<commit_message>
revise manuscript abstract and introduction
</commit_message>
<xml_diff>
--- a/论文/GriddingMachine论文初稿_v0.3_语言优化版.docx
+++ b/论文/GriddingMachine论文初稿_v0.3_语言优化版.docx
@@ -11,7 +11,7 @@
         <w:rPr>
           <w:rFonts w:ascii="Times New Roman" w:hAnsi="Times New Roman" w:eastAsia="宋体"/>
         </w:rPr>
-        <w:t>面向地球系统模型的全球网格数据生命周期：GriddingMachine框架更新与应用</w:t>
+        <w:t>面向地球系统模式的全球网格数据库：GriddingMachine框架更新与应用</w:t>
       </w:r>
     </w:p>
     <w:p>
@@ -82,7 +82,7 @@
         <w:rPr>
           <w:rFonts w:ascii="Times New Roman" w:hAnsi="Times New Roman" w:eastAsia="宋体"/>
         </w:rPr>
-        <w:t>地球系统模型依赖来自不同机构和产品体系的全球网格数据。即使数据已采用NetCDF等标准格式，源数据处理规则、标准产品标识、网络分发副本与模型实际输入仍可能由不同环节分别维护，给持续更新和可核验调用带来困难。本文在2022版GriddingMachine基础上，将数据生产、产品登记与分发、模型输入组织重构为连续的数据生命周期。数据生产与标准化层以共享YAML配置规范驱动源维度映射、坐标与数值变换、缺失值处理和质量控制；数据目录与可信分发层以独立目录维护逻辑标签、镜像及完整性元数据，并通过直接NetCDF和事务式获取对已登记完整性字段的产品进行字节数与SHA-256核验；模型输入组织层以统一读取、陆面参数融合和气象驱动组织连接标准产品与模型接口。NOAA OISST V2.1由四维源结构转换为1440×720标准网格，691 150个有效格点与独立参考逐点一致。对于ELEV和LAI两个内部压缩产品，直接NetCDF在环境A中分别降低48.3%和82.9%的缓存预热端到端中位时间，在环境B中分别降低53.6%和69.2%。校园网内4个代表性产品经FTP和Zenodo完成24次同文件下载，文件大小与SHA-256均与目录登记值一致。14类陆面产品和8类ERA5逐时产品在US-NR1形成模型参数和气象驱动，8个字段的8784个时间步与底层NetCDF逐点一致，并完成Emerald初始化和60 s首步。结果表明，新版GriddingMachine能够连接异构源数据生产、标准产品登记、内容完整性核验和模型输入组织，形成面向地球系统模型的可执行数据生命周期，为全球网格数据产品的持续维护与复用提供轻量化基础设施。</w:t>
+        <w:t>地球系统模式依赖区域至全球尺度的网格数据进行参数初始化和结果验证。尽管当前数据大多采用NetCDF、HDF或GeoTIFF等标准格式，源数据处理规则、单位换算、数据标识和网络分发方式仍存在差异，研究人员往往需要为不同模式重复维护数据整理和读取程序。本文在2022版GriddingMachine基础上，完善数据预处理、数据分发和数据读取流程：以共享YAML配置描述源数据结构及转换规则，以独立目录管理标准化数据的标签、镜像和完整性信息，并通过统一接口组织陆面参数和气象驱动。除Julia外，本文适配MATLAB、Octave、Python和R对新版数据的自动获取，并新增C和Fortran的自动获取入口。OISST V2.1标准化后与独立参考逐点一致；ELEV和LAI的直接NetCDF读取降低了外层归档带来的访问开销；代表性数据在FTP和Zenodo镜像之间保持文件大小和SHA-256一致；14类陆面数据和8类ERA5逐时数据能够形成US-NR1的模式输入并完成Emerald初始化和60 s首步。结果表明，更新后的GriddingMachine能够减少多源网格数据在预处理、获取、检查和模式接入过程中的重复工作，为地球系统模式研究提供可复用的数据组织和调用基础。</w:t>
       </w:r>
     </w:p>
     <w:p>
@@ -97,7 +97,7 @@
         <w:rPr>
           <w:rFonts w:ascii="Times New Roman" w:hAnsi="Times New Roman" w:eastAsia="宋体"/>
         </w:rPr>
-        <w:t xml:space="preserve"> 地球系统模型；全球网格数据；数据生命周期；NetCDF；数据完整性；模型输入</w:t>
+        <w:t xml:space="preserve"> 地球系统模式；全球网格数据库；数据标准化；NetCDF；数据完整性；模式输入</w:t>
       </w:r>
     </w:p>
     <w:p>
@@ -106,7 +106,7 @@
           <w:rFonts w:ascii="Times New Roman" w:hAnsi="Times New Roman" w:eastAsia="宋体"/>
           <w:b/>
         </w:rPr>
-        <w:t>A Lifecycle Framework for Global Gridded Data in Earth System Models: Advances and Applications of GriddingMachine</w:t>
+        <w:t>A Global Gridded Database for Earth System Models: Advances and Applications of GriddingMachine</w:t>
       </w:r>
     </w:p>
     <w:p>
@@ -198,7 +198,7 @@
         <w:rPr>
           <w:rFonts w:ascii="Times New Roman" w:hAnsi="Times New Roman" w:eastAsia="宋体"/>
         </w:rPr>
-        <w:t>地球系统模型正在以更高的空间分辨率和更精细的过程表达描述陆地、大气、海洋及其相互作用。模型复杂度的提升使参数化、初始条件、边界条件、气象驱动和结果评估越来越依赖多源全球网格数据。此类数据通常由多个研究团队和业务机构生产，在文件格式、空间投影、维度顺序、经纬度方向、时间组织、单位、缩放方式、缺失值表示和元数据结构等方面存在差异。研究人员需要串联数据发现、下载、重排或重投影、数值转换、质量检查和模型接口适配，才能把“可获得的数据”转化为可重复调用的模型输入。</w:t>
+        <w:t>地球系统模式以数值方法描述大气、海洋、陆地及其相互作用，其参数初始化、边界条件、气象驱动和结果验证均依赖区域至全球尺度的网格数据。此类数据由多个研究团队和业务机构提供，在文件格式、空间投影、维度顺序、经纬度方向、时间组织、单位、缩放方式、缺失值表示和元数据结构等方面存在差异。研究人员需要完成数据发现、下载、重排或重投影、数值转换、质量检查和模式接口适配，才能将可获得的数据用于可重复的模式计算。因此，面向本地模式运行建立具有统一空间、变量和元数据约定的科研数据库，对于减少重复整理和保证输入一致性具有实际意义。</w:t>
       </w:r>
     </w:p>
     <w:p>
@@ -206,7 +206,7 @@
         <w:rPr>
           <w:rFonts w:ascii="Times New Roman" w:hAnsi="Times New Roman" w:eastAsia="宋体"/>
         </w:rPr>
-        <w:t>科学数据管理正在由单纯的数据公开转向强调可发现、可获取、可互操作和可复用的FAIR原则[1]。NetCDF具有自描述、跨系统和适合多维数组等特点，CF元数据约定进一步通过坐标、物理量、单位和时空属性促进不同数据源之间的解释与处理[2]。Google Earth Engine等云平台显著提升了大尺度遥感数据的访问和分析能力[3]。机构服务器、团队存储和公共存储共同构成当前地学数据分发生态。这些标准与平台分别改善了数据表达、发现、计算或访问，但对于面向固定版本、离线缓存和模型直接调用的工作流，仍需要把数据转换规则、标准产品标识、网络获取内容和下游模型接口连接起来。</w:t>
+        <w:t>科学数据管理正在由单纯的数据公开转向强调可发现、可获取、可互操作和可复用的FAIR原则[1]。NetCDF具有自描述、跨系统和适合多维数组等特点，CF元数据约定进一步通过坐标、物理量、单位和时空属性促进不同数据源之间的解释与处理[2]。Google Earth Engine等云平台提升了大尺度遥感数据的访问和分析能力[3]，但云端访问并不能替代面向固定版本、离线缓存和模式直接调用的本地数据组织。现有标准和平台改善了数据表达、发现、计算或访问，却不会自动解决源数据处理规则、数据标识、网络副本和模式输入字段之间的一致性问题。</w:t>
       </w:r>
     </w:p>
     <w:p>
@@ -214,19 +214,7 @@
         <w:rPr>
           <w:rFonts w:ascii="Times New Roman" w:hAnsi="Times New Roman" w:eastAsia="宋体"/>
         </w:rPr>
-        <w:t>王玉杰等[4]于2022年提出GriddingMachine，将常用于陆面和地球系统模拟的全球数据处理为具有统一空间和变量约定的NetCDF文件，并通过标签、</w:t>
-      </w:r>
-      <w:r>
-        <w:rPr>
-          <w:rFonts w:ascii="Consolas" w:hAnsi="Consolas" w:eastAsia="等线"/>
-        </w:rPr>
-        <w:t>Artifacts.toml</w:t>
-      </w:r>
-      <w:r>
-        <w:rPr>
-          <w:rFonts w:ascii="Times New Roman" w:hAnsi="Times New Roman" w:eastAsia="宋体"/>
-        </w:rPr>
-        <w:t>和Julia artifact机制实现数据管理和自动下载，同时提供Julia、MATLAB、Octave、Python和R接口。旧版已经规定经纬度方向、空间分辨率、变量名称、缺失值、单位、引用信息和处理日志，目录中也记录SHA-1、SHA-256和一个或多个下载URL。新版在此基础上进一步面向产品体系扩展，组织生产规则、产品目录、分发副本与模型输入之间的一致关系。</w:t>
+        <w:t>Wang等[4]于2022年发布了基于Julia语言的GriddingMachine数据库和软件，用于将常用于陆面和地球系统模拟的全球数据处理为具有统一空间和变量约定的NetCDF文件，并通过标签、Artifacts.toml和Julia artifact机制实现数据管理与自动下载，同时提供Julia、MATLAB、Octave、Python和R接口。2022版已经建立了统一网格约定、数据标签和多语言访问基础，但其数据预处理脚本、分发归档和目录维护仍主要围绕当时的数据组织方式展开。随着数据类型和模式应用链条扩展，有必要进一步统一数据生产、目录维护、数据获取和模式输入组织。</w:t>
       </w:r>
     </w:p>
     <w:p>
@@ -234,7 +222,7 @@
         <w:rPr>
           <w:rFonts w:ascii="Times New Roman" w:hAnsi="Times New Roman" w:eastAsia="宋体"/>
         </w:rPr>
-        <w:t>在相关技术基础方面，NetCDF支持机器无关的多维科学数据访问[5]，地球系统数据立方体强调多变量时空数据的统一组织[6]，Julia为高性能科学计算与可组合方法实现提供支撑[7]，研究软件引用原则则强调可识别版本及其学术贡献[8]。新版GriddingMachine将这些实践落实到标准产品的生成、登记、获取和模型调用流程中。</w:t>
+        <w:t>针对上述问题，改进方向应当同时覆盖数据生产和模式使用两个环节：用共享配置显式记录源数据维度、坐标、数值变换和缺失值处理，用独立目录维护数据标签、版本、镜像及可核验的完整性信息，并用统一读取接口把标准化数据组织为模式需要的参数、驱动和时间序列。这样的设计可以使数据处理规则、数据目录和访问软件分别维护，同时通过稳定标签和标准NetCDF保持衔接。</w:t>
       </w:r>
     </w:p>
     <w:p>
@@ -242,7 +230,7 @@
         <w:rPr>
           <w:rFonts w:ascii="Times New Roman" w:hAnsi="Times New Roman" w:eastAsia="宋体"/>
         </w:rPr>
-        <w:t>随着产品类型、分发位置和模型应用链条扩展，源数据处理规则、标准产品版本、网络分发副本和模型实际读取对象需要在保持统一标签语义的同时分别更新。统一文件格式为跨环节协同奠定基础，源数据维度和缩放规则的显式表达、网络文件与目录登记产品的内容核对，以及空间索引、字段组织、时间轴和量纲衔接进一步把标准产品转化为模型输入。为此，本文在延续2022版统一数据标准与标签访问的基础上，建立从异构源数据到模型输入的连续、可执行并可核验的数据生命周期。</w:t>
+        <w:t>本文在2022版GriddingMachine基础上，更新数据预处理、数据分发和数据读取流程，形成数据生产与标准化、数据目录与获取、模式输入组织三个相互衔接的环节。研究通过受控配置和维度变换实例、OISST V2.1标准化、ELEV与LAI分发效率比较、FTP—Zenodo镜像获取以及US-NR1模式输入案例，评价新版框架的数据一致性、可执行性和接口适配能力；同时适配MATLAB、Octave、Python和R对新版数据的自动获取，并新增C和Fortran的自动获取入口。</w:t>
       </w:r>
     </w:p>
     <w:p>
@@ -250,7 +238,7 @@
         <w:rPr>
           <w:rFonts w:ascii="Times New Roman" w:hAnsi="Times New Roman" w:eastAsia="宋体"/>
         </w:rPr>
-        <w:t>围绕这一问题，新版GriddingMachine形成三个相互衔接的功能层。第一，数据生产与标准化层以共享YAML配置规范表达源维度、坐标、数值变换、Gapfill和质量控制，使异构源到标准NetCDF的转换规则成为可执行生产契约。第二，数据目录与可信分发层将数据目录与访问软件解耦，以逻辑标签连接发布副本，并通过直接NetCDF与事务式获取组织下载路径；对于登记了文件字节数和SHA-256的条目，获取流程进一步执行严格内容核验以维护稳定产品标识。第三，模型输入组织层以稳定标签连接统一读取、陆面参数融合和气象驱动组织，使标准产品形成满足模型接口要求的数据结构。三层共同构成“异构数据生产—产品登记与完整性核验—模型输入组织”的连续路径。</w:t>
+        <w:t>围绕这一问题，新版GriddingMachine形成三个相互衔接的功能层。第一，数据生产与标准化层以共享YAML配置规范表达源维度、坐标、数值变换、Gapfill和质量控制，使异构源到标准NetCDF的转换规则成为可执行生产契约。第二，数据目录与可信分发层将数据目录与访问软件解耦，以逻辑标签连接发布副本，并通过直接NetCDF与事务式获取组织下载路径；对于登记了文件字节数和SHA-256的条目，获取流程进一步执行严格内容核验以维护稳定产品标识。第三，模式输入组织层以稳定标签连接统一读取、陆面参数融合和气象驱动组织，使标准产品形成满足模型接口要求的数据结构。三层共同构成“异构数据生产—产品登记与完整性核验—模式输入组织”的连续路径。</w:t>
       </w:r>
     </w:p>
     <w:p>
@@ -270,7 +258,7 @@
         <w:rPr>
           <w:rFonts w:ascii="Times New Roman" w:hAnsi="Times New Roman" w:eastAsia="宋体"/>
         </w:rPr>
-        <w:t>的分发路径，并结合13类受控状态场景及FTP—Zenodo同文件获取检验事务式多镜像机制；以14类陆面数据和8类ERA5逐时数据[10]构成的US-NR1案例检验标准NetCDF到模型输入组织的接口链路。跨操作系统持续集成作为横向验证，用于检查固定依赖条件下核心实现的运行一致性。</w:t>
+        <w:t>的分发路径，并结合13类受控状态场景及FTP—Zenodo同文件获取检验事务式多镜像机制；以14类陆面数据和8类ERA5逐时数据[10]构成的US-NR1案例检验标准NetCDF到模式输入组织的接口链路。跨操作系统持续集成作为横向验证，用于检查固定依赖条件下核心实现的运行一致性。</w:t>
       </w:r>
     </w:p>
     <w:p>
@@ -312,7 +300,7 @@
         <w:rPr>
           <w:rFonts w:ascii="Times New Roman" w:hAnsi="Times New Roman" w:eastAsia="宋体"/>
         </w:rPr>
-        <w:t>软件包版本更新；模型输入组织层负责数据发现、获取、读取以及陆面参数和气象驱动组织。数据生产与标准化层主要由</w:t>
+        <w:t>软件包版本更新；模式输入组织层负责数据发现、获取、读取以及陆面参数和气象驱动组织。数据生产与标准化层主要由</w:t>
       </w:r>
       <w:r>
         <w:rPr>
@@ -324,7 +312,7 @@
         <w:rPr>
           <w:rFonts w:ascii="Times New Roman" w:hAnsi="Times New Roman" w:eastAsia="宋体"/>
         </w:rPr>
-        <w:t>承担，数据目录与可信分发层及模型输入组织层主要由</w:t>
+        <w:t>承担，数据目录与可信分发层及模式输入组织层主要由</w:t>
       </w:r>
       <w:r>
         <w:rPr>
@@ -417,7 +405,7 @@
         <w:rPr>
           <w:rFonts w:ascii="Times New Roman" w:hAnsi="Times New Roman" w:eastAsia="宋体"/>
         </w:rPr>
-        <w:t>构成数据预处理、分发与读取路径；（b）新版由数据生产与标准化层、数据目录与可信分发层和模型输入组织层构成，依次连接异构源数据、共享YAML契约、标准化与质量控制、标准NetCDF、独立数据目录、完整性获取以及统一读取和模型调用；（c）O1—O5依次表示统一数据契约、简化数据制品、目录独立演化、事务式获取和模型就绪接口。橙色虚线标示各项更新相对于2022版基线及新版核心节点的对应关系。</w:t>
+        <w:t>构成数据预处理、分发与读取路径；（b）新版由数据生产与标准化层、数据目录与可信分发层和模式输入组织层构成，依次连接异构源数据、共享YAML契约、标准化与质量控制、标准NetCDF、独立数据目录、完整性获取以及统一读取和模型调用；（c）O1—O5依次表示统一数据契约、简化数据制品、目录独立演化、事务式获取和模型就绪接口。橙色虚线标示各项更新相对于2022版基线及新版核心节点的对应关系。</w:t>
       </w:r>
     </w:p>
     <w:p>
@@ -515,7 +503,7 @@
         <w:rPr>
           <w:rFonts w:ascii="Times New Roman" w:hAnsi="Times New Roman" w:eastAsia="宋体"/>
         </w:rPr>
-        <w:t>模型输入组织层提供标签驱动的整场、指定周期及站点读取，并进一步完成格点尺度陆面参数融合与气象驱动组织。由14类产品组成的第二套陆面参数集合（代码标识为</w:t>
+        <w:t>模式输入组织层提供标签驱动的整场、指定周期及站点读取，并进一步完成格点尺度陆面参数融合与气象驱动组织。由14类产品组成的第二套陆面参数集合（代码标识为</w:t>
       </w:r>
       <w:r>
         <w:rPr>
@@ -2824,7 +2812,7 @@
         <w:rPr>
           <w:rFonts w:ascii="Times New Roman" w:hAnsi="Times New Roman" w:eastAsia="宋体"/>
         </w:rPr>
-        <w:t>2.4 统一读取与模型输入组织</w:t>
+        <w:t>2.4 统一读取与模式输入组织</w:t>
       </w:r>
     </w:p>
     <w:p>
@@ -2867,7 +2855,7 @@
         <w:rPr>
           <w:rFonts w:ascii="Times New Roman" w:hAnsi="Times New Roman" w:eastAsia="宋体"/>
         </w:rPr>
-        <w:t>。模型输入组织层直接继承数据生产与标准化层统一的单位、缺失值和物理范围，使处理规则集中于共享生产契约，并兼容既有读取方式。</w:t>
+        <w:t>。模式输入组织层直接继承数据生产与标准化层统一的单位、缺失值和物理范围，使处理规则集中于共享生产契约，并兼容既有读取方式。</w:t>
       </w:r>
     </w:p>
     <w:p>
@@ -2974,7 +2962,7 @@
         <w:rPr>
           <w:rFonts w:ascii="Times New Roman" w:hAnsi="Times New Roman" w:eastAsia="宋体"/>
         </w:rPr>
-        <w:t>状态同步进入质量控制。多个标准产品由此形成结构一致的格点级模型输入。</w:t>
+        <w:t>状态同步进入质量控制。多个标准产品由此形成结构一致的格点级模式输入。</w:t>
       </w:r>
     </w:p>
     <w:p>
@@ -3026,7 +3014,7 @@
         <w:rPr>
           <w:rFonts w:ascii="Times New Roman" w:hAnsi="Times New Roman" w:eastAsia="宋体"/>
         </w:rPr>
-        <w:t>标签驱动的数据访问、陆面参数融合与气象驱动组织共同构成模型输入组织层。本文将“模型就绪”具体界定为：标准产品经过格点索引、字段组织、时间轴构建和量纲衔接后，形成满足Emerald初始化接口的数据结构。与2022版通过标签组织数据访问的思路一致[4]，新版进一步把目录配置与更新、完整性获取、标准网格读取和模型输入组织连接为连续公共数据流。用户以数据标签发现产品，经镜像获取，并在目录提供完整性元数据时执行内容核验，再读取整场、周期或格点数据，并形成陆面参数或气象驱动；具体公共接口、调用参数和完整Julia示例列入补充材料与版本化用户指南。</w:t>
+        <w:t>标签驱动的数据访问、陆面参数融合与气象驱动组织共同构成模式输入组织层。本文将“模型就绪”具体界定为：标准产品经过格点索引、字段组织、时间轴构建和量纲衔接后，形成满足Emerald初始化接口的数据结构。与2022版通过标签组织数据访问的思路一致[4]，新版进一步把目录配置与更新、完整性获取、标准网格读取和模式输入组织连接为连续公共数据流。用户以数据标签发现产品，经镜像获取，并在目录提供完整性元数据时执行内容核验，再读取整场、周期或格点数据，并形成陆面参数或气象驱动；具体公共接口、调用参数和完整Julia示例列入补充材料与版本化用户指南。</w:t>
       </w:r>
     </w:p>
     <w:p>
@@ -3348,7 +3336,7 @@
                 <w:rFonts w:ascii="Times New Roman" w:hAnsi="Times New Roman" w:eastAsia="宋体"/>
                 <w:sz w:val="18"/>
               </w:rPr>
-              <w:t>模型输入组织层将标准产品组织为模型就绪输入</w:t>
+              <w:t>模式输入组织层将标准产品组织为模型就绪输入</w:t>
             </w:r>
           </w:p>
         </w:tc>
@@ -3970,7 +3958,7 @@
         <w:rPr>
           <w:rFonts w:ascii="Times New Roman" w:hAnsi="Times New Roman" w:eastAsia="宋体"/>
         </w:rPr>
-        <w:t>3.4 统一读取与模型输入组织</w:t>
+        <w:t>3.4 统一读取与模式输入组织</w:t>
       </w:r>
     </w:p>
     <w:p>
@@ -3978,7 +3966,7 @@
         <w:rPr>
           <w:rFonts w:ascii="Times New Roman" w:hAnsi="Times New Roman" w:eastAsia="宋体"/>
         </w:rPr>
-        <w:t>模型输入组织案例连接标准网格读取、陆面参数融合、气象驱动组织与Emerald初始化。确定性参考数据用于核对字段名、形状、类型、时间索引和缺失值处理；陆面案例采用2020年第二套陆面参数集合，在US-NR1附近植被格点和典型非植被格点呈现不同陆面状态下的模型入口。</w:t>
+        <w:t>模式输入组织案例连接标准网格读取、陆面参数融合、气象驱动组织与Emerald初始化。确定性参考数据用于核对字段名、形状、类型、时间索引和缺失值处理；陆面案例采用2020年第二套陆面参数集合，在US-NR1附近植被格点和典型非植被格点呈现不同陆面状态下的模型入口。</w:t>
       </w:r>
     </w:p>
     <w:p>
@@ -4010,7 +3998,7 @@
         <w:rPr>
           <w:rFonts w:ascii="Times New Roman" w:hAnsi="Times New Roman" w:eastAsia="宋体"/>
         </w:rPr>
-        <w:t>维度、360×180×8784形状及单位属性。模型输入组织层输出与底层NetCDF直接读取的同一格点序列逐点比较；</w:t>
+        <w:t>维度、360×180×8784形状及单位属性。模式输入组织层输出与底层NetCDF直接读取的同一格点序列逐点比较；</w:t>
       </w:r>
       <w:r>
         <w:rPr>
@@ -4068,7 +4056,7 @@
         <w:rPr>
           <w:rFonts w:ascii="Times New Roman" w:hAnsi="Times New Roman" w:eastAsia="宋体"/>
         </w:rPr>
-        <w:t>按照表3所列评价设计，以下依次呈现标准产品生产、直接NetCDF分发效率、多镜像获取、模型输入组织和跨操作系统运行一致性结果。</w:t>
+        <w:t>按照表3所列评价设计，以下依次呈现标准产品生产、直接NetCDF分发效率、多镜像获取、模式输入组织和跨操作系统运行一致性结果。</w:t>
       </w:r>
     </w:p>
     <w:p>
@@ -4540,7 +4528,7 @@
         <w:rPr>
           <w:rFonts w:ascii="Times New Roman" w:hAnsi="Times New Roman" w:eastAsia="宋体"/>
         </w:rPr>
-        <w:t>4.4 统一读取与模型输入组织</w:t>
+        <w:t>4.4 统一读取与模式输入组织</w:t>
       </w:r>
     </w:p>
     <w:p>
@@ -4580,7 +4568,7 @@
         <w:rPr>
           <w:rFonts w:ascii="Times New Roman" w:hAnsi="Times New Roman" w:eastAsia="宋体"/>
         </w:rPr>
-        <w:t>、360×180×8784，并带有单位属性。US-NR1格点的地表气压、降水、漫射与直射短波辐射、长波辐射、气温、水汽压亏缺和风速均得到8784个逐小时值，有限值比例均为100%；模型输入组织层输出与底层NetCDF逐点读取的8个字段最大绝对差均为0。按站点经度计算的时区偏移为−7.0364 h，</w:t>
+        <w:t>、360×180×8784，并带有单位属性。US-NR1格点的地表气压、降水、漫射与直射短波辐射、长波辐射、气温、水汽压亏缺和风速均得到8784个逐小时值，有限值比例均为100%；模式输入组织层输出与底层NetCDF逐点读取的8个字段最大绝对差均为0。按站点经度计算的时区偏移为−7.0364 h，</w:t>
       </w:r>
       <w:r>
         <w:rPr>
@@ -4651,7 +4639,7 @@
         <w:rPr>
           <w:rFonts w:ascii="Times New Roman" w:hAnsi="Times New Roman" w:eastAsia="宋体"/>
         </w:rPr>
-        <w:t>Windows和macOS本地环境进一步完成ELEV/LAI性能测量及镜像故障场景，独立公共网络记录完成Zenodo内容核验；校园网环境完成FTP—Zenodo同文件对照，US-NR1案例完成真实陆面与气象产品的模型输入组织。持续集成、独立环境观测和真实数据案例共同构成分层复现证据，具体系统—模块对应关系列于补充材料S5。</w:t>
+        <w:t>Windows和macOS本地环境进一步完成ELEV/LAI性能测量及镜像故障场景，独立公共网络记录完成Zenodo内容核验；校园网环境完成FTP—Zenodo同文件对照，US-NR1案例完成真实陆面与气象产品的模式输入组织。持续集成、独立环境观测和真实数据案例共同构成分层复现证据，具体系统—模块对应关系列于补充材料S5。</w:t>
       </w:r>
     </w:p>
     <w:p>
@@ -4681,7 +4669,7 @@
         <w:rPr>
           <w:rFonts w:ascii="Times New Roman" w:hAnsi="Times New Roman" w:eastAsia="宋体"/>
         </w:rPr>
-        <w:t>2022版GriddingMachine已经建立统一网格、变量约定、标签化数据访问以及基于artifact的数据管理[4]。新版进一步把分布于数据源专用处理、软件内置目录和下游调用中的维护单元组织为三个相互衔接的层次：共享YAML契约显式描述异构源到标准产品的转换规则，独立目录维护标准产品的逻辑标识、镜像和完整性元数据，统一读取与模型输入层围绕稳定标签组织下游使用。数据处理规则、产品目录和访问软件由此能够在共同约定下分别更新，并通过标准产品和标签保持连续对应。</w:t>
+        <w:t>2022版GriddingMachine已经建立统一网格、变量约定、标签化数据访问以及基于artifact的数据管理[4]。新版进一步把分布于数据源专用处理、软件内置目录和下游调用中的维护单元组织为三个相互衔接的层次：共享YAML契约显式描述异构源到标准产品的转换规则，独立目录维护标准产品的逻辑标识、镜像和完整性元数据，统一读取与模式输入层围绕稳定标签组织下游使用。数据处理规则、产品目录和访问软件由此能够在共同约定下分别更新，并通过标准产品和标签保持连续对应。</w:t>
       </w:r>
     </w:p>
     <w:p>
@@ -4767,7 +4755,7 @@
         <w:rPr>
           <w:rFonts w:ascii="Times New Roman" w:hAnsi="Times New Roman" w:eastAsia="宋体"/>
         </w:rPr>
-        <w:t>生产质量控制与分发完整性核验形成互补。数据生产与标准化层通过维度、坐标方向、变量、数值范围、Gapfill、空间方向图和独立参考等检查，确认标准数据符合声明的处理规则；数据目录与可信分发层通过文件字节数和SHA-256确认下载对象与目录登记的标准文件内容一致。源数据属性、处理规则、变量物理意义和量纲继续在数据生产与标准化层与模型输入组织层接受对应检查。OISST的逐点独立参考和ERA5降水单位修订体现了两类机制在数据生命周期中的协同作用。</w:t>
+        <w:t>生产质量控制与分发完整性核验形成互补。数据生产与标准化层通过维度、坐标方向、变量、数值范围、Gapfill、空间方向图和独立参考等检查，确认标准数据符合声明的处理规则；数据目录与可信分发层通过文件字节数和SHA-256确认下载对象与目录登记的标准文件内容一致。源数据属性、处理规则、变量物理意义和量纲继续在数据生产与标准化层与模式输入组织层接受对应检查。OISST的逐点独立参考和ERA5降水单位修订体现了两类机制在数据生命周期中的协同作用。</w:t>
       </w:r>
     </w:p>
     <w:p>
@@ -4786,7 +4774,7 @@
         <w:rPr>
           <w:rFonts w:ascii="Times New Roman" w:hAnsi="Times New Roman" w:eastAsia="宋体"/>
         </w:rPr>
-        <w:t>5.4 从标准产品到模型输入：接口层面的“模型就绪”</w:t>
+        <w:t>5.4 从标准产品到模式输入：接口层面的“模型就绪”</w:t>
       </w:r>
     </w:p>
     <w:p>
@@ -4794,7 +4782,7 @@
         <w:rPr>
           <w:rFonts w:ascii="Times New Roman" w:hAnsi="Times New Roman" w:eastAsia="宋体"/>
         </w:rPr>
-        <w:t>标准化NetCDF是模型输入组织的起点。地球系统模型还需要把多个产品映射到共同格点，组合参数字段，建立时间轴，并衔接变量单位和模型接口所需的数据结构。US-NR1案例中，14类陆面产品形成34个模型字段，8类ERA5产品形成8784步逐时气象序列；模型输入组织层字段与底层NetCDF逐点一致，FDOY与独立时间公式一致，降水单位与模型水量换算相衔接。真实陆面参数和气象驱动随后完成Emerald初始化和60 s首步计算。</w:t>
+        <w:t>标准化NetCDF是模式输入组织的起点。地球系统模式还需要把多个产品映射到共同格点，组合参数字段，建立时间轴，并衔接变量单位和模型接口所需的数据结构。US-NR1案例中，14类陆面产品形成34个模型字段，8类ERA5产品形成8784步逐时气象序列；模式输入组织层字段与底层NetCDF逐点一致，FDOY与独立时间公式一致，降水单位与模型水量换算相衔接。真实陆面参数和气象驱动随后完成Emerald初始化和60 s首步计算。</w:t>
       </w:r>
     </w:p>
     <w:p>
@@ -4829,7 +4817,7 @@
         <w:rPr>
           <w:rFonts w:ascii="Times New Roman" w:hAnsi="Times New Roman" w:eastAsia="宋体"/>
         </w:rPr>
-        <w:t>从基础设施定位看，NetCDF/CF支持多维科学数据的表示与语义约定[2,5]，Earth Engine强调云端地理空间数据计算[3]，ESGF支撑分布式气候模式数据发现与访问[12]，Pangeo及Pangeo Forge侧重云优化数据和可复用生产配方[13-14]。国内地球系统科学数据共享研究同样强调目录体系与规范分类对跨团队复用的作用[15]；Pooch与STAC分别提供文件获取注册和广义地理空间资产描述[16-17]。FAIR4RS原则强调研究软件的持续演化和版本记录[18]，TRUST原则强调数字资源库的透明度与技术能力[19]，国家科学数据中心的FAIR实践进一步展示了标准化元数据和清晰使用信息的重要性[20]。GriddingMachine面向全球规则网格产品进入Julia模型工作流的应用场景，以稳定标签连接机构存储、公共镜像、离线缓存和模型输入，其特色是将上游生产契约、标准NetCDF、轻量目录、事务式多镜像获取和下游模型字段组织纳入同一生命周期。</w:t>
+        <w:t>从基础设施定位看，NetCDF/CF支持多维科学数据的表示与语义约定[2,5]，Earth Engine强调云端地理空间数据计算[3]，ESGF支撑分布式气候模式数据发现与访问[12]，Pangeo及Pangeo Forge侧重云优化数据和可复用生产配方[13-14]。国内地球系统科学数据共享研究同样强调目录体系与规范分类对跨团队复用的作用[15]；Pooch与STAC分别提供文件获取注册和广义地理空间资产描述[16-17]。FAIR4RS原则强调研究软件的持续演化和版本记录[18]，TRUST原则强调数字资源库的透明度与技术能力[19]，国家科学数据中心的FAIR实践进一步展示了标准化元数据和清晰使用信息的重要性[20]。GriddingMachine面向全球规则网格产品进入Julia模型工作流的应用场景，以稳定标签连接机构存储、公共镜像、离线缓存和模式输入，其特色是将上游生产契约、标准NetCDF、轻量目录、事务式多镜像获取和下游模型字段组织纳入同一生命周期。</w:t>
       </w:r>
     </w:p>
     <w:p>
@@ -4867,7 +4855,7 @@
         <w:rPr>
           <w:rFonts w:ascii="Times New Roman" w:hAnsi="Times New Roman" w:eastAsia="宋体"/>
         </w:rPr>
-        <w:t>本文在2022版GriddingMachine统一网格、标签访问和artifact数据管理基础上，形成由数据生产与标准化层、数据目录与可信分发层和模型输入组织层构成的可执行数据生命周期。新版以共享YAML配置规范和显式源维度映射描述异构源到标准NetCDF的生产契约，以独立目录、直接NetCDF、事务式获取和</w:t>
+        <w:t>本文在2022版GriddingMachine统一网格、标签访问和artifact数据管理基础上，形成由数据生产与标准化层、数据目录与可信分发层和模式输入组织层构成的可执行数据生命周期。新版以共享YAML配置规范和显式源维度映射描述异构源到标准NetCDF的生产契约，以独立目录、直接NetCDF、事务式获取和</w:t>
       </w:r>
       <w:r>
         <w:rPr>
@@ -4895,7 +4883,7 @@
         <w:rPr>
           <w:rFonts w:ascii="Times New Roman" w:hAnsi="Times New Roman" w:eastAsia="宋体"/>
         </w:rPr>
-        <w:t>这些结果表明，GriddingMachine能够把异构源数据生产、标准产品登记与内容完整性核验以及模型输入组织连接为连续数据路径。该框架为数据产品、分发目录和访问软件的独立维护建立统一接口，并为全球网格数据持续扩展、可靠获取和地球系统模型应用提供可复用的基础设施。</w:t>
+        <w:t>这些结果表明，GriddingMachine能够把异构源数据生产、标准产品登记与内容完整性核验以及模式输入组织连接为连续数据路径。该框架为数据产品、分发目录和访问软件的独立维护建立统一接口，并为全球网格数据持续扩展、可靠获取和地球系统模式应用提供可复用的基础设施。</w:t>
       </w:r>
     </w:p>
     <w:p>

</xml_diff>

<commit_message>
sync revised abstract to manuscript documents
</commit_message>
<xml_diff>
--- a/论文/GriddingMachine论文初稿_v0.3_语言优化版.docx
+++ b/论文/GriddingMachine论文初稿_v0.3_语言优化版.docx
@@ -82,7 +82,7 @@
         <w:rPr>
           <w:rFonts w:ascii="Times New Roman" w:hAnsi="Times New Roman" w:eastAsia="宋体"/>
         </w:rPr>
-        <w:t>地球系统模式依赖区域至全球尺度的网格数据进行参数初始化和结果验证。尽管当前数据大多采用NetCDF、HDF或GeoTIFF等标准格式，源数据处理规则、单位换算、数据标识和网络分发方式仍存在差异，研究人员往往需要为不同模式重复维护数据整理和读取程序。本文在2022版GriddingMachine基础上，完善数据预处理、数据分发和数据读取流程：以共享YAML配置描述源数据结构及转换规则，以独立目录管理标准化数据的标签、镜像和完整性信息，并通过统一接口组织陆面参数和气象驱动。除Julia外，本文适配MATLAB、Octave、Python和R对新版数据的自动获取，并新增C和Fortran的自动获取入口。OISST V2.1标准化后与独立参考逐点一致；ELEV和LAI的直接NetCDF读取降低了外层归档带来的访问开销；代表性数据在FTP和Zenodo镜像之间保持文件大小和SHA-256一致；14类陆面数据和8类ERA5逐时数据能够形成US-NR1的模式输入并完成Emerald初始化和60 s首步。结果表明，更新后的GriddingMachine能够减少多源网格数据在预处理、获取、检查和模式接入过程中的重复工作，为地球系统模式研究提供可复用的数据组织和调用基础。</w:t>
+        <w:t>地球系统模式依赖区域至全球尺度的网格数据进行参数初始化和结果验证。尽管当前数据大多采用NetCDF、HDF或GeoTIFF等标准格式，源数据处理规则、单位换算、数据标识和网络分发方式仍存在差异，使得每个模式不得不单独维护数据库，给模式持续更新和验证带来不必要的困难。本文在2022版GriddingMachine基础上，完善数据预处理、数据分发和数据读取流程：以共享YAML配置描述源数据结构及转换规则，以独立目录管理标准化数据的标签、镜像和完整性信息，并通过统一接口组织陆面参数和气象驱动。除Julia外，我们适配了MATLAB、Octave、Python和R语言对新版数据的自动下载支持，并新增C和Fortran的自动获取入口。这些更新使研究人员能够通过统一方式处理、获取和调用网格数据，减少不同地球系统模式重复整理和维护数据的工作，为科学研究与应用提供便利。</w:t>
       </w:r>
     </w:p>
     <w:p>
@@ -164,7 +164,7 @@
         <w:rPr>
           <w:rFonts w:ascii="Times New Roman" w:hAnsi="Times New Roman" w:eastAsia="宋体"/>
         </w:rPr>
-        <w:t>Earth system models depend on global gridded datasets maintained by different institutions and product systems. Even when standardized formats such as NetCDF are used, source-processing rules, standardized product identities, network replicas, and the data structures actually consumed by models may evolve in separate maintenance layers. Building on the 2022 release, this study reorganizes GriddingMachine into a continuous data lifecycle comprising a data production and standardization layer, a catalog and trusted-distribution layer, and a model-input organization layer. A shared YAML contract drives source-dimension mapping, coordinate and numerical transformations, missing-value treatment, and quality control. An independent catalog manages logical labels, mirrors, and integrity metadata, while direct NetCDF and transactional acquisition verify file size and SHA-256 for entries that carry integrity records. Unified reading, land-parameter assembly, and meteorological forcing organization connect standardized products to model interfaces. NOAA OISST V2.1 was transformed from a four-dimensional source layout to a standardized 1440 × 720 grid, with 691,150 finite cells matching an independently decoded reference point by point. For the internally compressed ELEV and LAI products, direct NetCDF reduced median warm-cache end-to-end time by 48.3% and 82.9%, respectively, in environment A and by 53.6% and 69.2% in environment B. Four representative products were downloaded 24 times from FTP and Zenodo on the campus network, with file sizes and SHA-256 digests matching catalog records. Fourteen land products and eight hourly ERA5 products supplied model parameters and forcing for US-NR1; all 8,784 time steps in eight fields matched direct NetCDF reads, and Emerald initialization and a 60 s first step completed with finite states. The updated GriddingMachine connects heterogeneous-source production, standardized-product registration, integrity-verified acquisition, and model-input organization into an executable lifecycle for Earth system modeling.</w:t>
+        <w:t>Earth system models rely on gridded data at regional to global scales for parameter initialization and evaluation of simulation results. Although most datasets are available in standard formats such as NetCDF, HDF, or GeoTIFF, differences in preprocessing rules, unit conversions, dataset identifiers, and distribution methods require individual modeling efforts to maintain separate databases, complicating ongoing model development and evaluation. Building on the 2022 release of GriddingMachine, this study improves data preprocessing, distribution, and reading. Shared YAML configurations describe source data structures and transformation rules; an independent catalog manages dataset tags, mirrors, and integrity metadata; and unified interfaces organize land parameters and meteorological forcing. In addition to Julia support, we have adapted automatic downloading of the updated datasets for MATLAB, Octave, Python, and R, and added automatic data retrieval interfaces for C and Fortran. These updates enable researchers to process, retrieve, and access gridded data through a consistent workflow, reducing repeated data preparation and maintenance across Earth system models and facilitating scientific research and applications.</w:t>
       </w:r>
     </w:p>
     <w:p>
@@ -173,13 +173,7 @@
           <w:rFonts w:ascii="Times New Roman" w:hAnsi="Times New Roman" w:eastAsia="宋体"/>
           <w:b/>
         </w:rPr>
-        <w:t>Keywords:</w:t>
-      </w:r>
-      <w:r>
-        <w:rPr>
-          <w:rFonts w:ascii="Times New Roman" w:hAnsi="Times New Roman" w:eastAsia="宋体"/>
-        </w:rPr>
-        <w:t xml:space="preserve"> Earth system modeling; global gridded data; data lifecycle; NetCDF; data integrity; model input</w:t>
+        <w:t>Keywords: Earth system models; global gridded database; data standardization; NetCDF; data integrity; model input</w:t>
       </w:r>
     </w:p>
     <w:p>

</xml_diff>

<commit_message>
sync corrected abstract wording to Word
</commit_message>
<xml_diff>
--- a/论文/GriddingMachine论文初稿_v0.3_语言优化版.docx
+++ b/论文/GriddingMachine论文初稿_v0.3_语言优化版.docx
@@ -173,7 +173,13 @@
           <w:rFonts w:ascii="Times New Roman" w:hAnsi="Times New Roman" w:eastAsia="宋体"/>
           <w:b/>
         </w:rPr>
-        <w:t>Keywords: Earth system models; global gridded database; data standardization; NetCDF; data integrity; model input</w:t>
+        <w:t>Keywords:</w:t>
+      </w:r>
+      <w:r>
+        <w:rPr>
+          <w:rFonts w:ascii="Times New Roman" w:hAnsi="Times New Roman" w:eastAsia="宋体"/>
+        </w:rPr>
+        <w:t xml:space="preserve"> Earth system models; global gridded database; data standardization; NetCDF; data integrity; model input</w:t>
       </w:r>
     </w:p>
     <w:p>

</xml_diff>

<commit_message>
align FAIR explanation and introduction order
</commit_message>
<xml_diff>
--- a/论文/GriddingMachine论文初稿_v0.3_语言优化版.docx
+++ b/论文/GriddingMachine论文初稿_v0.3_语言优化版.docx
@@ -206,7 +206,59 @@
         <w:rPr>
           <w:rFonts w:ascii="Times New Roman" w:hAnsi="Times New Roman" w:eastAsia="宋体"/>
         </w:rPr>
-        <w:t>科学数据管理正在由单纯的数据公开转向强调可发现、可获取、可互操作和可复用的FAIR原则[1]。NetCDF具有自描述、跨系统和适合多维数组等特点，CF元数据约定进一步通过坐标、物理量、单位和时空属性促进不同数据源之间的解释与处理[2]。Google Earth Engine等云平台提升了大尺度遥感数据的访问和分析能力[3]，但云端访问并不能替代面向固定版本、离线缓存和模式直接调用的本地数据组织。现有标准和平台改善了数据表达、发现、计算或访问，却不会自动解决源数据处理规则、数据标识、网络副本和模式输入字段之间的一致性问题。</w:t>
+        <w:t>科学数据管理正在由单纯的数据公开转向强调可发现（</w:t>
+      </w:r>
+      <w:r>
+        <w:rPr>
+          <w:rFonts w:ascii="Times New Roman" w:hAnsi="Times New Roman" w:eastAsia="宋体"/>
+          <w:b/>
+        </w:rPr>
+        <w:t>F</w:t>
+      </w:r>
+      <w:r>
+        <w:rPr>
+          <w:rFonts w:ascii="Times New Roman" w:hAnsi="Times New Roman" w:eastAsia="宋体"/>
+        </w:rPr>
+        <w:t>indable）、可获取（</w:t>
+      </w:r>
+      <w:r>
+        <w:rPr>
+          <w:rFonts w:ascii="Times New Roman" w:hAnsi="Times New Roman" w:eastAsia="宋体"/>
+          <w:b/>
+        </w:rPr>
+        <w:t>A</w:t>
+      </w:r>
+      <w:r>
+        <w:rPr>
+          <w:rFonts w:ascii="Times New Roman" w:hAnsi="Times New Roman" w:eastAsia="宋体"/>
+        </w:rPr>
+        <w:t>ccessible）、可互操作（</w:t>
+      </w:r>
+      <w:r>
+        <w:rPr>
+          <w:rFonts w:ascii="Times New Roman" w:hAnsi="Times New Roman" w:eastAsia="宋体"/>
+          <w:b/>
+        </w:rPr>
+        <w:t>I</w:t>
+      </w:r>
+      <w:r>
+        <w:rPr>
+          <w:rFonts w:ascii="Times New Roman" w:hAnsi="Times New Roman" w:eastAsia="宋体"/>
+        </w:rPr>
+        <w:t>nteroperable）和可复用（</w:t>
+      </w:r>
+      <w:r>
+        <w:rPr>
+          <w:rFonts w:ascii="Times New Roman" w:hAnsi="Times New Roman" w:eastAsia="宋体"/>
+          <w:b/>
+        </w:rPr>
+        <w:t>R</w:t>
+      </w:r>
+      <w:r>
+        <w:rPr>
+          <w:rFonts w:ascii="Times New Roman" w:hAnsi="Times New Roman" w:eastAsia="宋体"/>
+        </w:rPr>
+        <w:t>eusable）的FAIR（Findable, Accessible, Interoperable, Reusable）原则[1]。NetCDF具有自描述、跨系统和适合多维数组等特点，CF元数据约定进一步通过坐标、物理量、单位和时空属性促进不同数据源之间的解释与处理[2]。Google Earth Engine等云平台通过改善数据表达、发现、访问及计算，显著提升了大尺度遥感数据的访问和分析能力[3]。然而，对于面向固定版本、离线缓存和模式直接调用的工作流，研究人员仍需要把数据转换规则、标准产品标识、网络获取内容和下游模式接口连接起来，因此一个适用于本地运行的标准化数据库是必要的。</w:t>
       </w:r>
     </w:p>
     <w:p>

</xml_diff>

<commit_message>
align local database wording with advisor phrasing
</commit_message>
<xml_diff>
--- a/论文/GriddingMachine论文初稿_v0.3_语言优化版.docx
+++ b/论文/GriddingMachine论文初稿_v0.3_语言优化版.docx
@@ -258,7 +258,7 @@
         <w:rPr>
           <w:rFonts w:ascii="Times New Roman" w:hAnsi="Times New Roman" w:eastAsia="宋体"/>
         </w:rPr>
-        <w:t>eusable）的FAIR（Findable, Accessible, Interoperable, Reusable）原则[1]。NetCDF具有自描述、跨系统和适合多维数组等特点，CF元数据约定进一步通过坐标、物理量、单位和时空属性促进不同数据源之间的解释与处理[2]。Google Earth Engine等云平台通过改善数据表达、发现、访问及计算，显著提升了大尺度遥感数据的访问和分析能力[3]。然而，对于面向固定版本、离线缓存和模式直接调用的工作流，研究人员仍需要把数据转换规则、标准产品标识、网络获取内容和下游模式接口连接起来，因此一个适用于本地运行的标准化数据库是必要的。</w:t>
+        <w:t>eusable）的FAIR（Findable, Accessible, Interoperable, Reusable）原则[1]。NetCDF具有自描述、跨系统和适合多维数组等特点，CF元数据约定进一步通过坐标、物理量、单位和时空属性促进不同数据源之间的解释与处理[2]。Google Earth Engine等云平台通过改善数据表达、发现、访问及计算，显著提升了大尺度遥感数据的访问和分析能力[3]。然而，对于面向固定版本、离线缓存和模式直接调用的工作流，研究人员仍需要把数据转换规则、标准产品标识、网络获取内容和下游模式接口连接起来，因此一个适用于本地运行的标准化数据库是非常必要的。</w:t>
       </w:r>
     </w:p>
     <w:p>
@@ -266,7 +266,7 @@
         <w:rPr>
           <w:rFonts w:ascii="Times New Roman" w:hAnsi="Times New Roman" w:eastAsia="宋体"/>
         </w:rPr>
-        <w:t>Wang等[4]于2022年发布了基于Julia语言的GriddingMachine数据库和软件，用于将常用于陆面和地球系统模拟的全球数据处理为具有统一空间和变量约定的NetCDF文件，并通过标签、Artifacts.toml和Julia artifact机制实现数据管理与自动下载，同时提供Julia、MATLAB、Octave、Python和R接口。2022版已经建立了统一网格约定、数据标签和多语言访问基础，但其数据预处理脚本、分发归档和目录维护仍主要围绕当时的数据组织方式展开。随着数据类型和模式应用链条扩展，有必要进一步统一数据生产、目录维护、数据获取和模式输入组织。</w:t>
+        <w:t>Wang等[4]于2022年发布了基于Julia语言的GriddingMachine数据库，旨在将常用于陆面和地球系统模拟的全球数据处理为具有统一空间和变量约定的NetCDF文件，并通过标签、数据库文件Artifacts.toml和Julia语言的artifact机制实现数据管理与自动下载，同时提供Julia、MATLAB、Octave、Python和R接口。2022版已经建立了统一网格约定、数据标签和多语言访问基础，但其数据预处理脚本、分发归档和目录维护仍主要围绕当时的数据组织方式展开。随着数据类型和模式应用链条扩展，有必要进一步统一数据生产、目录维护、数据获取和模式输入组织。</w:t>
       </w:r>
     </w:p>
     <w:p>

</xml_diff>

<commit_message>
merge opening introduction paragraphs
</commit_message>
<xml_diff>
--- a/论文/GriddingMachine论文初稿_v0.3_语言优化版.docx
+++ b/论文/GriddingMachine论文初稿_v0.3_语言优化版.docx
@@ -198,15 +198,7 @@
         <w:rPr>
           <w:rFonts w:ascii="Times New Roman" w:hAnsi="Times New Roman" w:eastAsia="宋体"/>
         </w:rPr>
-        <w:t>地球系统模式以数值方法描述大气、海洋及其相互作用，其参数初始化、边界条件、气象驱动和结果验证均依赖区域至全球尺度的网格数据。此类数据由多个研究团队和业务机构提供，在文件格式、空间投影、维度顺序、经纬度方向、时间组织、单位、缩放方式、缺失值表示和元数据结构等方面存在差异。研究人员需要完成数据发现、下载、重排或重投影、数值转换、质量检查和模式接口适配，才能将可获得的数据用于可重复的模式计算。因此，面向本地模式运行建立具有统一空间、变量和元数据约定的科研数据库，对于减少重复整理和保证输入一致性具有实际意义。</w:t>
-      </w:r>
-    </w:p>
-    <w:p>
-      <w:r>
-        <w:rPr>
-          <w:rFonts w:ascii="Times New Roman" w:hAnsi="Times New Roman" w:eastAsia="宋体"/>
-        </w:rPr>
-        <w:t>科学数据管理正在由单纯的数据公开转向强调可发现（</w:t>
+        <w:t>地球系统模式以数值方法描述大气、海洋及其相互作用，其参数初始化、边界条件、气象驱动和结果验证均依赖区域至全球尺度的网格数据。此类数据由多个研究团队和业务机构提供，在文件格式、空间投影、维度顺序、经纬度方向、时间组织、单位、缩放方式、缺失值表示和元数据结构等方面存在差异。研究人员需要完成数据发现、下载、重排或重投影、数值转换、质量检查和模式接口适配，才能将可获得的数据用于可重复的模式计算。科学数据管理正在由单纯的数据公开转向强调可发现（</w:t>
       </w:r>
       <w:r>
         <w:rPr>

</xml_diff>

<commit_message>
refine abstract and introduction alignment
</commit_message>
<xml_diff>
--- a/论文/GriddingMachine论文初稿_v0.3_语言优化版.docx
+++ b/论文/GriddingMachine论文初稿_v0.3_语言优化版.docx
@@ -164,7 +164,7 @@
         <w:rPr>
           <w:rFonts w:ascii="Times New Roman" w:hAnsi="Times New Roman" w:eastAsia="宋体"/>
         </w:rPr>
-        <w:t>Earth system models rely on gridded data at regional to global scales for parameter initialization and evaluation of simulation results. Although most datasets are available in standard formats such as NetCDF, HDF, or GeoTIFF, differences in preprocessing rules, unit conversions, dataset identifiers, and distribution methods require individual modeling efforts to maintain separate databases, complicating ongoing model development and evaluation. Building on the 2022 release of GriddingMachine, this study improves data preprocessing, distribution, and reading. Shared YAML configurations describe source data structures and transformation rules; an independent catalog manages dataset tags, mirrors, and integrity metadata; and unified interfaces organize land parameters and meteorological forcing. In addition to Julia support, we have adapted automatic downloading of the updated datasets for MATLAB, Octave, Python, and R, and added automatic data retrieval interfaces for C and Fortran. These updates enable researchers to process, retrieve, and access gridded data through a consistent workflow, reducing repeated data preparation and maintenance across Earth system models and facilitating scientific research and applications.</w:t>
+        <w:t>Earth system models rely on gridded data at regional to global scales for parameter initialization and evaluation of simulation results. Although most datasets are available in standard formats such as NetCDF, HDF, or GeoTIFF, differences in source-processing rules, unit conversion, data identification, and distribution methods require each model to maintain its own database, creating unnecessary difficulties for continued model development and evaluation. Building on the 2022 release of GriddingMachine, this study improves data preprocessing, distribution, and data reading. Shared YAML configurations describe source data structures and transformation rules; an independent catalog manages standardized-data tags, mirrors, and integrity metadata; and unified interfaces organize land parameters and meteorological forcing. In addition to Julia, we have adapted automatic downloading of the updated data for MATLAB, Octave, Python, and R, and added automatic data-retrieval entry points for C and Fortran. These updates enable researchers to process, retrieve, and access gridded data through a consistent workflow, reducing repeated data preparation and maintenance across Earth system models and facilitating scientific research and applications.</w:t>
       </w:r>
     </w:p>
     <w:p>
@@ -198,7 +198,7 @@
         <w:rPr>
           <w:rFonts w:ascii="Times New Roman" w:hAnsi="Times New Roman" w:eastAsia="宋体"/>
         </w:rPr>
-        <w:t>地球系统模式以数值方法描述大气、海洋及其相互作用，其参数初始化、边界条件、气象驱动和结果验证均依赖区域至全球尺度的网格数据。此类数据由多个研究团队和业务机构提供，在文件格式、空间投影、维度顺序、经纬度方向、时间组织、单位、缩放方式、缺失值表示和元数据结构等方面存在差异。研究人员需要完成数据发现、下载、重排或重投影、数值转换、质量检查和模式接口适配，才能将可获得的数据用于可重复的模式计算。科学数据管理正在由单纯的数据公开转向强调可发现（</w:t>
+        <w:t>地球系统模式以数值方法描述大气、海洋及其相互作用，其参数初始化、边界条件、气象驱动和结果验证均依赖区域至全球尺度的网格数据。此类数据由多个研究团队和业务机构提供，在文件格式、空间投影、维度顺序、经纬度方向、时间组织、单位、缩放方式、缺失值表示和元数据结构等方面存在差异。研究人员需要完成数据发现、下载、重排或重投影、数值转换、质量检查和模式接口适配，才能将可获得的数据用于可重复的模式计算。因此，科学数据管理正在由单纯的数据公开转向强调可发现（</w:t>
       </w:r>
       <w:r>
         <w:rPr>
@@ -282,7 +282,7 @@
         <w:rPr>
           <w:rFonts w:ascii="Times New Roman" w:hAnsi="Times New Roman" w:eastAsia="宋体"/>
         </w:rPr>
-        <w:t>围绕这一问题，新版GriddingMachine形成三个相互衔接的功能层。第一，数据生产与标准化层以共享YAML配置规范表达源维度、坐标、数值变换、Gapfill和质量控制，使异构源到标准NetCDF的转换规则成为可执行生产契约。第二，数据目录与可信分发层将数据目录与访问软件解耦，以逻辑标签连接发布副本，并通过直接NetCDF与事务式获取组织下载路径；对于登记了文件字节数和SHA-256的条目，获取流程进一步执行严格内容核验以维护稳定产品标识。第三，模式输入组织层以稳定标签连接统一读取、陆面参数融合和气象驱动组织，使标准产品形成满足模型接口要求的数据结构。三层共同构成“异构数据生产—产品登记与完整性核验—模式输入组织”的连续路径。</w:t>
+        <w:t>围绕这一问题，新版GriddingMachine形成三个相互衔接的功能层。第一，数据生产与标准化层以共享YAML配置规范表达源维度、坐标、数值变换、Gapfill和质量控制，使异构源到标准NetCDF的转换规则成为可执行生产契约。第二，数据目录与可信分发层将数据目录与访问软件解耦，以逻辑标签连接发布副本，并通过直接NetCDF与事务式获取组织下载路径；对于登记了文件字节数和SHA-256的条目，获取流程进一步执行严格内容核验以维护稳定产品标识。第三，模式输入组织层以稳定标签连接统一读取、陆面参数融合和气象驱动组织，使标准化数据形成满足模式接口要求的数据结构。三层共同构成“异构数据生产—产品登记与完整性核验—模式输入组织”的连续路径。</w:t>
       </w:r>
     </w:p>
     <w:p>

</xml_diff>

<commit_message>
restructure introduction into advisor four-step logic
</commit_message>
<xml_diff>
--- a/论文/GriddingMachine论文初稿_v0.3_语言优化版.docx
+++ b/论文/GriddingMachine论文初稿_v0.3_语言优化版.docx
@@ -266,7 +266,7 @@
         <w:rPr>
           <w:rFonts w:ascii="Times New Roman" w:hAnsi="Times New Roman" w:eastAsia="宋体"/>
         </w:rPr>
-        <w:t>针对上述问题，改进方向应当同时覆盖数据生产和模式使用两个环节：用共享配置显式记录源数据维度、坐标、数值变换和缺失值处理，用独立目录维护数据标签、版本、镜像及可核验的完整性信息，并用统一读取接口把标准化数据组织为模式需要的参数、驱动和时间序列。这样的设计可以使数据处理规则、数据目录和访问软件分别维护，同时通过稳定标签和标准NetCDF保持衔接。</w:t>
+        <w:t>针对上述问题，改进方向应当同时覆盖数据生产和模式使用两个环节：用共享配置显式记录源数据维度、坐标、数值变换和缺失值处理，用独立目录维护数据标签、版本、镜像及可核验的完整性信息，并用统一读取接口把标准化数据组织为模式需要的参数、驱动和时间序列。这样的设计可以使数据处理规则、数据目录和访问软件分别维护，同时通过稳定标签和标准 NetCDF 保持衔接。</w:t>
       </w:r>
     </w:p>
     <w:p>
@@ -274,35 +274,7 @@
         <w:rPr>
           <w:rFonts w:ascii="Times New Roman" w:hAnsi="Times New Roman" w:eastAsia="宋体"/>
         </w:rPr>
-        <w:t>本文在2022版GriddingMachine基础上，更新数据预处理、数据分发和数据读取流程，形成数据生产与标准化、数据目录与获取、模式输入组织三个相互衔接的环节。研究通过受控配置和维度变换实例、OISST V2.1标准化、ELEV与LAI分发效率比较、FTP—Zenodo镜像获取以及US-NR1模式输入案例，评价新版框架的数据一致性、可执行性和接口适配能力；同时适配MATLAB、Octave、Python和R对新版数据的自动获取，并新增C和Fortran的自动获取入口。</w:t>
-      </w:r>
-    </w:p>
-    <w:p>
-      <w:r>
-        <w:rPr>
-          <w:rFonts w:ascii="Times New Roman" w:hAnsi="Times New Roman" w:eastAsia="宋体"/>
-        </w:rPr>
-        <w:t>围绕这一问题，新版GriddingMachine形成三个相互衔接的功能层。第一，数据生产与标准化层以共享YAML配置规范表达源维度、坐标、数值变换、Gapfill和质量控制，使异构源到标准NetCDF的转换规则成为可执行生产契约。第二，数据目录与可信分发层将数据目录与访问软件解耦，以逻辑标签连接发布副本，并通过直接NetCDF与事务式获取组织下载路径；对于登记了文件字节数和SHA-256的条目，获取流程进一步执行严格内容核验以维护稳定产品标识。第三，模式输入组织层以稳定标签连接统一读取、陆面参数融合和气象驱动组织，使标准化数据形成满足模式接口要求的数据结构。三层共同构成“异构数据生产—产品登记与完整性核验—模式输入组织”的连续路径。</w:t>
-      </w:r>
-    </w:p>
-    <w:p>
-      <w:r>
-        <w:rPr>
-          <w:rFonts w:ascii="Times New Roman" w:hAnsi="Times New Roman" w:eastAsia="宋体"/>
-        </w:rPr>
-        <w:t>本文采用受控实例与真实地学数据分层评价上述路径：以31组生产实例和OISST V2.1数据转换[9]检验标准化规则及真实异构源适配；以ELEV和LAI比较直接NetCDF与外层</w:t>
-      </w:r>
-      <w:r>
-        <w:rPr>
-          <w:rFonts w:ascii="Consolas" w:hAnsi="Consolas" w:eastAsia="等线"/>
-        </w:rPr>
-        <w:t>tar.gz</w:t>
-      </w:r>
-      <w:r>
-        <w:rPr>
-          <w:rFonts w:ascii="Times New Roman" w:hAnsi="Times New Roman" w:eastAsia="宋体"/>
-        </w:rPr>
-        <w:t>的分发路径，并结合13类受控状态场景及FTP—Zenodo同文件获取检验事务式多镜像机制；以14类陆面数据和8类ERA5逐时数据[10]构成的US-NR1案例检验标准NetCDF到模式输入组织的接口链路。跨操作系统持续集成作为横向验证，用于检查固定依赖条件下核心实现的运行一致性。</w:t>
+        <w:t>本文在 2022 版 GriddingMachine 基础上，更新数据预处理、数据分发和数据读取流程，形成数据生产与标准化、数据目录与获取、模式输入组织三个相互衔接的环节。数据生产与标准化层以共享 YAML 配置规范表达源维度、坐标、数值变换、Gapfill 和质量控制；数据目录与获取层以逻辑标签连接数据副本，并对登记了文件字节数和 SHA-256 的条目执行内容核验；模式输入组织层通过统一读取、陆面参数融合和气象驱动组织形成满足模式接口要求的数据结构。研究通过 31 组生产实例、OISST V2.1 标准化、ELEV 与 LAI 分发效率比较、FTP—Zenodo 镜像获取以及 US-NR1 模式输入案例，评价新版框架的数据一致性、可执行性和接口适配能力；同时适配 MATLAB、Octave、Python 和 R 对新版数据的自动获取，并新增 C 和 Fortran 的自动获取入口。</w:t>
       </w:r>
     </w:p>
     <w:p>

</xml_diff>

<commit_message>
refine introduction paragraph structure
</commit_message>
<xml_diff>
--- a/论文/GriddingMachine论文初稿_v0.3_语言优化版.docx
+++ b/论文/GriddingMachine论文初稿_v0.3_语言优化版.docx
@@ -274,7 +274,15 @@
         <w:rPr>
           <w:rFonts w:ascii="Times New Roman" w:hAnsi="Times New Roman" w:eastAsia="宋体"/>
         </w:rPr>
-        <w:t>本文在 2022 版 GriddingMachine 基础上，更新数据预处理、数据分发和数据读取流程，形成数据生产与标准化、数据目录与获取、模式输入组织三个相互衔接的环节。数据生产与标准化层以共享 YAML 配置规范表达源维度、坐标、数值变换、Gapfill 和质量控制；数据目录与获取层以逻辑标签连接数据副本，并对登记了文件字节数和 SHA-256 的条目执行内容核验；模式输入组织层通过统一读取、陆面参数融合和气象驱动组织形成满足模式接口要求的数据结构。研究通过 31 组生产实例、OISST V2.1 标准化、ELEV 与 LAI 分发效率比较、FTP—Zenodo 镜像获取以及 US-NR1 模式输入案例，评价新版框架的数据一致性、可执行性和接口适配能力；同时适配 MATLAB、Octave、Python 和 R 对新版数据的自动获取，并新增 C 和 Fortran 的自动获取入口。</w:t>
+        <w:t>本文在 2022 版 GriddingMachine 基础上，更新数据预处理、数据分发和数据读取流程，形成数据生产与标准化、数据目录与获取、模式输入组织三个相互衔接的环节。数据生产与标准化层以共享 YAML 配置规范表达源维度、坐标、数值变换、Gapfill 和质量控制；数据目录与获取层以逻辑标签连接数据副本，并对登记了文件字节数和 SHA-256 的条目执行内容核验；模式输入组织层通过统一读取、陆面参数融合和气象驱动组织形成满足模式接口要求的数据结构。。</w:t>
+      </w:r>
+    </w:p>
+    <w:p>
+      <w:r>
+        <w:rPr>
+          <w:rFonts w:ascii="Times New Roman" w:hAnsi="Times New Roman" w:eastAsia="宋体"/>
+        </w:rPr>
+        <w:t>本文在 2022 版 GriddingMachine 基础上，更新数据预处理、数据分发和数据读取流程，并通过 31 组生产实例、OISST V2.1 标准化、ELEV 与 LAI 分发效率比较、FTP—Zenodo 镜像获取以及 US-NR1 模式输入案例，评价新版框架的数据一致性、可执行性和接口适配能力；同时适配 MATLAB、Octave、Python 和 R 对新版数据的自动获取，并新增 C 和 Fortran 的自动获取入口。</w:t>
       </w:r>
     </w:p>
     <w:p>

</xml_diff>

<commit_message>
clarify case terminology in introduction and methods
</commit_message>
<xml_diff>
--- a/论文/GriddingMachine论文初稿_v0.3_语言优化版.docx
+++ b/论文/GriddingMachine论文初稿_v0.3_语言优化版.docx
@@ -274,7 +274,7 @@
         <w:rPr>
           <w:rFonts w:ascii="Times New Roman" w:hAnsi="Times New Roman" w:eastAsia="宋体"/>
         </w:rPr>
-        <w:t>本文在 2022 版 GriddingMachine 基础上，更新数据预处理、数据分发和数据读取流程，形成数据生产与标准化、数据目录与获取、模式输入组织三个相互衔接的环节。数据生产与标准化层以共享 YAML 配置规范表达源维度、坐标、数值变换、Gapfill 和质量控制；数据目录与获取层以逻辑标签连接数据副本，并对登记了文件字节数和 SHA-256 的条目执行内容核验；模式输入组织层通过统一读取、陆面参数融合和气象驱动组织形成满足模式接口要求的数据结构。。</w:t>
+        <w:t>本文在 2022 版 GriddingMachine 基础上，更新数据预处理、数据分发和数据读取流程，形成数据生产与标准化、数据目录与获取、模式输入组织三个相互衔接的环节。数据生产与标准化层以共享 YAML 配置规范表达源维度、坐标、数值变换、Gapfill 和质量控制；数据目录与获取层以逻辑标签连接数据副本，并对登记了文件字节数和 SHA-256 的条目执行内容核验；模式输入组织层通过统一读取、陆面参数融合和气象驱动组织形成满足模式接口要求的数据结构。</w:t>
       </w:r>
     </w:p>
     <w:p>
@@ -282,7 +282,7 @@
         <w:rPr>
           <w:rFonts w:ascii="Times New Roman" w:hAnsi="Times New Roman" w:eastAsia="宋体"/>
         </w:rPr>
-        <w:t>本文在 2022 版 GriddingMachine 基础上，更新数据预处理、数据分发和数据读取流程，并通过 31 组生产实例、OISST V2.1 标准化、ELEV 与 LAI 分发效率比较、FTP—Zenodo 镜像获取以及 US-NR1 模式输入案例，评价新版框架的数据一致性、可执行性和接口适配能力；同时适配 MATLAB、Octave、Python 和 R 对新版数据的自动获取，并新增 C 和 Fortran 的自动获取入口。</w:t>
+        <w:t>本文通过受控数据处理实例、真实网格数据标准化、网络镜像获取和模式输入案例，评价新版框架的数据一致性、可执行性和接口适配能力；同时适配 MATLAB、Octave、Python 和 R 对新版数据的自动获取，并新增 C 和 Fortran 的自动获取入口。</w:t>
       </w:r>
     </w:p>
     <w:p>
@@ -3677,7 +3677,7 @@
         <w:rPr>
           <w:rFonts w:ascii="Times New Roman" w:hAnsi="Times New Roman" w:eastAsia="宋体"/>
         </w:rPr>
-        <w:t>OISST实际产品用于进一步呈现共享生产契约对异构源结构的适配能力。案例采用NOAA/NCEI 0.25°逐日最优插值海表温度OISST V2.1中仅使用AVHRR数据的正式产品[9]，选取2022年2月25日文件。原始</w:t>
+        <w:t>OISST（最优插值海表温度）实际数据用于进一步呈现共享生产契约对异构源结构的适配能力。案例采用NOAA/NCEI 0.25°逐日最优插值海表温度OISST V2.1中仅使用AVHRR数据的正式产品[9]，选取2022年2月25日文件。原始</w:t>
       </w:r>
       <w:r>
         <w:rPr>
@@ -3844,7 +3844,7 @@
         <w:rPr>
           <w:rFonts w:ascii="Times New Roman" w:hAnsi="Times New Roman" w:eastAsia="宋体"/>
         </w:rPr>
-        <w:t>直接NetCDF分发效率采用二维静态高程</w:t>
+        <w:t>直接NetCDF分发效率采用二维静态高程（ELEV）</w:t>
       </w:r>
       <w:r>
         <w:rPr>
@@ -3856,7 +3856,7 @@
         <w:rPr>
           <w:rFonts w:ascii="Times New Roman" w:hAnsi="Times New Roman" w:eastAsia="宋体"/>
         </w:rPr>
-        <w:t>和三维8日叶面积指数</w:t>
+        <w:t>和三维8日叶面积指数（LAI）</w:t>
       </w:r>
       <w:r>
         <w:rPr>
@@ -3939,7 +3939,7 @@
         <w:rPr>
           <w:rFonts w:ascii="Times New Roman" w:hAnsi="Times New Roman" w:eastAsia="宋体"/>
         </w:rPr>
-        <w:t>多镜像分析在两个独立环境中构建内容一致、访问状态可配置的镜像集合，通过延迟分数组织候选顺序，并设置13类受控状态场景，覆盖候选排序、镜像回退、网络访问异常、缓存命中、内容完整性异常和候选耗尽过程。每类场景在各环境中重复5次，记录候选选择、镜像遍历、正式文件状态及SHA-256，据此刻画事务式获取在镜像切换过程中的文件选择、校验与落盘行为。校园网FTP与Zenodo访问进一步呈现机构镜像和公共镜像的互补分发特征与内容一致性；完整场景矩阵列于补充材料S6。</w:t>
+        <w:t>多镜像分析在两个独立环境中构建内容一致、访问状态可配置的镜像集合，通过延迟分数组织候选顺序，并设置13类受控状态场景，覆盖候选排序、镜像回退、网络访问异常、缓存命中、内容完整性异常和候选耗尽过程。每类场景在各环境中重复5次，记录候选选择、镜像遍历、正式文件状态及SHA-256，据此刻画事务式获取在镜像切换过程中的文件选择、校验与落盘行为。校园网机构FTP与Zenodo公共存储的访问进一步呈现机构镜像和公共镜像的互补分发特征与内容一致性；完整场景矩阵列于补充材料S6。</w:t>
       </w:r>
     </w:p>
     <w:p>
@@ -3990,7 +3990,7 @@
         <w:rPr>
           <w:rFonts w:ascii="Times New Roman" w:hAnsi="Times New Roman" w:eastAsia="宋体"/>
         </w:rPr>
-        <w:t>模式输入组织案例连接标准网格读取、陆面参数融合、气象驱动组织与Emerald初始化。确定性参考数据用于核对字段名、形状、类型、时间索引和缺失值处理；陆面案例采用2020年第二套陆面参数集合，在US-NR1附近植被格点和典型非植被格点呈现不同陆面状态下的模型入口。</w:t>
+        <w:t>模式输入组织案例连接标准网格读取、陆面参数融合、气象驱动组织与Emerald初始化。确定性参考数据用于核对字段名、形状、类型、时间索引和缺失值处理；陆面案例采用2020年第二套陆面参数集合，在US-NR1研究站点附近植被格点和典型非植被格点呈现不同陆面状态下的模型入口。</w:t>
       </w:r>
     </w:p>
     <w:p>

</xml_diff>

<commit_message>
clarify limitations of original GriddingMachine
</commit_message>
<xml_diff>
--- a/论文/GriddingMachine论文初稿_v0.3_语言优化版.docx
+++ b/论文/GriddingMachine论文初稿_v0.3_语言优化版.docx
@@ -258,7 +258,19 @@
         <w:rPr>
           <w:rFonts w:ascii="Times New Roman" w:hAnsi="Times New Roman" w:eastAsia="宋体"/>
         </w:rPr>
-        <w:t>Wang等[4]于2022年发布了基于Julia语言的GriddingMachine数据库，旨在将常用于陆面和地球系统模拟的全球数据处理为具有统一空间和变量约定的NetCDF文件，并通过标签、数据库文件Artifacts.toml和Julia语言的artifact机制实现数据管理与自动下载，同时提供Julia、MATLAB、Octave、Python和R接口。2022版已经建立了统一网格约定、数据标签和多语言访问基础，但其数据预处理脚本、分发归档和目录维护仍主要围绕当时的数据组织方式展开。随着数据类型和模式应用链条扩展，有必要进一步统一数据生产、目录维护、数据获取和模式输入组织。</w:t>
+        <w:t>Wang等[4]于2022年发布了基于Julia语言的GriddingMachine数据库和软件，旨在将常用于陆面和地球系统模拟的全球数据处理为具有统一空间和变量约定的NetCDF文件，并通过标签、Artifacts.toml文件和Julia artifact机制实现数据管理与自动下载，同时提供Julia、MATLAB、Octave、Python和R接口。2022版已经建立了统一网格约定、数据标签和多语言访问基础，但其数据处理主要依赖数据集专用脚本，标准化数据以带有标签文件的</w:t>
+      </w:r>
+      <w:r>
+        <w:rPr>
+          <w:rFonts w:ascii="Consolas" w:hAnsi="Consolas" w:eastAsia="等线"/>
+        </w:rPr>
+        <w:t>tar.gz</w:t>
+      </w:r>
+      <w:r>
+        <w:rPr>
+          <w:rFonts w:ascii="Times New Roman" w:hAnsi="Times New Roman" w:eastAsia="宋体"/>
+        </w:rPr>
+        <w:t>归档分发，数据目录也随软件包维护。随着数据类型、分发位置和模式应用链条扩展，源数据处理规则、数据目录、网络获取和模式输入之间需要进一步统一。</w:t>
       </w:r>
     </w:p>
     <w:p>

</xml_diff>

<commit_message>
revise manuscript text and synchronize Word draft
</commit_message>
<xml_diff>
--- a/论文/GriddingMachine论文初稿_v0.3_语言优化版.docx
+++ b/论文/GriddingMachine论文初稿_v0.3_语言优化版.docx
@@ -9,7 +9,7 @@
       </w:pPr>
       <w:r>
         <w:rPr>
-          <w:rFonts w:ascii="Times New Roman" w:hAnsi="Times New Roman" w:eastAsia="宋体"/>
+          <w:rFonts w:ascii="Times New Roman" w:hAnsi="Times New Roman" w:eastAsia="Songti SC"/>
         </w:rPr>
         <w:t>面向地球系统模式的全球网格数据库：GriddingMachine框架更新与应用</w:t>
       </w:r>
@@ -17,27 +17,27 @@
     <w:p>
       <w:r>
         <w:rPr>
-          <w:rFonts w:ascii="Times New Roman" w:hAnsi="Times New Roman" w:eastAsia="宋体"/>
+          <w:rFonts w:ascii="Times New Roman" w:hAnsi="Times New Roman" w:eastAsia="Songti SC"/>
           <w:b/>
         </w:rPr>
         <w:t>姜皓（Hao Jiang）</w:t>
       </w:r>
       <w:r>
         <w:rPr>
-          <w:rFonts w:ascii="Times New Roman" w:hAnsi="Times New Roman" w:eastAsia="宋体"/>
+          <w:rFonts w:ascii="Times New Roman" w:hAnsi="Times New Roman" w:eastAsia="Songti SC"/>
         </w:rPr>
         <w:t>^1，</w:t>
       </w:r>
       <w:r>
         <w:rPr>
-          <w:rFonts w:ascii="Times New Roman" w:hAnsi="Times New Roman" w:eastAsia="宋体"/>
+          <w:rFonts w:ascii="Times New Roman" w:hAnsi="Times New Roman" w:eastAsia="Songti SC"/>
           <w:b/>
         </w:rPr>
         <w:t>王玉杰（Yujie Wang）</w:t>
       </w:r>
       <w:r>
         <w:rPr>
-          <w:rFonts w:ascii="Times New Roman" w:hAnsi="Times New Roman" w:eastAsia="宋体"/>
+          <w:rFonts w:ascii="Times New Roman" w:hAnsi="Times New Roman" w:eastAsia="Songti SC"/>
         </w:rPr>
         <w:t>^1*</w:t>
       </w:r>
@@ -45,7 +45,7 @@
     <w:p>
       <w:r>
         <w:rPr>
-          <w:rFonts w:ascii="Times New Roman" w:hAnsi="Times New Roman" w:eastAsia="宋体"/>
+          <w:rFonts w:ascii="Times New Roman" w:hAnsi="Times New Roman" w:eastAsia="Songti SC"/>
         </w:rPr>
         <w:t>1. 中国科学技术大学地球和空间科学学院，安徽 合肥 230026</w:t>
       </w:r>
@@ -53,7 +53,7 @@
     <w:p>
       <w:r>
         <w:rPr>
-          <w:rFonts w:ascii="Times New Roman" w:hAnsi="Times New Roman" w:eastAsia="宋体"/>
+          <w:rFonts w:ascii="Times New Roman" w:hAnsi="Times New Roman" w:eastAsia="Songti SC"/>
         </w:rPr>
         <w:t>姜皓，E-mail：hao.jiang@mail.ustc.edu.cn；ORCID：https://orcid.org/0009-0009-8295-8661</w:t>
       </w:r>
@@ -61,7 +61,7 @@
     <w:p>
       <w:r>
         <w:rPr>
-          <w:rFonts w:ascii="Times New Roman" w:hAnsi="Times New Roman" w:eastAsia="宋体"/>
+          <w:rFonts w:ascii="Times New Roman" w:hAnsi="Times New Roman" w:eastAsia="Songti SC"/>
         </w:rPr>
         <w:t>\* 通讯作者：王玉杰，wyujie@ustc.edu.cn</w:t>
       </w:r>
@@ -72,7 +72,7 @@
       </w:pPr>
       <w:r>
         <w:rPr>
-          <w:rFonts w:ascii="Times New Roman" w:hAnsi="Times New Roman" w:eastAsia="宋体"/>
+          <w:rFonts w:ascii="Times New Roman" w:hAnsi="Times New Roman" w:eastAsia="Songti SC"/>
         </w:rPr>
         <w:t>摘要</w:t>
       </w:r>
@@ -80,7 +80,7 @@
     <w:p>
       <w:r>
         <w:rPr>
-          <w:rFonts w:ascii="Times New Roman" w:hAnsi="Times New Roman" w:eastAsia="宋体"/>
+          <w:rFonts w:ascii="Times New Roman" w:hAnsi="Times New Roman" w:eastAsia="Songti SC"/>
         </w:rPr>
         <w:t>地球系统模式依赖区域至全球尺度的网格数据进行参数初始化和结果验证。尽管当前数据大多采用NetCDF、HDF或GeoTIFF等标准格式，源数据处理规则、单位换算、数据标识和网络分发方式仍存在差异，使得每个模式不得不单独维护数据库，给模式持续更新和验证带来不必要的困难。本文在2022版GriddingMachine基础上，完善数据预处理、数据分发和数据读取流程：以共享YAML配置描述源数据结构及转换规则，以独立目录管理标准化数据的标签、镜像和完整性信息，并通过统一接口组织陆面参数和气象驱动。除Julia外，我们适配了MATLAB、Octave、Python和R语言对新版数据的自动下载支持，并新增C和Fortran的自动获取入口。这些更新使研究人员能够通过统一方式处理、获取和调用网格数据，减少不同地球系统模式重复整理和维护数据的工作，为科学研究与应用提供便利。</w:t>
       </w:r>
@@ -88,14 +88,14 @@
     <w:p>
       <w:r>
         <w:rPr>
-          <w:rFonts w:ascii="Times New Roman" w:hAnsi="Times New Roman" w:eastAsia="宋体"/>
+          <w:rFonts w:ascii="Times New Roman" w:hAnsi="Times New Roman" w:eastAsia="Songti SC"/>
           <w:b/>
         </w:rPr>
         <w:t>关键词：</w:t>
       </w:r>
       <w:r>
         <w:rPr>
-          <w:rFonts w:ascii="Times New Roman" w:hAnsi="Times New Roman" w:eastAsia="宋体"/>
+          <w:rFonts w:ascii="Times New Roman" w:hAnsi="Times New Roman" w:eastAsia="Songti SC"/>
         </w:rPr>
         <w:t xml:space="preserve"> 地球系统模式；全球网格数据库；数据标准化；NetCDF；数据完整性；模式输入</w:t>
       </w:r>
@@ -103,7 +103,7 @@
     <w:p>
       <w:r>
         <w:rPr>
-          <w:rFonts w:ascii="Times New Roman" w:hAnsi="Times New Roman" w:eastAsia="宋体"/>
+          <w:rFonts w:ascii="Times New Roman" w:hAnsi="Times New Roman" w:eastAsia="Songti SC"/>
           <w:b/>
         </w:rPr>
         <w:t>A Global Gridded Database for Earth System Models: Advances and Applications of GriddingMachine</w:t>
@@ -112,14 +112,14 @@
     <w:p>
       <w:r>
         <w:rPr>
-          <w:rFonts w:ascii="Times New Roman" w:hAnsi="Times New Roman" w:eastAsia="宋体"/>
+          <w:rFonts w:ascii="Times New Roman" w:hAnsi="Times New Roman" w:eastAsia="Songti SC"/>
           <w:b/>
         </w:rPr>
         <w:t>Hao JIANG^1, Yujie WANG^1\</w:t>
       </w:r>
       <w:r>
         <w:rPr>
-          <w:rFonts w:ascii="Times New Roman" w:hAnsi="Times New Roman" w:eastAsia="宋体"/>
+          <w:rFonts w:ascii="Times New Roman" w:hAnsi="Times New Roman" w:eastAsia="Songti SC"/>
         </w:rPr>
         <w:t>*</w:t>
       </w:r>
@@ -127,7 +127,7 @@
     <w:p>
       <w:r>
         <w:rPr>
-          <w:rFonts w:ascii="Times New Roman" w:hAnsi="Times New Roman" w:eastAsia="宋体"/>
+          <w:rFonts w:ascii="Times New Roman" w:hAnsi="Times New Roman" w:eastAsia="Songti SC"/>
         </w:rPr>
         <w:t>1. School of Earth and Space Sciences, University of Science and Technology of China, Hefei 230026, China</w:t>
       </w:r>
@@ -135,7 +135,7 @@
     <w:p>
       <w:r>
         <w:rPr>
-          <w:rFonts w:ascii="Times New Roman" w:hAnsi="Times New Roman" w:eastAsia="宋体"/>
+          <w:rFonts w:ascii="Times New Roman" w:hAnsi="Times New Roman" w:eastAsia="Songti SC"/>
         </w:rPr>
         <w:t>Hao Jiang, E-mail: hao.jiang@mail.ustc.edu.cn; ORCID: https://orcid.org/0009-0009-8295-8661</w:t>
       </w:r>
@@ -143,7 +143,7 @@
     <w:p>
       <w:r>
         <w:rPr>
-          <w:rFonts w:ascii="Times New Roman" w:hAnsi="Times New Roman" w:eastAsia="宋体"/>
+          <w:rFonts w:ascii="Times New Roman" w:hAnsi="Times New Roman" w:eastAsia="Songti SC"/>
         </w:rPr>
         <w:t>\* Corresponding author: Yujie Wang, wyujie@ustc.edu.cn</w:t>
       </w:r>
@@ -154,7 +154,7 @@
       </w:pPr>
       <w:r>
         <w:rPr>
-          <w:rFonts w:ascii="Times New Roman" w:hAnsi="Times New Roman" w:eastAsia="宋体"/>
+          <w:rFonts w:ascii="Times New Roman" w:hAnsi="Times New Roman" w:eastAsia="Songti SC"/>
         </w:rPr>
         <w:t>Abstract</w:t>
       </w:r>
@@ -162,22 +162,22 @@
     <w:p>
       <w:r>
         <w:rPr>
-          <w:rFonts w:ascii="Times New Roman" w:hAnsi="Times New Roman" w:eastAsia="宋体"/>
-        </w:rPr>
-        <w:t>Earth system models rely on gridded data at regional to global scales for parameter initialization and evaluation of simulation results. Although most datasets are available in standard formats such as NetCDF, HDF, or GeoTIFF, differences in source-processing rules, unit conversion, data identification, and distribution methods require each model to maintain its own database, creating unnecessary difficulties for continued model development and evaluation. Building on the 2022 release of GriddingMachine, this study improves data preprocessing, distribution, and data reading. Shared YAML configurations describe source data structures and transformation rules; an independent catalog manages standardized-data tags, mirrors, and integrity metadata; and unified interfaces organize land parameters and meteorological forcing. In addition to Julia, we have adapted automatic downloading of the updated data for MATLAB, Octave, Python, and R, and added automatic data-retrieval entry points for C and Fortran. These updates enable researchers to process, retrieve, and access gridded data through a consistent workflow, reducing repeated data preparation and maintenance across Earth system models and facilitating scientific research and applications.</w:t>
+          <w:rFonts w:ascii="Times New Roman" w:hAnsi="Times New Roman" w:eastAsia="Songti SC"/>
+        </w:rPr>
+        <w:t>Earth system models rely on gridded data at regional to global scales for parameter initialization and evaluation of simulation results. Although most datasets are available in standard formats such as NetCDF, HDF, or GeoTIFF, differences in source-processing rules, unit conversion, data identification, and distribution methods require each model to maintain its own database, creating unnecessary difficulties for continued model development and evaluation. Building on the 2022 release of GriddingMachine, this study improves data preprocessing, distribution, and data reading. Shared YAML configurations describe source data structures and transformation rules; an independent catalog manages dataset tags, mirrors, and integrity metadata; and unified interfaces organize land parameters and meteorological forcing. In addition to Julia, we have adapted automatic downloading of the updated data for MATLAB, Octave, Python, and R, and added automatic data retrieval entry points for C and Fortran. These updates enable researchers to process, retrieve, and access gridded data through a consistent workflow, reducing repeated data preparation and maintenance across Earth system models and facilitating scientific research and applications.</w:t>
       </w:r>
     </w:p>
     <w:p>
       <w:r>
         <w:rPr>
-          <w:rFonts w:ascii="Times New Roman" w:hAnsi="Times New Roman" w:eastAsia="宋体"/>
+          <w:rFonts w:ascii="Times New Roman" w:hAnsi="Times New Roman" w:eastAsia="Songti SC"/>
           <w:b/>
         </w:rPr>
         <w:t>Keywords:</w:t>
       </w:r>
       <w:r>
         <w:rPr>
-          <w:rFonts w:ascii="Times New Roman" w:hAnsi="Times New Roman" w:eastAsia="宋体"/>
+          <w:rFonts w:ascii="Times New Roman" w:hAnsi="Times New Roman" w:eastAsia="Songti SC"/>
         </w:rPr>
         <w:t xml:space="preserve"> Earth system models; global gridded database; data standardization; NetCDF; data integrity; model input</w:t>
       </w:r>
@@ -188,7 +188,7 @@
       </w:pPr>
       <w:r>
         <w:rPr>
-          <w:rFonts w:ascii="Times New Roman" w:hAnsi="Times New Roman" w:eastAsia="宋体"/>
+          <w:rFonts w:ascii="Times New Roman" w:hAnsi="Times New Roman" w:eastAsia="Songti SC"/>
         </w:rPr>
         <w:t>1 引言</w:t>
       </w:r>
@@ -196,79 +196,79 @@
     <w:p>
       <w:r>
         <w:rPr>
-          <w:rFonts w:ascii="Times New Roman" w:hAnsi="Times New Roman" w:eastAsia="宋体"/>
+          <w:rFonts w:ascii="Times New Roman" w:hAnsi="Times New Roman" w:eastAsia="Songti SC"/>
         </w:rPr>
         <w:t>地球系统模式以数值方法描述大气、海洋及其相互作用，其参数初始化、边界条件、气象驱动和结果验证均依赖区域至全球尺度的网格数据。此类数据由多个研究团队和业务机构提供，在文件格式、空间投影、维度顺序、经纬度方向、时间组织、单位、缩放方式、缺失值表示和元数据结构等方面存在差异。研究人员需要完成数据发现、下载、重排或重投影、数值转换、质量检查和模式接口适配，才能将可获得的数据用于可重复的模式计算。因此，科学数据管理正在由单纯的数据公开转向强调可发现（</w:t>
       </w:r>
       <w:r>
         <w:rPr>
-          <w:rFonts w:ascii="Times New Roman" w:hAnsi="Times New Roman" w:eastAsia="宋体"/>
+          <w:rFonts w:ascii="Times New Roman" w:hAnsi="Times New Roman" w:eastAsia="Songti SC"/>
           <w:b/>
         </w:rPr>
         <w:t>F</w:t>
       </w:r>
       <w:r>
         <w:rPr>
-          <w:rFonts w:ascii="Times New Roman" w:hAnsi="Times New Roman" w:eastAsia="宋体"/>
+          <w:rFonts w:ascii="Times New Roman" w:hAnsi="Times New Roman" w:eastAsia="Songti SC"/>
         </w:rPr>
         <w:t>indable）、可获取（</w:t>
       </w:r>
       <w:r>
         <w:rPr>
-          <w:rFonts w:ascii="Times New Roman" w:hAnsi="Times New Roman" w:eastAsia="宋体"/>
+          <w:rFonts w:ascii="Times New Roman" w:hAnsi="Times New Roman" w:eastAsia="Songti SC"/>
           <w:b/>
         </w:rPr>
         <w:t>A</w:t>
       </w:r>
       <w:r>
         <w:rPr>
-          <w:rFonts w:ascii="Times New Roman" w:hAnsi="Times New Roman" w:eastAsia="宋体"/>
+          <w:rFonts w:ascii="Times New Roman" w:hAnsi="Times New Roman" w:eastAsia="Songti SC"/>
         </w:rPr>
         <w:t>ccessible）、可互操作（</w:t>
       </w:r>
       <w:r>
         <w:rPr>
-          <w:rFonts w:ascii="Times New Roman" w:hAnsi="Times New Roman" w:eastAsia="宋体"/>
+          <w:rFonts w:ascii="Times New Roman" w:hAnsi="Times New Roman" w:eastAsia="Songti SC"/>
           <w:b/>
         </w:rPr>
         <w:t>I</w:t>
       </w:r>
       <w:r>
         <w:rPr>
-          <w:rFonts w:ascii="Times New Roman" w:hAnsi="Times New Roman" w:eastAsia="宋体"/>
+          <w:rFonts w:ascii="Times New Roman" w:hAnsi="Times New Roman" w:eastAsia="Songti SC"/>
         </w:rPr>
         <w:t>nteroperable）和可复用（</w:t>
       </w:r>
       <w:r>
         <w:rPr>
-          <w:rFonts w:ascii="Times New Roman" w:hAnsi="Times New Roman" w:eastAsia="宋体"/>
+          <w:rFonts w:ascii="Times New Roman" w:hAnsi="Times New Roman" w:eastAsia="Songti SC"/>
           <w:b/>
         </w:rPr>
         <w:t>R</w:t>
       </w:r>
       <w:r>
         <w:rPr>
-          <w:rFonts w:ascii="Times New Roman" w:hAnsi="Times New Roman" w:eastAsia="宋体"/>
-        </w:rPr>
-        <w:t>eusable）的FAIR（Findable, Accessible, Interoperable, Reusable）原则[1]。NetCDF具有自描述、跨系统和适合多维数组等特点，CF元数据约定进一步通过坐标、物理量、单位和时空属性促进不同数据源之间的解释与处理[2]。Google Earth Engine等云平台通过改善数据表达、发现、访问及计算，显著提升了大尺度遥感数据的访问和分析能力[3]。然而，对于面向固定版本、离线缓存和模式直接调用的工作流，研究人员仍需要把数据转换规则、标准产品标识、网络获取内容和下游模式接口连接起来，因此一个适用于本地运行的标准化数据库是非常必要的。</w:t>
+          <w:rFonts w:ascii="Times New Roman" w:hAnsi="Times New Roman" w:eastAsia="Songti SC"/>
+        </w:rPr>
+        <w:t>eusable）的 FAIR 原则[1]。NetCDF具有自描述、跨系统和适合多维数组等特点，CF元数据约定进一步通过坐标、物理量、单位和时空属性促进不同数据源之间的解释与处理[2]。Google Earth Engine等云平台通过改善数据表达、发现、访问及计算，显著提升了大尺度遥感数据的访问和分析能力[3]。然而，对于面向固定版本、离线缓存和模式直接调用的工作流，研究人员仍需要把数据转换规则、标准产品标识、网络获取内容和下游模式接口连接起来，因此一个适用于本地运行的标准化数据库是非常必要的。</w:t>
       </w:r>
     </w:p>
     <w:p>
       <w:r>
         <w:rPr>
-          <w:rFonts w:ascii="Times New Roman" w:hAnsi="Times New Roman" w:eastAsia="宋体"/>
+          <w:rFonts w:ascii="Times New Roman" w:hAnsi="Times New Roman" w:eastAsia="Songti SC"/>
         </w:rPr>
         <w:t>Wang等[4]于2022年发布了基于Julia语言的GriddingMachine数据库和软件，旨在将常用于陆面和地球系统模拟的全球数据处理为具有统一空间和变量约定的NetCDF文件，并通过标签、Artifacts.toml文件和Julia artifact机制实现数据管理与自动下载，同时提供Julia、MATLAB、Octave、Python和R接口。2022版已经建立了统一网格约定、数据标签和多语言访问基础，但其数据处理主要依赖数据集专用脚本，标准化数据以带有标签文件的</w:t>
       </w:r>
       <w:r>
         <w:rPr>
-          <w:rFonts w:ascii="Consolas" w:hAnsi="Consolas" w:eastAsia="等线"/>
+          <w:rFonts w:ascii="Consolas" w:hAnsi="Consolas" w:eastAsia="Songti SC"/>
         </w:rPr>
         <w:t>tar.gz</w:t>
       </w:r>
       <w:r>
         <w:rPr>
-          <w:rFonts w:ascii="Times New Roman" w:hAnsi="Times New Roman" w:eastAsia="宋体"/>
+          <w:rFonts w:ascii="Times New Roman" w:hAnsi="Times New Roman" w:eastAsia="Songti SC"/>
         </w:rPr>
         <w:t>归档分发，数据目录也随软件包维护。随着数据类型、分发位置和模式应用链条扩展，源数据处理规则、数据目录、网络获取和模式输入之间需要进一步统一。</w:t>
       </w:r>
@@ -276,7 +276,7 @@
     <w:p>
       <w:r>
         <w:rPr>
-          <w:rFonts w:ascii="Times New Roman" w:hAnsi="Times New Roman" w:eastAsia="宋体"/>
+          <w:rFonts w:ascii="Times New Roman" w:hAnsi="Times New Roman" w:eastAsia="Songti SC"/>
         </w:rPr>
         <w:t>针对上述问题，改进方向应当同时覆盖数据生产和模式使用两个环节：用共享配置显式记录源数据维度、坐标、数值变换和缺失值处理，用独立目录维护数据标签、版本、镜像及可核验的完整性信息，并用统一读取接口把标准化数据组织为模式需要的参数、驱动和时间序列。这样的设计可以使数据处理规则、数据目录和访问软件分别维护，同时通过稳定标签和标准 NetCDF 保持衔接。</w:t>
       </w:r>
@@ -284,7 +284,7 @@
     <w:p>
       <w:r>
         <w:rPr>
-          <w:rFonts w:ascii="Times New Roman" w:hAnsi="Times New Roman" w:eastAsia="宋体"/>
+          <w:rFonts w:ascii="Times New Roman" w:hAnsi="Times New Roman" w:eastAsia="Songti SC"/>
         </w:rPr>
         <w:t>本文在 2022 版 GriddingMachine 基础上，更新数据预处理、数据分发和数据读取流程，形成数据生产与标准化、数据目录与获取、模式输入组织三个相互衔接的环节。数据生产与标准化层以共享 YAML 配置规范表达源维度、坐标、数值变换、Gapfill 和质量控制；数据目录与获取层以逻辑标签连接数据副本，并对登记了文件字节数和 SHA-256 的条目执行内容核验；模式输入组织层通过统一读取、陆面参数融合和气象驱动组织形成满足模式接口要求的数据结构。</w:t>
       </w:r>
@@ -292,7 +292,7 @@
     <w:p>
       <w:r>
         <w:rPr>
-          <w:rFonts w:ascii="Times New Roman" w:hAnsi="Times New Roman" w:eastAsia="宋体"/>
+          <w:rFonts w:ascii="Times New Roman" w:hAnsi="Times New Roman" w:eastAsia="Songti SC"/>
         </w:rPr>
         <w:t>在上述框架基础上，研究通过受控数据处理实例、真实网格数据标准化、网络镜像获取和模式输入案例，评价新版框架的数据一致性、可执行性和接口适配能力；同时适配 MATLAB、Octave、Python 和 R 对新版数据的自动获取，并新增 C 和 Fortran 的自动获取入口。</w:t>
       </w:r>
@@ -303,7 +303,7 @@
       </w:pPr>
       <w:r>
         <w:rPr>
-          <w:rFonts w:ascii="Times New Roman" w:hAnsi="Times New Roman" w:eastAsia="宋体"/>
+          <w:rFonts w:ascii="Times New Roman" w:hAnsi="Times New Roman" w:eastAsia="Songti SC"/>
         </w:rPr>
         <w:t>2 框架设计与关键方法</w:t>
       </w:r>
@@ -314,7 +314,7 @@
       </w:pPr>
       <w:r>
         <w:rPr>
-          <w:rFonts w:ascii="Times New Roman" w:hAnsi="Times New Roman" w:eastAsia="宋体"/>
+          <w:rFonts w:ascii="Times New Roman" w:hAnsi="Times New Roman" w:eastAsia="Songti SC"/>
         </w:rPr>
         <w:t>2.1 总体架构与数据生命周期</w:t>
       </w:r>
@@ -322,45 +322,45 @@
     <w:p>
       <w:r>
         <w:rPr>
-          <w:rFonts w:ascii="Times New Roman" w:hAnsi="Times New Roman" w:eastAsia="宋体"/>
+          <w:rFonts w:ascii="Times New Roman" w:hAnsi="Times New Roman" w:eastAsia="Songti SC"/>
         </w:rPr>
         <w:t>GriddingMachine新版围绕三个相互衔接的生命周期层次组织（图1）：数据生产与标准化层负责把来源、结构和数值约定不同的地学数据转换为标准NetCDF；数据目录与可信分发层负责维护标签、版本、镜像和完整性元数据，并使数据目录能够独立于</w:t>
       </w:r>
       <w:r>
         <w:rPr>
-          <w:rFonts w:ascii="Consolas" w:hAnsi="Consolas" w:eastAsia="等线"/>
+          <w:rFonts w:ascii="Consolas" w:hAnsi="Consolas" w:eastAsia="Songti SC"/>
         </w:rPr>
         <w:t>GriddingMachine.jl</w:t>
       </w:r>
       <w:r>
         <w:rPr>
-          <w:rFonts w:ascii="Times New Roman" w:hAnsi="Times New Roman" w:eastAsia="宋体"/>
+          <w:rFonts w:ascii="Times New Roman" w:hAnsi="Times New Roman" w:eastAsia="Songti SC"/>
         </w:rPr>
         <w:t>软件包版本更新；模式输入组织层负责数据发现、获取、读取以及陆面参数和气象驱动组织。数据生产与标准化层主要由</w:t>
       </w:r>
       <w:r>
         <w:rPr>
-          <w:rFonts w:ascii="Consolas" w:hAnsi="Consolas" w:eastAsia="等线"/>
+          <w:rFonts w:ascii="Consolas" w:hAnsi="Consolas" w:eastAsia="Songti SC"/>
         </w:rPr>
         <w:t>GriddingMachineDatasets</w:t>
       </w:r>
       <w:r>
         <w:rPr>
-          <w:rFonts w:ascii="Times New Roman" w:hAnsi="Times New Roman" w:eastAsia="宋体"/>
+          <w:rFonts w:ascii="Times New Roman" w:hAnsi="Times New Roman" w:eastAsia="Songti SC"/>
         </w:rPr>
         <w:t>承担，数据目录与可信分发层及模式输入组织层主要由</w:t>
       </w:r>
       <w:r>
         <w:rPr>
-          <w:rFonts w:ascii="Consolas" w:hAnsi="Consolas" w:eastAsia="等线"/>
+          <w:rFonts w:ascii="Consolas" w:hAnsi="Consolas" w:eastAsia="Songti SC"/>
         </w:rPr>
         <w:t>GriddingMachine.jl</w:t>
       </w:r>
       <w:r>
         <w:rPr>
-          <w:rFonts w:ascii="Times New Roman" w:hAnsi="Times New Roman" w:eastAsia="宋体"/>
-        </w:rPr>
-        <w:t>承担。三层共同形成“生产—质控—发布—发现—下载—读取—模型调用”的数据生命周期，其中各层通过标准NetCDF和稳定标签衔接，同时保留独立演化的维护边界。</w:t>
+          <w:rFonts w:ascii="Times New Roman" w:hAnsi="Times New Roman" w:eastAsia="Songti SC"/>
+        </w:rPr>
+        <w:t>承担。三层共同形成“生产—质控—发布—发现—下载—读取—模式调用”的数据生命周期，其中各层通过标准NetCDF和稳定标签衔接，同时保留独立演化的维护边界。</w:t>
       </w:r>
     </w:p>
     <w:p>
@@ -408,40 +408,40 @@
       </w:pPr>
       <w:r>
         <w:rPr>
-          <w:rFonts w:ascii="Times New Roman" w:hAnsi="Times New Roman" w:eastAsia="宋体"/>
+          <w:rFonts w:ascii="Times New Roman" w:hAnsi="Times New Roman" w:eastAsia="Songti SC"/>
           <w:b/>
         </w:rPr>
         <w:t>图1 GriddingMachine从2022版基线到新版数据生命周期的架构更新</w:t>
       </w:r>
       <w:r>
         <w:rPr>
-          <w:rFonts w:ascii="Times New Roman" w:hAnsi="Times New Roman" w:eastAsia="宋体"/>
+          <w:rFonts w:ascii="Times New Roman" w:hAnsi="Times New Roman" w:eastAsia="Songti SC"/>
         </w:rPr>
         <w:t xml:space="preserve"> （a）2022版以数据集专用脚本、</w:t>
       </w:r>
       <w:r>
         <w:rPr>
-          <w:rFonts w:ascii="Consolas" w:hAnsi="Consolas" w:eastAsia="等线"/>
+          <w:rFonts w:ascii="Consolas" w:hAnsi="Consolas" w:eastAsia="Songti SC"/>
         </w:rPr>
         <w:t>tar.gz</w:t>
       </w:r>
       <w:r>
         <w:rPr>
-          <w:rFonts w:ascii="Times New Roman" w:hAnsi="Times New Roman" w:eastAsia="宋体"/>
-        </w:rPr>
-        <w:t>制品、包内数据目录和</w:t>
-      </w:r>
-      <w:r>
-        <w:rPr>
-          <w:rFonts w:ascii="Consolas" w:hAnsi="Consolas" w:eastAsia="等线"/>
+          <w:rFonts w:ascii="Times New Roman" w:hAnsi="Times New Roman" w:eastAsia="Songti SC"/>
+        </w:rPr>
+        <w:t>文件、包内数据目录和</w:t>
+      </w:r>
+      <w:r>
+        <w:rPr>
+          <w:rFonts w:ascii="Consolas" w:hAnsi="Consolas" w:eastAsia="Songti SC"/>
         </w:rPr>
         <w:t>read_LUT</w:t>
       </w:r>
       <w:r>
         <w:rPr>
-          <w:rFonts w:ascii="Times New Roman" w:hAnsi="Times New Roman" w:eastAsia="宋体"/>
-        </w:rPr>
-        <w:t>构成数据预处理、分发与读取路径；（b）新版由数据生产与标准化层、数据目录与可信分发层和模式输入组织层构成，依次连接异构源数据、共享YAML契约、标准化与质量控制、标准NetCDF、独立数据目录、完整性获取以及统一读取和模型调用；（c）O1—O5依次表示统一数据契约、简化数据制品、目录独立演化、事务式获取和模型就绪接口。橙色虚线标示各项更新相对于2022版基线及新版核心节点的对应关系。</w:t>
+          <w:rFonts w:ascii="Times New Roman" w:hAnsi="Times New Roman" w:eastAsia="Songti SC"/>
+        </w:rPr>
+        <w:t>构成数据预处理、分发与读取路径；（b）新版由数据生产与标准化层、数据目录与可信分发层和模式输入组织层构成，依次连接异构源数据、共享YAML契约、标准化与质量控制、标准NetCDF、独立数据目录、完整性获取以及统一读取和模式调用；（c）O1—O5依次表示统一数据契约、简化数据文件、目录独立演化、事务式获取和模式就绪接口。橙色虚线标示各项更新相对于2022版基线及新版核心节点的对应关系。</w:t>
       </w:r>
     </w:p>
     <w:p>
@@ -450,38 +450,38 @@
       </w:pPr>
       <w:r>
         <w:rPr>
-          <w:rFonts w:ascii="Times New Roman" w:hAnsi="Times New Roman" w:eastAsia="宋体"/>
+          <w:rFonts w:ascii="Times New Roman" w:hAnsi="Times New Roman" w:eastAsia="Songti SC"/>
           <w:b/>
         </w:rPr>
         <w:t>Fig. 1 Architectural updates from the 2022 GriddingMachine baseline to the updated data lifecycle.</w:t>
       </w:r>
       <w:r>
         <w:rPr>
-          <w:rFonts w:ascii="Times New Roman" w:hAnsi="Times New Roman" w:eastAsia="宋体"/>
+          <w:rFonts w:ascii="Times New Roman" w:hAnsi="Times New Roman" w:eastAsia="Songti SC"/>
         </w:rPr>
         <w:t xml:space="preserve"> (a) The 2022 release connected dataset-specific scripts, </w:t>
       </w:r>
       <w:r>
         <w:rPr>
-          <w:rFonts w:ascii="Consolas" w:hAnsi="Consolas" w:eastAsia="等线"/>
+          <w:rFonts w:ascii="Consolas" w:hAnsi="Consolas" w:eastAsia="Songti SC"/>
         </w:rPr>
         <w:t>tar.gz</w:t>
       </w:r>
       <w:r>
         <w:rPr>
-          <w:rFonts w:ascii="Times New Roman" w:hAnsi="Times New Roman" w:eastAsia="宋体"/>
+          <w:rFonts w:ascii="Times New Roman" w:hAnsi="Times New Roman" w:eastAsia="Songti SC"/>
         </w:rPr>
         <w:t xml:space="preserve"> artifacts, an in-package catalog, and </w:t>
       </w:r>
       <w:r>
         <w:rPr>
-          <w:rFonts w:ascii="Consolas" w:hAnsi="Consolas" w:eastAsia="等线"/>
+          <w:rFonts w:ascii="Consolas" w:hAnsi="Consolas" w:eastAsia="Songti SC"/>
         </w:rPr>
         <w:t>read_LUT</w:t>
       </w:r>
       <w:r>
         <w:rPr>
-          <w:rFonts w:ascii="Times New Roman" w:hAnsi="Times New Roman" w:eastAsia="宋体"/>
+          <w:rFonts w:ascii="Times New Roman" w:hAnsi="Times New Roman" w:eastAsia="Songti SC"/>
         </w:rPr>
         <w:t xml:space="preserve"> across data preprocessing, distribution, and access. (b) The updated lifecycle comprises a data production and standardization layer, a catalog and trusted-distribution layer, and a model-input organization layer, connecting heterogeneous source data, a shared YAML contract, standardization and quality control, standard NetCDF data, an independent catalog, integrity-verified acquisition, and unified reading and model invocation. (c) O1--O5 denote the unified data contract, simplified data artifacts, independent catalog evolution, transactional acquisition, and model-ready interfaces. Orange dashed lines map these updates to the corresponding baseline components and core nodes in the updated workflow.</w:t>
       </w:r>
@@ -489,83 +489,23 @@
     <w:p>
       <w:r>
         <w:rPr>
-          <w:rFonts w:ascii="Times New Roman" w:hAnsi="Times New Roman" w:eastAsia="宋体"/>
-        </w:rPr>
-        <w:t>在数据生产与标准化层，原始数据及其处理规则分别作为数据输入和YAML配置输入。新版使用共享配置规范描述原始文件组合、源变量、经纬度方向、源维度语义、数值变换、有效范围、Gapfill及输出元数据；配置构建器与处理流水线遵循同一规范。生产引擎依据配置枚举输入，依次完成读取、标准化、质量控制和保存，最终生成以统一标签命名的NetCDF数据。维度、坐标、数值和空间方向检查嵌入生产流程，使标准数据在生成阶段即具有清晰的数据语义。</w:t>
+          <w:rFonts w:ascii="Times New Roman" w:hAnsi="Times New Roman" w:eastAsia="Songti SC"/>
+        </w:rPr>
+        <w:t>三层之间以标准NetCDF和数据标签衔接。源数据与YAML配置共同进入预处理流程，经维度、坐标和数值检查后生成标准化文件；数据目录登记文件位置、镜像与完整性信息，数据获取模块据此下载和核验；读取接口再将多个数据集组织为格点参数和气象驱动。本文以“数据生命周期”描述这一从源数据整理到模式调用的连续过程。</w:t>
       </w:r>
     </w:p>
     <w:p>
       <w:r>
         <w:rPr>
-          <w:rFonts w:ascii="Times New Roman" w:hAnsi="Times New Roman" w:eastAsia="宋体"/>
-        </w:rPr>
-        <w:t>通过质量控制的数据产品可发布到机构FTP、HTTP(S)服务或Zenodo等公共存储位置。同一标签可对应多个内容相同的网络副本，本文将其称为多镜像分发。独立数据目录登记相对路径和镜像地址，并可为新登记或需要严格完整性管理的条目记录文件字节数和SHA-256；目录生成过程从权威标准文件计算相应完整性元数据并以事务方式写入YAML。目录与访问软件分开维护，支持数据产品列表及其分发位置独立更新。</w:t>
+          <w:rFonts w:ascii="Times New Roman" w:hAnsi="Times New Roman" w:eastAsia="Songti SC"/>
+        </w:rPr>
+        <w:t>这种组织方式将数据处理规则、数据目录和访问软件分开维护。数据源发生变化时可调整配置，分发位置发生变化时可更新目录，模式侧则通过标签保持调用方式一致。各环节的具体方法分别见第2.2—2.4节。</w:t>
       </w:r>
     </w:p>
     <w:p>
       <w:r>
         <w:rPr>
-          <w:rFonts w:ascii="Times New Roman" w:hAnsi="Times New Roman" w:eastAsia="宋体"/>
-        </w:rPr>
-        <w:t>在数据目录与可信分发层，目录管理模块显式设置数据根目录与目录来源。目录更新经临时文件完成配置规范校验和事务式替换，并保留上一有效版本。数据获取模块提取各镜像地址的主机名，以可获得的平均往返延迟辅助确定候选顺序，同时保留全部镜像并依次回退。每次传输创建独立临时文件。对于登记了</w:t>
-      </w:r>
-      <w:r>
-        <w:rPr>
-          <w:rFonts w:ascii="Consolas" w:hAnsi="Consolas" w:eastAsia="等线"/>
-        </w:rPr>
-        <w:t>SIZE</w:t>
-      </w:r>
-      <w:r>
-        <w:rPr>
-          <w:rFonts w:ascii="Times New Roman" w:hAnsi="Times New Roman" w:eastAsia="宋体"/>
-        </w:rPr>
-        <w:t>和</w:t>
-      </w:r>
-      <w:r>
-        <w:rPr>
-          <w:rFonts w:ascii="Consolas" w:hAnsi="Consolas" w:eastAsia="等线"/>
-        </w:rPr>
-        <w:t>SHA256</w:t>
-      </w:r>
-      <w:r>
-        <w:rPr>
-          <w:rFonts w:ascii="Times New Roman" w:hAnsi="Times New Roman" w:eastAsia="宋体"/>
-        </w:rPr>
-        <w:t>的条目，文件通过字节数和摘要核验后进入正式数据目录；历史条目由兼容模式保持标签访问。本文将版本化目录、内容一致的镜像、事务式落盘和内容完整性校验共同构成的获取机制定义为“可信分发”。</w:t>
-      </w:r>
-    </w:p>
-    <w:p>
-      <w:r>
-        <w:rPr>
-          <w:rFonts w:ascii="Times New Roman" w:hAnsi="Times New Roman" w:eastAsia="宋体"/>
-        </w:rPr>
-        <w:t>模式输入组织层提供标签驱动的整场、指定周期及站点读取，并进一步完成格点尺度陆面参数融合与气象驱动组织。由14类产品组成的第二套陆面参数集合（代码标识为</w:t>
-      </w:r>
-      <w:r>
-        <w:rPr>
-          <w:rFonts w:ascii="Consolas" w:hAnsi="Consolas" w:eastAsia="等线"/>
-        </w:rPr>
-        <w:t>gm2</w:t>
-      </w:r>
-      <w:r>
-        <w:rPr>
-          <w:rFonts w:ascii="Times New Roman" w:hAnsi="Times New Roman" w:eastAsia="宋体"/>
-        </w:rPr>
-        <w:t>）贯通参数组织链路并进入Emerald初始化。本文所称“模型就绪”指标准产品经过格点索引、字段组织、时间轴构建和量纲衔接后形成满足Emerald初始化与首步运行的数据结构。</w:t>
-      </w:r>
-    </w:p>
-    <w:p>
-      <w:r>
-        <w:rPr>
-          <w:rFonts w:ascii="Times New Roman" w:hAnsi="Times New Roman" w:eastAsia="宋体"/>
-        </w:rPr>
-        <w:t>共享YAML、独立目录与统一读取接口共同重构了GriddingMachine的维护单元：数据处理规则由配置契约表达，数据产品与镜像由目录版本管理，模型应用继续使用稳定标签。该设计支持数据产品、分发目录和访问软件在保持接口一致的条件下分别更新，形成贯通生产、发布和应用的可维护数据生命周期。</w:t>
-      </w:r>
-    </w:p>
-    <w:p>
-      <w:r>
-        <w:rPr>
-          <w:rFonts w:ascii="Times New Roman" w:hAnsi="Times New Roman" w:eastAsia="宋体"/>
+          <w:rFonts w:ascii="Times New Roman" w:hAnsi="Times New Roman" w:eastAsia="Songti SC"/>
         </w:rPr>
         <w:t>表1概括2022版与新版的主要差异及其在数据生命周期中的作用。</w:t>
       </w:r>
@@ -576,7 +516,7 @@
       </w:pPr>
       <w:r>
         <w:rPr>
-          <w:rFonts w:ascii="Times New Roman" w:hAnsi="Times New Roman" w:eastAsia="宋体"/>
+          <w:rFonts w:ascii="Times New Roman" w:hAnsi="Times New Roman" w:eastAsia="Songti SC"/>
           <w:b/>
         </w:rPr>
         <w:t>表1 2022版与新版GriddingMachine的功能和技术路线比较</w:t>
@@ -609,7 +549,7 @@
             </w:r>
             <w:r>
               <w:rPr>
-                <w:rFonts w:ascii="Times New Roman" w:hAnsi="Times New Roman" w:eastAsia="宋体"/>
+                <w:rFonts w:ascii="Times New Roman" w:hAnsi="Times New Roman" w:eastAsia="Songti SC"/>
                 <w:b/>
                 <w:sz w:val="18"/>
               </w:rPr>
@@ -631,7 +571,7 @@
             </w:r>
             <w:r>
               <w:rPr>
-                <w:rFonts w:ascii="Times New Roman" w:hAnsi="Times New Roman" w:eastAsia="宋体"/>
+                <w:rFonts w:ascii="Times New Roman" w:hAnsi="Times New Roman" w:eastAsia="Songti SC"/>
                 <w:b/>
                 <w:sz w:val="18"/>
               </w:rPr>
@@ -653,7 +593,7 @@
             </w:r>
             <w:r>
               <w:rPr>
-                <w:rFonts w:ascii="Times New Roman" w:hAnsi="Times New Roman" w:eastAsia="宋体"/>
+                <w:rFonts w:ascii="Times New Roman" w:hAnsi="Times New Roman" w:eastAsia="Songti SC"/>
                 <w:b/>
                 <w:sz w:val="18"/>
               </w:rPr>
@@ -675,7 +615,7 @@
             </w:r>
             <w:r>
               <w:rPr>
-                <w:rFonts w:ascii="Times New Roman" w:hAnsi="Times New Roman" w:eastAsia="宋体"/>
+                <w:rFonts w:ascii="Times New Roman" w:hAnsi="Times New Roman" w:eastAsia="Songti SC"/>
                 <w:b/>
                 <w:sz w:val="18"/>
               </w:rPr>
@@ -697,7 +637,7 @@
             </w:r>
             <w:r>
               <w:rPr>
-                <w:rFonts w:ascii="Times New Roman" w:hAnsi="Times New Roman" w:eastAsia="宋体"/>
+                <w:rFonts w:ascii="Times New Roman" w:hAnsi="Times New Roman" w:eastAsia="Songti SC"/>
                 <w:sz w:val="18"/>
               </w:rPr>
               <w:t>分发单元</w:t>
@@ -716,21 +656,21 @@
             </w:r>
             <w:r>
               <w:rPr>
-                <w:rFonts w:ascii="Times New Roman" w:hAnsi="Times New Roman" w:eastAsia="宋体"/>
+                <w:rFonts w:ascii="Times New Roman" w:hAnsi="Times New Roman" w:eastAsia="Songti SC"/>
                 <w:sz w:val="18"/>
               </w:rPr>
               <w:t>NetCDF的</w:t>
             </w:r>
             <w:r>
               <w:rPr>
-                <w:rFonts w:ascii="Consolas" w:hAnsi="Consolas" w:eastAsia="等线"/>
+                <w:rFonts w:ascii="Consolas" w:hAnsi="Consolas" w:eastAsia="Songti SC"/>
                 <w:sz w:val="18"/>
               </w:rPr>
               <w:t>tar.gz</w:t>
             </w:r>
             <w:r>
               <w:rPr>
-                <w:rFonts w:ascii="Times New Roman" w:hAnsi="Times New Roman" w:eastAsia="宋体"/>
+                <w:rFonts w:ascii="Times New Roman" w:hAnsi="Times New Roman" w:eastAsia="Songti SC"/>
                 <w:sz w:val="18"/>
               </w:rPr>
               <w:t xml:space="preserve"> artifact</w:t>
@@ -749,14 +689,14 @@
             </w:r>
             <w:r>
               <w:rPr>
-                <w:rFonts w:ascii="Times New Roman" w:hAnsi="Times New Roman" w:eastAsia="宋体"/>
+                <w:rFonts w:ascii="Times New Roman" w:hAnsi="Times New Roman" w:eastAsia="Songti SC"/>
                 <w:sz w:val="18"/>
               </w:rPr>
               <w:t>可直接读取的</w:t>
             </w:r>
             <w:r>
               <w:rPr>
-                <w:rFonts w:ascii="Consolas" w:hAnsi="Consolas" w:eastAsia="等线"/>
+                <w:rFonts w:ascii="Consolas" w:hAnsi="Consolas" w:eastAsia="Songti SC"/>
                 <w:sz w:val="18"/>
               </w:rPr>
               <w:t>.nc</w:t>
@@ -775,7 +715,7 @@
             </w:r>
             <w:r>
               <w:rPr>
-                <w:rFonts w:ascii="Times New Roman" w:hAnsi="Times New Roman" w:eastAsia="宋体"/>
+                <w:rFonts w:ascii="Times New Roman" w:hAnsi="Times New Roman" w:eastAsia="Songti SC"/>
                 <w:sz w:val="18"/>
               </w:rPr>
               <w:t>简化数据获取并降低端到端读取时间</w:t>
@@ -796,7 +736,7 @@
             </w:r>
             <w:r>
               <w:rPr>
-                <w:rFonts w:ascii="Times New Roman" w:hAnsi="Times New Roman" w:eastAsia="宋体"/>
+                <w:rFonts w:ascii="Times New Roman" w:hAnsi="Times New Roman" w:eastAsia="Songti SC"/>
                 <w:sz w:val="18"/>
               </w:rPr>
               <w:t>数据目录</w:t>
@@ -815,14 +755,14 @@
             </w:r>
             <w:r>
               <w:rPr>
-                <w:rFonts w:ascii="Times New Roman" w:hAnsi="Times New Roman" w:eastAsia="宋体"/>
+                <w:rFonts w:ascii="Times New Roman" w:hAnsi="Times New Roman" w:eastAsia="Songti SC"/>
                 <w:sz w:val="18"/>
               </w:rPr>
               <w:t>软件内置</w:t>
             </w:r>
             <w:r>
               <w:rPr>
-                <w:rFonts w:ascii="Consolas" w:hAnsi="Consolas" w:eastAsia="等线"/>
+                <w:rFonts w:ascii="Consolas" w:hAnsi="Consolas" w:eastAsia="Songti SC"/>
                 <w:sz w:val="18"/>
               </w:rPr>
               <w:t>Artifacts.toml</w:t>
@@ -841,21 +781,21 @@
             </w:r>
             <w:r>
               <w:rPr>
-                <w:rFonts w:ascii="Times New Roman" w:hAnsi="Times New Roman" w:eastAsia="宋体"/>
+                <w:rFonts w:ascii="Times New Roman" w:hAnsi="Times New Roman" w:eastAsia="Songti SC"/>
                 <w:sz w:val="18"/>
               </w:rPr>
               <w:t>独立</w:t>
             </w:r>
             <w:r>
               <w:rPr>
-                <w:rFonts w:ascii="Consolas" w:hAnsi="Consolas" w:eastAsia="等线"/>
+                <w:rFonts w:ascii="Consolas" w:hAnsi="Consolas" w:eastAsia="Songti SC"/>
                 <w:sz w:val="18"/>
               </w:rPr>
               <w:t>Artifacts.yaml</w:t>
             </w:r>
             <w:r>
               <w:rPr>
-                <w:rFonts w:ascii="Times New Roman" w:hAnsi="Times New Roman" w:eastAsia="宋体"/>
+                <w:rFonts w:ascii="Times New Roman" w:hAnsi="Times New Roman" w:eastAsia="Songti SC"/>
                 <w:sz w:val="18"/>
               </w:rPr>
               <w:t>；配置规范校验、事务更新和版本备份</w:t>
@@ -874,10 +814,10 @@
             </w:r>
             <w:r>
               <w:rPr>
-                <w:rFonts w:ascii="Times New Roman" w:hAnsi="Times New Roman" w:eastAsia="宋体"/>
+                <w:rFonts w:ascii="Times New Roman" w:hAnsi="Times New Roman" w:eastAsia="Songti SC"/>
                 <w:sz w:val="18"/>
               </w:rPr>
-              <w:t>数据产品可独立于软件版本持续扩展</w:t>
+              <w:t>数据集可独立于软件版本持续扩展</w:t>
             </w:r>
           </w:p>
         </w:tc>
@@ -895,7 +835,7 @@
             </w:r>
             <w:r>
               <w:rPr>
-                <w:rFonts w:ascii="Times New Roman" w:hAnsi="Times New Roman" w:eastAsia="宋体"/>
+                <w:rFonts w:ascii="Times New Roman" w:hAnsi="Times New Roman" w:eastAsia="Songti SC"/>
                 <w:sz w:val="18"/>
               </w:rPr>
               <w:t>下载</w:t>
@@ -914,7 +854,7 @@
             </w:r>
             <w:r>
               <w:rPr>
-                <w:rFonts w:ascii="Times New Roman" w:hAnsi="Times New Roman" w:eastAsia="宋体"/>
+                <w:rFonts w:ascii="Times New Roman" w:hAnsi="Times New Roman" w:eastAsia="Songti SC"/>
                 <w:sz w:val="18"/>
               </w:rPr>
               <w:t>artifact哈希寻址、多个URL和解包</w:t>
@@ -933,35 +873,35 @@
             </w:r>
             <w:r>
               <w:rPr>
-                <w:rFonts w:ascii="Times New Roman" w:hAnsi="Times New Roman" w:eastAsia="宋体"/>
+                <w:rFonts w:ascii="Times New Roman" w:hAnsi="Times New Roman" w:eastAsia="Songti SC"/>
                 <w:sz w:val="18"/>
               </w:rPr>
               <w:t>延迟信号辅助排序；多URL回退、独立临时文件；带</w:t>
             </w:r>
             <w:r>
               <w:rPr>
-                <w:rFonts w:ascii="Consolas" w:hAnsi="Consolas" w:eastAsia="等线"/>
+                <w:rFonts w:ascii="Consolas" w:hAnsi="Consolas" w:eastAsia="Songti SC"/>
                 <w:sz w:val="18"/>
               </w:rPr>
               <w:t>SIZE</w:t>
             </w:r>
             <w:r>
               <w:rPr>
-                <w:rFonts w:ascii="Times New Roman" w:hAnsi="Times New Roman" w:eastAsia="宋体"/>
+                <w:rFonts w:ascii="Times New Roman" w:hAnsi="Times New Roman" w:eastAsia="Songti SC"/>
                 <w:sz w:val="18"/>
               </w:rPr>
               <w:t>/</w:t>
             </w:r>
             <w:r>
               <w:rPr>
-                <w:rFonts w:ascii="Consolas" w:hAnsi="Consolas" w:eastAsia="等线"/>
+                <w:rFonts w:ascii="Consolas" w:hAnsi="Consolas" w:eastAsia="Songti SC"/>
                 <w:sz w:val="18"/>
               </w:rPr>
               <w:t>SHA256</w:t>
             </w:r>
             <w:r>
               <w:rPr>
-                <w:rFonts w:ascii="Times New Roman" w:hAnsi="Times New Roman" w:eastAsia="宋体"/>
+                <w:rFonts w:ascii="Times New Roman" w:hAnsi="Times New Roman" w:eastAsia="Songti SC"/>
                 <w:sz w:val="18"/>
               </w:rPr>
               <w:t>条目可执行严格核验后落盘</w:t>
@@ -980,7 +920,7 @@
             </w:r>
             <w:r>
               <w:rPr>
-                <w:rFonts w:ascii="Times New Roman" w:hAnsi="Times New Roman" w:eastAsia="宋体"/>
+                <w:rFonts w:ascii="Times New Roman" w:hAnsi="Times New Roman" w:eastAsia="Songti SC"/>
                 <w:sz w:val="18"/>
               </w:rPr>
               <w:t>将镜像选择与内容完整性判定分离，支持历史目录平滑迁移</w:t>
@@ -1001,7 +941,7 @@
             </w:r>
             <w:r>
               <w:rPr>
-                <w:rFonts w:ascii="Times New Roman" w:hAnsi="Times New Roman" w:eastAsia="宋体"/>
+                <w:rFonts w:ascii="Times New Roman" w:hAnsi="Times New Roman" w:eastAsia="Songti SC"/>
                 <w:sz w:val="18"/>
               </w:rPr>
               <w:t>读取</w:t>
@@ -1020,7 +960,7 @@
             </w:r>
             <w:r>
               <w:rPr>
-                <w:rFonts w:ascii="Consolas" w:hAnsi="Consolas" w:eastAsia="等线"/>
+                <w:rFonts w:ascii="Consolas" w:hAnsi="Consolas" w:eastAsia="Songti SC"/>
                 <w:sz w:val="18"/>
               </w:rPr>
               <w:t>read_LUT</w:t>
@@ -1039,14 +979,14 @@
             </w:r>
             <w:r>
               <w:rPr>
-                <w:rFonts w:ascii="Consolas" w:hAnsi="Consolas" w:eastAsia="等线"/>
+                <w:rFonts w:ascii="Consolas" w:hAnsi="Consolas" w:eastAsia="Songti SC"/>
                 <w:sz w:val="18"/>
               </w:rPr>
               <w:t>read_dataset</w:t>
             </w:r>
             <w:r>
               <w:rPr>
-                <w:rFonts w:ascii="Times New Roman" w:hAnsi="Times New Roman" w:eastAsia="宋体"/>
+                <w:rFonts w:ascii="Times New Roman" w:hAnsi="Times New Roman" w:eastAsia="Songti SC"/>
                 <w:sz w:val="18"/>
               </w:rPr>
               <w:t>，旧名称保留为别名</w:t>
@@ -1065,7 +1005,7 @@
             </w:r>
             <w:r>
               <w:rPr>
-                <w:rFonts w:ascii="Times New Roman" w:hAnsi="Times New Roman" w:eastAsia="宋体"/>
+                <w:rFonts w:ascii="Times New Roman" w:hAnsi="Times New Roman" w:eastAsia="Songti SC"/>
                 <w:sz w:val="18"/>
               </w:rPr>
               <w:t>全球规则经纬网整场、周期和站点读取</w:t>
@@ -1086,10 +1026,10 @@
             </w:r>
             <w:r>
               <w:rPr>
-                <w:rFonts w:ascii="Times New Roman" w:hAnsi="Times New Roman" w:eastAsia="宋体"/>
+                <w:rFonts w:ascii="Times New Roman" w:hAnsi="Times New Roman" w:eastAsia="Songti SC"/>
                 <w:sz w:val="18"/>
               </w:rPr>
-              <w:t>模型组织</w:t>
+              <w:t>模式组织</w:t>
             </w:r>
           </w:p>
         </w:tc>
@@ -1105,7 +1045,7 @@
             </w:r>
             <w:r>
               <w:rPr>
-                <w:rFonts w:ascii="Times New Roman" w:hAnsi="Times New Roman" w:eastAsia="宋体"/>
+                <w:rFonts w:ascii="Times New Roman" w:hAnsi="Times New Roman" w:eastAsia="Songti SC"/>
                 <w:sz w:val="18"/>
               </w:rPr>
               <w:t>标准化数据和通用读取</w:t>
@@ -1124,7 +1064,7 @@
             </w:r>
             <w:r>
               <w:rPr>
-                <w:rFonts w:ascii="Times New Roman" w:hAnsi="Times New Roman" w:eastAsia="宋体"/>
+                <w:rFonts w:ascii="Times New Roman" w:hAnsi="Times New Roman" w:eastAsia="Songti SC"/>
                 <w:sz w:val="18"/>
               </w:rPr>
               <w:t>陆面参数融合与气象驱动组织</w:t>
@@ -1143,10 +1083,10 @@
             </w:r>
             <w:r>
               <w:rPr>
-                <w:rFonts w:ascii="Times New Roman" w:hAnsi="Times New Roman" w:eastAsia="宋体"/>
+                <w:rFonts w:ascii="Times New Roman" w:hAnsi="Times New Roman" w:eastAsia="Songti SC"/>
                 <w:sz w:val="18"/>
               </w:rPr>
-              <w:t>标准产品进入Emerald参数组织与模型初始化</w:t>
+              <w:t>标准化数据进入Emerald参数组织与模式初始化</w:t>
             </w:r>
           </w:p>
         </w:tc>
@@ -1164,7 +1104,7 @@
             </w:r>
             <w:r>
               <w:rPr>
-                <w:rFonts w:ascii="Times New Roman" w:hAnsi="Times New Roman" w:eastAsia="宋体"/>
+                <w:rFonts w:ascii="Times New Roman" w:hAnsi="Times New Roman" w:eastAsia="Songti SC"/>
                 <w:sz w:val="18"/>
               </w:rPr>
               <w:t>数据生产</w:t>
@@ -1183,7 +1123,7 @@
             </w:r>
             <w:r>
               <w:rPr>
-                <w:rFonts w:ascii="Times New Roman" w:hAnsi="Times New Roman" w:eastAsia="宋体"/>
+                <w:rFonts w:ascii="Times New Roman" w:hAnsi="Times New Roman" w:eastAsia="Songti SC"/>
                 <w:sz w:val="18"/>
               </w:rPr>
               <w:t>数据源专用处理及贡献流程</w:t>
@@ -1202,7 +1142,7 @@
             </w:r>
             <w:r>
               <w:rPr>
-                <w:rFonts w:ascii="Times New Roman" w:hAnsi="Times New Roman" w:eastAsia="宋体"/>
+                <w:rFonts w:ascii="Times New Roman" w:hAnsi="Times New Roman" w:eastAsia="Songti SC"/>
                 <w:sz w:val="18"/>
               </w:rPr>
               <w:t>共享YAML配置规范、程序化与交互式配置生成及显式源维度映射</w:t>
@@ -1221,10 +1161,10 @@
             </w:r>
             <w:r>
               <w:rPr>
-                <w:rFonts w:ascii="Times New Roman" w:hAnsi="Times New Roman" w:eastAsia="宋体"/>
+                <w:rFonts w:ascii="Times New Roman" w:hAnsi="Times New Roman" w:eastAsia="Songti SC"/>
                 <w:sz w:val="18"/>
               </w:rPr>
-              <w:t>形成共享的标准产品生产工作流</w:t>
+              <w:t>形成共享的标准化数据生产工作流</w:t>
             </w:r>
           </w:p>
         </w:tc>
@@ -1236,14 +1176,14 @@
       </w:pPr>
       <w:r>
         <w:rPr>
-          <w:rFonts w:ascii="Times New Roman" w:hAnsi="Times New Roman" w:eastAsia="宋体"/>
+          <w:rFonts w:ascii="Times New Roman" w:hAnsi="Times New Roman" w:eastAsia="Songti SC"/>
           <w:b/>
         </w:rPr>
         <w:t>Table 1 Comparison between the 2022 release and the updated GriddingMachine.</w:t>
       </w:r>
       <w:r>
         <w:rPr>
-          <w:rFonts w:ascii="Times New Roman" w:hAnsi="Times New Roman" w:eastAsia="宋体"/>
+          <w:rFonts w:ascii="Times New Roman" w:hAnsi="Times New Roman" w:eastAsia="Songti SC"/>
         </w:rPr>
         <w:t xml:space="preserve"> The table summarizes the implemented mechanisms, workflow advances, and application value across the data lifecycle.</w:t>
       </w:r>
@@ -1254,7 +1194,7 @@
       </w:pPr>
       <w:r>
         <w:rPr>
-          <w:rFonts w:ascii="Times New Roman" w:hAnsi="Times New Roman" w:eastAsia="宋体"/>
+          <w:rFonts w:ascii="Times New Roman" w:hAnsi="Times New Roman" w:eastAsia="Songti SC"/>
         </w:rPr>
         <w:t>2.2 YAML驱动的数据生产与标准化</w:t>
       </w:r>
@@ -1265,7 +1205,7 @@
       </w:pPr>
       <w:r>
         <w:rPr>
-          <w:rFonts w:ascii="Times New Roman" w:hAnsi="Times New Roman" w:eastAsia="宋体"/>
+          <w:rFonts w:ascii="Times New Roman" w:hAnsi="Times New Roman" w:eastAsia="Songti SC"/>
         </w:rPr>
         <w:t>2.2.1 数据契约与维度映射</w:t>
       </w:r>
@@ -1273,43 +1213,43 @@
     <w:p>
       <w:r>
         <w:rPr>
-          <w:rFonts w:ascii="Times New Roman" w:hAnsi="Times New Roman" w:eastAsia="宋体"/>
-        </w:rPr>
-        <w:t xml:space="preserve">GriddingMachine 以 NetCDF 作为标准数据格式，原因是该格式能够在同一文件中保存多维数组、坐标和自描述元数据，并被多种地球科学软件读取。2022 年版本已经规定数据采用二维或三维规则经纬网，前两维依次为经度和纬度，可选第三维表示周期；经度自西向东、纬度自南向北，输出保存为实际物理值，缺失值在读取后统一表示为 </w:t>
-      </w:r>
-      <w:r>
-        <w:rPr>
-          <w:rFonts w:ascii="Consolas" w:hAnsi="Consolas" w:eastAsia="等线"/>
+          <w:rFonts w:ascii="Times New Roman" w:hAnsi="Times New Roman" w:eastAsia="Songti SC"/>
+        </w:rPr>
+        <w:t xml:space="preserve">GriddingMachine采用NetCDF格式组织多维数组、坐标和自描述元数据，便于不同地球科学软件读取[5]。2022 年版本已经规定数据采用二维或三维规则经纬网，前两维依次为经度和纬度，可选第三维表示周期；经度自西向东、纬度自南向北，输出保存为实际物理值，缺失值在读取后统一表示为 </w:t>
+      </w:r>
+      <w:r>
+        <w:rPr>
+          <w:rFonts w:ascii="Consolas" w:hAnsi="Consolas" w:eastAsia="Songti SC"/>
         </w:rPr>
         <w:t>NaN</w:t>
       </w:r>
       <w:r>
         <w:rPr>
-          <w:rFonts w:ascii="Times New Roman" w:hAnsi="Times New Roman" w:eastAsia="宋体"/>
+          <w:rFonts w:ascii="Times New Roman" w:hAnsi="Times New Roman" w:eastAsia="Songti SC"/>
         </w:rPr>
         <w:t xml:space="preserve">，主变量和不确定性变量分别命名为 </w:t>
       </w:r>
       <w:r>
         <w:rPr>
-          <w:rFonts w:ascii="Consolas" w:hAnsi="Consolas" w:eastAsia="等线"/>
+          <w:rFonts w:ascii="Consolas" w:hAnsi="Consolas" w:eastAsia="Songti SC"/>
         </w:rPr>
         <w:t>data</w:t>
       </w:r>
       <w:r>
         <w:rPr>
-          <w:rFonts w:ascii="Times New Roman" w:hAnsi="Times New Roman" w:eastAsia="宋体"/>
+          <w:rFonts w:ascii="Times New Roman" w:hAnsi="Times New Roman" w:eastAsia="Songti SC"/>
         </w:rPr>
         <w:t xml:space="preserve"> 和 </w:t>
       </w:r>
       <w:r>
         <w:rPr>
-          <w:rFonts w:ascii="Consolas" w:hAnsi="Consolas" w:eastAsia="等线"/>
+          <w:rFonts w:ascii="Consolas" w:hAnsi="Consolas" w:eastAsia="Songti SC"/>
         </w:rPr>
         <w:t>std</w:t>
       </w:r>
       <w:r>
         <w:rPr>
-          <w:rFonts w:ascii="Times New Roman" w:hAnsi="Times New Roman" w:eastAsia="宋体"/>
+          <w:rFonts w:ascii="Times New Roman" w:hAnsi="Times New Roman" w:eastAsia="Songti SC"/>
         </w:rPr>
         <w:t>[4]。新版延续这些核心约定，并将源维度映射、处理记录、版本化配置和分发完整性纳入相互衔接的机器可读规范（表2）。</w:t>
       </w:r>
@@ -1320,7 +1260,7 @@
       </w:pPr>
       <w:r>
         <w:rPr>
-          <w:rFonts w:ascii="Times New Roman" w:hAnsi="Times New Roman" w:eastAsia="宋体"/>
+          <w:rFonts w:ascii="Times New Roman" w:hAnsi="Times New Roman" w:eastAsia="Songti SC"/>
           <w:b/>
         </w:rPr>
         <w:t>表2 GriddingMachine 标准 NetCDF 数据与元数据规范</w:t>
@@ -1352,7 +1292,7 @@
             </w:r>
             <w:r>
               <w:rPr>
-                <w:rFonts w:ascii="Times New Roman" w:hAnsi="Times New Roman" w:eastAsia="宋体"/>
+                <w:rFonts w:ascii="Times New Roman" w:hAnsi="Times New Roman" w:eastAsia="Songti SC"/>
                 <w:b/>
                 <w:sz w:val="18"/>
               </w:rPr>
@@ -1374,7 +1314,7 @@
             </w:r>
             <w:r>
               <w:rPr>
-                <w:rFonts w:ascii="Times New Roman" w:hAnsi="Times New Roman" w:eastAsia="宋体"/>
+                <w:rFonts w:ascii="Times New Roman" w:hAnsi="Times New Roman" w:eastAsia="Songti SC"/>
                 <w:b/>
                 <w:sz w:val="18"/>
               </w:rPr>
@@ -1396,7 +1336,7 @@
             </w:r>
             <w:r>
               <w:rPr>
-                <w:rFonts w:ascii="Times New Roman" w:hAnsi="Times New Roman" w:eastAsia="宋体"/>
+                <w:rFonts w:ascii="Times New Roman" w:hAnsi="Times New Roman" w:eastAsia="Songti SC"/>
                 <w:b/>
                 <w:sz w:val="18"/>
               </w:rPr>
@@ -1418,7 +1358,7 @@
             </w:r>
             <w:r>
               <w:rPr>
-                <w:rFonts w:ascii="Times New Roman" w:hAnsi="Times New Roman" w:eastAsia="宋体"/>
+                <w:rFonts w:ascii="Times New Roman" w:hAnsi="Times New Roman" w:eastAsia="Songti SC"/>
                 <w:sz w:val="18"/>
               </w:rPr>
               <w:t>文件与网格</w:t>
@@ -1437,21 +1377,21 @@
             </w:r>
             <w:r>
               <w:rPr>
-                <w:rFonts w:ascii="Times New Roman" w:hAnsi="Times New Roman" w:eastAsia="宋体"/>
+                <w:rFonts w:ascii="Times New Roman" w:hAnsi="Times New Roman" w:eastAsia="Songti SC"/>
                 <w:sz w:val="18"/>
               </w:rPr>
               <w:t>一个标签对应一个可直接读取的</w:t>
             </w:r>
             <w:r>
               <w:rPr>
-                <w:rFonts w:ascii="Consolas" w:hAnsi="Consolas" w:eastAsia="等线"/>
+                <w:rFonts w:ascii="Consolas" w:hAnsi="Consolas" w:eastAsia="Songti SC"/>
                 <w:sz w:val="18"/>
               </w:rPr>
               <w:t>.nc</w:t>
             </w:r>
             <w:r>
               <w:rPr>
-                <w:rFonts w:ascii="Times New Roman" w:hAnsi="Times New Roman" w:eastAsia="宋体"/>
+                <w:rFonts w:ascii="Times New Roman" w:hAnsi="Times New Roman" w:eastAsia="Songti SC"/>
                 <w:sz w:val="18"/>
               </w:rPr>
               <w:t>；规则经纬度网格，默认全球覆盖并声明坐标参考</w:t>
@@ -1470,7 +1410,7 @@
             </w:r>
             <w:r>
               <w:rPr>
-                <w:rFonts w:ascii="Times New Roman" w:hAnsi="Times New Roman" w:eastAsia="宋体"/>
+                <w:rFonts w:ascii="Times New Roman" w:hAnsi="Times New Roman" w:eastAsia="Songti SC"/>
                 <w:sz w:val="18"/>
               </w:rPr>
               <w:t>NetCDF统一保存数据、坐标与自描述元数据</w:t>
@@ -1491,7 +1431,7 @@
             </w:r>
             <w:r>
               <w:rPr>
-                <w:rFonts w:ascii="Times New Roman" w:hAnsi="Times New Roman" w:eastAsia="宋体"/>
+                <w:rFonts w:ascii="Times New Roman" w:hAnsi="Times New Roman" w:eastAsia="Songti SC"/>
                 <w:sz w:val="18"/>
               </w:rPr>
               <w:t>维度</w:t>
@@ -1510,35 +1450,35 @@
             </w:r>
             <w:r>
               <w:rPr>
-                <w:rFonts w:ascii="Times New Roman" w:hAnsi="Times New Roman" w:eastAsia="宋体"/>
+                <w:rFonts w:ascii="Times New Roman" w:hAnsi="Times New Roman" w:eastAsia="Songti SC"/>
                 <w:sz w:val="18"/>
               </w:rPr>
               <w:t>二维</w:t>
             </w:r>
             <w:r>
               <w:rPr>
-                <w:rFonts w:ascii="Consolas" w:hAnsi="Consolas" w:eastAsia="等线"/>
+                <w:rFonts w:ascii="Consolas" w:hAnsi="Consolas" w:eastAsia="Songti SC"/>
                 <w:sz w:val="18"/>
               </w:rPr>
               <w:t>(lon, lat)</w:t>
             </w:r>
             <w:r>
               <w:rPr>
-                <w:rFonts w:ascii="Times New Roman" w:hAnsi="Times New Roman" w:eastAsia="宋体"/>
+                <w:rFonts w:ascii="Times New Roman" w:hAnsi="Times New Roman" w:eastAsia="Songti SC"/>
                 <w:sz w:val="18"/>
               </w:rPr>
               <w:t>；三维</w:t>
             </w:r>
             <w:r>
               <w:rPr>
-                <w:rFonts w:ascii="Consolas" w:hAnsi="Consolas" w:eastAsia="等线"/>
+                <w:rFonts w:ascii="Consolas" w:hAnsi="Consolas" w:eastAsia="Songti SC"/>
                 <w:sz w:val="18"/>
               </w:rPr>
               <w:t>(lon, lat, ind)</w:t>
             </w:r>
             <w:r>
               <w:rPr>
-                <w:rFonts w:ascii="Times New Roman" w:hAnsi="Times New Roman" w:eastAsia="宋体"/>
+                <w:rFonts w:ascii="Times New Roman" w:hAnsi="Times New Roman" w:eastAsia="Songti SC"/>
                 <w:sz w:val="18"/>
               </w:rPr>
               <w:t>；源维度按名称映射到标准顺序</w:t>
@@ -1557,7 +1497,7 @@
             </w:r>
             <w:r>
               <w:rPr>
-                <w:rFonts w:ascii="Times New Roman" w:hAnsi="Times New Roman" w:eastAsia="宋体"/>
+                <w:rFonts w:ascii="Times New Roman" w:hAnsi="Times New Roman" w:eastAsia="Songti SC"/>
                 <w:sz w:val="18"/>
               </w:rPr>
               <w:t>通用维度映射将多种源排列转换为统一结构</w:t>
@@ -1578,7 +1518,7 @@
             </w:r>
             <w:r>
               <w:rPr>
-                <w:rFonts w:ascii="Times New Roman" w:hAnsi="Times New Roman" w:eastAsia="宋体"/>
+                <w:rFonts w:ascii="Times New Roman" w:hAnsi="Times New Roman" w:eastAsia="Songti SC"/>
                 <w:sz w:val="18"/>
               </w:rPr>
               <w:t>坐标方向</w:t>
@@ -1597,42 +1537,42 @@
             </w:r>
             <w:r>
               <w:rPr>
-                <w:rFonts w:ascii="Consolas" w:hAnsi="Consolas" w:eastAsia="等线"/>
+                <w:rFonts w:ascii="Consolas" w:hAnsi="Consolas" w:eastAsia="Songti SC"/>
                 <w:sz w:val="18"/>
               </w:rPr>
               <w:t>lon</w:t>
             </w:r>
             <w:r>
               <w:rPr>
-                <w:rFonts w:ascii="Times New Roman" w:hAnsi="Times New Roman" w:eastAsia="宋体"/>
+                <w:rFonts w:ascii="Times New Roman" w:hAnsi="Times New Roman" w:eastAsia="Songti SC"/>
                 <w:sz w:val="18"/>
               </w:rPr>
               <w:t>自西向东并统一到</w:t>
             </w:r>
             <w:r>
               <w:rPr>
-                <w:rFonts w:ascii="Consolas" w:hAnsi="Consolas" w:eastAsia="等线"/>
+                <w:rFonts w:ascii="Consolas" w:hAnsi="Consolas" w:eastAsia="Songti SC"/>
                 <w:sz w:val="18"/>
               </w:rPr>
               <w:t>[-180, 180)</w:t>
             </w:r>
             <w:r>
               <w:rPr>
-                <w:rFonts w:ascii="Times New Roman" w:hAnsi="Times New Roman" w:eastAsia="宋体"/>
+                <w:rFonts w:ascii="Times New Roman" w:hAnsi="Times New Roman" w:eastAsia="Songti SC"/>
                 <w:sz w:val="18"/>
               </w:rPr>
               <w:t>；</w:t>
             </w:r>
             <w:r>
               <w:rPr>
-                <w:rFonts w:ascii="Consolas" w:hAnsi="Consolas" w:eastAsia="等线"/>
+                <w:rFonts w:ascii="Consolas" w:hAnsi="Consolas" w:eastAsia="Songti SC"/>
                 <w:sz w:val="18"/>
               </w:rPr>
               <w:t>lat</w:t>
             </w:r>
             <w:r>
               <w:rPr>
-                <w:rFonts w:ascii="Times New Roman" w:hAnsi="Times New Roman" w:eastAsia="宋体"/>
+                <w:rFonts w:ascii="Times New Roman" w:hAnsi="Times New Roman" w:eastAsia="Songti SC"/>
                 <w:sz w:val="18"/>
               </w:rPr>
               <w:t>自南向北</w:t>
@@ -1651,7 +1591,7 @@
             </w:r>
             <w:r>
               <w:rPr>
-                <w:rFonts w:ascii="Times New Roman" w:hAnsi="Times New Roman" w:eastAsia="宋体"/>
+                <w:rFonts w:ascii="Times New Roman" w:hAnsi="Times New Roman" w:eastAsia="Songti SC"/>
                 <w:sz w:val="18"/>
               </w:rPr>
               <w:t>翻转和循环平移保持数据与坐标同步</w:t>
@@ -1672,7 +1612,7 @@
             </w:r>
             <w:r>
               <w:rPr>
-                <w:rFonts w:ascii="Times New Roman" w:hAnsi="Times New Roman" w:eastAsia="宋体"/>
+                <w:rFonts w:ascii="Times New Roman" w:hAnsi="Times New Roman" w:eastAsia="Songti SC"/>
                 <w:sz w:val="18"/>
               </w:rPr>
               <w:t>数据变量</w:t>
@@ -1691,28 +1631,28 @@
             </w:r>
             <w:r>
               <w:rPr>
-                <w:rFonts w:ascii="Consolas" w:hAnsi="Consolas" w:eastAsia="等线"/>
+                <w:rFonts w:ascii="Consolas" w:hAnsi="Consolas" w:eastAsia="Songti SC"/>
                 <w:sz w:val="18"/>
               </w:rPr>
               <w:t>data</w:t>
             </w:r>
             <w:r>
               <w:rPr>
-                <w:rFonts w:ascii="Times New Roman" w:hAnsi="Times New Roman" w:eastAsia="宋体"/>
+                <w:rFonts w:ascii="Times New Roman" w:hAnsi="Times New Roman" w:eastAsia="Songti SC"/>
                 <w:sz w:val="18"/>
               </w:rPr>
               <w:t>为主变量；</w:t>
             </w:r>
             <w:r>
               <w:rPr>
-                <w:rFonts w:ascii="Consolas" w:hAnsi="Consolas" w:eastAsia="等线"/>
+                <w:rFonts w:ascii="Consolas" w:hAnsi="Consolas" w:eastAsia="Songti SC"/>
                 <w:sz w:val="18"/>
               </w:rPr>
               <w:t>std</w:t>
             </w:r>
             <w:r>
               <w:rPr>
-                <w:rFonts w:ascii="Times New Roman" w:hAnsi="Times New Roman" w:eastAsia="宋体"/>
+                <w:rFonts w:ascii="Times New Roman" w:hAnsi="Times New Roman" w:eastAsia="Songti SC"/>
                 <w:sz w:val="18"/>
               </w:rPr>
               <w:t>保存同形不确定性；输出为实际物理值</w:t>
@@ -1731,7 +1671,7 @@
             </w:r>
             <w:r>
               <w:rPr>
-                <w:rFonts w:ascii="Times New Roman" w:hAnsi="Times New Roman" w:eastAsia="宋体"/>
+                <w:rFonts w:ascii="Times New Roman" w:hAnsi="Times New Roman" w:eastAsia="Songti SC"/>
                 <w:sz w:val="18"/>
               </w:rPr>
               <w:t>统一变量命名、类型、单位和数值表达</w:t>
@@ -1752,7 +1692,7 @@
             </w:r>
             <w:r>
               <w:rPr>
-                <w:rFonts w:ascii="Times New Roman" w:hAnsi="Times New Roman" w:eastAsia="宋体"/>
+                <w:rFonts w:ascii="Times New Roman" w:hAnsi="Times New Roman" w:eastAsia="Songti SC"/>
                 <w:sz w:val="18"/>
               </w:rPr>
               <w:t>Gapfill与范围</w:t>
@@ -1771,7 +1711,7 @@
             </w:r>
             <w:r>
               <w:rPr>
-                <w:rFonts w:ascii="Times New Roman" w:hAnsi="Times New Roman" w:eastAsia="宋体"/>
+                <w:rFonts w:ascii="Times New Roman" w:hAnsi="Times New Roman" w:eastAsia="Songti SC"/>
                 <w:sz w:val="18"/>
               </w:rPr>
               <w:t>有效范围、填充值和Gapfill策略由YAML显式声明</w:t>
@@ -1790,70 +1730,70 @@
             </w:r>
             <w:r>
               <w:rPr>
-                <w:rFonts w:ascii="Times New Roman" w:hAnsi="Times New Roman" w:eastAsia="宋体"/>
+                <w:rFonts w:ascii="Times New Roman" w:hAnsi="Times New Roman" w:eastAsia="Songti SC"/>
                 <w:sz w:val="18"/>
               </w:rPr>
               <w:t>支持数值常数、</w:t>
             </w:r>
             <w:r>
               <w:rPr>
-                <w:rFonts w:ascii="Consolas" w:hAnsi="Consolas" w:eastAsia="等线"/>
+                <w:rFonts w:ascii="Consolas" w:hAnsi="Consolas" w:eastAsia="Songti SC"/>
                 <w:sz w:val="18"/>
               </w:rPr>
               <w:t>MEAN</w:t>
             </w:r>
             <w:r>
               <w:rPr>
-                <w:rFonts w:ascii="Times New Roman" w:hAnsi="Times New Roman" w:eastAsia="宋体"/>
+                <w:rFonts w:ascii="Times New Roman" w:hAnsi="Times New Roman" w:eastAsia="Songti SC"/>
                 <w:sz w:val="18"/>
               </w:rPr>
               <w:t>、</w:t>
             </w:r>
             <w:r>
               <w:rPr>
-                <w:rFonts w:ascii="Consolas" w:hAnsi="Consolas" w:eastAsia="等线"/>
+                <w:rFonts w:ascii="Consolas" w:hAnsi="Consolas" w:eastAsia="Songti SC"/>
                 <w:sz w:val="18"/>
               </w:rPr>
               <w:t>KEEP_AS_IS</w:t>
             </w:r>
             <w:r>
               <w:rPr>
-                <w:rFonts w:ascii="Times New Roman" w:hAnsi="Times New Roman" w:eastAsia="宋体"/>
+                <w:rFonts w:ascii="Times New Roman" w:hAnsi="Times New Roman" w:eastAsia="Songti SC"/>
                 <w:sz w:val="18"/>
               </w:rPr>
               <w:t>、</w:t>
             </w:r>
             <w:r>
               <w:rPr>
-                <w:rFonts w:ascii="Consolas" w:hAnsi="Consolas" w:eastAsia="等线"/>
+                <w:rFonts w:ascii="Consolas" w:hAnsi="Consolas" w:eastAsia="Songti SC"/>
                 <w:sz w:val="18"/>
               </w:rPr>
               <w:t>INT_NAN_TO_1</w:t>
             </w:r>
             <w:r>
               <w:rPr>
-                <w:rFonts w:ascii="Times New Roman" w:hAnsi="Times New Roman" w:eastAsia="宋体"/>
+                <w:rFonts w:ascii="Times New Roman" w:hAnsi="Times New Roman" w:eastAsia="Songti SC"/>
                 <w:sz w:val="18"/>
               </w:rPr>
               <w:t>、</w:t>
             </w:r>
             <w:r>
               <w:rPr>
-                <w:rFonts w:ascii="Consolas" w:hAnsi="Consolas" w:eastAsia="等线"/>
+                <w:rFonts w:ascii="Consolas" w:hAnsi="Consolas" w:eastAsia="Songti SC"/>
                 <w:sz w:val="18"/>
               </w:rPr>
               <w:t>NO_LAND_NAN</w:t>
             </w:r>
             <w:r>
               <w:rPr>
-                <w:rFonts w:ascii="Times New Roman" w:hAnsi="Times New Roman" w:eastAsia="宋体"/>
+                <w:rFonts w:ascii="Times New Roman" w:hAnsi="Times New Roman" w:eastAsia="Songti SC"/>
                 <w:sz w:val="18"/>
               </w:rPr>
               <w:t>和</w:t>
             </w:r>
             <w:r>
               <w:rPr>
-                <w:rFonts w:ascii="Consolas" w:hAnsi="Consolas" w:eastAsia="等线"/>
+                <w:rFonts w:ascii="Consolas" w:hAnsi="Consolas" w:eastAsia="Songti SC"/>
                 <w:sz w:val="18"/>
               </w:rPr>
               <w:t>NO_NAN</w:t>
@@ -1874,7 +1814,7 @@
             </w:r>
             <w:r>
               <w:rPr>
-                <w:rFonts w:ascii="Times New Roman" w:hAnsi="Times New Roman" w:eastAsia="宋体"/>
+                <w:rFonts w:ascii="Times New Roman" w:hAnsi="Times New Roman" w:eastAsia="Songti SC"/>
                 <w:sz w:val="18"/>
               </w:rPr>
               <w:t>变量元数据</w:t>
@@ -1893,14 +1833,14 @@
             </w:r>
             <w:r>
               <w:rPr>
-                <w:rFonts w:ascii="Consolas" w:hAnsi="Consolas" w:eastAsia="等线"/>
+                <w:rFonts w:ascii="Consolas" w:hAnsi="Consolas" w:eastAsia="Songti SC"/>
                 <w:sz w:val="18"/>
               </w:rPr>
               <w:t>data/std</w:t>
             </w:r>
             <w:r>
               <w:rPr>
-                <w:rFonts w:ascii="Times New Roman" w:hAnsi="Times New Roman" w:eastAsia="宋体"/>
+                <w:rFonts w:ascii="Times New Roman" w:hAnsi="Times New Roman" w:eastAsia="Songti SC"/>
                 <w:sz w:val="18"/>
               </w:rPr>
               <w:t>记录可读说明、单位及处理变更条目</w:t>
@@ -1919,7 +1859,7 @@
             </w:r>
             <w:r>
               <w:rPr>
-                <w:rFonts w:ascii="Times New Roman" w:hAnsi="Times New Roman" w:eastAsia="宋体"/>
+                <w:rFonts w:ascii="Times New Roman" w:hAnsi="Times New Roman" w:eastAsia="Songti SC"/>
                 <w:sz w:val="18"/>
               </w:rPr>
               <w:t>输出文件保留变量语义与主要转换过程</w:t>
@@ -1940,7 +1880,7 @@
             </w:r>
             <w:r>
               <w:rPr>
-                <w:rFonts w:ascii="Times New Roman" w:hAnsi="Times New Roman" w:eastAsia="宋体"/>
+                <w:rFonts w:ascii="Times New Roman" w:hAnsi="Times New Roman" w:eastAsia="Songti SC"/>
                 <w:sz w:val="18"/>
               </w:rPr>
               <w:t>处理记录</w:t>
@@ -1959,7 +1899,7 @@
             </w:r>
             <w:r>
               <w:rPr>
-                <w:rFonts w:ascii="Times New Roman" w:hAnsi="Times New Roman" w:eastAsia="宋体"/>
+                <w:rFonts w:ascii="Times New Roman" w:hAnsi="Times New Roman" w:eastAsia="Songti SC"/>
                 <w:sz w:val="18"/>
               </w:rPr>
               <w:t>YAML声明维度、坐标、数值与Gapfill规则；NetCDF属性写入逐项变更记录</w:t>
@@ -1978,10 +1918,10 @@
             </w:r>
             <w:r>
               <w:rPr>
-                <w:rFonts w:ascii="Times New Roman" w:hAnsi="Times New Roman" w:eastAsia="宋体"/>
+                <w:rFonts w:ascii="Times New Roman" w:hAnsi="Times New Roman" w:eastAsia="Songti SC"/>
                 <w:sz w:val="18"/>
               </w:rPr>
-              <w:t>配置意图与产品处理历史相互对应</w:t>
+              <w:t>配置意图与数据集处理历史相互对应</w:t>
             </w:r>
           </w:p>
         </w:tc>
@@ -1999,7 +1939,7 @@
             </w:r>
             <w:r>
               <w:rPr>
-                <w:rFonts w:ascii="Times New Roman" w:hAnsi="Times New Roman" w:eastAsia="宋体"/>
+                <w:rFonts w:ascii="Times New Roman" w:hAnsi="Times New Roman" w:eastAsia="Songti SC"/>
                 <w:sz w:val="18"/>
               </w:rPr>
               <w:t>处理复现</w:t>
@@ -2018,14 +1958,14 @@
             </w:r>
             <w:r>
               <w:rPr>
-                <w:rFonts w:ascii="Consolas" w:hAnsi="Consolas" w:eastAsia="等线"/>
+                <w:rFonts w:ascii="Consolas" w:hAnsi="Consolas" w:eastAsia="Songti SC"/>
                 <w:sz w:val="18"/>
               </w:rPr>
               <w:t>SCHEMA_VERSION</w:t>
             </w:r>
             <w:r>
               <w:rPr>
-                <w:rFonts w:ascii="Times New Roman" w:hAnsi="Times New Roman" w:eastAsia="宋体"/>
+                <w:rFonts w:ascii="Times New Roman" w:hAnsi="Times New Roman" w:eastAsia="Songti SC"/>
                 <w:sz w:val="18"/>
               </w:rPr>
               <w:t>、完整YAML、固定输入和版本化项目环境共同归档</w:t>
@@ -2044,10 +1984,10 @@
             </w:r>
             <w:r>
               <w:rPr>
-                <w:rFonts w:ascii="Times New Roman" w:hAnsi="Times New Roman" w:eastAsia="宋体"/>
+                <w:rFonts w:ascii="Times New Roman" w:hAnsi="Times New Roman" w:eastAsia="Songti SC"/>
                 <w:sz w:val="18"/>
               </w:rPr>
-              <w:t>配置、输入与代码版本共同重建标准产品</w:t>
+              <w:t>配置、输入与代码版本共同重建标准化数据</w:t>
             </w:r>
           </w:p>
         </w:tc>
@@ -2065,7 +2005,7 @@
             </w:r>
             <w:r>
               <w:rPr>
-                <w:rFonts w:ascii="Times New Roman" w:hAnsi="Times New Roman" w:eastAsia="宋体"/>
+                <w:rFonts w:ascii="Times New Roman" w:hAnsi="Times New Roman" w:eastAsia="Songti SC"/>
                 <w:sz w:val="18"/>
               </w:rPr>
               <w:t>标签与版本</w:t>
@@ -2084,7 +2024,7 @@
             </w:r>
             <w:r>
               <w:rPr>
-                <w:rFonts w:ascii="Times New Roman" w:hAnsi="Times New Roman" w:eastAsia="宋体"/>
+                <w:rFonts w:ascii="Times New Roman" w:hAnsi="Times New Roman" w:eastAsia="Songti SC"/>
                 <w:sz w:val="18"/>
               </w:rPr>
               <w:t>标签表达类别、空间/时间分辨率、年份、版本和可选修订号</w:t>
@@ -2103,10 +2043,10 @@
             </w:r>
             <w:r>
               <w:rPr>
-                <w:rFonts w:ascii="Times New Roman" w:hAnsi="Times New Roman" w:eastAsia="宋体"/>
+                <w:rFonts w:ascii="Times New Roman" w:hAnsi="Times New Roman" w:eastAsia="Songti SC"/>
                 <w:sz w:val="18"/>
               </w:rPr>
-              <w:t>标签与文件名共同形成稳定产品标识</w:t>
+              <w:t>标签与文件名共同形成稳定数据集标识</w:t>
             </w:r>
           </w:p>
         </w:tc>
@@ -2124,7 +2064,7 @@
             </w:r>
             <w:r>
               <w:rPr>
-                <w:rFonts w:ascii="Times New Roman" w:hAnsi="Times New Roman" w:eastAsia="宋体"/>
+                <w:rFonts w:ascii="Times New Roman" w:hAnsi="Times New Roman" w:eastAsia="Songti SC"/>
                 <w:sz w:val="18"/>
               </w:rPr>
               <w:t>分发完整性</w:t>
@@ -2143,7 +2083,7 @@
             </w:r>
             <w:r>
               <w:rPr>
-                <w:rFonts w:ascii="Times New Roman" w:hAnsi="Times New Roman" w:eastAsia="宋体"/>
+                <w:rFonts w:ascii="Times New Roman" w:hAnsi="Times New Roman" w:eastAsia="Songti SC"/>
                 <w:sz w:val="18"/>
               </w:rPr>
               <w:t>新登记或严格完整性条目记录文件字节数和SHA-256；同一标签的受控镜像指向相同内容</w:t>
@@ -2162,7 +2102,7 @@
             </w:r>
             <w:r>
               <w:rPr>
-                <w:rFonts w:ascii="Times New Roman" w:hAnsi="Times New Roman" w:eastAsia="宋体"/>
+                <w:rFonts w:ascii="Times New Roman" w:hAnsi="Times New Roman" w:eastAsia="Songti SC"/>
                 <w:sz w:val="18"/>
               </w:rPr>
               <w:t>对带完整性元数据的条目下载后核验并以事务方式进入正式目录；历史条目由兼容模式承接</w:t>
@@ -2177,14 +2117,14 @@
       </w:pPr>
       <w:r>
         <w:rPr>
-          <w:rFonts w:ascii="Times New Roman" w:hAnsi="Times New Roman" w:eastAsia="宋体"/>
+          <w:rFonts w:ascii="Times New Roman" w:hAnsi="Times New Roman" w:eastAsia="Songti SC"/>
           <w:b/>
         </w:rPr>
         <w:t>Table 2 Standardized NetCDF data and metadata requirements of GriddingMachine.</w:t>
       </w:r>
       <w:r>
         <w:rPr>
-          <w:rFonts w:ascii="Times New Roman" w:hAnsi="Times New Roman" w:eastAsia="宋体"/>
+          <w:rFonts w:ascii="Times New Roman" w:hAnsi="Times New Roman" w:eastAsia="Songti SC"/>
         </w:rPr>
         <w:t xml:space="preserve"> The specification connects grid structure, gap filling, metadata, provenance, versioning, and distribution integrity within a unified production contract.</w:t>
       </w:r>
@@ -2192,135 +2132,135 @@
     <w:p>
       <w:r>
         <w:rPr>
-          <w:rFonts w:ascii="Times New Roman" w:hAnsi="Times New Roman" w:eastAsia="宋体"/>
-        </w:rPr>
-        <w:t>缺失值处理由YAML中的</w:t>
-      </w:r>
-      <w:r>
-        <w:rPr>
-          <w:rFonts w:ascii="Consolas" w:hAnsi="Consolas" w:eastAsia="等线"/>
+          <w:rFonts w:ascii="Times New Roman" w:hAnsi="Times New Roman" w:eastAsia="Songti SC"/>
+        </w:rPr>
+        <w:t>缺失值填补（gap filling，以下简称Gapfill）由YAML中的</w:t>
+      </w:r>
+      <w:r>
+        <w:rPr>
+          <w:rFonts w:ascii="Consolas" w:hAnsi="Consolas" w:eastAsia="Songti SC"/>
         </w:rPr>
         <w:t>GAPFILL</w:t>
       </w:r>
       <w:r>
         <w:rPr>
-          <w:rFonts w:ascii="Times New Roman" w:hAnsi="Times New Roman" w:eastAsia="宋体"/>
-        </w:rPr>
-        <w:t>字段驱动，并依据产品物理含义选择相应策略。数值常数和</w:t>
-      </w:r>
-      <w:r>
-        <w:rPr>
-          <w:rFonts w:ascii="Consolas" w:hAnsi="Consolas" w:eastAsia="等线"/>
+          <w:rFonts w:ascii="Times New Roman" w:hAnsi="Times New Roman" w:eastAsia="Songti SC"/>
+        </w:rPr>
+        <w:t>字段驱动，并依据数据集物理含义选择相应策略。数值常数和</w:t>
+      </w:r>
+      <w:r>
+        <w:rPr>
+          <w:rFonts w:ascii="Consolas" w:hAnsi="Consolas" w:eastAsia="Songti SC"/>
         </w:rPr>
         <w:t>MEAN</w:t>
       </w:r>
       <w:r>
         <w:rPr>
-          <w:rFonts w:ascii="Times New Roman" w:hAnsi="Times New Roman" w:eastAsia="宋体"/>
+          <w:rFonts w:ascii="Times New Roman" w:hAnsi="Times New Roman" w:eastAsia="Songti SC"/>
         </w:rPr>
         <w:t>分别以给定值或分层</w:t>
       </w:r>
       <w:r>
         <w:rPr>
-          <w:rFonts w:ascii="Consolas" w:hAnsi="Consolas" w:eastAsia="等线"/>
+          <w:rFonts w:ascii="Consolas" w:hAnsi="Consolas" w:eastAsia="Songti SC"/>
         </w:rPr>
         <w:t>nanmean</w:t>
       </w:r>
       <w:r>
         <w:rPr>
-          <w:rFonts w:ascii="Times New Roman" w:hAnsi="Times New Roman" w:eastAsia="宋体"/>
+          <w:rFonts w:ascii="Times New Roman" w:hAnsi="Times New Roman" w:eastAsia="Songti SC"/>
         </w:rPr>
         <w:t>填补陆地区域缺失值；</w:t>
       </w:r>
       <w:r>
         <w:rPr>
-          <w:rFonts w:ascii="Consolas" w:hAnsi="Consolas" w:eastAsia="等线"/>
+          <w:rFonts w:ascii="Consolas" w:hAnsi="Consolas" w:eastAsia="Songti SC"/>
         </w:rPr>
         <w:t>KEEP_AS_IS</w:t>
       </w:r>
       <w:r>
         <w:rPr>
-          <w:rFonts w:ascii="Times New Roman" w:hAnsi="Times New Roman" w:eastAsia="宋体"/>
+          <w:rFonts w:ascii="Times New Roman" w:hAnsi="Times New Roman" w:eastAsia="Songti SC"/>
         </w:rPr>
         <w:t>保持原始数组；</w:t>
       </w:r>
       <w:r>
         <w:rPr>
-          <w:rFonts w:ascii="Consolas" w:hAnsi="Consolas" w:eastAsia="等线"/>
+          <w:rFonts w:ascii="Consolas" w:hAnsi="Consolas" w:eastAsia="Songti SC"/>
         </w:rPr>
         <w:t>INT_NAN_TO_1</w:t>
       </w:r>
       <w:r>
         <w:rPr>
-          <w:rFonts w:ascii="Times New Roman" w:hAnsi="Times New Roman" w:eastAsia="宋体"/>
+          <w:rFonts w:ascii="Times New Roman" w:hAnsi="Times New Roman" w:eastAsia="Songti SC"/>
         </w:rPr>
         <w:t>将缺失值补为1并对数组整数化；</w:t>
       </w:r>
       <w:r>
         <w:rPr>
-          <w:rFonts w:ascii="Consolas" w:hAnsi="Consolas" w:eastAsia="等线"/>
+          <w:rFonts w:ascii="Consolas" w:hAnsi="Consolas" w:eastAsia="Songti SC"/>
         </w:rPr>
         <w:t>NO_LAND_NAN</w:t>
       </w:r>
       <w:r>
         <w:rPr>
-          <w:rFonts w:ascii="Times New Roman" w:hAnsi="Times New Roman" w:eastAsia="宋体"/>
+          <w:rFonts w:ascii="Times New Roman" w:hAnsi="Times New Roman" w:eastAsia="Songti SC"/>
         </w:rPr>
         <w:t>和</w:t>
       </w:r>
       <w:r>
         <w:rPr>
-          <w:rFonts w:ascii="Consolas" w:hAnsi="Consolas" w:eastAsia="等线"/>
+          <w:rFonts w:ascii="Consolas" w:hAnsi="Consolas" w:eastAsia="Songti SC"/>
         </w:rPr>
         <w:t>NO_NAN</w:t>
       </w:r>
       <w:r>
         <w:rPr>
-          <w:rFonts w:ascii="Times New Roman" w:hAnsi="Times New Roman" w:eastAsia="宋体"/>
-        </w:rPr>
-        <w:t>分别检查陆地区域与全域的数据完整性。Gapfill由此统一连接有效范围过滤、陆海掩膜、缺失值处置和输出精度，为不同地球系统数据产品提供可配置的数据完善方法。ELEV采用常数0填补策略，为统一读取和模型调用提供连续地形场。</w:t>
+          <w:rFonts w:ascii="Times New Roman" w:hAnsi="Times New Roman" w:eastAsia="Songti SC"/>
+        </w:rPr>
+        <w:t>分别检查陆地区域与全域的数据完整性。Gapfill由此统一连接有效范围过滤、陆海掩膜、缺失值处置和输出精度，为不同地球系统数据集提供可配置的数据完善方法。高程数据（ELEV）采用常数0填补策略，为统一读取和模式调用提供连续地形场。</w:t>
       </w:r>
     </w:p>
     <w:p>
       <w:r>
         <w:rPr>
-          <w:rFonts w:ascii="Times New Roman" w:hAnsi="Times New Roman" w:eastAsia="宋体"/>
+          <w:rFonts w:ascii="Times New Roman" w:hAnsi="Times New Roman" w:eastAsia="Songti SC"/>
         </w:rPr>
         <w:t>CF约定利用坐标变量和属性表达维度语义[2]。GriddingMachine进一步固定输出维度顺序，以降低下游接口复杂度。新版通过YAML的</w:t>
       </w:r>
       <w:r>
         <w:rPr>
-          <w:rFonts w:ascii="Consolas" w:hAnsi="Consolas" w:eastAsia="等线"/>
+          <w:rFonts w:ascii="Consolas" w:hAnsi="Consolas" w:eastAsia="Songti SC"/>
         </w:rPr>
         <w:t>DIMENSIONS</w:t>
       </w:r>
       <w:r>
         <w:rPr>
-          <w:rFonts w:ascii="Times New Roman" w:hAnsi="Times New Roman" w:eastAsia="宋体"/>
+          <w:rFonts w:ascii="Times New Roman" w:hAnsi="Times New Roman" w:eastAsia="Songti SC"/>
         </w:rPr>
         <w:t>显式记录源变量各维度语义，维度标准化过程将</w:t>
       </w:r>
       <w:r>
         <w:rPr>
-          <w:rFonts w:ascii="Consolas" w:hAnsi="Consolas" w:eastAsia="等线"/>
+          <w:rFonts w:ascii="Consolas" w:hAnsi="Consolas" w:eastAsia="Songti SC"/>
         </w:rPr>
         <w:t>(lat, lon)</w:t>
       </w:r>
       <w:r>
         <w:rPr>
-          <w:rFonts w:ascii="Times New Roman" w:hAnsi="Times New Roman" w:eastAsia="宋体"/>
+          <w:rFonts w:ascii="Times New Roman" w:hAnsi="Times New Roman" w:eastAsia="Songti SC"/>
         </w:rPr>
         <w:t>、</w:t>
       </w:r>
       <w:r>
         <w:rPr>
-          <w:rFonts w:ascii="Consolas" w:hAnsi="Consolas" w:eastAsia="等线"/>
+          <w:rFonts w:ascii="Consolas" w:hAnsi="Consolas" w:eastAsia="Songti SC"/>
         </w:rPr>
         <w:t>(ind, lat, lon)</w:t>
       </w:r>
       <w:r>
         <w:rPr>
-          <w:rFonts w:ascii="Times New Roman" w:hAnsi="Times New Roman" w:eastAsia="宋体"/>
+          <w:rFonts w:ascii="Times New Roman" w:hAnsi="Times New Roman" w:eastAsia="Songti SC"/>
         </w:rPr>
         <w:t>等排列重排为统一输出；经纬度翻转与循环平移同步作用于坐标和数据值。规则经纬网数据进入通用标准化流程，非规则网格、区域投影和复杂坐标数据由数据源专用预处理模块完成适配。</w:t>
       </w:r>
@@ -2331,7 +2271,7 @@
       </w:pPr>
       <w:r>
         <w:rPr>
-          <w:rFonts w:ascii="Times New Roman" w:hAnsi="Times New Roman" w:eastAsia="宋体"/>
+          <w:rFonts w:ascii="Times New Roman" w:hAnsi="Times New Roman" w:eastAsia="Songti SC"/>
         </w:rPr>
         <w:t>2.2.2 YAML配置与转换示例</w:t>
       </w:r>
@@ -2339,103 +2279,103 @@
     <w:p>
       <w:r>
         <w:rPr>
-          <w:rFonts w:ascii="Times New Roman" w:hAnsi="Times New Roman" w:eastAsia="宋体"/>
+          <w:rFonts w:ascii="Times New Roman" w:hAnsi="Times New Roman" w:eastAsia="Songti SC"/>
         </w:rPr>
         <w:t>YAML将数据源差异与通用处理代码分离。配置以</w:t>
       </w:r>
       <w:r>
         <w:rPr>
-          <w:rFonts w:ascii="Consolas" w:hAnsi="Consolas" w:eastAsia="等线"/>
+          <w:rFonts w:ascii="Consolas" w:hAnsi="Consolas" w:eastAsia="Songti SC"/>
         </w:rPr>
         <w:t>FILE</w:t>
       </w:r>
       <w:r>
         <w:rPr>
-          <w:rFonts w:ascii="Times New Roman" w:hAnsi="Times New Roman" w:eastAsia="宋体"/>
+          <w:rFonts w:ascii="Times New Roman" w:hAnsi="Times New Roman" w:eastAsia="Songti SC"/>
         </w:rPr>
         <w:t>、</w:t>
       </w:r>
       <w:r>
         <w:rPr>
-          <w:rFonts w:ascii="Consolas" w:hAnsi="Consolas" w:eastAsia="等线"/>
+          <w:rFonts w:ascii="Consolas" w:hAnsi="Consolas" w:eastAsia="Songti SC"/>
         </w:rPr>
         <w:t>FOLDER</w:t>
       </w:r>
       <w:r>
         <w:rPr>
-          <w:rFonts w:ascii="Times New Roman" w:hAnsi="Times New Roman" w:eastAsia="宋体"/>
+          <w:rFonts w:ascii="Times New Roman" w:hAnsi="Times New Roman" w:eastAsia="Songti SC"/>
         </w:rPr>
         <w:t>、</w:t>
       </w:r>
       <w:r>
         <w:rPr>
-          <w:rFonts w:ascii="Consolas" w:hAnsi="Consolas" w:eastAsia="等线"/>
+          <w:rFonts w:ascii="Consolas" w:hAnsi="Consolas" w:eastAsia="Songti SC"/>
         </w:rPr>
         <w:t>DATA</w:t>
       </w:r>
       <w:r>
         <w:rPr>
-          <w:rFonts w:ascii="Times New Roman" w:hAnsi="Times New Roman" w:eastAsia="宋体"/>
+          <w:rFonts w:ascii="Times New Roman" w:hAnsi="Times New Roman" w:eastAsia="Songti SC"/>
         </w:rPr>
         <w:t>（及可选</w:t>
       </w:r>
       <w:r>
         <w:rPr>
-          <w:rFonts w:ascii="Consolas" w:hAnsi="Consolas" w:eastAsia="等线"/>
+          <w:rFonts w:ascii="Consolas" w:hAnsi="Consolas" w:eastAsia="Songti SC"/>
         </w:rPr>
         <w:t>STD</w:t>
       </w:r>
       <w:r>
         <w:rPr>
-          <w:rFonts w:ascii="Times New Roman" w:hAnsi="Times New Roman" w:eastAsia="宋体"/>
+          <w:rFonts w:ascii="Times New Roman" w:hAnsi="Times New Roman" w:eastAsia="Songti SC"/>
         </w:rPr>
         <w:t>）和</w:t>
       </w:r>
       <w:r>
         <w:rPr>
-          <w:rFonts w:ascii="Consolas" w:hAnsi="Consolas" w:eastAsia="等线"/>
+          <w:rFonts w:ascii="Consolas" w:hAnsi="Consolas" w:eastAsia="Songti SC"/>
         </w:rPr>
         <w:t>GRIDDINGMACHINE</w:t>
       </w:r>
       <w:r>
         <w:rPr>
-          <w:rFonts w:ascii="Times New Roman" w:hAnsi="Times New Roman" w:eastAsia="宋体"/>
+          <w:rFonts w:ascii="Times New Roman" w:hAnsi="Times New Roman" w:eastAsia="Songti SC"/>
         </w:rPr>
         <w:t>组织文件组合、输入输出位置、变量语义与转换规则以及稳定标签，并通过</w:t>
       </w:r>
       <w:r>
         <w:rPr>
-          <w:rFonts w:ascii="Consolas" w:hAnsi="Consolas" w:eastAsia="等线"/>
+          <w:rFonts w:ascii="Consolas" w:hAnsi="Consolas" w:eastAsia="Songti SC"/>
         </w:rPr>
         <w:t>SCHEMA_VERSION</w:t>
       </w:r>
       <w:r>
         <w:rPr>
-          <w:rFonts w:ascii="Times New Roman" w:hAnsi="Times New Roman" w:eastAsia="宋体"/>
+          <w:rFonts w:ascii="Times New Roman" w:hAnsi="Times New Roman" w:eastAsia="Songti SC"/>
         </w:rPr>
         <w:t>约束字段类型、必需项、默认值、互斥关系和数组长度一致性。</w:t>
       </w:r>
       <w:r>
         <w:rPr>
-          <w:rFonts w:ascii="Consolas" w:hAnsi="Consolas" w:eastAsia="等线"/>
+          <w:rFonts w:ascii="Consolas" w:hAnsi="Consolas" w:eastAsia="Songti SC"/>
         </w:rPr>
         <w:t>DIMENSIONS</w:t>
       </w:r>
       <w:r>
         <w:rPr>
-          <w:rFonts w:ascii="Times New Roman" w:hAnsi="Times New Roman" w:eastAsia="宋体"/>
+          <w:rFonts w:ascii="Times New Roman" w:hAnsi="Times New Roman" w:eastAsia="Songti SC"/>
         </w:rPr>
         <w:t>显式记录源变量的维度语义，</w:t>
       </w:r>
       <w:r>
         <w:rPr>
-          <w:rFonts w:ascii="Consolas" w:hAnsi="Consolas" w:eastAsia="等线"/>
+          <w:rFonts w:ascii="Consolas" w:hAnsi="Consolas" w:eastAsia="Songti SC"/>
         </w:rPr>
         <w:t>GAPFILL</w:t>
       </w:r>
       <w:r>
         <w:rPr>
-          <w:rFonts w:ascii="Times New Roman" w:hAnsi="Times New Roman" w:eastAsia="宋体"/>
+          <w:rFonts w:ascii="Times New Roman" w:hAnsi="Times New Roman" w:eastAsia="Songti SC"/>
         </w:rPr>
         <w:t>、坐标方向、数值范围和缩放规则在数据读取前完成解析；配置构建器与生产流水线调用同一规范。</w:t>
       </w:r>
@@ -2443,63 +2383,63 @@
     <w:p>
       <w:r>
         <w:rPr>
-          <w:rFonts w:ascii="Times New Roman" w:hAnsi="Times New Roman" w:eastAsia="宋体"/>
+          <w:rFonts w:ascii="Times New Roman" w:hAnsi="Times New Roman" w:eastAsia="Songti SC"/>
         </w:rPr>
         <w:t>受控二维示例采用</w:t>
       </w:r>
       <w:r>
         <w:rPr>
-          <w:rFonts w:ascii="Consolas" w:hAnsi="Consolas" w:eastAsia="等线"/>
+          <w:rFonts w:ascii="Consolas" w:hAnsi="Consolas" w:eastAsia="Songti SC"/>
         </w:rPr>
         <w:t>(lat, lon)</w:t>
       </w:r>
       <w:r>
         <w:rPr>
-          <w:rFonts w:ascii="Times New Roman" w:hAnsi="Times New Roman" w:eastAsia="宋体"/>
+          <w:rFonts w:ascii="Times New Roman" w:hAnsi="Times New Roman" w:eastAsia="Songti SC"/>
         </w:rPr>
         <w:t>源维度排列，纬度按北向南排列，经度范围为</w:t>
       </w:r>
       <w:r>
         <w:rPr>
-          <w:rFonts w:ascii="Consolas" w:hAnsi="Consolas" w:eastAsia="等线"/>
+          <w:rFonts w:ascii="Consolas" w:hAnsi="Consolas" w:eastAsia="Songti SC"/>
         </w:rPr>
         <w:t>0°～360°</w:t>
       </w:r>
       <w:r>
         <w:rPr>
-          <w:rFonts w:ascii="Times New Roman" w:hAnsi="Times New Roman" w:eastAsia="宋体"/>
+          <w:rFonts w:ascii="Times New Roman" w:hAnsi="Times New Roman" w:eastAsia="Songti SC"/>
         </w:rPr>
         <w:t>。配置文件显式声明源维度语义、纬度方向转换、经度范围转换和线性数值变换，生产流水线据此生成标准</w:t>
       </w:r>
       <w:r>
         <w:rPr>
-          <w:rFonts w:ascii="Consolas" w:hAnsi="Consolas" w:eastAsia="等线"/>
+          <w:rFonts w:ascii="Consolas" w:hAnsi="Consolas" w:eastAsia="Songti SC"/>
         </w:rPr>
         <w:t>(lon, lat)</w:t>
       </w:r>
       <w:r>
         <w:rPr>
-          <w:rFonts w:ascii="Times New Roman" w:hAnsi="Times New Roman" w:eastAsia="宋体"/>
-        </w:rPr>
-        <w:t>产品。输出坐标和数值与独立构造的参考数组逐点一致，用于验证配置声明能够被正确映射为标准化处理过程。完整YAML配置、字段说明、执行命令和目录结构列于补充材料S3及版本化贡献指南。</w:t>
+          <w:rFonts w:ascii="Times New Roman" w:hAnsi="Times New Roman" w:eastAsia="Songti SC"/>
+        </w:rPr>
+        <w:t>数据集。输出坐标和数值与独立构造的参考数组逐点一致，用于验证配置声明能够被正确映射为标准化处理过程。完整YAML配置、字段说明、执行命令和目录结构列于补充材料S3及版本化贡献指南。</w:t>
       </w:r>
     </w:p>
     <w:p>
       <w:r>
         <w:rPr>
-          <w:rFonts w:ascii="Times New Roman" w:hAnsi="Times New Roman" w:eastAsia="宋体"/>
+          <w:rFonts w:ascii="Times New Roman" w:hAnsi="Times New Roman" w:eastAsia="Songti SC"/>
         </w:rPr>
         <w:t>框架同时提供程序化和本地交互式配置生成方式。二者输出均经同一配置规范校验后进入</w:t>
       </w:r>
       <w:r>
         <w:rPr>
-          <w:rFonts w:ascii="Consolas" w:hAnsi="Consolas" w:eastAsia="等线"/>
+          <w:rFonts w:ascii="Consolas" w:hAnsi="Consolas" w:eastAsia="Songti SC"/>
         </w:rPr>
         <w:t>process_dataset!</w:t>
       </w:r>
       <w:r>
         <w:rPr>
-          <w:rFonts w:ascii="Times New Roman" w:hAnsi="Times New Roman" w:eastAsia="宋体"/>
+          <w:rFonts w:ascii="Times New Roman" w:hAnsi="Times New Roman" w:eastAsia="Songti SC"/>
         </w:rPr>
         <w:t>，使数据贡献入口与生产流水线共享一致的字段语义。</w:t>
       </w:r>
@@ -2510,7 +2450,7 @@
       </w:pPr>
       <w:r>
         <w:rPr>
-          <w:rFonts w:ascii="Times New Roman" w:hAnsi="Times New Roman" w:eastAsia="宋体"/>
+          <w:rFonts w:ascii="Times New Roman" w:hAnsi="Times New Roman" w:eastAsia="Songti SC"/>
         </w:rPr>
         <w:t>2.2.3 生产流程与质量控制</w:t>
       </w:r>
@@ -2518,217 +2458,217 @@
     <w:p>
       <w:r>
         <w:rPr>
-          <w:rFonts w:ascii="Times New Roman" w:hAnsi="Times New Roman" w:eastAsia="宋体"/>
-        </w:rPr>
-        <w:t>标准产品生产引擎首先根据</w:t>
-      </w:r>
-      <w:r>
-        <w:rPr>
-          <w:rFonts w:ascii="Consolas" w:hAnsi="Consolas" w:eastAsia="等线"/>
+          <w:rFonts w:ascii="Times New Roman" w:hAnsi="Times New Roman" w:eastAsia="Songti SC"/>
+        </w:rPr>
+        <w:t>标准化数据生产引擎首先根据</w:t>
+      </w:r>
+      <w:r>
+        <w:rPr>
+          <w:rFonts w:ascii="Consolas" w:hAnsi="Consolas" w:eastAsia="Songti SC"/>
         </w:rPr>
         <w:t>FILE</w:t>
       </w:r>
       <w:r>
         <w:rPr>
-          <w:rFonts w:ascii="Times New Roman" w:hAnsi="Times New Roman" w:eastAsia="宋体"/>
+          <w:rFonts w:ascii="Times New Roman" w:hAnsi="Times New Roman" w:eastAsia="Songti SC"/>
         </w:rPr>
         <w:t>和</w:t>
       </w:r>
       <w:r>
         <w:rPr>
-          <w:rFonts w:ascii="Consolas" w:hAnsi="Consolas" w:eastAsia="等线"/>
+          <w:rFonts w:ascii="Consolas" w:hAnsi="Consolas" w:eastAsia="Songti SC"/>
         </w:rPr>
         <w:t>FOLDER</w:t>
       </w:r>
       <w:r>
         <w:rPr>
-          <w:rFonts w:ascii="Times New Roman" w:hAnsi="Times New Roman" w:eastAsia="宋体"/>
+          <w:rFonts w:ascii="Times New Roman" w:hAnsi="Times New Roman" w:eastAsia="Songti SC"/>
         </w:rPr>
         <w:t>定位输入与输出文件，再读取</w:t>
       </w:r>
       <w:r>
         <w:rPr>
-          <w:rFonts w:ascii="Consolas" w:hAnsi="Consolas" w:eastAsia="等线"/>
+          <w:rFonts w:ascii="Consolas" w:hAnsi="Consolas" w:eastAsia="Songti SC"/>
         </w:rPr>
         <w:t>DATA</w:t>
       </w:r>
       <w:r>
         <w:rPr>
-          <w:rFonts w:ascii="Times New Roman" w:hAnsi="Times New Roman" w:eastAsia="宋体"/>
+          <w:rFonts w:ascii="Times New Roman" w:hAnsi="Times New Roman" w:eastAsia="Songti SC"/>
         </w:rPr>
         <w:t>和可选</w:t>
       </w:r>
       <w:r>
         <w:rPr>
-          <w:rFonts w:ascii="Consolas" w:hAnsi="Consolas" w:eastAsia="等线"/>
+          <w:rFonts w:ascii="Consolas" w:hAnsi="Consolas" w:eastAsia="Songti SC"/>
         </w:rPr>
         <w:t>STD</w:t>
       </w:r>
       <w:r>
         <w:rPr>
-          <w:rFonts w:ascii="Times New Roman" w:hAnsi="Times New Roman" w:eastAsia="宋体"/>
+          <w:rFonts w:ascii="Times New Roman" w:hAnsi="Times New Roman" w:eastAsia="Songti SC"/>
         </w:rPr>
         <w:t>指定的源变量。流水线将数据转换为</w:t>
       </w:r>
       <w:r>
         <w:rPr>
-          <w:rFonts w:ascii="Consolas" w:hAnsi="Consolas" w:eastAsia="等线"/>
+          <w:rFonts w:ascii="Consolas" w:hAnsi="Consolas" w:eastAsia="Songti SC"/>
         </w:rPr>
         <w:t>Float32</w:t>
       </w:r>
       <w:r>
         <w:rPr>
-          <w:rFonts w:ascii="Times New Roman" w:hAnsi="Times New Roman" w:eastAsia="宋体"/>
+          <w:rFonts w:ascii="Times New Roman" w:hAnsi="Times New Roman" w:eastAsia="Songti SC"/>
         </w:rPr>
         <w:t>，依次执行纬度翻转、经度翻转或从</w:t>
       </w:r>
       <w:r>
         <w:rPr>
-          <w:rFonts w:ascii="Consolas" w:hAnsi="Consolas" w:eastAsia="等线"/>
+          <w:rFonts w:ascii="Consolas" w:hAnsi="Consolas" w:eastAsia="Songti SC"/>
         </w:rPr>
         <w:t>0°～360°</w:t>
       </w:r>
       <w:r>
         <w:rPr>
-          <w:rFonts w:ascii="Times New Roman" w:hAnsi="Times New Roman" w:eastAsia="宋体"/>
+          <w:rFonts w:ascii="Times New Roman" w:hAnsi="Times New Roman" w:eastAsia="Songti SC"/>
         </w:rPr>
         <w:t>到</w:t>
       </w:r>
       <w:r>
         <w:rPr>
-          <w:rFonts w:ascii="Consolas" w:hAnsi="Consolas" w:eastAsia="等线"/>
+          <w:rFonts w:ascii="Consolas" w:hAnsi="Consolas" w:eastAsia="Songti SC"/>
         </w:rPr>
         <w:t>−180°～180°</w:t>
       </w:r>
       <w:r>
         <w:rPr>
-          <w:rFonts w:ascii="Times New Roman" w:hAnsi="Times New Roman" w:eastAsia="宋体"/>
-        </w:rPr>
-        <w:t>的循环平移、线性缩放、有效范围过滤和缺失值处理。各项转换追加为NetCDF变量属性中的变更记录；研究材料进一步将完整YAML、固定输入和版本化项目环境与输出产品共同归档。</w:t>
+          <w:rFonts w:ascii="Times New Roman" w:hAnsi="Times New Roman" w:eastAsia="Songti SC"/>
+        </w:rPr>
+        <w:t>的循环平移、线性缩放、有效范围过滤和缺失值处理。各项转换追加为NetCDF变量属性中的变更记录；研究材料进一步将完整YAML、固定输入和版本化项目环境与输出数据集共同归档。</w:t>
       </w:r>
     </w:p>
     <w:p>
       <w:r>
         <w:rPr>
-          <w:rFonts w:ascii="Times New Roman" w:hAnsi="Times New Roman" w:eastAsia="宋体"/>
+          <w:rFonts w:ascii="Times New Roman" w:hAnsi="Times New Roman" w:eastAsia="Songti SC"/>
         </w:rPr>
         <w:t>生产流程在保存前检查维度、坐标、变量、数值范围和Gapfill结果，空间方向图进一步呈现坐标语义。质量控制完成后生成</w:t>
       </w:r>
       <w:r>
         <w:rPr>
-          <w:rFonts w:ascii="Consolas" w:hAnsi="Consolas" w:eastAsia="等线"/>
+          <w:rFonts w:ascii="Consolas" w:hAnsi="Consolas" w:eastAsia="Songti SC"/>
         </w:rPr>
         <w:t>data</w:t>
       </w:r>
       <w:r>
         <w:rPr>
-          <w:rFonts w:ascii="Times New Roman" w:hAnsi="Times New Roman" w:eastAsia="宋体"/>
+          <w:rFonts w:ascii="Times New Roman" w:hAnsi="Times New Roman" w:eastAsia="Songti SC"/>
         </w:rPr>
         <w:t>，存在不确定性时追加同形的</w:t>
       </w:r>
       <w:r>
         <w:rPr>
-          <w:rFonts w:ascii="Consolas" w:hAnsi="Consolas" w:eastAsia="等线"/>
+          <w:rFonts w:ascii="Consolas" w:hAnsi="Consolas" w:eastAsia="Songti SC"/>
         </w:rPr>
         <w:t>std</w:t>
       </w:r>
       <w:r>
         <w:rPr>
-          <w:rFonts w:ascii="Times New Roman" w:hAnsi="Times New Roman" w:eastAsia="宋体"/>
+          <w:rFonts w:ascii="Times New Roman" w:hAnsi="Times New Roman" w:eastAsia="Songti SC"/>
         </w:rPr>
         <w:t>，并按</w:t>
       </w:r>
       <w:r>
         <w:rPr>
-          <w:rFonts w:ascii="Consolas" w:hAnsi="Consolas" w:eastAsia="等线"/>
+          <w:rFonts w:ascii="Consolas" w:hAnsi="Consolas" w:eastAsia="Songti SC"/>
         </w:rPr>
         <w:t>TAG_(PREFIX_)NX_MT_(YYYY_)VV(_REVISION)</w:t>
       </w:r>
       <w:r>
         <w:rPr>
-          <w:rFonts w:ascii="Times New Roman" w:hAnsi="Times New Roman" w:eastAsia="宋体"/>
-        </w:rPr>
-        <w:t>生成唯一文件名。文件级变更记录与发布级配置、输入和软件环境共同构成双层复现链，连接产品内容与其生成上下文。</w:t>
+          <w:rFonts w:ascii="Times New Roman" w:hAnsi="Times New Roman" w:eastAsia="Songti SC"/>
+        </w:rPr>
+        <w:t>生成唯一文件名。文件级变更记录与发布级配置、输入和软件环境共同构成双层复现链，连接数据集内容与其生成上下文。</w:t>
       </w:r>
     </w:p>
     <w:p>
       <w:r>
         <w:rPr>
-          <w:rFonts w:ascii="Times New Roman" w:hAnsi="Times New Roman" w:eastAsia="宋体"/>
+          <w:rFonts w:ascii="Times New Roman" w:hAnsi="Times New Roman" w:eastAsia="Songti SC"/>
         </w:rPr>
         <w:t>空间方向检查依据变量维度生成带经纬度坐标轴的审核图，人工确认与自动结构、坐标和逐点数值检查相互补充；</w:t>
       </w:r>
       <w:r>
         <w:rPr>
-          <w:rFonts w:ascii="Consolas" w:hAnsi="Consolas" w:eastAsia="等线"/>
+          <w:rFonts w:ascii="Consolas" w:hAnsi="Consolas" w:eastAsia="Songti SC"/>
         </w:rPr>
         <w:t>VERIFY_ONCE</w:t>
       </w:r>
       <w:r>
         <w:rPr>
-          <w:rFonts w:ascii="Times New Roman" w:hAnsi="Times New Roman" w:eastAsia="宋体"/>
-        </w:rPr>
-        <w:t>用于记录同一配置组合的首次方向确认。成品质量检查进一步核对</w:t>
-      </w:r>
-      <w:r>
-        <w:rPr>
-          <w:rFonts w:ascii="Consolas" w:hAnsi="Consolas" w:eastAsia="等线"/>
+          <w:rFonts w:ascii="Times New Roman" w:hAnsi="Times New Roman" w:eastAsia="Songti SC"/>
+        </w:rPr>
+        <w:t>用于记录同一配置组合的首次方向确认。输出数据质量检查进一步核对</w:t>
+      </w:r>
+      <w:r>
+        <w:rPr>
+          <w:rFonts w:ascii="Consolas" w:hAnsi="Consolas" w:eastAsia="Songti SC"/>
         </w:rPr>
         <w:t>lon</w:t>
       </w:r>
       <w:r>
         <w:rPr>
-          <w:rFonts w:ascii="Times New Roman" w:hAnsi="Times New Roman" w:eastAsia="宋体"/>
+          <w:rFonts w:ascii="Times New Roman" w:hAnsi="Times New Roman" w:eastAsia="Songti SC"/>
         </w:rPr>
         <w:t>、</w:t>
       </w:r>
       <w:r>
         <w:rPr>
-          <w:rFonts w:ascii="Consolas" w:hAnsi="Consolas" w:eastAsia="等线"/>
+          <w:rFonts w:ascii="Consolas" w:hAnsi="Consolas" w:eastAsia="Songti SC"/>
         </w:rPr>
         <w:t>lat</w:t>
       </w:r>
       <w:r>
         <w:rPr>
-          <w:rFonts w:ascii="Times New Roman" w:hAnsi="Times New Roman" w:eastAsia="宋体"/>
+          <w:rFonts w:ascii="Times New Roman" w:hAnsi="Times New Roman" w:eastAsia="Songti SC"/>
         </w:rPr>
         <w:t>及可选</w:t>
       </w:r>
       <w:r>
         <w:rPr>
-          <w:rFonts w:ascii="Consolas" w:hAnsi="Consolas" w:eastAsia="等线"/>
+          <w:rFonts w:ascii="Consolas" w:hAnsi="Consolas" w:eastAsia="Songti SC"/>
         </w:rPr>
         <w:t>ind</w:t>
       </w:r>
       <w:r>
         <w:rPr>
-          <w:rFonts w:ascii="Times New Roman" w:hAnsi="Times New Roman" w:eastAsia="宋体"/>
+          <w:rFonts w:ascii="Times New Roman" w:hAnsi="Times New Roman" w:eastAsia="Songti SC"/>
         </w:rPr>
         <w:t>维度、主变量</w:t>
       </w:r>
       <w:r>
         <w:rPr>
-          <w:rFonts w:ascii="Consolas" w:hAnsi="Consolas" w:eastAsia="等线"/>
+          <w:rFonts w:ascii="Consolas" w:hAnsi="Consolas" w:eastAsia="Songti SC"/>
         </w:rPr>
         <w:t>data</w:t>
       </w:r>
       <w:r>
         <w:rPr>
-          <w:rFonts w:ascii="Times New Roman" w:hAnsi="Times New Roman" w:eastAsia="宋体"/>
+          <w:rFonts w:ascii="Times New Roman" w:hAnsi="Times New Roman" w:eastAsia="Songti SC"/>
         </w:rPr>
         <w:t>、数值范围和缺失值状态。对于标准支持分辨率，陆地区域完整性通过重采样</w:t>
       </w:r>
       <w:r>
         <w:rPr>
-          <w:rFonts w:ascii="Consolas" w:hAnsi="Consolas" w:eastAsia="等线"/>
+          <w:rFonts w:ascii="Consolas" w:hAnsi="Consolas" w:eastAsia="Songti SC"/>
         </w:rPr>
         <w:t>LM_4X_1Y_V1</w:t>
       </w:r>
       <w:r>
         <w:rPr>
-          <w:rFonts w:ascii="Times New Roman" w:hAnsi="Times New Roman" w:eastAsia="宋体"/>
-        </w:rPr>
-        <w:t>掩膜检查；其他分辨率由专用规则承接。由此，生产阶段的变换记录、自动判据和必要的空间方向审核共同构成标准产品质量控制。</w:t>
+          <w:rFonts w:ascii="Times New Roman" w:hAnsi="Times New Roman" w:eastAsia="Songti SC"/>
+        </w:rPr>
+        <w:t>掩膜检查；其他分辨率由专用规则承接。由此，生产阶段的变换记录、自动判据和必要的空间方向审核共同构成标准化数据质量控制。</w:t>
       </w:r>
     </w:p>
     <w:p>
@@ -2737,7 +2677,7 @@
       </w:pPr>
       <w:r>
         <w:rPr>
-          <w:rFonts w:ascii="Times New Roman" w:hAnsi="Times New Roman" w:eastAsia="宋体"/>
+          <w:rFonts w:ascii="Times New Roman" w:hAnsi="Times New Roman" w:eastAsia="Songti SC"/>
         </w:rPr>
         <w:t>2.3 独立数据目录与事务式多镜像分发</w:t>
       </w:r>
@@ -2745,81 +2685,81 @@
     <w:p>
       <w:r>
         <w:rPr>
-          <w:rFonts w:ascii="Times New Roman" w:hAnsi="Times New Roman" w:eastAsia="宋体"/>
-        </w:rPr>
-        <w:t>标准产品标签由类别、可选前缀、空间分辨率、时间分辨率、可选年份、数据版本和可选修订号构成，基本形式为</w:t>
-      </w:r>
-      <w:r>
-        <w:rPr>
-          <w:rFonts w:ascii="Consolas" w:hAnsi="Consolas" w:eastAsia="等线"/>
+          <w:rFonts w:ascii="Times New Roman" w:hAnsi="Times New Roman" w:eastAsia="Songti SC"/>
+        </w:rPr>
+        <w:t>标准化数据标签由类别、可选前缀、空间分辨率、时间分辨率、可选年份、数据版本和可选修订号构成，基本形式为</w:t>
+      </w:r>
+      <w:r>
+        <w:rPr>
+          <w:rFonts w:ascii="Consolas" w:hAnsi="Consolas" w:eastAsia="Songti SC"/>
         </w:rPr>
         <w:t>TAG_(PREFIX_)NX_MT_(YYYY_)VV(_REVISION)</w:t>
       </w:r>
       <w:r>
         <w:rPr>
-          <w:rFonts w:ascii="Times New Roman" w:hAnsi="Times New Roman" w:eastAsia="宋体"/>
-        </w:rPr>
-        <w:t>。数据发布与目录登记相互解耦：维护者可将标准NetCDF发布到机构FTP、HTTP(S)或公共存储，目录生成器根据本地权威文件和公开地址生成逻辑路径、去重镜像列表，并对新登记或需要严格完整性管理的条目计算文件字节数和SHA-256。目录通过临时文件写入和替换，使产品列表、镜像位置和完整性元数据能够独立于访问软件版本更新。</w:t>
+          <w:rFonts w:ascii="Times New Roman" w:hAnsi="Times New Roman" w:eastAsia="Songti SC"/>
+        </w:rPr>
+        <w:t>。数据发布与目录登记相互解耦：维护者可将标准NetCDF发布到机构文件传输协议（File Transfer Protocol，FTP）服务器、HTTP(S)服务或Zenodo科研资源存储平台，目录生成器根据本地权威文件和公开地址生成逻辑路径、去重镜像列表，并对新登记或需要严格完整性管理的条目计算文件字节数和SHA-256。目录通过临时文件写入和替换，使数据集列表、镜像位置和完整性元数据能够独立于访问软件版本更新。</w:t>
       </w:r>
     </w:p>
     <w:p>
       <w:r>
         <w:rPr>
-          <w:rFonts w:ascii="Consolas" w:hAnsi="Consolas" w:eastAsia="等线"/>
+          <w:rFonts w:ascii="Consolas" w:hAnsi="Consolas" w:eastAsia="Songti SC"/>
         </w:rPr>
         <w:t>GriddingMachine.jl</w:t>
       </w:r>
       <w:r>
         <w:rPr>
-          <w:rFonts w:ascii="Times New Roman" w:hAnsi="Times New Roman" w:eastAsia="宋体"/>
+          <w:rFonts w:ascii="Times New Roman" w:hAnsi="Times New Roman" w:eastAsia="Songti SC"/>
         </w:rPr>
         <w:t>的Collector显式配置数据根目录、目录来源和本地目录文件。远端目录先下载至临时路径，经根节点和字段规范校验后再替换正式目录，并保留上一有效版本。目录条目以标签为键，核心字段包括安全相对路径</w:t>
       </w:r>
       <w:r>
         <w:rPr>
-          <w:rFonts w:ascii="Consolas" w:hAnsi="Consolas" w:eastAsia="等线"/>
+          <w:rFonts w:ascii="Consolas" w:hAnsi="Consolas" w:eastAsia="Songti SC"/>
         </w:rPr>
         <w:t>PATH</w:t>
       </w:r>
       <w:r>
         <w:rPr>
-          <w:rFonts w:ascii="Times New Roman" w:hAnsi="Times New Roman" w:eastAsia="宋体"/>
+          <w:rFonts w:ascii="Times New Roman" w:hAnsi="Times New Roman" w:eastAsia="Songti SC"/>
         </w:rPr>
         <w:t>、一个或多个</w:t>
       </w:r>
       <w:r>
         <w:rPr>
-          <w:rFonts w:ascii="Consolas" w:hAnsi="Consolas" w:eastAsia="等线"/>
+          <w:rFonts w:ascii="Consolas" w:hAnsi="Consolas" w:eastAsia="Songti SC"/>
         </w:rPr>
         <w:t>URL</w:t>
       </w:r>
       <w:r>
         <w:rPr>
-          <w:rFonts w:ascii="Times New Roman" w:hAnsi="Times New Roman" w:eastAsia="宋体"/>
+          <w:rFonts w:ascii="Times New Roman" w:hAnsi="Times New Roman" w:eastAsia="Songti SC"/>
         </w:rPr>
         <w:t>以及可选的</w:t>
       </w:r>
       <w:r>
         <w:rPr>
-          <w:rFonts w:ascii="Consolas" w:hAnsi="Consolas" w:eastAsia="等线"/>
+          <w:rFonts w:ascii="Consolas" w:hAnsi="Consolas" w:eastAsia="Songti SC"/>
         </w:rPr>
         <w:t>SIZE</w:t>
       </w:r>
       <w:r>
         <w:rPr>
-          <w:rFonts w:ascii="Times New Roman" w:hAnsi="Times New Roman" w:eastAsia="宋体"/>
+          <w:rFonts w:ascii="Times New Roman" w:hAnsi="Times New Roman" w:eastAsia="Songti SC"/>
         </w:rPr>
         <w:t>与</w:t>
       </w:r>
       <w:r>
         <w:rPr>
-          <w:rFonts w:ascii="Consolas" w:hAnsi="Consolas" w:eastAsia="等线"/>
+          <w:rFonts w:ascii="Consolas" w:hAnsi="Consolas" w:eastAsia="Songti SC"/>
         </w:rPr>
         <w:t>SHA256</w:t>
       </w:r>
       <w:r>
         <w:rPr>
-          <w:rFonts w:ascii="Times New Roman" w:hAnsi="Times New Roman" w:eastAsia="宋体"/>
+          <w:rFonts w:ascii="Times New Roman" w:hAnsi="Times New Roman" w:eastAsia="Songti SC"/>
         </w:rPr>
         <w:t>。严格完整性模式要求后两项同时存在，兼容模式保持历史条目的标签访问；目录规范和获取逻辑对多URL与完整性字段采用统一表达。</w:t>
       </w:r>
@@ -2827,17 +2767,17 @@
     <w:p>
       <w:r>
         <w:rPr>
-          <w:rFonts w:ascii="Times New Roman" w:hAnsi="Times New Roman" w:eastAsia="宋体"/>
-        </w:rPr>
-        <w:t>产品获取以标签为入口。系统保留目录中的全部镜像，并在存在可用延迟信号时辅助安排候选顺序；文件内容统一依据目录完整性元数据判定。每次镜像尝试写入进程级唯一临时文件，对带完整性元数据的条目检查文件状态、字节数和SHA-256，通过后移动至正式路径；各镜像尝试相互隔离，正式路径始终对应最近一次通过核验的产品。全库同步、状态查询和历史数据整理复用相同目录与获取逻辑。</w:t>
+          <w:rFonts w:ascii="Times New Roman" w:hAnsi="Times New Roman" w:eastAsia="Songti SC"/>
+        </w:rPr>
+        <w:t>数据集获取以标签为入口。系统保留目录中的全部镜像，并在存在可用延迟信号时辅助安排候选顺序；文件内容统一依据目录完整性元数据判定。每次镜像尝试写入进程级唯一临时文件，对带完整性元数据的条目检查文件状态、字节数和SHA-256，通过后移动至正式路径；各镜像尝试相互隔离，正式路径始终对应最近一次通过核验的数据集。全库同步、状态查询和历史数据整理复用相同目录与获取逻辑。</w:t>
       </w:r>
     </w:p>
     <w:p>
       <w:r>
         <w:rPr>
-          <w:rFonts w:ascii="Times New Roman" w:hAnsi="Times New Roman" w:eastAsia="宋体"/>
-        </w:rPr>
-        <w:t>这一设计将镜像选择与内容完整性判定分离：镜像和延迟信息用于组织候选顺序与回退，目录中的标准产品标识与完整性字段用于内容核验。多镜像实验选取已配置多个镜像和完整性元数据的代表性产品，综合评价候选遍历、内容核验和事务式落盘机制；相关接口、状态恢复流程和目录条目示例见补充材料。</w:t>
+          <w:rFonts w:ascii="Times New Roman" w:hAnsi="Times New Roman" w:eastAsia="Songti SC"/>
+        </w:rPr>
+        <w:t>这一设计将镜像选择与内容完整性判定分离：镜像和延迟信息用于组织候选顺序与回退，目录中的标准化数据标识与完整性字段用于内容核验。多镜像实验选取已配置多个镜像和完整性元数据的代表性数据集，综合评价候选遍历、内容核验和事务式落盘机制；相关接口、状态恢复流程和目录条目示例见补充材料。</w:t>
       </w:r>
     </w:p>
     <w:p>
@@ -2846,7 +2786,7 @@
       </w:pPr>
       <w:r>
         <w:rPr>
-          <w:rFonts w:ascii="Times New Roman" w:hAnsi="Times New Roman" w:eastAsia="宋体"/>
+          <w:rFonts w:ascii="Times New Roman" w:hAnsi="Times New Roman" w:eastAsia="Songti SC"/>
         </w:rPr>
         <w:t>2.4 统一读取与模式输入组织</w:t>
       </w:r>
@@ -2857,7 +2797,7 @@
       </w:pPr>
       <w:r>
         <w:rPr>
-          <w:rFonts w:ascii="Times New Roman" w:hAnsi="Times New Roman" w:eastAsia="宋体"/>
+          <w:rFonts w:ascii="Times New Roman" w:hAnsi="Times New Roman" w:eastAsia="Songti SC"/>
         </w:rPr>
         <w:t>2.4.1 标准网格数据读取</w:t>
       </w:r>
@@ -2865,31 +2805,31 @@
     <w:p>
       <w:r>
         <w:rPr>
-          <w:rFonts w:ascii="Times New Roman" w:hAnsi="Times New Roman" w:eastAsia="宋体"/>
+          <w:rFonts w:ascii="Times New Roman" w:hAnsi="Times New Roman" w:eastAsia="Songti SC"/>
         </w:rPr>
         <w:t>标准网格数据读取接口支持以本地NetCDF路径或数据标签访问数据，并提供整场数组、指定周期切片、站点全部周期和站点指定周期4种读取方式。标签对应的NetCDF可由目录模块自动获取；默认返回标准变量</w:t>
       </w:r>
       <w:r>
         <w:rPr>
-          <w:rFonts w:ascii="Consolas" w:hAnsi="Consolas" w:eastAsia="等线"/>
+          <w:rFonts w:ascii="Consolas" w:hAnsi="Consolas" w:eastAsia="Songti SC"/>
         </w:rPr>
         <w:t>data</w:t>
       </w:r>
       <w:r>
         <w:rPr>
-          <w:rFonts w:ascii="Times New Roman" w:hAnsi="Times New Roman" w:eastAsia="宋体"/>
+          <w:rFonts w:ascii="Times New Roman" w:hAnsi="Times New Roman" w:eastAsia="Songti SC"/>
         </w:rPr>
         <w:t>，也可读取原始数值或同形不确定性变量</w:t>
       </w:r>
       <w:r>
         <w:rPr>
-          <w:rFonts w:ascii="Consolas" w:hAnsi="Consolas" w:eastAsia="等线"/>
+          <w:rFonts w:ascii="Consolas" w:hAnsi="Consolas" w:eastAsia="Songti SC"/>
         </w:rPr>
         <w:t>std</w:t>
       </w:r>
       <w:r>
         <w:rPr>
-          <w:rFonts w:ascii="Times New Roman" w:hAnsi="Times New Roman" w:eastAsia="宋体"/>
+          <w:rFonts w:ascii="Times New Roman" w:hAnsi="Times New Roman" w:eastAsia="Songti SC"/>
         </w:rPr>
         <w:t>。模式输入组织层直接继承数据生产与标准化层统一的单位、缺失值和物理范围，使处理规则集中于共享生产契约，并兼容既有读取方式。</w:t>
       </w:r>
@@ -2897,19 +2837,19 @@
     <w:p>
       <w:r>
         <w:rPr>
-          <w:rFonts w:ascii="Times New Roman" w:hAnsi="Times New Roman" w:eastAsia="宋体"/>
+          <w:rFonts w:ascii="Times New Roman" w:hAnsi="Times New Roman" w:eastAsia="Songti SC"/>
         </w:rPr>
         <w:t>站点读取依据全球规则经纬网分辨率把经纬度映射为数组索引，并以标准文件的</w:t>
       </w:r>
       <w:r>
         <w:rPr>
-          <w:rFonts w:ascii="Consolas" w:hAnsi="Consolas" w:eastAsia="等线"/>
+          <w:rFonts w:ascii="Consolas" w:hAnsi="Consolas" w:eastAsia="Songti SC"/>
         </w:rPr>
         <w:t>(lon,lat[,ind])</w:t>
       </w:r>
       <w:r>
         <w:rPr>
-          <w:rFonts w:ascii="Times New Roman" w:hAnsi="Times New Roman" w:eastAsia="宋体"/>
+          <w:rFonts w:ascii="Times New Roman" w:hAnsi="Times New Roman" w:eastAsia="Songti SC"/>
         </w:rPr>
         <w:t>顺序及西向东、南向北排列为输入契约。接口面向全球规则网格的原位索引，区域投影、非规则网格和空间插值可在数据生产与标准化层完成转换；周期索引的月份、日期或小时含义由对应数据元数据解释。</w:t>
       </w:r>
@@ -2920,127 +2860,127 @@
       </w:pPr>
       <w:r>
         <w:rPr>
-          <w:rFonts w:ascii="Times New Roman" w:hAnsi="Times New Roman" w:eastAsia="宋体"/>
-        </w:rPr>
-        <w:t>2.4.2 模型参数与气象驱动组织</w:t>
+          <w:rFonts w:ascii="Times New Roman" w:hAnsi="Times New Roman" w:eastAsia="Songti SC"/>
+        </w:rPr>
+        <w:t>2.4.2 模式参数与气象驱动组织</w:t>
       </w:r>
     </w:p>
     <w:p>
       <w:r>
         <w:rPr>
-          <w:rFonts w:ascii="Times New Roman" w:hAnsi="Times New Roman" w:eastAsia="宋体"/>
-        </w:rPr>
-        <w:t>格点尺度陆面参数组织接口从预定义产品集合中提取土壤、冠层、叶片、地形、陆地掩膜和植物功能型数据，依据陆面状态融合相应参数，并对叶面积指数、叶绿素、冠层聚集度和最大羧化速率等季节序列执行Gapfill与逐日重采样。第二套陆面参数集合</w:t>
-      </w:r>
-      <w:r>
-        <w:rPr>
-          <w:rFonts w:ascii="Consolas" w:hAnsi="Consolas" w:eastAsia="等线"/>
+          <w:rFonts w:ascii="Times New Roman" w:hAnsi="Times New Roman" w:eastAsia="Songti SC"/>
+        </w:rPr>
+        <w:t>格点尺度陆面参数组织接口从预定义数据集合中提取土壤、冠层、叶片、地形、陆地掩膜和植物功能型数据，依据陆面状态融合相应参数，并对叶面积指数、叶绿素、冠层聚集度和最大羧化速率等季节序列执行Gapfill与逐日重采样。第二套陆面参数集合</w:t>
+      </w:r>
+      <w:r>
+        <w:rPr>
+          <w:rFonts w:ascii="Consolas" w:hAnsi="Consolas" w:eastAsia="Songti SC"/>
         </w:rPr>
         <w:t>gm2</w:t>
       </w:r>
       <w:r>
         <w:rPr>
-          <w:rFonts w:ascii="Times New Roman" w:hAnsi="Times New Roman" w:eastAsia="宋体"/>
-        </w:rPr>
-        <w:t>由14类标准产品组成，其中冠层聚集度采用月尺度产品，其余字段按各自空间与时间分辨率进入统一格点。</w:t>
+          <w:rFonts w:ascii="Times New Roman" w:hAnsi="Times New Roman" w:eastAsia="Songti SC"/>
+        </w:rPr>
+        <w:t>由14类标准化数据组成，其中冠层聚集度采用月尺度数据集，其余字段按各自空间与时间分辨率进入统一格点。</w:t>
       </w:r>
     </w:p>
     <w:p>
       <w:r>
         <w:rPr>
-          <w:rFonts w:ascii="Times New Roman" w:hAnsi="Times New Roman" w:eastAsia="宋体"/>
+          <w:rFonts w:ascii="Times New Roman" w:hAnsi="Times New Roman" w:eastAsia="Songti SC"/>
         </w:rPr>
         <w:t>植物功能型比例进一步用于融合C3/C4植被的叶片光学参数和Medlyn气孔参数，并由</w:t>
       </w:r>
       <w:r>
         <w:rPr>
-          <w:rFonts w:ascii="Consolas" w:hAnsi="Consolas" w:eastAsia="等线"/>
+          <w:rFonts w:ascii="Consolas" w:hAnsi="Consolas" w:eastAsia="Songti SC"/>
         </w:rPr>
         <w:t>VCMAX25</w:t>
       </w:r>
       <w:r>
         <w:rPr>
-          <w:rFonts w:ascii="Times New Roman" w:hAnsi="Times New Roman" w:eastAsia="宋体"/>
+          <w:rFonts w:ascii="Times New Roman" w:hAnsi="Times New Roman" w:eastAsia="Songti SC"/>
         </w:rPr>
         <w:t>推导</w:t>
       </w:r>
       <w:r>
         <w:rPr>
-          <w:rFonts w:ascii="Consolas" w:hAnsi="Consolas" w:eastAsia="等线"/>
+          <w:rFonts w:ascii="Consolas" w:hAnsi="Consolas" w:eastAsia="Songti SC"/>
         </w:rPr>
         <w:t>JMAX25</w:t>
       </w:r>
       <w:r>
         <w:rPr>
-          <w:rFonts w:ascii="Times New Roman" w:hAnsi="Times New Roman" w:eastAsia="宋体"/>
+          <w:rFonts w:ascii="Times New Roman" w:hAnsi="Times New Roman" w:eastAsia="Songti SC"/>
         </w:rPr>
         <w:t>和</w:t>
       </w:r>
       <w:r>
         <w:rPr>
-          <w:rFonts w:ascii="Consolas" w:hAnsi="Consolas" w:eastAsia="等线"/>
+          <w:rFonts w:ascii="Consolas" w:hAnsi="Consolas" w:eastAsia="Songti SC"/>
         </w:rPr>
         <w:t>B6F</w:t>
       </w:r>
       <w:r>
         <w:rPr>
-          <w:rFonts w:ascii="Times New Roman" w:hAnsi="Times New Roman" w:eastAsia="宋体"/>
+          <w:rFonts w:ascii="Times New Roman" w:hAnsi="Times New Roman" w:eastAsia="Songti SC"/>
         </w:rPr>
         <w:t>。输出涵盖位置、分辨率、年份、CO₂、土壤水力性质、冠层结构、植物功能型组成、叶片生物物理和光合参数；字段完整性与</w:t>
       </w:r>
       <w:r>
         <w:rPr>
-          <w:rFonts w:ascii="Consolas" w:hAnsi="Consolas" w:eastAsia="等线"/>
+          <w:rFonts w:ascii="Consolas" w:hAnsi="Consolas" w:eastAsia="Songti SC"/>
         </w:rPr>
         <w:t>NaN</w:t>
       </w:r>
       <w:r>
         <w:rPr>
-          <w:rFonts w:ascii="Times New Roman" w:hAnsi="Times New Roman" w:eastAsia="宋体"/>
-        </w:rPr>
-        <w:t>状态同步进入质量控制。多个标准产品由此形成结构一致的格点级模式输入。</w:t>
+          <w:rFonts w:ascii="Times New Roman" w:hAnsi="Times New Roman" w:eastAsia="Songti SC"/>
+        </w:rPr>
+        <w:t>状态同步进入质量控制。多个标准化数据由此形成结构一致的格点级模式输入。</w:t>
       </w:r>
     </w:p>
     <w:p>
       <w:r>
         <w:rPr>
-          <w:rFonts w:ascii="Times New Roman" w:hAnsi="Times New Roman" w:eastAsia="宋体"/>
+          <w:rFonts w:ascii="Times New Roman" w:hAnsi="Times New Roman" w:eastAsia="Songti SC"/>
         </w:rPr>
         <w:t>格点尺度气象驱动接口按年份和格点读取气象驱动集合</w:t>
       </w:r>
       <w:r>
         <w:rPr>
-          <w:rFonts w:ascii="Consolas" w:hAnsi="Consolas" w:eastAsia="等线"/>
+          <w:rFonts w:ascii="Consolas" w:hAnsi="Consolas" w:eastAsia="Songti SC"/>
         </w:rPr>
         <w:t>wd1</w:t>
       </w:r>
       <w:r>
         <w:rPr>
-          <w:rFonts w:ascii="Times New Roman" w:hAnsi="Times New Roman" w:eastAsia="宋体"/>
-        </w:rPr>
-        <w:t>中的8类ERA5产品，分别提取地表气压、降水、漫射与直射短波辐射、长波辐射、气温、水汽压亏缺和风速，并依据格点经度换算时区偏移、构建浮点年积日</w:t>
-      </w:r>
-      <w:r>
-        <w:rPr>
-          <w:rFonts w:ascii="Consolas" w:hAnsi="Consolas" w:eastAsia="等线"/>
+          <w:rFonts w:ascii="Times New Roman" w:hAnsi="Times New Roman" w:eastAsia="Songti SC"/>
+        </w:rPr>
+        <w:t>中的8类第五代全球再分析数据（ERA5）[6]，分别提取地表气压、降水、漫射与直射短波辐射、长波辐射、气温、水汽压亏缺和风速，并依据格点经度换算时区偏移、构建浮点年积日</w:t>
+      </w:r>
+      <w:r>
+        <w:rPr>
+          <w:rFonts w:ascii="Consolas" w:hAnsi="Consolas" w:eastAsia="Songti SC"/>
         </w:rPr>
         <w:t>FDOY</w:t>
       </w:r>
       <w:r>
         <w:rPr>
-          <w:rFonts w:ascii="Times New Roman" w:hAnsi="Times New Roman" w:eastAsia="宋体"/>
+          <w:rFonts w:ascii="Times New Roman" w:hAnsi="Times New Roman" w:eastAsia="Songti SC"/>
         </w:rPr>
         <w:t>。接口既可直接按经纬度读取，也可从已经加载的全局气象数组提取格点序列，输出字段完整性与</w:t>
       </w:r>
       <w:r>
         <w:rPr>
-          <w:rFonts w:ascii="Consolas" w:hAnsi="Consolas" w:eastAsia="等线"/>
+          <w:rFonts w:ascii="Consolas" w:hAnsi="Consolas" w:eastAsia="Songti SC"/>
         </w:rPr>
         <w:t>NaN</w:t>
       </w:r>
       <w:r>
         <w:rPr>
-          <w:rFonts w:ascii="Times New Roman" w:hAnsi="Times New Roman" w:eastAsia="宋体"/>
+          <w:rFonts w:ascii="Times New Roman" w:hAnsi="Times New Roman" w:eastAsia="Songti SC"/>
         </w:rPr>
         <w:t>状态同步进入质量控制。</w:t>
       </w:r>
@@ -3048,9 +2988,36 @@
     <w:p>
       <w:r>
         <w:rPr>
-          <w:rFonts w:ascii="Times New Roman" w:hAnsi="Times New Roman" w:eastAsia="宋体"/>
-        </w:rPr>
-        <w:t>标签驱动的数据访问、陆面参数融合与气象驱动组织共同构成模式输入组织层。本文将“模型就绪”具体界定为：标准产品经过格点索引、字段组织、时间轴构建和量纲衔接后，形成满足Emerald初始化接口的数据结构。与2022版通过标签组织数据访问的思路一致[4]，新版进一步把目录配置与更新、完整性获取、标准网格读取和模式输入组织连接为连续公共数据流。用户以数据标签发现产品，经镜像获取，并在目录提供完整性元数据时执行内容核验，再读取整场、周期或格点数据，并形成陆面参数或气象驱动；具体公共接口、调用参数和完整Julia示例列入补充材料与版本化用户指南。</w:t>
+          <w:rFonts w:ascii="Times New Roman" w:hAnsi="Times New Roman" w:eastAsia="Songti SC"/>
+        </w:rPr>
+        <w:t>标签驱动的数据访问、陆面参数融合与气象驱动组织共同构成模式输入组织层。本文将“模式就绪”界定为：标准化数据经过格点索引、字段组织、时间轴构建和量纲衔接后，形成满足Emerald初始化接口的数据结构。与2022版通过标签组织数据访问的思路一致[4]，新版进一步把目录配置与更新、完整性获取、标准网格读取和模式输入组织连接为连续公共数据流。用户以数据标签发现数据集，经镜像获取，并在目录提供完整性元数据时执行内容核验，再读取整场、周期或格点数据，并形成陆面参数或气象驱动；具体公共接口、调用参数和完整Julia示例列入补充材料与版本化用户指南。</w:t>
+      </w:r>
+    </w:p>
+    <w:p>
+      <w:pPr>
+        <w:pStyle w:val="Heading2"/>
+      </w:pPr>
+      <w:r>
+        <w:rPr>
+          <w:rFonts w:ascii="Times New Roman" w:hAnsi="Times New Roman" w:eastAsia="Songti SC"/>
+        </w:rPr>
+        <w:t>2.5 多语言数据下载接口</w:t>
+      </w:r>
+    </w:p>
+    <w:p>
+      <w:r>
+        <w:rPr>
+          <w:rFonts w:ascii="Times New Roman" w:hAnsi="Times New Roman" w:eastAsia="Songti SC"/>
+        </w:rPr>
+        <w:t>为衔接不同科研编程环境，新版提供MATLAB、Octave、Python和R的数据下载入口，并增加C和Fortran入口。非Julia入口调用同一Python下载脚本，使用时需要Python 3运行环境。MATLAB/Octave函数、R函数及C和Fortran程序接收文件URL和本地输出路径，调用脚本完成直接NetCDF下载；Python脚本还支持依据本地Artifacts.yaml中的标签查找下载地址，并在目录或调用参数提供相应信息时检查文件大小和SHA-256。</w:t>
+      </w:r>
+    </w:p>
+    <w:p>
+      <w:r>
+        <w:rPr>
+          <w:rFonts w:ascii="Times New Roman" w:hAnsi="Times New Roman" w:eastAsia="Songti SC"/>
+        </w:rPr>
+        <w:t>该设计将各语言的调用方式与下载逻辑分开维护，使科研人员可以在已有程序中自动获取文件，再使用相应语言的NetCDF工具读取数据。第3—4节的事务式目录管理、镜像获取和模式输入实验采用Julia主流程；非Julia接口的源码和调用说明随代码仓库的clients目录提供。</w:t>
       </w:r>
     </w:p>
     <w:p>
@@ -3059,7 +3026,7 @@
       </w:pPr>
       <w:r>
         <w:rPr>
-          <w:rFonts w:ascii="Times New Roman" w:hAnsi="Times New Roman" w:eastAsia="宋体"/>
+          <w:rFonts w:ascii="Times New Roman" w:hAnsi="Times New Roman" w:eastAsia="Songti SC"/>
         </w:rPr>
         <w:t>3 应用案例与评价方法</w:t>
       </w:r>
@@ -3067,9 +3034,9 @@
     <w:p>
       <w:r>
         <w:rPr>
-          <w:rFonts w:ascii="Times New Roman" w:hAnsi="Times New Roman" w:eastAsia="宋体"/>
-        </w:rPr>
-        <w:t>表3按照受控实验、真实数据和真实网络应用组织全文证据，并列出各项核心贡献对应的主要评价指标。跨操作系统持续集成作为横向维度，贯穿生产、分发和模型接口的确定性核心路径。</w:t>
+          <w:rFonts w:ascii="Times New Roman" w:hAnsi="Times New Roman" w:eastAsia="Songti SC"/>
+        </w:rPr>
+        <w:t>本节从数据标准化、文件获取和模式输入三个方面评价框架。案例包括最优插值海表温度数据（Optimum Interpolation Sea Surface Temperature，OISST）、高程数据（ELEV）、叶面积指数数据（Leaf Area Index，LAI），以及US-NR1站点附近格点的陆面参数和气象驱动。表3列出各项方法对应的受控实验、真实数据与网络案例及评价指标；跨操作系统测试用于检查相同依赖和判据下的运行一致性。</w:t>
       </w:r>
     </w:p>
     <w:p>
@@ -3078,7 +3045,7 @@
       </w:pPr>
       <w:r>
         <w:rPr>
-          <w:rFonts w:ascii="Times New Roman" w:hAnsi="Times New Roman" w:eastAsia="宋体"/>
+          <w:rFonts w:ascii="Times New Roman" w:hAnsi="Times New Roman" w:eastAsia="Songti SC"/>
           <w:b/>
         </w:rPr>
         <w:t>表3 GriddingMachine框架核心贡献、证据层级与主要评价指标</w:t>
@@ -3111,7 +3078,7 @@
             </w:r>
             <w:r>
               <w:rPr>
-                <w:rFonts w:ascii="Times New Roman" w:hAnsi="Times New Roman" w:eastAsia="宋体"/>
+                <w:rFonts w:ascii="Times New Roman" w:hAnsi="Times New Roman" w:eastAsia="Songti SC"/>
                 <w:b/>
                 <w:sz w:val="18"/>
               </w:rPr>
@@ -3133,7 +3100,7 @@
             </w:r>
             <w:r>
               <w:rPr>
-                <w:rFonts w:ascii="Times New Roman" w:hAnsi="Times New Roman" w:eastAsia="宋体"/>
+                <w:rFonts w:ascii="Times New Roman" w:hAnsi="Times New Roman" w:eastAsia="Songti SC"/>
                 <w:b/>
                 <w:sz w:val="18"/>
               </w:rPr>
@@ -3155,7 +3122,7 @@
             </w:r>
             <w:r>
               <w:rPr>
-                <w:rFonts w:ascii="Times New Roman" w:hAnsi="Times New Roman" w:eastAsia="宋体"/>
+                <w:rFonts w:ascii="Times New Roman" w:hAnsi="Times New Roman" w:eastAsia="Songti SC"/>
                 <w:b/>
                 <w:sz w:val="18"/>
               </w:rPr>
@@ -3177,7 +3144,7 @@
             </w:r>
             <w:r>
               <w:rPr>
-                <w:rFonts w:ascii="Times New Roman" w:hAnsi="Times New Roman" w:eastAsia="宋体"/>
+                <w:rFonts w:ascii="Times New Roman" w:hAnsi="Times New Roman" w:eastAsia="Songti SC"/>
                 <w:b/>
                 <w:sz w:val="18"/>
               </w:rPr>
@@ -3199,7 +3166,7 @@
             </w:r>
             <w:r>
               <w:rPr>
-                <w:rFonts w:ascii="Times New Roman" w:hAnsi="Times New Roman" w:eastAsia="宋体"/>
+                <w:rFonts w:ascii="Times New Roman" w:hAnsi="Times New Roman" w:eastAsia="Songti SC"/>
                 <w:sz w:val="18"/>
               </w:rPr>
               <w:t>数据生产与标准化层将异构源数据转换为标准NetCDF</w:t>
@@ -3218,7 +3185,7 @@
             </w:r>
             <w:r>
               <w:rPr>
-                <w:rFonts w:ascii="Times New Roman" w:hAnsi="Times New Roman" w:eastAsia="宋体"/>
+                <w:rFonts w:ascii="Times New Roman" w:hAnsi="Times New Roman" w:eastAsia="Songti SC"/>
                 <w:sz w:val="18"/>
               </w:rPr>
               <w:t>31组受控实例、ELEV重复生产与逐点核对</w:t>
@@ -3237,7 +3204,7 @@
             </w:r>
             <w:r>
               <w:rPr>
-                <w:rFonts w:ascii="Times New Roman" w:hAnsi="Times New Roman" w:eastAsia="宋体"/>
+                <w:rFonts w:ascii="Times New Roman" w:hAnsi="Times New Roman" w:eastAsia="Songti SC"/>
                 <w:sz w:val="18"/>
               </w:rPr>
               <w:t>OISST V2.1真实异构源数据</w:t>
@@ -3256,7 +3223,7 @@
             </w:r>
             <w:r>
               <w:rPr>
-                <w:rFonts w:ascii="Times New Roman" w:hAnsi="Times New Roman" w:eastAsia="宋体"/>
+                <w:rFonts w:ascii="Times New Roman" w:hAnsi="Times New Roman" w:eastAsia="Songti SC"/>
                 <w:sz w:val="18"/>
               </w:rPr>
               <w:t>维度与坐标、有效值掩膜、逐点物理值、重复生成摘要</w:t>
@@ -3277,7 +3244,7 @@
             </w:r>
             <w:r>
               <w:rPr>
-                <w:rFonts w:ascii="Times New Roman" w:hAnsi="Times New Roman" w:eastAsia="宋体"/>
+                <w:rFonts w:ascii="Times New Roman" w:hAnsi="Times New Roman" w:eastAsia="Songti SC"/>
                 <w:sz w:val="18"/>
               </w:rPr>
               <w:t>数据目录与可信分发层组织高效且内容可核验的数据获取</w:t>
@@ -3296,7 +3263,7 @@
             </w:r>
             <w:r>
               <w:rPr>
-                <w:rFonts w:ascii="Times New Roman" w:hAnsi="Times New Roman" w:eastAsia="宋体"/>
+                <w:rFonts w:ascii="Times New Roman" w:hAnsi="Times New Roman" w:eastAsia="Songti SC"/>
                 <w:sz w:val="18"/>
               </w:rPr>
               <w:t>ELEV/LAI回环HTTP对照；13类受控状态场景</w:t>
@@ -3315,7 +3282,7 @@
             </w:r>
             <w:r>
               <w:rPr>
-                <w:rFonts w:ascii="Times New Roman" w:hAnsi="Times New Roman" w:eastAsia="宋体"/>
+                <w:rFonts w:ascii="Times New Roman" w:hAnsi="Times New Roman" w:eastAsia="Songti SC"/>
                 <w:sz w:val="18"/>
               </w:rPr>
               <w:t>Zenodo公共网络记录；校园网FTP—Zenodo同文件获取</w:t>
@@ -3334,21 +3301,21 @@
             </w:r>
             <w:r>
               <w:rPr>
-                <w:rFonts w:ascii="Times New Roman" w:hAnsi="Times New Roman" w:eastAsia="宋体"/>
+                <w:rFonts w:ascii="Times New Roman" w:hAnsi="Times New Roman" w:eastAsia="Songti SC"/>
                 <w:sz w:val="18"/>
               </w:rPr>
               <w:t>端到端时间、传输字节、候选遍历、</w:t>
             </w:r>
             <w:r>
               <w:rPr>
-                <w:rFonts w:ascii="Consolas" w:hAnsi="Consolas" w:eastAsia="等线"/>
+                <w:rFonts w:ascii="Consolas" w:hAnsi="Consolas" w:eastAsia="Songti SC"/>
                 <w:sz w:val="18"/>
               </w:rPr>
               <w:t>SIZE</w:t>
             </w:r>
             <w:r>
               <w:rPr>
-                <w:rFonts w:ascii="Times New Roman" w:hAnsi="Times New Roman" w:eastAsia="宋体"/>
+                <w:rFonts w:ascii="Times New Roman" w:hAnsi="Times New Roman" w:eastAsia="Songti SC"/>
                 <w:sz w:val="18"/>
               </w:rPr>
               <w:t>/SHA-256、临时与正式文件状态</w:t>
@@ -3369,10 +3336,10 @@
             </w:r>
             <w:r>
               <w:rPr>
-                <w:rFonts w:ascii="Times New Roman" w:hAnsi="Times New Roman" w:eastAsia="宋体"/>
+                <w:rFonts w:ascii="Times New Roman" w:hAnsi="Times New Roman" w:eastAsia="Songti SC"/>
                 <w:sz w:val="18"/>
               </w:rPr>
-              <w:t>模式输入组织层将标准产品组织为模型就绪输入</w:t>
+              <w:t>模式输入组织层将标准化数据组织为模式就绪输入</w:t>
             </w:r>
           </w:p>
         </w:tc>
@@ -3388,7 +3355,7 @@
             </w:r>
             <w:r>
               <w:rPr>
-                <w:rFonts w:ascii="Times New Roman" w:hAnsi="Times New Roman" w:eastAsia="宋体"/>
+                <w:rFonts w:ascii="Times New Roman" w:hAnsi="Times New Roman" w:eastAsia="Songti SC"/>
                 <w:sz w:val="18"/>
               </w:rPr>
               <w:t>确定性读取、字段、时间轴与接口核对</w:t>
@@ -3407,10 +3374,10 @@
             </w:r>
             <w:r>
               <w:rPr>
-                <w:rFonts w:ascii="Times New Roman" w:hAnsi="Times New Roman" w:eastAsia="宋体"/>
+                <w:rFonts w:ascii="Times New Roman" w:hAnsi="Times New Roman" w:eastAsia="Songti SC"/>
                 <w:sz w:val="18"/>
               </w:rPr>
-              <w:t>US-NR1的14类陆面产品、8类ERA5及Emerald初始化和60 s首步</w:t>
+              <w:t>US-NR1的14类陆面数据集、8类ERA5及Emerald初始化和60 s首步</w:t>
             </w:r>
           </w:p>
         </w:tc>
@@ -3426,7 +3393,7 @@
             </w:r>
             <w:r>
               <w:rPr>
-                <w:rFonts w:ascii="Times New Roman" w:hAnsi="Times New Roman" w:eastAsia="宋体"/>
+                <w:rFonts w:ascii="Times New Roman" w:hAnsi="Times New Roman" w:eastAsia="Songti SC"/>
                 <w:sz w:val="18"/>
               </w:rPr>
               <w:t>字段与形状、时间轴、量纲、逐点数值、初始化与首步状态</w:t>
@@ -3447,7 +3414,7 @@
             </w:r>
             <w:r>
               <w:rPr>
-                <w:rFonts w:ascii="Times New Roman" w:hAnsi="Times New Roman" w:eastAsia="宋体"/>
+                <w:rFonts w:ascii="Times New Roman" w:hAnsi="Times New Roman" w:eastAsia="Songti SC"/>
                 <w:sz w:val="18"/>
               </w:rPr>
               <w:t>核心实现具有跨操作系统运行一致性</w:t>
@@ -3466,7 +3433,7 @@
             </w:r>
             <w:r>
               <w:rPr>
-                <w:rFonts w:ascii="Times New Roman" w:hAnsi="Times New Roman" w:eastAsia="宋体"/>
+                <w:rFonts w:ascii="Times New Roman" w:hAnsi="Times New Roman" w:eastAsia="Songti SC"/>
                 <w:sz w:val="18"/>
               </w:rPr>
               <w:t>Windows、macOS、Linux持续集成</w:t>
@@ -3485,7 +3452,7 @@
             </w:r>
             <w:r>
               <w:rPr>
-                <w:rFonts w:ascii="Times New Roman" w:hAnsi="Times New Roman" w:eastAsia="宋体"/>
+                <w:rFonts w:ascii="Times New Roman" w:hAnsi="Times New Roman" w:eastAsia="Songti SC"/>
                 <w:sz w:val="18"/>
               </w:rPr>
               <w:t>Windows/macOS独立性能观测及按实际环境记录的真实网络案例</w:t>
@@ -3504,10 +3471,10 @@
             </w:r>
             <w:r>
               <w:rPr>
-                <w:rFonts w:ascii="Times New Roman" w:hAnsi="Times New Roman" w:eastAsia="宋体"/>
+                <w:rFonts w:ascii="Times New Roman" w:hAnsi="Times New Roman" w:eastAsia="Songti SC"/>
                 <w:sz w:val="18"/>
               </w:rPr>
-              <w:t>产品结构、逐点数值、文件摘要、缓存状态和接口状态</w:t>
+              <w:t>数据集结构、逐点数值、文件摘要、缓存状态和接口状态</w:t>
             </w:r>
           </w:p>
         </w:tc>
@@ -3519,14 +3486,14 @@
       </w:pPr>
       <w:r>
         <w:rPr>
-          <w:rFonts w:ascii="Times New Roman" w:hAnsi="Times New Roman" w:eastAsia="宋体"/>
+          <w:rFonts w:ascii="Times New Roman" w:hAnsi="Times New Roman" w:eastAsia="Songti SC"/>
           <w:b/>
         </w:rPr>
         <w:t>Table 3 Core contributions, evidence levels, and evaluation metrics for the GriddingMachine framework.</w:t>
       </w:r>
       <w:r>
         <w:rPr>
-          <w:rFonts w:ascii="Times New Roman" w:hAnsi="Times New Roman" w:eastAsia="宋体"/>
+          <w:rFonts w:ascii="Times New Roman" w:hAnsi="Times New Roman" w:eastAsia="Songti SC"/>
         </w:rPr>
         <w:t xml:space="preserve"> Controlled experiments and real-data or real-network applications are listed separately, and the final column summarizes the principal metrics used for each contribution.</w:t>
       </w:r>
@@ -3537,7 +3504,7 @@
       </w:pPr>
       <w:r>
         <w:rPr>
-          <w:rFonts w:ascii="Times New Roman" w:hAnsi="Times New Roman" w:eastAsia="宋体"/>
+          <w:rFonts w:ascii="Times New Roman" w:hAnsi="Times New Roman" w:eastAsia="Songti SC"/>
         </w:rPr>
         <w:t>3.1 数据生产与标准化及OISST案例</w:t>
       </w:r>
@@ -3548,7 +3515,7 @@
       </w:pPr>
       <w:r>
         <w:rPr>
-          <w:rFonts w:ascii="Times New Roman" w:hAnsi="Times New Roman" w:eastAsia="宋体"/>
+          <w:rFonts w:ascii="Times New Roman" w:hAnsi="Times New Roman" w:eastAsia="Songti SC"/>
         </w:rPr>
         <w:t>3.1.1 共享生产契约与质量控制</w:t>
       </w:r>
@@ -3556,7 +3523,7 @@
     <w:p>
       <w:r>
         <w:rPr>
-          <w:rFonts w:ascii="Times New Roman" w:hAnsi="Times New Roman" w:eastAsia="宋体"/>
+          <w:rFonts w:ascii="Times New Roman" w:hAnsi="Times New Roman" w:eastAsia="Songti SC"/>
         </w:rPr>
         <w:t>为展示YAML驱动流程对多维地学数据的标准化能力，本文设计具有明确空间语义的位置编码数组：二维数组由经纬度索引共同编码，三维数组进一步加入周期索引。该设计能够清晰呈现维度交换、方向翻转、经度平移和周期组织前后的对应关系，并为标准NetCDF生产提供逐点参照。</w:t>
       </w:r>
@@ -3564,103 +3531,103 @@
     <w:p>
       <w:r>
         <w:rPr>
-          <w:rFonts w:ascii="Times New Roman" w:hAnsi="Times New Roman" w:eastAsia="宋体"/>
+          <w:rFonts w:ascii="Times New Roman" w:hAnsi="Times New Roman" w:eastAsia="Songti SC"/>
         </w:rPr>
         <w:t>代表性处理实例包括</w:t>
       </w:r>
       <w:r>
         <w:rPr>
-          <w:rFonts w:ascii="Consolas" w:hAnsi="Consolas" w:eastAsia="等线"/>
+          <w:rFonts w:ascii="Consolas" w:hAnsi="Consolas" w:eastAsia="Songti SC"/>
         </w:rPr>
         <w:t>(lon,lat)</w:t>
       </w:r>
       <w:r>
         <w:rPr>
-          <w:rFonts w:ascii="Times New Roman" w:hAnsi="Times New Roman" w:eastAsia="宋体"/>
+          <w:rFonts w:ascii="Times New Roman" w:hAnsi="Times New Roman" w:eastAsia="Songti SC"/>
         </w:rPr>
         <w:t>与</w:t>
       </w:r>
       <w:r>
         <w:rPr>
-          <w:rFonts w:ascii="Consolas" w:hAnsi="Consolas" w:eastAsia="等线"/>
+          <w:rFonts w:ascii="Consolas" w:hAnsi="Consolas" w:eastAsia="Songti SC"/>
         </w:rPr>
         <w:t>(lon,lat,ind)</w:t>
       </w:r>
       <w:r>
         <w:rPr>
-          <w:rFonts w:ascii="Times New Roman" w:hAnsi="Times New Roman" w:eastAsia="宋体"/>
+          <w:rFonts w:ascii="Times New Roman" w:hAnsi="Times New Roman" w:eastAsia="Songti SC"/>
         </w:rPr>
         <w:t>标准输入、</w:t>
       </w:r>
       <w:r>
         <w:rPr>
-          <w:rFonts w:ascii="Consolas" w:hAnsi="Consolas" w:eastAsia="等线"/>
+          <w:rFonts w:ascii="Consolas" w:hAnsi="Consolas" w:eastAsia="Songti SC"/>
         </w:rPr>
         <w:t>(lat,lon)</w:t>
       </w:r>
       <w:r>
         <w:rPr>
-          <w:rFonts w:ascii="Times New Roman" w:hAnsi="Times New Roman" w:eastAsia="宋体"/>
+          <w:rFonts w:ascii="Times New Roman" w:hAnsi="Times New Roman" w:eastAsia="Songti SC"/>
         </w:rPr>
         <w:t>与</w:t>
       </w:r>
       <w:r>
         <w:rPr>
-          <w:rFonts w:ascii="Consolas" w:hAnsi="Consolas" w:eastAsia="等线"/>
+          <w:rFonts w:ascii="Consolas" w:hAnsi="Consolas" w:eastAsia="Songti SC"/>
         </w:rPr>
         <w:t>(ind,lat,lon)</w:t>
       </w:r>
       <w:r>
         <w:rPr>
-          <w:rFonts w:ascii="Times New Roman" w:hAnsi="Times New Roman" w:eastAsia="宋体"/>
+          <w:rFonts w:ascii="Times New Roman" w:hAnsi="Times New Roman" w:eastAsia="Songti SC"/>
         </w:rPr>
         <w:t>源排列、纬度和经度翻转、</w:t>
       </w:r>
       <w:r>
         <w:rPr>
-          <w:rFonts w:ascii="Consolas" w:hAnsi="Consolas" w:eastAsia="等线"/>
+          <w:rFonts w:ascii="Consolas" w:hAnsi="Consolas" w:eastAsia="Songti SC"/>
         </w:rPr>
         <w:t>0～360°</w:t>
       </w:r>
       <w:r>
         <w:rPr>
-          <w:rFonts w:ascii="Times New Roman" w:hAnsi="Times New Roman" w:eastAsia="宋体"/>
+          <w:rFonts w:ascii="Times New Roman" w:hAnsi="Times New Roman" w:eastAsia="Songti SC"/>
         </w:rPr>
         <w:t>经度平移、线性缩放、范围过滤、Gapfill、</w:t>
       </w:r>
       <w:r>
         <w:rPr>
-          <w:rFonts w:ascii="Consolas" w:hAnsi="Consolas" w:eastAsia="等线"/>
+          <w:rFonts w:ascii="Consolas" w:hAnsi="Consolas" w:eastAsia="Songti SC"/>
         </w:rPr>
         <w:t>data/std</w:t>
       </w:r>
       <w:r>
         <w:rPr>
-          <w:rFonts w:ascii="Times New Roman" w:hAnsi="Times New Roman" w:eastAsia="宋体"/>
-        </w:rPr>
-        <w:t>保存和标签生成。配置字段、变量数量、已有产品和标签状态共同覆盖标准产品从源数据到目录登记的主要环节。</w:t>
+          <w:rFonts w:ascii="Times New Roman" w:hAnsi="Times New Roman" w:eastAsia="Songti SC"/>
+        </w:rPr>
+        <w:t>保存和标签生成。配置字段、变量数量、已有数据集和标签状态共同覆盖标准化数据从源数据到目录登记的主要环节。</w:t>
       </w:r>
     </w:p>
     <w:p>
       <w:r>
         <w:rPr>
-          <w:rFonts w:ascii="Times New Roman" w:hAnsi="Times New Roman" w:eastAsia="宋体"/>
-        </w:rPr>
-        <w:t>共享生产契约的受控评价从维度、坐标、数值、Gapfill、YAML配置、输出和空间方向7个方面组织31组代表性处理实例。各组对应生产流程中的一个关键操作，并以结构、逐点数值或产品状态表征标准化结果；完整分类矩阵见补充材料S4。</w:t>
+          <w:rFonts w:ascii="Times New Roman" w:hAnsi="Times New Roman" w:eastAsia="Songti SC"/>
+        </w:rPr>
+        <w:t>共享生产契约的受控评价从维度、坐标、数值、Gapfill、YAML配置、输出和空间方向7个方面组织31组代表性处理实例。各组对应生产流程中的一个关键操作，并以结构、逐点数值或数据集状态表征标准化结果；完整分类矩阵见补充材料S4。</w:t>
       </w:r>
     </w:p>
     <w:p>
       <w:r>
         <w:rPr>
-          <w:rFonts w:ascii="Times New Roman" w:hAnsi="Times New Roman" w:eastAsia="宋体"/>
-        </w:rPr>
-        <w:t>产品质量控制覆盖变量、维度、形状、属性、坐标方向、数值范围和Gapfill结果。输出数组与位置编码参照逐点对应，Float32转换采用统一的绝对和相对容差；配置与产品状态通过明确的流程信息反馈给维护者。质量报告同步保存最大绝对误差、最大相对误差、处理历史和重复生产一致性。</w:t>
+          <w:rFonts w:ascii="Times New Roman" w:hAnsi="Times New Roman" w:eastAsia="Songti SC"/>
+        </w:rPr>
+        <w:t>数据集质量控制覆盖变量、维度、形状、属性、坐标方向、数值范围和Gapfill结果。输出数组与位置编码参照逐点对应，Float32转换采用统一的绝对和相对容差；配置与数据集状态通过明确的流程信息反馈给维护者。质量报告同步保存最大绝对误差、最大相对误差、处理历史和重复生产一致性。</w:t>
       </w:r>
     </w:p>
     <w:p>
       <w:r>
         <w:rPr>
-          <w:rFonts w:ascii="Times New Roman" w:hAnsi="Times New Roman" w:eastAsia="宋体"/>
+          <w:rFonts w:ascii="Times New Roman" w:hAnsi="Times New Roman" w:eastAsia="Songti SC"/>
         </w:rPr>
         <w:t>29组非交互处理实例在Windows、macOS和Linux持续集成环境中采用相同判据运行；V01和V02空间方向图分别设置正向和南北反转预期。自动结构与数值检查和人工空间审核共同评价生产契约在数组变换、配置解析和空间方向控制方面的跨系统一致性。</w:t>
       </w:r>
@@ -3668,9 +3635,9 @@
     <w:p>
       <w:r>
         <w:rPr>
-          <w:rFonts w:ascii="Times New Roman" w:hAnsi="Times New Roman" w:eastAsia="宋体"/>
-        </w:rPr>
-        <w:t>配置构建器面向二维数据、含不确定性变量的三维数据和经纬度变换数据生成符合共享配置规范的YAML，并将其直接交给标准产品生产引擎。数据贡献案例进一步贯通配置生成、标准化、自动与人工质量检查、产品发布、目录登记以及下游更新、下载和读取，形成覆盖主要环节的数据贡献入口。</w:t>
+          <w:rFonts w:ascii="Times New Roman" w:hAnsi="Times New Roman" w:eastAsia="Songti SC"/>
+        </w:rPr>
+        <w:t>配置构建器面向二维数据、含不确定性变量的三维数据和经纬度变换数据生成符合共享配置规范的YAML，并将其直接交给标准化数据生产引擎。数据贡献案例进一步贯通配置生成、标准化、自动与人工质量检查、数据集发布、目录登记以及下游更新、下载和读取，形成覆盖主要环节的数据贡献入口。</w:t>
       </w:r>
     </w:p>
     <w:p>
@@ -3679,75 +3646,75 @@
       </w:pPr>
       <w:r>
         <w:rPr>
-          <w:rFonts w:ascii="Times New Roman" w:hAnsi="Times New Roman" w:eastAsia="宋体"/>
-        </w:rPr>
-        <w:t>3.1.2 OISST异构产品标准化</w:t>
+          <w:rFonts w:ascii="Times New Roman" w:hAnsi="Times New Roman" w:eastAsia="Songti SC"/>
+        </w:rPr>
+        <w:t>3.1.2 OISST异构数据集标准化</w:t>
       </w:r>
     </w:p>
     <w:p>
       <w:r>
         <w:rPr>
-          <w:rFonts w:ascii="Times New Roman" w:hAnsi="Times New Roman" w:eastAsia="宋体"/>
-        </w:rPr>
-        <w:t>OISST（最优插值海表温度）实际数据用于进一步呈现共享生产契约对异构源结构的适配能力。案例采用NOAA/NCEI 0.25°逐日最优插值海表温度OISST V2.1中仅使用AVHRR数据的正式产品[9]，选取2022年2月25日文件。原始</w:t>
-      </w:r>
-      <w:r>
-        <w:rPr>
-          <w:rFonts w:ascii="Consolas" w:hAnsi="Consolas" w:eastAsia="等线"/>
+          <w:rFonts w:ascii="Times New Roman" w:hAnsi="Times New Roman" w:eastAsia="Songti SC"/>
+        </w:rPr>
+        <w:t>OISST案例用于检验共享配置对真实异构源数据的适配。采用美国国家海洋和大气管理局国家环境信息中心（NOAA/NCEI）发布的0.25°逐日OISST V2.1数据，选用仅使用甚高分辨率辐射计（AVHRR）数据的版本[7]，选取2022年2月25日文件。原始</w:t>
+      </w:r>
+      <w:r>
+        <w:rPr>
+          <w:rFonts w:ascii="Consolas" w:hAnsi="Consolas" w:eastAsia="Songti SC"/>
         </w:rPr>
         <w:t>sst</w:t>
       </w:r>
       <w:r>
         <w:rPr>
-          <w:rFonts w:ascii="Times New Roman" w:hAnsi="Times New Roman" w:eastAsia="宋体"/>
+          <w:rFonts w:ascii="Times New Roman" w:hAnsi="Times New Roman" w:eastAsia="Songti SC"/>
         </w:rPr>
         <w:t>变量在NetCDF中声明为</w:t>
       </w:r>
       <w:r>
         <w:rPr>
-          <w:rFonts w:ascii="Consolas" w:hAnsi="Consolas" w:eastAsia="等线"/>
+          <w:rFonts w:ascii="Consolas" w:hAnsi="Consolas" w:eastAsia="Songti SC"/>
         </w:rPr>
         <w:t>time×zlev×lat×lon</w:t>
       </w:r>
       <w:r>
         <w:rPr>
-          <w:rFonts w:ascii="Times New Roman" w:hAnsi="Times New Roman" w:eastAsia="宋体"/>
+          <w:rFonts w:ascii="Times New Roman" w:hAnsi="Times New Roman" w:eastAsia="Songti SC"/>
         </w:rPr>
         <w:t>，其中</w:t>
       </w:r>
       <w:r>
         <w:rPr>
-          <w:rFonts w:ascii="Consolas" w:hAnsi="Consolas" w:eastAsia="等线"/>
+          <w:rFonts w:ascii="Consolas" w:hAnsi="Consolas" w:eastAsia="Songti SC"/>
         </w:rPr>
         <w:t>zlev</w:t>
       </w:r>
       <w:r>
         <w:rPr>
-          <w:rFonts w:ascii="Times New Roman" w:hAnsi="Times New Roman" w:eastAsia="宋体"/>
+          <w:rFonts w:ascii="Times New Roman" w:hAnsi="Times New Roman" w:eastAsia="Songti SC"/>
         </w:rPr>
         <w:t>和</w:t>
       </w:r>
       <w:r>
         <w:rPr>
-          <w:rFonts w:ascii="Consolas" w:hAnsi="Consolas" w:eastAsia="等线"/>
+          <w:rFonts w:ascii="Consolas" w:hAnsi="Consolas" w:eastAsia="Songti SC"/>
         </w:rPr>
         <w:t>time</w:t>
       </w:r>
       <w:r>
         <w:rPr>
-          <w:rFonts w:ascii="Times New Roman" w:hAnsi="Times New Roman" w:eastAsia="宋体"/>
+          <w:rFonts w:ascii="Times New Roman" w:hAnsi="Times New Roman" w:eastAsia="Songti SC"/>
         </w:rPr>
         <w:t>均为单例维度；Julia读取后的数组顺序为</w:t>
       </w:r>
       <w:r>
         <w:rPr>
-          <w:rFonts w:ascii="Consolas" w:hAnsi="Consolas" w:eastAsia="等线"/>
+          <w:rFonts w:ascii="Consolas" w:hAnsi="Consolas" w:eastAsia="Songti SC"/>
         </w:rPr>
         <w:t>lon×lat×zlev×time</w:t>
       </w:r>
       <w:r>
         <w:rPr>
-          <w:rFonts w:ascii="Times New Roman" w:hAnsi="Times New Roman" w:eastAsia="宋体"/>
+          <w:rFonts w:ascii="Times New Roman" w:hAnsi="Times New Roman" w:eastAsia="Songti SC"/>
         </w:rPr>
         <w:t>，形状为1440×720×1×1。经度覆盖0.125°～359.875°，存储类型为Int16，并以0.01缩放因子解码为摄氏度。</w:t>
       </w:r>
@@ -3755,89 +3722,89 @@
     <w:p>
       <w:r>
         <w:rPr>
-          <w:rFonts w:ascii="Times New Roman" w:hAnsi="Times New Roman" w:eastAsia="宋体"/>
+          <w:rFonts w:ascii="Times New Roman" w:hAnsi="Times New Roman" w:eastAsia="Songti SC"/>
         </w:rPr>
         <w:t>版本化源适配器提取唯一的垂向层和时间层，共享YAML契约进一步完成维度声明、</w:t>
       </w:r>
       <w:r>
         <w:rPr>
-          <w:rFonts w:ascii="Consolas" w:hAnsi="Consolas" w:eastAsia="等线"/>
+          <w:rFonts w:ascii="Consolas" w:hAnsi="Consolas" w:eastAsia="Songti SC"/>
         </w:rPr>
         <w:t>0°～360°</w:t>
       </w:r>
       <w:r>
         <w:rPr>
-          <w:rFonts w:ascii="Times New Roman" w:hAnsi="Times New Roman" w:eastAsia="宋体"/>
+          <w:rFonts w:ascii="Times New Roman" w:hAnsi="Times New Roman" w:eastAsia="Songti SC"/>
         </w:rPr>
         <w:t>至</w:t>
       </w:r>
       <w:r>
         <w:rPr>
-          <w:rFonts w:ascii="Consolas" w:hAnsi="Consolas" w:eastAsia="等线"/>
+          <w:rFonts w:ascii="Consolas" w:hAnsi="Consolas" w:eastAsia="Songti SC"/>
         </w:rPr>
         <w:t>[−180°, 180°)</w:t>
       </w:r>
       <w:r>
         <w:rPr>
-          <w:rFonts w:ascii="Times New Roman" w:hAnsi="Times New Roman" w:eastAsia="宋体"/>
+          <w:rFonts w:ascii="Times New Roman" w:hAnsi="Times New Roman" w:eastAsia="Songti SC"/>
         </w:rPr>
         <w:t>的经度重排、有效范围控制和缺失值策略，生成</w:t>
       </w:r>
       <w:r>
         <w:rPr>
-          <w:rFonts w:ascii="Consolas" w:hAnsi="Consolas" w:eastAsia="等线"/>
+          <w:rFonts w:ascii="Consolas" w:hAnsi="Consolas" w:eastAsia="Songti SC"/>
         </w:rPr>
         <w:t>SST_OISST_4X_1D_20220225_V1</w:t>
       </w:r>
       <w:r>
         <w:rPr>
-          <w:rFonts w:ascii="Times New Roman" w:hAnsi="Times New Roman" w:eastAsia="宋体"/>
-        </w:rPr>
-        <w:t>标准产品。</w:t>
+          <w:rFonts w:ascii="Times New Roman" w:hAnsi="Times New Roman" w:eastAsia="Songti SC"/>
+        </w:rPr>
+        <w:t>标准化数据。</w:t>
       </w:r>
     </w:p>
     <w:p>
       <w:r>
         <w:rPr>
-          <w:rFonts w:ascii="Times New Roman" w:hAnsi="Times New Roman" w:eastAsia="宋体"/>
+          <w:rFonts w:ascii="Times New Roman" w:hAnsi="Times New Roman" w:eastAsia="Songti SC"/>
         </w:rPr>
         <w:t>独立参考流程直接读取未缩放的Int16存储值，根据原始</w:t>
       </w:r>
       <w:r>
         <w:rPr>
-          <w:rFonts w:ascii="Consolas" w:hAnsi="Consolas" w:eastAsia="等线"/>
+          <w:rFonts w:ascii="Consolas" w:hAnsi="Consolas" w:eastAsia="Songti SC"/>
         </w:rPr>
         <w:t>scale_factor</w:t>
       </w:r>
       <w:r>
         <w:rPr>
-          <w:rFonts w:ascii="Times New Roman" w:hAnsi="Times New Roman" w:eastAsia="宋体"/>
+          <w:rFonts w:ascii="Times New Roman" w:hAnsi="Times New Roman" w:eastAsia="Songti SC"/>
         </w:rPr>
         <w:t>、</w:t>
       </w:r>
       <w:r>
         <w:rPr>
-          <w:rFonts w:ascii="Consolas" w:hAnsi="Consolas" w:eastAsia="等线"/>
+          <w:rFonts w:ascii="Consolas" w:hAnsi="Consolas" w:eastAsia="Songti SC"/>
         </w:rPr>
         <w:t>add_offset</w:t>
       </w:r>
       <w:r>
         <w:rPr>
-          <w:rFonts w:ascii="Times New Roman" w:hAnsi="Times New Roman" w:eastAsia="宋体"/>
+          <w:rFonts w:ascii="Times New Roman" w:hAnsi="Times New Roman" w:eastAsia="Songti SC"/>
         </w:rPr>
         <w:t>和</w:t>
       </w:r>
       <w:r>
         <w:rPr>
-          <w:rFonts w:ascii="Consolas" w:hAnsi="Consolas" w:eastAsia="等线"/>
+          <w:rFonts w:ascii="Consolas" w:hAnsi="Consolas" w:eastAsia="Songti SC"/>
         </w:rPr>
         <w:t>_FillValue</w:t>
       </w:r>
       <w:r>
         <w:rPr>
-          <w:rFonts w:ascii="Times New Roman" w:hAnsi="Times New Roman" w:eastAsia="宋体"/>
-        </w:rPr>
-        <w:t>构造物理值与缺失值掩膜，并独立计算目标经度索引。参考结果记录全场统计量、10个确定性有效格点和10个缺失格点。标准产品连续生成3次，逐点比较坐标、有效值掩膜和物理值；随后由权威文件生成包含逻辑路径、镜像地址、字节数和SHA-256的目录条目，通过回环HTTP执行事务式下载，并以统一读取接口完成整场核对。</w:t>
+          <w:rFonts w:ascii="Times New Roman" w:hAnsi="Times New Roman" w:eastAsia="Songti SC"/>
+        </w:rPr>
+        <w:t>构造物理值与缺失值掩膜，并独立计算目标经度索引。参考结果记录全场统计量、10个确定性有效格点和10个缺失格点。标准化数据连续生成3次，逐点比较坐标、有效值掩膜和物理值；随后由权威文件生成包含逻辑路径、镜像地址、字节数和SHA-256的目录条目，通过回环HTTP执行事务式下载，并以统一读取接口完成整场核对。</w:t>
       </w:r>
     </w:p>
     <w:p>
@@ -3846,7 +3813,7 @@
       </w:pPr>
       <w:r>
         <w:rPr>
-          <w:rFonts w:ascii="Times New Roman" w:hAnsi="Times New Roman" w:eastAsia="宋体"/>
+          <w:rFonts w:ascii="Times New Roman" w:hAnsi="Times New Roman" w:eastAsia="Songti SC"/>
         </w:rPr>
         <w:t>3.2 ELEV与LAI的直接NetCDF分发效率评价</w:t>
       </w:r>
@@ -3854,55 +3821,55 @@
     <w:p>
       <w:r>
         <w:rPr>
-          <w:rFonts w:ascii="Times New Roman" w:hAnsi="Times New Roman" w:eastAsia="宋体"/>
+          <w:rFonts w:ascii="Times New Roman" w:hAnsi="Times New Roman" w:eastAsia="Songti SC"/>
         </w:rPr>
         <w:t>直接NetCDF分发效率采用二维静态高程（ELEV）</w:t>
       </w:r>
       <w:r>
         <w:rPr>
-          <w:rFonts w:ascii="Consolas" w:hAnsi="Consolas" w:eastAsia="等线"/>
+          <w:rFonts w:ascii="Consolas" w:hAnsi="Consolas" w:eastAsia="Songti SC"/>
         </w:rPr>
         <w:t>ELEV_4X_1Y_V1</w:t>
       </w:r>
       <w:r>
         <w:rPr>
-          <w:rFonts w:ascii="Times New Roman" w:hAnsi="Times New Roman" w:eastAsia="宋体"/>
+          <w:rFonts w:ascii="Times New Roman" w:hAnsi="Times New Roman" w:eastAsia="Songti SC"/>
         </w:rPr>
         <w:t>和三维8日叶面积指数（LAI）</w:t>
       </w:r>
       <w:r>
         <w:rPr>
-          <w:rFonts w:ascii="Consolas" w:hAnsi="Consolas" w:eastAsia="等线"/>
+          <w:rFonts w:ascii="Consolas" w:hAnsi="Consolas" w:eastAsia="Songti SC"/>
         </w:rPr>
         <w:t>LAI_MODIS_2X_8D_2020_V1</w:t>
       </w:r>
       <w:r>
         <w:rPr>
-          <w:rFonts w:ascii="Times New Roman" w:hAnsi="Times New Roman" w:eastAsia="宋体"/>
-        </w:rPr>
-        <w:t>进行分析，代表不同规模和维度的内部压缩产品。每个标准NetCDF分别以原始</w:t>
-      </w:r>
-      <w:r>
-        <w:rPr>
-          <w:rFonts w:ascii="Consolas" w:hAnsi="Consolas" w:eastAsia="等线"/>
+          <w:rFonts w:ascii="Times New Roman" w:hAnsi="Times New Roman" w:eastAsia="Songti SC"/>
+        </w:rPr>
+        <w:t>进行分析，代表不同规模和维度的内部压缩数据集。每个标准NetCDF分别以原始</w:t>
+      </w:r>
+      <w:r>
+        <w:rPr>
+          <w:rFonts w:ascii="Consolas" w:hAnsi="Consolas" w:eastAsia="Songti SC"/>
         </w:rPr>
         <w:t>.nc</w:t>
       </w:r>
       <w:r>
         <w:rPr>
-          <w:rFonts w:ascii="Times New Roman" w:hAnsi="Times New Roman" w:eastAsia="宋体"/>
+          <w:rFonts w:ascii="Times New Roman" w:hAnsi="Times New Roman" w:eastAsia="Songti SC"/>
         </w:rPr>
         <w:t>和包含同一文件的</w:t>
       </w:r>
       <w:r>
         <w:rPr>
-          <w:rFonts w:ascii="Consolas" w:hAnsi="Consolas" w:eastAsia="等线"/>
+          <w:rFonts w:ascii="Consolas" w:hAnsi="Consolas" w:eastAsia="Songti SC"/>
         </w:rPr>
         <w:t>tar.gz</w:t>
       </w:r>
       <w:r>
         <w:rPr>
-          <w:rFonts w:ascii="Times New Roman" w:hAnsi="Times New Roman" w:eastAsia="宋体"/>
+          <w:rFonts w:ascii="Times New Roman" w:hAnsi="Times New Roman" w:eastAsia="Songti SC"/>
         </w:rPr>
         <w:t>分发，对照归档采用gzip级别6。两种形式解包后的NetCDF具有相同SHA-256，据此量化省去外层打包与解包带来的时间和临时空间收益。</w:t>
       </w:r>
@@ -3910,9 +3877,9 @@
     <w:p>
       <w:r>
         <w:rPr>
-          <w:rFonts w:ascii="Times New Roman" w:hAnsi="Times New Roman" w:eastAsia="宋体"/>
-        </w:rPr>
-        <w:t>性能分析基于回环HTTP服务，按随机顺序重复测量传输字节数、打包与解包时间、从请求开始到首次读取NetCDF值的端到端时间，以及下载文件与解包文件并存时的逻辑临时占用。两个独立环境使用一致的脚本和输入文件，时间指标以中位数、四分位距和95% Bootstrap置信区间表示。</w:t>
+          <w:rFonts w:ascii="Times New Roman" w:hAnsi="Times New Roman" w:eastAsia="Songti SC"/>
+        </w:rPr>
+        <w:t>性能分析在Windows（环境A）和macOS（环境B）中采用回环HTTP服务。每个“数据×分发形式”组合经过缓存预热后按随机顺序测量10次，记录传输字节数、打包与解包时间、从请求开始到首次读取NetCDF值的端到端时间，以及下载文件与解包文件并存时的逻辑临时占用。两个独立环境使用一致的脚本和输入文件，时间指标以中位数、四分位距和95% Bootstrap置信区间表示。</w:t>
       </w:r>
     </w:p>
     <w:p>
@@ -3921,7 +3888,7 @@
       </w:pPr>
       <w:r>
         <w:rPr>
-          <w:rFonts w:ascii="Times New Roman" w:hAnsi="Times New Roman" w:eastAsia="宋体"/>
+          <w:rFonts w:ascii="Times New Roman" w:hAnsi="Times New Roman" w:eastAsia="Songti SC"/>
         </w:rPr>
         <w:t>3.3 多镜像获取与内容完整性</w:t>
       </w:r>
@@ -3929,27 +3896,27 @@
     <w:p>
       <w:r>
         <w:rPr>
-          <w:rFonts w:ascii="Times New Roman" w:hAnsi="Times New Roman" w:eastAsia="宋体"/>
-        </w:rPr>
-        <w:t>数据目录生命周期涵盖首次建立、版本更新、目录同步、产品获取、状态查询和历史数据整理。代表性目录包含不同版本的</w:t>
-      </w:r>
-      <w:r>
-        <w:rPr>
-          <w:rFonts w:ascii="Consolas" w:hAnsi="Consolas" w:eastAsia="等线"/>
+          <w:rFonts w:ascii="Times New Roman" w:hAnsi="Times New Roman" w:eastAsia="Songti SC"/>
+        </w:rPr>
+        <w:t>数据目录生命周期涵盖首次建立、版本更新、目录同步、数据集获取、状态查询和历史数据整理。代表性目录包含不同版本的</w:t>
+      </w:r>
+      <w:r>
+        <w:rPr>
+          <w:rFonts w:ascii="Consolas" w:hAnsi="Consolas" w:eastAsia="Songti SC"/>
         </w:rPr>
         <w:t>Artifacts.yaml</w:t>
       </w:r>
       <w:r>
         <w:rPr>
-          <w:rFonts w:ascii="Times New Roman" w:hAnsi="Times New Roman" w:eastAsia="宋体"/>
-        </w:rPr>
-        <w:t>、多个NetCDF产品和两个镜像端点，并覆盖目录更新、单产品获取、全库同步、历史整理和状态查询。各状态转换通过重复调用考察幂等行为，确定性小型目录参考数据用于呈现事务缓存、正式数据区、全库同步与镜像遍历逻辑。</w:t>
+          <w:rFonts w:ascii="Times New Roman" w:hAnsi="Times New Roman" w:eastAsia="Songti SC"/>
+        </w:rPr>
+        <w:t>、多个NetCDF数据集和两个镜像端点，并覆盖目录更新、单数据集获取、全库同步、历史整理和状态查询。各状态转换通过重复调用考察幂等行为，确定性小型目录参考数据用于呈现事务缓存、正式数据区、全库同步与镜像遍历逻辑。</w:t>
       </w:r>
     </w:p>
     <w:p>
       <w:r>
         <w:rPr>
-          <w:rFonts w:ascii="Times New Roman" w:hAnsi="Times New Roman" w:eastAsia="宋体"/>
+          <w:rFonts w:ascii="Times New Roman" w:hAnsi="Times New Roman" w:eastAsia="Songti SC"/>
         </w:rPr>
         <w:t>多镜像分析在两个独立环境中构建内容一致、访问状态可配置的镜像集合，通过延迟分数组织候选顺序，并设置13类受控状态场景，覆盖候选排序、镜像回退、网络访问异常、缓存命中、内容完整性异常和候选耗尽过程。每类场景在各环境中重复5次，记录候选选择、镜像遍历、正式文件状态及SHA-256，据此刻画事务式获取在镜像切换过程中的文件选择、校验与落盘行为。校园网机构FTP与Zenodo公共存储的访问进一步呈现机构镜像和公共镜像的互补分发特征与内容一致性；完整场景矩阵列于补充材料S6。</w:t>
       </w:r>
@@ -3957,31 +3924,31 @@
     <w:p>
       <w:r>
         <w:rPr>
-          <w:rFonts w:ascii="Times New Roman" w:hAnsi="Times New Roman" w:eastAsia="宋体"/>
+          <w:rFonts w:ascii="Times New Roman" w:hAnsi="Times New Roman" w:eastAsia="Songti SC"/>
         </w:rPr>
         <w:t>镜像访问实验选取4个同时具有FTP和Zenodo地址且已登记</w:t>
       </w:r>
       <w:r>
         <w:rPr>
-          <w:rFonts w:ascii="Consolas" w:hAnsi="Consolas" w:eastAsia="等线"/>
+          <w:rFonts w:ascii="Consolas" w:hAnsi="Consolas" w:eastAsia="Songti SC"/>
         </w:rPr>
         <w:t>SIZE</w:t>
       </w:r>
       <w:r>
         <w:rPr>
-          <w:rFonts w:ascii="Times New Roman" w:hAnsi="Times New Roman" w:eastAsia="宋体"/>
+          <w:rFonts w:ascii="Times New Roman" w:hAnsi="Times New Roman" w:eastAsia="Songti SC"/>
         </w:rPr>
         <w:t>与</w:t>
       </w:r>
       <w:r>
         <w:rPr>
-          <w:rFonts w:ascii="Consolas" w:hAnsi="Consolas" w:eastAsia="等线"/>
+          <w:rFonts w:ascii="Consolas" w:hAnsi="Consolas" w:eastAsia="Songti SC"/>
         </w:rPr>
         <w:t>SHA256</w:t>
       </w:r>
       <w:r>
         <w:rPr>
-          <w:rFonts w:ascii="Times New Roman" w:hAnsi="Times New Roman" w:eastAsia="宋体"/>
+          <w:rFonts w:ascii="Times New Roman" w:hAnsi="Times New Roman" w:eastAsia="Songti SC"/>
         </w:rPr>
         <w:t>字段的代表性标签，对各文件—镜像组合开展重复下载，记录候选顺序、传输时间、字节数和SHA-256。公共网络观测刻画Zenodo镜像获取特征；中科大校园网实验对FTP与Zenodo执行同文件只读下载，共形成24次完整性记录。实验数据与环境信息随可复现材料归档。</w:t>
       </w:r>
@@ -3992,7 +3959,7 @@
       </w:pPr>
       <w:r>
         <w:rPr>
-          <w:rFonts w:ascii="Times New Roman" w:hAnsi="Times New Roman" w:eastAsia="宋体"/>
+          <w:rFonts w:ascii="Times New Roman" w:hAnsi="Times New Roman" w:eastAsia="Songti SC"/>
         </w:rPr>
         <w:t>3.4 统一读取与模式输入组织</w:t>
       </w:r>
@@ -4000,51 +3967,51 @@
     <w:p>
       <w:r>
         <w:rPr>
-          <w:rFonts w:ascii="Times New Roman" w:hAnsi="Times New Roman" w:eastAsia="宋体"/>
-        </w:rPr>
-        <w:t>模式输入组织案例连接标准网格读取、陆面参数融合、气象驱动组织与Emerald初始化。确定性参考数据用于核对字段名、形状、类型、时间索引和缺失值处理；陆面案例采用2020年第二套陆面参数集合，在US-NR1研究站点附近植被格点和典型非植被格点呈现不同陆面状态下的模型入口。</w:t>
+          <w:rFonts w:ascii="Times New Roman" w:hAnsi="Times New Roman" w:eastAsia="Songti SC"/>
+        </w:rPr>
+        <w:t>模式输入组织案例连接标准网格读取、陆面参数融合、气象驱动组织与Emerald初始化。确定性参考数据用于核对字段名、形状、类型、时间索引和缺失值处理；陆面案例采用2020年第二套陆面参数集合，在US-NR1研究站点附近植被格点和典型非植被格点呈现不同陆面状态下的模式入口。</w:t>
       </w:r>
     </w:p>
     <w:p>
       <w:r>
         <w:rPr>
-          <w:rFonts w:ascii="Times New Roman" w:hAnsi="Times New Roman" w:eastAsia="宋体"/>
-        </w:rPr>
-        <w:t>真实气象案例使用同一年度的8类ERA5标准产品[10]：地表气压、降水、漫射与直射短波辐射、长波辐射、气温、水汽压亏缺和风速。八文件从中科大机构FTP只读获取，总大小为12 575 376 138字节，并逐文件记录SHA-256。US-NR1坐标（40.0329°N、105.5464°W）由规则索引映射到40.5°N、105.5°W格点；2020年为闰年，预期每个字段包含8784个逐小时值。实验同时核对8个</w:t>
-      </w:r>
-      <w:r>
-        <w:rPr>
-          <w:rFonts w:ascii="Consolas" w:hAnsi="Consolas" w:eastAsia="等线"/>
+          <w:rFonts w:ascii="Times New Roman" w:hAnsi="Times New Roman" w:eastAsia="Songti SC"/>
+        </w:rPr>
+        <w:t>真实气象案例使用同一年度的8类ERA5标准化数据[6]：地表气压、降水、漫射与直射短波辐射、长波辐射、气温、水汽压亏缺和风速。八文件从中科大机构FTP只读获取，总大小为12 575 376 138字节，并逐文件记录SHA-256。US-NR1坐标（40.0329°N、105.5464°W）由规则索引映射到40.5°N、105.5°W格点；2020年为闰年，预期每个字段包含8784个逐小时值。实验同时核对8个</w:t>
+      </w:r>
+      <w:r>
+        <w:rPr>
+          <w:rFonts w:ascii="Consolas" w:hAnsi="Consolas" w:eastAsia="Songti SC"/>
         </w:rPr>
         <w:t>data</w:t>
       </w:r>
       <w:r>
         <w:rPr>
-          <w:rFonts w:ascii="Times New Roman" w:hAnsi="Times New Roman" w:eastAsia="宋体"/>
+          <w:rFonts w:ascii="Times New Roman" w:hAnsi="Times New Roman" w:eastAsia="Songti SC"/>
         </w:rPr>
         <w:t>变量的</w:t>
       </w:r>
       <w:r>
         <w:rPr>
-          <w:rFonts w:ascii="Consolas" w:hAnsi="Consolas" w:eastAsia="等线"/>
+          <w:rFonts w:ascii="Consolas" w:hAnsi="Consolas" w:eastAsia="Songti SC"/>
         </w:rPr>
         <w:t>lon×lat×ind</w:t>
       </w:r>
       <w:r>
         <w:rPr>
-          <w:rFonts w:ascii="Times New Roman" w:hAnsi="Times New Roman" w:eastAsia="宋体"/>
+          <w:rFonts w:ascii="Times New Roman" w:hAnsi="Times New Roman" w:eastAsia="Songti SC"/>
         </w:rPr>
         <w:t>维度、360×180×8784形状及单位属性。模式输入组织层输出与底层NetCDF直接读取的同一格点序列逐点比较；</w:t>
       </w:r>
       <w:r>
         <w:rPr>
-          <w:rFonts w:ascii="Consolas" w:hAnsi="Consolas" w:eastAsia="等线"/>
+          <w:rFonts w:ascii="Consolas" w:hAnsi="Consolas" w:eastAsia="Songti SC"/>
         </w:rPr>
         <w:t>FDOY</w:t>
       </w:r>
       <w:r>
         <w:rPr>
-          <w:rFonts w:ascii="Times New Roman" w:hAnsi="Times New Roman" w:eastAsia="宋体"/>
+          <w:rFonts w:ascii="Times New Roman" w:hAnsi="Times New Roman" w:eastAsia="Songti SC"/>
         </w:rPr>
         <w:t>另按经度/15计算时区偏移并独立重建。随后把真实陆面参数和真实气象驱动共同传入Emerald，检查初始化和60 s首步后的大气、土壤状态是否均为有限值。</w:t>
       </w:r>
@@ -4055,7 +4022,7 @@
       </w:pPr>
       <w:r>
         <w:rPr>
-          <w:rFonts w:ascii="Times New Roman" w:hAnsi="Times New Roman" w:eastAsia="宋体"/>
+          <w:rFonts w:ascii="Times New Roman" w:hAnsi="Times New Roman" w:eastAsia="Songti SC"/>
         </w:rPr>
         <w:t>3.5 跨操作系统运行一致性设计</w:t>
       </w:r>
@@ -4063,7 +4030,7 @@
     <w:p>
       <w:r>
         <w:rPr>
-          <w:rFonts w:ascii="Times New Roman" w:hAnsi="Times New Roman" w:eastAsia="宋体"/>
+          <w:rFonts w:ascii="Times New Roman" w:hAnsi="Times New Roman" w:eastAsia="Songti SC"/>
         </w:rPr>
         <w:t>跨操作系统运行一致性采用本地运行与持续集成相结合的设计。Windows和macOS本地环境运行生产矩阵、ELEV/LAI分发效率、13类受控状态场景以及核心软件与Emerald接口；Linux与另外两个系统的干净持续集成环境运行29组非交互生产实例、40次确定性分发测量、65次镜像状态核对、核心软件功能和Emerald最小接口。统一项目依赖与参考数据用于比较数据结构、逐点数值、正式文件摘要和接口状态。</w:t>
       </w:r>
@@ -4071,7 +4038,7 @@
     <w:p>
       <w:r>
         <w:rPr>
-          <w:rFonts w:ascii="Times New Roman" w:hAnsi="Times New Roman" w:eastAsia="宋体"/>
+          <w:rFonts w:ascii="Times New Roman" w:hAnsi="Times New Roman" w:eastAsia="Songti SC"/>
         </w:rPr>
         <w:t>真实FTP—Zenodo访问按照实际网络环境单独记录，US-NR1真实陆面和ERA5链路作为应用案例归档。由此形成“多系统确定性核心路径—独立环境性能观测—真实网络与数据应用”三个层次的复现设计；完整系统—模块—证据矩阵见补充材料S5。</w:t>
       </w:r>
@@ -4082,7 +4049,7 @@
       </w:pPr>
       <w:r>
         <w:rPr>
-          <w:rFonts w:ascii="Times New Roman" w:hAnsi="Times New Roman" w:eastAsia="宋体"/>
+          <w:rFonts w:ascii="Times New Roman" w:hAnsi="Times New Roman" w:eastAsia="Songti SC"/>
         </w:rPr>
         <w:t>4 结果</w:t>
       </w:r>
@@ -4090,9 +4057,9 @@
     <w:p>
       <w:r>
         <w:rPr>
-          <w:rFonts w:ascii="Times New Roman" w:hAnsi="Times New Roman" w:eastAsia="宋体"/>
-        </w:rPr>
-        <w:t>按照表3所列评价设计，以下依次呈现标准产品生产、直接NetCDF分发效率、多镜像获取、模式输入组织和跨操作系统运行一致性结果。</w:t>
+          <w:rFonts w:ascii="Times New Roman" w:hAnsi="Times New Roman" w:eastAsia="Songti SC"/>
+        </w:rPr>
+        <w:t>按照表3所列评价设计，以下依次呈现标准化数据生产、直接NetCDF分发效率、多镜像获取、模式输入组织和跨操作系统运行一致性结果。</w:t>
       </w:r>
     </w:p>
     <w:p>
@@ -4101,7 +4068,7 @@
       </w:pPr>
       <w:r>
         <w:rPr>
-          <w:rFonts w:ascii="Times New Roman" w:hAnsi="Times New Roman" w:eastAsia="宋体"/>
+          <w:rFonts w:ascii="Times New Roman" w:hAnsi="Times New Roman" w:eastAsia="Songti SC"/>
         </w:rPr>
         <w:t>4.1 数据生产与标准化及OISST结果</w:t>
       </w:r>
@@ -4112,7 +4079,7 @@
       </w:pPr>
       <w:r>
         <w:rPr>
-          <w:rFonts w:ascii="Times New Roman" w:hAnsi="Times New Roman" w:eastAsia="宋体"/>
+          <w:rFonts w:ascii="Times New Roman" w:hAnsi="Times New Roman" w:eastAsia="Songti SC"/>
         </w:rPr>
         <w:t>4.1.1 共享生产契约与质量控制结果</w:t>
       </w:r>
@@ -4120,53 +4087,53 @@
     <w:p>
       <w:r>
         <w:rPr>
-          <w:rFonts w:ascii="Times New Roman" w:hAnsi="Times New Roman" w:eastAsia="宋体"/>
-        </w:rPr>
-        <w:t>31组处理实例覆盖维度、坐标、数值、Gapfill、配置、输出和空间方向控制，其中29组非交互实例在三系统持续集成环境中获得一致的产品结构和逐点数值结果；人工空间审核分别接受正向图并识别南北反转图，与预设方向结果一致。数据贡献案例进一步贯通YAML配置、标准产品生成、目录登记和下游读取，生成产品与参考数组逐点一致，目录中的文件字节数和SHA-256与产品相符。</w:t>
+          <w:rFonts w:ascii="Times New Roman" w:hAnsi="Times New Roman" w:eastAsia="Songti SC"/>
+        </w:rPr>
+        <w:t>31组处理实例覆盖维度、坐标、数值、Gapfill、配置、输出和空间方向控制，其中29组非交互实例在三系统持续集成环境中获得一致的数据集结构和逐点数值结果；人工空间审核分别接受正向图并识别南北反转图，与预设方向结果一致。数据贡献案例进一步贯通YAML配置、标准化数据生成、目录登记和下游读取，生成数据集与参考数组逐点一致，目录中的文件字节数和SHA-256与数据集相符。</w:t>
       </w:r>
     </w:p>
     <w:p>
       <w:r>
         <w:rPr>
-          <w:rFonts w:ascii="Times New Roman" w:hAnsi="Times New Roman" w:eastAsia="宋体"/>
+          <w:rFonts w:ascii="Times New Roman" w:hAnsi="Times New Roman" w:eastAsia="Songti SC"/>
         </w:rPr>
         <w:t>ELEV补充案例使用已通过文件大小和SHA-256校验的</w:t>
       </w:r>
       <w:r>
         <w:rPr>
-          <w:rFonts w:ascii="Consolas" w:hAnsi="Consolas" w:eastAsia="等线"/>
+          <w:rFonts w:ascii="Consolas" w:hAnsi="Consolas" w:eastAsia="Songti SC"/>
         </w:rPr>
         <w:t>ELEV_4X_1Y_V1.nc</w:t>
       </w:r>
       <w:r>
         <w:rPr>
-          <w:rFonts w:ascii="Times New Roman" w:hAnsi="Times New Roman" w:eastAsia="宋体"/>
+          <w:rFonts w:ascii="Times New Roman" w:hAnsi="Times New Roman" w:eastAsia="Songti SC"/>
         </w:rPr>
         <w:t>。该文件为1440×720、全域有效，有限值范围为−415.5～5 357.7002 m；GriddingMachine整场读取与NetCDF底层Float32数组逐点一致。使用显式标准维度、</w:t>
       </w:r>
       <w:r>
         <w:rPr>
-          <w:rFonts w:ascii="Consolas" w:hAnsi="Consolas" w:eastAsia="等线"/>
+          <w:rFonts w:ascii="Consolas" w:hAnsi="Consolas" w:eastAsia="Songti SC"/>
         </w:rPr>
         <w:t>KEEP_AS_IS</w:t>
       </w:r>
       <w:r>
         <w:rPr>
-          <w:rFonts w:ascii="Times New Roman" w:hAnsi="Times New Roman" w:eastAsia="宋体"/>
+          <w:rFonts w:ascii="Times New Roman" w:hAnsi="Times New Roman" w:eastAsia="Songti SC"/>
         </w:rPr>
         <w:t>和原值保持配置连续处理3次，三次</w:t>
       </w:r>
       <w:r>
         <w:rPr>
-          <w:rFonts w:ascii="Consolas" w:hAnsi="Consolas" w:eastAsia="等线"/>
+          <w:rFonts w:ascii="Consolas" w:hAnsi="Consolas" w:eastAsia="Songti SC"/>
         </w:rPr>
         <w:t>data/lon/lat</w:t>
       </w:r>
       <w:r>
         <w:rPr>
-          <w:rFonts w:ascii="Times New Roman" w:hAnsi="Times New Roman" w:eastAsia="宋体"/>
-        </w:rPr>
-        <w:t>均与输入一致，输出文件SHA-256也彼此相同，表明标准产品经过统一读取和生产流水线后保持科学数组及坐标。</w:t>
+          <w:rFonts w:ascii="Times New Roman" w:hAnsi="Times New Roman" w:eastAsia="Songti SC"/>
+        </w:rPr>
+        <w:t>均与输入一致，输出文件SHA-256也彼此相同，表明标准化数据经过统一读取和生产流水线后保持科学数组及坐标。</w:t>
       </w:r>
     </w:p>
     <w:p>
@@ -4175,49 +4142,49 @@
       </w:pPr>
       <w:r>
         <w:rPr>
-          <w:rFonts w:ascii="Times New Roman" w:hAnsi="Times New Roman" w:eastAsia="宋体"/>
-        </w:rPr>
-        <w:t>4.1.2 OISST异构产品标准化结果</w:t>
+          <w:rFonts w:ascii="Times New Roman" w:hAnsi="Times New Roman" w:eastAsia="Songti SC"/>
+        </w:rPr>
+        <w:t>4.1.2 OISST异构数据集标准化结果</w:t>
       </w:r>
     </w:p>
     <w:p>
       <w:r>
         <w:rPr>
-          <w:rFonts w:ascii="Times New Roman" w:hAnsi="Times New Roman" w:eastAsia="宋体"/>
+          <w:rFonts w:ascii="Times New Roman" w:hAnsi="Times New Roman" w:eastAsia="Songti SC"/>
         </w:rPr>
         <w:t>OISST案例展示了共享生产契约对异构地学源数据的组织能力。原始</w:t>
       </w:r>
       <w:r>
         <w:rPr>
-          <w:rFonts w:ascii="Consolas" w:hAnsi="Consolas" w:eastAsia="等线"/>
+          <w:rFonts w:ascii="Consolas" w:hAnsi="Consolas" w:eastAsia="Songti SC"/>
         </w:rPr>
         <w:t>sst</w:t>
       </w:r>
       <w:r>
         <w:rPr>
-          <w:rFonts w:ascii="Times New Roman" w:hAnsi="Times New Roman" w:eastAsia="宋体"/>
+          <w:rFonts w:ascii="Times New Roman" w:hAnsi="Times New Roman" w:eastAsia="Songti SC"/>
         </w:rPr>
         <w:t>变量在Julia读取路径中呈现为1440×720×1×1的</w:t>
       </w:r>
       <w:r>
         <w:rPr>
-          <w:rFonts w:ascii="Consolas" w:hAnsi="Consolas" w:eastAsia="等线"/>
+          <w:rFonts w:ascii="Consolas" w:hAnsi="Consolas" w:eastAsia="Songti SC"/>
         </w:rPr>
         <w:t>lon×lat×zlev×time</w:t>
       </w:r>
       <w:r>
         <w:rPr>
-          <w:rFonts w:ascii="Times New Roman" w:hAnsi="Times New Roman" w:eastAsia="宋体"/>
-        </w:rPr>
-        <w:t>数组，经单例层提取、Int16物理值解码和经度重排后形成1440×720标准产品。输出经度由−179.875°递增至179.875°，纬度由−89.875°递增至89.875°；691 150个有效格点和345 650个缺失格点与独立参考逐点一致，海表温度范围为−1.80～32.39 ℃，全场平均值为14.013 ℃，最大绝对差为0。</w:t>
+          <w:rFonts w:ascii="Times New Roman" w:hAnsi="Times New Roman" w:eastAsia="Songti SC"/>
+        </w:rPr>
+        <w:t>数组，经单例层提取、Int16物理值解码和经度重排后形成1440×720标准化数据。输出经度由−179.875°递增至179.875°，纬度由−89.875°递增至89.875°；691 150个有效格点和345 650个缺失格点与独立参考逐点一致，海表温度范围为−1.80～32.39 ℃，全场平均值为14.013 ℃，最大绝对差为0。</w:t>
       </w:r>
     </w:p>
     <w:p>
       <w:r>
         <w:rPr>
-          <w:rFonts w:ascii="Times New Roman" w:hAnsi="Times New Roman" w:eastAsia="宋体"/>
-        </w:rPr>
-        <w:t>标准产品连续生成3次，科学数组、坐标和文件SHA-256均保持一致。生成文件为997 006字节，目录条目自动登记相同的字节数和SHA-256；经回环HTTP事务式下载后，正式文件摘要与目录完全一致，传输临时文件全部完成回收。统一读取接口获得的整场数组与独立参考逐点一致，验证了从源产品、共享YAML生产、目录登记到标准读取的端到端数据链路。</w:t>
+          <w:rFonts w:ascii="Times New Roman" w:hAnsi="Times New Roman" w:eastAsia="Songti SC"/>
+        </w:rPr>
+        <w:t>标准化数据连续生成3次，科学数组、坐标和文件SHA-256均保持一致。生成文件为997 006字节，目录条目自动登记相同的字节数和SHA-256；经回环HTTP事务式下载后，正式文件摘要与目录完全一致，传输临时文件全部完成回收。统一读取接口获得的整场数组与独立参考逐点一致，验证了从源数据、共享YAML生产、目录登记到标准读取的端到端数据链路。</w:t>
       </w:r>
     </w:p>
     <w:p>
@@ -4265,16 +4232,16 @@
       </w:pPr>
       <w:r>
         <w:rPr>
-          <w:rFonts w:ascii="Times New Roman" w:hAnsi="Times New Roman" w:eastAsia="宋体"/>
+          <w:rFonts w:ascii="Times New Roman" w:hAnsi="Times New Roman" w:eastAsia="Songti SC"/>
           <w:b/>
         </w:rPr>
-        <w:t>图2 OISST V2.1产品标准化结果</w:t>
-      </w:r>
-      <w:r>
-        <w:rPr>
-          <w:rFonts w:ascii="Times New Roman" w:hAnsi="Times New Roman" w:eastAsia="宋体"/>
-        </w:rPr>
-        <w:t xml:space="preserve"> （a）2022年2月25日全球海表温度标准产品；（b）从四维源结构、存储值解码和经度重排到二维标准网格的转换路径；（c）坐标、有效值掩膜、物理值及重复生成摘要的独立参考核对。标准产品为1440×720规则网格，691 150个有效格点及345 650个缺失格点与独立参考掩膜逐点一致，物理值最大绝对差为0，3次生成的文件摘要相同。</w:t>
+        <w:t>图2 OISST V2.1数据集标准化结果</w:t>
+      </w:r>
+      <w:r>
+        <w:rPr>
+          <w:rFonts w:ascii="Times New Roman" w:hAnsi="Times New Roman" w:eastAsia="Songti SC"/>
+        </w:rPr>
+        <w:t xml:space="preserve"> （a）2022年2月25日全球海表温度标准化数据；（b）从四维源结构、存储值解码和经度重排到二维标准网格的转换路径；（c）坐标、有效值掩膜、物理值及重复生成摘要的独立参考核对。标准化数据为1440×720规则网格，691 150个有效格点及345 650个缺失格点与独立参考掩膜逐点一致，物理值最大绝对差为0，3次生成的文件摘要相同。</w:t>
       </w:r>
     </w:p>
     <w:p>
@@ -4283,14 +4250,14 @@
       </w:pPr>
       <w:r>
         <w:rPr>
-          <w:rFonts w:ascii="Times New Roman" w:hAnsi="Times New Roman" w:eastAsia="宋体"/>
+          <w:rFonts w:ascii="Times New Roman" w:hAnsi="Times New Roman" w:eastAsia="Songti SC"/>
           <w:b/>
         </w:rPr>
         <w:t>Fig. 2 Standardization results for the OISST V2.1 product.</w:t>
       </w:r>
       <w:r>
         <w:rPr>
-          <w:rFonts w:ascii="Times New Roman" w:hAnsi="Times New Roman" w:eastAsia="宋体"/>
+          <w:rFonts w:ascii="Times New Roman" w:hAnsi="Times New Roman" w:eastAsia="Songti SC"/>
         </w:rPr>
         <w:t xml:space="preserve"> (a) Global standardized sea-surface temperature on 25 February 2022; (b) the transformation from the four-dimensional source layout through stored-value decoding and longitude reordering to the two-dimensional standard grid; and (c) independent-reference checks of coordinates, the finite-value mask, physical values, and repeated file digests. The 1440 × 720 product contains 691,150 finite and 345,650 missing cells that match the independently decoded reference mask point by point, with a maximum absolute physical-value difference of zero and identical file digests across three runs.</w:t>
       </w:r>
@@ -4301,7 +4268,7 @@
       </w:pPr>
       <w:r>
         <w:rPr>
-          <w:rFonts w:ascii="Times New Roman" w:hAnsi="Times New Roman" w:eastAsia="宋体"/>
+          <w:rFonts w:ascii="Times New Roman" w:hAnsi="Times New Roman" w:eastAsia="Songti SC"/>
         </w:rPr>
         <w:t>4.2 ELEV与LAI的直接NetCDF分发效率</w:t>
       </w:r>
@@ -4309,65 +4276,29 @@
     <w:p>
       <w:r>
         <w:rPr>
-          <w:rFonts w:ascii="Times New Roman" w:hAnsi="Times New Roman" w:eastAsia="宋体"/>
-        </w:rPr>
-        <w:t>新版采用直接NetCDF作为分发制品。本研究以通过来源MD5与SHA-256校验的</w:t>
-      </w:r>
-      <w:r>
-        <w:rPr>
-          <w:rFonts w:ascii="Consolas" w:hAnsi="Consolas" w:eastAsia="等线"/>
-        </w:rPr>
-        <w:t>ELEV_4X_1Y_V1</w:t>
-      </w:r>
-      <w:r>
-        <w:rPr>
-          <w:rFonts w:ascii="Times New Roman" w:hAnsi="Times New Roman" w:eastAsia="宋体"/>
-        </w:rPr>
-        <w:t>和</w:t>
-      </w:r>
-      <w:r>
-        <w:rPr>
-          <w:rFonts w:ascii="Consolas" w:hAnsi="Consolas" w:eastAsia="等线"/>
-        </w:rPr>
-        <w:t>LAI_MODIS_2X_8D_2020_V1</w:t>
-      </w:r>
-      <w:r>
-        <w:rPr>
-          <w:rFonts w:ascii="Times New Roman" w:hAnsi="Times New Roman" w:eastAsia="宋体"/>
-        </w:rPr>
-        <w:t>评价分发效率，并在环境A（Windows）和环境B（macOS）中采用一致协议。两文件的</w:t>
-      </w:r>
-      <w:r>
-        <w:rPr>
-          <w:rFonts w:ascii="Consolas" w:hAnsi="Consolas" w:eastAsia="等线"/>
-        </w:rPr>
-        <w:t>data</w:t>
-      </w:r>
-      <w:r>
-        <w:rPr>
-          <w:rFonts w:ascii="Times New Roman" w:hAnsi="Times New Roman" w:eastAsia="宋体"/>
-        </w:rPr>
-        <w:t>变量均采用NetCDF内部zlib压缩级别4，对照归档采用gzip压缩级别6。回环HTTP条件下，各“数据×形式”组合经过缓存预热并按随机顺序重复10次，解包后内容均通过SHA-256校验。</w:t>
+          <w:rFonts w:ascii="Times New Roman" w:hAnsi="Times New Roman" w:eastAsia="Songti SC"/>
+        </w:rPr>
+        <w:t>按照第3.2节的相同输入和测量协议，环境A中直接NetCDF相对外层</w:t>
+      </w:r>
+      <w:r>
+        <w:rPr>
+          <w:rFonts w:ascii="Consolas" w:hAnsi="Consolas" w:eastAsia="Songti SC"/>
+        </w:rPr>
+        <w:t>tar.gz</w:t>
+      </w:r>
+      <w:r>
+        <w:rPr>
+          <w:rFonts w:ascii="Times New Roman" w:hAnsi="Times New Roman" w:eastAsia="Songti SC"/>
+        </w:rPr>
+        <w:t>将ELEV和LAI的端到端中位时间分别降低48.3%和82.9%；环境B中的相应降幅分别为53.6%和69.2%（图3）。两个数据文件的传输字节分别增加6.43%和2.16%，逻辑临时占用分别减少约48%和49%。80次SHA-256摘要核验结果一致。</w:t>
       </w:r>
     </w:p>
     <w:p>
       <w:r>
         <w:rPr>
-          <w:rFonts w:ascii="Times New Roman" w:hAnsi="Times New Roman" w:eastAsia="宋体"/>
-        </w:rPr>
-        <w:t>环境A中，直接NetCDF相对外层</w:t>
-      </w:r>
-      <w:r>
-        <w:rPr>
-          <w:rFonts w:ascii="Consolas" w:hAnsi="Consolas" w:eastAsia="等线"/>
-        </w:rPr>
-        <w:t>tar.gz</w:t>
-      </w:r>
-      <w:r>
-        <w:rPr>
-          <w:rFonts w:ascii="Times New Roman" w:hAnsi="Times New Roman" w:eastAsia="宋体"/>
-        </w:rPr>
-        <w:t>将ELEV和LAI的端到端中位时间分别降低48.3%和82.9%；环境B中的相应降幅分别为53.6%和69.2%。两个数据文件的传输字节分别增加6.43%和2.16%，逻辑临时占用分别减少约48%和49%。80次SHA-256摘要核验结果一致，体现了减少重复压缩、解包及临时文件共存对缩短数据访问路径的贡献。</w:t>
+          <w:rFonts w:ascii="Times New Roman" w:hAnsi="Times New Roman" w:eastAsia="Songti SC"/>
+        </w:rPr>
+        <w:t>两文件均已采用NetCDF内部zlib压缩级别4，对照归档采用gzip级别6。在所测文件和缓存预热条件下，直接NetCDF以较小的传输字节增量减少了解包及临时文件共存开销，缩短了从请求到首次读取数据的路径。</w:t>
       </w:r>
     </w:p>
     <w:p>
@@ -4415,26 +4346,26 @@
       </w:pPr>
       <w:r>
         <w:rPr>
-          <w:rFonts w:ascii="Times New Roman" w:hAnsi="Times New Roman" w:eastAsia="宋体"/>
+          <w:rFonts w:ascii="Times New Roman" w:hAnsi="Times New Roman" w:eastAsia="Songti SC"/>
           <w:b/>
         </w:rPr>
-        <w:t>图3 ELEV和LAI产品采用直接NetCDF与外层tar.gz分发的端到端时间比较</w:t>
-      </w:r>
-      <w:r>
-        <w:rPr>
-          <w:rFonts w:ascii="Times New Roman" w:hAnsi="Times New Roman" w:eastAsia="宋体"/>
-        </w:rPr>
-        <w:t xml:space="preserve"> （a）二维高程产品ELEV；（b）三维叶面积指数产品LAI。空心圆表示各组合的10次独立测量，柱高为缓存预热后端到端时间中位数，误差线为95% Bootstrap置信区间；环境A（Windows）和环境B（macOS）采用相同输入文件与测量协议。柱上百分比表示直接NetCDF相对于外层</w:t>
-      </w:r>
-      <w:r>
-        <w:rPr>
-          <w:rFonts w:ascii="Consolas" w:hAnsi="Consolas" w:eastAsia="等线"/>
+        <w:t>图3 ELEV和LAI数据集采用直接NetCDF与外层tar.gz分发的端到端时间比较</w:t>
+      </w:r>
+      <w:r>
+        <w:rPr>
+          <w:rFonts w:ascii="Times New Roman" w:hAnsi="Times New Roman" w:eastAsia="Songti SC"/>
+        </w:rPr>
+        <w:t xml:space="preserve"> （a）二维高程数据集ELEV；（b）三维叶面积指数数据集LAI。空心圆表示各组合的10次独立测量，柱高为缓存预热后端到端时间中位数，误差线为95% Bootstrap置信区间；环境A（Windows）和环境B（macOS）采用相同输入文件与测量协议。柱上百分比表示直接NetCDF相对于外层</w:t>
+      </w:r>
+      <w:r>
+        <w:rPr>
+          <w:rFonts w:ascii="Consolas" w:hAnsi="Consolas" w:eastAsia="Songti SC"/>
         </w:rPr>
         <w:t>tar.gz</w:t>
       </w:r>
       <w:r>
         <w:rPr>
-          <w:rFonts w:ascii="Times New Roman" w:hAnsi="Times New Roman" w:eastAsia="宋体"/>
+          <w:rFonts w:ascii="Times New Roman" w:hAnsi="Times New Roman" w:eastAsia="Songti SC"/>
         </w:rPr>
         <w:t>归档的中位时间降幅。</w:t>
       </w:r>
@@ -4445,26 +4376,26 @@
       </w:pPr>
       <w:r>
         <w:rPr>
-          <w:rFonts w:ascii="Times New Roman" w:hAnsi="Times New Roman" w:eastAsia="宋体"/>
+          <w:rFonts w:ascii="Times New Roman" w:hAnsi="Times New Roman" w:eastAsia="Songti SC"/>
           <w:b/>
         </w:rPr>
         <w:t>Fig. 3 End-to-end distribution time for the ELEV and LAI products using direct NetCDF and external `tar.gz` archives.</w:t>
       </w:r>
       <w:r>
         <w:rPr>
-          <w:rFonts w:ascii="Times New Roman" w:hAnsi="Times New Roman" w:eastAsia="宋体"/>
+          <w:rFonts w:ascii="Times New Roman" w:hAnsi="Times New Roman" w:eastAsia="Songti SC"/>
         </w:rPr>
         <w:t xml:space="preserve"> (a) The two-dimensional ELEV product; (b) the three-dimensional LAI product. Open circles show the 10 measurements for each combination, bars show median warm-cache end-to-end time, and error bars show 95% bootstrap confidence intervals. Environment A (Windows) and environment B (macOS) used identical input files and measurement protocols. Percentages above the bars indicate the reduction in median time achieved by direct NetCDF relative to external </w:t>
       </w:r>
       <w:r>
         <w:rPr>
-          <w:rFonts w:ascii="Consolas" w:hAnsi="Consolas" w:eastAsia="等线"/>
+          <w:rFonts w:ascii="Consolas" w:hAnsi="Consolas" w:eastAsia="Songti SC"/>
         </w:rPr>
         <w:t>tar.gz</w:t>
       </w:r>
       <w:r>
         <w:rPr>
-          <w:rFonts w:ascii="Times New Roman" w:hAnsi="Times New Roman" w:eastAsia="宋体"/>
+          <w:rFonts w:ascii="Times New Roman" w:hAnsi="Times New Roman" w:eastAsia="Songti SC"/>
         </w:rPr>
         <w:t xml:space="preserve"> archives.</w:t>
       </w:r>
@@ -4475,7 +4406,7 @@
       </w:pPr>
       <w:r>
         <w:rPr>
-          <w:rFonts w:ascii="Times New Roman" w:hAnsi="Times New Roman" w:eastAsia="宋体"/>
+          <w:rFonts w:ascii="Times New Roman" w:hAnsi="Times New Roman" w:eastAsia="Songti SC"/>
         </w:rPr>
         <w:t>4.3 目录管理与事务式多镜像分发</w:t>
       </w:r>
@@ -4483,15 +4414,15 @@
     <w:p>
       <w:r>
         <w:rPr>
-          <w:rFonts w:ascii="Times New Roman" w:hAnsi="Times New Roman" w:eastAsia="宋体"/>
-        </w:rPr>
-        <w:t>目录与数据获取模块将目录初始化、事务更新、产品同步、镜像获取、状态查询和历史数据整理组织为统一的数据维护接口。独立目录使数据产品能够随镜像和版本持续更新，事务缓存区与正式数据区的分层机制则将传输过程与标准产品分离，使上一有效目录和已发布产品在目录更新与镜像切换过程中保持稳定。</w:t>
+          <w:rFonts w:ascii="Times New Roman" w:hAnsi="Times New Roman" w:eastAsia="Songti SC"/>
+        </w:rPr>
+        <w:t>目录与数据获取模块将目录初始化、事务更新、数据集同步、镜像获取、状态查询和历史数据整理组织为统一的数据维护接口。独立目录使数据集能够随镜像和版本持续更新，事务缓存区与正式数据区的分层机制则将传输过程与标准化数据分离，使上一有效目录和已发布数据集在目录更新与镜像切换过程中保持稳定。</w:t>
       </w:r>
     </w:p>
     <w:p>
       <w:r>
         <w:rPr>
-          <w:rFonts w:ascii="Times New Roman" w:hAnsi="Times New Roman" w:eastAsia="宋体"/>
+          <w:rFonts w:ascii="Times New Roman" w:hAnsi="Times New Roman" w:eastAsia="Songti SC"/>
         </w:rPr>
         <w:t>13类受控状态场景在两个独立操作系统环境中分别重复5次，共形成130次获取记录。在具有可用延迟分数的场景中，目录与数据获取模块按照延迟辅助排序候选，并在首选镜像访问或内容校验状态变化时依次遍历其余地址。每次获取采用独立临时文件，内容经字节数和SHA-256确认后进入正式路径；所有记录均完成临时文件回收，既有正式文件摘要保持一致。</w:t>
       </w:r>
@@ -4499,7 +4430,7 @@
     <w:p>
       <w:r>
         <w:rPr>
-          <w:rFonts w:ascii="Times New Roman" w:hAnsi="Times New Roman" w:eastAsia="宋体"/>
+          <w:rFonts w:ascii="Times New Roman" w:hAnsi="Times New Roman" w:eastAsia="Songti SC"/>
         </w:rPr>
         <w:t>在校外公共网络观测中，两个独立环境分别对4个Zenodo标签重复获取3次，共形成24次下载记录，全部达到登记字节数并通过SHA-256核验。下载时间随文件规模呈梯度变化，重复传输的SHA-256摘要与目录登记值一致，体现了公共镜像、事务式获取和完整性校验的协同作用。</w:t>
       </w:r>
@@ -4507,51 +4438,51 @@
     <w:p>
       <w:r>
         <w:rPr>
-          <w:rFonts w:ascii="Times New Roman" w:hAnsi="Times New Roman" w:eastAsia="宋体"/>
-        </w:rPr>
-        <w:t>校园网双镜像实验是另一组独立记录：4个产品分别从FTP和Zenodo重复获取3次，两类镜像各形成12次下载，共24次结果，均达到登记字节数并通过SHA-256核验。在本组校园网观测中，延迟辅助排序与实际传输顺序一致，机构镜像与公共镜像提供了内容一致的分发副本；分产品传输时间与网络记录列于补充材料。</w:t>
+          <w:rFonts w:ascii="Times New Roman" w:hAnsi="Times New Roman" w:eastAsia="Songti SC"/>
+        </w:rPr>
+        <w:t>校园网双镜像实验是另一组独立记录：4个数据集分别从FTP和Zenodo重复获取3次，两类镜像各形成12次下载，共24次结果，均达到登记字节数并通过SHA-256核验。在本组校园网观测中，延迟辅助排序与实际传输顺序一致，机构镜像与公共镜像提供了内容一致的分发副本；分数据集传输时间与网络记录列于补充材料。</w:t>
       </w:r>
     </w:p>
     <w:p>
       <w:r>
         <w:rPr>
-          <w:rFonts w:ascii="Times New Roman" w:hAnsi="Times New Roman" w:eastAsia="宋体"/>
+          <w:rFonts w:ascii="Times New Roman" w:hAnsi="Times New Roman" w:eastAsia="Songti SC"/>
         </w:rPr>
         <w:t>ERA5降水数据的单位修订进一步呈现逻辑标签与物理文件的解耦：逻辑标签</w:t>
       </w:r>
       <w:r>
         <w:rPr>
-          <w:rFonts w:ascii="Consolas" w:hAnsi="Consolas" w:eastAsia="等线"/>
+          <w:rFonts w:ascii="Consolas" w:hAnsi="Consolas" w:eastAsia="Songti SC"/>
         </w:rPr>
         <w:t>PPT_ERA5_1X_1H_2020_V1</w:t>
       </w:r>
       <w:r>
         <w:rPr>
-          <w:rFonts w:ascii="Times New Roman" w:hAnsi="Times New Roman" w:eastAsia="宋体"/>
+          <w:rFonts w:ascii="Times New Roman" w:hAnsi="Times New Roman" w:eastAsia="Songti SC"/>
         </w:rPr>
         <w:t>保持稳定，目录将其物理URL指向</w:t>
       </w:r>
       <w:r>
         <w:rPr>
-          <w:rFonts w:ascii="Consolas" w:hAnsi="Consolas" w:eastAsia="等线"/>
+          <w:rFonts w:ascii="Consolas" w:hAnsi="Consolas" w:eastAsia="Songti SC"/>
         </w:rPr>
         <w:t>V1_R1.nc</w:t>
       </w:r>
       <w:r>
         <w:rPr>
-          <w:rFonts w:ascii="Times New Roman" w:hAnsi="Times New Roman" w:eastAsia="宋体"/>
+          <w:rFonts w:ascii="Times New Roman" w:hAnsi="Times New Roman" w:eastAsia="Songti SC"/>
         </w:rPr>
         <w:t>并登记新的</w:t>
       </w:r>
       <w:r>
         <w:rPr>
-          <w:rFonts w:ascii="Consolas" w:hAnsi="Consolas" w:eastAsia="等线"/>
+          <w:rFonts w:ascii="Consolas" w:hAnsi="Consolas" w:eastAsia="Songti SC"/>
         </w:rPr>
         <w:t>SIZE</w:t>
       </w:r>
       <w:r>
         <w:rPr>
-          <w:rFonts w:ascii="Times New Roman" w:hAnsi="Times New Roman" w:eastAsia="宋体"/>
+          <w:rFonts w:ascii="Times New Roman" w:hAnsi="Times New Roman" w:eastAsia="Songti SC"/>
         </w:rPr>
         <w:t>与SHA-256，V1和V1_R1文件以不同后缀并行保留。空缓存Collector实例按V1逻辑标签获取R1文件并通过完整性核验，第二次调用直接复用正式缓存。该案例表明，目录更新能够承接数据修订，同时保持下游逻辑标签和调用接口稳定。</w:t>
       </w:r>
@@ -4562,7 +4493,7 @@
       </w:pPr>
       <w:r>
         <w:rPr>
-          <w:rFonts w:ascii="Times New Roman" w:hAnsi="Times New Roman" w:eastAsia="宋体"/>
+          <w:rFonts w:ascii="Times New Roman" w:hAnsi="Times New Roman" w:eastAsia="Songti SC"/>
         </w:rPr>
         <w:t>4.4 统一读取与模式输入组织</w:t>
       </w:r>
@@ -4570,85 +4501,85 @@
     <w:p>
       <w:r>
         <w:rPr>
-          <w:rFonts w:ascii="Times New Roman" w:hAnsi="Times New Roman" w:eastAsia="宋体"/>
-        </w:rPr>
-        <w:t>陆面案例使用2020年第二套陆面参数集合的14类标准产品，文件大小、来源摘要和SHA-256均通过核验。US-NR1站点映射至40.5°N、105.5°W的规则格点，参数融合接口组织34个模型字段、366日季节序列、4个土壤层和17个植物功能型，高程、陆地掩膜与叶面积指数得到一致读取。撒哈拉案例被识别为非植被格点并进入相应的陆面状态分流，体现了参数组织前的场景识别能力。该参数集合由此贯通完整性目录、统一读取和陆面参数组织，并覆盖植被与非植被场景。</w:t>
+          <w:rFonts w:ascii="Times New Roman" w:hAnsi="Times New Roman" w:eastAsia="Songti SC"/>
+        </w:rPr>
+        <w:t>陆面案例使用2020年第二套陆面参数集合的14类标准化数据，文件大小、来源摘要和SHA-256均通过核验。US-NR1站点映射至40.5°N、105.5°W的规则格点，参数融合接口组织34个模式字段、366日季节序列、4个土壤层和17个植物功能型，高程、陆地掩膜与叶面积指数得到一致读取。撒哈拉案例被识别为非植被格点并进入相应的陆面状态分流，体现了参数组织前的场景识别能力。该参数集合由此贯通完整性目录、统一读取和陆面参数组织，并覆盖植被与非植被场景。</w:t>
       </w:r>
     </w:p>
     <w:p>
       <w:r>
         <w:rPr>
-          <w:rFonts w:ascii="Times New Roman" w:hAnsi="Times New Roman" w:eastAsia="宋体"/>
-        </w:rPr>
-        <w:t>真实气象案例读取2020年8类ERA5标准产品，八文件合计12 575 376 138字节；各</w:t>
-      </w:r>
-      <w:r>
-        <w:rPr>
-          <w:rFonts w:ascii="Consolas" w:hAnsi="Consolas" w:eastAsia="等线"/>
+          <w:rFonts w:ascii="Times New Roman" w:hAnsi="Times New Roman" w:eastAsia="Songti SC"/>
+        </w:rPr>
+        <w:t>真实气象案例读取2020年8类ERA5标准化数据，八文件合计12 575 376 138字节；各</w:t>
+      </w:r>
+      <w:r>
+        <w:rPr>
+          <w:rFonts w:ascii="Consolas" w:hAnsi="Consolas" w:eastAsia="Songti SC"/>
         </w:rPr>
         <w:t>data</w:t>
       </w:r>
       <w:r>
         <w:rPr>
-          <w:rFonts w:ascii="Times New Roman" w:hAnsi="Times New Roman" w:eastAsia="宋体"/>
+          <w:rFonts w:ascii="Times New Roman" w:hAnsi="Times New Roman" w:eastAsia="Songti SC"/>
         </w:rPr>
         <w:t>变量均为</w:t>
       </w:r>
       <w:r>
         <w:rPr>
-          <w:rFonts w:ascii="Consolas" w:hAnsi="Consolas" w:eastAsia="等线"/>
+          <w:rFonts w:ascii="Consolas" w:hAnsi="Consolas" w:eastAsia="Songti SC"/>
         </w:rPr>
         <w:t>lon×lat×ind</w:t>
       </w:r>
       <w:r>
         <w:rPr>
-          <w:rFonts w:ascii="Times New Roman" w:hAnsi="Times New Roman" w:eastAsia="宋体"/>
+          <w:rFonts w:ascii="Times New Roman" w:hAnsi="Times New Roman" w:eastAsia="Songti SC"/>
         </w:rPr>
         <w:t>、360×180×8784，并带有单位属性。US-NR1格点的地表气压、降水、漫射与直射短波辐射、长波辐射、气温、水汽压亏缺和风速均得到8784个逐小时值，有限值比例均为100%；模式输入组织层输出与底层NetCDF逐点读取的8个字段最大绝对差均为0。按站点经度计算的时区偏移为−7.0364 h，</w:t>
       </w:r>
       <w:r>
         <w:rPr>
-          <w:rFonts w:ascii="Consolas" w:hAnsi="Consolas" w:eastAsia="等线"/>
+          <w:rFonts w:ascii="Consolas" w:hAnsi="Consolas" w:eastAsia="Songti SC"/>
         </w:rPr>
         <w:t>FDOY</w:t>
       </w:r>
       <w:r>
         <w:rPr>
-          <w:rFonts w:ascii="Times New Roman" w:hAnsi="Times New Roman" w:eastAsia="宋体"/>
+          <w:rFonts w:ascii="Times New Roman" w:hAnsi="Times New Roman" w:eastAsia="Songti SC"/>
         </w:rPr>
         <w:t>严格递增且与独立公式逐点一致。气象驱动组织形成</w:t>
       </w:r>
       <w:r>
         <w:rPr>
-          <w:rFonts w:ascii="Consolas" w:hAnsi="Consolas" w:eastAsia="等线"/>
+          <w:rFonts w:ascii="Consolas" w:hAnsi="Consolas" w:eastAsia="Songti SC"/>
         </w:rPr>
         <w:t>FDOY</w:t>
       </w:r>
       <w:r>
         <w:rPr>
-          <w:rFonts w:ascii="Times New Roman" w:hAnsi="Times New Roman" w:eastAsia="宋体"/>
-        </w:rPr>
-        <w:t>和8类气象共9个字段，Emerald适配后扩展为16个模型驱动字段；真实陆面参数与真实气象共同完成模型初始化和60 s首步计算，大气与土壤关键状态均保持有限值。</w:t>
+          <w:rFonts w:ascii="Times New Roman" w:hAnsi="Times New Roman" w:eastAsia="Songti SC"/>
+        </w:rPr>
+        <w:t>和8类气象共9个字段，Emerald适配后扩展为16个模式驱动字段；真实陆面参数与真实气象共同完成模式初始化和60 s首步计算，大气与土壤关键状态均保持有限值。</w:t>
       </w:r>
     </w:p>
     <w:p>
       <w:r>
         <w:rPr>
-          <w:rFonts w:ascii="Times New Roman" w:hAnsi="Times New Roman" w:eastAsia="宋体"/>
-        </w:rPr>
-        <w:t>量纲审计进一步表明，PPT全年累计值为0.496409 m水层，即496.409 mm。该数值尺度与ERA5逐小时累计降水的米制表达[11]及Emerald由水层厚度转换为摩尔通量的适配关系一致。据此，标准NetCDF中的降水单位属性统一为</w:t>
-      </w:r>
-      <w:r>
-        <w:rPr>
-          <w:rFonts w:ascii="Consolas" w:hAnsi="Consolas" w:eastAsia="等线"/>
+          <w:rFonts w:ascii="Times New Roman" w:hAnsi="Times New Roman" w:eastAsia="Songti SC"/>
+        </w:rPr>
+        <w:t>量纲审计进一步表明，PPT全年累计值为0.496409 m水层，即496.409 mm。该数值尺度与ERA5逐小时累计降水的米制表达[8]及Emerald由水层厚度转换为摩尔通量的适配关系一致。据此，标准NetCDF中的降水单位属性统一为</w:t>
+      </w:r>
+      <w:r>
+        <w:rPr>
+          <w:rFonts w:ascii="Consolas" w:hAnsi="Consolas" w:eastAsia="Songti SC"/>
         </w:rPr>
         <w:t>m</w:t>
       </w:r>
       <w:r>
         <w:rPr>
-          <w:rFonts w:ascii="Times New Roman" w:hAnsi="Times New Roman" w:eastAsia="宋体"/>
-        </w:rPr>
-        <w:t>，使数据元信息、数值尺度和模型换算形成一致的量纲链条。真实年度案例由此覆盖格点提取、时间轴构建、量纲衔接和模型首步计算等主要接口环节。</w:t>
+          <w:rFonts w:ascii="Times New Roman" w:hAnsi="Times New Roman" w:eastAsia="Songti SC"/>
+        </w:rPr>
+        <w:t>，使数据元信息、数值尺度和模式换算形成一致的量纲链条。真实年度案例由此覆盖格点提取、时间轴构建、量纲衔接和模式首步计算等主要接口环节。</w:t>
       </w:r>
     </w:p>
     <w:p>
@@ -4657,7 +4588,7 @@
       </w:pPr>
       <w:r>
         <w:rPr>
-          <w:rFonts w:ascii="Times New Roman" w:hAnsi="Times New Roman" w:eastAsia="宋体"/>
+          <w:rFonts w:ascii="Times New Roman" w:hAnsi="Times New Roman" w:eastAsia="Songti SC"/>
         </w:rPr>
         <w:t>4.5 跨操作系统运行一致性结果</w:t>
       </w:r>
@@ -4665,17 +4596,17 @@
     <w:p>
       <w:r>
         <w:rPr>
-          <w:rFonts w:ascii="Times New Roman" w:hAnsi="Times New Roman" w:eastAsia="宋体"/>
-        </w:rPr>
-        <w:t>Windows、macOS和Linux持续集成环境分别完成29组非交互生产实例、40次确定性分发测量和65次镜像状态核对，产品结构、逐点数值、SHA-256摘要、正式文件状态和临时文件回收结果一致。GriddingMachine与GriddingMachineDatasets核心功能以及Emerald合成输入最小接口也在三个系统环境中完成，呈现固定依赖下核心数据路径的跨系统一致性。</w:t>
+          <w:rFonts w:ascii="Times New Roman" w:hAnsi="Times New Roman" w:eastAsia="Songti SC"/>
+        </w:rPr>
+        <w:t>Windows、macOS和Linux持续集成环境分别完成29组非交互生产实例、40次确定性分发测量和65次镜像状态核对，数据集结构、逐点数值、SHA-256摘要、正式文件状态和临时文件回收结果一致。GriddingMachine与GriddingMachineDatasets核心功能以及Emerald合成输入最小接口也在三个系统环境中完成，呈现固定依赖下核心数据路径的跨系统一致性。</w:t>
       </w:r>
     </w:p>
     <w:p>
       <w:r>
         <w:rPr>
-          <w:rFonts w:ascii="Times New Roman" w:hAnsi="Times New Roman" w:eastAsia="宋体"/>
-        </w:rPr>
-        <w:t>Windows和macOS本地环境进一步完成ELEV/LAI性能测量及镜像故障场景，独立公共网络记录完成Zenodo内容核验；校园网环境完成FTP—Zenodo同文件对照，US-NR1案例完成真实陆面与气象产品的模式输入组织。持续集成、独立环境观测和真实数据案例共同构成分层复现证据，具体系统—模块对应关系列于补充材料S5。</w:t>
+          <w:rFonts w:ascii="Times New Roman" w:hAnsi="Times New Roman" w:eastAsia="Songti SC"/>
+        </w:rPr>
+        <w:t>Windows和macOS本地环境进一步完成ELEV/LAI性能测量及镜像故障场景，独立公共网络记录完成Zenodo内容核验；校园网环境完成FTP—Zenodo同文件对照，US-NR1案例完成真实陆面与气象数据集的模式输入组织。持续集成、独立环境观测和真实数据案例共同构成分层复现证据，具体系统—模块对应关系列于补充材料S5。</w:t>
       </w:r>
     </w:p>
     <w:p>
@@ -4684,7 +4615,7 @@
       </w:pPr>
       <w:r>
         <w:rPr>
-          <w:rFonts w:ascii="Times New Roman" w:hAnsi="Times New Roman" w:eastAsia="宋体"/>
+          <w:rFonts w:ascii="Times New Roman" w:hAnsi="Times New Roman" w:eastAsia="Songti SC"/>
         </w:rPr>
         <w:t>5 讨论</w:t>
       </w:r>
@@ -4695,25 +4626,25 @@
       </w:pPr>
       <w:r>
         <w:rPr>
-          <w:rFonts w:ascii="Times New Roman" w:hAnsi="Times New Roman" w:eastAsia="宋体"/>
-        </w:rPr>
-        <w:t>5.1 从统一产品标准到可执行数据生命周期</w:t>
+          <w:rFonts w:ascii="Times New Roman" w:hAnsi="Times New Roman" w:eastAsia="Songti SC"/>
+        </w:rPr>
+        <w:t>5.1 相对2022版的更新与科研用途</w:t>
       </w:r>
     </w:p>
     <w:p>
       <w:r>
         <w:rPr>
-          <w:rFonts w:ascii="Times New Roman" w:hAnsi="Times New Roman" w:eastAsia="宋体"/>
-        </w:rPr>
-        <w:t>2022版GriddingMachine已经建立统一网格、变量约定、标签化数据访问以及基于artifact的数据管理[4]。新版进一步把分布于数据源专用处理、软件内置目录和下游调用中的维护单元组织为三个相互衔接的层次：共享YAML契约显式描述异构源到标准产品的转换规则，独立目录维护标准产品的逻辑标识、镜像和完整性元数据，统一读取与模式输入层围绕稳定标签组织下游使用。数据处理规则、产品目录和访问软件由此能够在共同约定下分别更新，并通过标准产品和标签保持连续对应。</w:t>
+          <w:rFonts w:ascii="Times New Roman" w:hAnsi="Times New Roman" w:eastAsia="Songti SC"/>
+        </w:rPr>
+        <w:t>2022版GriddingMachine已建立统一网格、变量约定、标签访问和多语言接口[4]。本轮更新进一步把数据源专用处理规则整理为共享配置，将数据目录与软件包分开维护，并将标准网格读取延伸到陆面参数和气象驱动组织。其科研用途在于减少不同数据集和模式之间重复编写转换、下载与接口程序的工作，使数据修订能够在明确的配置、目录和文件记录下进行。</w:t>
       </w:r>
     </w:p>
     <w:p>
       <w:r>
         <w:rPr>
-          <w:rFonts w:ascii="Times New Roman" w:hAnsi="Times New Roman" w:eastAsia="宋体"/>
-        </w:rPr>
-        <w:t>OISST案例说明了这种重构在数据生产与标准化层的具体作用。源变量的单例维度、存储缩放和经度范围由源适配与共享配置共同表达，输出通过独立解码参考核对坐标、有效值掩膜和逐点物理值。31组受控实例解析维度、坐标、数值和Gapfill等基本操作的确定性表现，真实OISST呈现这些机制在实际异构产品中的组合路径。由此，新版将处理规则显式化为可执行、可核对的生产契约，并把标准化流程从数据源专用实现提升为可复用的数据生产方法。</w:t>
+          <w:rFonts w:ascii="Times New Roman" w:hAnsi="Times New Roman" w:eastAsia="Songti SC"/>
+        </w:rPr>
+        <w:t>OISST案例说明，共享流程可以通过源适配器处理单例维度、存储缩放和经度范围差异，并保留与独立参考逐点核对的路径。ERA5降水修订则表明，逻辑标签可以继续供下游调用，实际文件位置和完整性信息在目录中更新。为重现某次模式计算，研究人员需要同时保存当时的目录、文件摘要和代码版本；稳定标签用于简化调用，版本记录用于确定实际使用的数据。</w:t>
       </w:r>
     </w:p>
     <w:p>
@@ -4722,57 +4653,25 @@
       </w:pPr>
       <w:r>
         <w:rPr>
-          <w:rFonts w:ascii="Times New Roman" w:hAnsi="Times New Roman" w:eastAsia="宋体"/>
-        </w:rPr>
-        <w:t>5.2 直接NetCDF分发与完整性保证的重新建立</w:t>
+          <w:rFonts w:ascii="Times New Roman" w:hAnsi="Times New Roman" w:eastAsia="Songti SC"/>
+        </w:rPr>
+        <w:t>5.2 分发效率与科学数据质量</w:t>
       </w:r>
     </w:p>
     <w:p>
       <w:r>
         <w:rPr>
-          <w:rFonts w:ascii="Times New Roman" w:hAnsi="Times New Roman" w:eastAsia="宋体"/>
-        </w:rPr>
-        <w:t>直接NetCDF简化了标准文件外层</w:t>
-      </w:r>
-      <w:r>
-        <w:rPr>
-          <w:rFonts w:ascii="Consolas" w:hAnsi="Consolas" w:eastAsia="等线"/>
-        </w:rPr>
-        <w:t>tar.gz</w:t>
-      </w:r>
-      <w:r>
-        <w:rPr>
-          <w:rFonts w:ascii="Times New Roman" w:hAnsi="Times New Roman" w:eastAsia="宋体"/>
-        </w:rPr>
-        <w:t>的打包和解包步骤。ELEV和LAI已经采用NetCDF内部压缩，外层归档仅减少2.16%～6.43%的传输字节；直接NetCDF在两个独立环境中均缩短了缓存预热后的端到端时间，并将逻辑临时占用降低约一半。对于下载后立即读取的单体NetCDF，分发单元由此能够综合优化传输字节、解包开销和首次读取路径，为内部压缩产品提供更直接的数据访问方式。</w:t>
+          <w:rFonts w:ascii="Times New Roman" w:hAnsi="Times New Roman" w:eastAsia="Songti SC"/>
+        </w:rPr>
+        <w:t>直接NetCDF减少了单文件外层打包和解包的步骤。对于本文测试的两个内部压缩文件，直接分发虽然增加少量传输字节，但减少了临时占用并缩短缓存预热后的端到端访问时间。这一结果适用于所测文件与协议；其他文件规模、压缩程度和网络带宽下的收益取决于传输与解包开销的相对大小。选择分发方式时，应同时考虑传输量、首次读取时间和本地存储需求。</w:t>
       </w:r>
     </w:p>
     <w:p>
       <w:r>
         <w:rPr>
-          <w:rFonts w:ascii="Times New Roman" w:hAnsi="Times New Roman" w:eastAsia="宋体"/>
-        </w:rPr>
-        <w:t>直接NetCDF路径同时以显式完整性记录承接旧版artifact封装提供的内容约束。新版目录生成器从权威标准文件计算并记录</w:t>
-      </w:r>
-      <w:r>
-        <w:rPr>
-          <w:rFonts w:ascii="Consolas" w:hAnsi="Consolas" w:eastAsia="等线"/>
-        </w:rPr>
-        <w:t>SIZE</w:t>
-      </w:r>
-      <w:r>
-        <w:rPr>
-          <w:rFonts w:ascii="Times New Roman" w:hAnsi="Times New Roman" w:eastAsia="宋体"/>
-        </w:rPr>
-        <w:t>和SHA-256；每个镜像下载到独立临时文件，字节数和摘要与目录一致后进入正式路径。13类受控状态场景刻画回退、内容变化和缓存条件下的事务行为，真实Zenodo及校园网FTP—Zenodo记录表明代表性网络副本与目录登记内容一致。分发效率与事务式完整性机制由此共同构成新版分发架构的两项互补改进。</w:t>
-      </w:r>
-    </w:p>
-    <w:p>
-      <w:r>
-        <w:rPr>
-          <w:rFonts w:ascii="Times New Roman" w:hAnsi="Times New Roman" w:eastAsia="宋体"/>
-        </w:rPr>
-        <w:t>ERA5降水V1→V1_R1修订展示了独立目录的另一项作用：模型侧继续使用稳定逻辑标签，物理文件、URL及完整性摘要在目录层更新。目录记录与带修订后缀的文件共同保留版本关系，使数据修订与下游接口保持解耦，并由新的摘要锁定修订后的文件内容。</w:t>
+          <w:rFonts w:ascii="Times New Roman" w:hAnsi="Times New Roman" w:eastAsia="Songti SC"/>
+        </w:rPr>
+        <w:t>数据质量检查与下载完整性核验分别解决两个问题：前者检查维度、坐标、物理值、单位和缺失值处理是否符合数据约定，后者检查收到的文件是否与目录登记内容一致。OISST的独立解码比较和ERA5降水单位修订分别体现了数值与量纲检查的作用；受控镜像场景和真实网络下载记录则检验了文件获取的一致性。将两类检查串联，才能从源数据处理一直追溯到科研程序实际读取的文件。</w:t>
       </w:r>
     </w:p>
     <w:p>
@@ -4781,25 +4680,25 @@
       </w:pPr>
       <w:r>
         <w:rPr>
-          <w:rFonts w:ascii="Times New Roman" w:hAnsi="Times New Roman" w:eastAsia="宋体"/>
-        </w:rPr>
-        <w:t>5.3 科学质量控制与内容完整性的协同</w:t>
+          <w:rFonts w:ascii="Times New Roman" w:hAnsi="Times New Roman" w:eastAsia="Songti SC"/>
+        </w:rPr>
+        <w:t>5.3 从标准网格数据到模式输入</w:t>
       </w:r>
     </w:p>
     <w:p>
       <w:r>
         <w:rPr>
-          <w:rFonts w:ascii="Times New Roman" w:hAnsi="Times New Roman" w:eastAsia="宋体"/>
-        </w:rPr>
-        <w:t>生产质量控制与分发完整性核验形成互补。数据生产与标准化层通过维度、坐标方向、变量、数值范围、Gapfill、空间方向图和独立参考等检查，确认标准数据符合声明的处理规则；数据目录与可信分发层通过文件字节数和SHA-256确认下载对象与目录登记的标准文件内容一致。源数据属性、处理规则、变量物理意义和量纲继续在数据生产与标准化层与模式输入组织层接受对应检查。OISST的逐点独立参考和ERA5降水单位修订体现了两类机制在数据生命周期中的协同作用。</w:t>
+          <w:rFonts w:ascii="Times New Roman" w:hAnsi="Times New Roman" w:eastAsia="Songti SC"/>
+        </w:rPr>
+        <w:t>统一NetCDF格式为数据复用提供基础，模式运行还需要格点对应、参数字段组合、时间轴构建和单位换算。US-NR1案例中，多类陆面数据和逐时气象驱动经过这些步骤形成Emerald所需的输入，应用层字段与底层读取逐点一致，并完成初始化与60 s首步计算。这些结果验证了本文数据组织方法与既定模式接口的衔接。</w:t>
       </w:r>
     </w:p>
     <w:p>
       <w:r>
         <w:rPr>
-          <w:rFonts w:ascii="Times New Roman" w:hAnsi="Times New Roman" w:eastAsia="宋体"/>
-        </w:rPr>
-        <w:t>本文以“可信分发”概括标准产品标识和内容完整性可核验的分发机制。多镜像提供获取路径冗余，候选顺序组织尝试过程，完整性元数据确保正式目录接收与登记产品一致的文件。校园网实验进一步呈现FTP与Zenodo等价副本在真实网络路径中的内容一致性。</w:t>
+          <w:rFonts w:ascii="Times New Roman" w:hAnsi="Times New Roman" w:eastAsia="Songti SC"/>
+        </w:rPr>
+        <w:t>这一流程可作为其他站点、年份和模式的数据接入参考。迁移时应根据目标模式重新确认空间代表性、时间分辨率、变量定义和单位关系；长期模拟与观测比较则用于进一步评价模式运行效果。Julia主流程与非Julia下载入口分别服务输入组织和跨语言文件获取，研究人员可按已有科研程序的需求选择调用方式。</w:t>
       </w:r>
     </w:p>
     <w:p>
@@ -4808,71 +4707,41 @@
       </w:pPr>
       <w:r>
         <w:rPr>
-          <w:rFonts w:ascii="Times New Roman" w:hAnsi="Times New Roman" w:eastAsia="宋体"/>
-        </w:rPr>
-        <w:t>5.4 从标准产品到模式输入：接口层面的“模型就绪”</w:t>
+          <w:rFonts w:ascii="Times New Roman" w:hAnsi="Times New Roman" w:eastAsia="Songti SC"/>
+        </w:rPr>
+        <w:t>5.4 与相关数据基础设施的关系及扩展方向</w:t>
       </w:r>
     </w:p>
     <w:p>
       <w:r>
         <w:rPr>
-          <w:rFonts w:ascii="Times New Roman" w:hAnsi="Times New Roman" w:eastAsia="宋体"/>
-        </w:rPr>
-        <w:t>标准化NetCDF是模式输入组织的起点。地球系统模式还需要把多个产品映射到共同格点，组合参数字段，建立时间轴，并衔接变量单位和模型接口所需的数据结构。US-NR1案例中，14类陆面产品形成34个模型字段，8类ERA5产品形成8784步逐时气象序列；模式输入组织层字段与底层NetCDF逐点一致，FDOY与独立时间公式一致，降水单位与模型水量换算相衔接。真实陆面参数和气象驱动随后完成Emerald初始化和60 s首步计算。</w:t>
+          <w:rFonts w:ascii="Times New Roman" w:hAnsi="Times New Roman" w:eastAsia="Songti SC"/>
+        </w:rPr>
+        <w:t>NetCDF/CF提供多维数据表达与元数据约定[2,5]，地球系统数据立方体强调多变量时空数据的联合组织与分析[9]。GriddingMachine在这些基础上固定规则网格、变量命名和数据标签，使不同来源的数据能够进入一致的本地读取流程。其核心实现使用Julia[10]，通过可组合的数据处理与读取接口连接标准化过程和模式程序。</w:t>
       </w:r>
     </w:p>
     <w:p>
       <w:r>
         <w:rPr>
-          <w:rFonts w:ascii="Times New Roman" w:hAnsi="Times New Roman" w:eastAsia="宋体"/>
-        </w:rPr>
-        <w:t>这些结果体现了模型就绪数据在字段组织、时间轴、量纲衔接和接口运行上的完整路径。本文将“模型就绪”定义为：标准产品经过格点索引、字段组织、时间轴构建和量纲衔接后，形成满足Emerald初始化接口的数据结构。以US-NR1年度案例为基础，相同接口可进一步服务多区域、多年份、不同生态区和长期模型积分。</w:t>
+          <w:rFonts w:ascii="Times New Roman" w:hAnsi="Times New Roman" w:eastAsia="Songti SC"/>
+        </w:rPr>
+        <w:t>Google Earth Engine侧重云端遥感数据访问与计算[3]，ESGF侧重分布式气候模式数据发现和访问[11]，Pangeo及Pangeo Forge支持云端数据组织与可复用的处理配方[12,13]。GriddingMachine面向固定版本、离线缓存和本地模式调用，利用共享配置、数据目录和模式输入接口衔接这些环节。与上述平台的关系主要体现为科研工作流中的分工；本文的本地分发实验也不构成与云端平台的性能比较。</w:t>
       </w:r>
     </w:p>
     <w:p>
-      <w:pPr>
-        <w:pStyle w:val="Heading2"/>
-      </w:pPr>
-      <w:r>
-        <w:rPr>
-          <w:rFonts w:ascii="Times New Roman" w:hAnsi="Times New Roman" w:eastAsia="宋体"/>
-        </w:rPr>
-        <w:t>5.5 跨操作系统运行一致性与相关基础设施定位</w:t>
+      <w:r>
+        <w:rPr>
+          <w:rFonts w:ascii="Times New Roman" w:hAnsi="Times New Roman" w:eastAsia="Songti SC"/>
+        </w:rPr>
+        <w:t>国内地球系统科学数据共享研究强调规范分类和目录建设[14]；Pooch提供科研文件获取与管理工具[15]，STAC提供地理空间数据的目录描述规范[16]。GriddingMachine进一步约定标准网格数据和模式输入的组织方式，为模式研究中的多源数据组合提供统一入口。后续可在保留现有读取方式的同时，加强与通用目录和数据获取工具的衔接。</w:t>
       </w:r>
     </w:p>
     <w:p>
       <w:r>
         <w:rPr>
-          <w:rFonts w:ascii="Times New Roman" w:hAnsi="Times New Roman" w:eastAsia="宋体"/>
-        </w:rPr>
-        <w:t>Windows、macOS和Linux持续集成呈现固定依赖条件下核心数据逻辑的跨操作系统一致性。持续集成覆盖确定性的生产、分发和接口路径，独立环境用于测量性能与镜像状态，真实网络及US-NR1案例呈现实际数据流。核心逻辑、实际性能和真实应用相互补充，形成从软件实现到地学产品及模型接口的分层复现体系。</w:t>
-      </w:r>
-    </w:p>
-    <w:p>
-      <w:r>
-        <w:rPr>
-          <w:rFonts w:ascii="Times New Roman" w:hAnsi="Times New Roman" w:eastAsia="宋体"/>
-        </w:rPr>
-        <w:t>从基础设施定位看，NetCDF/CF支持多维科学数据的表示与语义约定[2,5]，Earth Engine强调云端地理空间数据计算[3]，ESGF支撑分布式气候模式数据发现与访问[12]，Pangeo及Pangeo Forge侧重云优化数据和可复用生产配方[13-14]。国内地球系统科学数据共享研究同样强调目录体系与规范分类对跨团队复用的作用[15]；Pooch与STAC分别提供文件获取注册和广义地理空间资产描述[16-17]。FAIR4RS原则强调研究软件的持续演化和版本记录[18]，TRUST原则强调数字资源库的透明度与技术能力[19]，国家科学数据中心的FAIR实践进一步展示了标准化元数据和清晰使用信息的重要性[20]。GriddingMachine面向全球规则网格产品进入Julia模型工作流的应用场景，以稳定标签连接机构存储、公共镜像、离线缓存和模式输入，其特色是将上游生产契约、标准NetCDF、轻量目录、事务式多镜像获取和下游模型字段组织纳入同一生命周期。</w:t>
-      </w:r>
-    </w:p>
-    <w:p>
-      <w:pPr>
-        <w:pStyle w:val="Heading2"/>
-      </w:pPr>
-      <w:r>
-        <w:rPr>
-          <w:rFonts w:ascii="Times New Roman" w:hAnsi="Times New Roman" w:eastAsia="宋体"/>
-        </w:rPr>
-        <w:t>5.6 扩展路径与应用前景</w:t>
-      </w:r>
-    </w:p>
-    <w:p>
-      <w:r>
-        <w:rPr>
-          <w:rFonts w:ascii="Times New Roman" w:hAnsi="Times New Roman" w:eastAsia="宋体"/>
-        </w:rPr>
-        <w:t>全球规则经纬网构成当前共享生产与读取契约，源适配器为非规则网格、区域投影和复杂坐标进入标准化流程提供扩展入口。围绕OISST、ELEV/LAI、代表性镜像和US-NR1形成的方法与案例，为继续扩展海洋、陆面和大气产品、多区域多年份模型应用及长期积分提供基础。随着公共镜像、完整性元数据、持久化归档和模型适配持续完善，GriddingMachine将进一步增强地球系统数据产品的开放共享、稳定获取和跨模型复用能力。</w:t>
+          <w:rFonts w:ascii="Times New Roman" w:hAnsi="Times New Roman" w:eastAsia="Songti SC"/>
+        </w:rPr>
+        <w:t>持续维护需要兼顾软件版本、数据出处和可引用性。科研软件引用原则[17]、FAIR4RS[18]和TRUST[19]分别为软件识别、复用和资源库维护提供参考，国内国家科学数据中心的FAIR实践也强调元数据与使用信息的重要性[20]。当前跨系统测试提供了固定依赖下的运行一致性证据；后续重点是完善数据目录与镜像登记、归档配置和实验环境，并扩展非规则网格源适配及更多模式接口，使数据更新和科研复用保持可追溯。</w:t>
       </w:r>
     </w:p>
     <w:p>
@@ -4881,7 +4750,7 @@
       </w:pPr>
       <w:r>
         <w:rPr>
-          <w:rFonts w:ascii="Times New Roman" w:hAnsi="Times New Roman" w:eastAsia="宋体"/>
+          <w:rFonts w:ascii="Times New Roman" w:hAnsi="Times New Roman" w:eastAsia="Songti SC"/>
         </w:rPr>
         <w:t>6 结论</w:t>
       </w:r>
@@ -4889,37 +4758,25 @@
     <w:p>
       <w:r>
         <w:rPr>
-          <w:rFonts w:ascii="Times New Roman" w:hAnsi="Times New Roman" w:eastAsia="宋体"/>
-        </w:rPr>
-        <w:t>本文在2022版GriddingMachine统一网格、标签访问和artifact数据管理基础上，形成由数据生产与标准化层、数据目录与可信分发层和模式输入组织层构成的可执行数据生命周期。新版以共享YAML配置规范和显式源维度映射描述异构源到标准NetCDF的生产契约，以独立目录、直接NetCDF、事务式获取和</w:t>
-      </w:r>
-      <w:r>
-        <w:rPr>
-          <w:rFonts w:ascii="Consolas" w:hAnsi="Consolas" w:eastAsia="等线"/>
-        </w:rPr>
-        <w:t>SIZE</w:t>
-      </w:r>
-      <w:r>
-        <w:rPr>
-          <w:rFonts w:ascii="Times New Roman" w:hAnsi="Times New Roman" w:eastAsia="宋体"/>
-        </w:rPr>
-        <w:t>/SHA-256核验维护稳定数据标识与内容完整性，并以统一读取、陆面参数融合和气象驱动组织连接标准数据与模型接口。</w:t>
+          <w:rFonts w:ascii="Times New Roman" w:hAnsi="Times New Roman" w:eastAsia="Songti SC"/>
+        </w:rPr>
+        <w:t>本文面向地球系统模式对全球网格数据的使用需求，在2022版GriddingMachine基础上完善了数据预处理、分发和读取。共享YAML配置统一描述源数据转换规则，独立目录组织标签、镜像和完整性信息，统一读取接口将标准化数据进一步组织为陆面参数和气象驱动；多语言下载入口扩展了数据获取的调用方式。</w:t>
       </w:r>
     </w:p>
     <w:p>
       <w:r>
         <w:rPr>
-          <w:rFonts w:ascii="Times New Roman" w:hAnsi="Times New Roman" w:eastAsia="宋体"/>
-        </w:rPr>
-        <w:t>真实产品与分层实验为三个环节提供了对应证据。OISST V2.1产品从四维源结构生成1440×720标准海表温度产品，坐标、有效值掩膜和691 150个物理值与独立参考逐点一致。对于内部压缩的ELEV和LAI，直接NetCDF在环境A中将缓存预热后的端到端中位时间分别降低48.3%和82.9%，在环境B中分别降低53.6%和69.2%；校园网内4个代表性产品通过FTP与Zenodo完成24次内容一致的双镜像获取。US-NR1案例中，14类陆面产品与8类ERA5逐时产品形成参数和气象驱动，8个气象字段的8784个时间步与底层NetCDF逐点一致，并完成Emerald初始化和60 s首步计算。</w:t>
+          <w:rFonts w:ascii="Times New Roman" w:hAnsi="Times New Roman" w:eastAsia="Songti SC"/>
+        </w:rPr>
+        <w:t>受控实例和真实数据案例为上述更新提供了验证。OISST标准化后的有效格点与独立参考逐点一致；ELEV和LAI在两个测试环境中采用直接NetCDF分发，缩短了缓存预热后的端到端访问时间并使逻辑临时占用约减半；校园网FTP与Zenodo的24次获取均通过文件大小和SHA-256核验。US-NR1案例中，14类陆面数据和8类ERA5逐时数据形成模式输入，各气象字段的8784个时间步与底层读取一致，并完成Emerald初始化和60 s首步计算。</w:t>
       </w:r>
     </w:p>
     <w:p>
       <w:r>
         <w:rPr>
-          <w:rFonts w:ascii="Times New Roman" w:hAnsi="Times New Roman" w:eastAsia="宋体"/>
-        </w:rPr>
-        <w:t>这些结果表明，GriddingMachine能够把异构源数据生产、标准产品登记与内容完整性核验以及模式输入组织连接为连续数据路径。该框架为数据产品、分发目录和访问软件的独立维护建立统一接口，并为全球网格数据持续扩展、可靠获取和地球系统模式应用提供可复用的基础设施。</w:t>
+          <w:rFonts w:ascii="Times New Roman" w:hAnsi="Times New Roman" w:eastAsia="Songti SC"/>
+        </w:rPr>
+        <w:t>更新后的GriddingMachine将数据处理规则、网络获取和模式输入连接为可重复调用的流程，为全球网格数据的持续维护和地球系统模式研究提供基础。后续将围绕数据覆盖、镜像维护和模式适配扩展其科研应用。</w:t>
       </w:r>
     </w:p>
     <w:p>
@@ -4928,7 +4785,7 @@
       </w:pPr>
       <w:r>
         <w:rPr>
-          <w:rFonts w:ascii="Times New Roman" w:hAnsi="Times New Roman" w:eastAsia="宋体"/>
+          <w:rFonts w:ascii="Times New Roman" w:hAnsi="Times New Roman" w:eastAsia="Songti SC"/>
         </w:rPr>
         <w:t>数据和代码可用性声明</w:t>
       </w:r>
@@ -4936,67 +4793,91 @@
     <w:p>
       <w:r>
         <w:rPr>
-          <w:rFonts w:ascii="Times New Roman" w:hAnsi="Times New Roman" w:eastAsia="宋体"/>
-        </w:rPr>
-        <w:t>GriddingMachine.jl源代码公开于https://github.com/CliMA/GriddingMachine.jl，数据生产代码公开于https://github.com/jhOo1/GriddingMachineDatasets，Emerald模型接口环境公开于https://github.com/jhOo1/Emerald-paper，论文补充材料、实验协议、脚本和结果公开于https://github.com/jhOo1/GriddingMachine_Reaserach。ERA5案例的逐文件大小与SHA-256、格点统计、时间轴核对和模型状态保存在</w:t>
-      </w:r>
-      <w:r>
-        <w:rPr>
-          <w:rFonts w:ascii="Consolas" w:hAnsi="Consolas" w:eastAsia="等线"/>
+          <w:rFonts w:ascii="Times New Roman" w:hAnsi="Times New Roman" w:eastAsia="Songti SC"/>
+        </w:rPr>
+        <w:t>GriddingMachine.jl源代码公开于https://github.com/CliMA/GriddingMachine.jl，数据生产代码公开于https://github.com/jhOo1/GriddingMachineDatasets，Emerald模式接口环境公开于https://github.com/jhOo1/Emerald-paper，论文补充材料、实验协议、脚本和结果公开于https://github.com/jhOo1/GriddingMachine_Reaserach。ERA5案例的逐文件大小与SHA-256、格点统计、时间轴核对和模式状态保存在</w:t>
+      </w:r>
+      <w:r>
+        <w:rPr>
+          <w:rFonts w:ascii="Consolas" w:hAnsi="Consolas" w:eastAsia="Songti SC"/>
         </w:rPr>
         <w:t>experiment_data/03_09/real_era5_result.toml</w:t>
       </w:r>
       <w:r>
         <w:rPr>
-          <w:rFonts w:ascii="Times New Roman" w:hAnsi="Times New Roman" w:eastAsia="宋体"/>
-        </w:rPr>
-        <w:t>；PPT修订文件以V1_R1后缀发布，逻辑标签保持V1，目录记录其文件大小、SHA-256和机构FTP地址。论文所对应的核心代码版本分别以</w:t>
-      </w:r>
-      <w:r>
-        <w:rPr>
-          <w:rFonts w:ascii="Consolas" w:hAnsi="Consolas" w:eastAsia="等线"/>
+          <w:rFonts w:ascii="Times New Roman" w:hAnsi="Times New Roman" w:eastAsia="Songti SC"/>
+        </w:rPr>
+        <w:t>；PPT修订文件以V1_R1后缀发布，逻辑标签保持V1，目录记录其文件大小、SHA-256和机构FTP地址。既有主体实验使用的核心代码版本分别以</w:t>
+      </w:r>
+      <w:r>
+        <w:rPr>
+          <w:rFonts w:ascii="Consolas" w:hAnsi="Consolas" w:eastAsia="Songti SC"/>
         </w:rPr>
         <w:t>griddingmachine-paper-2026-v1</w:t>
       </w:r>
       <w:r>
         <w:rPr>
-          <w:rFonts w:ascii="Times New Roman" w:hAnsi="Times New Roman" w:eastAsia="宋体"/>
+          <w:rFonts w:ascii="Times New Roman" w:hAnsi="Times New Roman" w:eastAsia="Songti SC"/>
         </w:rPr>
         <w:t>、</w:t>
       </w:r>
       <w:r>
         <w:rPr>
-          <w:rFonts w:ascii="Consolas" w:hAnsi="Consolas" w:eastAsia="等线"/>
+          <w:rFonts w:ascii="Consolas" w:hAnsi="Consolas" w:eastAsia="Songti SC"/>
         </w:rPr>
         <w:t>griddingmachine-datasets-paper-2026-v1</w:t>
       </w:r>
       <w:r>
         <w:rPr>
-          <w:rFonts w:ascii="Times New Roman" w:hAnsi="Times New Roman" w:eastAsia="宋体"/>
+          <w:rFonts w:ascii="Times New Roman" w:hAnsi="Times New Roman" w:eastAsia="Songti SC"/>
         </w:rPr>
         <w:t>和</w:t>
       </w:r>
       <w:r>
         <w:rPr>
-          <w:rFonts w:ascii="Consolas" w:hAnsi="Consolas" w:eastAsia="等线"/>
+          <w:rFonts w:ascii="Consolas" w:hAnsi="Consolas" w:eastAsia="Songti SC"/>
         </w:rPr>
         <w:t>emerald-paper-2026-v1</w:t>
       </w:r>
       <w:r>
         <w:rPr>
-          <w:rFonts w:ascii="Times New Roman" w:hAnsi="Times New Roman" w:eastAsia="宋体"/>
-        </w:rPr>
-        <w:t>标签固定。研究材料的内容冻结提交、冻结分支及不可变稿件标签由</w:t>
-      </w:r>
-      <w:r>
-        <w:rPr>
-          <w:rFonts w:ascii="Consolas" w:hAnsi="Consolas" w:eastAsia="等线"/>
+          <w:rFonts w:ascii="Times New Roman" w:hAnsi="Times New Roman" w:eastAsia="Songti SC"/>
+        </w:rPr>
+        <w:t>标签固定。多语言下载入口位于GriddingMachine.jl的</w:t>
+      </w:r>
+      <w:r>
+        <w:rPr>
+          <w:rFonts w:ascii="Consolas" w:hAnsi="Consolas" w:eastAsia="Songti SC"/>
+        </w:rPr>
+        <w:t>clients</w:t>
+      </w:r>
+      <w:r>
+        <w:rPr>
+          <w:rFonts w:ascii="Times New Roman" w:hAnsi="Times New Roman" w:eastAsia="Songti SC"/>
+        </w:rPr>
+        <w:t>目录，对应提交</w:t>
+      </w:r>
+      <w:r>
+        <w:rPr>
+          <w:rFonts w:ascii="Consolas" w:hAnsi="Consolas" w:eastAsia="Songti SC"/>
+        </w:rPr>
+        <w:t>e0ee0051ba1e51826f494d03f4a411187477cc61</w:t>
+      </w:r>
+      <w:r>
+        <w:rPr>
+          <w:rFonts w:ascii="Times New Roman" w:hAnsi="Times New Roman" w:eastAsia="Songti SC"/>
+        </w:rPr>
+        <w:t>；该新增代码与既有实验冻结版本分别记录。研究材料的内容冻结提交、冻结分支及不可变稿件标签由</w:t>
+      </w:r>
+      <w:r>
+        <w:rPr>
+          <w:rFonts w:ascii="Consolas" w:hAnsi="Consolas" w:eastAsia="Songti SC"/>
         </w:rPr>
         <w:t>论文/投稿版本锁定.toml</w:t>
       </w:r>
       <w:r>
         <w:rPr>
-          <w:rFonts w:ascii="Times New Roman" w:hAnsi="Times New Roman" w:eastAsia="宋体"/>
+          <w:rFonts w:ascii="Times New Roman" w:hAnsi="Times New Roman" w:eastAsia="Songti SC"/>
         </w:rPr>
         <w:t>统一记录；永久归档与DOI信息随最终归档版本同步发布。</w:t>
       </w:r>
@@ -5007,7 +4888,7 @@
       </w:pPr>
       <w:r>
         <w:rPr>
-          <w:rFonts w:ascii="Times New Roman" w:hAnsi="Times New Roman" w:eastAsia="宋体"/>
+          <w:rFonts w:ascii="Times New Roman" w:hAnsi="Times New Roman" w:eastAsia="Songti SC"/>
         </w:rPr>
         <w:t>基金项目</w:t>
       </w:r>
@@ -5015,7 +4896,7 @@
     <w:p>
       <w:r>
         <w:rPr>
-          <w:rFonts w:ascii="Times New Roman" w:hAnsi="Times New Roman" w:eastAsia="宋体"/>
+          <w:rFonts w:ascii="Times New Roman" w:hAnsi="Times New Roman" w:eastAsia="Songti SC"/>
         </w:rPr>
         <w:t>【待作者和通讯作者补充基金项目中文/英文名称及编号；如无资助，按期刊要求声明。】</w:t>
       </w:r>
@@ -5026,7 +4907,7 @@
       </w:pPr>
       <w:r>
         <w:rPr>
-          <w:rFonts w:ascii="Times New Roman" w:hAnsi="Times New Roman" w:eastAsia="宋体"/>
+          <w:rFonts w:ascii="Times New Roman" w:hAnsi="Times New Roman" w:eastAsia="Songti SC"/>
         </w:rPr>
         <w:t>作者贡献</w:t>
       </w:r>
@@ -5034,7 +4915,7 @@
     <w:p>
       <w:r>
         <w:rPr>
-          <w:rFonts w:ascii="Times New Roman" w:hAnsi="Times New Roman" w:eastAsia="宋体"/>
+          <w:rFonts w:ascii="Times New Roman" w:hAnsi="Times New Roman" w:eastAsia="Songti SC"/>
         </w:rPr>
         <w:t>姜皓：概念设计、方法设计、软件、数据整理、可视化、初稿撰写。王玉杰：概念设计、研究指导、项目管理、论文审阅与修改。</w:t>
       </w:r>
@@ -5045,7 +4926,7 @@
       </w:pPr>
       <w:r>
         <w:rPr>
-          <w:rFonts w:ascii="Times New Roman" w:hAnsi="Times New Roman" w:eastAsia="宋体"/>
+          <w:rFonts w:ascii="Times New Roman" w:hAnsi="Times New Roman" w:eastAsia="Songti SC"/>
         </w:rPr>
         <w:t>利益冲突声明</w:t>
       </w:r>
@@ -5053,7 +4934,7 @@
     <w:p>
       <w:r>
         <w:rPr>
-          <w:rFonts w:ascii="Times New Roman" w:hAnsi="Times New Roman" w:eastAsia="宋体"/>
+          <w:rFonts w:ascii="Times New Roman" w:hAnsi="Times New Roman" w:eastAsia="Songti SC"/>
         </w:rPr>
         <w:t>作者声明不存在利益冲突。</w:t>
       </w:r>
@@ -5064,7 +4945,7 @@
       </w:pPr>
       <w:r>
         <w:rPr>
-          <w:rFonts w:ascii="Times New Roman" w:hAnsi="Times New Roman" w:eastAsia="宋体"/>
+          <w:rFonts w:ascii="Times New Roman" w:hAnsi="Times New Roman" w:eastAsia="Songti SC"/>
         </w:rPr>
         <w:t>AI 工具使用声明</w:t>
       </w:r>
@@ -5072,7 +4953,7 @@
     <w:p>
       <w:r>
         <w:rPr>
-          <w:rFonts w:ascii="Times New Roman" w:hAnsi="Times New Roman" w:eastAsia="宋体"/>
+          <w:rFonts w:ascii="Times New Roman" w:hAnsi="Times New Roman" w:eastAsia="Songti SC"/>
         </w:rPr>
         <w:t>本文准备过程中使用OpenAI Codex辅助整理研究材料与代码差异、检查论文结构、修订部分文字、审查分析脚本、汇总结果并辅助图件制作。研究目标、分析方法和结论由作者确定；作者核验软件版本、数据、文件摘要、图件数值和正文表述，并对研究设计、数据真实性、结果解释及全文承担责任。</w:t>
       </w:r>
@@ -5083,7 +4964,7 @@
       </w:pPr>
       <w:r>
         <w:rPr>
-          <w:rFonts w:ascii="Times New Roman" w:hAnsi="Times New Roman" w:eastAsia="宋体"/>
+          <w:rFonts w:ascii="Times New Roman" w:hAnsi="Times New Roman" w:eastAsia="Songti SC"/>
         </w:rPr>
         <w:t>参考文献</w:t>
       </w:r>
@@ -5091,7 +4972,7 @@
     <w:p>
       <w:r>
         <w:rPr>
-          <w:rFonts w:ascii="Times New Roman" w:hAnsi="Times New Roman" w:eastAsia="宋体"/>
+          <w:rFonts w:ascii="Times New Roman" w:hAnsi="Times New Roman" w:eastAsia="Songti SC"/>
         </w:rPr>
         <w:t>[1] WILKINSON M D, DUMONTIER M, AALBERSBERG I J, et al. The FAIR Guiding Principles for scientific data management and stewardship[J]. Scientific Data, 2016, 3: 160018. DOI: 10.1038/sdata.2016.18.</w:t>
       </w:r>
@@ -5099,7 +4980,7 @@
     <w:p>
       <w:r>
         <w:rPr>
-          <w:rFonts w:ascii="Times New Roman" w:hAnsi="Times New Roman" w:eastAsia="宋体"/>
+          <w:rFonts w:ascii="Times New Roman" w:hAnsi="Times New Roman" w:eastAsia="Songti SC"/>
         </w:rPr>
         <w:t>[2] CF CONVENTIONS COMMITTEE. CF Metadata Conventions[EB/OL]. [2026-08-07]. https://cfconventions.org/.</w:t>
       </w:r>
@@ -5107,7 +4988,7 @@
     <w:p>
       <w:r>
         <w:rPr>
-          <w:rFonts w:ascii="Times New Roman" w:hAnsi="Times New Roman" w:eastAsia="宋体"/>
+          <w:rFonts w:ascii="Times New Roman" w:hAnsi="Times New Roman" w:eastAsia="Songti SC"/>
         </w:rPr>
         <w:t>[3] GORELICK N, HANCHER M, DIXON M, et al. Google Earth Engine: Planetary-scale geospatial analysis for everyone[J]. Remote Sensing of Environment, 2017, 202: 18-27. DOI: 10.1016/j.rse.2017.06.031.</w:t>
       </w:r>
@@ -5115,7 +4996,7 @@
     <w:p>
       <w:r>
         <w:rPr>
-          <w:rFonts w:ascii="Times New Roman" w:hAnsi="Times New Roman" w:eastAsia="宋体"/>
+          <w:rFonts w:ascii="Times New Roman" w:hAnsi="Times New Roman" w:eastAsia="Songti SC"/>
         </w:rPr>
         <w:t>[4] WANG Y, KÖHLER P, BRAGHIERE R K, et al. GriddingMachine, a database and software for Earth system modeling at global and regional scales[J]. Scientific Data, 2022, 9: 258. DOI: 10.1038/s41597-022-01346-x.</w:t>
       </w:r>
@@ -5123,7 +5004,7 @@
     <w:p>
       <w:r>
         <w:rPr>
-          <w:rFonts w:ascii="Times New Roman" w:hAnsi="Times New Roman" w:eastAsia="宋体"/>
+          <w:rFonts w:ascii="Times New Roman" w:hAnsi="Times New Roman" w:eastAsia="Songti SC"/>
         </w:rPr>
         <w:t>[5] REW R, DAVIS G. NetCDF: An interface for scientific data access[J]. IEEE Computer Graphics and Applications, 1990, 10(4): 76-82. DOI: 10.1109/38.56302.</w:t>
       </w:r>
@@ -5131,103 +5012,103 @@
     <w:p>
       <w:r>
         <w:rPr>
-          <w:rFonts w:ascii="Times New Roman" w:hAnsi="Times New Roman" w:eastAsia="宋体"/>
-        </w:rPr>
-        <w:t>[6] MAHECHA M D, GANS F, BRANDT G, et al. Earth system data cubes unravel global multivariate dynamics[J]. Earth System Dynamics, 2020, 11: 201-234. DOI: 10.5194/esd-11-201-2020.</w:t>
+          <w:rFonts w:ascii="Times New Roman" w:hAnsi="Times New Roman" w:eastAsia="Songti SC"/>
+        </w:rPr>
+        <w:t>[6] HERSBACH H, BELL B, BERRISFORD P, et al. The ERA5 global reanalysis[J]. Quarterly Journal of the Royal Meteorological Society, 2020, 146(730): 1999-2049. DOI: 10.1002/qj.3803.</w:t>
       </w:r>
     </w:p>
     <w:p>
       <w:r>
         <w:rPr>
-          <w:rFonts w:ascii="Times New Roman" w:hAnsi="Times New Roman" w:eastAsia="宋体"/>
-        </w:rPr>
-        <w:t>[7] BEZANSON J, EDELMAN A, KARPINSKI S, et al. Julia: A fresh approach to numerical computing[J]. SIAM Review, 2017, 59(1): 65-98. DOI: 10.1137/141000671.</w:t>
+          <w:rFonts w:ascii="Times New Roman" w:hAnsi="Times New Roman" w:eastAsia="Songti SC"/>
+        </w:rPr>
+        <w:t>[7] HUANG B, LIU C, BANZON V, et al. Improvements of the Daily Optimum Interpolation Sea Surface Temperature (DOISST) Version 2.1[J]. Journal of Climate, 2021, 34(8): 2923-2939. DOI: 10.1175/JCLI-D-20-0166.1.</w:t>
       </w:r>
     </w:p>
     <w:p>
       <w:r>
         <w:rPr>
-          <w:rFonts w:ascii="Times New Roman" w:hAnsi="Times New Roman" w:eastAsia="宋体"/>
-        </w:rPr>
-        <w:t>[8] SMITH A M, KATZ D S, NIEMEYER K E, et al. Software citation principles[J]. PeerJ Computer Science, 2016, 2: e86. DOI: 10.7717/peerj-cs.86.</w:t>
+          <w:rFonts w:ascii="Times New Roman" w:hAnsi="Times New Roman" w:eastAsia="Songti SC"/>
+        </w:rPr>
+        <w:t>[8] COPERNICUS CLIMATE CHANGE SERVICE. Conversion table for accumulated variables (total precipitation/fluxes): ERA5 reanalysis hourly data[EB/OL]. https://confluence.ecmwf.int/pages/viewpage.action?pageId=216478200.</w:t>
       </w:r>
     </w:p>
     <w:p>
       <w:r>
         <w:rPr>
-          <w:rFonts w:ascii="Times New Roman" w:hAnsi="Times New Roman" w:eastAsia="宋体"/>
-        </w:rPr>
-        <w:t>[9] HUANG B, LIU C, BANZON V, et al. Improvements of the Daily Optimum Interpolation Sea Surface Temperature (DOISST) Version 2.1[J]. Journal of Climate, 2021, 34(8): 2923-2939. DOI: 10.1175/JCLI-D-20-0166.1.</w:t>
+          <w:rFonts w:ascii="Times New Roman" w:hAnsi="Times New Roman" w:eastAsia="Songti SC"/>
+        </w:rPr>
+        <w:t>[9] MAHECHA M D, GANS F, BRANDT G, et al. Earth system data cubes unravel global multivariate dynamics[J]. Earth System Dynamics, 2020, 11: 201-234. DOI: 10.5194/esd-11-201-2020.</w:t>
       </w:r>
     </w:p>
     <w:p>
       <w:r>
         <w:rPr>
-          <w:rFonts w:ascii="Times New Roman" w:hAnsi="Times New Roman" w:eastAsia="宋体"/>
-        </w:rPr>
-        <w:t>[10] HERSBACH H, BELL B, BERRISFORD P, et al. The ERA5 global reanalysis[J]. Quarterly Journal of the Royal Meteorological Society, 2020, 146(730): 1999-2049. DOI: 10.1002/qj.3803.</w:t>
+          <w:rFonts w:ascii="Times New Roman" w:hAnsi="Times New Roman" w:eastAsia="Songti SC"/>
+        </w:rPr>
+        <w:t>[10] BEZANSON J, EDELMAN A, KARPINSKI S, et al. Julia: A fresh approach to numerical computing[J]. SIAM Review, 2017, 59(1): 65-98. DOI: 10.1137/141000671.</w:t>
       </w:r>
     </w:p>
     <w:p>
       <w:r>
         <w:rPr>
-          <w:rFonts w:ascii="Times New Roman" w:hAnsi="Times New Roman" w:eastAsia="宋体"/>
-        </w:rPr>
-        <w:t>[11] COPERNICUS CLIMATE CHANGE SERVICE. Conversion table for accumulated variables (total precipitation/fluxes): ERA5 reanalysis hourly data[EB/OL]. https://confluence.ecmwf.int/pages/viewpage.action?pageId=216478200.</w:t>
+          <w:rFonts w:ascii="Times New Roman" w:hAnsi="Times New Roman" w:eastAsia="Songti SC"/>
+        </w:rPr>
+        <w:t>[11] CINQUINI L, CRICHTON D, MATTMANN C, et al. The Earth System Grid Federation: An open infrastructure for access to distributed geospatial data[J]. Future Generation Computer Systems, 2014, 36: 400-417. DOI: 10.1016/j.future.2013.07.002.</w:t>
       </w:r>
     </w:p>
     <w:p>
       <w:r>
         <w:rPr>
-          <w:rFonts w:ascii="Times New Roman" w:hAnsi="Times New Roman" w:eastAsia="宋体"/>
-        </w:rPr>
-        <w:t>[12] CINQUINI L, CRICHTON D, MATTMANN C, et al. The Earth System Grid Federation: An open infrastructure for access to distributed geospatial data[J]. Future Generation Computer Systems, 2014, 36: 400-417. DOI: 10.1016/j.future.2013.07.002.</w:t>
+          <w:rFonts w:ascii="Times New Roman" w:hAnsi="Times New Roman" w:eastAsia="Songti SC"/>
+        </w:rPr>
+        <w:t>[12] ABERNATHEY R P, AUGSPURGER T, BANIHIRWE A, et al. Cloud-native repositories for big scientific data[J]. Computing in Science &amp; Engineering, 2021, 23(2): 26-35. DOI: 10.1109/MCSE.2021.3059437.</w:t>
       </w:r>
     </w:p>
     <w:p>
       <w:r>
         <w:rPr>
-          <w:rFonts w:ascii="Times New Roman" w:hAnsi="Times New Roman" w:eastAsia="宋体"/>
-        </w:rPr>
-        <w:t>[13] ABERNATHEY R P, AUGSPURGER T, BANIHIRWE A, et al. Cloud-native repositories for big scientific data[J]. Computing in Science &amp; Engineering, 2021, 23(2): 26-35. DOI: 10.1109/MCSE.2021.3059437.</w:t>
+          <w:rFonts w:ascii="Times New Roman" w:hAnsi="Times New Roman" w:eastAsia="Songti SC"/>
+        </w:rPr>
+        <w:t>[13] STERN C, ABERNATHEY R, HAMMAN J, et al. Pangeo Forge: Crowdsourcing analysis-ready, cloud optimized data production[J]. Frontiers in Climate, 2022, 3: 782909. DOI: 10.3389/fclim.2021.782909.</w:t>
       </w:r>
     </w:p>
     <w:p>
       <w:r>
         <w:rPr>
-          <w:rFonts w:ascii="Times New Roman" w:hAnsi="Times New Roman" w:eastAsia="宋体"/>
-        </w:rPr>
-        <w:t>[14] STERN C, ABERNATHEY R, HAMMAN J, et al. Pangeo Forge: Crowdsourcing analysis-ready, cloud optimized data production[J]. Frontiers in Climate, 2022, 3: 782909. DOI: 10.3389/fclim.2021.782909.</w:t>
+          <w:rFonts w:ascii="Times New Roman" w:hAnsi="Times New Roman" w:eastAsia="Songti SC"/>
+        </w:rPr>
+        <w:t>[14] 王卷乐, 林海, 冉盈盈, 等. 面向数据共享的地球系统科学数据分类探讨[J]. 地球科学进展, 2014, 29(2): 265-274. [WANG Juanle, LIN Hai, RAN Yingying, et al. A study of Earth System Science data classification for data sharing[J]. Advances in Earth Science, 2014, 29(2): 265-274.]</w:t>
       </w:r>
     </w:p>
     <w:p>
       <w:r>
         <w:rPr>
-          <w:rFonts w:ascii="Times New Roman" w:hAnsi="Times New Roman" w:eastAsia="宋体"/>
-        </w:rPr>
-        <w:t>[15] 王卷乐, 林海, 冉盈盈, 等. 面向数据共享的地球系统科学数据分类探讨[J]. 地球科学进展, 2014, 29(2): 265-274. [WANG Juanle, LIN Hai, RAN Yingying, et al. A study of Earth System Science data classification for data sharing[J]. Advances in Earth Science, 2014, 29(2): 265-274.]</w:t>
+          <w:rFonts w:ascii="Times New Roman" w:hAnsi="Times New Roman" w:eastAsia="Songti SC"/>
+        </w:rPr>
+        <w:t>[15] UIEDA L, SOLER S R, RAMPIN R, et al. Pooch: A friend to fetch your data files[J]. Journal of Open Source Software, 2020, 5(45): 1943. DOI: 10.21105/joss.01943.</w:t>
       </w:r>
     </w:p>
     <w:p>
       <w:r>
         <w:rPr>
-          <w:rFonts w:ascii="Times New Roman" w:hAnsi="Times New Roman" w:eastAsia="宋体"/>
-        </w:rPr>
-        <w:t>[16] UIEDA L, SOLER S R, RAMPIN R, et al. Pooch: A friend to fetch your data files[J]. Journal of Open Source Software, 2020, 5(45): 1943. DOI: 10.21105/joss.01943.</w:t>
+          <w:rFonts w:ascii="Times New Roman" w:hAnsi="Times New Roman" w:eastAsia="Songti SC"/>
+        </w:rPr>
+        <w:t>[16] OPEN GEOSPATIAL CONSORTIUM. SpatioTemporal Asset Catalog (STAC) Community Standard, Version 1.1.0[S/OL]. OGC 25-004, 2025[2026-08-15]. https://www.ogc.org/standards/stac/.</w:t>
       </w:r>
     </w:p>
     <w:p>
       <w:r>
         <w:rPr>
-          <w:rFonts w:ascii="Times New Roman" w:hAnsi="Times New Roman" w:eastAsia="宋体"/>
-        </w:rPr>
-        <w:t>[17] OPEN GEOSPATIAL CONSORTIUM. SpatioTemporal Asset Catalog (STAC) Community Standard, Version 1.1.0[S/OL]. OGC 25-004, 2025[2026-08-15]. https://www.ogc.org/standards/stac/.</w:t>
+          <w:rFonts w:ascii="Times New Roman" w:hAnsi="Times New Roman" w:eastAsia="Songti SC"/>
+        </w:rPr>
+        <w:t>[17] SMITH A M, KATZ D S, NIEMEYER K E, et al. Software citation principles[J]. PeerJ Computer Science, 2016, 2: e86. DOI: 10.7717/peerj-cs.86.</w:t>
       </w:r>
     </w:p>
     <w:p>
       <w:r>
         <w:rPr>
-          <w:rFonts w:ascii="Times New Roman" w:hAnsi="Times New Roman" w:eastAsia="宋体"/>
+          <w:rFonts w:ascii="Times New Roman" w:hAnsi="Times New Roman" w:eastAsia="Songti SC"/>
         </w:rPr>
         <w:t>[18] BARKER M, CHUE HONG N P, KATZ D S, et al. Introducing the FAIR Principles for research software[J]. Scientific Data, 2022, 9: 622. DOI: 10.1038/s41597-022-01710-x.</w:t>
       </w:r>
@@ -5235,7 +5116,7 @@
     <w:p>
       <w:r>
         <w:rPr>
-          <w:rFonts w:ascii="Times New Roman" w:hAnsi="Times New Roman" w:eastAsia="宋体"/>
+          <w:rFonts w:ascii="Times New Roman" w:hAnsi="Times New Roman" w:eastAsia="Songti SC"/>
         </w:rPr>
         <w:t>[19] LIN D, CRABTREE J, DILLO I, et al. The TRUST Principles for digital repositories[J]. Scientific Data, 2020, 7: 144. DOI: 10.1038/s41597-020-0486-7.</w:t>
       </w:r>
@@ -5243,7 +5124,7 @@
     <w:p>
       <w:r>
         <w:rPr>
-          <w:rFonts w:ascii="Times New Roman" w:hAnsi="Times New Roman" w:eastAsia="宋体"/>
+          <w:rFonts w:ascii="Times New Roman" w:hAnsi="Times New Roman" w:eastAsia="Songti SC"/>
         </w:rPr>
         <w:t>[20] 李楠楠, 刘筱敏. 我国国家科学数据中心FAIR原则的实践现状调查与分析[J]. 图书与情报, 2023, 43(2): 137-144. DOI: 10.11968/tsyqb.1003-6938.2023032. [LI Nannan, LIU Xiaomin. Survey and analysis on the practice of FAIR principle in National Science Data Center of China[J]. Library and Information, 2023, 43(2): 137-144.]</w:t>
       </w:r>
@@ -5626,7 +5507,7 @@
       <w:ind w:firstLine="420"/>
     </w:pPr>
     <w:rPr>
-      <w:rFonts w:ascii="Times New Roman" w:hAnsi="Times New Roman" w:eastAsia="宋体"/>
+      <w:rFonts w:ascii="Times New Roman" w:hAnsi="Times New Roman" w:eastAsia="Songti SC"/>
       <w:sz w:val="21"/>
     </w:rPr>
   </w:style>
@@ -5690,7 +5571,7 @@
       <w:outlineLvl w:val="0"/>
     </w:pPr>
     <w:rPr>
-      <w:rFonts w:asciiTheme="majorHAnsi" w:eastAsiaTheme="majorEastAsia" w:hAnsiTheme="majorHAnsi" w:cstheme="majorBidi" w:ascii="Times New Roman" w:hAnsi="Times New Roman" w:eastAsia="黑体"/>
+      <w:rFonts w:asciiTheme="majorHAnsi" w:eastAsiaTheme="majorEastAsia" w:hAnsiTheme="majorHAnsi" w:cstheme="majorBidi" w:ascii="Times New Roman" w:hAnsi="Times New Roman" w:eastAsia="Heiti SC"/>
       <w:b/>
       <w:bCs/>
       <w:color w:val="365F91" w:themeColor="accent1" w:themeShade="BF"/>
@@ -5715,7 +5596,7 @@
       <w:outlineLvl w:val="1"/>
     </w:pPr>
     <w:rPr>
-      <w:rFonts w:asciiTheme="majorHAnsi" w:eastAsiaTheme="majorEastAsia" w:hAnsiTheme="majorHAnsi" w:cstheme="majorBidi" w:ascii="Times New Roman" w:hAnsi="Times New Roman" w:eastAsia="黑体"/>
+      <w:rFonts w:asciiTheme="majorHAnsi" w:eastAsiaTheme="majorEastAsia" w:hAnsiTheme="majorHAnsi" w:cstheme="majorBidi" w:ascii="Times New Roman" w:hAnsi="Times New Roman" w:eastAsia="Heiti SC"/>
       <w:b/>
       <w:bCs/>
       <w:color w:val="4F81BD" w:themeColor="accent1"/>
@@ -5740,7 +5621,7 @@
       <w:outlineLvl w:val="2"/>
     </w:pPr>
     <w:rPr>
-      <w:rFonts w:asciiTheme="majorHAnsi" w:eastAsiaTheme="majorEastAsia" w:hAnsiTheme="majorHAnsi" w:cstheme="majorBidi" w:ascii="Times New Roman" w:hAnsi="Times New Roman" w:eastAsia="黑体"/>
+      <w:rFonts w:asciiTheme="majorHAnsi" w:eastAsiaTheme="majorEastAsia" w:hAnsiTheme="majorHAnsi" w:cstheme="majorBidi" w:ascii="Times New Roman" w:hAnsi="Times New Roman" w:eastAsia="Heiti SC"/>
       <w:b/>
       <w:bCs/>
       <w:color w:val="4F81BD" w:themeColor="accent1"/>
@@ -5983,7 +5864,7 @@
       <w:contextualSpacing/>
     </w:pPr>
     <w:rPr>
-      <w:rFonts w:asciiTheme="majorHAnsi" w:eastAsiaTheme="majorEastAsia" w:hAnsiTheme="majorHAnsi" w:cstheme="majorBidi" w:ascii="Times New Roman" w:hAnsi="Times New Roman" w:eastAsia="黑体"/>
+      <w:rFonts w:asciiTheme="majorHAnsi" w:eastAsiaTheme="majorEastAsia" w:hAnsiTheme="majorHAnsi" w:cstheme="majorBidi" w:ascii="Times New Roman" w:hAnsi="Times New Roman" w:eastAsia="Heiti SC"/>
       <w:color w:val="17365D" w:themeColor="text2" w:themeShade="BF"/>
       <w:spacing w:val="5"/>
       <w:kern w:val="28"/>

</xml_diff>

<commit_message>
simplify multilingual interface description
</commit_message>
<xml_diff>
--- a/论文/GriddingMachine论文初稿_v0.3_语言优化版.docx
+++ b/论文/GriddingMachine论文初稿_v0.3_语言优化版.docx
@@ -258,7 +258,7 @@
         <w:rPr>
           <w:rFonts w:ascii="Times New Roman" w:hAnsi="Times New Roman" w:eastAsia="Songti SC"/>
         </w:rPr>
-        <w:t>Wang等[4]于2022年发布了基于Julia语言的GriddingMachine数据库和软件，旨在将常用于陆面和地球系统模拟的全球数据处理为具有统一空间和变量约定的NetCDF文件，并通过标签、Artifacts.toml文件和Julia artifact机制实现数据管理与自动下载，同时提供Julia、MATLAB、Octave、Python和R接口。2022版已经建立了统一网格约定、数据标签和多语言访问基础，但其数据处理主要依赖数据集专用脚本，标准化数据以带有标签文件的</w:t>
+        <w:t>Wang等[4]于2022年发布了基于Julia语言的GriddingMachine数据库和软件，旨在将常用于陆面和地球系统模拟的全球数据处理为具有统一空间和变量约定的NetCDF文件，并通过标签、数据库文件Artifacts.toml和Julia语言的artifact机制实现数据管理与自动下载，同时提供Julia、MATLAB、Octave、Python和R接口。2022版已经建立了统一网格约定、数据标签和多语言访问基础，但其数据处理主要依赖数据集专用脚本，标准化数据以带有标签文件的</w:t>
       </w:r>
       <w:r>
         <w:rPr>
@@ -3017,7 +3017,19 @@
         <w:rPr>
           <w:rFonts w:ascii="Times New Roman" w:hAnsi="Times New Roman" w:eastAsia="Songti SC"/>
         </w:rPr>
-        <w:t>该设计将各语言的调用方式与下载逻辑分开维护，使科研人员可以在已有程序中自动获取文件，再使用相应语言的NetCDF工具读取数据。第3—4节的事务式目录管理、镜像获取和模式输入实验采用Julia主流程；非Julia接口的源码和调用说明随代码仓库的clients目录提供。</w:t>
+        <w:t>该设计将各语言的调用方式与下载逻辑分开维护，使科研人员可以在已有程序中自动获取文件，再使用相应语言的NetCDF工具读取数据。非Julia接口的源码和调用说明随代码仓库的</w:t>
+      </w:r>
+      <w:r>
+        <w:rPr>
+          <w:rFonts w:ascii="Consolas" w:hAnsi="Consolas" w:eastAsia="Songti SC"/>
+        </w:rPr>
+        <w:t>clients</w:t>
+      </w:r>
+      <w:r>
+        <w:rPr>
+          <w:rFonts w:ascii="Times New Roman" w:hAnsi="Times New Roman" w:eastAsia="Songti SC"/>
+        </w:rPr>
+        <w:t>目录提供。</w:t>
       </w:r>
     </w:p>
     <w:p>

</xml_diff>

<commit_message>
refine manuscript framing and version comparison
</commit_message>
<xml_diff>
--- a/论文/GriddingMachine论文初稿_v0.3_语言优化版.docx
+++ b/论文/GriddingMachine论文初稿_v0.3_语言优化版.docx
@@ -82,7 +82,7 @@
         <w:rPr>
           <w:rFonts w:ascii="Times New Roman" w:hAnsi="Times New Roman" w:eastAsia="Songti SC"/>
         </w:rPr>
-        <w:t>地球系统模式依赖区域至全球尺度的网格数据进行参数初始化和结果验证。尽管当前数据大多采用NetCDF、HDF或GeoTIFF等标准格式，源数据处理规则、单位换算、数据标识和网络分发方式仍存在差异，使得每个模式不得不单独维护数据库，给模式持续更新和验证带来不必要的困难。本文在2022版GriddingMachine基础上，完善数据预处理、数据分发和数据读取流程：以共享YAML配置描述源数据结构及转换规则，以独立目录管理标准化数据的标签、镜像和完整性信息，并通过统一接口组织陆面参数和气象驱动。除Julia外，我们适配了MATLAB、Octave、Python和R语言对新版数据的自动下载支持，并新增C和Fortran的自动获取入口。这些更新使研究人员能够通过统一方式处理、获取和调用网格数据，减少不同地球系统模式重复整理和维护数据的工作，为科学研究与应用提供便利。</w:t>
+        <w:t>地球系统模式依赖区域至全球尺度的网格数据进行参数初始化和结果验证。尽管当前数据大多采用NetCDF、HDF或GeoTIFF等标准格式，源数据处理规则、单位换算、数据标识和网络分发方式仍存在差异，使得每个模式不得不单独维护数据库，给模式持续更新和验证带来不必要的困难。本文在2022版GriddingMachine基础上，完善数据预处理、数据分发和数据读取流程：以共享YAML配置描述源数据结构及转换规则，以独立目录管理标准化数据的标签、镜像和完整性信息，并通过统一接口组织陆面参数和气象驱动。除Julia外，我们适配了MATLAB、Octave、Python和R语言对新版数据的自动下载支持，并新增C和Fortran的自动获取入口。这些更新使研究人员能够在 MATLAB、Octave、Python、R、C 和 Fortran 程序中调用统一的数据获取接口，自动下载新版网格数据，并通过 Julia 接口完成标准化数据的读取和模式输入组织，减少不同地球系统模式重复整理和维护数据的工作，为科学研究与应用提供便利。</w:t>
       </w:r>
     </w:p>
     <w:p>
@@ -250,7 +250,7 @@
         <w:rPr>
           <w:rFonts w:ascii="Times New Roman" w:hAnsi="Times New Roman" w:eastAsia="Songti SC"/>
         </w:rPr>
-        <w:t>eusable）的 FAIR 原则[1]。NetCDF具有自描述、跨系统和适合多维数组等特点，CF元数据约定进一步通过坐标、物理量、单位和时空属性促进不同数据源之间的解释与处理[2]。Google Earth Engine等云平台通过改善数据表达、发现、访问及计算，显著提升了大尺度遥感数据的访问和分析能力[3]。然而，对于面向固定版本、离线缓存和模式直接调用的工作流，研究人员仍需要把数据转换规则、标准产品标识、网络获取内容和下游模式接口连接起来，因此一个适用于本地运行的标准化数据库是非常必要的。</w:t>
+        <w:t>eusable）的 FAIR 原则[1]。NetCDF具有自描述、跨系统和适合多维数组等特点，便于保存多维网格及其坐标信息[2]。然而，对于面向固定版本、离线缓存和模式直接调用的工作流，研究人员仍需要把数据转换规则、标准产品标识、网络获取内容和下游模式接口连接起来。建立适用于本地运行的标准化科研数据库，可以将这些环节组织为可追溯、可复用的数据流程，减少重复整理，保证模式输入的一致性，并便于研究人员在不同计算环境中复现实验。</w:t>
       </w:r>
     </w:p>
     <w:p>
@@ -258,7 +258,7 @@
         <w:rPr>
           <w:rFonts w:ascii="Times New Roman" w:hAnsi="Times New Roman" w:eastAsia="Songti SC"/>
         </w:rPr>
-        <w:t>Wang等[4]于2022年发布了基于Julia语言的GriddingMachine数据库和软件，旨在将常用于陆面和地球系统模拟的全球数据处理为具有统一空间和变量约定的NetCDF文件，并通过标签、数据库文件Artifacts.toml和Julia语言的artifact机制实现数据管理与自动下载，同时提供Julia、MATLAB、Octave、Python和R接口。2022版已经建立了统一网格约定、数据标签和多语言访问基础，但其数据处理主要依赖数据集专用脚本，标准化数据以带有标签文件的</w:t>
+        <w:t>Wang等[4]于2022年发布了基于Julia语言的GriddingMachine数据库和软件，旨在将常用于陆面和地球系统模拟的全球数据处理为具有统一空间和变量约定的NetCDF文件，并通过标签、数据库文件Artifacts.toml和Julia语言的artifact机制实现数据管理与自动下载，同时提供Julia、MATLAB、Octave、Python和R接口。2022版已经建立了统一网格约定、数据标签和多语言访问基础，但仍存在三方面局限：数据生产主要依赖数据集专用脚本，处理规则难以共享；标准化数据以带有标签文件的</w:t>
       </w:r>
       <w:r>
         <w:rPr>
@@ -270,7 +270,7 @@
         <w:rPr>
           <w:rFonts w:ascii="Times New Roman" w:hAnsi="Times New Roman" w:eastAsia="Songti SC"/>
         </w:rPr>
-        <w:t>归档分发，数据目录也随软件包维护。随着数据类型、分发位置和模式应用链条扩展，源数据处理规则、数据目录、网络获取和模式输入之间需要进一步统一。</w:t>
+        <w:t>归档分发，增加了获取和读取环节；数据目录随软件包维护，数据更新与软件发布耦合。随着数据类型、分发位置和模式应用链条扩展，源数据处理、数据分发和模式输入之间需要进一步统一。</w:t>
       </w:r>
     </w:p>
     <w:p>
@@ -619,7 +619,7 @@
                 <w:b/>
                 <w:sz w:val="18"/>
               </w:rPr>
-              <w:t>应用价值</w:t>
+              <w:t>对科研流程的作用</w:t>
             </w:r>
           </w:p>
         </w:tc>

</xml_diff>

<commit_message>
define Gapfill at first use
</commit_message>
<xml_diff>
--- a/论文/GriddingMachine论文初稿_v0.3_语言优化版.docx
+++ b/论文/GriddingMachine论文初稿_v0.3_语言优化版.docx
@@ -286,7 +286,7 @@
         <w:rPr>
           <w:rFonts w:ascii="Times New Roman" w:hAnsi="Times New Roman" w:eastAsia="Songti SC"/>
         </w:rPr>
-        <w:t>本文在 2022 版 GriddingMachine 基础上，更新数据预处理、数据分发和数据读取流程，形成数据生产与标准化、数据目录与获取、模式输入组织三个相互衔接的环节。数据生产与标准化层以共享 YAML 配置规范表达源维度、坐标、数值变换、Gapfill 和质量控制；数据目录与获取层以逻辑标签连接数据副本，并对登记了文件字节数和 SHA-256 的条目执行内容核验；模式输入组织层通过统一读取、陆面参数融合和气象驱动组织形成满足模式接口要求的数据结构。</w:t>
+        <w:t>本文在 2022 版 GriddingMachine 基础上，更新数据预处理、数据分发和数据读取流程，形成数据生产与标准化、数据目录与获取、模式输入组织三个相互衔接的环节。数据生产与标准化层以共享 YAML 配置规范表达源维度、坐标、数值变换和缺失值填补（Gapfill）以及质量控制；数据目录与获取层以逻辑标签连接数据副本，并对登记了文件字节数和 SHA-256 的条目执行内容核验；模式输入组织层通过统一读取、陆面参数融合和气象驱动组织形成满足模式接口要求的数据结构。</w:t>
       </w:r>
     </w:p>
     <w:p>
@@ -2134,7 +2134,7 @@
         <w:rPr>
           <w:rFonts w:ascii="Times New Roman" w:hAnsi="Times New Roman" w:eastAsia="Songti SC"/>
         </w:rPr>
-        <w:t>缺失值填补（gap filling，以下简称Gapfill）由YAML中的</w:t>
+        <w:t>缺失值填补由YAML中的</w:t>
       </w:r>
       <w:r>
         <w:rPr>

</xml_diff>

<commit_message>
align abstract with advisor revision
</commit_message>
<xml_diff>
--- a/论文/GriddingMachine论文初稿_v0.3_语言优化版.docx
+++ b/论文/GriddingMachine论文初稿_v0.3_语言优化版.docx
@@ -82,7 +82,7 @@
         <w:rPr>
           <w:rFonts w:ascii="Times New Roman" w:hAnsi="Times New Roman" w:eastAsia="Songti SC"/>
         </w:rPr>
-        <w:t>地球系统模式依赖区域至全球尺度的网格数据进行参数初始化和结果验证。尽管当前数据大多采用NetCDF、HDF或GeoTIFF等标准格式，源数据处理规则、单位换算、数据标识和网络分发方式仍存在差异，使得每个模式不得不单独维护数据库，给模式持续更新和验证带来不必要的困难。本文在2022版GriddingMachine基础上，完善数据预处理、数据分发和数据读取流程：以共享YAML配置描述源数据结构及转换规则，以独立目录管理标准化数据的标签、镜像和完整性信息，并通过统一接口组织陆面参数和气象驱动。除Julia外，我们适配了MATLAB、Octave、Python和R语言对新版数据的自动下载支持，并新增C和Fortran的自动获取入口。这些更新使研究人员能够在 MATLAB、Octave、Python、R、C 和 Fortran 程序中调用统一的数据获取接口，自动下载新版网格数据，并通过 Julia 接口完成标准化数据的读取和模式输入组织，减少不同地球系统模式重复整理和维护数据的工作，为科学研究与应用提供便利。</w:t>
+        <w:t>地球系统模式依赖区域至全球尺度的网格数据进行参数初始化及结果验证。尽管当前数据大多已采用NetCDF、HDF、GeoTIFF等标准格式，源数据处理规则、单位换算、标准数据标识和网络分发方式不同等问题，使得每个模式不得不单独维护数据库，给模式持续更新和验证带来不必要的困难。本文在2022版GriddingMachine基础上，在数据预处理、数据分发及数据读取方面作出优化：增加数据处理标准化流程，改进数据文件分发方式，完善数据目录与模式输入组织，并添加新的标准化数据及数据集。除Julia语言外，还完善了Matlab、Octave、Python和R语言对新版数据的自动下载支持，并添加了C语言和Fortran语言的自动下载支持，以更好地服务科学研究与应用。</w:t>
       </w:r>
     </w:p>
     <w:p>
@@ -164,7 +164,7 @@
         <w:rPr>
           <w:rFonts w:ascii="Times New Roman" w:hAnsi="Times New Roman" w:eastAsia="Songti SC"/>
         </w:rPr>
-        <w:t>Earth system models rely on gridded data at regional to global scales for parameter initialization and evaluation of simulation results. Although most datasets are available in standard formats such as NetCDF, HDF, or GeoTIFF, differences in source-processing rules, unit conversion, data identification, and distribution methods require each model to maintain its own database, creating unnecessary difficulties for continued model development and evaluation. Building on the 2022 release of GriddingMachine, this study improves data preprocessing, distribution, and data reading. Shared YAML configurations describe source data structures and transformation rules; an independent catalog manages dataset tags, mirrors, and integrity metadata; and unified interfaces organize land parameters and meteorological forcing. In addition to Julia, we have adapted automatic downloading of the updated data for MATLAB, Octave, Python, and R, and added automatic data retrieval entry points for C and Fortran. These updates enable researchers to process, retrieve, and access gridded data through a consistent workflow, reducing repeated data preparation and maintenance across Earth system modeling workflows and facilitating scientific research and applications.</w:t>
+        <w:t>Earth system models rely on gridded data at regional to global scales for parameter initialization and evaluation of simulation results. Although most datasets are available in standard formats such as NetCDF, HDF, and GeoTIFF, differences in source-processing rules, unit conversion, standardized data identifiers, and distribution methods require each model to maintain its own database, creating unnecessary difficulties for continued model development and evaluation. Building on the 2022 release of GriddingMachine, this study improves data preprocessing, distribution, and data reading by introducing a standardized processing workflow, improving data-file distribution, strengthening catalog and model-input organization, and adding new standardized datasets and dataset collections. In addition to Julia, automatic downloading of the updated data is supported in MATLAB, Octave, Python, and R, with new automatic-download entry points for C and Fortran, to better serve scientific research and applications.</w:t>
       </w:r>
     </w:p>
     <w:p>

</xml_diff>

<commit_message>
align conclusion and figure captions with abstract scope
</commit_message>
<xml_diff>
--- a/论文/GriddingMachine论文初稿_v0.3_语言优化版.docx
+++ b/论文/GriddingMachine论文初稿_v0.3_语言优化版.docx
@@ -483,7 +483,7 @@
         <w:rPr>
           <w:rFonts w:ascii="Times New Roman" w:hAnsi="Times New Roman" w:eastAsia="Songti SC"/>
         </w:rPr>
-        <w:t xml:space="preserve"> across data preprocessing, distribution, and access. (b) The updated lifecycle comprises a data production and standardization layer, a catalog and trusted-distribution layer, and a model-input organization layer, connecting heterogeneous source data, a shared YAML contract, standardization and quality control, standard NetCDF data, an independent catalog, integrity-verified acquisition, and unified reading and model invocation. (c) O1--O5 denote the unified data contract, simplified data artifacts, independent catalog evolution, transactional acquisition, and model-ready interfaces. Orange dashed lines map these updates to the corresponding baseline components and core nodes in the updated workflow.</w:t>
+        <w:t xml:space="preserve"> across data preprocessing, distribution, and access. (b) The updated lifecycle comprises a data production and standardization layer, a catalog and trusted-distribution layer, and a model-input organization layer, connecting heterogeneous source data, a shared YAML contract, standardization and quality control, standard NetCDF data, an independent catalog, integrity-verified acquisition, and unified reading and model invocation. (c) O1--O5 denote the unified data contract, simplified data artifacts, independent catalog evolution, transactional acquisition, and Earth-system-model-ready interfaces. Orange dashed lines map these updates to the corresponding baseline components and core nodes in the updated workflow.</w:t>
       </w:r>
     </w:p>
     <w:p>
@@ -4265,13 +4265,13 @@
           <w:rFonts w:ascii="Times New Roman" w:hAnsi="Times New Roman" w:eastAsia="Songti SC"/>
           <w:b/>
         </w:rPr>
-        <w:t>Fig. 2 Standardization results for the OISST V2.1 product.</w:t>
-      </w:r>
-      <w:r>
-        <w:rPr>
-          <w:rFonts w:ascii="Times New Roman" w:hAnsi="Times New Roman" w:eastAsia="Songti SC"/>
-        </w:rPr>
-        <w:t xml:space="preserve"> (a) Global standardized sea-surface temperature on 25 February 2022; (b) the transformation from the four-dimensional source layout through stored-value decoding and longitude reordering to the two-dimensional standard grid; and (c) independent-reference checks of coordinates, the finite-value mask, physical values, and repeated file digests. The 1440 × 720 product contains 691,150 finite and 345,650 missing cells that match the independently decoded reference mask point by point, with a maximum absolute physical-value difference of zero and identical file digests across three runs.</w:t>
+        <w:t>Fig. 2 Standardization results for the OISST V2.1 dataset.</w:t>
+      </w:r>
+      <w:r>
+        <w:rPr>
+          <w:rFonts w:ascii="Times New Roman" w:hAnsi="Times New Roman" w:eastAsia="Songti SC"/>
+        </w:rPr>
+        <w:t xml:space="preserve"> (a) Global standardized sea-surface temperature on 25 February 2022; (b) the transformation from the four-dimensional source layout through stored-value decoding and longitude reordering to the two-dimensional standard grid; and (c) independent-reference checks of coordinates, the finite-value mask, physical values, and repeated file digests. The 1440 × 720 dataset contains 691,150 finite and 345,650 missing cells that match the independently decoded reference mask point by point, with a maximum absolute physical-value difference of zero and identical file digests across three runs.</w:t>
       </w:r>
     </w:p>
     <w:p>
@@ -4391,13 +4391,13 @@
           <w:rFonts w:ascii="Times New Roman" w:hAnsi="Times New Roman" w:eastAsia="Songti SC"/>
           <w:b/>
         </w:rPr>
-        <w:t>Fig. 3 End-to-end distribution time for the ELEV and LAI products using direct NetCDF and external `tar.gz` archives.</w:t>
-      </w:r>
-      <w:r>
-        <w:rPr>
-          <w:rFonts w:ascii="Times New Roman" w:hAnsi="Times New Roman" w:eastAsia="Songti SC"/>
-        </w:rPr>
-        <w:t xml:space="preserve"> (a) The two-dimensional ELEV product; (b) the three-dimensional LAI product. Open circles show the 10 measurements for each combination, bars show median warm-cache end-to-end time, and error bars show 95% bootstrap confidence intervals. Environment A (Windows) and environment B (macOS) used identical input files and measurement protocols. Percentages above the bars indicate the reduction in median time achieved by direct NetCDF relative to external </w:t>
+        <w:t>Fig. 3 End-to-end distribution time for the ELEV and LAI datasets using direct NetCDF and external `tar.gz` archives.</w:t>
+      </w:r>
+      <w:r>
+        <w:rPr>
+          <w:rFonts w:ascii="Times New Roman" w:hAnsi="Times New Roman" w:eastAsia="Songti SC"/>
+        </w:rPr>
+        <w:t xml:space="preserve"> (a) The two-dimensional ELEV dataset; (b) the three-dimensional LAI dataset. Open circles show the 10 measurements for each combination, bars show median warm-cache end-to-end time, and error bars show 95% bootstrap confidence intervals. Environment A (Windows) and environment B (macOS) used identical input files and measurement protocols. Percentages above the bars indicate the reduction in median time achieved by direct NetCDF relative to external </w:t>
       </w:r>
       <w:r>
         <w:rPr>

</xml_diff>

<commit_message>
Improve Figure 2 and restore Figure 3
</commit_message>
<xml_diff>
--- a/论文/GriddingMachine论文初稿_v0.3_语言优化版.docx
+++ b/论文/GriddingMachine论文初稿_v0.3_语言优化版.docx
@@ -4206,7 +4206,7 @@
       <w:r>
         <w:drawing>
           <wp:inline xmlns:a="http://schemas.openxmlformats.org/drawingml/2006/main" xmlns:pic="http://schemas.openxmlformats.org/drawingml/2006/picture">
-            <wp:extent cx="5400000" cy="3887147"/>
+            <wp:extent cx="5400000" cy="3628433"/>
             <wp:docPr id="2" name="Picture 2"/>
             <wp:cNvGraphicFramePr>
               <a:graphicFrameLocks noChangeAspect="1"/>
@@ -4227,7 +4227,7 @@
                   <pic:spPr>
                     <a:xfrm>
                       <a:off x="0" y="0"/>
-                      <a:ext cx="5400000" cy="3887147"/>
+                      <a:ext cx="5400000" cy="3628433"/>
                     </a:xfrm>
                     <a:prstGeom prst="rect"/>
                   </pic:spPr>

</xml_diff>

<commit_message>
clarify data reading interface comparison
</commit_message>
<xml_diff>
--- a/论文/GriddingMachine论文初稿_v0.3_语言优化版.docx
+++ b/论文/GriddingMachine论文初稿_v0.3_语言优化版.docx
@@ -944,52 +944,7 @@
                 <w:rFonts w:ascii="Times New Roman" w:hAnsi="Times New Roman" w:eastAsia="Songti SC"/>
                 <w:sz w:val="18"/>
               </w:rPr>
-              <w:t>读取</w:t>
-            </w:r>
-          </w:p>
-        </w:tc>
-        <w:tc>
-          <w:tcPr>
-            <w:tcW w:type="dxa" w:w="2211"/>
-          </w:tcPr>
-          <w:p>
-            <w:r>
-              <w:rPr>
-                <w:sz w:val="18"/>
-              </w:rPr>
-            </w:r>
-            <w:r>
-              <w:rPr>
-                <w:rFonts w:ascii="Consolas" w:hAnsi="Consolas" w:eastAsia="Songti SC"/>
-                <w:sz w:val="18"/>
-              </w:rPr>
-              <w:t>read_LUT</w:t>
-            </w:r>
-          </w:p>
-        </w:tc>
-        <w:tc>
-          <w:tcPr>
-            <w:tcW w:type="dxa" w:w="2211"/>
-          </w:tcPr>
-          <w:p>
-            <w:r>
-              <w:rPr>
-                <w:sz w:val="18"/>
-              </w:rPr>
-            </w:r>
-            <w:r>
-              <w:rPr>
-                <w:rFonts w:ascii="Consolas" w:hAnsi="Consolas" w:eastAsia="Songti SC"/>
-                <w:sz w:val="18"/>
-              </w:rPr>
-              <w:t>read_dataset</w:t>
-            </w:r>
-            <w:r>
-              <w:rPr>
-                <w:rFonts w:ascii="Times New Roman" w:hAnsi="Times New Roman" w:eastAsia="Songti SC"/>
-                <w:sz w:val="18"/>
-              </w:rPr>
-              <w:t>，旧名称保留为别名</w:t>
+              <w:t>数据读取接口</w:t>
             </w:r>
           </w:p>
         </w:tc>
@@ -1008,7 +963,73 @@
                 <w:rFonts w:ascii="Times New Roman" w:hAnsi="Times New Roman" w:eastAsia="Songti SC"/>
                 <w:sz w:val="18"/>
               </w:rPr>
-              <w:t>全球规则经纬网整场、周期和站点读取</w:t>
+              <w:t>以</w:t>
+            </w:r>
+            <w:r>
+              <w:rPr>
+                <w:rFonts w:ascii="Consolas" w:hAnsi="Consolas" w:eastAsia="Songti SC"/>
+                <w:sz w:val="18"/>
+              </w:rPr>
+              <w:t>read_LUT</w:t>
+            </w:r>
+            <w:r>
+              <w:rPr>
+                <w:rFonts w:ascii="Times New Roman" w:hAnsi="Times New Roman" w:eastAsia="Songti SC"/>
+                <w:sz w:val="18"/>
+              </w:rPr>
+              <w:t>读取已登记数据</w:t>
+            </w:r>
+          </w:p>
+        </w:tc>
+        <w:tc>
+          <w:tcPr>
+            <w:tcW w:type="dxa" w:w="2211"/>
+          </w:tcPr>
+          <w:p>
+            <w:r>
+              <w:rPr>
+                <w:sz w:val="18"/>
+              </w:rPr>
+            </w:r>
+            <w:r>
+              <w:rPr>
+                <w:rFonts w:ascii="Times New Roman" w:hAnsi="Times New Roman" w:eastAsia="Songti SC"/>
+                <w:sz w:val="18"/>
+              </w:rPr>
+              <w:t>以</w:t>
+            </w:r>
+            <w:r>
+              <w:rPr>
+                <w:rFonts w:ascii="Consolas" w:hAnsi="Consolas" w:eastAsia="Songti SC"/>
+                <w:sz w:val="18"/>
+              </w:rPr>
+              <w:t>read_dataset</w:t>
+            </w:r>
+            <w:r>
+              <w:rPr>
+                <w:rFonts w:ascii="Times New Roman" w:hAnsi="Times New Roman" w:eastAsia="Songti SC"/>
+                <w:sz w:val="18"/>
+              </w:rPr>
+              <w:t>统一整场、周期和格点读取，并保留旧名称别名</w:t>
+            </w:r>
+          </w:p>
+        </w:tc>
+        <w:tc>
+          <w:tcPr>
+            <w:tcW w:type="dxa" w:w="2211"/>
+          </w:tcPr>
+          <w:p>
+            <w:r>
+              <w:rPr>
+                <w:sz w:val="18"/>
+              </w:rPr>
+            </w:r>
+            <w:r>
+              <w:rPr>
+                <w:rFonts w:ascii="Times New Roman" w:hAnsi="Times New Roman" w:eastAsia="Songti SC"/>
+                <w:sz w:val="18"/>
+              </w:rPr>
+              <w:t>统一数据发现、读取和模式输入组织，降低旧接口迁移成本</w:t>
             </w:r>
           </w:p>
         </w:tc>

</xml_diff>

<commit_message>
add multilingual access comparison to table one
</commit_message>
<xml_diff>
--- a/论文/GriddingMachine论文初稿_v0.3_语言优化版.docx
+++ b/论文/GriddingMachine论文初稿_v0.3_语言优化版.docx
@@ -1030,6 +1030,84 @@
                 <w:sz w:val="18"/>
               </w:rPr>
               <w:t>统一数据发现、读取和模式输入组织，降低旧接口迁移成本</w:t>
+            </w:r>
+          </w:p>
+        </w:tc>
+      </w:tr>
+      <w:tr>
+        <w:tc>
+          <w:tcPr>
+            <w:tcW w:type="dxa" w:w="2211"/>
+          </w:tcPr>
+          <w:p>
+            <w:r>
+              <w:rPr>
+                <w:sz w:val="18"/>
+              </w:rPr>
+            </w:r>
+            <w:r>
+              <w:rPr>
+                <w:rFonts w:ascii="Times New Roman" w:hAnsi="Times New Roman" w:eastAsia="Songti SC"/>
+                <w:sz w:val="18"/>
+              </w:rPr>
+              <w:t>多语言访问</w:t>
+            </w:r>
+          </w:p>
+        </w:tc>
+        <w:tc>
+          <w:tcPr>
+            <w:tcW w:type="dxa" w:w="2211"/>
+          </w:tcPr>
+          <w:p>
+            <w:r>
+              <w:rPr>
+                <w:sz w:val="18"/>
+              </w:rPr>
+            </w:r>
+            <w:r>
+              <w:rPr>
+                <w:rFonts w:ascii="Times New Roman" w:hAnsi="Times New Roman" w:eastAsia="Songti SC"/>
+                <w:sz w:val="18"/>
+              </w:rPr>
+              <w:t>提供Julia、MATLAB、Octave、Python和R接口</w:t>
+            </w:r>
+          </w:p>
+        </w:tc>
+        <w:tc>
+          <w:tcPr>
+            <w:tcW w:type="dxa" w:w="2211"/>
+          </w:tcPr>
+          <w:p>
+            <w:r>
+              <w:rPr>
+                <w:sz w:val="18"/>
+              </w:rPr>
+            </w:r>
+            <w:r>
+              <w:rPr>
+                <w:rFonts w:ascii="Times New Roman" w:hAnsi="Times New Roman" w:eastAsia="Songti SC"/>
+                <w:sz w:val="18"/>
+              </w:rPr>
+              <w:t>在保留原有接口的基础上完善MATLAB、Octave、Python和R自动下载，并新增C和Fortran自动下载入口</w:t>
+            </w:r>
+          </w:p>
+        </w:tc>
+        <w:tc>
+          <w:tcPr>
+            <w:tcW w:type="dxa" w:w="2211"/>
+          </w:tcPr>
+          <w:p>
+            <w:r>
+              <w:rPr>
+                <w:sz w:val="18"/>
+              </w:rPr>
+            </w:r>
+            <w:r>
+              <w:rPr>
+                <w:rFonts w:ascii="Times New Roman" w:hAnsi="Times New Roman" w:eastAsia="Songti SC"/>
+                <w:sz w:val="18"/>
+              </w:rPr>
+              <w:t>扩展科研人员获取新版网格数据的编程环境</w:t>
             </w:r>
           </w:p>
         </w:tc>

</xml_diff>

<commit_message>
streamline high-level comparison table
</commit_message>
<xml_diff>
--- a/论文/GriddingMachine论文初稿_v0.3_语言优化版.docx
+++ b/论文/GriddingMachine论文初稿_v0.3_语言优化版.docx
@@ -798,7 +798,7 @@
                 <w:rFonts w:ascii="Times New Roman" w:hAnsi="Times New Roman" w:eastAsia="Songti SC"/>
                 <w:sz w:val="18"/>
               </w:rPr>
-              <w:t>；配置规范校验、事务更新和版本备份</w:t>
+              <w:t>，支持目录校验和独立更新</w:t>
             </w:r>
           </w:p>
         </w:tc>
@@ -817,7 +817,7 @@
                 <w:rFonts w:ascii="Times New Roman" w:hAnsi="Times New Roman" w:eastAsia="Songti SC"/>
                 <w:sz w:val="18"/>
               </w:rPr>
-              <w:t>数据集可独立于软件版本持续扩展</w:t>
+              <w:t>数据目录可独立于软件版本维护</w:t>
             </w:r>
           </w:p>
         </w:tc>
@@ -838,7 +838,7 @@
                 <w:rFonts w:ascii="Times New Roman" w:hAnsi="Times New Roman" w:eastAsia="Songti SC"/>
                 <w:sz w:val="18"/>
               </w:rPr>
-              <w:t>下载</w:t>
+              <w:t>数据获取</w:t>
             </w:r>
           </w:p>
         </w:tc>
@@ -876,35 +876,7 @@
                 <w:rFonts w:ascii="Times New Roman" w:hAnsi="Times New Roman" w:eastAsia="Songti SC"/>
                 <w:sz w:val="18"/>
               </w:rPr>
-              <w:t>延迟信号辅助排序；多URL回退、独立临时文件；带</w:t>
-            </w:r>
-            <w:r>
-              <w:rPr>
-                <w:rFonts w:ascii="Consolas" w:hAnsi="Consolas" w:eastAsia="Songti SC"/>
-                <w:sz w:val="18"/>
-              </w:rPr>
-              <w:t>SIZE</w:t>
-            </w:r>
-            <w:r>
-              <w:rPr>
-                <w:rFonts w:ascii="Times New Roman" w:hAnsi="Times New Roman" w:eastAsia="Songti SC"/>
-                <w:sz w:val="18"/>
-              </w:rPr>
-              <w:t>/</w:t>
-            </w:r>
-            <w:r>
-              <w:rPr>
-                <w:rFonts w:ascii="Consolas" w:hAnsi="Consolas" w:eastAsia="Songti SC"/>
-                <w:sz w:val="18"/>
-              </w:rPr>
-              <w:t>SHA256</w:t>
-            </w:r>
-            <w:r>
-              <w:rPr>
-                <w:rFonts w:ascii="Times New Roman" w:hAnsi="Times New Roman" w:eastAsia="Songti SC"/>
-                <w:sz w:val="18"/>
-              </w:rPr>
-              <w:t>条目可执行严格核验后落盘</w:t>
+              <w:t>多镜像回退、临时文件下载和完整性校验</w:t>
             </w:r>
           </w:p>
         </w:tc>
@@ -923,7 +895,7 @@
                 <w:rFonts w:ascii="Times New Roman" w:hAnsi="Times New Roman" w:eastAsia="Songti SC"/>
                 <w:sz w:val="18"/>
               </w:rPr>
-              <w:t>将镜像选择与内容完整性判定分离，支持历史目录平滑迁移</w:t>
+              <w:t>提高数据获取的可靠性和可追溯性</w:t>
             </w:r>
           </w:p>
         </w:tc>

</xml_diff>

<commit_message>
clarify artifact terminology in manuscript
</commit_message>
<xml_diff>
--- a/论文/GriddingMachine论文初稿_v0.3_语言优化版.docx
+++ b/论文/GriddingMachine论文初稿_v0.3_语言优化版.docx
@@ -258,7 +258,7 @@
         <w:rPr>
           <w:rFonts w:ascii="Times New Roman" w:hAnsi="Times New Roman" w:eastAsia="Songti SC"/>
         </w:rPr>
-        <w:t>Wang等[4]于2022年发布了基于Julia语言的GriddingMachine数据库和软件，旨在将常用于陆面和地球系统模拟的全球数据处理为具有统一空间和变量约定的NetCDF文件，并通过标签、数据库文件Artifacts.toml和Julia语言的artifact机制实现数据管理与自动下载，同时提供Julia、MATLAB、Octave、Python和R接口。2022版已经建立了统一网格约定、数据标签和多语言访问基础，但仍存在三方面局限：数据生产主要依赖数据集专用脚本，处理规则难以共享；标准化数据以带有标签文件的</w:t>
+        <w:t>Wang等[4]于2022年发布了基于Julia语言的GriddingMachine数据库和软件，旨在将常用于陆面和地球系统模拟的全球数据处理为具有统一空间和变量约定的NetCDF文件，并通过标签、数据库文件Artifacts.toml和Julia语言的 artifact 机制（构建产物管理机制）实现数据管理与自动下载，同时提供Julia、MATLAB、Octave、Python和R接口。2022版已经建立了统一网格约定、数据标签和多语言访问基础，但仍存在三方面局限：数据生产主要依赖数据集专用脚本，处理规则难以共享；标准化数据以带有标签文件的</w:t>
       </w:r>
       <w:r>
         <w:rPr>
@@ -471,7 +471,7 @@
         <w:rPr>
           <w:rFonts w:ascii="Times New Roman" w:hAnsi="Times New Roman" w:eastAsia="Songti SC"/>
         </w:rPr>
-        <w:t xml:space="preserve"> artifacts, an in-package catalog, and </w:t>
+        <w:t xml:space="preserve"> archive files, an in-package catalog, and </w:t>
       </w:r>
       <w:r>
         <w:rPr>
@@ -483,7 +483,7 @@
         <w:rPr>
           <w:rFonts w:ascii="Times New Roman" w:hAnsi="Times New Roman" w:eastAsia="Songti SC"/>
         </w:rPr>
-        <w:t xml:space="preserve"> across data preprocessing, distribution, and access. (b) The updated lifecycle comprises a data production and standardization layer, a catalog and trusted-distribution layer, and a model-input organization layer, connecting heterogeneous source data, a shared YAML contract, standardization and quality control, standard NetCDF data, an independent catalog, integrity-verified acquisition, and unified reading and model invocation. (c) O1--O5 denote the unified data contract, simplified data artifacts, independent catalog evolution, transactional acquisition, and Earth-system-model-ready interfaces. Orange dashed lines map these updates to the corresponding baseline components and core nodes in the updated workflow.</w:t>
+        <w:t xml:space="preserve"> across data preprocessing, distribution, and access. (b) The updated lifecycle comprises a data production and standardization layer, a catalog and trusted-distribution layer, and a model-input organization layer, connecting heterogeneous source data, a shared YAML contract, standardization and quality control, standard NetCDF data, an independent catalog, integrity-verified acquisition, and unified reading and model invocation. (c) O1--O5 denote the unified data contract, simplified data files, independent catalog evolution, transactional acquisition, and Earth-system-model-ready interfaces. Orange dashed lines map these updates to the corresponding baseline components and core nodes in the updated workflow.</w:t>
       </w:r>
     </w:p>
     <w:p>
@@ -673,7 +673,7 @@
                 <w:rFonts w:ascii="Times New Roman" w:hAnsi="Times New Roman" w:eastAsia="Songti SC"/>
                 <w:sz w:val="18"/>
               </w:rPr>
-              <w:t xml:space="preserve"> artifact</w:t>
+              <w:t>归档文件</w:t>
             </w:r>
           </w:p>
         </w:tc>
@@ -857,7 +857,7 @@
                 <w:rFonts w:ascii="Times New Roman" w:hAnsi="Times New Roman" w:eastAsia="Songti SC"/>
                 <w:sz w:val="18"/>
               </w:rPr>
-              <w:t>artifact哈希寻址、多个URL和解包</w:t>
+              <w:t>artifact 哈希寻址、多个 URL 和解包</w:t>
             </w:r>
           </w:p>
         </w:tc>

</xml_diff>

<commit_message>
Unify prose terminology and preserve configuration identifiers
</commit_message>
<xml_diff>
--- a/论文/GriddingMachine论文初稿_v0.3_语言优化版.docx
+++ b/论文/GriddingMachine论文初稿_v0.3_语言优化版.docx
@@ -258,7 +258,7 @@
         <w:rPr>
           <w:rFonts w:ascii="Times New Roman" w:hAnsi="Times New Roman" w:eastAsia="Songti SC"/>
         </w:rPr>
-        <w:t>Wang等[4]于2022年发布了基于Julia语言的GriddingMachine数据库和软件，旨在将常用于陆面和地球系统模拟的全球数据处理为具有统一空间和变量约定的NetCDF文件，并通过标签、数据库文件Artifacts.toml和Julia语言的 artifact 机制（构建产物管理机制）实现数据管理与自动下载，同时提供Julia、MATLAB、Octave、Python和R接口。2022版已经建立了统一网格约定、数据标签和多语言访问基础，但仍存在三方面局限：数据生产主要依赖数据集专用脚本，处理规则难以共享；标准化数据以带有标签文件的</w:t>
+        <w:t>Wang等[4]于2022年发布了基于Julia语言的GriddingMachine数据库和软件，旨在将常用于陆面和地球系统模拟的全球数据处理为具有统一空间和变量约定的NetCDF文件，并通过标签、数据库文件Artifacts.toml和Julia语言的 artifact 机制（构建产物管理机制）实现数据管理与自动下载，同时提供Julia、Matlab、Octave、Python和R接口。2022版已经建立了统一网格约定、数据标签和多语言访问基础，但仍存在三方面局限：数据生产主要依赖数据集专用脚本，处理规则难以共享；标准化数据以带有标签文件的</w:t>
       </w:r>
       <w:r>
         <w:rPr>
@@ -286,7 +286,7 @@
         <w:rPr>
           <w:rFonts w:ascii="Times New Roman" w:hAnsi="Times New Roman" w:eastAsia="Songti SC"/>
         </w:rPr>
-        <w:t>本文在 2022 版 GriddingMachine 基础上，更新数据预处理、数据分发和数据读取流程，形成数据生产与标准化、数据目录与获取、模式输入组织三个相互衔接的环节。数据生产与标准化层以共享 YAML 配置规范表达源维度、坐标、数值变换和缺失值填补（Gapfill）以及质量控制；数据目录与获取层以逻辑标签连接数据副本，并对登记了文件字节数和 SHA-256 的条目执行内容核验；模式输入组织层通过统一读取、陆面参数融合和气象驱动组织形成满足模式接口要求的数据结构。</w:t>
+        <w:t>本文在 2022 版 GriddingMachine 基础上，更新数据预处理、数据分发和数据读取流程，形成数据生产与标准化、数据目录与获取、模式输入组织三个相互衔接的环节。数据生产与标准化层以共享 YAML 配置规范表达源维度、坐标、数值变换和缺失值填补（gap filling）及质量控制；数据目录与获取层以逻辑标签连接数据副本，并对登记了文件字节数和 SHA-256 的条目执行内容核验；模式输入组织层通过统一读取、陆面参数融合和气象驱动组织形成满足模式接口要求的数据结构。</w:t>
       </w:r>
     </w:p>
     <w:p>
@@ -294,7 +294,7 @@
         <w:rPr>
           <w:rFonts w:ascii="Times New Roman" w:hAnsi="Times New Roman" w:eastAsia="Songti SC"/>
         </w:rPr>
-        <w:t>在上述框架基础上，研究通过受控数据处理实例、真实网格数据标准化、网络镜像获取和模式输入案例，评价新版框架的数据一致性、可执行性和接口适配能力；同时适配 MATLAB、Octave、Python 和 R 对新版数据的自动获取，并新增 C 和 Fortran 的自动获取入口。</w:t>
+        <w:t>在上述框架基础上，研究通过受控数据处理实例、真实网格数据标准化、网络镜像获取和模式输入案例，评价新版框架的数据一致性、可执行性和接口适配能力；同时适配 Matlab、Octave、Python 和 R 对新版数据的自动获取，并新增 C 和 Fortran 的自动获取入口。</w:t>
       </w:r>
     </w:p>
     <w:p>
@@ -1041,7 +1041,7 @@
                 <w:rFonts w:ascii="Times New Roman" w:hAnsi="Times New Roman" w:eastAsia="Songti SC"/>
                 <w:sz w:val="18"/>
               </w:rPr>
-              <w:t>提供Julia、MATLAB、Octave、Python和R接口</w:t>
+              <w:t>提供Julia、Matlab、Octave、Python和R接口</w:t>
             </w:r>
           </w:p>
         </w:tc>
@@ -1060,7 +1060,7 @@
                 <w:rFonts w:ascii="Times New Roman" w:hAnsi="Times New Roman" w:eastAsia="Songti SC"/>
                 <w:sz w:val="18"/>
               </w:rPr>
-              <w:t>在保留原有接口的基础上完善MATLAB、Octave、Python和R自动下载，并新增C和Fortran自动下载入口</w:t>
+              <w:t>在保留原有接口的基础上完善Matlab、Octave、Python和R自动下载，并新增C和Fortran自动下载入口</w:t>
             </w:r>
           </w:p>
         </w:tc>
@@ -1766,7 +1766,7 @@
                 <w:rFonts w:ascii="Times New Roman" w:hAnsi="Times New Roman" w:eastAsia="Songti SC"/>
                 <w:sz w:val="18"/>
               </w:rPr>
-              <w:t>Gapfill与范围</w:t>
+              <w:t>缺失值填补与范围</w:t>
             </w:r>
           </w:p>
         </w:tc>
@@ -1785,7 +1785,7 @@
                 <w:rFonts w:ascii="Times New Roman" w:hAnsi="Times New Roman" w:eastAsia="Songti SC"/>
                 <w:sz w:val="18"/>
               </w:rPr>
-              <w:t>有效范围、填充值和Gapfill策略由YAML显式声明</w:t>
+              <w:t>有效范围、填充值和缺失值填补策略由YAML显式声明</w:t>
             </w:r>
           </w:p>
         </w:tc>
@@ -1973,7 +1973,7 @@
                 <w:rFonts w:ascii="Times New Roman" w:hAnsi="Times New Roman" w:eastAsia="Songti SC"/>
                 <w:sz w:val="18"/>
               </w:rPr>
-              <w:t>YAML声明维度、坐标、数值与Gapfill规则；NetCDF属性写入逐项变更记录</w:t>
+              <w:t>YAML声明维度、坐标、数值与缺失值填补规则；NetCDF属性写入逐项变更记录</w:t>
             </w:r>
           </w:p>
         </w:tc>
@@ -2289,7 +2289,7 @@
         <w:rPr>
           <w:rFonts w:ascii="Times New Roman" w:hAnsi="Times New Roman" w:eastAsia="Songti SC"/>
         </w:rPr>
-        <w:t>分别检查陆地区域与全域的数据完整性。Gapfill由此统一连接有效范围过滤、陆海掩膜、缺失值处置和输出精度，为不同地球系统数据集提供可配置的数据完善方法。高程数据（ELEV）采用常数0填补策略，为统一读取和模式调用提供连续地形场。</w:t>
+        <w:t>分别检查陆地区域与全域的数据完整性。缺失值填补由此统一连接有效范围过滤、陆海掩膜、缺失值处置和输出精度，为不同地球系统数据集提供可配置的数据完善方法。高程数据（ELEV）采用常数0填补策略，为统一读取和模式调用提供连续地形场。</w:t>
       </w:r>
     </w:p>
     <w:p>
@@ -2623,7 +2623,7 @@
         <w:rPr>
           <w:rFonts w:ascii="Times New Roman" w:hAnsi="Times New Roman" w:eastAsia="Songti SC"/>
         </w:rPr>
-        <w:t>生产流程在保存前检查维度、坐标、变量、数值范围和Gapfill结果，空间方向图进一步呈现坐标语义。质量控制完成后生成</w:t>
+        <w:t>生产流程在保存前检查维度、坐标、变量、数值范围和缺失值填补结果，空间方向图进一步呈现坐标语义。质量控制完成后生成</w:t>
       </w:r>
       <w:r>
         <w:rPr>
@@ -2941,7 +2941,7 @@
         <w:rPr>
           <w:rFonts w:ascii="Times New Roman" w:hAnsi="Times New Roman" w:eastAsia="Songti SC"/>
         </w:rPr>
-        <w:t>格点尺度陆面参数组织接口从预定义数据集合中提取土壤、冠层、叶片、地形、陆地掩膜和植物功能型数据，依据陆面状态融合相应参数，并对叶面积指数、叶绿素、冠层聚集度和最大羧化速率等季节序列执行Gapfill与逐日重采样。第二套陆面参数集合</w:t>
+        <w:t>格点尺度陆面参数组织接口从预定义数据集合中提取土壤、冠层、叶片、地形、陆地掩膜和植物功能型数据，依据陆面状态融合相应参数，并对叶面积指数、叶绿素、冠层聚集度和最大羧化速率等季节序列执行缺失值填补与逐日重采样。第二套陆面参数集合</w:t>
       </w:r>
       <w:r>
         <w:rPr>
@@ -3080,7 +3080,7 @@
         <w:rPr>
           <w:rFonts w:ascii="Times New Roman" w:hAnsi="Times New Roman" w:eastAsia="Songti SC"/>
         </w:rPr>
-        <w:t>为衔接不同科研编程环境，新版提供MATLAB、Octave、Python和R的数据下载入口，并增加C和Fortran入口。非Julia入口调用同一Python下载脚本，使用时需要Python 3运行环境。MATLAB/Octave函数、R函数及C和Fortran程序接收文件URL和本地输出路径，调用脚本完成直接NetCDF下载；Python脚本还支持依据本地Artifacts.yaml中的标签查找下载地址，并在目录或调用参数提供相应信息时检查文件大小和SHA-256。</w:t>
+        <w:t>为衔接不同科研编程环境，新版提供Matlab、Octave、Python和R的数据下载入口，并增加C和Fortran入口。非Julia入口调用同一Python下载脚本，使用时需要Python 3运行环境。Matlab/Octave函数、R函数及C和Fortran程序接收文件URL和本地输出路径，调用脚本完成直接NetCDF下载；Python脚本还支持依据本地Artifacts.yaml中的标签查找下载地址，并在目录或调用参数提供相应信息时检查文件大小和SHA-256。</w:t>
       </w:r>
     </w:p>
     <w:p>
@@ -3676,7 +3676,7 @@
         <w:rPr>
           <w:rFonts w:ascii="Times New Roman" w:hAnsi="Times New Roman" w:eastAsia="Songti SC"/>
         </w:rPr>
-        <w:t>经度平移、线性缩放、范围过滤、Gapfill、</w:t>
+        <w:t>经度平移、线性缩放、范围过滤、缺失值填补、</w:t>
       </w:r>
       <w:r>
         <w:rPr>
@@ -3696,7 +3696,7 @@
         <w:rPr>
           <w:rFonts w:ascii="Times New Roman" w:hAnsi="Times New Roman" w:eastAsia="Songti SC"/>
         </w:rPr>
-        <w:t>共享生产契约的受控评价从维度、坐标、数值、Gapfill、YAML配置、输出和空间方向7个方面组织31组代表性处理实例。各组对应生产流程中的一个关键操作，并以结构、逐点数值或数据集状态表征标准化结果；完整分类矩阵见补充材料S4。</w:t>
+        <w:t>共享生产契约的受控评价从维度、坐标、数值、缺失值填补、YAML配置、输出和空间方向7个方面组织31组代表性处理实例。各组对应生产流程中的一个关键操作，并以结构、逐点数值或数据集状态表征标准化结果；完整分类矩阵见补充材料S4。</w:t>
       </w:r>
     </w:p>
     <w:p>
@@ -3704,7 +3704,7 @@
         <w:rPr>
           <w:rFonts w:ascii="Times New Roman" w:hAnsi="Times New Roman" w:eastAsia="Songti SC"/>
         </w:rPr>
-        <w:t>数据集质量控制覆盖变量、维度、形状、属性、坐标方向、数值范围和Gapfill结果。输出数组与位置编码参照逐点对应，Float32转换采用统一的绝对和相对容差；配置与数据集状态通过明确的流程信息反馈给维护者。质量报告同步保存最大绝对误差、最大相对误差、处理历史和重复生产一致性。</w:t>
+        <w:t>数据集质量控制覆盖变量、维度、形状、属性、坐标方向、数值范围和缺失值填补结果。输出数组与位置编码参照逐点对应，Float32转换采用统一的绝对和相对容差；配置与数据集状态通过明确的流程信息反馈给维护者。质量报告同步保存最大绝对误差、最大相对误差、处理历史和重复生产一致性。</w:t>
       </w:r>
     </w:p>
     <w:p>
@@ -4172,7 +4172,7 @@
         <w:rPr>
           <w:rFonts w:ascii="Times New Roman" w:hAnsi="Times New Roman" w:eastAsia="Songti SC"/>
         </w:rPr>
-        <w:t>31组处理实例覆盖维度、坐标、数值、Gapfill、配置、输出和空间方向控制，其中29组非交互实例在三系统持续集成环境中获得一致的数据集结构和逐点数值结果；人工空间审核分别接受正向图并识别南北反转图，与预设方向结果一致。数据贡献案例进一步贯通YAML配置、标准化数据生成、目录登记和下游读取，生成数据集与参考数组逐点一致，目录中的文件字节数和SHA-256与数据集相符。</w:t>
+        <w:t>31组处理实例覆盖维度、坐标、数值、缺失值填补、配置、输出和空间方向控制，其中29组非交互实例在三系统持续集成环境中获得一致的数据集结构和逐点数值结果；人工空间审核分别接受正向图并识别南北反转图，与预设方向结果一致。数据贡献案例进一步贯通YAML配置、标准化数据生成、目录登记和下游读取，生成数据集与参考数组逐点一致，目录中的文件字节数和SHA-256与数据集相符。</w:t>
       </w:r>
     </w:p>
     <w:p>
@@ -4567,7 +4567,19 @@
         <w:rPr>
           <w:rFonts w:ascii="Times New Roman" w:hAnsi="Times New Roman" w:eastAsia="Songti SC"/>
         </w:rPr>
-        <w:t>与SHA-256，V1和V1_R1文件以不同后缀并行保留。空缓存Collector实例按V1逻辑标签获取R1文件并通过完整性核验，第二次调用直接复用正式缓存。该案例表明，目录更新能够承接数据修订，同时保持下游逻辑标签和调用接口稳定。</w:t>
+        <w:t>与</w:t>
+      </w:r>
+      <w:r>
+        <w:rPr>
+          <w:rFonts w:ascii="Consolas" w:hAnsi="Consolas" w:eastAsia="Songti SC"/>
+        </w:rPr>
+        <w:t>SHA256</w:t>
+      </w:r>
+      <w:r>
+        <w:rPr>
+          <w:rFonts w:ascii="Times New Roman" w:hAnsi="Times New Roman" w:eastAsia="Songti SC"/>
+        </w:rPr>
+        <w:t>字段，V1和V1_R1文件以不同后缀并行保留。空缓存Collector实例按V1逻辑标签获取R1文件并通过完整性核验，第二次调用直接复用正式缓存。该案例表明，目录更新能够承接数据修订，同时保持下游逻辑标签和调用接口稳定。</w:t>
       </w:r>
     </w:p>
     <w:p>

</xml_diff>

<commit_message>
explain specialized parameters and abbreviations
</commit_message>
<xml_diff>
--- a/论文/GriddingMachine论文初稿_v0.3_语言优化版.docx
+++ b/论文/GriddingMachine论文初稿_v0.3_语言优化版.docx
@@ -2770,7 +2770,7 @@
         <w:rPr>
           <w:rFonts w:ascii="Times New Roman" w:hAnsi="Times New Roman" w:eastAsia="Songti SC"/>
         </w:rPr>
-        <w:t>。数据发布与目录登记相互解耦：维护者可将标准NetCDF发布到机构文件传输协议（File Transfer Protocol，FTP）服务器、HTTP(S)服务或Zenodo科研资源存储平台，目录生成器根据本地权威文件和公开地址生成逻辑路径、去重镜像列表，并对新登记或需要严格完整性管理的条目计算文件字节数和SHA-256。目录通过临时文件写入和替换，使数据集列表、镜像位置和完整性元数据能够独立于访问软件版本更新。</w:t>
+        <w:t>。数据发布与目录登记相互解耦：维护者可将标准NetCDF发布到机构文件传输协议（File Transfer Protocol，FTP）服务器、超文本传输协议（HTTP/HTTPS）服务或Zenodo科研资源存储平台，目录生成器根据本地权威文件和公开地址生成逻辑路径、去重镜像列表，并对新登记或需要严格完整性管理的条目计算文件字节数和SHA-256。目录通过临时文件写入和替换，使数据集列表、镜像位置和完整性元数据能够独立于访问软件版本更新。</w:t>
       </w:r>
     </w:p>
     <w:p>
@@ -2961,7 +2961,7 @@
         <w:rPr>
           <w:rFonts w:ascii="Times New Roman" w:hAnsi="Times New Roman" w:eastAsia="Songti SC"/>
         </w:rPr>
-        <w:t>植物功能型比例进一步用于融合C3/C4植被的叶片光学参数和Medlyn气孔参数，并由</w:t>
+        <w:t xml:space="preserve">植物功能型比例进一步用于融合 C3 和 C4 植物的叶片光学参数与 Medlyn 气孔导度模型参数，并由 25 ℃下最大羧化速率 </w:t>
       </w:r>
       <w:r>
         <w:rPr>
@@ -2973,7 +2973,7 @@
         <w:rPr>
           <w:rFonts w:ascii="Times New Roman" w:hAnsi="Times New Roman" w:eastAsia="Songti SC"/>
         </w:rPr>
-        <w:t>推导</w:t>
+        <w:t xml:space="preserve"> 推导最大电子传递速率 </w:t>
       </w:r>
       <w:r>
         <w:rPr>
@@ -2985,7 +2985,7 @@
         <w:rPr>
           <w:rFonts w:ascii="Times New Roman" w:hAnsi="Times New Roman" w:eastAsia="Songti SC"/>
         </w:rPr>
-        <w:t>和</w:t>
+        <w:t xml:space="preserve"> 和细胞色素 b6f 复合体参数 </w:t>
       </w:r>
       <w:r>
         <w:rPr>
@@ -2997,7 +2997,7 @@
         <w:rPr>
           <w:rFonts w:ascii="Times New Roman" w:hAnsi="Times New Roman" w:eastAsia="Songti SC"/>
         </w:rPr>
-        <w:t>。输出涵盖位置、分辨率、年份、CO₂、土壤水力性质、冠层结构、植物功能型组成、叶片生物物理和光合参数；字段完整性与</w:t>
+        <w:t xml:space="preserve">。输出涵盖位置、分辨率、年份、二氧化碳（CO₂）、土壤水力性质、冠层结构、植物功能型组成、叶片生物物理和光合参数；字段完整性与缺失值标记 </w:t>
       </w:r>
       <w:r>
         <w:rPr>
@@ -3009,7 +3009,7 @@
         <w:rPr>
           <w:rFonts w:ascii="Times New Roman" w:hAnsi="Times New Roman" w:eastAsia="Songti SC"/>
         </w:rPr>
-        <w:t>状态同步进入质量控制。多个标准化数据由此形成结构一致的格点级模式输入。</w:t>
+        <w:t xml:space="preserve"> 状态同步进入质量控制。多个标准化数据由此形成结构一致的格点级模式输入。</w:t>
       </w:r>
     </w:p>
     <w:p>
@@ -3029,7 +3029,7 @@
         <w:rPr>
           <w:rFonts w:ascii="Times New Roman" w:hAnsi="Times New Roman" w:eastAsia="Songti SC"/>
         </w:rPr>
-        <w:t>中的8类第五代全球再分析数据（ERA5）[6]，分别提取地表气压、降水、漫射与直射短波辐射、长波辐射、气温、水汽压亏缺和风速，并依据格点经度换算时区偏移、构建浮点年积日</w:t>
+        <w:t>中的8类第五代全球再分析数据（ERA5）[6]，分别提取地表气压、降水、漫射与直射短波辐射、长波辐射、气温、水汽压亏缺和风速，并依据格点经度换算时区偏移、构建浮点年积日（fractional day of year，</w:t>
       </w:r>
       <w:r>
         <w:rPr>
@@ -3041,7 +3041,7 @@
         <w:rPr>
           <w:rFonts w:ascii="Times New Roman" w:hAnsi="Times New Roman" w:eastAsia="Songti SC"/>
         </w:rPr>
-        <w:t>。接口既可直接按经纬度读取，也可从已经加载的全局气象数组提取格点序列，输出字段完整性与</w:t>
+        <w:t>）。接口既可直接按经纬度读取，也可从已经加载的全局气象数组提取格点序列，输出字段完整性与</w:t>
       </w:r>
       <w:r>
         <w:rPr>

</xml_diff>

<commit_message>
identify NetCDF attributes in reference workflow
</commit_message>
<xml_diff>
--- a/论文/GriddingMachine论文初稿_v0.3_语言优化版.docx
+++ b/论文/GriddingMachine论文初稿_v0.3_语言优化版.docx
@@ -3851,7 +3851,7 @@
         <w:rPr>
           <w:rFonts w:ascii="Times New Roman" w:hAnsi="Times New Roman" w:eastAsia="Songti SC"/>
         </w:rPr>
-        <w:t>独立参考流程直接读取未缩放的Int16存储值，根据原始</w:t>
+        <w:t xml:space="preserve">独立参考流程直接读取未缩放的Int16存储值，根据原始 NetCDF 变量属性 </w:t>
       </w:r>
       <w:r>
         <w:rPr>
@@ -3875,7 +3875,7 @@
         <w:rPr>
           <w:rFonts w:ascii="Times New Roman" w:hAnsi="Times New Roman" w:eastAsia="Songti SC"/>
         </w:rPr>
-        <w:t>和</w:t>
+        <w:t xml:space="preserve"> 和 </w:t>
       </w:r>
       <w:r>
         <w:rPr>
@@ -3887,7 +3887,7 @@
         <w:rPr>
           <w:rFonts w:ascii="Times New Roman" w:hAnsi="Times New Roman" w:eastAsia="Songti SC"/>
         </w:rPr>
-        <w:t>构造物理值与缺失值掩膜，并独立计算目标经度索引。参考结果记录全场统计量、10个确定性有效格点和10个缺失格点。标准化数据连续生成3次，逐点比较坐标、有效值掩膜和物理值；随后由权威文件生成包含逻辑路径、镜像地址、字节数和SHA-256的目录条目，通过回环HTTP执行事务式下载，并以统一读取接口完成整场核对。</w:t>
+        <w:t xml:space="preserve"> 构造物理值与缺失值掩膜，并独立计算目标经度索引。参考结果记录全场统计量、10个确定性有效格点和10个缺失格点。标准化数据连续生成3次，逐点比较坐标、有效值掩膜和物理值；随后由权威文件生成包含逻辑路径、镜像地址、字节数和SHA-256的目录条目，通过回环HTTP执行事务式下载，并以统一读取接口完成整场核对。</w:t>
       </w:r>
     </w:p>
     <w:p>

</xml_diff>

<commit_message>
place university abbreviation at first occurrence
</commit_message>
<xml_diff>
--- a/论文/GriddingMachine论文初稿_v0.3_语言优化版.docx
+++ b/论文/GriddingMachine论文初稿_v0.3_语言优化版.docx
@@ -4033,7 +4033,7 @@
         <w:rPr>
           <w:rFonts w:ascii="Times New Roman" w:hAnsi="Times New Roman" w:eastAsia="Songti SC"/>
         </w:rPr>
-        <w:t>字段的代表性标签，对各文件—镜像组合开展重复下载，记录候选顺序、传输时间、字节数和SHA-256。公共网络观测刻画Zenodo镜像获取特征；中科大校园网实验对FTP与Zenodo执行同文件只读下载，共形成24次完整性记录。实验数据与环境信息随可复现材料归档。</w:t>
+        <w:t>字段的代表性标签，对各文件—镜像组合开展重复下载，记录候选顺序、传输时间、字节数和SHA-256。公共网络观测刻画Zenodo镜像获取特征；中国科学技术大学（以下简称中科大）校园网实验对FTP与Zenodo执行同文件只读下载，共形成24次完整性记录。实验数据与环境信息随可复现材料归档。</w:t>
       </w:r>
     </w:p>
     <w:p>
@@ -4060,7 +4060,7 @@
         <w:rPr>
           <w:rFonts w:ascii="Times New Roman" w:hAnsi="Times New Roman" w:eastAsia="Songti SC"/>
         </w:rPr>
-        <w:t>真实气象案例使用同一年度的8类ERA5标准化数据[6]：地表气压、降水、漫射与直射短波辐射、长波辐射、气温、水汽压亏缺和风速。八文件从中国科学技术大学（以下简称中科大）机构FTP只读获取，总大小为12 575 376 138字节，并逐文件记录SHA-256。US-NR1坐标（40.0329°N、105.5464°W）由规则索引映射到40.5°N、105.5°W格点；2020年为闰年，预期每个字段包含8784个逐小时值。实验同时核对8个</w:t>
+        <w:t>真实气象案例使用同一年度的8类ERA5标准化数据[6]：地表气压、降水、漫射与直射短波辐射、长波辐射、气温、水汽压亏缺和风速。八文件从中科大机构FTP只读获取，总大小为12 575 376 138字节，并逐文件记录SHA-256。US-NR1坐标（40.0329°N、105.5464°W）由规则索引映射到40.5°N、105.5°W格点；2020年为闰年，预期每个字段包含8784个逐小时值。实验同时核对8个</w:t>
       </w:r>
       <w:r>
         <w:rPr>

</xml_diff>

<commit_message>
standardize campus network terminology
</commit_message>
<xml_diff>
--- a/论文/GriddingMachine论文初稿_v0.3_语言优化版.docx
+++ b/论文/GriddingMachine论文初稿_v0.3_语言优化版.docx
@@ -3368,7 +3368,7 @@
                 <w:rFonts w:ascii="Times New Roman" w:hAnsi="Times New Roman" w:eastAsia="Songti SC"/>
                 <w:sz w:val="18"/>
               </w:rPr>
-              <w:t>Zenodo公共网络记录；校园网FTP—Zenodo同文件获取</w:t>
+              <w:t>Zenodo公共网络记录；中科大校内网 FTP—Zenodo同文件获取</w:t>
             </w:r>
           </w:p>
         </w:tc>
@@ -4033,7 +4033,7 @@
         <w:rPr>
           <w:rFonts w:ascii="Times New Roman" w:hAnsi="Times New Roman" w:eastAsia="Songti SC"/>
         </w:rPr>
-        <w:t>字段的代表性标签，对各文件—镜像组合开展重复下载，记录候选顺序、传输时间、字节数和SHA-256。公共网络观测刻画Zenodo镜像获取特征；中国科学技术大学（以下简称中科大）校园网实验对FTP与Zenodo执行同文件只读下载，共形成24次完整性记录。实验数据与环境信息随可复现材料归档。</w:t>
+        <w:t>字段的代表性标签，对各文件—镜像组合开展重复下载，记录候选顺序、传输时间、字节数和SHA-256。公共网络观测刻画Zenodo镜像获取特征；中科大校内网实验对FTP与Zenodo执行同文件只读下载，共形成24次完整性记录。实验数据与环境信息随可复现材料归档。</w:t>
       </w:r>
     </w:p>
     <w:p>
@@ -4523,7 +4523,7 @@
         <w:rPr>
           <w:rFonts w:ascii="Times New Roman" w:hAnsi="Times New Roman" w:eastAsia="Songti SC"/>
         </w:rPr>
-        <w:t>校园网双镜像实验是另一组独立记录：4个数据集分别从FTP和Zenodo重复获取3次，两类镜像各形成12次下载，共24次结果，均达到登记字节数并通过SHA-256核验。在本组校园网观测中，延迟辅助排序与实际传输顺序一致，机构镜像与公共镜像提供了内容一致的分发副本；分数据集传输时间与网络记录列于补充材料。</w:t>
+        <w:t>中科大校内网双镜像实验是另一组独立记录：4个数据集分别从FTP和Zenodo重复获取3次，两类镜像各形成12次下载，共24次结果，均达到登记字节数并通过SHA-256核验。在本组校园网观测中，延迟辅助排序与实际传输顺序一致，机构镜像与公共镜像提供了内容一致的分发副本；分数据集传输时间与网络记录列于补充材料。</w:t>
       </w:r>
     </w:p>
     <w:p>
@@ -4701,7 +4701,7 @@
         <w:rPr>
           <w:rFonts w:ascii="Times New Roman" w:hAnsi="Times New Roman" w:eastAsia="Songti SC"/>
         </w:rPr>
-        <w:t>Windows和macOS本地环境进一步完成ELEV/LAI性能测量及镜像故障场景，独立公共网络记录完成Zenodo内容核验；校园网环境完成FTP—Zenodo同文件对照，US-NR1案例完成真实陆面与气象数据集的模式输入组织。持续集成、独立环境观测和真实数据案例共同构成分层复现证据，具体系统—模块对应关系列于补充材料S5。</w:t>
+        <w:t>Windows和macOS本地环境进一步完成ELEV/LAI性能测量及镜像故障场景，独立公共网络记录完成Zenodo内容核验；中科大校内网环境完成FTP—Zenodo同文件对照，US-NR1案例完成真实陆面与气象数据集的模式输入组织。持续集成、独立环境观测和真实数据案例共同构成分层复现证据，具体系统—模块对应关系列于补充材料S5。</w:t>
       </w:r>
     </w:p>
     <w:p>
@@ -4863,7 +4863,7 @@
         <w:rPr>
           <w:rFonts w:ascii="Times New Roman" w:hAnsi="Times New Roman" w:eastAsia="Songti SC"/>
         </w:rPr>
-        <w:t>受控实例和真实数据案例为上述更新提供了验证。OISST标准化后的有效格点与独立参考逐点一致；ELEV和LAI在两个测试环境中采用直接NetCDF分发，缩短了缓存预热后的端到端访问时间并使逻辑临时占用约减半；校园网FTP与Zenodo的24次获取均通过文件大小和SHA-256核验。US-NR1案例中，14类陆面数据和8类ERA5逐时数据形成模式输入，各气象字段的8784个时间步与底层读取一致，并完成Emerald初始化和60 s首步计算。</w:t>
+        <w:t>受控实例和真实数据案例为上述更新提供了验证。OISST标准化后的有效格点与独立参考逐点一致；ELEV和LAI在两个测试环境中采用直接NetCDF分发，缩短了缓存预热后的端到端访问时间并使逻辑临时占用约减半；中科大校内网 FTP与Zenodo的24次获取均通过文件大小和SHA-256核验。US-NR1案例中，14类陆面数据和8类ERA5逐时数据形成模式输入，各气象字段的8784个时间步与底层读取一致，并完成Emerald初始化和60 s首步计算。</w:t>
       </w:r>
     </w:p>
     <w:p>

</xml_diff>

<commit_message>
standardize public network scenario wording
</commit_message>
<xml_diff>
--- a/论文/GriddingMachine论文初稿_v0.3_语言优化版.docx
+++ b/论文/GriddingMachine论文初稿_v0.3_语言优化版.docx
@@ -4033,7 +4033,7 @@
         <w:rPr>
           <w:rFonts w:ascii="Times New Roman" w:hAnsi="Times New Roman" w:eastAsia="Songti SC"/>
         </w:rPr>
-        <w:t>字段的代表性标签，对各文件—镜像组合开展重复下载，记录候选顺序、传输时间、字节数和SHA-256。公共网络观测刻画Zenodo镜像获取特征；中科大校内网实验对FTP与Zenodo执行同文件只读下载，共形成24次完整性记录。实验数据与环境信息随可复现材料归档。</w:t>
+        <w:t>字段的代表性标签，对各文件—镜像组合开展重复下载，记录候选顺序、传输时间、字节数和SHA-256。公共网络场景刻画Zenodo镜像获取特征；中科大校内网实验对FTP与Zenodo执行同文件只读下载，共形成24次完整性记录。实验数据与环境信息随可复现材料归档。</w:t>
       </w:r>
     </w:p>
     <w:p>
@@ -4515,7 +4515,7 @@
         <w:rPr>
           <w:rFonts w:ascii="Times New Roman" w:hAnsi="Times New Roman" w:eastAsia="Songti SC"/>
         </w:rPr>
-        <w:t>在校外公共网络观测中，两个独立环境分别对4个Zenodo标签重复获取3次，共形成24次下载记录，全部达到登记字节数并通过SHA-256核验。下载时间随文件规模呈梯度变化，重复传输的SHA-256摘要与目录登记值一致，体现了公共镜像、事务式获取和完整性校验的协同作用。</w:t>
+        <w:t>在公共网络场景中，两个独立环境分别对4个Zenodo标签重复获取3次，共形成24次下载记录，全部达到登记字节数并通过SHA-256核验。下载时间随文件规模呈梯度变化，重复传输的SHA-256摘要与目录登记值一致，体现了公共镜像、事务式获取和完整性校验的协同作用。</w:t>
       </w:r>
     </w:p>
     <w:p>
@@ -4523,7 +4523,7 @@
         <w:rPr>
           <w:rFonts w:ascii="Times New Roman" w:hAnsi="Times New Roman" w:eastAsia="Songti SC"/>
         </w:rPr>
-        <w:t>中科大校内网双镜像实验是另一组独立记录：4个数据集分别从FTP和Zenodo重复获取3次，两类镜像各形成12次下载，共24次结果，均达到登记字节数并通过SHA-256核验。在本组校园网观测中，延迟辅助排序与实际传输顺序一致，机构镜像与公共镜像提供了内容一致的分发副本；分数据集传输时间与网络记录列于补充材料。</w:t>
+        <w:t>中科大校内网双镜像实验是另一组独立记录：4个数据集分别从FTP和Zenodo重复获取3次，两类镜像各形成12次下载，共24次结果，均达到登记字节数并通过SHA-256核验。在本组中科大校内网观测中，延迟辅助排序与实际传输顺序一致，机构镜像与公共镜像提供了内容一致的分发副本；分数据集传输时间与网络记录列于补充材料。</w:t>
       </w:r>
     </w:p>
     <w:p>

</xml_diff>

<commit_message>
define university name at earliest occurrence
</commit_message>
<xml_diff>
--- a/论文/GriddingMachine论文初稿_v0.3_语言优化版.docx
+++ b/论文/GriddingMachine论文初稿_v0.3_语言优化版.docx
@@ -3368,7 +3368,7 @@
                 <w:rFonts w:ascii="Times New Roman" w:hAnsi="Times New Roman" w:eastAsia="Songti SC"/>
                 <w:sz w:val="18"/>
               </w:rPr>
-              <w:t>Zenodo公共网络记录；中科大校内网 FTP—Zenodo同文件获取</w:t>
+              <w:t>Zenodo公共网络记录；中国科学技术大学（以下简称中科大）校内网 FTP—Zenodo同文件获取</w:t>
             </w:r>
           </w:p>
         </w:tc>
@@ -4033,7 +4033,7 @@
         <w:rPr>
           <w:rFonts w:ascii="Times New Roman" w:hAnsi="Times New Roman" w:eastAsia="Songti SC"/>
         </w:rPr>
-        <w:t>字段的代表性标签，对各文件—镜像组合开展重复下载，记录候选顺序、传输时间、字节数和SHA-256。公共网络场景刻画Zenodo镜像获取特征；中国科学技术大学（以下简称中科大）校内网实验对FTP与Zenodo执行同文件只读下载，共形成24次完整性记录。实验数据与环境信息随可复现材料归档。</w:t>
+        <w:t>字段的代表性标签，对各文件—镜像组合开展重复下载，记录候选顺序、传输时间、字节数和SHA-256。公共网络场景刻画Zenodo镜像获取特征；中科大校内网实验对FTP与Zenodo执行同文件只读下载，共形成24次完整性记录。实验数据与环境信息随可复现材料归档。</w:t>
       </w:r>
     </w:p>
     <w:p>

</xml_diff>

<commit_message>
implement reviewer driven manuscript refinements
</commit_message>
<xml_diff>
--- a/论文/GriddingMachine论文初稿_v0.3_语言优化版.docx
+++ b/论文/GriddingMachine论文初稿_v0.3_语言优化版.docx
@@ -250,7 +250,7 @@
         <w:rPr>
           <w:rFonts w:ascii="Times New Roman" w:hAnsi="Times New Roman" w:eastAsia="Songti SC"/>
         </w:rPr>
-        <w:t>eusable）的 FAIR 原则[1]。NetCDF具有自描述、跨系统和适合多维数组等特点，便于保存多维网格及其坐标信息[2]。Google Earth Engine等云平台通过改善数据表达、发现、访问及计算，提升了大尺度地学数据的访问和分析能力[3]。然而，对于面向固定版本、离线缓存和模式直接调用的工作流，研究人员仍需要把数据转换规则、标准产品标识、网络获取内容和下游模式接口连接起来。建立适用于本地运行的标准化科研数据库，可以将这些环节组织为可追溯、可复用的数据流程，减少重复整理，保证模式输入的一致性，并便于研究人员在不同计算环境中复现实验。</w:t>
+        <w:t>eusable）的 FAIR 原则[1]。NetCDF具有自描述、跨系统和适合多维数组等特点，便于保存多维网格及其坐标信息[2]。Google Earth Engine等云平台通过改善数据表达、发现、访问及计算，提升了大尺度地学数据的访问和分析能力[3]。然而，对于面向固定版本、离线缓存和模式直接调用的工作流，研究人员仍需要把数据转换规则、标准数据标识、网络获取内容和下游模式接口连接起来。建立适用于本地运行的标准化科研数据库，可以将这些环节组织为可追溯、可复用的数据流程，减少重复整理，保证模式输入的一致性，并便于研究人员在不同计算环境中复现实验。</w:t>
       </w:r>
     </w:p>
     <w:p>
@@ -1256,7 +1256,7 @@
         <w:rPr>
           <w:rFonts w:ascii="Times New Roman" w:hAnsi="Times New Roman" w:eastAsia="Songti SC"/>
         </w:rPr>
-        <w:t xml:space="preserve"> The table summarizes the implemented mechanisms, workflow advances, and application value across the data lifecycle.</w:t>
+        <w:t xml:space="preserve"> The table summarizes the implemented mechanisms, workflow changes, and their implications for scientific data use across the data lifecycle.</w:t>
       </w:r>
     </w:p>
     <w:p>
@@ -2352,7 +2352,7 @@
         <w:rPr>
           <w:rFonts w:ascii="Times New Roman" w:hAnsi="Times New Roman" w:eastAsia="Songti SC"/>
         </w:rPr>
-        <w:t>YAML将数据源差异与通用处理代码分离。配置以</w:t>
+        <w:t>YAML将数据源差异与通用处理代码分离。配置字段分别描述输入文件、源变量、维度语义、缺失值处理、版本和质量检查要求，共同构成可执行的数据生产配置。配置以</w:t>
       </w:r>
       <w:r>
         <w:rPr>
@@ -2500,7 +2500,7 @@
         <w:rPr>
           <w:rFonts w:ascii="Times New Roman" w:hAnsi="Times New Roman" w:eastAsia="Songti SC"/>
         </w:rPr>
-        <w:t>框架同时提供程序化和本地交互式配置生成方式。二者输出均经同一配置规范校验后进入</w:t>
+        <w:t>框架同时提供程序化和本地交互式配置生成方式。二者输出均经同一配置规范校验后，由核心生产函数</w:t>
       </w:r>
       <w:r>
         <w:rPr>
@@ -2512,7 +2512,7 @@
         <w:rPr>
           <w:rFonts w:ascii="Times New Roman" w:hAnsi="Times New Roman" w:eastAsia="Songti SC"/>
         </w:rPr>
-        <w:t>，使数据贡献入口与生产流水线共享一致的字段语义。</w:t>
+        <w:t>执行标准化处理，使数据贡献入口与生产流水线共享一致的字段语义。</w:t>
       </w:r>
     </w:p>
     <w:p>
@@ -2832,7 +2832,7 @@
         <w:rPr>
           <w:rFonts w:ascii="Times New Roman" w:hAnsi="Times New Roman" w:eastAsia="Songti SC"/>
         </w:rPr>
-        <w:t>。严格完整性模式要求后两项同时存在，兼容模式保持历史条目的标签访问；目录规范和获取逻辑对多URL与完整性字段采用统一表达。</w:t>
+        <w:t>。对已有目录条目，系统保留兼容访问方式；对登记完整性信息的新条目，则执行严格校验和事务式落盘。目录规范和获取逻辑对多URL与完整性字段采用统一表达。</w:t>
       </w:r>
     </w:p>
     <w:p>
@@ -3009,7 +3009,7 @@
         <w:rPr>
           <w:rFonts w:ascii="Times New Roman" w:hAnsi="Times New Roman" w:eastAsia="Songti SC"/>
         </w:rPr>
-        <w:t xml:space="preserve"> 状态同步进入质量控制。多个标准化数据由此形成结构一致的格点级模式输入。</w:t>
+        <w:t xml:space="preserve"> 状态同步进入质量控制。多个标准化数据由此形成结构一致的格点级模式输入。本文关注数据组织和接口衔接，不对Emerald的模式性能或科学模拟结果作独立评价。</w:t>
       </w:r>
     </w:p>
     <w:p>
@@ -3696,15 +3696,7 @@
         <w:rPr>
           <w:rFonts w:ascii="Times New Roman" w:hAnsi="Times New Roman" w:eastAsia="Songti SC"/>
         </w:rPr>
-        <w:t>共享生产契约的受控评价从维度、坐标、数值、缺失值填补、YAML配置、输出和空间方向7个方面组织31组代表性处理实例。各组对应生产流程中的一个关键操作，并以结构、逐点数值或数据集状态表征标准化结果；完整分类矩阵见补充材料S4。</w:t>
-      </w:r>
-    </w:p>
-    <w:p>
-      <w:r>
-        <w:rPr>
-          <w:rFonts w:ascii="Times New Roman" w:hAnsi="Times New Roman" w:eastAsia="Songti SC"/>
-        </w:rPr>
-        <w:t>数据集质量控制覆盖变量、维度、形状、属性、坐标方向、数值范围和缺失值填补结果。输出数组与位置编码参照逐点对应，Float32转换采用统一的绝对和相对容差；配置与数据集状态通过明确的流程信息反馈给维护者。质量报告同步保存最大绝对误差、最大相对误差、处理历史和重复生产一致性。</w:t>
+        <w:t>共享生产契约的受控评价围绕维度、坐标、数值、缺失值填补、配置、输出和空间方向7个方面组织31组处理实例，并进一步检查变量、形状、属性、数值范围和缺失值状态。各组以结构、逐点数值或数据集状态表征标准化结果；输出数组与位置编码参照逐点对应，Float32转换采用统一的绝对和相对容差，质量报告同步保存误差、处理历史和重复生产一致性。完整分类矩阵见补充材料S4。</w:t>
       </w:r>
     </w:p>
     <w:p>
@@ -4785,7 +4777,7 @@
         <w:rPr>
           <w:rFonts w:ascii="Times New Roman" w:hAnsi="Times New Roman" w:eastAsia="Songti SC"/>
         </w:rPr>
-        <w:t>统一NetCDF格式为数据复用提供基础，模式运行还需要格点对应、参数字段组合、时间轴构建和单位换算。US-NR1案例中，多类陆面数据和逐时气象驱动经过这些步骤形成Emerald所需的输入，应用层字段与底层读取逐点一致，并完成初始化与60 s首步计算。这些结果验证了本文数据组织方法与既定模式接口的衔接。</w:t>
+        <w:t>统一NetCDF格式为数据复用提供基础，模式运行还需要格点对应、参数字段组合、时间轴构建和单位换算。US-NR1案例中，多类陆面数据和逐时气象驱动经过这些步骤形成Emerald所需的输入，应用层字段与底层读取逐点一致，并完成初始化与60 s首步计算。这些结果说明本文数据组织方法能够与既定模式接口衔接。</w:t>
       </w:r>
     </w:p>
     <w:p>
@@ -4863,7 +4855,7 @@
         <w:rPr>
           <w:rFonts w:ascii="Times New Roman" w:hAnsi="Times New Roman" w:eastAsia="Songti SC"/>
         </w:rPr>
-        <w:t>受控实例和真实数据案例为上述更新提供了验证。OISST标准化后的有效格点与独立参考逐点一致；ELEV和LAI在两个测试环境中采用直接NetCDF分发，缩短了缓存预热后的端到端访问时间并使逻辑临时占用约减半；中科大校内网 FTP与Zenodo的24次获取均通过文件大小和SHA-256核验。US-NR1案例中，14类陆面数据和8类ERA5逐时数据形成模式输入，各气象字段的8784个时间步与底层读取一致，并完成Emerald初始化和60 s首步计算。</w:t>
+        <w:t>受控实例和真实数据案例表明，新版流程能够保持标准化数据与独立参考的一致性，改善直接NetCDF文件的分发效率，支持FTP—Zenodo镜像内容核验，并将陆面参数和ERA5逐时数据组织为US-NR1模式输入，完成Emerald初始化和60 s首步计算。具体数值结果见第4节。</w:t>
       </w:r>
     </w:p>
     <w:p>

</xml_diff>

<commit_message>
align abstract with actual dataset contributions
</commit_message>
<xml_diff>
--- a/论文/GriddingMachine论文初稿_v0.3_语言优化版.docx
+++ b/论文/GriddingMachine论文初稿_v0.3_语言优化版.docx
@@ -82,7 +82,7 @@
         <w:rPr>
           <w:rFonts w:ascii="Times New Roman" w:hAnsi="Times New Roman" w:eastAsia="Songti SC"/>
         </w:rPr>
-        <w:t>地球系统模式依赖区域至全球尺度的网格数据进行参数初始化及结果验证。尽管当前数据大多已采用NetCDF、HDF、GeoTIFF等标准格式，源数据处理规则、单位换算、标准数据标识和网络分发方式不同等问题，使得每个模式不得不单独维护数据库，给模式持续更新和验证带来不必要的困难。本文在2022版GriddingMachine基础上，在数据预处理、数据分发及数据读取方面做出优化：增加数据处理标准化流程，改进数据文件分发方式，完善数据目录与模式输入组织，并添加新的标准化数据及数据集。除Julia语言外，还完善了Matlab、Octave、Python和R语言对新版数据的自动下载支持，并添加了C语言和Fortran语言的自动下载支持，以更好地服务科学研究与应用。</w:t>
+        <w:t>地球系统模式依赖区域至全球尺度的网格数据进行参数初始化及结果验证。尽管当前数据大多已采用NetCDF、HDF、GeoTIFF等标准格式，源数据处理规则、单位换算、标准数据标识和网络分发方式不同等问题，使得每个模式不得不单独维护数据库，给模式持续更新和验证带来不必要的困难。本文在2022版GriddingMachine基础上，在数据预处理、数据分发及数据读取方面做出优化：增加数据处理标准化流程，改进数据文件分发方式，完善数据目录与模式输入组织，并增加真实异构数据的标准化处理案例，完善数据集的组织与应用。除Julia语言外，还完善了Matlab、Octave、Python和R语言对新版数据的自动下载支持，并添加了C语言和Fortran语言的自动下载支持，以更好地服务科学研究与应用。</w:t>
       </w:r>
     </w:p>
     <w:p>
@@ -164,7 +164,7 @@
         <w:rPr>
           <w:rFonts w:ascii="Times New Roman" w:hAnsi="Times New Roman" w:eastAsia="Songti SC"/>
         </w:rPr>
-        <w:t>Earth system models rely on gridded data at regional to global scales for parameter initialization and evaluation of simulation results. Although most datasets are available in standard formats such as NetCDF, HDF, and GeoTIFF, differences in source-processing rules, unit conversion, standardized data identifiers, and distribution methods require each model to maintain its own database, creating unnecessary difficulties for continued model development and evaluation. Building on the 2022 release of GriddingMachine, this study improves data preprocessing, distribution, and data reading by introducing a standardized processing workflow, improving data-file distribution, strengthening catalog and model-input organization, and adding new standardized datasets and dataset collections. In addition to Julia, automatic downloading of the updated data is supported in MATLAB, Octave, Python, and R, with new automatic-download entry points for C and Fortran, to better serve scientific research and applications.</w:t>
+        <w:t>Earth system models rely on gridded data at regional to global scales for parameter initialization and evaluation of simulation results. Although most datasets are available in standard formats such as NetCDF, HDF, and GeoTIFF, differences in source-processing rules, unit conversion, standardized data identifiers, and distribution methods require each model to maintain its own database, creating unnecessary difficulties for continued model development and evaluation. Building on the 2022 release of GriddingMachine, this study improves data preprocessing, distribution, and data reading by introducing a standardized processing workflow, improving data-file distribution, strengthening catalog and model-input organization, and adding a real heterogeneous-data standardization case while improving dataset organization and application. In addition to Julia, automatic downloading of the updated data is supported in MATLAB, Octave, Python, and R, with new automatic-download entry points for C and Fortran, to better serve scientific research and applications.</w:t>
       </w:r>
     </w:p>
     <w:p>

</xml_diff>

<commit_message>
clarify full grid and backward compatible reading
</commit_message>
<xml_diff>
--- a/论文/GriddingMachine论文初稿_v0.3_语言优化版.docx
+++ b/论文/GriddingMachine论文初稿_v0.3_语言优化版.docx
@@ -982,7 +982,21 @@
                 <w:rFonts w:ascii="Times New Roman" w:hAnsi="Times New Roman" w:eastAsia="Songti SC"/>
                 <w:sz w:val="18"/>
               </w:rPr>
-              <w:t>统一整场、周期和格点读取，并保留旧名称别名</w:t>
+              <w:t>统一提供全域网格、周期切片和指定格点读取，并保留</w:t>
+            </w:r>
+            <w:r>
+              <w:rPr>
+                <w:rFonts w:ascii="Consolas" w:hAnsi="Consolas" w:eastAsia="Songti SC"/>
+                <w:sz w:val="18"/>
+              </w:rPr>
+              <w:t>read_LUT</w:t>
+            </w:r>
+            <w:r>
+              <w:rPr>
+                <w:rFonts w:ascii="Times New Roman" w:hAnsi="Times New Roman" w:eastAsia="Songti SC"/>
+                <w:sz w:val="18"/>
+              </w:rPr>
+              <w:t>作为兼容调用名称</w:t>
             </w:r>
           </w:p>
         </w:tc>
@@ -2878,7 +2892,7 @@
         <w:rPr>
           <w:rFonts w:ascii="Times New Roman" w:hAnsi="Times New Roman" w:eastAsia="Songti SC"/>
         </w:rPr>
-        <w:t>标准网格数据读取接口支持以本地NetCDF路径或数据标签访问数据，并提供整场数组、指定周期切片、站点全部周期和站点指定周期4种读取方式。标签对应的NetCDF可由目录模块自动获取；默认返回标准变量</w:t>
+        <w:t>标准网格数据读取接口支持以本地NetCDF路径或数据标签访问数据，并提供全域网格数组（以下简称整场数组）、指定周期切片、站点全部周期和站点指定周期4种读取方式。标签对应的NetCDF可由目录模块自动获取；默认返回标准变量</w:t>
       </w:r>
       <w:r>
         <w:rPr>

</xml_diff>

<commit_message>
clarify full grid terminology throughout manuscript
</commit_message>
<xml_diff>
--- a/论文/GriddingMachine论文初稿_v0.3_语言优化版.docx
+++ b/论文/GriddingMachine论文初稿_v0.3_语言优化版.docx
@@ -2892,7 +2892,7 @@
         <w:rPr>
           <w:rFonts w:ascii="Times New Roman" w:hAnsi="Times New Roman" w:eastAsia="Songti SC"/>
         </w:rPr>
-        <w:t>标准网格数据读取接口支持以本地NetCDF路径或数据标签访问数据，并提供全域网格数组（以下简称整场数组）、指定周期切片、站点全部周期和站点指定周期4种读取方式。标签对应的NetCDF可由目录模块自动获取；默认返回标准变量</w:t>
+        <w:t>标准网格数据读取接口支持以本地NetCDF路径或数据标签访问数据，并提供全域网格数组、指定周期切片、站点全部周期和站点指定周期4种读取方式。标签对应的NetCDF可由目录模块自动获取；默认返回标准变量</w:t>
       </w:r>
       <w:r>
         <w:rPr>
@@ -3075,7 +3075,7 @@
         <w:rPr>
           <w:rFonts w:ascii="Times New Roman" w:hAnsi="Times New Roman" w:eastAsia="Songti SC"/>
         </w:rPr>
-        <w:t>标签驱动的数据访问、陆面参数融合与气象驱动组织共同构成模式输入组织层。本文将“模式就绪”界定为：标准化数据经过格点索引、字段组织、时间轴构建和量纲衔接后，形成满足Emerald初始化接口的数据结构。与2022版通过标签组织数据访问的思路一致[4]，新版进一步把目录配置与更新、完整性获取、标准网格读取和模式输入组织连接为连续公共数据流。用户以数据标签发现数据集，经镜像获取，并在目录提供完整性元数据时执行内容核验，再读取整场、周期或格点数据，并形成陆面参数或气象驱动；具体公共接口、调用参数和完整Julia示例列入补充材料与版本化用户指南。</w:t>
+        <w:t>标签驱动的数据访问、陆面参数融合与气象驱动组织共同构成模式输入组织层。本文将“模式就绪”界定为：标准化数据经过格点索引、字段组织、时间轴构建和量纲衔接后，形成满足Emerald初始化接口的数据结构。与2022版通过标签组织数据访问的思路一致[4]，新版进一步把目录配置与更新、完整性获取、标准网格读取和模式输入组织连接为连续公共数据流。用户以数据标签发现数据集，经镜像获取，并在目录提供完整性元数据时执行内容核验，再读取全域网格、周期或格点数据，并形成陆面参数或气象驱动；具体公共接口、调用参数和完整Julia示例列入补充材料与版本化用户指南。</w:t>
       </w:r>
     </w:p>
     <w:p>
@@ -3893,7 +3893,7 @@
         <w:rPr>
           <w:rFonts w:ascii="Times New Roman" w:hAnsi="Times New Roman" w:eastAsia="Songti SC"/>
         </w:rPr>
-        <w:t xml:space="preserve"> 构造物理值与缺失值掩膜，并独立计算目标经度索引。参考结果记录全场统计量、10个确定性有效格点和10个缺失格点。标准化数据连续生成3次，逐点比较坐标、有效值掩膜和物理值；随后由权威文件生成包含逻辑路径、镜像地址、字节数和SHA-256的目录条目，通过回环HTTP执行事务式下载，并以统一读取接口完成整场核对。</w:t>
+        <w:t xml:space="preserve"> 构造物理值与缺失值掩膜，并独立计算目标经度索引。参考结果记录全场统计量、10个确定性有效格点和10个缺失格点。标准化数据连续生成3次，逐点比较坐标、有效值掩膜和物理值；随后由权威文件生成包含逻辑路径、镜像地址、字节数和SHA-256的目录条目，通过回环HTTP执行事务式下载，并以统一读取接口完成全域网格逐点核对。</w:t>
       </w:r>
     </w:p>
     <w:p>
@@ -4198,7 +4198,7 @@
         <w:rPr>
           <w:rFonts w:ascii="Times New Roman" w:hAnsi="Times New Roman" w:eastAsia="Songti SC"/>
         </w:rPr>
-        <w:t>。该文件为1440×720、全域有效，有限值范围为−415.5～5 357.7002 m；GriddingMachine整场读取与NetCDF底层Float32数组逐点一致。使用显式标准维度、</w:t>
+        <w:t>。该文件为1440×720、全域有效，有限值范围为−415.5～5 357.7002 m；GriddingMachine全域网格读取与NetCDF底层Float32数组逐点一致。使用显式标准维度、</w:t>
       </w:r>
       <w:r>
         <w:rPr>
@@ -4273,7 +4273,7 @@
         <w:rPr>
           <w:rFonts w:ascii="Times New Roman" w:hAnsi="Times New Roman" w:eastAsia="Songti SC"/>
         </w:rPr>
-        <w:t>标准化数据连续生成3次，科学数组、坐标和文件SHA-256均保持一致。生成文件为997 006字节，目录条目自动登记相同的字节数和SHA-256；经回环HTTP事务式下载后，正式文件摘要与目录完全一致，传输临时文件全部完成回收。统一读取接口获得的整场数组与独立参考逐点一致，验证了从源数据、共享YAML生产、目录登记到标准读取的端到端数据链路。</w:t>
+        <w:t>标准化数据连续生成3次，科学数组、坐标和文件SHA-256均保持一致。生成文件为997 006字节，目录条目自动登记相同的字节数和SHA-256；经回环HTTP事务式下载后，正式文件摘要与目录完全一致，传输临时文件全部完成回收。统一读取接口获得的全域网格数组与独立参考逐点一致，验证了从源数据、共享YAML生产、目录登记到标准读取的端到端数据链路。</w:t>
       </w:r>
     </w:p>
     <w:p>

</xml_diff>

<commit_message>
finish full grid terminology cleanup
</commit_message>
<xml_diff>
--- a/论文/GriddingMachine论文初稿_v0.3_语言优化版.docx
+++ b/论文/GriddingMachine论文初稿_v0.3_语言优化版.docx
@@ -3893,7 +3893,7 @@
         <w:rPr>
           <w:rFonts w:ascii="Times New Roman" w:hAnsi="Times New Roman" w:eastAsia="Songti SC"/>
         </w:rPr>
-        <w:t xml:space="preserve"> 构造物理值与缺失值掩膜，并独立计算目标经度索引。参考结果记录全场统计量、10个确定性有效格点和10个缺失格点。标准化数据连续生成3次，逐点比较坐标、有效值掩膜和物理值；随后由权威文件生成包含逻辑路径、镜像地址、字节数和SHA-256的目录条目，通过回环HTTP执行事务式下载，并以统一读取接口完成全域网格逐点核对。</w:t>
+        <w:t xml:space="preserve"> 构造物理值与缺失值掩膜，并独立计算目标经度索引。参考结果记录全域统计量、10个确定性有效格点和10个缺失格点。标准化数据连续生成3次，逐点比较坐标、有效值掩膜和物理值；随后由权威文件生成包含逻辑路径、镜像地址、字节数和SHA-256的目录条目，通过回环HTTP执行事务式下载，并以统一读取接口完成全域网格逐点核对。</w:t>
       </w:r>
     </w:p>
     <w:p>
@@ -4007,7 +4007,7 @@
         <w:rPr>
           <w:rFonts w:ascii="Times New Roman" w:hAnsi="Times New Roman" w:eastAsia="Songti SC"/>
         </w:rPr>
-        <w:t>多镜像分析在两个独立环境中构建内容一致、访问状态可配置的镜像集合，通过延迟分数组织候选顺序，并设置13类受控状态场景，覆盖候选排序、镜像回退、网络访问异常、缓存命中、内容完整性异常和候选耗尽过程。每类场景在各环境中重复5次，记录候选选择、镜像遍历、正式文件状态及SHA-256，据此刻画事务式获取在镜像切换过程中的文件选择、校验与落盘行为。校园网机构FTP与Zenodo公共存储的访问进一步呈现机构镜像和公共镜像的互补分发特征与内容一致性；完整场景矩阵列于补充材料S6。</w:t>
+        <w:t>多镜像分析在两个独立环境中构建内容一致、访问状态可配置的镜像集合，通过延迟分数组织候选顺序，并设置13类受控状态场景，覆盖候选排序、镜像回退、网络访问异常、缓存命中、内容完整性异常和候选耗尽过程。每类场景在各环境中重复5次，记录候选选择、镜像遍历、正式文件状态及SHA-256，据此刻画事务式获取在镜像切换过程中的文件选择、校验与落盘行为。中科大校内网机构 FTP与Zenodo公共存储的访问进一步呈现机构镜像和公共镜像的互补分发特征与内容一致性；完整场景矩阵列于补充材料S6。</w:t>
       </w:r>
     </w:p>
     <w:p>

</xml_diff>

<commit_message>
Refine manuscript argument and scientific interpretation; sync Word
</commit_message>
<xml_diff>
--- a/论文/GriddingMachine论文初稿_v0.3_语言优化版.docx
+++ b/论文/GriddingMachine论文初稿_v0.3_语言优化版.docx
@@ -115,7 +115,7 @@
           <w:rFonts w:ascii="Times New Roman" w:hAnsi="Times New Roman" w:eastAsia="Songti SC"/>
           <w:b w:val="0"/>
         </w:rPr>
-        <w:t>地球系统模式依赖区域至全球尺度的网格数据进行参数初始化及结果验证。尽管当前数据大多已采用NetCDF、HDF、GeoTIFF等标准格式，源数据处理规则、单位换算、标准数据标识和网络分发方式不同等问题，使得各模式仍需分别整理和维护数据库，给模式持续更新和验证带来不必要的困难。本文在2022版GriddingMachine基础上，优化数据预处理、数据分发及数据读取：以共享配置组织数据处理规则，建立统一的标准化流程；采用直接NetCDF分发和独立数据目录，简化文件获取与数据更新；在统一读取基础上组织陆面参数和气象驱动，衔接多源数据与模式输入。应用案例表明，标准化后的坐标与物理值均与独立参考一致，直接NetCDF分发减少了解包开销并缩短了数据获取至首次读取的时间，多源网格数据能够形成满足模式接口要求的输入。除Julia语言外，还完善了Matlab、Octave、Python和R语言对新版数据的自动下载支持，并添加了C语言和Fortran语言的自动下载支持，为不同科研编程环境和地球系统模式提供可复用的网格数据基础。</w:t>
+        <w:t>地球系统模式依赖区域至全球尺度的网格数据进行参数初始化及结果验证。尽管当前数据大多已采用NetCDF、HDF、GeoTIFF等标准格式，源数据处理规则、单位换算、标准数据标识和网络分发方式不同等问题，使得各模式仍需分别整理和维护数据库，给模式持续更新和验证带来不必要的困难。本文在2022版GriddingMachine基础上，优化数据预处理、数据分发及数据读取：以共享配置组织数据处理规则，建立统一的标准化流程；采用直接NetCDF分发和独立数据目录，简化文件获取与数据更新；在统一读取基础上组织陆面参数和气象驱动，衔接多源数据与模式输入。应用案例表明，标准化数据的坐标和物理值与独立参考一致，直接NetCDF分发减少解包开销、缩短获取至首次读取的时间，多源数据经统一组织形成满足模式接口要求的输入。除Julia语言外，还完善了Matlab、Octave、Python和R语言对新版数据的自动下载支持，并添加了C语言和Fortran语言的自动下载支持，为不同科研编程环境和地球系统模式提供可复用的网格数据基础。</w:t>
       </w:r>
     </w:p>
     <w:p>
@@ -236,7 +236,7 @@
           <w:rFonts w:ascii="Times New Roman" w:hAnsi="Times New Roman" w:eastAsia="Songti SC"/>
           <w:b w:val="0"/>
         </w:rPr>
-        <w:t>Earth system models rely on gridded data at regional to global scales for parameter initialization and evaluation of simulation results. Although most datasets are available in standard formats such as NetCDF, HDF, and GeoTIFF, differences in source-processing rules, unit conversion, standardized data identifiers, and distribution methods require researchers to organize and maintain databases for individual models, complicating continued model development and evaluation. Building on the 2022 release of GriddingMachine, this study improves data preprocessing, distribution, and reading. A shared configuration organizes processing rules within a standardized workflow; direct NetCDF distribution and an independent catalog simplify file acquisition and data updates; and land parameters and meteorological forcing from multiple sources are assembled into model inputs on the basis of unified reading. Application cases show that standardized coordinates and physical values agree with independent references, direct NetCDF distribution reduces unpacking overhead and shortens the time from data acquisition to the first read, and gridded data from multiple sources can be assembled into inputs that meet model-interface requirements. In addition to Julia, automatic downloading of the updated data is supported in MATLAB, Octave, Python, and R, with new automatic-download entry points for C and Fortran, providing a reusable gridded-data basis for different scientific programming environments and Earth system models.</w:t>
+        <w:t>Earth system models rely on gridded data at regional to global scales for parameter initialization and evaluation of simulation results. Although most datasets are available in standard formats such as NetCDF, HDF, and GeoTIFF, differences in source-processing rules, unit conversion, standardized data identifiers, and distribution methods require researchers to organize and maintain databases for individual models, complicating continued model development and evaluation. Building on the 2022 release of GriddingMachine, this study improves data preprocessing, distribution, and reading. A shared configuration organizes processing rules within a standardized workflow; direct NetCDF distribution and an independent catalog simplify file acquisition and data updates; and land parameters and meteorological forcing from multiple sources are assembled into model inputs on the basis of unified reading. Application cases show that standardized coordinates and physical values agree with independent references, direct NetCDF distribution reduces unpacking overhead and the time from acquisition to the first read, and unified organization of data from multiple sources yields inputs that meet model-interface requirements. In addition to Julia, automatic downloading of the updated data is supported in MATLAB, Octave, Python, and R, with new automatic-download entry points for C and Fortran, providing a reusable gridded-data basis for different scientific programming environments and Earth system models.</w:t>
       </w:r>
     </w:p>
     <w:p>
@@ -338,7 +338,7 @@
           <w:rFonts w:ascii="Times New Roman" w:hAnsi="Times New Roman" w:eastAsia="Songti SC"/>
           <w:b w:val="0"/>
         </w:rPr>
-        <w:t>eusable）[1]；NetCDF及CF元数据约定为多维数据、坐标和变量属性的表达提供基础[2,3]。Google Earth Engine等云平台通过改善数据表达、发现、访问及计算，提升了大尺度地学数据的访问和分析能力[4]。本地模式试验还需保存可反复调用的处理结果，并记录所用数据版本和转换规则。对于面向固定版本、离线缓存和模式直接调用的工作流，研究人员仍需要把数据转换规则、标准数据标识、网络获取内容和下游模式接口连接起来。因此，建立适用于本地运行的标准化科研数据库，可以集中维护多源数据及其处理结果，为不同模式试验提供一致的数据输入。</w:t>
+        <w:t>eusable）[1]；NetCDF及气候与预报元数据约定（Climate and Forecast Metadata Conventions，CF）为多维数据、坐标和变量属性的表达提供基础[2,3]。Google Earth Engine等云平台通过改善数据表达、发现、访问及计算，提升了大尺度地学数据的访问和分析能力[4]。本地模式试验还需保存可反复调用的处理结果，并记录所用数据版本和转换规则。对于面向固定版本、离线缓存和模式直接调用的工作流，研究人员仍需要把数据转换规则、标准数据标识、网络获取内容和下游模式接口连接起来。因此，建立适用于本地运行的标准化科研数据库，可以集中维护多源数据及其处理结果，为不同模式试验提供一致的数据输入。</w:t>
       </w:r>
     </w:p>
     <w:p>
@@ -356,7 +356,7 @@
           <w:rFonts w:ascii="Times New Roman" w:hAnsi="Times New Roman" w:eastAsia="Songti SC"/>
           <w:b w:val="0"/>
         </w:rPr>
-        <w:t>针对这些需求，改进应围绕数据转换规则的复用、分发信息的独立维护及模式输入的组织展开。源数据特有的转换规则与通用程序分开，可使新增数据沿用已有处理方法；数据目录独立维护并直接分发NetCDF，可减少更新与获取时的附加步骤；在标准网格读取之后统一处理参数组合、时间轴和单位关系，则可减少各模式重复编写数据接入程序。标准NetCDF和数据标签为这些环节提供共同约定，使处理结果能够持续用于模式试验。</w:t>
+        <w:t>上述需求涉及源数据处理、分发信息与模式应用之间的分工。以配置表达数据源特有的结构和数值约定，可使同类转换复用通用程序；由独立目录维护分发位置和内容标识，可使数据更新不必伴随访问软件发布。标准网格数据进入具体模式时，还需依据变量的空间、时间和量纲关系组织输入。以标准NetCDF和数据标签连接这些环节，有助于在保持统一访问方式的同时，分别维护处理规则、分发信息和模式适配。</w:t>
       </w:r>
     </w:p>
     <w:p>
@@ -3394,7 +3394,7 @@
           <w:rFonts w:ascii="Times New Roman" w:hAnsi="Times New Roman" w:eastAsia="Songti SC"/>
           <w:b w:val="0"/>
         </w:rPr>
-        <w:t>字段指定，具体策略依据变量的物理含义和陆海分布选择。流程先过滤超出有效范围的数值，再按配置保留缺失值、以常数或均值填补，或检查指定区域是否仍有缺失值；需要类别编码的数据可采用整数化处理。陆地掩膜用于区分陆地区域与全域的检查要求，避免对不同区域采用相同的有效性判据。本文高程数据（ELEV）配置采用常数0填补陆地区域缺失值；各策略的作用范围与字段说明见补充材料S3。</w:t>
+        <w:t>字段指定，策略依据变量的物理含义和陆海分布选择，可保留缺失状态、以常数或均值填补，或检查指定区域的数据完整性。需要类别编码的数据可采用整数化处理。陆地掩膜用于区分陆地区域与全域的检查要求；本文高程数据（ELEV）配置采用常数0填补陆地区域缺失值。各策略的作用范围与字段说明见补充材料S3。</w:t>
       </w:r>
     </w:p>
     <w:p>
@@ -3463,7 +3463,7 @@
           <w:rFonts w:ascii="Times New Roman" w:hAnsi="Times New Roman" w:eastAsia="Songti SC"/>
           <w:b w:val="0"/>
         </w:rPr>
-        <w:t>数据预处理采用YAML配置，将数据源差异与通用处理程序分开。配置描述输入文件、源变量、维度语义、坐标方向、数值转换、缺失值填补及质量检查要求，处理程序据此完成转换，再按照统一的空间和变量约定输出NetCDF文件。配置规范在执行前检查必需信息、字段类型及相互关系，使程序化与交互式生成的配置遵循相同约定。配置及实际执行的处理记录共同保留源数据到标准化数据的转换过程。</w:t>
+        <w:t>YAML配置集中描述各数据源的输入文件、变量及转换规则，使源数据差异与通用处理程序分开维护。配置规范在执行前检查必需信息、字段类型及相互关系；程序化和交互式生成的配置均通过同一规范解析，使数据贡献者能够复用已有方法，并为新增数据明确相应转换规则。</w:t>
       </w:r>
     </w:p>
     <w:p>
@@ -3515,7 +3515,7 @@
           <w:rFonts w:ascii="Times New Roman" w:hAnsi="Times New Roman" w:eastAsia="Songti SC"/>
           <w:b w:val="0"/>
         </w:rPr>
-        <w:t>标准化生产按配置依次处理数据结构、坐标和数值。读取主变量及可选不确定性变量后，统一数值类型，执行维度重排，并同步调整坐标与数据；随后完成缩放、有效范围过滤和缺失值处理。保存前检查输出维度、坐标、变量、数值范围和缺失值状态。陆地区域完整性依据相应分辨率的陆地掩膜检查；带经纬度坐标轴的空间方向图用于人工确认数据与坐标的对应关系，补充自动结构检查。同一配置组合的首次方向确认随配置记录。</w:t>
+        <w:t>生产流程依次完成维度与坐标转换、数值变换、有效范围过滤和缺失值处理，主变量与可选不确定性变量采用一致的数值类型。保存前检查输出维度、坐标、变量、数值范围和缺失值状态，并依据相应分辨率的陆地掩膜核对陆地区域完整性。带经纬度坐标轴的空间方向图用于人工确认数据与坐标的对应关系，补充自动结构检查；同一配置组合的首次方向确认随配置记录。</w:t>
       </w:r>
     </w:p>
     <w:p>
@@ -3735,7 +3735,7 @@
           <w:rFonts w:ascii="Times New Roman" w:hAnsi="Times New Roman" w:eastAsia="Songti SC"/>
           <w:b w:val="0"/>
         </w:rPr>
-        <w:t xml:space="preserve">叶片光学参数与Medlyn气孔导度模型参数按采用C3与C4光合途径的两类植物分别组织[6,7]：C3参数按格点内对应植物功能型比例归一化加权，C4参数从相应类型的参数表提取，以保留两类植物的参数差异。光合参数组织参考叶片羧化能力与电子传递能力的协调关系[8]，并按当前模式参数化关系由 25 ℃下最大羧化速率 </w:t>
+        <w:t>叶片光学参数与Medlyn气孔导度模型参数按采用C3与C4光合途径的两类植物分别组织[6,7]：C3参数按格点内对应植物功能型比例归一化加权，C4参数从相应类型的参数表提取，以保留两类植物的参数差异。叶片羧化能力与电子传递能力的关联为光合参数组织提供依据[8]。本研究采用GriddingMachine模式输入接口的固定比例参数化，由25 ℃下最大羧化速率</w:t>
       </w:r>
       <w:r>
         <w:rPr>
@@ -3748,7 +3748,7 @@
           <w:rFonts w:ascii="Times New Roman" w:hAnsi="Times New Roman" w:eastAsia="Songti SC"/>
           <w:b w:val="0"/>
         </w:rPr>
-        <w:t xml:space="preserve"> 计算最大电子传递速率 </w:t>
+        <w:t>生成最大电子传递速率</w:t>
       </w:r>
       <w:r>
         <w:rPr>
@@ -3761,7 +3761,7 @@
           <w:rFonts w:ascii="Times New Roman" w:hAnsi="Times New Roman" w:eastAsia="Songti SC"/>
           <w:b w:val="0"/>
         </w:rPr>
-        <w:t xml:space="preserve"> 和细胞色素 b6f 复合体参数 </w:t>
+        <w:t>和细胞色素b6f复合体含量</w:t>
       </w:r>
       <w:r>
         <w:rPr>
@@ -3774,7 +3774,7 @@
           <w:rFonts w:ascii="Times New Roman" w:hAnsi="Times New Roman" w:eastAsia="Songti SC"/>
           <w:b w:val="0"/>
         </w:rPr>
-        <w:t xml:space="preserve">。输出涵盖位置、分辨率、年份、二氧化碳（CO₂）、土壤水力性质、冠层结构、植物功能型组成、叶片生物物理和光合参数；字段完整性与缺失值标记 </w:t>
+        <w:t>，换算关系、参数单位与实现出处见补充材料S1。输出涵盖位置、分辨率、年份、二氧化碳（CO₂）、土壤水力性质、冠层结构、植物功能型组成、叶片生物物理和光合参数；字段完整性与缺失值标记</w:t>
       </w:r>
       <w:r>
         <w:rPr>
@@ -3787,7 +3787,7 @@
           <w:rFonts w:ascii="Times New Roman" w:hAnsi="Times New Roman" w:eastAsia="Songti SC"/>
           <w:b w:val="0"/>
         </w:rPr>
-        <w:t xml:space="preserve"> 状态同步进入质量控制。多个标准化数据由此形成结构一致的格点级模式输入。</w:t>
+        <w:t>状态同步进入质量控制。多个标准化数据由此形成结构一致的格点级模式输入。</w:t>
       </w:r>
     </w:p>
     <w:p>
@@ -3809,7 +3809,7 @@
           <w:rFonts w:ascii="Times New Roman" w:hAnsi="Times New Roman" w:eastAsia="Songti SC"/>
           <w:b w:val="0"/>
         </w:rPr>
-        <w:t>包含8类第五代全球再分析数据（ERA5）[9]：地表气压、降水、漫射与直射短波辐射、长波辐射、气温、水汽压亏缺和风速。接口可按经纬度提取对应格点，也可从已加载的全域气象数组中索引序列。时间轴以浮点年积日（fractional day of year，</w:t>
+        <w:t>包含8类第五代全球再分析数据（ERA5）[9]：地表气压、降水、漫射与直射短波辐射、长波辐射、气温、水汽压亏缺和风速。接口可按经纬度提取对应格点，也可从已加载的全域气象数组中索引序列。时间轴采用浮点年积日（fractional day of year，</w:t>
       </w:r>
       <w:r>
         <w:rPr>
@@ -3822,7 +3822,7 @@
           <w:rFonts w:ascii="Times New Roman" w:hAnsi="Times New Roman" w:eastAsia="Songti SC"/>
           <w:b w:val="0"/>
         </w:rPr>
-        <w:t>）表示，并按经度除以15计算时间偏移；经纬度调用采用输入位置的经度，数组索引调用采用格点中心经度。输出同时检查字段完整性和缺失值状态，以保证参数、气象序列与模式时间轴能够对应。</w:t>
+        <w:t>）：按模式驱动接口的约定，将协调世界时（Coordinated Universal Time，UTC）年度序列中的各小时标记置于小时中点，再以经度除以15得到的小时偏移转换为地方平太阳时，用于Emerald的太阳天顶角计算。经纬度调用采用输入位置的经度，数组索引调用采用格点中心经度；完整公式见补充材料S1。输出同时检查字段完整性和缺失值状态，使气象序列与模式时间计算采用明确的对应关系。</w:t>
       </w:r>
     </w:p>
     <w:p>
@@ -3895,7 +3895,7 @@
           <w:rFonts w:ascii="Times New Roman" w:hAnsi="Times New Roman" w:eastAsia="Songti SC"/>
           <w:b w:val="0"/>
         </w:rPr>
-        <w:t>本节围绕预处理、分发和读取中的改进需求安排评价。受控处理实例和真实最优插值海表温度数据（Optimum Interpolation Sea Surface Temperature，OISST）用于检查统一流程能否正确处理源维度、坐标和数值差异；高程数据（ELEV）与叶面积指数数据（Leaf Area Index，LAI）的分发对照用于量化省去外层归档后的访问开销，网络镜像获取用于检查不同地址提供的文件内容是否一致；北美通量观测站US-NR1附近格点的陆面参数和气象驱动用于考察多源数据能否组成模式所需输入。表3概括案例与评价指标，跨操作系统测试补充检查核心流程的运行一致性。</w:t>
+        <w:t>本节围绕预处理、分发和读取中的改进需求安排评价。受控处理实例和真实最优插值海表温度数据（Optimum Interpolation Sea Surface Temperature，OISST）用于检查统一流程能否正确处理源维度、坐标和数值差异；ELEV与叶面积指数数据（Leaf Area Index，LAI）的分发对照用于量化省去外层归档后的访问开销，网络镜像获取用于检查不同地址提供的文件内容是否一致；北美通量观测站US-NR1附近格点的陆面参数和气象驱动用于考察多源数据能否组成模式所需输入。表3概括案例与评价指标，跨操作系统测试补充检查核心流程的运行一致性。</w:t>
       </w:r>
     </w:p>
     <w:p>
@@ -5128,7 +5128,7 @@
           <w:rFonts w:ascii="Times New Roman" w:hAnsi="Times New Roman" w:eastAsia="Songti SC"/>
           <w:b w:val="0"/>
         </w:rPr>
-        <w:t>性能分析在Windows（环境A）和macOS（环境B）中采用回环HTTP服务。每个“数据×分发形式”组合经过缓存预热后按随机顺序测量10次，记录传输字节数、打包与解包时间、从请求开始到首次读取NetCDF值的端到端时间，以及下载文件与解包文件并存时的总大小。两个独立环境使用一致的脚本和输入文件，时间指标以中位数、四分位距和95% Bootstrap置信区间表示。</w:t>
+        <w:t>性能分析在Windows（环境A）和macOS（环境B）中采用回环HTTP服务。每个“数据×分发形式”组合经过缓存预热后按随机顺序测量10次，记录传输字节数、打包与解包时间、从请求开始到首次读取NetCDF值的端到端时间，以及获取过程中的文件存储占用（下载文件与解包文件并存时的合计大小）。两个独立环境使用一致的脚本和输入文件，时间指标以中位数、四分位距和95% Bootstrap置信区间表示。</w:t>
       </w:r>
     </w:p>
     <w:p>
@@ -5193,7 +5193,7 @@
           <w:rFonts w:ascii="Times New Roman" w:hAnsi="Times New Roman" w:eastAsia="Songti SC"/>
           <w:b w:val="0"/>
         </w:rPr>
-        <w:t>字段的代表性标签，对各文件—镜像组合开展重复下载，记录候选顺序、传输时间、字节数和SHA-256。公共网络场景刻画Zenodo镜像获取特征；中科大校内网实验对FTP与Zenodo执行同文件只读下载，共形成24次完整性记录。实验数据与环境信息随可复现材料归档。</w:t>
+        <w:t>字段的代表性标签，对各文件—镜像组合开展重复下载，记录候选顺序、传输时间、字节数和SHA-256。公共网络场景考察Zenodo的文件获取情况；中科大校内网场景比较FTP与Zenodo提供的同一文件，共形成24次完整性记录。实验数据与环境信息随可复现材料归档。</w:t>
       </w:r>
     </w:p>
     <w:p>
@@ -5521,7 +5521,7 @@
           <w:rFonts w:ascii="Times New Roman" w:hAnsi="Times New Roman" w:eastAsia="Songti SC"/>
           <w:b w:val="0"/>
         </w:rPr>
-        <w:t>将ELEV和LAI的端到端中位时间分别由40.503和222.297 ms降至20.929和38.100 ms，降幅为48.3%和82.9%；环境B中的相应降幅分别为53.6%和69.2%（图3）。两个数据文件的传输字节分别增加6.43%和2.16%，临时文件总大小分别减少约48%和49%。80次SHA-256摘要核验结果一致。</w:t>
+        <w:t>将ELEV和LAI的端到端中位时间分别由40.503和222.297 ms降至20.929和38.100 ms，降幅为48.3%和82.9%；环境B中的相应降幅分别为53.6%和69.2%（图3）。两个数据文件的传输字节分别增加6.43%和2.16%，文件存储占用分别减少约48%和49%。80次SHA-256摘要核验结果一致。</w:t>
       </w:r>
     </w:p>
     <w:p>
@@ -5530,7 +5530,7 @@
           <w:rFonts w:ascii="Times New Roman" w:hAnsi="Times New Roman" w:eastAsia="Songti SC"/>
           <w:b w:val="0"/>
         </w:rPr>
-        <w:t>两文件均已采用NetCDF内部zlib压缩级别4，对照归档采用gzip级别6。在所测文件和缓存预热条件下，直接NetCDF以较小的传输字节增量减少了解包及临时文件共存开销，缩短了从请求到首次读取数据的路径。</w:t>
+        <w:t>两文件均已采用NetCDF内部zlib压缩级别4，对照归档采用gzip级别6。在所测文件和缓存预热条件下，直接NetCDF以较小的传输字节增量减少了解包时间和文件存储占用，缩短了从请求到首次读取数据的路径。</w:t>
       </w:r>
     </w:p>
     <w:p>
@@ -5686,7 +5686,7 @@
           <w:rFonts w:ascii="Times New Roman" w:hAnsi="Times New Roman" w:eastAsia="Songti SC"/>
           <w:b w:val="0"/>
         </w:rPr>
-        <w:t>13类受控状态场景在两个独立操作系统环境中各重复5次，镜像获取、缓存复用和内容核验均得到预设结果。首选镜像访问或内容核验未通过时，其余镜像仍能被尝试；失败下载未改变已有正式文件的摘要。镜像地址的切换因而不会把未核验内容写入正式缓存，目录更新和本地读取可以继续使用有效数据。</w:t>
+        <w:t>13类受控状态场景在两个独立操作系统环境中各重复5次，均实现了预设的镜像回退、缓存复用和内容核验。首选镜像访问或内容核验未通过时，流程继续尝试后续镜像；失败下载未改变已有正式文件的摘要。镜像地址切换与正式缓存更新由此可以分别处理，下载异常时本地读取仍可沿用已有有效数据。</w:t>
       </w:r>
     </w:p>
     <w:p>
@@ -5695,7 +5695,7 @@
           <w:rFonts w:ascii="Times New Roman" w:hAnsi="Times New Roman" w:eastAsia="Songti SC"/>
           <w:b w:val="0"/>
         </w:rPr>
-        <w:t>在公共网络场景中，两个独立环境分别对4个Zenodo标签重复获取3次，共形成24次下载记录，全部达到登记字节数并通过SHA-256核验。下载时间随文件规模呈梯度变化，重复传输的SHA-256摘要与目录登记值一致，说明公共镜像能够向本地程序提供与目录登记一致的数据文件。</w:t>
+        <w:t>公共网络场景中，两个独立环境分别对4个Zenodo标签重复获取3次，共24次下载均与登记字节数和SHA-256一致。下载时间随文件规模呈梯度变化，公共镜像能够向本地科研程序提供内容可核验的数据文件。</w:t>
       </w:r>
     </w:p>
     <w:p>
@@ -5704,7 +5704,7 @@
           <w:rFonts w:ascii="Times New Roman" w:hAnsi="Times New Roman" w:eastAsia="Songti SC"/>
           <w:b w:val="0"/>
         </w:rPr>
-        <w:t>中科大校内网双镜像实验是另一组独立记录：4个数据集分别从FTP和Zenodo重复获取3次，两类镜像各形成12次下载，共24次结果，均达到登记字节数并通过SHA-256核验。在本组中科大校内网观测中，延迟辅助排序与实际传输顺序一致，机构镜像与公共镜像提供了内容一致的分发副本；分数据集传输时间与网络记录列于补充材料。</w:t>
+        <w:t>中科大校内网场景中，4个数据集分别从FTP和Zenodo重复获取3次，两类镜像各形成12次下载，共24次结果。两类镜像提供的同一数据集均与目录登记的字节数和SHA-256一致，说明机构镜像与公共镜像能够提供内容一致的分发副本。延迟辅助排序与本组实际传输顺序一致；分数据集传输时间与网络记录列于补充材料。</w:t>
       </w:r>
     </w:p>
     <w:p>
@@ -5739,7 +5739,7 @@
           <w:rFonts w:ascii="Times New Roman" w:hAnsi="Times New Roman" w:eastAsia="Songti SC"/>
           <w:b w:val="0"/>
         </w:rPr>
-        <w:t>，并登记修订后的字节数与SHA-256，原V1和R1文件分别保留。空缓存实例首次调用获取R1文件并通过完整性核验，第二次调用复用缓存。数据修订因此可以通过目录完成分发信息更新，同时保持调用入口稳定；试验所用的具体文件由目录版本与摘要确定。</w:t>
+        <w:t>，并登记修订后的字节数与SHA-256，原V1和R1文件分别保留。修订文件首次获取通过完整性核验，再次调用复用缓存。目录因而能够承接数据修订并保持调用入口稳定，试验所用的具体文件则由目录版本与摘要确定。</w:t>
       </w:r>
     </w:p>
     <w:p>
@@ -5769,7 +5769,7 @@
           <w:rFonts w:ascii="Times New Roman" w:hAnsi="Times New Roman" w:eastAsia="Songti SC"/>
           <w:b w:val="0"/>
         </w:rPr>
-        <w:t>2020年8类ERA5文件合计12 575 376 138字节，各变量均为360×180×8784的经度、纬度和逐小时数组，并带有单位属性。US-NR1格点的8类变量各得到8784个逐小时值，有限值比例均为100%，与底层NetCDF读取结果的最大绝对差均为0。时间偏移为−7.0364 h，浮点年积日严格递增且与独立公式逐点一致。输出由时间轴和8类气象变量共9个字段组成，经Emerald适配后形成16个模式驱动字段，保持了数据取样、年度时间组织与模式字段之间的对应关系。</w:t>
+        <w:t>2020年8类ERA5数据的各变量均为360×180×8784的经度、纬度和逐小时数组，并带有单位属性。US-NR1格点的8类变量各得到8784个逐小时值，有限值比例均为100%，与底层NetCDF读取结果的最大绝对差均为0。地方平太阳时偏移为−7.0364 h，浮点年积日严格递增且与独立公式逐点一致。输出由时间轴和8类气象变量共9个字段组成，经Emerald适配后形成16个模式驱动字段，保持了数据取样、年度时间组织与模式字段之间的对应关系。逐文件大小与字段信息见补充材料S1。</w:t>
       </w:r>
     </w:p>
     <w:p>
@@ -5778,7 +5778,7 @@
           <w:rFonts w:ascii="Times New Roman" w:hAnsi="Times New Roman" w:eastAsia="Songti SC"/>
           <w:b w:val="0"/>
         </w:rPr>
-        <w:t>降水全年累计值为0.496409 m水层，即496.409 mm，与ERA5逐小时累计降水的米制表达[11]一致。标准NetCDF降水单位属性据此统一为</w:t>
+        <w:t>依据ERA5逐小时总降水的变量定义[11]，降水输入表示每小时累计的米制水层，标准NetCDF单位属性据此修订为</w:t>
       </w:r>
       <w:r>
         <w:rPr>
@@ -5791,7 +5791,7 @@
           <w:rFonts w:ascii="Times New Roman" w:hAnsi="Times New Roman" w:eastAsia="Songti SC"/>
           <w:b w:val="0"/>
         </w:rPr>
-        <w:t>，Emerald再按水层厚度转换为摩尔通量，使数值尺度、元信息与模式换算相符。完成上述参数、时间和量纲衔接后，真实陆面参数与气象驱动共同完成Emerald初始化和60 s首步计算，大气与土壤关键状态均保持有限值。该年度案例表明，多源标准网格数据能够按明确的空间、时间与单位关系形成可用的模式输入。</w:t>
+        <w:t>，数据值保持不变。US-NR1年度累计降水为0.496409 m，即496.409 mm，用于核对数值尺度与量纲。Emerald按水层厚度、水密度、水的摩尔质量及3600 s累计时段换算为摩尔通量，使数据单位与模式输入一致。完成参数、时间和量纲衔接后，真实陆面参数与气象驱动共同完成Emerald初始化和60 s首步计算，大气与土壤关键状态均保持有限值。该年度案例表明，多源标准网格数据能够按明确的空间、时间与单位关系形成可用的模式输入。</w:t>
       </w:r>
     </w:p>
     <w:p>
@@ -5812,7 +5812,7 @@
           <w:rFonts w:ascii="Times New Roman" w:hAnsi="Times New Roman" w:eastAsia="Songti SC"/>
           <w:b w:val="0"/>
         </w:rPr>
-        <w:t>跨系统测试中，核心流程的数据结构、逐点数值、文件摘要和接口状态保持一致，GriddingMachine、GriddingMachineDatasets及Emerald合成输入接口通过相应检查。上述标准化、镜像获取和模式输入结果共同说明，数据约定能够在不同操作系统的已测试流程中保持一致；各系统测试项目与结果见补充材料S5。</w:t>
+        <w:t>跨操作系统运行中，GriddingMachine、GriddingMachineDatasets及Emerald合成输入接口的数据结构、逐点数值、文件摘要和接口状态满足相同判据。标准化、镜像获取和模式输入检查表明，统一数据约定能够支持核心流程在不同操作系统中采用一致的调用方式与结果核对方法；各系统测试项目与结果见补充材料S5。</w:t>
       </w:r>
     </w:p>
     <w:p>
@@ -5821,7 +5821,7 @@
           <w:rFonts w:ascii="Times New Roman" w:hAnsi="Times New Roman" w:eastAsia="Songti SC"/>
           <w:b w:val="0"/>
         </w:rPr>
-        <w:t>C和Fortran入口已完成编译与下载测试，下载文件通过字节数和SHA-256完整性校验。多语言入口由此能够在已有科研程序中获取与登记内容一致的数据文件。</w:t>
+        <w:t>经编译的C和Fortran入口均成功获取参考文件，字节数和SHA-256与参考内容一致。新增入口使采用这两种语言的科研程序能够调用统一下载逻辑，自动获取内容一致的网格数据文件。</w:t>
       </w:r>
     </w:p>
     <w:p>
@@ -5884,7 +5884,7 @@
           <w:rFonts w:ascii="Times New Roman" w:hAnsi="Times New Roman" w:eastAsia="Songti SC"/>
           <w:b w:val="0"/>
         </w:rPr>
-        <w:t>ELEV和LAI已经使用NetCDF内部压缩，外层归档的额外压缩收益较小，而下载后的解包和文件共存仍占用时间与空间。两环境中的对照结果表明，直接NetCDF以较小的传输字节增量换取端到端时间和临时占用的减少。对采用单文件标签组织的数据库，直接分发使获取结果即可作为读取输入，简化了文件获取到科研调用之间的操作。</w:t>
+        <w:t>ELEV和LAI已经使用NetCDF内部压缩，外层归档的额外压缩收益较小，而下载后的解包和归档文件与NetCDF文件共存仍占用时间与空间。两环境中的对照结果表明，直接NetCDF以较小的传输字节增量缩短端到端时间，并减少获取过程中的文件存储占用。对采用单文件标签组织的数据库，获取结果即可作为读取输入，简化了文件获取到科研调用之间的操作。</w:t>
       </w:r>
     </w:p>
     <w:p>
@@ -5944,7 +5944,7 @@
           <w:rFonts w:ascii="Times New Roman" w:hAnsi="Times New Roman" w:eastAsia="Songti SC"/>
           <w:b w:val="0"/>
         </w:rPr>
-        <w:t>地球系统数据立方体着重多变量时空数据的联合分析[12]，Google Earth Engine提供云端遥感访问与计算[4]，ESGF组织分布式气候模式数据发现与访问[14]，Pangeo及Pangeo Forge支持云端数据组织和可复用处理配方[15,16]。这些设施拓展了数据发现和计算能力，本地模式试验还需把获取的变量转换为可重复调用的具体输入。OISST标准化和US-NR1案例展示了GriddingMachine在这一环节的作用：沿用NetCDF及CF的数据表达基础[2,3]，保存处理规则及其结果，并明确格点、时间和单位之间的对应关系。其Julia实现[13]便于将数据处理、读取和模式适配组合到已有科研程序中。</w:t>
+        <w:t>地球系统数据立方体着重多变量时空数据的联合分析[12]；GriddingMachine侧重将不同来源的变量组织为可重复调用的模式输入，其Julia实现[13]便于把标准化、读取和模式适配组合到已有科研程序中。Google Earth Engine提供云端遥感访问与计算[4]，ESGF组织分布式气候模式数据发现与访问[14]，Pangeo及Pangeo Forge支持云端数据组织和可复用处理配方[15,16]。这些设施为数据访问和计算提供基础，GriddingMachine则以标准网格、数据标签和输入组织方法衔接本地模式试验，使获得的数据能够进一步用于参数配置与气象驱动。</w:t>
       </w:r>
     </w:p>
     <w:p>
@@ -5953,7 +5953,16 @@
           <w:rFonts w:ascii="Times New Roman" w:hAnsi="Times New Roman" w:eastAsia="Songti SC"/>
           <w:b w:val="0"/>
         </w:rPr>
-        <w:t>国内地球系统科学数据共享研究强调规范分类和目录建设[17]，Pooch提供科研文件获取工具，STAC提供地理空间目录描述规范[18,19]。本研究的镜像获取和修订案例说明，标签与文件内容的对应关系是持续维护的重要环节；后续可加强与通用目录和获取工具的衔接，使已有科研程序更便于使用共享数据。处理规则的复用还依赖数据出处、配置和软件版本的保留，软件引用原则、科研软件FAIR原则（FAIR4RS）及数字资源库TRUST原则为这些记录的引用与维护提供参考[20-22]。新增数据源配置、公共镜像登记和更多模式接口适配可在上述基础上持续扩展数据库的科研用途。</w:t>
+        <w:t>数据目录连接文件发现与实际获取。国内地球系统科学数据共享研究强调规范分类和目录建设[17]，Pooch提供科研文件获取工具，STAC提供地理空间目录描述规范[18,19]。本研究的镜像获取和修订案例表明，维护标签与文件内容的对应关系，可以在调整分发地址或修订数据时保持既有调用方式。后续可加强与通用目录和获取工具的衔接，使科研程序更便于复用共享数据。</w:t>
+      </w:r>
+    </w:p>
+    <w:p>
+      <w:r>
+        <w:rPr>
+          <w:rFonts w:ascii="Times New Roman" w:hAnsi="Times New Roman" w:eastAsia="Songti SC"/>
+          <w:b w:val="0"/>
+        </w:rPr>
+        <w:t>数据复用还需要保留处理规则及其研究出处。软件引用原则、科研软件FAIR原则（FAIR4RS）及数字资源库TRUST原则分别为软件识别、复用与资源库维护提供参考[20-22]。归档数据来源、配置和软件版本，可将模式试验中的输入追溯到具体处理过程；新增数据源配置、公共镜像登记和更多模式接口适配则可持续扩展数据库的科研用途。</w:t>
       </w:r>
     </w:p>
     <w:p>
@@ -5983,7 +5992,7 @@
           <w:rFonts w:ascii="Times New Roman" w:hAnsi="Times New Roman" w:eastAsia="Songti SC"/>
           <w:b w:val="0"/>
         </w:rPr>
-        <w:t>受控实例和真实数据案例中，标准化结果的坐标与物理值均与独立参考一致。直接NetCDF分发减少了解包和临时存储开销，缩短了获取至首次读取的时间；FTP—Zenodo镜像提供与登记摘要一致的文件，目录更新能够承接数据修订；陆面参数与ERA5逐时数据形成US-NR1模式输入，并完成Emerald初始化和60 s首步计算。这些结果表明，共享处理规则、独立分发信息和模式输入组织可以共同支持网格数据的持续更新与复用。</w:t>
+        <w:t>受控实例和真实数据案例中，标准化结果的坐标与物理值均与独立参考一致。直接NetCDF分发减少了解包时间和文件存储占用，缩短了获取至首次读取的时间；FTP—Zenodo镜像提供与登记摘要一致的文件，目录更新能够承接数据修订；陆面参数与ERA5逐时数据形成US-NR1模式输入，并完成Emerald初始化和60 s首步计算。</w:t>
       </w:r>
     </w:p>
     <w:p>

</xml_diff>

<commit_message>
Refine manuscript narrative and restore preferred introduction paragraph
</commit_message>
<xml_diff>
--- a/论文/GriddingMachine论文初稿_v0.3_语言优化版.docx
+++ b/论文/GriddingMachine论文初稿_v0.3_语言优化版.docx
@@ -115,7 +115,7 @@
           <w:rFonts w:ascii="Times New Roman" w:hAnsi="Times New Roman" w:eastAsia="Songti SC"/>
           <w:b w:val="0"/>
         </w:rPr>
-        <w:t>地球系统模式依赖区域至全球尺度的网格数据进行参数初始化及结果验证。尽管当前数据大多已采用NetCDF、HDF、GeoTIFF等标准格式，源数据处理规则、单位换算、标准数据标识和网络分发方式不同等问题，使得各模式仍需分别整理和维护数据库，给模式持续更新和验证带来不必要的困难。本文在2022版GriddingMachine基础上，优化数据预处理、数据分发及数据读取：以共享配置组织数据处理规则，建立统一的标准化流程；采用直接NetCDF分发和独立数据目录，简化文件获取与数据更新；在统一读取基础上组织陆面参数和气象驱动，衔接多源数据与模式输入。应用案例表明，标准化数据的坐标和物理值与独立参考一致，直接NetCDF分发减少解包开销、缩短获取至首次读取的时间，多源数据经统一组织形成满足模式接口要求的输入。除Julia语言外，还完善了Matlab、Octave、Python和R语言对新版数据的自动下载支持，并添加了C语言和Fortran语言的自动下载支持，为不同科研编程环境和地球系统模式提供可复用的网格数据基础。</w:t>
+        <w:t>地球系统模式依赖区域至全球尺度的网格数据进行参数初始化及结果验证。尽管当前数据大多已采用NetCDF、HDF、GeoTIFF等标准格式，源数据处理规则、单位换算、标准数据标识和网络分发方式不同等问题，使得各模式仍需分别整理和维护数据库，给模式持续更新和验证带来不必要的困难。本文在2022版GriddingMachine基础上，优化数据预处理、数据分发及数据读取：以共享配置组织数据处理规则，建立统一的标准化流程；采用直接NetCDF分发和独立数据目录，简化文件获取与数据更新；在统一读取基础上组织陆面参数和气象驱动，衔接多源数据与模式输入。应用案例表明，标准化数据与独立参考一致，直接NetCDF分发缩短获取至首次读取的时间，独立目录在数据修订后保持标签调用，多源数据经统一组织形成模式所需输入。除Julia语言外，还完善了Matlab、Octave、Python和R语言对新版数据的自动下载支持，并添加了C语言和Fortran语言的自动下载支持，为不同科研编程环境和地球系统模式提供可复用的网格数据基础。</w:t>
       </w:r>
     </w:p>
     <w:p>
@@ -236,7 +236,7 @@
           <w:rFonts w:ascii="Times New Roman" w:hAnsi="Times New Roman" w:eastAsia="Songti SC"/>
           <w:b w:val="0"/>
         </w:rPr>
-        <w:t>Earth system models rely on gridded data at regional to global scales for parameter initialization and evaluation of simulation results. Although most datasets are available in standard formats such as NetCDF, HDF, and GeoTIFF, differences in source-processing rules, unit conversion, standardized data identifiers, and distribution methods require researchers to organize and maintain databases for individual models, complicating continued model development and evaluation. Building on the 2022 release of GriddingMachine, this study improves data preprocessing, distribution, and reading. A shared configuration organizes processing rules within a standardized workflow; direct NetCDF distribution and an independent catalog simplify file acquisition and data updates; and land parameters and meteorological forcing from multiple sources are assembled into model inputs on the basis of unified reading. Application cases show that standardized coordinates and physical values agree with independent references, direct NetCDF distribution reduces unpacking overhead and the time from acquisition to the first read, and unified organization of data from multiple sources yields inputs that meet model-interface requirements. In addition to Julia, automatic downloading of the updated data is supported in MATLAB, Octave, Python, and R, with new automatic-download entry points for C and Fortran, providing a reusable gridded-data basis for different scientific programming environments and Earth system models.</w:t>
+        <w:t>Earth system models rely on gridded data at regional to global scales for parameter initialization and evaluation of simulation results. Although most datasets are available in standard formats such as NetCDF, HDF, and GeoTIFF, differences in source-processing rules, unit conversion, standardized data identifiers, and distribution methods require researchers to organize and maintain databases for individual models, complicating continued model development and evaluation. Building on the 2022 release of GriddingMachine, this study improves data preprocessing, distribution, and reading. A shared configuration organizes processing rules within a standardized workflow; direct NetCDF distribution and an independent catalog simplify file acquisition and data updates; and land parameters and meteorological forcing from multiple sources are assembled into model inputs on the basis of unified reading. Application cases show that standardized data agree with independent references, direct NetCDF distribution shortens the time from acquisition to the first read, the independent catalog preserves label-based access after data revisions, and data from multiple sources are organized into the inputs required by the model. In addition to Julia, automatic downloading of the updated data is supported in MATLAB, Octave, Python, and R, with new automatic-download entry points for C and Fortran, providing a reusable gridded-data basis for different scientific programming environments and Earth system models.</w:t>
       </w:r>
     </w:p>
     <w:p>
@@ -356,7 +356,7 @@
           <w:rFonts w:ascii="Times New Roman" w:hAnsi="Times New Roman" w:eastAsia="Songti SC"/>
           <w:b w:val="0"/>
         </w:rPr>
-        <w:t>上述需求涉及源数据处理、分发信息与模式应用之间的分工。以配置表达数据源特有的结构和数值约定，可使同类转换复用通用程序；由独立目录维护分发位置和内容标识，可使数据更新不必伴随访问软件发布。标准网格数据进入具体模式时，还需依据变量的空间、时间和量纲关系组织输入。以标准NetCDF和数据标签连接这些环节，有助于在保持统一访问方式的同时，分别维护处理规则、分发信息和模式适配。</w:t>
+        <w:t>针对这些需求，改进应围绕数据转换规则的复用、分发信息的独立维护及模式输入的组织展开。源数据特有的转换规则与通用程序分开，可使新增数据沿用已有处理方法；数据目录独立维护并直接分发NetCDF，可减少更新与获取时的附加步骤；在标准网格读取之后统一处理参数组合、时间轴和单位关系，则可减少各模式重复编写数据接入程序。标准NetCDF和数据标签为这些环节提供共同约定，使处理结果能够持续用于模式试验。</w:t>
       </w:r>
     </w:p>
     <w:p>
@@ -3463,7 +3463,20 @@
           <w:rFonts w:ascii="Times New Roman" w:hAnsi="Times New Roman" w:eastAsia="Songti SC"/>
           <w:b w:val="0"/>
         </w:rPr>
-        <w:t>YAML配置集中描述各数据源的输入文件、变量及转换规则，使源数据差异与通用处理程序分开维护。配置规范在执行前检查必需信息、字段类型及相互关系；程序化和交互式生成的配置均通过同一规范解析，使数据贡献者能够复用已有方法，并为新增数据明确相应转换规则。</w:t>
+        <w:t>YAML配置集中描述各数据源的输入文件、变量及转换规则，使源数据差异与通用处理程序分开维护。框架提供程序化和本地交互式配置生成方式，二者均在执行前检查必需信息、字段类型及相互关系，再由标准化处理函数</w:t>
+      </w:r>
+      <w:r>
+        <w:rPr>
+          <w:rFonts w:ascii="Consolas" w:hAnsi="Consolas" w:eastAsia="Songti SC"/>
+        </w:rPr>
+        <w:t>process_dataset!</w:t>
+      </w:r>
+      <w:r>
+        <w:rPr>
+          <w:rFonts w:ascii="Times New Roman" w:hAnsi="Times New Roman" w:eastAsia="Songti SC"/>
+          <w:b w:val="0"/>
+        </w:rPr>
+        <w:t>执行，使数据贡献者能够复用通用流程，并为新增数据明确相应转换规则。</w:t>
       </w:r>
     </w:p>
     <w:p>
@@ -3473,28 +3486,6 @@
           <w:b w:val="0"/>
         </w:rPr>
         <w:t>以二维源数据为例，源维度按纬度、经度排列，纬度由北向南，经度范围为0°～360°。配置声明维度语义和坐标转换规则，处理程序据此重排数据、翻转纬度并调整经度范围，输出经度在前、纬度在后且坐标递增的标准网格；需要数值转换时，按配置执行相应变换。该示例说明不同源排列如何进入同一输出结构，结果核对见第4.1节。完整配置与字段说明见补充材料S3。</w:t>
-      </w:r>
-    </w:p>
-    <w:p>
-      <w:r>
-        <w:rPr>
-          <w:rFonts w:ascii="Times New Roman" w:hAnsi="Times New Roman" w:eastAsia="Songti SC"/>
-          <w:b w:val="0"/>
-        </w:rPr>
-        <w:t>框架同时提供程序化和本地交互式配置生成方式。二者输出均通过同一配置规范校验，再由标准化处理函数</w:t>
-      </w:r>
-      <w:r>
-        <w:rPr>
-          <w:rFonts w:ascii="Consolas" w:hAnsi="Consolas" w:eastAsia="Songti SC"/>
-        </w:rPr>
-        <w:t>process_dataset!</w:t>
-      </w:r>
-      <w:r>
-        <w:rPr>
-          <w:rFonts w:ascii="Times New Roman" w:hAnsi="Times New Roman" w:eastAsia="Songti SC"/>
-          <w:b w:val="0"/>
-        </w:rPr>
-        <w:t>执行，使数据贡献者可以复用通用流程，集中描述各数据源的转换规则。</w:t>
       </w:r>
     </w:p>
     <w:p>
@@ -4654,7 +4645,7 @@
                 <w:b w:val="0"/>
                 <w:sz w:val="18"/>
               </w:rPr>
-              <w:t>Windows/macOS独立性能观测及按实际环境记录的真实网络案例</w:t>
+              <w:t>Windows/macOS独立性能观测；真实网络与数据案例</w:t>
             </w:r>
           </w:p>
         </w:tc>
@@ -5067,7 +5058,7 @@
           <w:rFonts w:ascii="Times New Roman" w:hAnsi="Times New Roman" w:eastAsia="Songti SC"/>
           <w:b w:val="0"/>
         </w:rPr>
-        <w:t>直接NetCDF分发效率采用二维静态高程（ELEV）</w:t>
+        <w:t>直接NetCDF分发效率采用二维静态高程数据集</w:t>
       </w:r>
       <w:r>
         <w:rPr>
@@ -5080,7 +5071,7 @@
           <w:rFonts w:ascii="Times New Roman" w:hAnsi="Times New Roman" w:eastAsia="Songti SC"/>
           <w:b w:val="0"/>
         </w:rPr>
-        <w:t>和三维8日叶面积指数（LAI）</w:t>
+        <w:t>和三维8日尺度叶面积指数数据集</w:t>
       </w:r>
       <w:r>
         <w:rPr>
@@ -5119,7 +5110,7 @@
           <w:rFonts w:ascii="Times New Roman" w:hAnsi="Times New Roman" w:eastAsia="Songti SC"/>
           <w:b w:val="0"/>
         </w:rPr>
-        <w:t>分发，对照归档采用gzip级别6。两种形式解包后的NetCDF具有相同SHA-256，据此量化省去外层打包与解包带来的时间和临时空间收益。</w:t>
+        <w:t>分发，对照归档采用gzip级别6。两种形式解包后的NetCDF具有相同SHA-256，据此量化省去外层打包与解包带来的时间收益和文件存储占用变化。</w:t>
       </w:r>
     </w:p>
     <w:p>
@@ -5149,7 +5140,7 @@
           <w:rFonts w:ascii="Times New Roman" w:hAnsi="Times New Roman" w:eastAsia="Songti SC"/>
           <w:b w:val="0"/>
         </w:rPr>
-        <w:t>目录管理评价考察目录更新后能否继续通过数据标签获取一致内容。实验采用不同版本的Artifacts.yaml、多个NetCDF文件和两个镜像端点，覆盖目录首次建立与更新、单数据集获取、全库同步、历史整理和状态查询。通过重复调用比较获取结果、文件摘要与缓存状态，并与小型参考目录的预设结果核对；完整操作和文件状态记录见补充材料S2与S6。</w:t>
+        <w:t>目录管理评价围绕数据更新与重复获取展开：目录修订后，同一标签能否连接相应文件；获取异常时已有有效文件能否保留，重复获取时文件内容能否与目录记录一致。实验采用不同版本的Artifacts.yaml、多个NetCDF文件和两个镜像端点，通过目录更新与重复调用比较获取结果、文件摘要和缓存状态，并与小型参考目录的预设结果核对。目录首次建立、全库同步、历史整理和状态查询等操作及其文件状态记录见补充材料S2与S6。</w:t>
       </w:r>
     </w:p>
     <w:p>
@@ -5223,7 +5214,7 @@
           <w:rFonts w:ascii="Times New Roman" w:hAnsi="Times New Roman" w:eastAsia="Songti SC"/>
           <w:b w:val="0"/>
         </w:rPr>
-        <w:t>真实气象案例使用同一年度的8类ERA5标准化数据[9]：地表气压、降水、漫射与直射短波辐射、长波辐射、气温、水汽压亏缺和风速。八文件从中科大机构FTP只读获取，并逐文件记录SHA-256。US-NR1坐标（40.0329°N、105.5464°W）由规则索引映射到40.5°N、105.5°W格点；2020年为闰年，预期每个字段包含8784个逐小时值。实验同时核对8个</w:t>
+        <w:t>真实气象案例使用同一年度的8类ERA5标准化数据[9]：地表气压、降水、漫射与直射短波辐射、长波辐射、气温、水汽压亏缺和风速。八文件从中科大机构FTP获取，并逐文件记录SHA-256。US-NR1坐标（40.0329°N、105.5464°W）由规则索引映射到40.5°N、105.5°W格点；2020年为闰年，预期每个字段包含8784个逐小时值。实验同时核对8个</w:t>
       </w:r>
       <w:r>
         <w:rPr>
@@ -5283,7 +5274,7 @@
           <w:rFonts w:ascii="Times New Roman" w:hAnsi="Times New Roman" w:eastAsia="Songti SC"/>
           <w:b w:val="0"/>
         </w:rPr>
-        <w:t>跨操作系统测试采用一致的项目依赖、参考数据和判据，比较核心流程的数据结构、逐点数值、文件摘要及接口状态。Windows和macOS本地环境开展生产、分发效率、镜像状态和模式接口测试，Windows、macOS和Linux持续集成环境运行非交互处理与确定性核心流程。真实网络获取和US-NR1应用案例按实际运行环境分别记录；完整的系统与测试项目对应关系见补充材料S5。</w:t>
+        <w:t>跨操作系统测试采用一致的项目依赖、参考数据和判据，比较核心流程的数据结构、逐点数值、文件摘要及接口状态。Windows和macOS本地环境开展生产、分发效率、镜像状态和模式接口测试，Windows、macOS和Linux持续集成环境运行非交互处理与确定性核心流程。各系统的测试项目及真实网络、US-NR1案例的运行环境见补充材料S5。</w:t>
       </w:r>
     </w:p>
     <w:p>
@@ -5398,7 +5389,7 @@
           <w:rFonts w:ascii="Times New Roman" w:hAnsi="Times New Roman" w:eastAsia="Songti SC"/>
           <w:b w:val="0"/>
         </w:rPr>
-        <w:t>3次生成的OISST数据值、坐标和文件SHA-256保持一致。标准文件为997 006字节，目录登记与回环HTTP获取均通过字节数和SHA-256核验，下载未遗留临时文件；统一读取结果与独立参考逐点一致。标准化过程形成的空间与数值约定由此在登记、获取和读取之后得到保持，可供下游程序按同一标签重复调用。</w:t>
+        <w:t>3次生成的OISST数据值、坐标和文件SHA-256保持一致。标准文件为997 006字节，目录登记与回环HTTP获取均通过字节数和SHA-256核验；统一读取结果与独立参考逐点一致。标准化过程形成的空间与数值约定由此在登记、获取和读取之后得到保持，可供下游程序按同一标签重复调用。</w:t>
       </w:r>
     </w:p>
     <w:p>
@@ -5713,33 +5704,59 @@
           <w:rFonts w:ascii="Times New Roman" w:hAnsi="Times New Roman" w:eastAsia="Songti SC"/>
           <w:b w:val="0"/>
         </w:rPr>
-        <w:t>ERA5降水单位修订后，下游仍可使用原逻辑标签获取修订文件。目录中</w:t>
+        <w:t>以ERA5降水单位属性由</w:t>
       </w:r>
       <w:r>
         <w:rPr>
           <w:rFonts w:ascii="Consolas" w:hAnsi="Consolas" w:eastAsia="Songti SC"/>
         </w:rPr>
-        <w:t>PPT_ERA5_1X_1H_2020_V1</w:t>
+        <w:t>mm</w:t>
       </w:r>
       <w:r>
         <w:rPr>
           <w:rFonts w:ascii="Times New Roman" w:hAnsi="Times New Roman" w:eastAsia="Songti SC"/>
           <w:b w:val="0"/>
         </w:rPr>
-        <w:t>指向</w:t>
+        <w:t>修订为</w:t>
       </w:r>
       <w:r>
         <w:rPr>
           <w:rFonts w:ascii="Consolas" w:hAnsi="Consolas" w:eastAsia="Songti SC"/>
         </w:rPr>
-        <w:t>V1_R1.nc</w:t>
+        <w:t>m</w:t>
       </w:r>
       <w:r>
         <w:rPr>
           <w:rFonts w:ascii="Times New Roman" w:hAnsi="Times New Roman" w:eastAsia="Songti SC"/>
           <w:b w:val="0"/>
         </w:rPr>
-        <w:t>，并登记修订后的字节数与SHA-256，原V1和R1文件分别保留。修订文件首次获取通过完整性核验，再次调用复用缓存。目录因而能够承接数据修订并保持调用入口稳定，试验所用的具体文件则由目录版本与摘要确定。</w:t>
+        <w:t>为例，独立目录将原逻辑标签</w:t>
+      </w:r>
+      <w:r>
+        <w:rPr>
+          <w:rFonts w:ascii="Consolas" w:hAnsi="Consolas" w:eastAsia="Songti SC"/>
+        </w:rPr>
+        <w:t>PPT_ERA5_1X_1H_2020_V1</w:t>
+      </w:r>
+      <w:r>
+        <w:rPr>
+          <w:rFonts w:ascii="Times New Roman" w:hAnsi="Times New Roman" w:eastAsia="Songti SC"/>
+          <w:b w:val="0"/>
+        </w:rPr>
+        <w:t>指向</w:t>
+      </w:r>
+      <w:r>
+        <w:rPr>
+          <w:rFonts w:ascii="Consolas" w:hAnsi="Consolas" w:eastAsia="Songti SC"/>
+        </w:rPr>
+        <w:t>V1_R1.nc</w:t>
+      </w:r>
+      <w:r>
+        <w:rPr>
+          <w:rFonts w:ascii="Times New Roman" w:hAnsi="Times New Roman" w:eastAsia="Songti SC"/>
+          <w:b w:val="0"/>
+        </w:rPr>
+        <w:t>，并登记修订后的字节数与SHA-256；原V1和R1文件分别保留。修订文件首次获取通过完整性核验，再次调用复用缓存。下游因而能够沿用原标签获取修订数据，试验所用的具体文件由目录版本与摘要确定。单位修订依据及模式换算见第4.4节。</w:t>
       </w:r>
     </w:p>
     <w:p>
@@ -5760,7 +5777,7 @@
           <w:rFonts w:ascii="Times New Roman" w:hAnsi="Times New Roman" w:eastAsia="Songti SC"/>
           <w:b w:val="0"/>
         </w:rPr>
-        <w:t>2020年14类陆面数据组合后形成US-NR1格点的34个模式字段，包含366日季节序列、4个土壤层和17个植物功能型。各文件的大小、来源摘要和SHA-256通过核验，站点索引映射至40.5°N、105.5°W，高程、陆地掩膜与叶面积指数读取一致。撒哈拉案例被识别为非植被格点，并按相应陆面状态组织参数。相同数据集合因而能够根据格点状态提供植被与非植被条件下的模式输入。</w:t>
+        <w:t>不同空间分辨率和时间尺度的14类陆面数据经统一组织，形成2020年US-NR1格点的34个模式字段，包含366日季节序列、4个土壤层和17个植物功能型。站点索引映射至40.5°N、105.5°W，高程、陆地掩膜与叶面积指数读取一致。撒哈拉案例被识别为非植被格点，并按相应陆面状态组织参数，说明同一数据集合能够根据格点状态提供植被与非植被条件下的模式输入。各输入文件的大小、来源摘要和SHA-256均通过核验。</w:t>
       </w:r>
     </w:p>
     <w:p>
@@ -5769,7 +5786,7 @@
           <w:rFonts w:ascii="Times New Roman" w:hAnsi="Times New Roman" w:eastAsia="Songti SC"/>
           <w:b w:val="0"/>
         </w:rPr>
-        <w:t>2020年8类ERA5数据的各变量均为360×180×8784的经度、纬度和逐小时数组，并带有单位属性。US-NR1格点的8类变量各得到8784个逐小时值，有限值比例均为100%，与底层NetCDF读取结果的最大绝对差均为0。地方平太阳时偏移为−7.0364 h，浮点年积日严格递增且与独立公式逐点一致。输出由时间轴和8类气象变量共9个字段组成，经Emerald适配后形成16个模式驱动字段，保持了数据取样、年度时间组织与模式字段之间的对应关系。逐文件大小与字段信息见补充材料S1。</w:t>
+        <w:t>8类ERA5气象变量经统一读取，形成US-NR1格点2020年连续的年度逐小时序列。各源变量均为360×180×8784的经度、纬度和逐小时数组，并带有单位属性；站点的每类变量均得到8784个逐小时值，有限值比例为100%，与底层NetCDF读取结果的最大绝对差为0。地方平太阳时偏移为−7.0364 h，浮点年积日严格递增且与独立公式逐点一致。时间轴和8类气象变量共9个字段经Emerald适配后形成16个模式驱动字段，使格点取样、年度时间组织与模式字段相互对应。逐文件大小与字段信息见补充材料S1。</w:t>
       </w:r>
     </w:p>
     <w:p>
@@ -5812,7 +5829,7 @@
           <w:rFonts w:ascii="Times New Roman" w:hAnsi="Times New Roman" w:eastAsia="Songti SC"/>
           <w:b w:val="0"/>
         </w:rPr>
-        <w:t>跨操作系统运行中，GriddingMachine、GriddingMachineDatasets及Emerald合成输入接口的数据结构、逐点数值、文件摘要和接口状态满足相同判据。标准化、镜像获取和模式输入检查表明，统一数据约定能够支持核心流程在不同操作系统中采用一致的调用方式与结果核对方法；各系统测试项目与结果见补充材料S5。</w:t>
+        <w:t>跨操作系统运行中，GriddingMachine和GriddingMachineDatasets的确定性核心流程得到一致的数据结构、逐点数值和文件摘要，Emerald合成输入接口的状态均符合预设结果。不同系统能够沿用同一数据约定完成标准化、获取和模式输入组织，为科研程序在不同运行环境中使用这些数据提供支持；各系统测试项目与结果见补充材料S5。</w:t>
       </w:r>
     </w:p>
     <w:p>
@@ -5863,7 +5880,7 @@
           <w:rFonts w:ascii="Times New Roman" w:hAnsi="Times New Roman" w:eastAsia="Songti SC"/>
           <w:b w:val="0"/>
         </w:rPr>
-        <w:t>统一约定还需要同时支持数据更新和既有试验的复现。ERA5降水修订中，下游逻辑标签保持不变，实际文件位置及完整性信息在目录中更新，使调用程序能够继续使用已有入口。对某次模式试验，保存当时的目录、文件摘要、处理配置和代码版本则能够明确实际使用的数据与转换过程。标签用于简化调用，归档记录用于还原试验，两者共同支持数据库的持续维护与科研复用。</w:t>
+        <w:t>数据库维护需要兼顾数据持续更新与既有试验复现。ERA5降水修订表明，目录能够承接文件变化，使科研程序沿用已有标签；保存各次试验使用的目录、文件摘要、处理配置和代码版本，则可明确实际输入及其转换过程。数据标签提供统一调用入口，归档记录保存具体试验所用内容，两者共同支持数据库更新与科研复用。</w:t>
       </w:r>
     </w:p>
     <w:p>
@@ -5914,7 +5931,7 @@
           <w:rFonts w:ascii="Times New Roman" w:hAnsi="Times New Roman" w:eastAsia="Songti SC"/>
           <w:b w:val="0"/>
         </w:rPr>
-        <w:t>US-NR1案例表明，统一文件格式之后的关键工作是建立变量之间的空间、时间和物理联系。不同分辨率的陆面数据按各自网格提取目标位置的参数，季节参数与ERA5逐时气象按共同年度组织，再由模式适配完成字段和量纲转换。降水修订尤其说明，仅有数值一致还不足以保证正确的物理输入：0.496409 m与496.409 mm代表同一水层，但模式的通量换算必须采用与输入单位一致的关系。把这些组织方法置于数据库读取之后，能够使各模式复用已明确的变量关系，减少单独整理参数和气象输入的工作。</w:t>
+        <w:t>US-NR1案例表明，统一文件格式之后的关键工作是建立变量之间的空间、时间和物理联系。不同分辨率的陆面数据按各自网格提取目标位置的参数，季节参数与ERA5逐时气象按共同年度组织，再由模式适配完成字段和量纲转换。降水等累计量还需结合单位和累计时段换算为模式所需通量，使数据的物理含义与模式计算相衔接。将这些关系纳入统一的数据组织方法，能够减少各模式单独整理参数和气象输入的工作。</w:t>
       </w:r>
     </w:p>
     <w:p>
@@ -5944,7 +5961,7 @@
           <w:rFonts w:ascii="Times New Roman" w:hAnsi="Times New Roman" w:eastAsia="Songti SC"/>
           <w:b w:val="0"/>
         </w:rPr>
-        <w:t>地球系统数据立方体着重多变量时空数据的联合分析[12]；GriddingMachine侧重将不同来源的变量组织为可重复调用的模式输入，其Julia实现[13]便于把标准化、读取和模式适配组合到已有科研程序中。Google Earth Engine提供云端遥感访问与计算[4]，ESGF组织分布式气候模式数据发现与访问[14]，Pangeo及Pangeo Forge支持云端数据组织和可复用处理配方[15,16]。这些设施为数据访问和计算提供基础，GriddingMachine则以标准网格、数据标签和输入组织方法衔接本地模式试验，使获得的数据能够进一步用于参数配置与气象驱动。</w:t>
+        <w:t>不同数据基础设施侧重数据分析与访问的不同环节。地球系统数据立方体着重多变量时空数据的联合分析[12]，GriddingMachine则将标准化、读取和模式适配组合为可由科研程序调用的数据流程，其Julia实现为这些方法的组合提供支持[13]。Google Earth Engine提供云端遥感访问与计算[4]，ESGF组织分布式气候模式数据发现与访问[14]，Pangeo及Pangeo Forge支持云端数据组织和可复用处理配方[15,16]。本文OISST标准化与US-NR1案例展示了数据获取之后的衔接：按统一空间约定保存处理结果，并依据变量的时间和量纲关系组织参数与气象驱动，使共享数据进一步用于本地模式试验。</w:t>
       </w:r>
     </w:p>
     <w:p>
@@ -5953,7 +5970,7 @@
           <w:rFonts w:ascii="Times New Roman" w:hAnsi="Times New Roman" w:eastAsia="Songti SC"/>
           <w:b w:val="0"/>
         </w:rPr>
-        <w:t>数据目录连接文件发现与实际获取。国内地球系统科学数据共享研究强调规范分类和目录建设[17]，Pooch提供科研文件获取工具，STAC提供地理空间目录描述规范[18,19]。本研究的镜像获取和修订案例表明，维护标签与文件内容的对应关系，可以在调整分发地址或修订数据时保持既有调用方式。后续可加强与通用目录和获取工具的衔接，使科研程序更便于复用共享数据。</w:t>
+        <w:t>数据目录连接文件发现与实际获取。国内地球系统科学数据共享研究强调规范分类和目录建设[17]，Pooch提供科研文件获取工具，STAC提供地理空间目录描述规范[18,19]。在本研究的镜像获取和修订案例中，标签既连接分发地址，也与文件内容记录对应，使科研程序能够在镜像切换或数据修订后沿用已有调用入口。这一实践为本地模式使用共享数据提供了文件获取与更新的衔接方式；后续可加强与通用目录和获取工具的连接。</w:t>
       </w:r>
     </w:p>
     <w:p>
@@ -5962,7 +5979,7 @@
           <w:rFonts w:ascii="Times New Roman" w:hAnsi="Times New Roman" w:eastAsia="Songti SC"/>
           <w:b w:val="0"/>
         </w:rPr>
-        <w:t>数据复用还需要保留处理规则及其研究出处。软件引用原则、科研软件FAIR原则（FAIR4RS）及数字资源库TRUST原则分别为软件识别、复用与资源库维护提供参考[20-22]。归档数据来源、配置和软件版本，可将模式试验中的输入追溯到具体处理过程；新增数据源配置、公共镜像登记和更多模式接口适配则可持续扩展数据库的科研用途。</w:t>
+        <w:t>多源数据共同进入模式时，处理规则及其研究出处也需要随输入保存。软件引用原则、科研软件FAIR原则（FAIR4RS）及数字资源库TRUST原则分别为软件识别、复用与资源库维护提供参考[20-22]。本文将数据来源、配置和软件版本与处理结果共同归档，使OISST转换和模式输入组织能够对应具体数据与方法。后续新增数据源配置、公共镜像登记和模式接口适配时，延续这些记录可为数据库更新和科研复用提供依据。</w:t>
       </w:r>
     </w:p>
     <w:p>
@@ -6022,98 +6039,20 @@
           <w:rFonts w:ascii="Times New Roman" w:hAnsi="Times New Roman" w:eastAsia="Songti SC"/>
           <w:b w:val="0"/>
         </w:rPr>
-        <w:t>GriddingMachine.jl源代码公开于https://github.com/CliMA/GriddingMachine.jl，数据生产代码公开于https://github.com/jhOo1/GriddingMachineDatasets，Emerald模式接口环境公开于https://github.com/jhOo1/Emerald-paper，论文补充材料、实验协议、脚本和结果公开于https://github.com/jhOo1/GriddingMachine_Reaserach。ERA5案例的逐文件大小与SHA-256、格点统计、时间轴核对和模式状态保存在</w:t>
+        <w:t>GriddingMachine.jl源代码公开于https://github.com/CliMA/GriddingMachine.jl，数据生产代码公开于https://github.com/jhOo1/GriddingMachineDatasets，Emerald模式接口环境公开于https://github.com/jhOo1/Emerald-paper，论文补充材料、实验协议、脚本和结果公开于https://github.com/jhOo1/GriddingMachine_Reaserach。研究所用代码版本、多语言下载入口及验证记录、数据修订信息和实验结果索引见补充材料S8，精确提交与稿件冻结信息由</w:t>
       </w:r>
       <w:r>
         <w:rPr>
           <w:rFonts w:ascii="Consolas" w:hAnsi="Consolas" w:eastAsia="Songti SC"/>
         </w:rPr>
-        <w:t>experiment_data/03_09/real_era5_result.toml</w:t>
+        <w:t>论文/投稿版本锁定.toml</w:t>
       </w:r>
       <w:r>
         <w:rPr>
           <w:rFonts w:ascii="Times New Roman" w:hAnsi="Times New Roman" w:eastAsia="Songti SC"/>
           <w:b w:val="0"/>
         </w:rPr>
-        <w:t>；PPT修订文件以V1_R1后缀发布，逻辑标签保持V1，目录记录其文件大小、SHA-256和机构FTP地址。既有主体实验使用的核心代码版本分别以</w:t>
-      </w:r>
-      <w:r>
-        <w:rPr>
-          <w:rFonts w:ascii="Consolas" w:hAnsi="Consolas" w:eastAsia="Songti SC"/>
-        </w:rPr>
-        <w:t>griddingmachine-paper-2026-v1</w:t>
-      </w:r>
-      <w:r>
-        <w:rPr>
-          <w:rFonts w:ascii="Times New Roman" w:hAnsi="Times New Roman" w:eastAsia="Songti SC"/>
-          <w:b w:val="0"/>
-        </w:rPr>
-        <w:t>、</w:t>
-      </w:r>
-      <w:r>
-        <w:rPr>
-          <w:rFonts w:ascii="Consolas" w:hAnsi="Consolas" w:eastAsia="Songti SC"/>
-        </w:rPr>
-        <w:t>griddingmachine-datasets-paper-2026-v1</w:t>
-      </w:r>
-      <w:r>
-        <w:rPr>
-          <w:rFonts w:ascii="Times New Roman" w:hAnsi="Times New Roman" w:eastAsia="Songti SC"/>
-          <w:b w:val="0"/>
-        </w:rPr>
-        <w:t>和</w:t>
-      </w:r>
-      <w:r>
-        <w:rPr>
-          <w:rFonts w:ascii="Consolas" w:hAnsi="Consolas" w:eastAsia="Songti SC"/>
-        </w:rPr>
-        <w:t>emerald-paper-2026-v1</w:t>
-      </w:r>
-      <w:r>
-        <w:rPr>
-          <w:rFonts w:ascii="Times New Roman" w:hAnsi="Times New Roman" w:eastAsia="Songti SC"/>
-          <w:b w:val="0"/>
-        </w:rPr>
-        <w:t>标签固定。多语言下载入口位于GriddingMachine.jl的</w:t>
-      </w:r>
-      <w:r>
-        <w:rPr>
-          <w:rFonts w:ascii="Consolas" w:hAnsi="Consolas" w:eastAsia="Songti SC"/>
-        </w:rPr>
-        <w:t>clients</w:t>
-      </w:r>
-      <w:r>
-        <w:rPr>
-          <w:rFonts w:ascii="Times New Roman" w:hAnsi="Times New Roman" w:eastAsia="Songti SC"/>
-          <w:b w:val="0"/>
-        </w:rPr>
-        <w:t>目录，对应发布分支提交</w:t>
-      </w:r>
-      <w:r>
-        <w:rPr>
-          <w:rFonts w:ascii="Consolas" w:hAnsi="Consolas" w:eastAsia="Songti SC"/>
-        </w:rPr>
-        <w:t>8b3ff703e14f1a387281f4c814f2620438e8f9aa</w:t>
-      </w:r>
-      <w:r>
-        <w:rPr>
-          <w:rFonts w:ascii="Times New Roman" w:hAnsi="Times New Roman" w:eastAsia="Songti SC"/>
-          <w:b w:val="0"/>
-        </w:rPr>
-        <w:t>；该提交包含跨语言下载入口及其完整性验证记录。研究材料的内容冻结提交、冻结分支及不可变稿件标签由</w:t>
-      </w:r>
-      <w:r>
-        <w:rPr>
-          <w:rFonts w:ascii="Consolas" w:hAnsi="Consolas" w:eastAsia="Songti SC"/>
-        </w:rPr>
-        <w:t>论文/投稿版本锁定.toml</w:t>
-      </w:r>
-      <w:r>
-        <w:rPr>
-          <w:rFonts w:ascii="Times New Roman" w:hAnsi="Times New Roman" w:eastAsia="Songti SC"/>
-          <w:b w:val="0"/>
-        </w:rPr>
-        <w:t>统一记录；永久归档与DOI信息随最终归档版本同步发布。</w:t>
+        <w:t>统一记录。永久归档与DOI信息随最终归档版本同步发布。</w:t>
       </w:r>
     </w:p>
     <w:p>

</xml_diff>

<commit_message>
Align manuscript with validated multilingual download interfaces
</commit_message>
<xml_diff>
--- a/论文/GriddingMachine论文初稿_v0.3_语言优化版.docx
+++ b/论文/GriddingMachine论文初稿_v0.3_语言优化版.docx
@@ -365,7 +365,7 @@
           <w:rFonts w:ascii="Times New Roman" w:hAnsi="Times New Roman" w:eastAsia="Songti SC"/>
           <w:b w:val="0"/>
         </w:rPr>
-        <w:t>本文从数据预处理、分发与读取三个方面更新2022版GriddingMachine，以共享处理规则和独立数据目录减少重复整理与维护，并在统一读取基础上组织模式输入；同时完善Matlab、Octave、Python和R对新版数据的自动下载支持，新增C和Fortran下载入口。研究通过受控处理实例和真实海表温度数据检验标准化结果，通过高程与叶面积指数数据的分发比较和网络镜像获取评价访问效率与内容一致性，并以Emerald陆面过程模式为应用载体，展示陆面参数与逐时气象数据向模式输入的衔接。</w:t>
+        <w:t>本文从数据预处理、分发与读取三个方面更新2022版GriddingMachine，以共享处理规则和独立数据目录减少重复整理与维护，并在统一读取基础上组织模式输入；同时完善Matlab、Octave、Python和R对新版数据的自动下载支持，新增C和Fortran自动下载支持。研究通过受控处理实例和真实海表温度数据检验标准化结果，通过高程与叶面积指数数据的分发比较和网络镜像获取评价访问效率与内容一致性，并以Emerald陆面过程模式为应用载体，展示陆面参数与逐时气象数据向模式输入的衔接。</w:t>
       </w:r>
     </w:p>
     <w:p>
@@ -1539,7 +1539,7 @@
                 <w:b w:val="0"/>
                 <w:sz w:val="18"/>
               </w:rPr>
-              <w:t>在保留原有接口的基础上完善Matlab、Octave、Python和R自动下载，并新增C和Fortran自动下载入口</w:t>
+              <w:t>完善Matlab、Octave、Python和R自动下载，新增C和Fortran支持；各下载入口均支持URL或数据标签调用及文件完整性核验</w:t>
             </w:r>
           </w:p>
         </w:tc>
@@ -1573,7 +1573,7 @@
                 <w:b w:val="0"/>
                 <w:sz w:val="18"/>
               </w:rPr>
-              <w:t>扩展科研人员获取新版网格数据的编程环境</w:t>
+              <w:t>不同科研编程环境共享数据获取方式与内容核验规则</w:t>
             </w:r>
           </w:p>
         </w:tc>
@@ -3843,7 +3843,7 @@
           <w:rFonts w:ascii="Times New Roman" w:hAnsi="Times New Roman" w:eastAsia="Songti SC"/>
           <w:b w:val="0"/>
         </w:rPr>
-        <w:t>为衔接不同科研编程环境，新版提供Matlab、Octave、Python和R的数据下载入口，并增加C和Fortran入口。非Julia入口调用同一Python下载脚本，使用时需要Python 3运行环境。Matlab/Octave函数、R函数及C和Fortran程序接收文件URL和本地输出路径，调用脚本完成直接NetCDF下载；Python脚本还支持依据本地Artifacts.yaml中的标签查找下载地址，并在目录或调用参数提供相应信息时检查文件大小和SHA-256。</w:t>
+        <w:t>为衔接不同科研编程环境，新版完善Matlab、Octave、Python和R的数据自动下载接口，并新增C和Fortran支持。各接口均可通过文件URL或数据标签指定所需数据；标签调用依据本地Artifacts.yaml查找分发地址，并在镜像不可用或内容核验未通过时尝试其余地址。下载先保存为临时文件，依据目录或调用参数中的文件大小和SHA-256完成核验后，再更新本地目标文件；获取失败时保留已有文件。</w:t>
       </w:r>
     </w:p>
     <w:p>
@@ -3852,20 +3852,7 @@
           <w:rFonts w:ascii="Times New Roman" w:hAnsi="Times New Roman" w:eastAsia="Songti SC"/>
           <w:b w:val="0"/>
         </w:rPr>
-        <w:t>该设计将各语言的调用方式与下载逻辑分开维护，使科研人员可以在已有程序中自动获取文件，再使用相应语言的NetCDF工具读取数据。非Julia接口的源码和调用说明随代码仓库的</w:t>
-      </w:r>
-      <w:r>
-        <w:rPr>
-          <w:rFonts w:ascii="Consolas" w:hAnsi="Consolas" w:eastAsia="Songti SC"/>
-        </w:rPr>
-        <w:t>clients</w:t>
-      </w:r>
-      <w:r>
-        <w:rPr>
-          <w:rFonts w:ascii="Times New Roman" w:hAnsi="Times New Roman" w:eastAsia="Songti SC"/>
-          <w:b w:val="0"/>
-        </w:rPr>
-        <w:t>目录提供。</w:t>
+        <w:t>各语言接口共用Python下载程序，使用时需要Python 3运行环境。该设计使不同语言的科研程序沿用相同的数据标签、镜像和完整性约定，自动获取标准NetCDF文件，再使用相应语言的NetCDF工具读取数据。下载逻辑集中维护，科研人员无需在不同编程环境中重复实现文件获取和内容核验；接口调用示例见补充材料S5。</w:t>
       </w:r>
     </w:p>
     <w:p>
@@ -4611,7 +4598,7 @@
                 <w:b w:val="0"/>
                 <w:sz w:val="18"/>
               </w:rPr>
-              <w:t>Windows、macOS、Linux持续集成；C与Fortran编译及下载测试</w:t>
+              <w:t>Windows、macOS、Linux持续集成；六种语言的URL与标签下载、镜像回退和完整性核验</w:t>
             </w:r>
           </w:p>
         </w:tc>
@@ -5283,7 +5270,7 @@
           <w:rFonts w:ascii="Times New Roman" w:hAnsi="Times New Roman" w:eastAsia="Songti SC"/>
           <w:b w:val="0"/>
         </w:rPr>
-        <w:t>多语言下载评价考察科研程序能否通过C和Fortran入口获取与参考内容一致的文件。两种入口编译后，通过回环HTTP下载同一确定性参考文件，核对获取结果、文件字节数和SHA-256；含空格的地址与输出路径另用于检查参数传递。程序状态及临时文件记录见补充材料S5。</w:t>
+        <w:t>多语言下载评价考察Matlab、Octave、Python、R、C和Fortran科研程序能否按相同约定获取数据。在相应语言运行环境中，通过文件URL和数据标签获取回环HTTP提供的确定性参考文件，并核对文件字节数、SHA-256与二进制内容；首选镜像不可用、文件大小或摘要不符的情形用于检验镜像回退、错误返回和已有文件保留。含空格与特殊字符的路径及不同工作目录用于检查参数传递和接口调用。各语言环境、调用示例与结果记录见补充材料S5。</w:t>
       </w:r>
     </w:p>
     <w:p>
@@ -5838,7 +5825,7 @@
           <w:rFonts w:ascii="Times New Roman" w:hAnsi="Times New Roman" w:eastAsia="Songti SC"/>
           <w:b w:val="0"/>
         </w:rPr>
-        <w:t>经编译的C和Fortran入口均成功获取参考文件，字节数和SHA-256与参考内容一致。新增入口使采用这两种语言的科研程序能够调用统一下载逻辑，自动获取内容一致的网格数据文件。</w:t>
+        <w:t>Matlab、Octave、Python、R、C和Fortran均可通过URL或数据标签获取与参考内容一致的文件。标签调用在首选镜像不可用时继续获取其余镜像；文件大小或摘要不符时，接口返回错误并保留已有文件。不同语言的科研程序由此能够沿用同一数据目录与内容核验规则，自动获取标准化网格数据，减少文件获取方法的重复实现。</w:t>
       </w:r>
     </w:p>
     <w:p>
@@ -6000,7 +5987,7 @@
           <w:rFonts w:ascii="Times New Roman" w:hAnsi="Times New Roman" w:eastAsia="Songti SC"/>
           <w:b w:val="0"/>
         </w:rPr>
-        <w:t>本文针对多源网格数据在转换、分发和模式接入中需要重复整理与维护的问题，更新了2022版GriddingMachine。共享配置集中描述源数据处理规则，独立目录维护标签、分发地址与文件完整性信息，并在直接NetCDF获取和统一读取之后组织陆面参数与气象驱动。Matlab、Octave、Python和R的新版数据自动下载支持得到完善，新增C和Fortran入口扩展了科研程序的数据获取方式。</w:t>
+        <w:t>本文针对多源网格数据在转换、分发和模式接入中需要重复整理与维护的问题，更新了2022版GriddingMachine。共享配置集中描述源数据处理规则，独立目录维护标签、分发地址与文件完整性信息，并在直接NetCDF获取和统一读取之后组织陆面参数与气象驱动。Matlab、Octave、Python和R的新版数据自动下载支持得到完善，新增C和Fortran自动下载支持，使不同编程环境能够通过URL或数据标签获取标准化文件。</w:t>
       </w:r>
     </w:p>
     <w:p>

</xml_diff>

<commit_message>
Improve abstract flow and synchronize English abstract and Word
</commit_message>
<xml_diff>
--- a/论文/GriddingMachine论文初稿_v0.3_语言优化版.docx
+++ b/论文/GriddingMachine论文初稿_v0.3_语言优化版.docx
@@ -115,7 +115,7 @@
           <w:rFonts w:ascii="Times New Roman" w:hAnsi="Times New Roman" w:eastAsia="Songti SC"/>
           <w:b w:val="0"/>
         </w:rPr>
-        <w:t>地球系统模式依赖区域至全球尺度的网格数据进行参数初始化及结果验证。尽管当前数据大多已采用NetCDF、HDF、GeoTIFF等标准格式，源数据处理规则、单位换算、标准数据标识和网络分发方式不同等问题，使得各模式仍需分别整理和维护数据库，给模式持续更新和验证带来不必要的困难。本文在2022版GriddingMachine基础上，优化数据预处理、数据分发及数据读取：以共享配置组织数据处理规则，建立统一的标准化流程；采用直接NetCDF分发和独立数据目录，简化文件获取与数据更新；在统一读取基础上组织陆面参数和气象驱动，衔接多源数据与模式输入。应用案例表明，标准化数据与独立参考一致，直接NetCDF分发缩短获取至首次读取的时间，独立目录在数据修订后保持标签调用，多源数据经统一组织形成模式所需输入。除Julia语言外，还完善了Matlab、Octave、Python和R语言对新版数据的自动下载支持，并添加了C语言和Fortran语言的自动下载支持，为不同科研编程环境和地球系统模式提供可复用的网格数据基础。</w:t>
+        <w:t>地球系统模式依赖区域至全球尺度的网格数据进行参数初始化及结果验证。尽管当前数据大多已采用NetCDF、HDF、GeoTIFF等标准格式，不同数据源在处理规则、单位、数据标识和网络分发方式等方面仍存在差异，研究人员往往需要针对各自模式重复整理和维护数据库，增加了模式持续更新与验证的工作量。本文在2022版GriddingMachine基础上，围绕数据预处理、分发和读取进行改进。通过共享配置统一组织数据处理规则，使不同来源的数据能够按一致规范完成标准化；采用直接NetCDF分发和独立维护的数据目录，简化数据获取与更新；进一步将多源数据组织为陆面参数和气象驱动，为模式计算提供输入。应用案例表明，改进后的流程能够保持标准化结果与独立参考的一致性，缩短数据获取至首次读取的时间，并在数据修订后沿用已有标签访问，支持多源数据向模式输入的衔接。此外，完善了Matlab、Octave、Python和R语言对新版数据的自动下载支持，并新增C和Fortran语言的自动下载支持，以更好地服务科学研究与应用。</w:t>
       </w:r>
     </w:p>
     <w:p>
@@ -236,7 +236,7 @@
           <w:rFonts w:ascii="Times New Roman" w:hAnsi="Times New Roman" w:eastAsia="Songti SC"/>
           <w:b w:val="0"/>
         </w:rPr>
-        <w:t>Earth system models rely on gridded data at regional to global scales for parameter initialization and evaluation of simulation results. Although most datasets are available in standard formats such as NetCDF, HDF, and GeoTIFF, differences in source-processing rules, unit conversion, standardized data identifiers, and distribution methods require researchers to organize and maintain databases for individual models, complicating continued model development and evaluation. Building on the 2022 release of GriddingMachine, this study improves data preprocessing, distribution, and reading. A shared configuration organizes processing rules within a standardized workflow; direct NetCDF distribution and an independent catalog simplify file acquisition and data updates; and land parameters and meteorological forcing from multiple sources are assembled into model inputs on the basis of unified reading. Application cases show that standardized data agree with independent references, direct NetCDF distribution shortens the time from acquisition to the first read, the independent catalog preserves label-based access after data revisions, and data from multiple sources are organized into the inputs required by the model. In addition to Julia, automatic downloading of the updated data is supported in MATLAB, Octave, Python, and R, with new automatic-download entry points for C and Fortran, providing a reusable gridded-data basis for different scientific programming environments and Earth system models.</w:t>
+        <w:t>Earth system models rely on gridded data at regional to global scales for parameter initialization and evaluation of simulation results. Although most datasets are available in standard formats such as NetCDF, HDF, and GeoTIFF, data sources still differ in processing rules, units, data identifiers, and distribution methods. Researchers therefore often need to organize and maintain databases for individual models, adding to the work required for continued model development and evaluation. Building on the 2022 release of GriddingMachine, this study improves data preprocessing, distribution, and reading. Shared configurations organize processing rules so that data from different sources can be standardized according to common conventions. Direct NetCDF distribution and an independently maintained catalog simplify data acquisition and updates, while land parameters and meteorological forcing are assembled from multiple sources to provide model inputs. Application cases show that the improved workflow maintains agreement between standardized results and independent references, shortens the time from data acquisition to the first read, preserves access through existing labels after data revisions, and connects data from multiple sources to model inputs. Automatic downloading of the updated data has also been improved for MATLAB, Octave, Python, and R, with new support for C and Fortran, to better serve scientific research and applications.</w:t>
       </w:r>
     </w:p>
     <w:p>

</xml_diff>

<commit_message>
Improve manuscript prose while preserving experimental details
</commit_message>
<xml_diff>
--- a/论文/GriddingMachine论文初稿_v0.3_语言优化版.docx
+++ b/论文/GriddingMachine论文初稿_v0.3_语言优化版.docx
@@ -347,7 +347,7 @@
           <w:rFonts w:ascii="Times New Roman" w:hAnsi="Times New Roman" w:eastAsia="Songti SC"/>
           <w:b w:val="0"/>
         </w:rPr>
-        <w:t>Wang等[5]于2022年发布了基于Julia语言的GriddingMachine数据库和软件，将常用于陆面和地球系统模拟的全球数据整理为具有统一空间和变量约定的NetCDF文件，并通过数据标签和软件包内的Artifacts.toml目录实现管理与自动下载，同时提供Julia、Matlab、Octave、Python和R接口。该版本为多源数据的统一访问奠定了基础。随着数据类型和应用需求扩展，原有流程在数据维护和模式接入方面面临新的需求：处理规则主要保存在数据源专用脚本中，新增数据需分别适配；标准NetCDF经外层tar.gz归档后分发，使用时仍需解包，Julia包内的数据目录随软件版本更新，新增或修订数据时需同步维护软件内置目录；在获得标准网格数据后，具体模式所需的参数和气象序列仍由应用程序进一步组合，并完成时间与单位衔接。</w:t>
+        <w:t>Wang等[5]于2022年发布了基于Julia语言的GriddingMachine数据库和软件，将常用于陆面和地球系统模拟的全球数据整理为具有统一空间和变量约定的NetCDF文件，通过数据标签和软件包内的Artifacts.toml目录实现管理与自动下载，并提供Julia、Matlab、Octave、Python和R接口。该版本为多源数据的统一访问奠定了基础。随着数据类型和应用需求扩展，原有流程在数据维护和模式接入方面仍有改进空间。处理规则主要保存在数据源专用脚本中，新增数据需要分别适配；标准NetCDF经外层tar.gz归档后分发，使用前还需解包。Julia包内的数据目录随软件版本更新，新增或修订数据时需同步维护内置目录。获得标准网格数据后，研究人员仍需根据具体模式组合参数和气象序列，并完成时间与单位换算。</w:t>
       </w:r>
     </w:p>
     <w:p>
@@ -365,7 +365,7 @@
           <w:rFonts w:ascii="Times New Roman" w:hAnsi="Times New Roman" w:eastAsia="Songti SC"/>
           <w:b w:val="0"/>
         </w:rPr>
-        <w:t>本文从数据预处理、分发与读取三个方面更新2022版GriddingMachine，以共享处理规则和独立数据目录减少重复整理与维护，并在统一读取基础上组织模式输入；同时完善Matlab、Octave、Python和R对新版数据的自动下载支持，新增C和Fortran自动下载支持。研究通过受控处理实例和真实海表温度数据检验标准化结果，通过高程与叶面积指数数据的分发比较和网络镜像获取评价访问效率与内容一致性，并以Emerald陆面过程模式为应用载体，展示陆面参数与逐时气象数据向模式输入的衔接。</w:t>
+        <w:t>本文从数据预处理、分发与读取三个方面更新2022版GriddingMachine，通过共享处理规则和独立维护数据目录减少重复整理，并在统一读取基础上组织模式输入。同时完善Matlab、Octave、Python和R对新版数据的自动下载支持，新增C和Fortran自动下载支持。研究采用受控处理实例和真实海表温度数据检验标准化结果，以高程与叶面积指数数据比较分发效率，并通过网络镜像获取核对文件内容的一致性；最后以Emerald陆面过程模式为例，考察陆面参数与逐时气象数据如何形成模式输入。</w:t>
       </w:r>
     </w:p>
     <w:p>
@@ -398,7 +398,7 @@
           <w:rFonts w:ascii="Times New Roman" w:hAnsi="Times New Roman" w:eastAsia="Songti SC"/>
           <w:b w:val="0"/>
         </w:rPr>
-        <w:t>为使源数据更新、文件分发和模式接入能够分别维护，新版GriddingMachine将数据流程组织为三个相互衔接的环节（图1）。数据生产与标准化层依据源数据和以文本配置格式YAML保存的处理规则，完成维度、坐标、数值转换和质量检查，输出标准NetCDF文件；数据目录与可信分发层登记数据标签、版本、镜像和完整性信息，负责目录更新、文件下载与内容核验；模式输入组织层读取已获取的标准化数据，完成格点提取、陆面参数融合和气象驱动组织。数据生产主要由GriddingMachineDatasets承担，目录管理、文件获取和模式输入组织主要由GriddingMachine.jl承担。</w:t>
+        <w:t>新版GriddingMachine按数据处理、分发和模式应用的职责划分为三个相互衔接的功能层（图1）。数据生产与标准化层根据源数据和文本配置格式YAML记录的处理规则，完成维度、坐标与数值转换，经质量检查后输出标准NetCDF文件。数据目录与可信分发层登记数据标签、版本、镜像和完整性信息，负责目录更新、文件下载与内容核验。模式输入组织层读取已获取的标准化数据，提取目标格点，融合陆面参数并组织气象驱动。数据生产主要由GriddingMachineDatasets承担，目录管理、文件获取和模式输入组织主要由GriddingMachine.jl承担。</w:t>
       </w:r>
     </w:p>
     <w:p>
@@ -556,7 +556,7 @@
           <w:rFonts w:ascii="Times New Roman" w:hAnsi="Times New Roman" w:eastAsia="Songti SC"/>
           <w:b w:val="0"/>
         </w:rPr>
-        <w:t>标准NetCDF和数据标签连接上述环节：生产流程输出以标签命名的文件，目录建立标签与文件地址的对应关系，科研程序再依据标签获取和读取数据。数据源变化时可调整处理配置，分发位置变化时可更新目录，模式侧则沿用统一读取方式，并根据自身接口组织输入。各环节的具体方法见第2.2—2.4节。</w:t>
+        <w:t>三个功能层通过标准NetCDF和数据标签连接。生产流程输出以标签命名的文件，数据目录记录标签对应的文件地址，科研程序据此获取和读取数据。源数据变化时更新处理配置，分发位置变化时调整目录，模式程序则沿用统一读取方式，并根据自身接口组织输入。这样，处理规则、分发信息和模式接入程序可以分别维护。具体方法见第2.2—2.4节。</w:t>
       </w:r>
     </w:p>
     <w:p>
@@ -1900,7 +1900,7 @@
           <w:rFonts w:ascii="Times New Roman" w:hAnsi="Times New Roman" w:eastAsia="Songti SC"/>
           <w:b w:val="0"/>
         </w:rPr>
-        <w:t xml:space="preserve">GriddingMachine采用NetCDF格式组织多维数组、坐标和自描述元数据，便于不同地球科学软件读取[2]。2022 年版本已经规定数据采用二维或三维规则经纬网，前两维依次为经度和纬度，可选第三维表示周期；经度自西向东、纬度自南向北，输出保存为实际物理值，缺失值在读取后统一表示为 </w:t>
+        <w:t xml:space="preserve">GriddingMachine采用NetCDF格式保存多维数组、坐标和自描述元数据，便于不同地球科学软件读取[2]。2022 年版本已经规定数据采用二维或三维规则经纬网，前两维依次为经度和纬度，可选第三维表示周期；经度自西向东、纬度自南向北，输出保存为实际物理值，缺失值在读取后统一表示为 </w:t>
       </w:r>
       <w:r>
         <w:rPr>
@@ -1939,7 +1939,7 @@
           <w:rFonts w:ascii="Times New Roman" w:hAnsi="Times New Roman" w:eastAsia="Songti SC"/>
           <w:b w:val="0"/>
         </w:rPr>
-        <w:t>[5]。新版延续这些核心约定，并将源维度映射、处理记录、版本化配置和分发完整性纳入相互衔接的机器可读规范（表2）。</w:t>
+        <w:t>[5]。新版保留这些约定，并进一步规范源维度映射、处理记录、配置归档和分发完整性信息，使处理程序、数据文件和获取接口能够使用同一套规则（表2）。</w:t>
       </w:r>
     </w:p>
     <w:p>
@@ -3041,7 +3041,7 @@
                 <w:b w:val="0"/>
                 <w:sz w:val="18"/>
               </w:rPr>
-              <w:t>配置意图与数据集处理历史相互对应</w:t>
+              <w:t>处理规则与实际执行记录可相互核对</w:t>
             </w:r>
           </w:p>
         </w:tc>
@@ -3155,7 +3155,7 @@
                 <w:b w:val="0"/>
                 <w:sz w:val="18"/>
               </w:rPr>
-              <w:t>配置、输入与代码版本共同重建标准化数据</w:t>
+              <w:t>利用归档的配置、输入与代码环境复现处理</w:t>
             </w:r>
           </w:p>
         </w:tc>
@@ -3369,7 +3369,7 @@
                 <w:b w:val="0"/>
                 <w:sz w:val="18"/>
               </w:rPr>
-              <w:t>对带完整性元数据的条目下载后核验并以事务方式进入正式目录；历史条目由兼容模式承接</w:t>
+              <w:t>带完整性信息的下载文件通过核验后才替换本地正式文件；已有条目按其登记信息获取</w:t>
             </w:r>
           </w:p>
         </w:tc>
@@ -3463,7 +3463,7 @@
           <w:rFonts w:ascii="Times New Roman" w:hAnsi="Times New Roman" w:eastAsia="Songti SC"/>
           <w:b w:val="0"/>
         </w:rPr>
-        <w:t>YAML配置集中描述各数据源的输入文件、变量及转换规则，使源数据差异与通用处理程序分开维护。框架提供程序化和本地交互式配置生成方式，二者均在执行前检查必需信息、字段类型及相互关系，再由标准化处理函数</w:t>
+        <w:t>YAML配置记录各数据源的输入文件、变量及转换规则，使数据源特有的处理要求可以独立于通用程序维护。框架提供程序化和本地交互式两种配置生成方式，均在执行前检查必需信息、字段类型及相互关系，再由标准化处理函数</w:t>
       </w:r>
       <w:r>
         <w:rPr>
@@ -3476,7 +3476,7 @@
           <w:rFonts w:ascii="Times New Roman" w:hAnsi="Times New Roman" w:eastAsia="Songti SC"/>
           <w:b w:val="0"/>
         </w:rPr>
-        <w:t>执行，使数据贡献者能够复用通用流程，并为新增数据明确相应转换规则。</w:t>
+        <w:t>完成转换。新增数据时，贡献者可以通过配置明确相应规则，复用已有处理流程。</w:t>
       </w:r>
     </w:p>
     <w:p>
@@ -3506,7 +3506,7 @@
           <w:rFonts w:ascii="Times New Roman" w:hAnsi="Times New Roman" w:eastAsia="Songti SC"/>
           <w:b w:val="0"/>
         </w:rPr>
-        <w:t>生产流程依次完成维度与坐标转换、数值变换、有效范围过滤和缺失值处理，主变量与可选不确定性变量采用一致的数值类型。保存前检查输出维度、坐标、变量、数值范围和缺失值状态，并依据相应分辨率的陆地掩膜核对陆地区域完整性。带经纬度坐标轴的空间方向图用于人工确认数据与坐标的对应关系，补充自动结构检查；同一配置组合的首次方向确认随配置记录。</w:t>
+        <w:t>生产流程依次完成维度与坐标转换、数值变换、有效范围过滤和缺失值处理，主变量与可选不确定性变量采用一致的数值类型。保存前检查输出维度、坐标、变量、数值范围和缺失值状态，并依据相应分辨率的陆地掩膜核对陆地区域完整性。程序还生成带经纬度坐标轴的空间方向图，供人工确认数据与坐标的对应关系，补充自动结构检查。每种配置首次使用时的方向确认结果随配置保存。</w:t>
       </w:r>
     </w:p>
     <w:p>
@@ -3528,7 +3528,7 @@
           <w:rFonts w:ascii="Times New Roman" w:hAnsi="Times New Roman" w:eastAsia="Songti SC"/>
           <w:b w:val="0"/>
         </w:rPr>
-        <w:t>，存在不确定性时追加同形的</w:t>
+        <w:t>，存在不确定性时追加形状相同的</w:t>
       </w:r>
       <w:r>
         <w:rPr>
@@ -3541,7 +3541,7 @@
           <w:rFonts w:ascii="Times New Roman" w:hAnsi="Times New Roman" w:eastAsia="Songti SC"/>
           <w:b w:val="0"/>
         </w:rPr>
-        <w:t>，文件按表2所列标签规则命名。各项转换写入NetCDF变量属性中的变更记录，完整YAML、固定输入和版本化项目环境与输出共同归档，使数据文件能够对应其处理规则、来源和生成环境。</w:t>
+        <w:t>，文件按表2所列标签规则命名。实际执行的转换记录在NetCDF变量属性中，完整YAML、固定输入和版本化项目环境与输出一同归档，以便追溯数据来源、处理规则和生成环境。</w:t>
       </w:r>
     </w:p>
     <w:p>
@@ -3571,7 +3571,7 @@
           <w:rFonts w:ascii="Times New Roman" w:hAnsi="Times New Roman" w:eastAsia="Songti SC"/>
           <w:b w:val="0"/>
         </w:rPr>
-        <w:t>数据目录与获取模块Collector负责目录更新和本地缓存管理。远端目录先经过结构与字段校验，确认有效后再更新本地目录，并保留上一有效版本。各条目记录本地相对路径、候选下载地址及完整性信息，已有条目按其登记字段保留兼容访问方式。目录校验保证更新后的数据标签仍能被科研程序解析和调用。</w:t>
+        <w:t>数据目录与获取模块Collector负责更新目录和管理本地缓存。远端目录通过结构与字段校验后替换本地目录，同时保留上一有效版本。目录条目记录本地相对路径、候选下载地址及完整性信息；对于已有条目，模块依据其登记字段保留兼容访问方式。更新后的目录因此仍可供科研程序按标签查找和获取数据。</w:t>
       </w:r>
     </w:p>
     <w:p>
@@ -3589,7 +3589,7 @@
           <w:rFonts w:ascii="Times New Roman" w:hAnsi="Times New Roman" w:eastAsia="Songti SC"/>
           <w:b w:val="0"/>
         </w:rPr>
-        <w:t>这一设计将镜像选择与内容完整性判定分离：镜像和延迟信息用于组织候选顺序与回退，目录中的标准化数据标识与完整性字段用于内容核验。分发地址变化时，可以通过目录调整候选镜像，科研程序继续按标签获取相同内容的数据文件；接口、状态恢复流程和目录条目示例见补充材料。</w:t>
+        <w:t>镜像选择和内容核验采用不同的信息：镜像地址与访问延迟决定下载尝试顺序，数据标识与完整性字段用于确认文件内容。分发地址变化时，只需调整目录中的候选镜像，科研程序仍可按原标签获取相同内容的文件。接口、状态恢复流程和目录条目示例见补充材料。</w:t>
       </w:r>
     </w:p>
     <w:p>
@@ -3622,7 +3622,7 @@
           <w:rFonts w:ascii="Times New Roman" w:hAnsi="Times New Roman" w:eastAsia="Songti SC"/>
           <w:b w:val="0"/>
         </w:rPr>
-        <w:t>标准网格读取接口支持以本地NetCDF路径或数据标签访问数据，提供覆盖文件全部空间网格的数据数组、指定周期的空间切片、站点全部周期和站点指定周期4种读取方式。标签对应的文件可由目录模块自动获取。默认读取标准变量</w:t>
+        <w:t>标准网格读取接口可按本地NetCDF路径或数据标签访问数据，支持读取文件覆盖的全部空间网格、指定周期的空间切片，以及站点的全部周期或指定周期数据，共4种方式。按标签调用时，目录模块自动获取对应文件。接口默认读取标准变量</w:t>
       </w:r>
       <w:r>
         <w:rPr>
@@ -3648,7 +3648,7 @@
           <w:rFonts w:ascii="Times New Roman" w:hAnsi="Times New Roman" w:eastAsia="Songti SC"/>
           <w:b w:val="0"/>
         </w:rPr>
-        <w:t>或同形不确定性变量</w:t>
+        <w:t>或形状相同的不确定性变量</w:t>
       </w:r>
       <w:r>
         <w:rPr>
@@ -3661,7 +3661,7 @@
           <w:rFonts w:ascii="Times New Roman" w:hAnsi="Times New Roman" w:eastAsia="Songti SC"/>
           <w:b w:val="0"/>
         </w:rPr>
-        <w:t>。这些读取方式沿用统一的维度、单位和缺失值约定，为后续模式输入组织提供一致的数据基础。</w:t>
+        <w:t>。各读取方式采用一致的维度、单位和缺失值约定，便于后续组合模式输入。</w:t>
       </w:r>
     </w:p>
     <w:p>
@@ -3670,7 +3670,7 @@
           <w:rFonts w:ascii="Times New Roman" w:hAnsi="Times New Roman" w:eastAsia="Songti SC"/>
           <w:b w:val="0"/>
         </w:rPr>
-        <w:t>站点读取依据全球规则经纬网分辨率把经纬度映射为数组索引，并以标准文件的</w:t>
+        <w:t>站点读取根据全球规则经纬网的分辨率，将目标经纬度换算为数组索引。输入文件的维度顺序为</w:t>
       </w:r>
       <w:r>
         <w:rPr>
@@ -3683,7 +3683,7 @@
           <w:rFonts w:ascii="Times New Roman" w:hAnsi="Times New Roman" w:eastAsia="Songti SC"/>
           <w:b w:val="0"/>
         </w:rPr>
-        <w:t>顺序及西向东、南向北排列为输入约定。接口面向全球规则网格的原位索引，区域投影、非规则网格和空间插值可在数据生产与标准化层完成转换；周期索引的月份、日期或小时含义由对应数据元数据解释。</w:t>
+        <w:t>，经度自西向东、纬度自南向北排列。接口直接提取对应格点的数据；区域投影、非规则网格转换和空间插值可在数据生产与标准化层完成。周期索引表示月份、日期还是小时，由相应数据的元数据说明。</w:t>
       </w:r>
     </w:p>
     <w:p>
@@ -3704,7 +3704,7 @@
           <w:rFonts w:ascii="Times New Roman" w:hAnsi="Times New Roman" w:eastAsia="Songti SC"/>
           <w:b w:val="0"/>
         </w:rPr>
-        <w:t>陆面参数组织需要围绕同一目标位置与年度组合不同空间和时间分辨率的数据。接口从预定义集合提取土壤、冠层、叶片、地形、陆地掩膜和植物功能型数据，按各数据的网格分辨率索引目标位置，再依据陆面状态融合参数。叶面积指数、叶绿素、冠层聚集度和最大羧化速率等季节序列组织到共同的逐日时间轴：缺失值填补后，月尺度数据按各月实际天数展开，8日尺度数据按覆盖日期展开，并依据年份保留365或366日。本文第二套陆面参数集合</w:t>
+        <w:t>陆面参数由同一目标位置和年度的多源数据组合而成。接口从预定义集合中提取土壤、冠层、叶片、地形、陆地掩膜和植物功能型数据，按各自网格分辨率定位目标格点，再依据陆面状态融合参数。叶面积指数、叶绿素、冠层聚集度和最大羧化速率等季节序列统一到逐日时间轴。完成缺失值填补后，月尺度数据按各月实际天数展开，8日尺度数据按覆盖日期展开，并依据年份保留365或366日。本文第二套陆面参数集合</w:t>
       </w:r>
       <w:r>
         <w:rPr>
@@ -3726,7 +3726,7 @@
           <w:rFonts w:ascii="Times New Roman" w:hAnsi="Times New Roman" w:eastAsia="Songti SC"/>
           <w:b w:val="0"/>
         </w:rPr>
-        <w:t>叶片光学参数与Medlyn气孔导度模型参数按采用C3与C4光合途径的两类植物分别组织[6,7]：C3参数按格点内对应植物功能型比例归一化加权，C4参数从相应类型的参数表提取，以保留两类植物的参数差异。叶片羧化能力与电子传递能力的关联为光合参数组织提供依据[8]。本研究采用GriddingMachine模式输入接口的固定比例参数化，由25 ℃下最大羧化速率</w:t>
+        <w:t>叶片光学参数与Medlyn气孔导度模型参数分别按采用C3和C4光合途径的植物组织[6,7]。C3参数按格点内对应植物功能型的比例归一化加权，C4参数从相应类型的参数表提取，以保留两类植物的参数差异。叶片羧化能力与电子传递能力的关联为光合参数组织提供依据[8]。本研究采用GriddingMachine模式输入接口的固定比例参数化，根据25 ℃下最大羧化速率</w:t>
       </w:r>
       <w:r>
         <w:rPr>
@@ -3739,7 +3739,7 @@
           <w:rFonts w:ascii="Times New Roman" w:hAnsi="Times New Roman" w:eastAsia="Songti SC"/>
           <w:b w:val="0"/>
         </w:rPr>
-        <w:t>生成最大电子传递速率</w:t>
+        <w:t>计算最大电子传递速率</w:t>
       </w:r>
       <w:r>
         <w:rPr>
@@ -3765,7 +3765,7 @@
           <w:rFonts w:ascii="Times New Roman" w:hAnsi="Times New Roman" w:eastAsia="Songti SC"/>
           <w:b w:val="0"/>
         </w:rPr>
-        <w:t>，换算关系、参数单位与实现出处见补充材料S1。输出涵盖位置、分辨率、年份、二氧化碳（CO₂）、土壤水力性质、冠层结构、植物功能型组成、叶片生物物理和光合参数；字段完整性与缺失值标记</w:t>
+        <w:t>，换算关系、参数单位与实现出处见补充材料S1。输出包括位置、分辨率、年份、二氧化碳（CO₂）、土壤水力性质、冠层结构、植物功能型组成、叶片生物物理和光合参数，同时检查字段是否完整以及缺失值标记</w:t>
       </w:r>
       <w:r>
         <w:rPr>
@@ -3778,7 +3778,7 @@
           <w:rFonts w:ascii="Times New Roman" w:hAnsi="Times New Roman" w:eastAsia="Songti SC"/>
           <w:b w:val="0"/>
         </w:rPr>
-        <w:t>状态同步进入质量控制。多个标准化数据由此形成结构一致的格点级模式输入。</w:t>
+        <w:t>的分布。经过上述处理，多源数据形成结构一致的格点级模式输入。</w:t>
       </w:r>
     </w:p>
     <w:p>
@@ -3822,7 +3822,7 @@
           <w:rFonts w:ascii="Times New Roman" w:hAnsi="Times New Roman" w:eastAsia="Songti SC"/>
           <w:b w:val="0"/>
         </w:rPr>
-        <w:t>网格读取提供各变量的数值，参数与气象接口进一步建立字段、时间和量纲之间的关系。本文所称“模式就绪”，是指标准化数据经格点提取、参数融合、时间轴构建和量纲衔接后，形成满足Emerald初始化接口的数据结构。相比2022版以标签组织基础数据访问[5]，新版将多源数据组合为可由模式直接调用的输入，使科研程序能够复用已有数据及其组织方法。完整调用示例见补充材料。</w:t>
+        <w:t>网格读取提供各变量的数值，参数和气象驱动接口则将这些数值按字段、时间与量纲关系组织为模式输入。本文所称“模式就绪”，是指标准化数据经过格点提取、参数融合、时间轴构建和量纲换算后，能够满足Emerald初始化接口的数据结构要求。2022版主要通过标签提供基础数据访问[5]，新版进一步组合多源数据，形成可由模式直接调用的输入，使科研程序能够复用数据及其组织方法。完整调用示例见补充材料。</w:t>
       </w:r>
     </w:p>
     <w:p>
@@ -3852,7 +3852,7 @@
           <w:rFonts w:ascii="Times New Roman" w:hAnsi="Times New Roman" w:eastAsia="Songti SC"/>
           <w:b w:val="0"/>
         </w:rPr>
-        <w:t>各语言接口共用Python下载程序，使用时需要Python 3运行环境。该设计使不同语言的科研程序沿用相同的数据标签、镜像和完整性约定，自动获取标准NetCDF文件，再使用相应语言的NetCDF工具读取数据。下载逻辑集中维护，科研人员无需在不同编程环境中重复实现文件获取和内容核验；接口调用示例见补充材料S5。</w:t>
+        <w:t>各语言接口共用Python下载程序，使用时需要Python 3运行环境。不同语言的科研程序因此可以按相同的数据标签和镜像信息获取标准NetCDF文件，采用一致的完整性核验规则，再使用各自的NetCDF工具读取数据。下载程序集中维护，减少了在不同编程环境中重复实现文件获取和内容核验的工作。接口调用示例见补充材料S5。</w:t>
       </w:r>
     </w:p>
     <w:p>
@@ -3873,7 +3873,7 @@
           <w:rFonts w:ascii="Times New Roman" w:hAnsi="Times New Roman" w:eastAsia="Songti SC"/>
           <w:b w:val="0"/>
         </w:rPr>
-        <w:t>本节围绕预处理、分发和读取中的改进需求安排评价。受控处理实例和真实最优插值海表温度数据（Optimum Interpolation Sea Surface Temperature，OISST）用于检查统一流程能否正确处理源维度、坐标和数值差异；ELEV与叶面积指数数据（Leaf Area Index，LAI）的分发对照用于量化省去外层归档后的访问开销，网络镜像获取用于检查不同地址提供的文件内容是否一致；北美通量观测站US-NR1附近格点的陆面参数和气象驱动用于考察多源数据能否组成模式所需输入。表3概括案例与评价指标，跨操作系统测试补充检查核心流程的运行一致性。</w:t>
+        <w:t>应用案例分别考察数据标准化、分发和模式接入中的改进效果。受控处理实例与真实最优插值海表温度数据（Optimum Interpolation Sea Surface Temperature，OISST）用于检验统一流程对维度、坐标和数值差异的处理；ELEV与叶面积指数数据（Leaf Area Index，LAI）用于比较有无外层归档时的数据获取和首次读取时间，网络镜像实验进一步核对不同地址所提供文件的一致性。北美通量观测站US-NR1附近格点的陆面参数与气象驱动用于考察多源数据能否形成模式输入，并通过跨操作系统测试检查核心流程的运行一致性。各案例与评价指标见表3。</w:t>
       </w:r>
     </w:p>
     <w:p>
@@ -4702,7 +4702,7 @@
           <w:rFonts w:ascii="Times New Roman" w:hAnsi="Times New Roman" w:eastAsia="Songti SC"/>
           <w:b w:val="0"/>
         </w:rPr>
-        <w:t>为展示YAML驱动流程对多维地学数据的标准化能力，本文设计具有明确空间语义的位置编码数组：二维数组由经纬度索引共同编码，三维数组进一步加入周期索引。该设计能够清晰呈现维度交换、方向翻转、经度平移和周期组织前后的对应关系，并为标准NetCDF生产提供逐点参照。</w:t>
+        <w:t>为检验YAML驱动流程能否正确处理多维网格数据，本文构造以空间位置编码的参考数组：二维数组的值由经纬度索引共同确定，三维数组进一步加入周期索引。数组值与位置之间的对应关系已知，因此可逐点核对维度交换、方向翻转、经度平移和周期组织后的结果。</w:t>
       </w:r>
     </w:p>
     <w:p>
@@ -4776,7 +4776,7 @@
           <w:rFonts w:ascii="Times New Roman" w:hAnsi="Times New Roman" w:eastAsia="Songti SC"/>
           <w:b w:val="0"/>
         </w:rPr>
-        <w:t>经度平移后的逐点对应关系；数值处理依据设定规则核对线性缩放、范围过滤和缺失值填补结果；配置一致性与流程复用检查字段与变量数量、</w:t>
+        <w:t>经度平移后的逐点对应关系。数值处理依据设定规则核对线性缩放、范围过滤和缺失值填补结果。配置一致性与流程复用则核对字段与变量数量、</w:t>
       </w:r>
       <w:r>
         <w:rPr>
@@ -4789,7 +4789,7 @@
           <w:rFonts w:ascii="Times New Roman" w:hAnsi="Times New Roman" w:eastAsia="Songti SC"/>
           <w:b w:val="0"/>
         </w:rPr>
-        <w:t>保存、已有数据集和标签状态，使配置生成、重复执行与目录登记遵循一致约定。</w:t>
+        <w:t>的保存结果，以及已有数据集与标签的状态，确认配置生成、重复执行与目录登记是否遵循同一约定。</w:t>
       </w:r>
     </w:p>
     <w:p>
@@ -4807,7 +4807,7 @@
           <w:rFonts w:ascii="Times New Roman" w:hAnsi="Times New Roman" w:eastAsia="Songti SC"/>
           <w:b w:val="0"/>
         </w:rPr>
-        <w:t>配置构建器分别以二维数据、含不确定性变量的三维数据和经纬度变换数据为输入，生成YAML后直接执行标准化，核对输出与参考数组是否一致。数据贡献案例连接配置生成、自动与人工质量检查、发布、目录登记及下游更新、下载和读取，检查各环节形成的数据能否继续被下一环节调用。</w:t>
+        <w:t>配置构建器分别以二维数据、含不确定性变量的三维数据和经纬度变换数据为输入，生成YAML并执行标准化，再将输出与参考数组比较。数据贡献案例进一步覆盖配置生成、自动与人工质量检查、发布、目录登记，以及下游目录更新、下载和读取，以检验处理结果能否在各环节间连续使用。</w:t>
       </w:r>
     </w:p>
     <w:p>
@@ -4816,7 +4816,7 @@
           <w:rFonts w:ascii="Times New Roman" w:hAnsi="Times New Roman" w:eastAsia="Songti SC"/>
           <w:b w:val="0"/>
         </w:rPr>
-        <w:t>ELEV重复处理案例以已有标准NetCDF为输入，先比较统一读取与底层NetCDF读取的数组和坐标，再采用显式标准维度、</w:t>
+        <w:t>ELEV重复处理案例以已有标准NetCDF为输入，先比较统一读取与底层NetCDF读取所得的数组和坐标，再采用显式标准维度、</w:t>
       </w:r>
       <w:r>
         <w:rPr>
@@ -4829,7 +4829,7 @@
           <w:rFonts w:ascii="Times New Roman" w:hAnsi="Times New Roman" w:eastAsia="Songti SC"/>
           <w:b w:val="0"/>
         </w:rPr>
-        <w:t>及不执行缩放和范围裁剪的配置连续处理3次。评价比较每次输出的</w:t>
+        <w:t>及不执行缩放和范围裁剪的配置连续处理3次。比较各次输出的</w:t>
       </w:r>
       <w:r>
         <w:rPr>
@@ -4842,7 +4842,7 @@
           <w:rFonts w:ascii="Times New Roman" w:hAnsi="Times New Roman" w:eastAsia="Songti SC"/>
           <w:b w:val="0"/>
         </w:rPr>
-        <w:t>与输入是否一致，以及各次输出文件的SHA-256是否相同，用于检查标准化数据在重复处理中的保持情况。</w:t>
+        <w:t>与输入，并核对输出文件的SHA-256，以检验重复处理是否保持数据值和空间结构。</w:t>
       </w:r>
     </w:p>
     <w:p>
@@ -4985,7 +4985,7 @@
           <w:rFonts w:ascii="Times New Roman" w:hAnsi="Times New Roman" w:eastAsia="Songti SC"/>
           <w:b w:val="0"/>
         </w:rPr>
-        <w:t xml:space="preserve">独立参考流程直接读取未缩放的Int16存储值，根据原始 NetCDF 变量属性 </w:t>
+        <w:t>独立参考流程直接读取未缩放的Int16存储值，根据原始NetCDF中的缩放因子</w:t>
       </w:r>
       <w:r>
         <w:rPr>
@@ -4998,7 +4998,7 @@
           <w:rFonts w:ascii="Times New Roman" w:hAnsi="Times New Roman" w:eastAsia="Songti SC"/>
           <w:b w:val="0"/>
         </w:rPr>
-        <w:t>、</w:t>
+        <w:t>、偏移量</w:t>
       </w:r>
       <w:r>
         <w:rPr>
@@ -5011,7 +5011,7 @@
           <w:rFonts w:ascii="Times New Roman" w:hAnsi="Times New Roman" w:eastAsia="Songti SC"/>
           <w:b w:val="0"/>
         </w:rPr>
-        <w:t xml:space="preserve"> 和 </w:t>
+        <w:t>和填充值</w:t>
       </w:r>
       <w:r>
         <w:rPr>
@@ -5024,7 +5024,7 @@
           <w:rFonts w:ascii="Times New Roman" w:hAnsi="Times New Roman" w:eastAsia="Songti SC"/>
           <w:b w:val="0"/>
         </w:rPr>
-        <w:t xml:space="preserve"> 构造物理值与缺失值掩膜，并独立计算目标经度索引。参考结果记录全域统计量、10个确定性有效格点和10个缺失格点。标准化数据连续生成3次，逐点比较坐标、有效值掩膜和物理值；随后由生成的标准NetCDF文件建立包含逻辑路径、镜像地址、字节数和SHA-256的目录条目，通过回环HTTP执行事务式下载，并以统一读取接口完成全域网格逐点核对。</w:t>
+        <w:t>计算物理值与缺失值掩膜，并独立计算目标经度索引。参考结果记录全域统计量、10个确定性有效格点和10个缺失格点。标准化数据连续生成3次，逐点比较坐标、有效值掩膜和物理值。随后根据标准NetCDF文件建立包含逻辑路径、镜像地址、字节数和SHA-256的目录条目，通过回环HTTP执行事务式下载，再由统一读取接口完成全域网格逐点核对。</w:t>
       </w:r>
     </w:p>
     <w:p>
@@ -5045,7 +5045,7 @@
           <w:rFonts w:ascii="Times New Roman" w:hAnsi="Times New Roman" w:eastAsia="Songti SC"/>
           <w:b w:val="0"/>
         </w:rPr>
-        <w:t>直接NetCDF分发效率采用二维静态高程数据集</w:t>
+        <w:t>分发效率比较采用二维静态高程数据集</w:t>
       </w:r>
       <w:r>
         <w:rPr>
@@ -5071,7 +5071,7 @@
           <w:rFonts w:ascii="Times New Roman" w:hAnsi="Times New Roman" w:eastAsia="Songti SC"/>
           <w:b w:val="0"/>
         </w:rPr>
-        <w:t>进行分析，代表不同规模和维度的内部压缩数据集。每个标准NetCDF分别以原始</w:t>
+        <w:t>，代表不同规模和维度的内部压缩数据。每个标准NetCDF分别以原始</w:t>
       </w:r>
       <w:r>
         <w:rPr>
@@ -5084,7 +5084,7 @@
           <w:rFonts w:ascii="Times New Roman" w:hAnsi="Times New Roman" w:eastAsia="Songti SC"/>
           <w:b w:val="0"/>
         </w:rPr>
-        <w:t>和包含同一文件的</w:t>
+        <w:t>文件和包含同一文件的</w:t>
       </w:r>
       <w:r>
         <w:rPr>
@@ -5097,7 +5097,7 @@
           <w:rFonts w:ascii="Times New Roman" w:hAnsi="Times New Roman" w:eastAsia="Songti SC"/>
           <w:b w:val="0"/>
         </w:rPr>
-        <w:t>分发，对照归档采用gzip级别6。两种形式解包后的NetCDF具有相同SHA-256，据此量化省去外层打包与解包带来的时间收益和文件存储占用变化。</w:t>
+        <w:t>归档分发，对照归档采用gzip级别6。直接分发的NetCDF与归档解包后的文件具有相同SHA-256，因此可在内容一致的条件下比较外层打包与解包所增加的时间和存储占用。</w:t>
       </w:r>
     </w:p>
     <w:p>
@@ -5127,7 +5127,7 @@
           <w:rFonts w:ascii="Times New Roman" w:hAnsi="Times New Roman" w:eastAsia="Songti SC"/>
           <w:b w:val="0"/>
         </w:rPr>
-        <w:t>目录管理评价围绕数据更新与重复获取展开：目录修订后，同一标签能否连接相应文件；获取异常时已有有效文件能否保留，重复获取时文件内容能否与目录记录一致。实验采用不同版本的Artifacts.yaml、多个NetCDF文件和两个镜像端点，通过目录更新与重复调用比较获取结果、文件摘要和缓存状态，并与小型参考目录的预设结果核对。目录首次建立、全库同步、历史整理和状态查询等操作及其文件状态记录见补充材料S2与S6。</w:t>
+        <w:t>目录管理实验考察数据修订后能否按原标签获取对应文件，以及获取异常时能否保留已有有效文件、重复获取时能否保持内容一致。实验使用不同版本的Artifacts.yaml、多个NetCDF文件和两个镜像端点，在目录更新与重复调用后比较获取结果、文件摘要和缓存状态，并与小型参考目录的预设结果核对。目录首次建立、全库同步、历史整理和状态查询等操作及其文件状态记录见补充材料S2与S6。</w:t>
       </w:r>
     </w:p>
     <w:p>
@@ -5136,7 +5136,7 @@
           <w:rFonts w:ascii="Times New Roman" w:hAnsi="Times New Roman" w:eastAsia="Songti SC"/>
           <w:b w:val="0"/>
         </w:rPr>
-        <w:t>多镜像分析在两个独立环境中构建内容一致、访问状态可配置的镜像集合，通过延迟分数组织候选顺序，并以13类受控状态场景检验镜像回退、缓存复用、内容核验和正式文件状态。每类场景在各环境中重复5次，记录候选选择、获取结果和文件状态；中科大校内网机构FTP与Zenodo公共存储的访问进一步呈现两类镜像的互补分发特征与内容一致性。完整场景矩阵列于补充材料S6。</w:t>
+        <w:t>多镜像分析在两个独立环境中构建内容一致、访问状态可配置的镜像集合，通过延迟分数组织候选顺序，并以13类受控状态场景检验镜像回退、缓存复用、内容核验和正式文件状态。每类场景在各环境中重复5次，记录候选选择、获取结果和文件状态；另在中科大校内网分别从机构FTP与Zenodo公共存储获取文件，考察两类镜像的分发特点和内容一致性。完整场景矩阵列于补充材料S6。</w:t>
       </w:r>
     </w:p>
     <w:p>
@@ -5192,7 +5192,7 @@
           <w:rFonts w:ascii="Times New Roman" w:hAnsi="Times New Roman" w:eastAsia="Songti SC"/>
           <w:b w:val="0"/>
         </w:rPr>
-        <w:t>模式输入组织案例连接标准网格读取、陆面参数融合、气象驱动组织与Emerald初始化。确定性参考数据用于核对字段名、形状、类型、时间索引和缺失值处理；陆面案例采用2020年第二套陆面参数集合，在US-NR1研究站点附近植被格点和典型非植被格点呈现不同陆面状态下的模式入口。</w:t>
+        <w:t>模式输入案例考察标准网格数据经过陆面参数融合和气象驱动组织后，能否用于Emerald初始化。首先利用确定性参考数据核对字段名、形状、类型、时间索引和缺失值处理，再采用2020年第二套陆面参数集合，分别为US-NR1研究站点附近的植被格点和典型非植被格点生成输入，检查不同陆面状态下的参数组织。</w:t>
       </w:r>
     </w:p>
     <w:p>
@@ -5324,7 +5324,7 @@
           <w:rFonts w:ascii="Times New Roman" w:hAnsi="Times New Roman" w:eastAsia="Songti SC"/>
           <w:b w:val="0"/>
         </w:rPr>
-        <w:t>31组受控处理实例中，29组非交互实例在三系统持续集成中获得一致的数据结构和逐点数值，V01和V02的人工方向检查结果与预设一致。这些实例覆盖维度重排、坐标翻转、经度平移、数值转换及缺失值处理，说明不同源排列和数值约定能够按配置进入统一结构。数据贡献案例完成配置生成、标准化、目录登记和下游读取后，最终读取数组与参考数组逐点一致，说明共享配置形成的标准网格能够继续用于下游数据访问。</w:t>
+        <w:t>31组受控处理实例中，29组非交互实例在三系统持续集成中获得一致的数据结构和逐点数值，V01和V02的人工方向检查结果与预设一致。维度重排、坐标翻转、经度平移、数值转换及缺失值处理均得到相应参考结果，表明配置能够指导通用程序正确处理源数据差异。数据贡献案例经过配置生成、标准化、目录登记和下游读取后，所得数组仍与参考数组逐点一致，标准化结果在后续获取与读取过程中得到保持。</w:t>
       </w:r>
     </w:p>
     <w:p>
@@ -5376,7 +5376,7 @@
           <w:rFonts w:ascii="Times New Roman" w:hAnsi="Times New Roman" w:eastAsia="Songti SC"/>
           <w:b w:val="0"/>
         </w:rPr>
-        <w:t>3次生成的OISST数据值、坐标和文件SHA-256保持一致。标准文件为997 006字节，目录登记与回环HTTP获取均通过字节数和SHA-256核验；统一读取结果与独立参考逐点一致。标准化过程形成的空间与数值约定由此在登记、获取和读取之后得到保持，可供下游程序按同一标签重复调用。</w:t>
+        <w:t>3次生成的OISST数据值、坐标和文件SHA-256保持一致。标准文件为997 006字节，经目录登记和回环HTTP获取后，字节数与SHA-256均与记录相符，统一读取结果也与独立参考逐点一致。这表明标准化后的数据在登记、下载和读取过程中保持不变，可由下游程序按同一标签重复获取和使用。</w:t>
       </w:r>
     </w:p>
     <w:p>
@@ -5664,7 +5664,7 @@
           <w:rFonts w:ascii="Times New Roman" w:hAnsi="Times New Roman" w:eastAsia="Songti SC"/>
           <w:b w:val="0"/>
         </w:rPr>
-        <w:t>13类受控状态场景在两个独立操作系统环境中各重复5次，均实现了预设的镜像回退、缓存复用和内容核验。首选镜像访问或内容核验未通过时，流程继续尝试后续镜像；失败下载未改变已有正式文件的摘要。镜像地址切换与正式缓存更新由此可以分别处理，下载异常时本地读取仍可沿用已有有效数据。</w:t>
+        <w:t>13类受控状态场景在两个独立操作系统环境中各重复5次，镜像回退、缓存复用和内容核验结果均符合预设。首选镜像无法访问或未通过内容核验时，程序继续尝试后续镜像；下载失败时，已有正式文件的摘要保持不变。因此，切换镜像无需破坏本地有效缓存，下载异常时科研程序仍可读取已有数据。</w:t>
       </w:r>
     </w:p>
     <w:p>
@@ -5691,7 +5691,7 @@
           <w:rFonts w:ascii="Times New Roman" w:hAnsi="Times New Roman" w:eastAsia="Songti SC"/>
           <w:b w:val="0"/>
         </w:rPr>
-        <w:t>以ERA5降水单位属性由</w:t>
+        <w:t>在ERA5降水单位属性由</w:t>
       </w:r>
       <w:r>
         <w:rPr>
@@ -5717,7 +5717,7 @@
           <w:rFonts w:ascii="Times New Roman" w:hAnsi="Times New Roman" w:eastAsia="Songti SC"/>
           <w:b w:val="0"/>
         </w:rPr>
-        <w:t>为例，独立目录将原逻辑标签</w:t>
+        <w:t>的案例中，独立目录将原逻辑标签</w:t>
       </w:r>
       <w:r>
         <w:rPr>
@@ -5743,7 +5743,7 @@
           <w:rFonts w:ascii="Times New Roman" w:hAnsi="Times New Roman" w:eastAsia="Songti SC"/>
           <w:b w:val="0"/>
         </w:rPr>
-        <w:t>，并登记修订后的字节数与SHA-256；原V1和R1文件分别保留。修订文件首次获取通过完整性核验，再次调用复用缓存。下游因而能够沿用原标签获取修订数据，试验所用的具体文件由目录版本与摘要确定。单位修订依据及模式换算见第4.4节。</w:t>
+        <w:t>，记录修订后的字节数与SHA-256，同时分别保留原V1和R1文件。首次调用获取修订文件并通过完整性核验，后续调用则复用本地缓存。科研程序因此可沿用原标签访问修订数据，而各次试验实际使用的文件可由目录版本与摘要追溯。单位修订依据及模式换算见第4.4节。</w:t>
       </w:r>
     </w:p>
     <w:p>
@@ -5764,7 +5764,7 @@
           <w:rFonts w:ascii="Times New Roman" w:hAnsi="Times New Roman" w:eastAsia="Songti SC"/>
           <w:b w:val="0"/>
         </w:rPr>
-        <w:t>不同空间分辨率和时间尺度的14类陆面数据经统一组织，形成2020年US-NR1格点的34个模式字段，包含366日季节序列、4个土壤层和17个植物功能型。站点索引映射至40.5°N、105.5°W，高程、陆地掩膜与叶面积指数读取一致。撒哈拉案例被识别为非植被格点，并按相应陆面状态组织参数，说明同一数据集合能够根据格点状态提供植被与非植被条件下的模式输入。各输入文件的大小、来源摘要和SHA-256均通过核验。</w:t>
+        <w:t>不同空间分辨率和时间尺度的14类陆面数据经统一组织，形成2020年US-NR1格点的34个模式字段，包含366日季节序列、4个土壤层和17个植物功能型。站点索引映射至40.5°N、105.5°W，高程、陆地掩膜与叶面积指数的读取结果一致。撒哈拉案例被识别为非植被格点，并按相应陆面状态组织参数，说明同一数据集合能够根据格点状态提供植被与非植被条件下的模式输入。各输入文件的大小、来源摘要和SHA-256均通过核验。</w:t>
       </w:r>
     </w:p>
     <w:p>
@@ -5773,7 +5773,7 @@
           <w:rFonts w:ascii="Times New Roman" w:hAnsi="Times New Roman" w:eastAsia="Songti SC"/>
           <w:b w:val="0"/>
         </w:rPr>
-        <w:t>8类ERA5气象变量经统一读取，形成US-NR1格点2020年连续的年度逐小时序列。各源变量均为360×180×8784的经度、纬度和逐小时数组，并带有单位属性；站点的每类变量均得到8784个逐小时值，有限值比例为100%，与底层NetCDF读取结果的最大绝对差为0。地方平太阳时偏移为−7.0364 h，浮点年积日严格递增且与独立公式逐点一致。时间轴和8类气象变量共9个字段经Emerald适配后形成16个模式驱动字段，使格点取样、年度时间组织与模式字段相互对应。逐文件大小与字段信息见补充材料S1。</w:t>
+        <w:t>8类ERA5气象变量经统一读取，形成US-NR1格点2020年连续的年度逐小时序列。各源变量均为360×180×8784的经度、纬度和逐小时数组，并带有单位属性；站点的每类变量均得到8784个逐小时值，有限值比例为100%，与底层NetCDF读取结果的最大绝对差为0。地方平太阳时偏移为−7.0364 h，浮点年积日严格递增且与独立公式逐点一致。时间轴和8类气象变量共9个字段经Emerald接口适配后，组成16个模式驱动字段，完成从格点年度序列到模式所需变量的转换。逐文件大小与字段信息见补充材料S1。</w:t>
       </w:r>
     </w:p>
     <w:p>
@@ -5795,7 +5795,7 @@
           <w:rFonts w:ascii="Times New Roman" w:hAnsi="Times New Roman" w:eastAsia="Songti SC"/>
           <w:b w:val="0"/>
         </w:rPr>
-        <w:t>，数据值保持不变。US-NR1年度累计降水为0.496409 m，即496.409 mm，用于核对数值尺度与量纲。Emerald按水层厚度、水密度、水的摩尔质量及3600 s累计时段换算为摩尔通量，使数据单位与模式输入一致。完成参数、时间和量纲衔接后，真实陆面参数与气象驱动共同完成Emerald初始化和60 s首步计算，大气与土壤关键状态均保持有限值。该年度案例表明，多源标准网格数据能够按明确的空间、时间与单位关系形成可用的模式输入。</w:t>
+        <w:t>，数据值保持不变。US-NR1年度累计降水为0.496409 m，即496.409 mm，用于核对数值尺度与量纲。Emerald按水层厚度、水密度、水的摩尔质量及3600 s累计时段换算为摩尔通量，使数据单位与模式输入一致。完成参数组织、时间轴构建和量纲换算后，将真实陆面参数与气象驱动共同用于Emerald初始化和60 s首步计算，大气与土壤关键状态均保持有限值。该年度案例表明，多源标准网格数据能够按明确的空间、时间与单位关系形成可用的模式输入。</w:t>
       </w:r>
     </w:p>
     <w:p>
@@ -5825,7 +5825,7 @@
           <w:rFonts w:ascii="Times New Roman" w:hAnsi="Times New Roman" w:eastAsia="Songti SC"/>
           <w:b w:val="0"/>
         </w:rPr>
-        <w:t>Matlab、Octave、Python、R、C和Fortran均可通过URL或数据标签获取与参考内容一致的文件。标签调用在首选镜像不可用时继续获取其余镜像；文件大小或摘要不符时，接口返回错误并保留已有文件。不同语言的科研程序由此能够沿用同一数据目录与内容核验规则，自动获取标准化网格数据，减少文件获取方法的重复实现。</w:t>
+        <w:t>Matlab、Octave、Python、R、C和Fortran接口通过URL或数据标签获取的文件均与参考内容一致。按标签下载时，首选镜像不可用后能够继续尝试其余镜像；文件大小或摘要不符时，接口返回错误并保留已有文件。这些结果表明，不同语言的科研程序可以共用数据目录和核验规则，自动获取标准化网格数据，无需分别编写下载与内容核验程序。</w:t>
       </w:r>
     </w:p>
     <w:p>
@@ -5858,7 +5858,7 @@
           <w:rFonts w:ascii="Times New Roman" w:hAnsi="Times New Roman" w:eastAsia="Songti SC"/>
           <w:b w:val="0"/>
         </w:rPr>
-        <w:t>2022版GriddingMachine的主要作用是以统一网格、变量和标签提供多源数据访问[5]。本研究在此基础上处理数据持续更新中的重复维护问题。31组处理实例与OISST结果说明，源维度、坐标和数值差异可以由配置表达，并在通用流程中得到正确处理；ELEV重复处理则表明，已有标准化结果可以沿用这一流程而保持数据值。处理规则因而能够与数据文件共同维护，新增或更新数据时不必为相同转换重新编写完整程序。独立目录进一步使镜像调整和文件修订集中于分发信息，模式侧继续沿用标签访问。</w:t>
+        <w:t>2022版GriddingMachine通过统一网格、变量和标签提供多源数据访问[5]，本研究进一步关注数据持续更新中的重复维护。31组处理实例与OISST结果表明，源数据在维度、坐标和数值上的差异可由配置描述，并由通用程序处理；ELEV重复处理结果则表明，已有标准化数据经过同一流程后仍可保持原值。将处理规则与数据文件一同维护，使新增或更新数据能够复用已有转换程序。镜像调整或文件修订后，可单独更新目录中的分发信息，模式程序继续按标签访问数据。</w:t>
       </w:r>
     </w:p>
     <w:p>
@@ -5867,7 +5867,7 @@
           <w:rFonts w:ascii="Times New Roman" w:hAnsi="Times New Roman" w:eastAsia="Songti SC"/>
           <w:b w:val="0"/>
         </w:rPr>
-        <w:t>数据库维护需要兼顾数据持续更新与既有试验复现。ERA5降水修订表明，目录能够承接文件变化，使科研程序沿用已有标签；保存各次试验使用的目录、文件摘要、处理配置和代码版本，则可明确实际输入及其转换过程。数据标签提供统一调用入口，归档记录保存具体试验所用内容，两者共同支持数据库更新与科研复用。</w:t>
+        <w:t>数据库需要持续更新，既有试验也需要能够复现。ERA5降水修订案例说明，更新目录即可使已有标签指向修订文件；保存各次试验使用的目录、文件摘要、处理配置和代码版本，则能确定当时使用的数据及其转换过程。标签便于程序持续调用，归档记录保留具体试验的输入，两者共同支持数据更新和试验复现。</w:t>
       </w:r>
     </w:p>
     <w:p>
@@ -5888,7 +5888,7 @@
           <w:rFonts w:ascii="Times New Roman" w:hAnsi="Times New Roman" w:eastAsia="Songti SC"/>
           <w:b w:val="0"/>
         </w:rPr>
-        <w:t>ELEV和LAI已经使用NetCDF内部压缩，外层归档的额外压缩收益较小，而下载后的解包和归档文件与NetCDF文件共存仍占用时间与空间。两环境中的对照结果表明，直接NetCDF以较小的传输字节增量缩短端到端时间，并减少获取过程中的文件存储占用。对采用单文件标签组织的数据库，获取结果即可作为读取输入，简化了文件获取到科研调用之间的操作。</w:t>
+        <w:t>ELEV和LAI已经使用NetCDF内部压缩，外层归档带来的额外压缩收益较小，却增加了解包时间，以及归档文件与NetCDF文件同时保存时的存储占用。两个环境中的对照结果表明，直接NetCDF分发仅增加少量传输字节，即可缩短端到端时间并减少获取过程中的存储需求。对于一个标签对应一个文件的数据库，下载完成后即可读取，省去了科研调用前的解包操作。</w:t>
       </w:r>
     </w:p>
     <w:p>
@@ -5897,7 +5897,7 @@
           <w:rFonts w:ascii="Times New Roman" w:hAnsi="Times New Roman" w:eastAsia="Songti SC"/>
           <w:b w:val="0"/>
         </w:rPr>
-        <w:t>数据质量检查与下载完整性核验分别解决两个问题：前者检查维度、坐标、物理值、单位和缺失值处理是否符合数据约定，后者检查收到的文件是否与目录登记内容一致。OISST的独立解码比较和ERA5降水单位修订分别体现了数值与量纲检查的作用；受控镜像场景和真实网络下载记录则检验了文件获取的一致性。将两类检查串联，才能从源数据处理一直追溯到科研程序实际读取的文件。</w:t>
+        <w:t>数据质量检查关注维度、坐标、物理值、单位和缺失值处理是否符合约定，下载完整性核验则确认收到的文件是否与目录记录一致。OISST的独立解码比较和ERA5降水单位修订体现了数值与量纲检查的作用，受控镜像场景和真实网络下载记录则支持对获取内容的核验。两类检查结合后，既能追溯数据如何从源文件转换而来，也能确认科研程序实际读取了哪个文件。</w:t>
       </w:r>
     </w:p>
     <w:p>
@@ -5927,7 +5927,7 @@
           <w:rFonts w:ascii="Times New Roman" w:hAnsi="Times New Roman" w:eastAsia="Songti SC"/>
           <w:b w:val="0"/>
         </w:rPr>
-        <w:t>这一流程也可用于其他站点、年份和模式的数据接入；根据目标模式的空间、时间和变量约定调整配置与接口适配，即可复用标准网格读取和数据组织方法。Julia主流程与非Julia下载入口分别服务输入组织和跨语言文件获取，研究人员可按已有科研程序的需求选择调用方式。</w:t>
+        <w:t>其他站点和年份可沿用上述读取与数据组织方法；接入不同模式时，可按其空间、时间和变量约定调整配置与适配接口。Julia接口用于组织模式输入，非Julia接口用于在已有科研程序中自动获取文件，研究人员可根据所用语言和计算任务选择调用方式。</w:t>
       </w:r>
     </w:p>
     <w:p>
@@ -5948,7 +5948,7 @@
           <w:rFonts w:ascii="Times New Roman" w:hAnsi="Times New Roman" w:eastAsia="Songti SC"/>
           <w:b w:val="0"/>
         </w:rPr>
-        <w:t>不同数据基础设施侧重数据分析与访问的不同环节。地球系统数据立方体着重多变量时空数据的联合分析[12]，GriddingMachine则将标准化、读取和模式适配组合为可由科研程序调用的数据流程，其Julia实现为这些方法的组合提供支持[13]。Google Earth Engine提供云端遥感访问与计算[4]，ESGF组织分布式气候模式数据发现与访问[14]，Pangeo及Pangeo Forge支持云端数据组织和可复用处理配方[15,16]。本文OISST标准化与US-NR1案例展示了数据获取之后的衔接：按统一空间约定保存处理结果，并依据变量的时间和量纲关系组织参数与气象驱动，使共享数据进一步用于本地模式试验。</w:t>
+        <w:t>现有数据基础设施各有侧重。地球系统数据立方体着重多变量时空数据的联合分析[12]。GriddingMachine侧重共享数据在本地模式中的使用，将标准化、读取和模式适配组织为可由科研程序调用的流程，Julia实现便于组合这些处理方法[13]。Google Earth Engine提供云端遥感访问与计算[4]，ESGF支持分布式气候模式数据发现与访问[14]，Pangeo及Pangeo Forge支持云端数据组织和可复用处理配方[15,16]。本文的OISST和US-NR1案例分别展示了数据转换与本地模式应用：处理结果按统一空间约定保存，多源变量再按时间与量纲关系组合为陆面参数和气象驱动。</w:t>
       </w:r>
     </w:p>
     <w:p>
@@ -5957,7 +5957,7 @@
           <w:rFonts w:ascii="Times New Roman" w:hAnsi="Times New Roman" w:eastAsia="Songti SC"/>
           <w:b w:val="0"/>
         </w:rPr>
-        <w:t>数据目录连接文件发现与实际获取。国内地球系统科学数据共享研究强调规范分类和目录建设[17]，Pooch提供科研文件获取工具，STAC提供地理空间目录描述规范[18,19]。在本研究的镜像获取和修订案例中，标签既连接分发地址，也与文件内容记录对应，使科研程序能够在镜像切换或数据修订后沿用已有调用入口。这一实践为本地模式使用共享数据提供了文件获取与更新的衔接方式；后续可加强与通用目录和获取工具的连接。</w:t>
+        <w:t>数据目录是查找和获取文件的依据。国内地球系统科学数据共享研究强调规范分类和目录建设[17]，Pooch提供科研文件获取工具，STAC提供地理空间目录描述规范[18,19]。本研究在标签对应的条目中同时记录分发地址和文件内容信息，使科研程序在镜像切换或数据修订后仍可使用原有调用方式。镜像获取和修订案例表明，这种组织方式便于本地模式持续使用共享数据；后续可进一步与通用目录规范和数据获取工具衔接。</w:t>
       </w:r>
     </w:p>
     <w:p>
@@ -5966,7 +5966,7 @@
           <w:rFonts w:ascii="Times New Roman" w:hAnsi="Times New Roman" w:eastAsia="Songti SC"/>
           <w:b w:val="0"/>
         </w:rPr>
-        <w:t>多源数据共同进入模式时，处理规则及其研究出处也需要随输入保存。软件引用原则、科研软件FAIR原则（FAIR4RS）及数字资源库TRUST原则分别为软件识别、复用与资源库维护提供参考[20-22]。本文将数据来源、配置和软件版本与处理结果共同归档，使OISST转换和模式输入组织能够对应具体数据与方法。后续新增数据源配置、公共镜像登记和模式接口适配时，延续这些记录可为数据库更新和科研复用提供依据。</w:t>
+        <w:t>模式使用多源数据时，还需要保存处理规则及其研究出处。软件引用原则、科研软件FAIR原则（FAIR4RS）及数字资源库TRUST原则为软件识别、复用与资源库维护提供参考[20-22]。本文将数据来源、配置和软件版本与处理结果共同归档，以便追溯OISST转换和模式输入组织所用的数据与方法。在扩展数据源配置、公共镜像和模式接口时，持续保存这些记录，有助于后续数据维护和科研复用。</w:t>
       </w:r>
     </w:p>
     <w:p>
@@ -5987,7 +5987,7 @@
           <w:rFonts w:ascii="Times New Roman" w:hAnsi="Times New Roman" w:eastAsia="Songti SC"/>
           <w:b w:val="0"/>
         </w:rPr>
-        <w:t>本文针对多源网格数据在转换、分发和模式接入中需要重复整理与维护的问题，更新了2022版GriddingMachine。共享配置集中描述源数据处理规则，独立目录维护标签、分发地址与文件完整性信息，并在直接NetCDF获取和统一读取之后组织陆面参数与气象驱动。Matlab、Octave、Python和R的新版数据自动下载支持得到完善，新增C和Fortran自动下载支持，使不同编程环境能够通过URL或数据标签获取标准化文件。</w:t>
+        <w:t>本文针对多源网格数据在转换、分发和模式接入中需要重复整理与维护的问题，更新了2022版GriddingMachine。新版通过共享配置记录源数据处理规则，利用独立目录维护标签、分发地址和文件完整性信息，并将统一读取的数据进一步组织为陆面参数与气象驱动。同时完善Matlab、Octave、Python和R对新版数据的自动下载支持，新增C和Fortran支持，使不同编程环境能够通过URL或数据标签获取标准化文件。</w:t>
       </w:r>
     </w:p>
     <w:p>
@@ -5996,7 +5996,7 @@
           <w:rFonts w:ascii="Times New Roman" w:hAnsi="Times New Roman" w:eastAsia="Songti SC"/>
           <w:b w:val="0"/>
         </w:rPr>
-        <w:t>受控实例和真实数据案例中，标准化结果的坐标与物理值均与独立参考一致。直接NetCDF分发减少了解包时间和文件存储占用，缩短了获取至首次读取的时间；FTP—Zenodo镜像提供与登记摘要一致的文件，目录更新能够承接数据修订；陆面参数与ERA5逐时数据形成US-NR1模式输入，并完成Emerald初始化和60 s首步计算。</w:t>
+        <w:t>受控实例和真实数据案例表明，标准化结果的坐标与物理值均与独立参考一致。直接NetCDF分发减少了解包时间和文件存储占用，缩短了获取至首次读取的时间。FTP—Zenodo镜像所提供的文件与目录登记的摘要一致，数据修订后仍可沿用原标签获取。陆面参数与ERA5逐时数据经组合形成US-NR1模式输入，并完成Emerald初始化和60 s首步计算。</w:t>
       </w:r>
     </w:p>
     <w:p>

</xml_diff>

<commit_message>
Update author affiliations and add complete Overleaf manuscript project
</commit_message>
<xml_diff>
--- a/论文/GriddingMachine论文初稿_v0.3_语言优化版.docx
+++ b/论文/GriddingMachine论文初稿_v0.3_语言优化版.docx
@@ -16,12 +16,18 @@
       </w:r>
     </w:p>
     <w:p>
+      <w:pPr>
+        <w:keepNext/>
+        <w:spacing w:after="80"/>
+        <w:ind w:firstLine="0"/>
+        <w:jc w:val="center"/>
+      </w:pPr>
       <w:r>
         <w:rPr>
           <w:rFonts w:ascii="Times New Roman" w:hAnsi="Times New Roman" w:eastAsia="Songti SC"/>
           <w:b/>
         </w:rPr>
-        <w:t>姜皓（Hao Jiang）</w:t>
+        <w:t>姜皓</w:t>
       </w:r>
       <w:r>
         <w:rPr>
@@ -29,21 +35,21 @@
           <w:b w:val="0"/>
           <w:vertAlign w:val="superscript"/>
         </w:rPr>
-        <w:t>1</w:t>
+        <w:t>1,2</w:t>
       </w:r>
       <w:r>
         <w:rPr>
           <w:rFonts w:ascii="Times New Roman" w:hAnsi="Times New Roman" w:eastAsia="Songti SC"/>
           <w:b w:val="0"/>
         </w:rPr>
-        <w:t>，</w:t>
+        <w:t xml:space="preserve">　</w:t>
       </w:r>
       <w:r>
         <w:rPr>
           <w:rFonts w:ascii="Times New Roman" w:hAnsi="Times New Roman" w:eastAsia="Songti SC"/>
           <w:b/>
         </w:rPr>
-        <w:t>王玉杰（Yujie Wang）</w:t>
+        <w:t>王玉杰</w:t>
       </w:r>
       <w:r>
         <w:rPr>
@@ -51,50 +57,76 @@
           <w:b w:val="0"/>
           <w:vertAlign w:val="superscript"/>
         </w:rPr>
-        <w:t>1</w:t>
-      </w:r>
+        <w:t>1,2,*</w:t>
+      </w:r>
+    </w:p>
+    <w:p>
+      <w:pPr>
+        <w:keepNext/>
+        <w:spacing w:after="80"/>
+        <w:ind w:firstLine="0"/>
+        <w:jc w:val="center"/>
+      </w:pPr>
       <w:r>
         <w:rPr>
           <w:rFonts w:ascii="Times New Roman" w:hAnsi="Times New Roman" w:eastAsia="Songti SC"/>
           <w:b w:val="0"/>
           <w:vertAlign w:val="superscript"/>
         </w:rPr>
-        <w:t>*</w:t>
+        <w:t>1</w:t>
+      </w:r>
+      <w:r>
+        <w:rPr>
+          <w:rFonts w:ascii="Times New Roman" w:hAnsi="Times New Roman" w:eastAsia="Songti SC"/>
+          <w:b w:val="0"/>
+        </w:rPr>
+        <w:t xml:space="preserve"> 中国科学技术大学风云卫星遥感联合实验室</w:t>
       </w:r>
     </w:p>
     <w:p>
-      <w:r>
-        <w:rPr>
-          <w:rFonts w:ascii="Times New Roman" w:hAnsi="Times New Roman" w:eastAsia="Songti SC"/>
-          <w:b w:val="0"/>
-        </w:rPr>
-        <w:t>1. 中国科学技术大学地球和空间科学学院，安徽 合肥 230026</w:t>
-      </w:r>
-    </w:p>
-    <w:p>
-      <w:r>
-        <w:rPr>
-          <w:rFonts w:ascii="Times New Roman" w:hAnsi="Times New Roman" w:eastAsia="Songti SC"/>
-          <w:b w:val="0"/>
-        </w:rPr>
-        <w:t>姜皓，E-mail：hao.jiang@mail.ustc.edu.cn；ORCID：https://orcid.org/0009-0009-8295-8661</w:t>
-      </w:r>
-    </w:p>
-    <w:p>
+      <w:pPr>
+        <w:keepNext/>
+        <w:spacing w:after="80"/>
+        <w:ind w:firstLine="0"/>
+        <w:jc w:val="center"/>
+      </w:pPr>
       <w:r>
         <w:rPr>
           <w:rFonts w:ascii="Times New Roman" w:hAnsi="Times New Roman" w:eastAsia="Songti SC"/>
           <w:b w:val="0"/>
           <w:vertAlign w:val="superscript"/>
         </w:rPr>
-        <w:t>*</w:t>
+        <w:t>2</w:t>
       </w:r>
       <w:r>
         <w:rPr>
           <w:rFonts w:ascii="Times New Roman" w:hAnsi="Times New Roman" w:eastAsia="Songti SC"/>
           <w:b w:val="0"/>
         </w:rPr>
-        <w:t xml:space="preserve"> 通讯作者：王玉杰，wyujie@ustc.edu.cn</w:t>
+        <w:t xml:space="preserve"> 崂山实验室</w:t>
+      </w:r>
+    </w:p>
+    <w:p>
+      <w:pPr>
+        <w:keepNext/>
+        <w:spacing w:after="80"/>
+        <w:ind w:firstLine="0"/>
+        <w:jc w:val="center"/>
+      </w:pPr>
+      <w:r>
+        <w:rPr>
+          <w:rFonts w:ascii="Times New Roman" w:hAnsi="Times New Roman" w:eastAsia="Songti SC"/>
+          <w:b w:val="0"/>
+          <w:vertAlign w:val="superscript"/>
+        </w:rPr>
+        <w:t>*</w:t>
+      </w:r>
+      <w:r>
+        <w:rPr>
+          <w:rFonts w:ascii="Times New Roman" w:hAnsi="Times New Roman" w:eastAsia="Songti SC"/>
+          <w:b w:val="0"/>
+        </w:rPr>
+        <w:t xml:space="preserve"> 通讯作者（wyujie@ustc.edu.cn）</w:t>
       </w:r>
     </w:p>
     <w:p>
@@ -135,6 +167,12 @@
       </w:r>
     </w:p>
     <w:p>
+      <w:pPr>
+        <w:keepNext/>
+        <w:spacing w:after="80"/>
+        <w:ind w:firstLine="0"/>
+        <w:jc w:val="center"/>
+      </w:pPr>
       <w:r>
         <w:rPr>
           <w:rFonts w:ascii="Times New Roman" w:hAnsi="Times New Roman" w:eastAsia="Songti SC"/>
@@ -144,35 +182,18 @@
       </w:r>
     </w:p>
     <w:p>
+      <w:pPr>
+        <w:keepNext/>
+        <w:spacing w:after="80"/>
+        <w:ind w:firstLine="0"/>
+        <w:jc w:val="center"/>
+      </w:pPr>
       <w:r>
         <w:rPr>
           <w:rFonts w:ascii="Times New Roman" w:hAnsi="Times New Roman" w:eastAsia="Songti SC"/>
           <w:b/>
         </w:rPr>
         <w:t>Hao JIANG</w:t>
-      </w:r>
-      <w:r>
-        <w:rPr>
-          <w:rFonts w:ascii="Times New Roman" w:hAnsi="Times New Roman" w:eastAsia="Songti SC"/>
-          <w:b/>
-          <w:vertAlign w:val="superscript"/>
-        </w:rPr>
-        <w:t>1</w:t>
-      </w:r>
-      <w:r>
-        <w:rPr>
-          <w:rFonts w:ascii="Times New Roman" w:hAnsi="Times New Roman" w:eastAsia="Songti SC"/>
-          <w:b/>
-        </w:rPr>
-        <w:t>, Yujie WANG</w:t>
-      </w:r>
-      <w:r>
-        <w:rPr>
-          <w:rFonts w:ascii="Times New Roman" w:hAnsi="Times New Roman" w:eastAsia="Songti SC"/>
-          <w:b/>
-          <w:vertAlign w:val="superscript"/>
-        </w:rPr>
-        <w:t>1</w:t>
       </w:r>
       <w:r>
         <w:rPr>
@@ -180,42 +201,98 @@
           <w:b w:val="0"/>
           <w:vertAlign w:val="superscript"/>
         </w:rPr>
-        <w:t>*</w:t>
-      </w:r>
-    </w:p>
-    <w:p>
+        <w:t>1,2</w:t>
+      </w:r>
       <w:r>
         <w:rPr>
           <w:rFonts w:ascii="Times New Roman" w:hAnsi="Times New Roman" w:eastAsia="Songti SC"/>
           <w:b w:val="0"/>
         </w:rPr>
-        <w:t>1. School of Earth and Space Sciences, University of Science and Technology of China, Hefei 230026, China</w:t>
-      </w:r>
-    </w:p>
-    <w:p>
+        <w:t xml:space="preserve">, </w:t>
+      </w:r>
       <w:r>
         <w:rPr>
           <w:rFonts w:ascii="Times New Roman" w:hAnsi="Times New Roman" w:eastAsia="Songti SC"/>
-          <w:b w:val="0"/>
-        </w:rPr>
-        <w:t>Hao Jiang, E-mail: hao.jiang@mail.ustc.edu.cn; ORCID: https://orcid.org/0009-0009-8295-8661</w:t>
-      </w:r>
-    </w:p>
-    <w:p>
+          <w:b/>
+        </w:rPr>
+        <w:t>Yujie WANG</w:t>
+      </w:r>
       <w:r>
         <w:rPr>
           <w:rFonts w:ascii="Times New Roman" w:hAnsi="Times New Roman" w:eastAsia="Songti SC"/>
           <w:b w:val="0"/>
           <w:vertAlign w:val="superscript"/>
         </w:rPr>
-        <w:t>*</w:t>
-      </w:r>
+        <w:t>1,2,*</w:t>
+      </w:r>
+    </w:p>
+    <w:p>
+      <w:pPr>
+        <w:keepNext/>
+        <w:spacing w:after="80"/>
+        <w:ind w:firstLine="0"/>
+        <w:jc w:val="center"/>
+      </w:pPr>
       <w:r>
         <w:rPr>
           <w:rFonts w:ascii="Times New Roman" w:hAnsi="Times New Roman" w:eastAsia="Songti SC"/>
           <w:b w:val="0"/>
-        </w:rPr>
-        <w:t xml:space="preserve"> Corresponding author: Yujie Wang, wyujie@ustc.edu.cn</w:t>
+          <w:vertAlign w:val="superscript"/>
+        </w:rPr>
+        <w:t>1</w:t>
+      </w:r>
+      <w:r>
+        <w:rPr>
+          <w:rFonts w:ascii="Times New Roman" w:hAnsi="Times New Roman" w:eastAsia="Songti SC"/>
+          <w:b w:val="0"/>
+        </w:rPr>
+        <w:t xml:space="preserve"> Joint Laboratory of Fengyun Remote Sensing, University of Science and Technology of China</w:t>
+      </w:r>
+    </w:p>
+    <w:p>
+      <w:pPr>
+        <w:keepNext/>
+        <w:spacing w:after="80"/>
+        <w:ind w:firstLine="0"/>
+        <w:jc w:val="center"/>
+      </w:pPr>
+      <w:r>
+        <w:rPr>
+          <w:rFonts w:ascii="Times New Roman" w:hAnsi="Times New Roman" w:eastAsia="Songti SC"/>
+          <w:b w:val="0"/>
+          <w:vertAlign w:val="superscript"/>
+        </w:rPr>
+        <w:t>2</w:t>
+      </w:r>
+      <w:r>
+        <w:rPr>
+          <w:rFonts w:ascii="Times New Roman" w:hAnsi="Times New Roman" w:eastAsia="Songti SC"/>
+          <w:b w:val="0"/>
+        </w:rPr>
+        <w:t xml:space="preserve"> Laoshan Laboratory</w:t>
+      </w:r>
+    </w:p>
+    <w:p>
+      <w:pPr>
+        <w:keepNext/>
+        <w:spacing w:after="80"/>
+        <w:ind w:firstLine="0"/>
+        <w:jc w:val="center"/>
+      </w:pPr>
+      <w:r>
+        <w:rPr>
+          <w:rFonts w:ascii="Times New Roman" w:hAnsi="Times New Roman" w:eastAsia="Songti SC"/>
+          <w:b w:val="0"/>
+          <w:vertAlign w:val="superscript"/>
+        </w:rPr>
+        <w:t>*</w:t>
+      </w:r>
+      <w:r>
+        <w:rPr>
+          <w:rFonts w:ascii="Times New Roman" w:hAnsi="Times New Roman" w:eastAsia="Songti SC"/>
+          <w:b w:val="0"/>
+        </w:rPr>
+        <w:t xml:space="preserve"> Corresponding author (wyujie@ustc.edu.cn)</w:t>
       </w:r>
     </w:p>
     <w:p>

</xml_diff>

<commit_message>
Remove funding placeholder and update author contributions
</commit_message>
<xml_diff>
--- a/论文/GriddingMachine论文初稿_v0.3_语言优化版.docx
+++ b/论文/GriddingMachine论文初稿_v0.3_语言优化版.docx
@@ -6128,7 +6128,7 @@
           <w:rFonts w:ascii="Times New Roman" w:hAnsi="Times New Roman" w:eastAsia="Songti SC"/>
           <w:b w:val="0"/>
         </w:rPr>
-        <w:t>基金项目</w:t>
+        <w:t>作者贡献</w:t>
       </w:r>
     </w:p>
     <w:p>
@@ -6137,28 +6137,7 @@
           <w:rFonts w:ascii="Times New Roman" w:hAnsi="Times New Roman" w:eastAsia="Songti SC"/>
           <w:b w:val="0"/>
         </w:rPr>
-        <w:t>【待作者和通讯作者补充基金项目中文/英文名称及编号；如无资助，按期刊要求声明。】</w:t>
-      </w:r>
-    </w:p>
-    <w:p>
-      <w:pPr>
-        <w:pStyle w:val="Heading1"/>
-      </w:pPr>
-      <w:r>
-        <w:rPr>
-          <w:rFonts w:ascii="Times New Roman" w:hAnsi="Times New Roman" w:eastAsia="Songti SC"/>
-          <w:b w:val="0"/>
-        </w:rPr>
-        <w:t>作者贡献</w:t>
-      </w:r>
-    </w:p>
-    <w:p>
-      <w:r>
-        <w:rPr>
-          <w:rFonts w:ascii="Times New Roman" w:hAnsi="Times New Roman" w:eastAsia="Songti SC"/>
-          <w:b w:val="0"/>
-        </w:rPr>
-        <w:t>姜皓：概念设计、方法设计、软件、数据整理、可视化、初稿撰写。王玉杰：概念设计、研究指导、项目管理、论文审阅与修改。</w:t>
+        <w:t>姜皓：概念设计、方法设计、软件、数据整理、初稿撰写。王玉杰：概念设计、软件、数据整理、研究指导、项目管理、论文审阅与修改。</w:t>
       </w:r>
     </w:p>
     <w:p>

</xml_diff>

<commit_message>
Improve manuscript table structure and typography across formats
</commit_message>
<xml_diff>
--- a/论文/GriddingMachine论文初稿_v0.3_语言优化版.docx
+++ b/论文/GriddingMachine论文初稿_v0.3_语言优化版.docx
@@ -642,7 +642,7 @@
           <w:rFonts w:ascii="Times New Roman" w:hAnsi="Times New Roman" w:eastAsia="Songti SC"/>
           <w:b w:val="0"/>
         </w:rPr>
-        <w:t>表1概括2022版与新版的主要差异及其在数据流程中的作用。</w:t>
+        <w:t>表1对比2022版与新版在数据生产、分发、读取和跨语言获取方面的主要差异。</w:t>
       </w:r>
     </w:p>
     <w:p>
@@ -673,13 +673,6 @@
           <w:b/>
         </w:rPr>
         <w:t>Table 1 Comparison between the 2022 release and the updated GriddingMachine.</w:t>
-      </w:r>
-      <w:r>
-        <w:rPr>
-          <w:rFonts w:ascii="Times New Roman" w:hAnsi="Times New Roman" w:eastAsia="Songti SC"/>
-          <w:b w:val="0"/>
-        </w:rPr>
-        <w:t xml:space="preserve"> The table summarizes the implemented mechanisms, workflow changes, and their implications for scientific data use across the data workflow.</w:t>
       </w:r>
     </w:p>
     <w:tbl>
@@ -698,10 +691,9 @@
         </w:tblBorders>
       </w:tblPr>
       <w:tblGrid>
-        <w:gridCol w:w="1417"/>
-        <w:gridCol w:w="2324"/>
-        <w:gridCol w:w="2665"/>
-        <w:gridCol w:w="2438"/>
+        <w:gridCol w:w="1502"/>
+        <w:gridCol w:w="3186"/>
+        <w:gridCol w:w="4156"/>
       </w:tblGrid>
       <w:tr>
         <w:trPr>
@@ -710,13 +702,13 @@
         </w:trPr>
         <w:tc>
           <w:tcPr>
-            <w:tcW w:type="dxa" w:w="1417"/>
-            <w:vAlign w:val="center"/>
+            <w:tcW w:type="dxa" w:w="1502"/>
+            <w:vAlign w:val="top"/>
             <w:tcMar>
-              <w:top w:w="70" w:type="dxa"/>
-              <w:start w:w="90" w:type="dxa"/>
-              <w:bottom w:w="70" w:type="dxa"/>
-              <w:end w:w="90" w:type="dxa"/>
+              <w:top w:w="90" w:type="dxa"/>
+              <w:start w:w="110" w:type="dxa"/>
+              <w:bottom w:w="90" w:type="dxa"/>
+              <w:end w:w="170" w:type="dxa"/>
             </w:tcMar>
             <w:tcBorders>
               <w:bottom w:val="single" w:sz="6" w:color="6B7280"/>
@@ -726,35 +718,35 @@
             <w:pPr>
               <w:keepNext/>
               <w:keepLines/>
-              <w:spacing w:before="0" w:after="0" w:line="240" w:lineRule="auto"/>
+              <w:spacing w:before="0" w:after="0" w:line="252" w:lineRule="auto"/>
               <w:ind w:firstLine="0" w:left="0" w:right="0"/>
-              <w:jc w:val="center"/>
+              <w:jc w:val="left"/>
             </w:pPr>
             <w:r>
               <w:rPr>
                 <w:b/>
-                <w:sz w:val="18"/>
+                <w:sz w:val="20"/>
               </w:rPr>
             </w:r>
             <w:r>
               <w:rPr>
                 <w:rFonts w:ascii="Times New Roman" w:hAnsi="Times New Roman" w:eastAsia="Songti SC"/>
                 <w:b/>
-                <w:sz w:val="18"/>
+                <w:sz w:val="20"/>
               </w:rPr>
-              <w:t>环节</w:t>
+              <w:t>更新环节</w:t>
             </w:r>
           </w:p>
         </w:tc>
         <w:tc>
           <w:tcPr>
-            <w:tcW w:type="dxa" w:w="2324"/>
-            <w:vAlign w:val="center"/>
+            <w:tcW w:type="dxa" w:w="3186"/>
+            <w:vAlign w:val="top"/>
             <w:tcMar>
-              <w:top w:w="70" w:type="dxa"/>
-              <w:start w:w="90" w:type="dxa"/>
-              <w:bottom w:w="70" w:type="dxa"/>
-              <w:end w:w="90" w:type="dxa"/>
+              <w:top w:w="90" w:type="dxa"/>
+              <w:start w:w="110" w:type="dxa"/>
+              <w:bottom w:w="90" w:type="dxa"/>
+              <w:end w:w="170" w:type="dxa"/>
             </w:tcMar>
             <w:tcBorders>
               <w:bottom w:val="single" w:sz="6" w:color="6B7280"/>
@@ -764,21 +756,21 @@
             <w:pPr>
               <w:keepNext/>
               <w:keepLines/>
-              <w:spacing w:before="0" w:after="0" w:line="240" w:lineRule="auto"/>
+              <w:spacing w:before="0" w:after="0" w:line="252" w:lineRule="auto"/>
               <w:ind w:firstLine="0" w:left="0" w:right="0"/>
-              <w:jc w:val="center"/>
+              <w:jc w:val="left"/>
             </w:pPr>
             <w:r>
               <w:rPr>
                 <w:b/>
-                <w:sz w:val="18"/>
+                <w:sz w:val="20"/>
               </w:rPr>
             </w:r>
             <w:r>
               <w:rPr>
                 <w:rFonts w:ascii="Times New Roman" w:hAnsi="Times New Roman" w:eastAsia="Songti SC"/>
                 <w:b/>
-                <w:sz w:val="18"/>
+                <w:sz w:val="20"/>
               </w:rPr>
               <w:t>2022版</w:t>
             </w:r>
@@ -786,13 +778,13 @@
         </w:tc>
         <w:tc>
           <w:tcPr>
-            <w:tcW w:type="dxa" w:w="2665"/>
-            <w:vAlign w:val="center"/>
+            <w:tcW w:type="dxa" w:w="4156"/>
+            <w:vAlign w:val="top"/>
             <w:tcMar>
-              <w:top w:w="70" w:type="dxa"/>
-              <w:start w:w="90" w:type="dxa"/>
-              <w:bottom w:w="70" w:type="dxa"/>
-              <w:end w:w="90" w:type="dxa"/>
+              <w:top w:w="90" w:type="dxa"/>
+              <w:start w:w="110" w:type="dxa"/>
+              <w:bottom w:w="90" w:type="dxa"/>
+              <w:end w:w="170" w:type="dxa"/>
             </w:tcMar>
             <w:tcBorders>
               <w:bottom w:val="single" w:sz="6" w:color="6B7280"/>
@@ -802,61 +794,23 @@
             <w:pPr>
               <w:keepNext/>
               <w:keepLines/>
-              <w:spacing w:before="0" w:after="0" w:line="240" w:lineRule="auto"/>
+              <w:spacing w:before="0" w:after="0" w:line="252" w:lineRule="auto"/>
               <w:ind w:firstLine="0" w:left="0" w:right="0"/>
-              <w:jc w:val="center"/>
+              <w:jc w:val="left"/>
             </w:pPr>
             <w:r>
               <w:rPr>
                 <w:b/>
-                <w:sz w:val="18"/>
+                <w:sz w:val="20"/>
               </w:rPr>
             </w:r>
             <w:r>
               <w:rPr>
                 <w:rFonts w:ascii="Times New Roman" w:hAnsi="Times New Roman" w:eastAsia="Songti SC"/>
                 <w:b/>
-                <w:sz w:val="18"/>
+                <w:sz w:val="20"/>
               </w:rPr>
               <w:t>新版</w:t>
-            </w:r>
-          </w:p>
-        </w:tc>
-        <w:tc>
-          <w:tcPr>
-            <w:tcW w:type="dxa" w:w="2438"/>
-            <w:vAlign w:val="center"/>
-            <w:tcMar>
-              <w:top w:w="70" w:type="dxa"/>
-              <w:start w:w="90" w:type="dxa"/>
-              <w:bottom w:w="70" w:type="dxa"/>
-              <w:end w:w="90" w:type="dxa"/>
-            </w:tcMar>
-            <w:tcBorders>
-              <w:bottom w:val="single" w:sz="6" w:color="6B7280"/>
-            </w:tcBorders>
-          </w:tcPr>
-          <w:p>
-            <w:pPr>
-              <w:keepNext/>
-              <w:keepLines/>
-              <w:spacing w:before="0" w:after="0" w:line="240" w:lineRule="auto"/>
-              <w:ind w:firstLine="0" w:left="0" w:right="0"/>
-              <w:jc w:val="center"/>
-            </w:pPr>
-            <w:r>
-              <w:rPr>
-                <w:b/>
-                <w:sz w:val="18"/>
-              </w:rPr>
-            </w:r>
-            <w:r>
-              <w:rPr>
-                <w:rFonts w:ascii="Times New Roman" w:hAnsi="Times New Roman" w:eastAsia="Songti SC"/>
-                <w:b/>
-                <w:sz w:val="18"/>
-              </w:rPr>
-              <w:t>对科研流程的作用</w:t>
             </w:r>
           </w:p>
         </w:tc>
@@ -867,159 +821,112 @@
         </w:trPr>
         <w:tc>
           <w:tcPr>
-            <w:tcW w:type="dxa" w:w="1417"/>
-            <w:vAlign w:val="center"/>
+            <w:tcW w:type="dxa" w:w="1502"/>
+            <w:vAlign w:val="top"/>
             <w:tcMar>
-              <w:top w:w="70" w:type="dxa"/>
-              <w:start w:w="90" w:type="dxa"/>
-              <w:bottom w:w="70" w:type="dxa"/>
-              <w:end w:w="90" w:type="dxa"/>
+              <w:top w:w="90" w:type="dxa"/>
+              <w:start w:w="110" w:type="dxa"/>
+              <w:bottom w:w="90" w:type="dxa"/>
+              <w:end w:w="170" w:type="dxa"/>
             </w:tcMar>
+            <w:tcBorders>
+              <w:bottom w:val="single" w:sz="2" w:color="B8BDC4"/>
+            </w:tcBorders>
           </w:tcPr>
           <w:p>
             <w:pPr>
               <w:keepNext/>
               <w:keepLines/>
-              <w:spacing w:before="0" w:after="0" w:line="240" w:lineRule="auto"/>
+              <w:spacing w:before="0" w:after="0" w:line="252" w:lineRule="auto"/>
               <w:ind w:firstLine="0" w:left="0" w:right="0"/>
-              <w:jc w:val="center"/>
+              <w:jc w:val="left"/>
             </w:pPr>
             <w:r>
               <w:rPr>
-                <w:sz w:val="18"/>
+                <w:sz w:val="20"/>
               </w:rPr>
             </w:r>
             <w:r>
               <w:rPr>
                 <w:rFonts w:ascii="Times New Roman" w:hAnsi="Times New Roman" w:eastAsia="Songti SC"/>
                 <w:b w:val="0"/>
-                <w:sz w:val="18"/>
+                <w:sz w:val="20"/>
               </w:rPr>
-              <w:t>分发单元</w:t>
+              <w:t>数据生产</w:t>
             </w:r>
           </w:p>
         </w:tc>
         <w:tc>
           <w:tcPr>
-            <w:tcW w:type="dxa" w:w="2324"/>
+            <w:tcW w:type="dxa" w:w="3186"/>
             <w:vAlign w:val="top"/>
             <w:tcMar>
-              <w:top w:w="70" w:type="dxa"/>
-              <w:start w:w="90" w:type="dxa"/>
-              <w:bottom w:w="70" w:type="dxa"/>
-              <w:end w:w="90" w:type="dxa"/>
+              <w:top w:w="90" w:type="dxa"/>
+              <w:start w:w="110" w:type="dxa"/>
+              <w:bottom w:w="90" w:type="dxa"/>
+              <w:end w:w="170" w:type="dxa"/>
             </w:tcMar>
+            <w:tcBorders>
+              <w:bottom w:val="single" w:sz="2" w:color="B8BDC4"/>
+            </w:tcBorders>
           </w:tcPr>
           <w:p>
             <w:pPr>
               <w:keepNext/>
               <w:keepLines/>
-              <w:spacing w:before="0" w:after="0" w:line="240" w:lineRule="auto"/>
+              <w:spacing w:before="0" w:after="0" w:line="252" w:lineRule="auto"/>
               <w:ind w:firstLine="0" w:left="0" w:right="0"/>
               <w:jc w:val="left"/>
             </w:pPr>
             <w:r>
               <w:rPr>
-                <w:sz w:val="18"/>
+                <w:sz w:val="20"/>
               </w:rPr>
             </w:r>
             <w:r>
               <w:rPr>
                 <w:rFonts w:ascii="Times New Roman" w:hAnsi="Times New Roman" w:eastAsia="Songti SC"/>
                 <w:b w:val="0"/>
-                <w:sz w:val="18"/>
+                <w:sz w:val="20"/>
               </w:rPr>
-              <w:t>NetCDF的</w:t>
-            </w:r>
-            <w:r>
-              <w:rPr>
-                <w:rFonts w:ascii="Consolas" w:hAnsi="Consolas" w:eastAsia="Songti SC"/>
-                <w:sz w:val="18"/>
-              </w:rPr>
-              <w:t>tar.gz</w:t>
-            </w:r>
-            <w:r>
-              <w:rPr>
-                <w:rFonts w:ascii="Times New Roman" w:hAnsi="Times New Roman" w:eastAsia="Songti SC"/>
-                <w:b w:val="0"/>
-                <w:sz w:val="18"/>
-              </w:rPr>
-              <w:t>归档文件</w:t>
+              <w:t>数据源专用脚本与贡献流程</w:t>
             </w:r>
           </w:p>
         </w:tc>
         <w:tc>
           <w:tcPr>
-            <w:tcW w:type="dxa" w:w="2665"/>
+            <w:tcW w:type="dxa" w:w="4156"/>
             <w:vAlign w:val="top"/>
             <w:tcMar>
-              <w:top w:w="70" w:type="dxa"/>
-              <w:start w:w="90" w:type="dxa"/>
-              <w:bottom w:w="70" w:type="dxa"/>
-              <w:end w:w="90" w:type="dxa"/>
+              <w:top w:w="90" w:type="dxa"/>
+              <w:start w:w="110" w:type="dxa"/>
+              <w:bottom w:w="90" w:type="dxa"/>
+              <w:end w:w="170" w:type="dxa"/>
             </w:tcMar>
+            <w:tcBorders>
+              <w:bottom w:val="single" w:sz="2" w:color="B8BDC4"/>
+            </w:tcBorders>
           </w:tcPr>
           <w:p>
             <w:pPr>
               <w:keepNext/>
               <w:keepLines/>
-              <w:spacing w:before="0" w:after="0" w:line="240" w:lineRule="auto"/>
+              <w:spacing w:before="0" w:after="0" w:line="252" w:lineRule="auto"/>
               <w:ind w:firstLine="0" w:left="0" w:right="0"/>
               <w:jc w:val="left"/>
             </w:pPr>
             <w:r>
               <w:rPr>
-                <w:sz w:val="18"/>
+                <w:sz w:val="20"/>
               </w:rPr>
             </w:r>
             <w:r>
               <w:rPr>
                 <w:rFonts w:ascii="Times New Roman" w:hAnsi="Times New Roman" w:eastAsia="Songti SC"/>
                 <w:b w:val="0"/>
-                <w:sz w:val="18"/>
+                <w:sz w:val="20"/>
               </w:rPr>
-              <w:t>可直接读取的</w:t>
-            </w:r>
-            <w:r>
-              <w:rPr>
-                <w:rFonts w:ascii="Consolas" w:hAnsi="Consolas" w:eastAsia="Songti SC"/>
-                <w:sz w:val="18"/>
-              </w:rPr>
-              <w:t>.nc</w:t>
-            </w:r>
-          </w:p>
-        </w:tc>
-        <w:tc>
-          <w:tcPr>
-            <w:tcW w:type="dxa" w:w="2438"/>
-            <w:vAlign w:val="top"/>
-            <w:tcMar>
-              <w:top w:w="70" w:type="dxa"/>
-              <w:start w:w="90" w:type="dxa"/>
-              <w:bottom w:w="70" w:type="dxa"/>
-              <w:end w:w="90" w:type="dxa"/>
-            </w:tcMar>
-          </w:tcPr>
-          <w:p>
-            <w:pPr>
-              <w:keepNext/>
-              <w:keepLines/>
-              <w:spacing w:before="0" w:after="0" w:line="240" w:lineRule="auto"/>
-              <w:ind w:firstLine="0" w:left="0" w:right="0"/>
-              <w:jc w:val="left"/>
-            </w:pPr>
-            <w:r>
-              <w:rPr>
-                <w:sz w:val="18"/>
-              </w:rPr>
-            </w:r>
-            <w:r>
-              <w:rPr>
-                <w:rFonts w:ascii="Times New Roman" w:hAnsi="Times New Roman" w:eastAsia="Songti SC"/>
-                <w:b w:val="0"/>
-                <w:sz w:val="18"/>
-              </w:rPr>
-              <w:t>简化数据获取并降低端到端读取时间</w:t>
+              <w:t>共享YAML配置、源维度映射及配置生成</w:t>
             </w:r>
           </w:p>
         </w:tc>
@@ -1030,159 +937,127 @@
         </w:trPr>
         <w:tc>
           <w:tcPr>
-            <w:tcW w:type="dxa" w:w="1417"/>
-            <w:vAlign w:val="center"/>
+            <w:tcW w:type="dxa" w:w="1502"/>
+            <w:vAlign w:val="top"/>
             <w:tcMar>
-              <w:top w:w="70" w:type="dxa"/>
-              <w:start w:w="90" w:type="dxa"/>
-              <w:bottom w:w="70" w:type="dxa"/>
-              <w:end w:w="90" w:type="dxa"/>
+              <w:top w:w="90" w:type="dxa"/>
+              <w:start w:w="110" w:type="dxa"/>
+              <w:bottom w:w="90" w:type="dxa"/>
+              <w:end w:w="170" w:type="dxa"/>
             </w:tcMar>
+            <w:tcBorders>
+              <w:bottom w:val="single" w:sz="2" w:color="B8BDC4"/>
+            </w:tcBorders>
           </w:tcPr>
           <w:p>
             <w:pPr>
               <w:keepNext/>
               <w:keepLines/>
-              <w:spacing w:before="0" w:after="0" w:line="240" w:lineRule="auto"/>
+              <w:spacing w:before="0" w:after="0" w:line="252" w:lineRule="auto"/>
               <w:ind w:firstLine="0" w:left="0" w:right="0"/>
-              <w:jc w:val="center"/>
+              <w:jc w:val="left"/>
             </w:pPr>
             <w:r>
               <w:rPr>
-                <w:sz w:val="18"/>
+                <w:sz w:val="20"/>
               </w:rPr>
             </w:r>
             <w:r>
               <w:rPr>
                 <w:rFonts w:ascii="Times New Roman" w:hAnsi="Times New Roman" w:eastAsia="Songti SC"/>
                 <w:b w:val="0"/>
-                <w:sz w:val="18"/>
+                <w:sz w:val="20"/>
               </w:rPr>
-              <w:t>数据目录</w:t>
+              <w:t>分发文件</w:t>
             </w:r>
           </w:p>
         </w:tc>
         <w:tc>
           <w:tcPr>
-            <w:tcW w:type="dxa" w:w="2324"/>
+            <w:tcW w:type="dxa" w:w="3186"/>
             <w:vAlign w:val="top"/>
             <w:tcMar>
-              <w:top w:w="70" w:type="dxa"/>
-              <w:start w:w="90" w:type="dxa"/>
-              <w:bottom w:w="70" w:type="dxa"/>
-              <w:end w:w="90" w:type="dxa"/>
+              <w:top w:w="90" w:type="dxa"/>
+              <w:start w:w="110" w:type="dxa"/>
+              <w:bottom w:w="90" w:type="dxa"/>
+              <w:end w:w="170" w:type="dxa"/>
             </w:tcMar>
+            <w:tcBorders>
+              <w:bottom w:val="single" w:sz="2" w:color="B8BDC4"/>
+            </w:tcBorders>
           </w:tcPr>
           <w:p>
             <w:pPr>
               <w:keepNext/>
               <w:keepLines/>
-              <w:spacing w:before="0" w:after="0" w:line="240" w:lineRule="auto"/>
+              <w:spacing w:before="0" w:after="0" w:line="252" w:lineRule="auto"/>
               <w:ind w:firstLine="0" w:left="0" w:right="0"/>
               <w:jc w:val="left"/>
             </w:pPr>
             <w:r>
               <w:rPr>
-                <w:sz w:val="18"/>
+                <w:sz w:val="20"/>
               </w:rPr>
             </w:r>
             <w:r>
               <w:rPr>
                 <w:rFonts w:ascii="Times New Roman" w:hAnsi="Times New Roman" w:eastAsia="Songti SC"/>
                 <w:b w:val="0"/>
-                <w:sz w:val="18"/>
+                <w:sz w:val="20"/>
               </w:rPr>
-              <w:t>Julia包内置</w:t>
+              <w:t>NetCDF外层</w:t>
             </w:r>
             <w:r>
               <w:rPr>
                 <w:rFonts w:ascii="Consolas" w:hAnsi="Consolas" w:eastAsia="Songti SC"/>
-                <w:sz w:val="18"/>
+                <w:sz w:val="20"/>
               </w:rPr>
-              <w:t>Artifacts.toml</w:t>
+              <w:t>tar.gz</w:t>
+            </w:r>
+            <w:r>
+              <w:rPr>
+                <w:rFonts w:ascii="Times New Roman" w:hAnsi="Times New Roman" w:eastAsia="Songti SC"/>
+                <w:b w:val="0"/>
+                <w:sz w:val="20"/>
+              </w:rPr>
+              <w:t>归档</w:t>
             </w:r>
           </w:p>
         </w:tc>
         <w:tc>
           <w:tcPr>
-            <w:tcW w:type="dxa" w:w="2665"/>
+            <w:tcW w:type="dxa" w:w="4156"/>
             <w:vAlign w:val="top"/>
             <w:tcMar>
-              <w:top w:w="70" w:type="dxa"/>
-              <w:start w:w="90" w:type="dxa"/>
-              <w:bottom w:w="70" w:type="dxa"/>
-              <w:end w:w="90" w:type="dxa"/>
+              <w:top w:w="90" w:type="dxa"/>
+              <w:start w:w="110" w:type="dxa"/>
+              <w:bottom w:w="90" w:type="dxa"/>
+              <w:end w:w="170" w:type="dxa"/>
             </w:tcMar>
+            <w:tcBorders>
+              <w:bottom w:val="single" w:sz="2" w:color="B8BDC4"/>
+            </w:tcBorders>
           </w:tcPr>
           <w:p>
             <w:pPr>
               <w:keepNext/>
               <w:keepLines/>
-              <w:spacing w:before="0" w:after="0" w:line="240" w:lineRule="auto"/>
+              <w:spacing w:before="0" w:after="0" w:line="252" w:lineRule="auto"/>
               <w:ind w:firstLine="0" w:left="0" w:right="0"/>
               <w:jc w:val="left"/>
             </w:pPr>
             <w:r>
               <w:rPr>
-                <w:sz w:val="18"/>
+                <w:sz w:val="20"/>
               </w:rPr>
             </w:r>
             <w:r>
               <w:rPr>
                 <w:rFonts w:ascii="Times New Roman" w:hAnsi="Times New Roman" w:eastAsia="Songti SC"/>
                 <w:b w:val="0"/>
-                <w:sz w:val="18"/>
+                <w:sz w:val="20"/>
               </w:rPr>
-              <w:t>独立</w:t>
-            </w:r>
-            <w:r>
-              <w:rPr>
-                <w:rFonts w:ascii="Consolas" w:hAnsi="Consolas" w:eastAsia="Songti SC"/>
-                <w:sz w:val="18"/>
-              </w:rPr>
-              <w:t>Artifacts.yaml</w:t>
-            </w:r>
-            <w:r>
-              <w:rPr>
-                <w:rFonts w:ascii="Times New Roman" w:hAnsi="Times New Roman" w:eastAsia="Songti SC"/>
-                <w:b w:val="0"/>
-                <w:sz w:val="18"/>
-              </w:rPr>
-              <w:t>，支持目录校验和独立更新</w:t>
-            </w:r>
-          </w:p>
-        </w:tc>
-        <w:tc>
-          <w:tcPr>
-            <w:tcW w:type="dxa" w:w="2438"/>
-            <w:vAlign w:val="top"/>
-            <w:tcMar>
-              <w:top w:w="70" w:type="dxa"/>
-              <w:start w:w="90" w:type="dxa"/>
-              <w:bottom w:w="70" w:type="dxa"/>
-              <w:end w:w="90" w:type="dxa"/>
-            </w:tcMar>
-          </w:tcPr>
-          <w:p>
-            <w:pPr>
-              <w:keepNext/>
-              <w:keepLines/>
-              <w:spacing w:before="0" w:after="0" w:line="240" w:lineRule="auto"/>
-              <w:ind w:firstLine="0" w:left="0" w:right="0"/>
-              <w:jc w:val="left"/>
-            </w:pPr>
-            <w:r>
-              <w:rPr>
-                <w:sz w:val="18"/>
-              </w:rPr>
-            </w:r>
-            <w:r>
-              <w:rPr>
-                <w:rFonts w:ascii="Times New Roman" w:hAnsi="Times New Roman" w:eastAsia="Songti SC"/>
-                <w:b w:val="0"/>
-                <w:sz w:val="18"/>
-              </w:rPr>
-              <w:t>数据目录可独立于软件版本维护</w:t>
+              <w:t>直接分发NetCDF，省去外层解包</w:t>
             </w:r>
           </w:p>
         </w:tc>
@@ -1193,137 +1068,134 @@
         </w:trPr>
         <w:tc>
           <w:tcPr>
-            <w:tcW w:type="dxa" w:w="1417"/>
-            <w:vAlign w:val="center"/>
+            <w:tcW w:type="dxa" w:w="1502"/>
+            <w:vAlign w:val="top"/>
             <w:tcMar>
-              <w:top w:w="70" w:type="dxa"/>
-              <w:start w:w="90" w:type="dxa"/>
-              <w:bottom w:w="70" w:type="dxa"/>
-              <w:end w:w="90" w:type="dxa"/>
+              <w:top w:w="90" w:type="dxa"/>
+              <w:start w:w="110" w:type="dxa"/>
+              <w:bottom w:w="90" w:type="dxa"/>
+              <w:end w:w="170" w:type="dxa"/>
             </w:tcMar>
+            <w:tcBorders>
+              <w:bottom w:val="single" w:sz="2" w:color="B8BDC4"/>
+            </w:tcBorders>
           </w:tcPr>
           <w:p>
             <w:pPr>
               <w:keepNext/>
               <w:keepLines/>
-              <w:spacing w:before="0" w:after="0" w:line="240" w:lineRule="auto"/>
+              <w:spacing w:before="0" w:after="0" w:line="252" w:lineRule="auto"/>
               <w:ind w:firstLine="0" w:left="0" w:right="0"/>
-              <w:jc w:val="center"/>
+              <w:jc w:val="left"/>
             </w:pPr>
             <w:r>
               <w:rPr>
-                <w:sz w:val="18"/>
+                <w:sz w:val="20"/>
               </w:rPr>
             </w:r>
             <w:r>
               <w:rPr>
                 <w:rFonts w:ascii="Times New Roman" w:hAnsi="Times New Roman" w:eastAsia="Songti SC"/>
                 <w:b w:val="0"/>
-                <w:sz w:val="18"/>
+                <w:sz w:val="20"/>
               </w:rPr>
-              <w:t>数据获取</w:t>
+              <w:t>目录维护</w:t>
             </w:r>
           </w:p>
         </w:tc>
         <w:tc>
           <w:tcPr>
-            <w:tcW w:type="dxa" w:w="2324"/>
+            <w:tcW w:type="dxa" w:w="3186"/>
             <w:vAlign w:val="top"/>
             <w:tcMar>
-              <w:top w:w="70" w:type="dxa"/>
-              <w:start w:w="90" w:type="dxa"/>
-              <w:bottom w:w="70" w:type="dxa"/>
-              <w:end w:w="90" w:type="dxa"/>
+              <w:top w:w="90" w:type="dxa"/>
+              <w:start w:w="110" w:type="dxa"/>
+              <w:bottom w:w="90" w:type="dxa"/>
+              <w:end w:w="170" w:type="dxa"/>
             </w:tcMar>
+            <w:tcBorders>
+              <w:bottom w:val="single" w:sz="2" w:color="B8BDC4"/>
+            </w:tcBorders>
           </w:tcPr>
           <w:p>
             <w:pPr>
               <w:keepNext/>
               <w:keepLines/>
-              <w:spacing w:before="0" w:after="0" w:line="240" w:lineRule="auto"/>
+              <w:spacing w:before="0" w:after="0" w:line="252" w:lineRule="auto"/>
               <w:ind w:firstLine="0" w:left="0" w:right="0"/>
               <w:jc w:val="left"/>
             </w:pPr>
             <w:r>
               <w:rPr>
-                <w:sz w:val="18"/>
+                <w:sz w:val="20"/>
               </w:rPr>
             </w:r>
             <w:r>
               <w:rPr>
                 <w:rFonts w:ascii="Times New Roman" w:hAnsi="Times New Roman" w:eastAsia="Songti SC"/>
                 <w:b w:val="0"/>
-                <w:sz w:val="18"/>
+                <w:sz w:val="20"/>
               </w:rPr>
-              <w:t>基于哈希标识管理数据，支持多个URL、摘要核验和解包</w:t>
+              <w:t>Julia包内置</w:t>
+            </w:r>
+            <w:r>
+              <w:rPr>
+                <w:rFonts w:ascii="Consolas" w:hAnsi="Consolas" w:eastAsia="Songti SC"/>
+                <w:sz w:val="20"/>
+              </w:rPr>
+              <w:t>Artifacts.toml</w:t>
             </w:r>
           </w:p>
         </w:tc>
         <w:tc>
           <w:tcPr>
-            <w:tcW w:type="dxa" w:w="2665"/>
+            <w:tcW w:type="dxa" w:w="4156"/>
             <w:vAlign w:val="top"/>
             <w:tcMar>
-              <w:top w:w="70" w:type="dxa"/>
-              <w:start w:w="90" w:type="dxa"/>
-              <w:bottom w:w="70" w:type="dxa"/>
-              <w:end w:w="90" w:type="dxa"/>
+              <w:top w:w="90" w:type="dxa"/>
+              <w:start w:w="110" w:type="dxa"/>
+              <w:bottom w:w="90" w:type="dxa"/>
+              <w:end w:w="170" w:type="dxa"/>
             </w:tcMar>
+            <w:tcBorders>
+              <w:bottom w:val="single" w:sz="2" w:color="B8BDC4"/>
+            </w:tcBorders>
           </w:tcPr>
           <w:p>
             <w:pPr>
               <w:keepNext/>
               <w:keepLines/>
-              <w:spacing w:before="0" w:after="0" w:line="240" w:lineRule="auto"/>
+              <w:spacing w:before="0" w:after="0" w:line="252" w:lineRule="auto"/>
               <w:ind w:firstLine="0" w:left="0" w:right="0"/>
               <w:jc w:val="left"/>
             </w:pPr>
             <w:r>
               <w:rPr>
-                <w:sz w:val="18"/>
+                <w:sz w:val="20"/>
               </w:rPr>
             </w:r>
             <w:r>
               <w:rPr>
                 <w:rFonts w:ascii="Times New Roman" w:hAnsi="Times New Roman" w:eastAsia="Songti SC"/>
                 <w:b w:val="0"/>
-                <w:sz w:val="18"/>
+                <w:sz w:val="20"/>
               </w:rPr>
-              <w:t>直接NetCDF获取、多镜像回退、临时文件核验后更新正式文件</w:t>
+              <w:t>独立</w:t>
             </w:r>
-          </w:p>
-        </w:tc>
-        <w:tc>
-          <w:tcPr>
-            <w:tcW w:type="dxa" w:w="2438"/>
-            <w:vAlign w:val="top"/>
-            <w:tcMar>
-              <w:top w:w="70" w:type="dxa"/>
-              <w:start w:w="90" w:type="dxa"/>
-              <w:bottom w:w="70" w:type="dxa"/>
-              <w:end w:w="90" w:type="dxa"/>
-            </w:tcMar>
-          </w:tcPr>
-          <w:p>
-            <w:pPr>
-              <w:keepNext/>
-              <w:keepLines/>
-              <w:spacing w:before="0" w:after="0" w:line="240" w:lineRule="auto"/>
-              <w:ind w:firstLine="0" w:left="0" w:right="0"/>
-              <w:jc w:val="left"/>
-            </w:pPr>
             <w:r>
               <w:rPr>
-                <w:sz w:val="18"/>
+                <w:rFonts w:ascii="Consolas" w:hAnsi="Consolas" w:eastAsia="Songti SC"/>
+                <w:sz w:val="20"/>
               </w:rPr>
+              <w:t>Artifacts.yaml</w:t>
             </w:r>
             <w:r>
               <w:rPr>
                 <w:rFonts w:ascii="Times New Roman" w:hAnsi="Times New Roman" w:eastAsia="Songti SC"/>
                 <w:b w:val="0"/>
-                <w:sz w:val="18"/>
+                <w:sz w:val="20"/>
               </w:rPr>
-              <w:t>简化获取步骤，并保持镜像切换时的文件内容一致</w:t>
+              <w:t>，与软件版本分别更新</w:t>
             </w:r>
           </w:p>
         </w:tc>
@@ -1334,182 +1206,112 @@
         </w:trPr>
         <w:tc>
           <w:tcPr>
-            <w:tcW w:type="dxa" w:w="1417"/>
-            <w:vAlign w:val="center"/>
+            <w:tcW w:type="dxa" w:w="1502"/>
+            <w:vAlign w:val="top"/>
             <w:tcMar>
-              <w:top w:w="70" w:type="dxa"/>
-              <w:start w:w="90" w:type="dxa"/>
-              <w:bottom w:w="70" w:type="dxa"/>
-              <w:end w:w="90" w:type="dxa"/>
+              <w:top w:w="90" w:type="dxa"/>
+              <w:start w:w="110" w:type="dxa"/>
+              <w:bottom w:w="90" w:type="dxa"/>
+              <w:end w:w="170" w:type="dxa"/>
             </w:tcMar>
+            <w:tcBorders>
+              <w:bottom w:val="single" w:sz="2" w:color="B8BDC4"/>
+            </w:tcBorders>
           </w:tcPr>
           <w:p>
             <w:pPr>
               <w:keepNext/>
               <w:keepLines/>
-              <w:spacing w:before="0" w:after="0" w:line="240" w:lineRule="auto"/>
+              <w:spacing w:before="0" w:after="0" w:line="252" w:lineRule="auto"/>
               <w:ind w:firstLine="0" w:left="0" w:right="0"/>
-              <w:jc w:val="center"/>
+              <w:jc w:val="left"/>
             </w:pPr>
             <w:r>
               <w:rPr>
-                <w:sz w:val="18"/>
+                <w:sz w:val="20"/>
               </w:rPr>
             </w:r>
             <w:r>
               <w:rPr>
                 <w:rFonts w:ascii="Times New Roman" w:hAnsi="Times New Roman" w:eastAsia="Songti SC"/>
                 <w:b w:val="0"/>
-                <w:sz w:val="18"/>
+                <w:sz w:val="20"/>
               </w:rPr>
-              <w:t>数据读取接口</w:t>
+              <w:t>文件获取</w:t>
             </w:r>
           </w:p>
         </w:tc>
         <w:tc>
           <w:tcPr>
-            <w:tcW w:type="dxa" w:w="2324"/>
+            <w:tcW w:type="dxa" w:w="3186"/>
             <w:vAlign w:val="top"/>
             <w:tcMar>
-              <w:top w:w="70" w:type="dxa"/>
-              <w:start w:w="90" w:type="dxa"/>
-              <w:bottom w:w="70" w:type="dxa"/>
-              <w:end w:w="90" w:type="dxa"/>
+              <w:top w:w="90" w:type="dxa"/>
+              <w:start w:w="110" w:type="dxa"/>
+              <w:bottom w:w="90" w:type="dxa"/>
+              <w:end w:w="170" w:type="dxa"/>
             </w:tcMar>
+            <w:tcBorders>
+              <w:bottom w:val="single" w:sz="2" w:color="B8BDC4"/>
+            </w:tcBorders>
           </w:tcPr>
           <w:p>
             <w:pPr>
               <w:keepNext/>
               <w:keepLines/>
-              <w:spacing w:before="0" w:after="0" w:line="240" w:lineRule="auto"/>
+              <w:spacing w:before="0" w:after="0" w:line="252" w:lineRule="auto"/>
               <w:ind w:firstLine="0" w:left="0" w:right="0"/>
               <w:jc w:val="left"/>
             </w:pPr>
             <w:r>
               <w:rPr>
-                <w:sz w:val="18"/>
+                <w:sz w:val="20"/>
               </w:rPr>
             </w:r>
             <w:r>
               <w:rPr>
                 <w:rFonts w:ascii="Times New Roman" w:hAnsi="Times New Roman" w:eastAsia="Songti SC"/>
                 <w:b w:val="0"/>
-                <w:sz w:val="18"/>
+                <w:sz w:val="20"/>
               </w:rPr>
-              <w:t>以</w:t>
-            </w:r>
-            <w:r>
-              <w:rPr>
-                <w:rFonts w:ascii="Consolas" w:hAnsi="Consolas" w:eastAsia="Songti SC"/>
-                <w:sz w:val="18"/>
-              </w:rPr>
-              <w:t>read_LUT</w:t>
-            </w:r>
-            <w:r>
-              <w:rPr>
-                <w:rFonts w:ascii="Times New Roman" w:hAnsi="Times New Roman" w:eastAsia="Songti SC"/>
-                <w:b w:val="0"/>
-                <w:sz w:val="18"/>
-              </w:rPr>
-              <w:t>提供全域网格、周期切片和指定格点读取</w:t>
+              <w:t>多URL下载、哈希核验及解包</w:t>
             </w:r>
           </w:p>
         </w:tc>
         <w:tc>
           <w:tcPr>
-            <w:tcW w:type="dxa" w:w="2665"/>
+            <w:tcW w:type="dxa" w:w="4156"/>
             <w:vAlign w:val="top"/>
             <w:tcMar>
-              <w:top w:w="70" w:type="dxa"/>
-              <w:start w:w="90" w:type="dxa"/>
-              <w:bottom w:w="70" w:type="dxa"/>
-              <w:end w:w="90" w:type="dxa"/>
+              <w:top w:w="90" w:type="dxa"/>
+              <w:start w:w="110" w:type="dxa"/>
+              <w:bottom w:w="90" w:type="dxa"/>
+              <w:end w:w="170" w:type="dxa"/>
             </w:tcMar>
+            <w:tcBorders>
+              <w:bottom w:val="single" w:sz="2" w:color="B8BDC4"/>
+            </w:tcBorders>
           </w:tcPr>
           <w:p>
             <w:pPr>
               <w:keepNext/>
               <w:keepLines/>
-              <w:spacing w:before="0" w:after="0" w:line="240" w:lineRule="auto"/>
+              <w:spacing w:before="0" w:after="0" w:line="252" w:lineRule="auto"/>
               <w:ind w:firstLine="0" w:left="0" w:right="0"/>
               <w:jc w:val="left"/>
             </w:pPr>
             <w:r>
               <w:rPr>
-                <w:sz w:val="18"/>
+                <w:sz w:val="20"/>
               </w:rPr>
             </w:r>
             <w:r>
               <w:rPr>
                 <w:rFonts w:ascii="Times New Roman" w:hAnsi="Times New Roman" w:eastAsia="Songti SC"/>
                 <w:b w:val="0"/>
-                <w:sz w:val="18"/>
+                <w:sz w:val="20"/>
               </w:rPr>
-              <w:t>以</w:t>
-            </w:r>
-            <w:r>
-              <w:rPr>
-                <w:rFonts w:ascii="Consolas" w:hAnsi="Consolas" w:eastAsia="Songti SC"/>
-                <w:sz w:val="18"/>
-              </w:rPr>
-              <w:t>read_dataset</w:t>
-            </w:r>
-            <w:r>
-              <w:rPr>
-                <w:rFonts w:ascii="Times New Roman" w:hAnsi="Times New Roman" w:eastAsia="Songti SC"/>
-                <w:b w:val="0"/>
-                <w:sz w:val="18"/>
-              </w:rPr>
-              <w:t>统一读取入口，保留</w:t>
-            </w:r>
-            <w:r>
-              <w:rPr>
-                <w:rFonts w:ascii="Consolas" w:hAnsi="Consolas" w:eastAsia="Songti SC"/>
-                <w:sz w:val="18"/>
-              </w:rPr>
-              <w:t>read_LUT</w:t>
-            </w:r>
-            <w:r>
-              <w:rPr>
-                <w:rFonts w:ascii="Times New Roman" w:hAnsi="Times New Roman" w:eastAsia="Songti SC"/>
-                <w:b w:val="0"/>
-                <w:sz w:val="18"/>
-              </w:rPr>
-              <w:t>兼容名称，并衔接参数与气象输入组织</w:t>
-            </w:r>
-          </w:p>
-        </w:tc>
-        <w:tc>
-          <w:tcPr>
-            <w:tcW w:type="dxa" w:w="2438"/>
-            <w:vAlign w:val="top"/>
-            <w:tcMar>
-              <w:top w:w="70" w:type="dxa"/>
-              <w:start w:w="90" w:type="dxa"/>
-              <w:bottom w:w="70" w:type="dxa"/>
-              <w:end w:w="90" w:type="dxa"/>
-            </w:tcMar>
-          </w:tcPr>
-          <w:p>
-            <w:pPr>
-              <w:keepNext/>
-              <w:keepLines/>
-              <w:spacing w:before="0" w:after="0" w:line="240" w:lineRule="auto"/>
-              <w:ind w:firstLine="0" w:left="0" w:right="0"/>
-              <w:jc w:val="left"/>
-            </w:pPr>
-            <w:r>
-              <w:rPr>
-                <w:sz w:val="18"/>
-              </w:rPr>
-            </w:r>
-            <w:r>
-              <w:rPr>
-                <w:rFonts w:ascii="Times New Roman" w:hAnsi="Times New Roman" w:eastAsia="Songti SC"/>
-                <w:b w:val="0"/>
-                <w:sz w:val="18"/>
-              </w:rPr>
-              <w:t>沿用已有读取方式，为模式输入组织提供基础，并降低旧接口迁移成本</w:t>
+              <w:t>多镜像回退，临时文件核验后更新正式文件</w:t>
             </w:r>
           </w:p>
         </w:tc>
@@ -1520,137 +1322,133 @@
         </w:trPr>
         <w:tc>
           <w:tcPr>
-            <w:tcW w:type="dxa" w:w="1417"/>
-            <w:vAlign w:val="center"/>
+            <w:tcW w:type="dxa" w:w="1502"/>
+            <w:vAlign w:val="top"/>
             <w:tcMar>
-              <w:top w:w="70" w:type="dxa"/>
-              <w:start w:w="90" w:type="dxa"/>
-              <w:bottom w:w="70" w:type="dxa"/>
-              <w:end w:w="90" w:type="dxa"/>
+              <w:top w:w="90" w:type="dxa"/>
+              <w:start w:w="110" w:type="dxa"/>
+              <w:bottom w:w="90" w:type="dxa"/>
+              <w:end w:w="170" w:type="dxa"/>
             </w:tcMar>
+            <w:tcBorders>
+              <w:bottom w:val="single" w:sz="2" w:color="B8BDC4"/>
+            </w:tcBorders>
           </w:tcPr>
           <w:p>
             <w:pPr>
               <w:keepNext/>
               <w:keepLines/>
-              <w:spacing w:before="0" w:after="0" w:line="240" w:lineRule="auto"/>
+              <w:spacing w:before="0" w:after="0" w:line="252" w:lineRule="auto"/>
               <w:ind w:firstLine="0" w:left="0" w:right="0"/>
-              <w:jc w:val="center"/>
+              <w:jc w:val="left"/>
             </w:pPr>
             <w:r>
               <w:rPr>
-                <w:sz w:val="18"/>
+                <w:sz w:val="20"/>
               </w:rPr>
             </w:r>
             <w:r>
               <w:rPr>
                 <w:rFonts w:ascii="Times New Roman" w:hAnsi="Times New Roman" w:eastAsia="Songti SC"/>
                 <w:b w:val="0"/>
-                <w:sz w:val="18"/>
+                <w:sz w:val="20"/>
               </w:rPr>
-              <w:t>多语言访问</w:t>
+              <w:t>数据读取</w:t>
             </w:r>
           </w:p>
         </w:tc>
         <w:tc>
           <w:tcPr>
-            <w:tcW w:type="dxa" w:w="2324"/>
+            <w:tcW w:type="dxa" w:w="3186"/>
             <w:vAlign w:val="top"/>
             <w:tcMar>
-              <w:top w:w="70" w:type="dxa"/>
-              <w:start w:w="90" w:type="dxa"/>
-              <w:bottom w:w="70" w:type="dxa"/>
-              <w:end w:w="90" w:type="dxa"/>
+              <w:top w:w="90" w:type="dxa"/>
+              <w:start w:w="110" w:type="dxa"/>
+              <w:bottom w:w="90" w:type="dxa"/>
+              <w:end w:w="170" w:type="dxa"/>
             </w:tcMar>
+            <w:tcBorders>
+              <w:bottom w:val="single" w:sz="2" w:color="B8BDC4"/>
+            </w:tcBorders>
           </w:tcPr>
           <w:p>
             <w:pPr>
               <w:keepNext/>
               <w:keepLines/>
-              <w:spacing w:before="0" w:after="0" w:line="240" w:lineRule="auto"/>
+              <w:spacing w:before="0" w:after="0" w:line="252" w:lineRule="auto"/>
               <w:ind w:firstLine="0" w:left="0" w:right="0"/>
               <w:jc w:val="left"/>
             </w:pPr>
             <w:r>
               <w:rPr>
-                <w:sz w:val="18"/>
+                <w:sz w:val="20"/>
               </w:rPr>
+            </w:r>
+            <w:r>
+              <w:rPr>
+                <w:rFonts w:ascii="Consolas" w:hAnsi="Consolas" w:eastAsia="Songti SC"/>
+                <w:sz w:val="20"/>
+              </w:rPr>
+              <w:t>read_LUT</w:t>
             </w:r>
             <w:r>
               <w:rPr>
                 <w:rFonts w:ascii="Times New Roman" w:hAnsi="Times New Roman" w:eastAsia="Songti SC"/>
                 <w:b w:val="0"/>
-                <w:sz w:val="18"/>
+                <w:sz w:val="20"/>
               </w:rPr>
-              <w:t>提供Julia、Matlab、Octave、Python和R接口</w:t>
+              <w:t>提供全域网格、周期切片及格点读取</w:t>
             </w:r>
           </w:p>
         </w:tc>
         <w:tc>
           <w:tcPr>
-            <w:tcW w:type="dxa" w:w="2665"/>
+            <w:tcW w:type="dxa" w:w="4156"/>
             <w:vAlign w:val="top"/>
             <w:tcMar>
-              <w:top w:w="70" w:type="dxa"/>
-              <w:start w:w="90" w:type="dxa"/>
-              <w:bottom w:w="70" w:type="dxa"/>
-              <w:end w:w="90" w:type="dxa"/>
+              <w:top w:w="90" w:type="dxa"/>
+              <w:start w:w="110" w:type="dxa"/>
+              <w:bottom w:w="90" w:type="dxa"/>
+              <w:end w:w="170" w:type="dxa"/>
             </w:tcMar>
+            <w:tcBorders>
+              <w:bottom w:val="single" w:sz="2" w:color="B8BDC4"/>
+            </w:tcBorders>
           </w:tcPr>
           <w:p>
             <w:pPr>
               <w:keepNext/>
               <w:keepLines/>
-              <w:spacing w:before="0" w:after="0" w:line="240" w:lineRule="auto"/>
+              <w:spacing w:before="0" w:after="0" w:line="252" w:lineRule="auto"/>
               <w:ind w:firstLine="0" w:left="0" w:right="0"/>
               <w:jc w:val="left"/>
             </w:pPr>
             <w:r>
               <w:rPr>
-                <w:sz w:val="18"/>
+                <w:sz w:val="20"/>
               </w:rPr>
+            </w:r>
+            <w:r>
+              <w:rPr>
+                <w:rFonts w:ascii="Consolas" w:hAnsi="Consolas" w:eastAsia="Songti SC"/>
+                <w:sz w:val="20"/>
+              </w:rPr>
+              <w:t>read_dataset</w:t>
             </w:r>
             <w:r>
               <w:rPr>
                 <w:rFonts w:ascii="Times New Roman" w:hAnsi="Times New Roman" w:eastAsia="Songti SC"/>
                 <w:b w:val="0"/>
-                <w:sz w:val="18"/>
+                <w:sz w:val="20"/>
               </w:rPr>
-              <w:t>完善Matlab、Octave、Python和R自动下载，新增C和Fortran支持；各下载入口均支持URL或数据标签调用及文件完整性核验</w:t>
-            </w:r>
-          </w:p>
-        </w:tc>
-        <w:tc>
-          <w:tcPr>
-            <w:tcW w:type="dxa" w:w="2438"/>
-            <w:vAlign w:val="top"/>
-            <w:tcMar>
-              <w:top w:w="70" w:type="dxa"/>
-              <w:start w:w="90" w:type="dxa"/>
-              <w:bottom w:w="70" w:type="dxa"/>
-              <w:end w:w="90" w:type="dxa"/>
-            </w:tcMar>
-          </w:tcPr>
-          <w:p>
-            <w:pPr>
-              <w:keepNext/>
-              <w:keepLines/>
-              <w:spacing w:before="0" w:after="0" w:line="240" w:lineRule="auto"/>
-              <w:ind w:firstLine="0" w:left="0" w:right="0"/>
-              <w:jc w:val="left"/>
-            </w:pPr>
-            <w:r>
-              <w:rPr>
-                <w:sz w:val="18"/>
-              </w:rPr>
+              <w:t>统一读取入口，兼容</w:t>
             </w:r>
             <w:r>
               <w:rPr>
-                <w:rFonts w:ascii="Times New Roman" w:hAnsi="Times New Roman" w:eastAsia="Songti SC"/>
-                <w:b w:val="0"/>
-                <w:sz w:val="18"/>
+                <w:rFonts w:ascii="Consolas" w:hAnsi="Consolas" w:eastAsia="Songti SC"/>
+                <w:sz w:val="20"/>
               </w:rPr>
-              <w:t>不同科研编程环境共享数据获取方式与内容核验规则</w:t>
+              <w:t>read_LUT</w:t>
             </w:r>
           </w:p>
         </w:tc>
@@ -1661,137 +1459,112 @@
         </w:trPr>
         <w:tc>
           <w:tcPr>
-            <w:tcW w:type="dxa" w:w="1417"/>
-            <w:vAlign w:val="center"/>
+            <w:tcW w:type="dxa" w:w="1502"/>
+            <w:vAlign w:val="top"/>
             <w:tcMar>
-              <w:top w:w="70" w:type="dxa"/>
-              <w:start w:w="90" w:type="dxa"/>
-              <w:bottom w:w="70" w:type="dxa"/>
-              <w:end w:w="90" w:type="dxa"/>
+              <w:top w:w="90" w:type="dxa"/>
+              <w:start w:w="110" w:type="dxa"/>
+              <w:bottom w:w="90" w:type="dxa"/>
+              <w:end w:w="170" w:type="dxa"/>
             </w:tcMar>
+            <w:tcBorders>
+              <w:bottom w:val="single" w:sz="2" w:color="B8BDC4"/>
+            </w:tcBorders>
           </w:tcPr>
           <w:p>
             <w:pPr>
               <w:keepNext/>
               <w:keepLines/>
-              <w:spacing w:before="0" w:after="0" w:line="240" w:lineRule="auto"/>
+              <w:spacing w:before="0" w:after="0" w:line="252" w:lineRule="auto"/>
               <w:ind w:firstLine="0" w:left="0" w:right="0"/>
-              <w:jc w:val="center"/>
+              <w:jc w:val="left"/>
             </w:pPr>
             <w:r>
               <w:rPr>
-                <w:sz w:val="18"/>
+                <w:sz w:val="20"/>
               </w:rPr>
             </w:r>
             <w:r>
               <w:rPr>
                 <w:rFonts w:ascii="Times New Roman" w:hAnsi="Times New Roman" w:eastAsia="Songti SC"/>
                 <w:b w:val="0"/>
-                <w:sz w:val="18"/>
+                <w:sz w:val="20"/>
               </w:rPr>
-              <w:t>模式组织</w:t>
+              <w:t>模式输入</w:t>
             </w:r>
           </w:p>
         </w:tc>
         <w:tc>
           <w:tcPr>
-            <w:tcW w:type="dxa" w:w="2324"/>
+            <w:tcW w:type="dxa" w:w="3186"/>
             <w:vAlign w:val="top"/>
             <w:tcMar>
-              <w:top w:w="70" w:type="dxa"/>
-              <w:start w:w="90" w:type="dxa"/>
-              <w:bottom w:w="70" w:type="dxa"/>
-              <w:end w:w="90" w:type="dxa"/>
+              <w:top w:w="90" w:type="dxa"/>
+              <w:start w:w="110" w:type="dxa"/>
+              <w:bottom w:w="90" w:type="dxa"/>
+              <w:end w:w="170" w:type="dxa"/>
             </w:tcMar>
+            <w:tcBorders>
+              <w:bottom w:val="single" w:sz="2" w:color="B8BDC4"/>
+            </w:tcBorders>
           </w:tcPr>
           <w:p>
             <w:pPr>
               <w:keepNext/>
               <w:keepLines/>
-              <w:spacing w:before="0" w:after="0" w:line="240" w:lineRule="auto"/>
+              <w:spacing w:before="0" w:after="0" w:line="252" w:lineRule="auto"/>
               <w:ind w:firstLine="0" w:left="0" w:right="0"/>
               <w:jc w:val="left"/>
             </w:pPr>
             <w:r>
               <w:rPr>
-                <w:sz w:val="18"/>
+                <w:sz w:val="20"/>
               </w:rPr>
             </w:r>
             <w:r>
               <w:rPr>
                 <w:rFonts w:ascii="Times New Roman" w:hAnsi="Times New Roman" w:eastAsia="Songti SC"/>
                 <w:b w:val="0"/>
-                <w:sz w:val="18"/>
+                <w:sz w:val="20"/>
               </w:rPr>
-              <w:t>标准化数据和通用读取</w:t>
+              <w:t>标准化数据与通用读取</w:t>
             </w:r>
           </w:p>
         </w:tc>
         <w:tc>
           <w:tcPr>
-            <w:tcW w:type="dxa" w:w="2665"/>
+            <w:tcW w:type="dxa" w:w="4156"/>
             <w:vAlign w:val="top"/>
             <w:tcMar>
-              <w:top w:w="70" w:type="dxa"/>
-              <w:start w:w="90" w:type="dxa"/>
-              <w:bottom w:w="70" w:type="dxa"/>
-              <w:end w:w="90" w:type="dxa"/>
+              <w:top w:w="90" w:type="dxa"/>
+              <w:start w:w="110" w:type="dxa"/>
+              <w:bottom w:w="90" w:type="dxa"/>
+              <w:end w:w="170" w:type="dxa"/>
             </w:tcMar>
+            <w:tcBorders>
+              <w:bottom w:val="single" w:sz="2" w:color="B8BDC4"/>
+            </w:tcBorders>
           </w:tcPr>
           <w:p>
             <w:pPr>
               <w:keepNext/>
               <w:keepLines/>
-              <w:spacing w:before="0" w:after="0" w:line="240" w:lineRule="auto"/>
+              <w:spacing w:before="0" w:after="0" w:line="252" w:lineRule="auto"/>
               <w:ind w:firstLine="0" w:left="0" w:right="0"/>
               <w:jc w:val="left"/>
             </w:pPr>
             <w:r>
               <w:rPr>
-                <w:sz w:val="18"/>
+                <w:sz w:val="20"/>
               </w:rPr>
             </w:r>
             <w:r>
               <w:rPr>
                 <w:rFonts w:ascii="Times New Roman" w:hAnsi="Times New Roman" w:eastAsia="Songti SC"/>
                 <w:b w:val="0"/>
-                <w:sz w:val="18"/>
+                <w:sz w:val="20"/>
               </w:rPr>
-              <w:t>陆面参数融合与气象驱动组织</w:t>
-            </w:r>
-          </w:p>
-        </w:tc>
-        <w:tc>
-          <w:tcPr>
-            <w:tcW w:type="dxa" w:w="2438"/>
-            <w:vAlign w:val="top"/>
-            <w:tcMar>
-              <w:top w:w="70" w:type="dxa"/>
-              <w:start w:w="90" w:type="dxa"/>
-              <w:bottom w:w="70" w:type="dxa"/>
-              <w:end w:w="90" w:type="dxa"/>
-            </w:tcMar>
-          </w:tcPr>
-          <w:p>
-            <w:pPr>
-              <w:keepNext/>
-              <w:keepLines/>
-              <w:spacing w:before="0" w:after="0" w:line="240" w:lineRule="auto"/>
-              <w:ind w:firstLine="0" w:left="0" w:right="0"/>
-              <w:jc w:val="left"/>
-            </w:pPr>
-            <w:r>
-              <w:rPr>
-                <w:sz w:val="18"/>
-              </w:rPr>
-            </w:r>
-            <w:r>
-              <w:rPr>
-                <w:rFonts w:ascii="Times New Roman" w:hAnsi="Times New Roman" w:eastAsia="Songti SC"/>
-                <w:b w:val="0"/>
-                <w:sz w:val="18"/>
-              </w:rPr>
-              <w:t>标准化数据进入Emerald参数组织与模式初始化</w:t>
+              <w:t>陆面参数融合、气象驱动组织及Emerald接口</w:t>
             </w:r>
           </w:p>
         </w:tc>
@@ -1802,137 +1575,103 @@
         </w:trPr>
         <w:tc>
           <w:tcPr>
-            <w:tcW w:type="dxa" w:w="1417"/>
-            <w:vAlign w:val="center"/>
+            <w:tcW w:type="dxa" w:w="1502"/>
+            <w:vAlign w:val="top"/>
             <w:tcMar>
-              <w:top w:w="70" w:type="dxa"/>
-              <w:start w:w="90" w:type="dxa"/>
-              <w:bottom w:w="70" w:type="dxa"/>
-              <w:end w:w="90" w:type="dxa"/>
+              <w:top w:w="90" w:type="dxa"/>
+              <w:start w:w="110" w:type="dxa"/>
+              <w:bottom w:w="90" w:type="dxa"/>
+              <w:end w:w="170" w:type="dxa"/>
             </w:tcMar>
           </w:tcPr>
           <w:p>
             <w:pPr>
               <w:keepNext w:val="0"/>
               <w:keepLines/>
-              <w:spacing w:before="0" w:after="0" w:line="240" w:lineRule="auto"/>
+              <w:spacing w:before="0" w:after="0" w:line="252" w:lineRule="auto"/>
               <w:ind w:firstLine="0" w:left="0" w:right="0"/>
-              <w:jc w:val="center"/>
+              <w:jc w:val="left"/>
             </w:pPr>
             <w:r>
               <w:rPr>
-                <w:sz w:val="18"/>
+                <w:sz w:val="20"/>
               </w:rPr>
             </w:r>
             <w:r>
               <w:rPr>
                 <w:rFonts w:ascii="Times New Roman" w:hAnsi="Times New Roman" w:eastAsia="Songti SC"/>
                 <w:b w:val="0"/>
-                <w:sz w:val="18"/>
+                <w:sz w:val="20"/>
               </w:rPr>
-              <w:t>数据生产</w:t>
+              <w:t>多语言获取</w:t>
             </w:r>
           </w:p>
         </w:tc>
         <w:tc>
           <w:tcPr>
-            <w:tcW w:type="dxa" w:w="2324"/>
+            <w:tcW w:type="dxa" w:w="3186"/>
             <w:vAlign w:val="top"/>
             <w:tcMar>
-              <w:top w:w="70" w:type="dxa"/>
-              <w:start w:w="90" w:type="dxa"/>
-              <w:bottom w:w="70" w:type="dxa"/>
-              <w:end w:w="90" w:type="dxa"/>
+              <w:top w:w="90" w:type="dxa"/>
+              <w:start w:w="110" w:type="dxa"/>
+              <w:bottom w:w="90" w:type="dxa"/>
+              <w:end w:w="170" w:type="dxa"/>
             </w:tcMar>
           </w:tcPr>
           <w:p>
             <w:pPr>
               <w:keepNext w:val="0"/>
               <w:keepLines/>
-              <w:spacing w:before="0" w:after="0" w:line="240" w:lineRule="auto"/>
+              <w:spacing w:before="0" w:after="0" w:line="252" w:lineRule="auto"/>
               <w:ind w:firstLine="0" w:left="0" w:right="0"/>
               <w:jc w:val="left"/>
             </w:pPr>
             <w:r>
               <w:rPr>
-                <w:sz w:val="18"/>
+                <w:sz w:val="20"/>
               </w:rPr>
             </w:r>
             <w:r>
               <w:rPr>
                 <w:rFonts w:ascii="Times New Roman" w:hAnsi="Times New Roman" w:eastAsia="Songti SC"/>
                 <w:b w:val="0"/>
-                <w:sz w:val="18"/>
+                <w:sz w:val="20"/>
               </w:rPr>
-              <w:t>数据源专用处理及贡献流程</w:t>
+              <w:t>Julia、Matlab、Octave、Python和R接口</w:t>
             </w:r>
           </w:p>
         </w:tc>
         <w:tc>
           <w:tcPr>
-            <w:tcW w:type="dxa" w:w="2665"/>
+            <w:tcW w:type="dxa" w:w="4156"/>
             <w:vAlign w:val="top"/>
             <w:tcMar>
-              <w:top w:w="70" w:type="dxa"/>
-              <w:start w:w="90" w:type="dxa"/>
-              <w:bottom w:w="70" w:type="dxa"/>
-              <w:end w:w="90" w:type="dxa"/>
+              <w:top w:w="90" w:type="dxa"/>
+              <w:start w:w="110" w:type="dxa"/>
+              <w:bottom w:w="90" w:type="dxa"/>
+              <w:end w:w="170" w:type="dxa"/>
             </w:tcMar>
           </w:tcPr>
           <w:p>
             <w:pPr>
               <w:keepNext w:val="0"/>
               <w:keepLines/>
-              <w:spacing w:before="0" w:after="0" w:line="240" w:lineRule="auto"/>
+              <w:spacing w:before="0" w:after="0" w:line="252" w:lineRule="auto"/>
               <w:ind w:firstLine="0" w:left="0" w:right="0"/>
               <w:jc w:val="left"/>
             </w:pPr>
             <w:r>
               <w:rPr>
-                <w:sz w:val="18"/>
+                <w:sz w:val="20"/>
               </w:rPr>
             </w:r>
             <w:r>
               <w:rPr>
                 <w:rFonts w:ascii="Times New Roman" w:hAnsi="Times New Roman" w:eastAsia="Songti SC"/>
                 <w:b w:val="0"/>
-                <w:sz w:val="18"/>
+                <w:sz w:val="20"/>
               </w:rPr>
-              <w:t>共享YAML配置规范、程序化与交互式配置生成及显式源维度映射</w:t>
-            </w:r>
-          </w:p>
-        </w:tc>
-        <w:tc>
-          <w:tcPr>
-            <w:tcW w:type="dxa" w:w="2438"/>
-            <w:vAlign w:val="top"/>
-            <w:tcMar>
-              <w:top w:w="70" w:type="dxa"/>
-              <w:start w:w="90" w:type="dxa"/>
-              <w:bottom w:w="70" w:type="dxa"/>
-              <w:end w:w="90" w:type="dxa"/>
-            </w:tcMar>
-          </w:tcPr>
-          <w:p>
-            <w:pPr>
-              <w:keepNext w:val="0"/>
-              <w:keepLines/>
-              <w:spacing w:before="0" w:after="0" w:line="240" w:lineRule="auto"/>
-              <w:ind w:firstLine="0" w:left="0" w:right="0"/>
-              <w:jc w:val="left"/>
-            </w:pPr>
-            <w:r>
-              <w:rPr>
-                <w:sz w:val="18"/>
-              </w:rPr>
-            </w:r>
-            <w:r>
-              <w:rPr>
-                <w:rFonts w:ascii="Times New Roman" w:hAnsi="Times New Roman" w:eastAsia="Songti SC"/>
-                <w:b w:val="0"/>
-                <w:sz w:val="18"/>
-              </w:rPr>
-              <w:t>形成共享的标准化数据生产工作流</w:t>
+              <w:t>完善原有下载支持，新增C和Fortran；各下载入口支持URL、标签与完整性核验</w:t>
             </w:r>
           </w:p>
         </w:tc>
@@ -2047,13 +1786,6 @@
           <w:b/>
         </w:rPr>
         <w:t>Table 2 Standardized NetCDF data and metadata requirements of GriddingMachine.</w:t>
-      </w:r>
-      <w:r>
-        <w:rPr>
-          <w:rFonts w:ascii="Times New Roman" w:hAnsi="Times New Roman" w:eastAsia="Songti SC"/>
-          <w:b w:val="0"/>
-        </w:rPr>
-        <w:t xml:space="preserve"> The specification connects grid structure, gap filling, metadata, provenance, versioning, and distribution integrity within a unified standardization workflow.</w:t>
       </w:r>
     </w:p>
     <w:tbl>
@@ -2072,9 +1804,8 @@
         </w:tblBorders>
       </w:tblPr>
       <w:tblGrid>
-        <w:gridCol w:w="1928"/>
-        <w:gridCol w:w="3969"/>
-        <w:gridCol w:w="2948"/>
+        <w:gridCol w:w="1769"/>
+        <w:gridCol w:w="7075"/>
       </w:tblGrid>
       <w:tr>
         <w:trPr>
@@ -2083,13 +1814,13 @@
         </w:trPr>
         <w:tc>
           <w:tcPr>
-            <w:tcW w:type="dxa" w:w="1928"/>
-            <w:vAlign w:val="center"/>
+            <w:tcW w:type="dxa" w:w="1769"/>
+            <w:vAlign w:val="top"/>
             <w:tcMar>
-              <w:top w:w="70" w:type="dxa"/>
-              <w:start w:w="90" w:type="dxa"/>
-              <w:bottom w:w="70" w:type="dxa"/>
-              <w:end w:w="90" w:type="dxa"/>
+              <w:top w:w="90" w:type="dxa"/>
+              <w:start w:w="110" w:type="dxa"/>
+              <w:bottom w:w="90" w:type="dxa"/>
+              <w:end w:w="170" w:type="dxa"/>
             </w:tcMar>
             <w:tcBorders>
               <w:bottom w:val="single" w:sz="6" w:color="6B7280"/>
@@ -2099,35 +1830,35 @@
             <w:pPr>
               <w:keepNext/>
               <w:keepLines/>
-              <w:spacing w:before="0" w:after="0" w:line="240" w:lineRule="auto"/>
+              <w:spacing w:before="0" w:after="0" w:line="252" w:lineRule="auto"/>
               <w:ind w:firstLine="0" w:left="0" w:right="0"/>
-              <w:jc w:val="center"/>
+              <w:jc w:val="left"/>
             </w:pPr>
             <w:r>
               <w:rPr>
                 <w:b/>
-                <w:sz w:val="18"/>
+                <w:sz w:val="20"/>
               </w:rPr>
             </w:r>
             <w:r>
               <w:rPr>
                 <w:rFonts w:ascii="Times New Roman" w:hAnsi="Times New Roman" w:eastAsia="Songti SC"/>
                 <w:b/>
-                <w:sz w:val="18"/>
+                <w:sz w:val="20"/>
               </w:rPr>
-              <w:t>类别</w:t>
+              <w:t>规范要素</w:t>
             </w:r>
           </w:p>
         </w:tc>
         <w:tc>
           <w:tcPr>
-            <w:tcW w:type="dxa" w:w="3969"/>
-            <w:vAlign w:val="center"/>
+            <w:tcW w:type="dxa" w:w="7075"/>
+            <w:vAlign w:val="top"/>
             <w:tcMar>
-              <w:top w:w="70" w:type="dxa"/>
-              <w:start w:w="90" w:type="dxa"/>
-              <w:bottom w:w="70" w:type="dxa"/>
-              <w:end w:w="90" w:type="dxa"/>
+              <w:top w:w="90" w:type="dxa"/>
+              <w:start w:w="110" w:type="dxa"/>
+              <w:bottom w:w="90" w:type="dxa"/>
+              <w:end w:w="170" w:type="dxa"/>
             </w:tcMar>
             <w:tcBorders>
               <w:bottom w:val="single" w:sz="6" w:color="6B7280"/>
@@ -2137,61 +1868,23 @@
             <w:pPr>
               <w:keepNext/>
               <w:keepLines/>
-              <w:spacing w:before="0" w:after="0" w:line="240" w:lineRule="auto"/>
+              <w:spacing w:before="0" w:after="0" w:line="252" w:lineRule="auto"/>
               <w:ind w:firstLine="0" w:left="0" w:right="0"/>
-              <w:jc w:val="center"/>
+              <w:jc w:val="left"/>
             </w:pPr>
             <w:r>
               <w:rPr>
                 <w:b/>
-                <w:sz w:val="18"/>
+                <w:sz w:val="20"/>
               </w:rPr>
             </w:r>
             <w:r>
               <w:rPr>
                 <w:rFonts w:ascii="Times New Roman" w:hAnsi="Times New Roman" w:eastAsia="Songti SC"/>
                 <w:b/>
-                <w:sz w:val="18"/>
+                <w:sz w:val="20"/>
               </w:rPr>
-              <w:t>新版规范</w:t>
-            </w:r>
-          </w:p>
-        </w:tc>
-        <w:tc>
-          <w:tcPr>
-            <w:tcW w:type="dxa" w:w="2948"/>
-            <w:vAlign w:val="center"/>
-            <w:tcMar>
-              <w:top w:w="70" w:type="dxa"/>
-              <w:start w:w="90" w:type="dxa"/>
-              <w:bottom w:w="70" w:type="dxa"/>
-              <w:end w:w="90" w:type="dxa"/>
-            </w:tcMar>
-            <w:tcBorders>
-              <w:bottom w:val="single" w:sz="6" w:color="6B7280"/>
-            </w:tcBorders>
-          </w:tcPr>
-          <w:p>
-            <w:pPr>
-              <w:keepNext/>
-              <w:keepLines/>
-              <w:spacing w:before="0" w:after="0" w:line="240" w:lineRule="auto"/>
-              <w:ind w:firstLine="0" w:left="0" w:right="0"/>
-              <w:jc w:val="center"/>
-            </w:pPr>
-            <w:r>
-              <w:rPr>
-                <w:b/>
-                <w:sz w:val="18"/>
-              </w:rPr>
-            </w:r>
-            <w:r>
-              <w:rPr>
-                <w:rFonts w:ascii="Times New Roman" w:hAnsi="Times New Roman" w:eastAsia="Songti SC"/>
-                <w:b/>
-                <w:sz w:val="18"/>
-              </w:rPr>
-              <w:t>实现方式</w:t>
+              <w:t>统一约定</w:t>
             </w:r>
           </w:p>
         </w:tc>
@@ -2202,33 +1895,36 @@
         </w:trPr>
         <w:tc>
           <w:tcPr>
-            <w:tcW w:type="dxa" w:w="1928"/>
-            <w:vAlign w:val="center"/>
+            <w:tcW w:type="dxa" w:w="1769"/>
+            <w:vAlign w:val="top"/>
             <w:tcMar>
-              <w:top w:w="70" w:type="dxa"/>
-              <w:start w:w="90" w:type="dxa"/>
-              <w:bottom w:w="70" w:type="dxa"/>
-              <w:end w:w="90" w:type="dxa"/>
+              <w:top w:w="90" w:type="dxa"/>
+              <w:start w:w="110" w:type="dxa"/>
+              <w:bottom w:w="90" w:type="dxa"/>
+              <w:end w:w="170" w:type="dxa"/>
             </w:tcMar>
+            <w:tcBorders>
+              <w:bottom w:val="single" w:sz="2" w:color="B8BDC4"/>
+            </w:tcBorders>
           </w:tcPr>
           <w:p>
             <w:pPr>
-              <w:keepNext w:val="0"/>
+              <w:keepNext/>
               <w:keepLines/>
-              <w:spacing w:before="0" w:after="0" w:line="240" w:lineRule="auto"/>
+              <w:spacing w:before="0" w:after="0" w:line="252" w:lineRule="auto"/>
               <w:ind w:firstLine="0" w:left="0" w:right="0"/>
-              <w:jc w:val="center"/>
+              <w:jc w:val="left"/>
             </w:pPr>
             <w:r>
               <w:rPr>
-                <w:sz w:val="18"/>
+                <w:sz w:val="20"/>
               </w:rPr>
             </w:r>
             <w:r>
               <w:rPr>
                 <w:rFonts w:ascii="Times New Roman" w:hAnsi="Times New Roman" w:eastAsia="Songti SC"/>
                 <w:b w:val="0"/>
-                <w:sz w:val="18"/>
+                <w:sz w:val="20"/>
               </w:rPr>
               <w:t>文件与网格</w:t>
             </w:r>
@@ -2236,84 +1932,38 @@
         </w:tc>
         <w:tc>
           <w:tcPr>
-            <w:tcW w:type="dxa" w:w="3969"/>
+            <w:tcW w:type="dxa" w:w="7075"/>
             <w:vAlign w:val="top"/>
             <w:tcMar>
-              <w:top w:w="70" w:type="dxa"/>
-              <w:start w:w="90" w:type="dxa"/>
-              <w:bottom w:w="70" w:type="dxa"/>
-              <w:end w:w="90" w:type="dxa"/>
+              <w:top w:w="90" w:type="dxa"/>
+              <w:start w:w="110" w:type="dxa"/>
+              <w:bottom w:w="90" w:type="dxa"/>
+              <w:end w:w="170" w:type="dxa"/>
             </w:tcMar>
+            <w:tcBorders>
+              <w:bottom w:val="single" w:sz="2" w:color="B8BDC4"/>
+            </w:tcBorders>
           </w:tcPr>
           <w:p>
             <w:pPr>
-              <w:keepNext w:val="0"/>
+              <w:keepNext/>
               <w:keepLines/>
-              <w:spacing w:before="0" w:after="0" w:line="240" w:lineRule="auto"/>
+              <w:spacing w:before="0" w:after="0" w:line="252" w:lineRule="auto"/>
               <w:ind w:firstLine="0" w:left="0" w:right="0"/>
               <w:jc w:val="left"/>
             </w:pPr>
             <w:r>
               <w:rPr>
-                <w:sz w:val="18"/>
+                <w:sz w:val="20"/>
               </w:rPr>
             </w:r>
             <w:r>
               <w:rPr>
                 <w:rFonts w:ascii="Times New Roman" w:hAnsi="Times New Roman" w:eastAsia="Songti SC"/>
                 <w:b w:val="0"/>
-                <w:sz w:val="18"/>
+                <w:sz w:val="20"/>
               </w:rPr>
-              <w:t>一个标签对应一个可直接读取的</w:t>
-            </w:r>
-            <w:r>
-              <w:rPr>
-                <w:rFonts w:ascii="Consolas" w:hAnsi="Consolas" w:eastAsia="Songti SC"/>
-                <w:sz w:val="18"/>
-              </w:rPr>
-              <w:t>.nc</w:t>
-            </w:r>
-            <w:r>
-              <w:rPr>
-                <w:rFonts w:ascii="Times New Roman" w:hAnsi="Times New Roman" w:eastAsia="Songti SC"/>
-                <w:b w:val="0"/>
-                <w:sz w:val="18"/>
-              </w:rPr>
-              <w:t>；规则经纬度网格，默认全球覆盖并声明坐标参考</w:t>
-            </w:r>
-          </w:p>
-        </w:tc>
-        <w:tc>
-          <w:tcPr>
-            <w:tcW w:type="dxa" w:w="2948"/>
-            <w:vAlign w:val="top"/>
-            <w:tcMar>
-              <w:top w:w="70" w:type="dxa"/>
-              <w:start w:w="90" w:type="dxa"/>
-              <w:bottom w:w="70" w:type="dxa"/>
-              <w:end w:w="90" w:type="dxa"/>
-            </w:tcMar>
-          </w:tcPr>
-          <w:p>
-            <w:pPr>
-              <w:keepNext w:val="0"/>
-              <w:keepLines/>
-              <w:spacing w:before="0" w:after="0" w:line="240" w:lineRule="auto"/>
-              <w:ind w:firstLine="0" w:left="0" w:right="0"/>
-              <w:jc w:val="left"/>
-            </w:pPr>
-            <w:r>
-              <w:rPr>
-                <w:sz w:val="18"/>
-              </w:rPr>
-            </w:r>
-            <w:r>
-              <w:rPr>
-                <w:rFonts w:ascii="Times New Roman" w:hAnsi="Times New Roman" w:eastAsia="Songti SC"/>
-                <w:b w:val="0"/>
-                <w:sz w:val="18"/>
-              </w:rPr>
-              <w:t>NetCDF统一保存数据、坐标与自描述元数据</w:t>
+              <w:t>一个标签对应一个NetCDF文件；采用规则经纬网，默认全球覆盖，并声明坐标参考</w:t>
             </w:r>
           </w:p>
         </w:tc>
@@ -2324,74 +1974,80 @@
         </w:trPr>
         <w:tc>
           <w:tcPr>
-            <w:tcW w:type="dxa" w:w="1928"/>
-            <w:vAlign w:val="center"/>
+            <w:tcW w:type="dxa" w:w="1769"/>
+            <w:vAlign w:val="top"/>
             <w:tcMar>
-              <w:top w:w="70" w:type="dxa"/>
-              <w:start w:w="90" w:type="dxa"/>
-              <w:bottom w:w="70" w:type="dxa"/>
-              <w:end w:w="90" w:type="dxa"/>
+              <w:top w:w="90" w:type="dxa"/>
+              <w:start w:w="110" w:type="dxa"/>
+              <w:bottom w:w="90" w:type="dxa"/>
+              <w:end w:w="170" w:type="dxa"/>
             </w:tcMar>
+            <w:tcBorders>
+              <w:bottom w:val="single" w:sz="2" w:color="B8BDC4"/>
+            </w:tcBorders>
           </w:tcPr>
           <w:p>
             <w:pPr>
-              <w:keepNext w:val="0"/>
+              <w:keepNext/>
               <w:keepLines/>
-              <w:spacing w:before="0" w:after="0" w:line="240" w:lineRule="auto"/>
+              <w:spacing w:before="0" w:after="0" w:line="252" w:lineRule="auto"/>
               <w:ind w:firstLine="0" w:left="0" w:right="0"/>
-              <w:jc w:val="center"/>
+              <w:jc w:val="left"/>
             </w:pPr>
             <w:r>
               <w:rPr>
-                <w:sz w:val="18"/>
+                <w:sz w:val="20"/>
               </w:rPr>
             </w:r>
             <w:r>
               <w:rPr>
                 <w:rFonts w:ascii="Times New Roman" w:hAnsi="Times New Roman" w:eastAsia="Songti SC"/>
                 <w:b w:val="0"/>
-                <w:sz w:val="18"/>
+                <w:sz w:val="20"/>
               </w:rPr>
-              <w:t>维度</w:t>
+              <w:t>维度顺序</w:t>
             </w:r>
           </w:p>
         </w:tc>
         <w:tc>
           <w:tcPr>
-            <w:tcW w:type="dxa" w:w="3969"/>
+            <w:tcW w:type="dxa" w:w="7075"/>
             <w:vAlign w:val="top"/>
             <w:tcMar>
-              <w:top w:w="70" w:type="dxa"/>
-              <w:start w:w="90" w:type="dxa"/>
-              <w:bottom w:w="70" w:type="dxa"/>
-              <w:end w:w="90" w:type="dxa"/>
+              <w:top w:w="90" w:type="dxa"/>
+              <w:start w:w="110" w:type="dxa"/>
+              <w:bottom w:w="90" w:type="dxa"/>
+              <w:end w:w="170" w:type="dxa"/>
             </w:tcMar>
+            <w:tcBorders>
+              <w:bottom w:val="single" w:sz="2" w:color="B8BDC4"/>
+            </w:tcBorders>
           </w:tcPr>
           <w:p>
             <w:pPr>
-              <w:keepNext w:val="0"/>
+              <w:keepNext/>
               <w:keepLines/>
-              <w:spacing w:before="0" w:after="0" w:line="240" w:lineRule="auto"/>
+              <w:spacing w:before="0" w:after="0" w:line="252" w:lineRule="auto"/>
               <w:ind w:firstLine="0" w:left="0" w:right="0"/>
               <w:jc w:val="left"/>
             </w:pPr>
             <w:r>
               <w:rPr>
-                <w:sz w:val="18"/>
+                <w:sz w:val="20"/>
               </w:rPr>
             </w:r>
             <w:r>
               <w:rPr>
                 <w:rFonts w:ascii="Times New Roman" w:hAnsi="Times New Roman" w:eastAsia="Songti SC"/>
                 <w:b w:val="0"/>
-                <w:sz w:val="18"/>
+                <w:sz w:val="20"/>
               </w:rPr>
               <w:t>二维</w:t>
             </w:r>
             <w:r>
               <w:rPr>
                 <w:rFonts w:ascii="Consolas" w:hAnsi="Consolas" w:eastAsia="Songti SC"/>
-                <w:sz w:val="18"/>
+                <w:sz w:val="20"/>
               </w:rPr>
               <w:t>(lon, lat)</w:t>
             </w:r>
@@ -2399,14 +2055,14 @@
               <w:rPr>
                 <w:rFonts w:ascii="Times New Roman" w:hAnsi="Times New Roman" w:eastAsia="Songti SC"/>
                 <w:b w:val="0"/>
-                <w:sz w:val="18"/>
+                <w:sz w:val="20"/>
               </w:rPr>
-              <w:t>；三维</w:t>
+              <w:t>或三维</w:t>
             </w:r>
             <w:r>
               <w:rPr>
                 <w:rFonts w:ascii="Consolas" w:hAnsi="Consolas" w:eastAsia="Songti SC"/>
-                <w:sz w:val="18"/>
+                <w:sz w:val="20"/>
               </w:rPr>
               <w:t>(lon, lat, ind)</w:t>
             </w:r>
@@ -2414,43 +2070,9 @@
               <w:rPr>
                 <w:rFonts w:ascii="Times New Roman" w:hAnsi="Times New Roman" w:eastAsia="Songti SC"/>
                 <w:b w:val="0"/>
-                <w:sz w:val="18"/>
+                <w:sz w:val="20"/>
               </w:rPr>
               <w:t>；源维度按名称映射到标准顺序</w:t>
-            </w:r>
-          </w:p>
-        </w:tc>
-        <w:tc>
-          <w:tcPr>
-            <w:tcW w:type="dxa" w:w="2948"/>
-            <w:vAlign w:val="top"/>
-            <w:tcMar>
-              <w:top w:w="70" w:type="dxa"/>
-              <w:start w:w="90" w:type="dxa"/>
-              <w:bottom w:w="70" w:type="dxa"/>
-              <w:end w:w="90" w:type="dxa"/>
-            </w:tcMar>
-          </w:tcPr>
-          <w:p>
-            <w:pPr>
-              <w:keepNext w:val="0"/>
-              <w:keepLines/>
-              <w:spacing w:before="0" w:after="0" w:line="240" w:lineRule="auto"/>
-              <w:ind w:firstLine="0" w:left="0" w:right="0"/>
-              <w:jc w:val="left"/>
-            </w:pPr>
-            <w:r>
-              <w:rPr>
-                <w:sz w:val="18"/>
-              </w:rPr>
-            </w:r>
-            <w:r>
-              <w:rPr>
-                <w:rFonts w:ascii="Times New Roman" w:hAnsi="Times New Roman" w:eastAsia="Songti SC"/>
-                <w:b w:val="0"/>
-                <w:sz w:val="18"/>
-              </w:rPr>
-              <w:t>通用维度映射将多种源排列转换为统一结构</w:t>
             </w:r>
           </w:p>
         </w:tc>
@@ -2461,33 +2083,36 @@
         </w:trPr>
         <w:tc>
           <w:tcPr>
-            <w:tcW w:type="dxa" w:w="1928"/>
-            <w:vAlign w:val="center"/>
+            <w:tcW w:type="dxa" w:w="1769"/>
+            <w:vAlign w:val="top"/>
             <w:tcMar>
-              <w:top w:w="70" w:type="dxa"/>
-              <w:start w:w="90" w:type="dxa"/>
-              <w:bottom w:w="70" w:type="dxa"/>
-              <w:end w:w="90" w:type="dxa"/>
+              <w:top w:w="90" w:type="dxa"/>
+              <w:start w:w="110" w:type="dxa"/>
+              <w:bottom w:w="90" w:type="dxa"/>
+              <w:end w:w="170" w:type="dxa"/>
             </w:tcMar>
+            <w:tcBorders>
+              <w:bottom w:val="single" w:sz="2" w:color="B8BDC4"/>
+            </w:tcBorders>
           </w:tcPr>
           <w:p>
             <w:pPr>
-              <w:keepNext w:val="0"/>
+              <w:keepNext/>
               <w:keepLines/>
-              <w:spacing w:before="0" w:after="0" w:line="240" w:lineRule="auto"/>
+              <w:spacing w:before="0" w:after="0" w:line="252" w:lineRule="auto"/>
               <w:ind w:firstLine="0" w:left="0" w:right="0"/>
-              <w:jc w:val="center"/>
+              <w:jc w:val="left"/>
             </w:pPr>
             <w:r>
               <w:rPr>
-                <w:sz w:val="18"/>
+                <w:sz w:val="20"/>
               </w:rPr>
             </w:r>
             <w:r>
               <w:rPr>
                 <w:rFonts w:ascii="Times New Roman" w:hAnsi="Times New Roman" w:eastAsia="Songti SC"/>
                 <w:b w:val="0"/>
-                <w:sz w:val="18"/>
+                <w:sz w:val="20"/>
               </w:rPr>
               <w:t>坐标方向</w:t>
             </w:r>
@@ -2495,47 +2120,43 @@
         </w:tc>
         <w:tc>
           <w:tcPr>
-            <w:tcW w:type="dxa" w:w="3969"/>
+            <w:tcW w:type="dxa" w:w="7075"/>
             <w:vAlign w:val="top"/>
             <w:tcMar>
-              <w:top w:w="70" w:type="dxa"/>
-              <w:start w:w="90" w:type="dxa"/>
-              <w:bottom w:w="70" w:type="dxa"/>
-              <w:end w:w="90" w:type="dxa"/>
+              <w:top w:w="90" w:type="dxa"/>
+              <w:start w:w="110" w:type="dxa"/>
+              <w:bottom w:w="90" w:type="dxa"/>
+              <w:end w:w="170" w:type="dxa"/>
             </w:tcMar>
+            <w:tcBorders>
+              <w:bottom w:val="single" w:sz="2" w:color="B8BDC4"/>
+            </w:tcBorders>
           </w:tcPr>
           <w:p>
             <w:pPr>
-              <w:keepNext w:val="0"/>
+              <w:keepNext/>
               <w:keepLines/>
-              <w:spacing w:before="0" w:after="0" w:line="240" w:lineRule="auto"/>
+              <w:spacing w:before="0" w:after="0" w:line="252" w:lineRule="auto"/>
               <w:ind w:firstLine="0" w:left="0" w:right="0"/>
               <w:jc w:val="left"/>
             </w:pPr>
             <w:r>
               <w:rPr>
-                <w:sz w:val="18"/>
+                <w:sz w:val="20"/>
               </w:rPr>
-            </w:r>
-            <w:r>
-              <w:rPr>
-                <w:rFonts w:ascii="Consolas" w:hAnsi="Consolas" w:eastAsia="Songti SC"/>
-                <w:sz w:val="18"/>
-              </w:rPr>
-              <w:t>lon</w:t>
             </w:r>
             <w:r>
               <w:rPr>
                 <w:rFonts w:ascii="Times New Roman" w:hAnsi="Times New Roman" w:eastAsia="Songti SC"/>
                 <w:b w:val="0"/>
-                <w:sz w:val="18"/>
+                <w:sz w:val="20"/>
               </w:rPr>
-              <w:t>自西向东并统一到</w:t>
+              <w:t>经度自西向东，范围为</w:t>
             </w:r>
             <w:r>
               <w:rPr>
                 <w:rFonts w:ascii="Consolas" w:hAnsi="Consolas" w:eastAsia="Songti SC"/>
-                <w:sz w:val="18"/>
+                <w:sz w:val="20"/>
               </w:rPr>
               <w:t>[-180, 180)</w:t>
             </w:r>
@@ -2543,58 +2164,9 @@
               <w:rPr>
                 <w:rFonts w:ascii="Times New Roman" w:hAnsi="Times New Roman" w:eastAsia="Songti SC"/>
                 <w:b w:val="0"/>
-                <w:sz w:val="18"/>
+                <w:sz w:val="20"/>
               </w:rPr>
-              <w:t>；</w:t>
-            </w:r>
-            <w:r>
-              <w:rPr>
-                <w:rFonts w:ascii="Consolas" w:hAnsi="Consolas" w:eastAsia="Songti SC"/>
-                <w:sz w:val="18"/>
-              </w:rPr>
-              <w:t>lat</w:t>
-            </w:r>
-            <w:r>
-              <w:rPr>
-                <w:rFonts w:ascii="Times New Roman" w:hAnsi="Times New Roman" w:eastAsia="Songti SC"/>
-                <w:b w:val="0"/>
-                <w:sz w:val="18"/>
-              </w:rPr>
-              <w:t>自南向北</w:t>
-            </w:r>
-          </w:p>
-        </w:tc>
-        <w:tc>
-          <w:tcPr>
-            <w:tcW w:type="dxa" w:w="2948"/>
-            <w:vAlign w:val="top"/>
-            <w:tcMar>
-              <w:top w:w="70" w:type="dxa"/>
-              <w:start w:w="90" w:type="dxa"/>
-              <w:bottom w:w="70" w:type="dxa"/>
-              <w:end w:w="90" w:type="dxa"/>
-            </w:tcMar>
-          </w:tcPr>
-          <w:p>
-            <w:pPr>
-              <w:keepNext w:val="0"/>
-              <w:keepLines/>
-              <w:spacing w:before="0" w:after="0" w:line="240" w:lineRule="auto"/>
-              <w:ind w:firstLine="0" w:left="0" w:right="0"/>
-              <w:jc w:val="left"/>
-            </w:pPr>
-            <w:r>
-              <w:rPr>
-                <w:sz w:val="18"/>
-              </w:rPr>
-            </w:r>
-            <w:r>
-              <w:rPr>
-                <w:rFonts w:ascii="Times New Roman" w:hAnsi="Times New Roman" w:eastAsia="Songti SC"/>
-                <w:b w:val="0"/>
-                <w:sz w:val="18"/>
-              </w:rPr>
-              <w:t>翻转和循环平移保持数据与坐标同步</w:t>
+              <w:t>；纬度自南向北；坐标与数据同步变换</w:t>
             </w:r>
           </w:p>
         </w:tc>
@@ -2605,66 +2177,72 @@
         </w:trPr>
         <w:tc>
           <w:tcPr>
-            <w:tcW w:type="dxa" w:w="1928"/>
-            <w:vAlign w:val="center"/>
+            <w:tcW w:type="dxa" w:w="1769"/>
+            <w:vAlign w:val="top"/>
             <w:tcMar>
-              <w:top w:w="70" w:type="dxa"/>
-              <w:start w:w="90" w:type="dxa"/>
-              <w:bottom w:w="70" w:type="dxa"/>
-              <w:end w:w="90" w:type="dxa"/>
+              <w:top w:w="90" w:type="dxa"/>
+              <w:start w:w="110" w:type="dxa"/>
+              <w:bottom w:w="90" w:type="dxa"/>
+              <w:end w:w="170" w:type="dxa"/>
             </w:tcMar>
+            <w:tcBorders>
+              <w:bottom w:val="single" w:sz="2" w:color="B8BDC4"/>
+            </w:tcBorders>
           </w:tcPr>
           <w:p>
             <w:pPr>
-              <w:keepNext w:val="0"/>
+              <w:keepNext/>
               <w:keepLines/>
-              <w:spacing w:before="0" w:after="0" w:line="240" w:lineRule="auto"/>
+              <w:spacing w:before="0" w:after="0" w:line="252" w:lineRule="auto"/>
               <w:ind w:firstLine="0" w:left="0" w:right="0"/>
-              <w:jc w:val="center"/>
+              <w:jc w:val="left"/>
             </w:pPr>
             <w:r>
               <w:rPr>
-                <w:sz w:val="18"/>
+                <w:sz w:val="20"/>
               </w:rPr>
             </w:r>
             <w:r>
               <w:rPr>
                 <w:rFonts w:ascii="Times New Roman" w:hAnsi="Times New Roman" w:eastAsia="Songti SC"/>
                 <w:b w:val="0"/>
-                <w:sz w:val="18"/>
+                <w:sz w:val="20"/>
               </w:rPr>
-              <w:t>数据变量</w:t>
+              <w:t>数据与元数据</w:t>
             </w:r>
           </w:p>
         </w:tc>
         <w:tc>
           <w:tcPr>
-            <w:tcW w:type="dxa" w:w="3969"/>
+            <w:tcW w:type="dxa" w:w="7075"/>
             <w:vAlign w:val="top"/>
             <w:tcMar>
-              <w:top w:w="70" w:type="dxa"/>
-              <w:start w:w="90" w:type="dxa"/>
-              <w:bottom w:w="70" w:type="dxa"/>
-              <w:end w:w="90" w:type="dxa"/>
+              <w:top w:w="90" w:type="dxa"/>
+              <w:start w:w="110" w:type="dxa"/>
+              <w:bottom w:w="90" w:type="dxa"/>
+              <w:end w:w="170" w:type="dxa"/>
             </w:tcMar>
+            <w:tcBorders>
+              <w:bottom w:val="single" w:sz="2" w:color="B8BDC4"/>
+            </w:tcBorders>
           </w:tcPr>
           <w:p>
             <w:pPr>
-              <w:keepNext w:val="0"/>
+              <w:keepNext/>
               <w:keepLines/>
-              <w:spacing w:before="0" w:after="0" w:line="240" w:lineRule="auto"/>
+              <w:spacing w:before="0" w:after="0" w:line="252" w:lineRule="auto"/>
               <w:ind w:firstLine="0" w:left="0" w:right="0"/>
               <w:jc w:val="left"/>
             </w:pPr>
             <w:r>
               <w:rPr>
-                <w:sz w:val="18"/>
+                <w:sz w:val="20"/>
               </w:rPr>
             </w:r>
             <w:r>
               <w:rPr>
                 <w:rFonts w:ascii="Consolas" w:hAnsi="Consolas" w:eastAsia="Songti SC"/>
-                <w:sz w:val="18"/>
+                <w:sz w:val="20"/>
               </w:rPr>
               <w:t>data</w:t>
             </w:r>
@@ -2672,14 +2250,14 @@
               <w:rPr>
                 <w:rFonts w:ascii="Times New Roman" w:hAnsi="Times New Roman" w:eastAsia="Songti SC"/>
                 <w:b w:val="0"/>
-                <w:sz w:val="18"/>
+                <w:sz w:val="20"/>
               </w:rPr>
-              <w:t>为主变量；</w:t>
+              <w:t>为主变量，</w:t>
             </w:r>
             <w:r>
               <w:rPr>
                 <w:rFonts w:ascii="Consolas" w:hAnsi="Consolas" w:eastAsia="Songti SC"/>
-                <w:sz w:val="18"/>
+                <w:sz w:val="20"/>
               </w:rPr>
               <w:t>std</w:t>
             </w:r>
@@ -2687,43 +2265,9 @@
               <w:rPr>
                 <w:rFonts w:ascii="Times New Roman" w:hAnsi="Times New Roman" w:eastAsia="Songti SC"/>
                 <w:b w:val="0"/>
-                <w:sz w:val="18"/>
+                <w:sz w:val="20"/>
               </w:rPr>
-              <w:t>保存同形不确定性；输出为实际物理值</w:t>
-            </w:r>
-          </w:p>
-        </w:tc>
-        <w:tc>
-          <w:tcPr>
-            <w:tcW w:type="dxa" w:w="2948"/>
-            <w:vAlign w:val="top"/>
-            <w:tcMar>
-              <w:top w:w="70" w:type="dxa"/>
-              <w:start w:w="90" w:type="dxa"/>
-              <w:bottom w:w="70" w:type="dxa"/>
-              <w:end w:w="90" w:type="dxa"/>
-            </w:tcMar>
-          </w:tcPr>
-          <w:p>
-            <w:pPr>
-              <w:keepNext w:val="0"/>
-              <w:keepLines/>
-              <w:spacing w:before="0" w:after="0" w:line="240" w:lineRule="auto"/>
-              <w:ind w:firstLine="0" w:left="0" w:right="0"/>
-              <w:jc w:val="left"/>
-            </w:pPr>
-            <w:r>
-              <w:rPr>
-                <w:sz w:val="18"/>
-              </w:rPr>
-            </w:r>
-            <w:r>
-              <w:rPr>
-                <w:rFonts w:ascii="Times New Roman" w:hAnsi="Times New Roman" w:eastAsia="Songti SC"/>
-                <w:b w:val="0"/>
-                <w:sz w:val="18"/>
-              </w:rPr>
-              <w:t>统一变量命名、类型、单位和数值表达</w:t>
+              <w:t>为同形不确定性；保存实际物理值、变量说明和单位</w:t>
             </w:r>
           </w:p>
         </w:tc>
@@ -2734,170 +2278,75 @@
         </w:trPr>
         <w:tc>
           <w:tcPr>
-            <w:tcW w:type="dxa" w:w="1928"/>
-            <w:vAlign w:val="center"/>
+            <w:tcW w:type="dxa" w:w="1769"/>
+            <w:vAlign w:val="top"/>
             <w:tcMar>
-              <w:top w:w="70" w:type="dxa"/>
-              <w:start w:w="90" w:type="dxa"/>
-              <w:bottom w:w="70" w:type="dxa"/>
-              <w:end w:w="90" w:type="dxa"/>
+              <w:top w:w="90" w:type="dxa"/>
+              <w:start w:w="110" w:type="dxa"/>
+              <w:bottom w:w="90" w:type="dxa"/>
+              <w:end w:w="170" w:type="dxa"/>
             </w:tcMar>
+            <w:tcBorders>
+              <w:bottom w:val="single" w:sz="2" w:color="B8BDC4"/>
+            </w:tcBorders>
           </w:tcPr>
           <w:p>
             <w:pPr>
-              <w:keepNext w:val="0"/>
+              <w:keepNext/>
               <w:keepLines/>
-              <w:spacing w:before="0" w:after="0" w:line="240" w:lineRule="auto"/>
+              <w:spacing w:before="0" w:after="0" w:line="252" w:lineRule="auto"/>
               <w:ind w:firstLine="0" w:left="0" w:right="0"/>
-              <w:jc w:val="center"/>
+              <w:jc w:val="left"/>
             </w:pPr>
             <w:r>
               <w:rPr>
-                <w:sz w:val="18"/>
+                <w:sz w:val="20"/>
               </w:rPr>
             </w:r>
             <w:r>
               <w:rPr>
                 <w:rFonts w:ascii="Times New Roman" w:hAnsi="Times New Roman" w:eastAsia="Songti SC"/>
                 <w:b w:val="0"/>
-                <w:sz w:val="18"/>
+                <w:sz w:val="20"/>
               </w:rPr>
-              <w:t>缺失值填补与范围</w:t>
+              <w:t>范围与缺失值</w:t>
             </w:r>
           </w:p>
         </w:tc>
         <w:tc>
           <w:tcPr>
-            <w:tcW w:type="dxa" w:w="3969"/>
+            <w:tcW w:type="dxa" w:w="7075"/>
             <w:vAlign w:val="top"/>
             <w:tcMar>
-              <w:top w:w="70" w:type="dxa"/>
-              <w:start w:w="90" w:type="dxa"/>
-              <w:bottom w:w="70" w:type="dxa"/>
-              <w:end w:w="90" w:type="dxa"/>
+              <w:top w:w="90" w:type="dxa"/>
+              <w:start w:w="110" w:type="dxa"/>
+              <w:bottom w:w="90" w:type="dxa"/>
+              <w:end w:w="170" w:type="dxa"/>
             </w:tcMar>
+            <w:tcBorders>
+              <w:bottom w:val="single" w:sz="2" w:color="B8BDC4"/>
+            </w:tcBorders>
           </w:tcPr>
           <w:p>
             <w:pPr>
-              <w:keepNext w:val="0"/>
+              <w:keepNext/>
               <w:keepLines/>
-              <w:spacing w:before="0" w:after="0" w:line="240" w:lineRule="auto"/>
+              <w:spacing w:before="0" w:after="0" w:line="252" w:lineRule="auto"/>
               <w:ind w:firstLine="0" w:left="0" w:right="0"/>
               <w:jc w:val="left"/>
             </w:pPr>
             <w:r>
               <w:rPr>
-                <w:sz w:val="18"/>
+                <w:sz w:val="20"/>
               </w:rPr>
             </w:r>
             <w:r>
               <w:rPr>
                 <w:rFonts w:ascii="Times New Roman" w:hAnsi="Times New Roman" w:eastAsia="Songti SC"/>
                 <w:b w:val="0"/>
-                <w:sz w:val="18"/>
+                <w:sz w:val="20"/>
               </w:rPr>
-              <w:t>有效范围、填充值和缺失值填补策略由YAML显式声明</w:t>
-            </w:r>
-          </w:p>
-        </w:tc>
-        <w:tc>
-          <w:tcPr>
-            <w:tcW w:type="dxa" w:w="2948"/>
-            <w:vAlign w:val="top"/>
-            <w:tcMar>
-              <w:top w:w="70" w:type="dxa"/>
-              <w:start w:w="90" w:type="dxa"/>
-              <w:bottom w:w="70" w:type="dxa"/>
-              <w:end w:w="90" w:type="dxa"/>
-            </w:tcMar>
-          </w:tcPr>
-          <w:p>
-            <w:pPr>
-              <w:keepNext w:val="0"/>
-              <w:keepLines/>
-              <w:spacing w:before="0" w:after="0" w:line="240" w:lineRule="auto"/>
-              <w:ind w:firstLine="0" w:left="0" w:right="0"/>
-              <w:jc w:val="left"/>
-            </w:pPr>
-            <w:r>
-              <w:rPr>
-                <w:sz w:val="18"/>
-              </w:rPr>
-            </w:r>
-            <w:r>
-              <w:rPr>
-                <w:rFonts w:ascii="Times New Roman" w:hAnsi="Times New Roman" w:eastAsia="Songti SC"/>
-                <w:b w:val="0"/>
-                <w:sz w:val="18"/>
-              </w:rPr>
-              <w:t>支持数值常数、</w:t>
-            </w:r>
-            <w:r>
-              <w:rPr>
-                <w:rFonts w:ascii="Consolas" w:hAnsi="Consolas" w:eastAsia="Songti SC"/>
-                <w:sz w:val="18"/>
-              </w:rPr>
-              <w:t>MEAN</w:t>
-            </w:r>
-            <w:r>
-              <w:rPr>
-                <w:rFonts w:ascii="Times New Roman" w:hAnsi="Times New Roman" w:eastAsia="Songti SC"/>
-                <w:b w:val="0"/>
-                <w:sz w:val="18"/>
-              </w:rPr>
-              <w:t>、</w:t>
-            </w:r>
-            <w:r>
-              <w:rPr>
-                <w:rFonts w:ascii="Consolas" w:hAnsi="Consolas" w:eastAsia="Songti SC"/>
-                <w:sz w:val="18"/>
-              </w:rPr>
-              <w:t>KEEP_AS_IS</w:t>
-            </w:r>
-            <w:r>
-              <w:rPr>
-                <w:rFonts w:ascii="Times New Roman" w:hAnsi="Times New Roman" w:eastAsia="Songti SC"/>
-                <w:b w:val="0"/>
-                <w:sz w:val="18"/>
-              </w:rPr>
-              <w:t>、</w:t>
-            </w:r>
-            <w:r>
-              <w:rPr>
-                <w:rFonts w:ascii="Consolas" w:hAnsi="Consolas" w:eastAsia="Songti SC"/>
-                <w:sz w:val="18"/>
-              </w:rPr>
-              <w:t>INT_NAN_TO_1</w:t>
-            </w:r>
-            <w:r>
-              <w:rPr>
-                <w:rFonts w:ascii="Times New Roman" w:hAnsi="Times New Roman" w:eastAsia="Songti SC"/>
-                <w:b w:val="0"/>
-                <w:sz w:val="18"/>
-              </w:rPr>
-              <w:t>、</w:t>
-            </w:r>
-            <w:r>
-              <w:rPr>
-                <w:rFonts w:ascii="Consolas" w:hAnsi="Consolas" w:eastAsia="Songti SC"/>
-                <w:sz w:val="18"/>
-              </w:rPr>
-              <w:t>NO_LAND_NAN</w:t>
-            </w:r>
-            <w:r>
-              <w:rPr>
-                <w:rFonts w:ascii="Times New Roman" w:hAnsi="Times New Roman" w:eastAsia="Songti SC"/>
-                <w:b w:val="0"/>
-                <w:sz w:val="18"/>
-              </w:rPr>
-              <w:t>和</w:t>
-            </w:r>
-            <w:r>
-              <w:rPr>
-                <w:rFonts w:ascii="Consolas" w:hAnsi="Consolas" w:eastAsia="Songti SC"/>
-                <w:sz w:val="18"/>
-              </w:rPr>
-              <w:t>NO_NAN</w:t>
+              <w:t>YAML显式声明有效范围、填充值及缺失值处理策略</w:t>
             </w:r>
           </w:p>
         </w:tc>
@@ -2908,110 +2357,75 @@
         </w:trPr>
         <w:tc>
           <w:tcPr>
-            <w:tcW w:type="dxa" w:w="1928"/>
-            <w:vAlign w:val="center"/>
+            <w:tcW w:type="dxa" w:w="1769"/>
+            <w:vAlign w:val="top"/>
             <w:tcMar>
-              <w:top w:w="70" w:type="dxa"/>
-              <w:start w:w="90" w:type="dxa"/>
-              <w:bottom w:w="70" w:type="dxa"/>
-              <w:end w:w="90" w:type="dxa"/>
+              <w:top w:w="90" w:type="dxa"/>
+              <w:start w:w="110" w:type="dxa"/>
+              <w:bottom w:w="90" w:type="dxa"/>
+              <w:end w:w="170" w:type="dxa"/>
             </w:tcMar>
+            <w:tcBorders>
+              <w:bottom w:val="single" w:sz="2" w:color="B8BDC4"/>
+            </w:tcBorders>
           </w:tcPr>
           <w:p>
             <w:pPr>
-              <w:keepNext w:val="0"/>
+              <w:keepNext/>
               <w:keepLines/>
-              <w:spacing w:before="0" w:after="0" w:line="240" w:lineRule="auto"/>
+              <w:spacing w:before="0" w:after="0" w:line="252" w:lineRule="auto"/>
               <w:ind w:firstLine="0" w:left="0" w:right="0"/>
-              <w:jc w:val="center"/>
+              <w:jc w:val="left"/>
             </w:pPr>
             <w:r>
               <w:rPr>
-                <w:sz w:val="18"/>
+                <w:sz w:val="20"/>
               </w:rPr>
             </w:r>
             <w:r>
               <w:rPr>
                 <w:rFonts w:ascii="Times New Roman" w:hAnsi="Times New Roman" w:eastAsia="Songti SC"/>
                 <w:b w:val="0"/>
-                <w:sz w:val="18"/>
+                <w:sz w:val="20"/>
               </w:rPr>
-              <w:t>变量元数据</w:t>
+              <w:t>处理记录</w:t>
             </w:r>
           </w:p>
         </w:tc>
         <w:tc>
           <w:tcPr>
-            <w:tcW w:type="dxa" w:w="3969"/>
+            <w:tcW w:type="dxa" w:w="7075"/>
             <w:vAlign w:val="top"/>
             <w:tcMar>
-              <w:top w:w="70" w:type="dxa"/>
-              <w:start w:w="90" w:type="dxa"/>
-              <w:bottom w:w="70" w:type="dxa"/>
-              <w:end w:w="90" w:type="dxa"/>
+              <w:top w:w="90" w:type="dxa"/>
+              <w:start w:w="110" w:type="dxa"/>
+              <w:bottom w:w="90" w:type="dxa"/>
+              <w:end w:w="170" w:type="dxa"/>
             </w:tcMar>
+            <w:tcBorders>
+              <w:bottom w:val="single" w:sz="2" w:color="B8BDC4"/>
+            </w:tcBorders>
           </w:tcPr>
           <w:p>
             <w:pPr>
-              <w:keepNext w:val="0"/>
+              <w:keepNext/>
               <w:keepLines/>
-              <w:spacing w:before="0" w:after="0" w:line="240" w:lineRule="auto"/>
+              <w:spacing w:before="0" w:after="0" w:line="252" w:lineRule="auto"/>
               <w:ind w:firstLine="0" w:left="0" w:right="0"/>
               <w:jc w:val="left"/>
             </w:pPr>
             <w:r>
               <w:rPr>
-                <w:sz w:val="18"/>
-              </w:rPr>
-            </w:r>
-            <w:r>
-              <w:rPr>
-                <w:rFonts w:ascii="Consolas" w:hAnsi="Consolas" w:eastAsia="Songti SC"/>
-                <w:sz w:val="18"/>
-              </w:rPr>
-              <w:t>data/std</w:t>
-            </w:r>
-            <w:r>
-              <w:rPr>
-                <w:rFonts w:ascii="Times New Roman" w:hAnsi="Times New Roman" w:eastAsia="Songti SC"/>
-                <w:b w:val="0"/>
-                <w:sz w:val="18"/>
-              </w:rPr>
-              <w:t>记录可读说明、单位及处理变更条目</w:t>
-            </w:r>
-          </w:p>
-        </w:tc>
-        <w:tc>
-          <w:tcPr>
-            <w:tcW w:type="dxa" w:w="2948"/>
-            <w:vAlign w:val="top"/>
-            <w:tcMar>
-              <w:top w:w="70" w:type="dxa"/>
-              <w:start w:w="90" w:type="dxa"/>
-              <w:bottom w:w="70" w:type="dxa"/>
-              <w:end w:w="90" w:type="dxa"/>
-            </w:tcMar>
-          </w:tcPr>
-          <w:p>
-            <w:pPr>
-              <w:keepNext w:val="0"/>
-              <w:keepLines/>
-              <w:spacing w:before="0" w:after="0" w:line="240" w:lineRule="auto"/>
-              <w:ind w:firstLine="0" w:left="0" w:right="0"/>
-              <w:jc w:val="left"/>
-            </w:pPr>
-            <w:r>
-              <w:rPr>
-                <w:sz w:val="18"/>
+                <w:sz w:val="20"/>
               </w:rPr>
             </w:r>
             <w:r>
               <w:rPr>
                 <w:rFonts w:ascii="Times New Roman" w:hAnsi="Times New Roman" w:eastAsia="Songti SC"/>
                 <w:b w:val="0"/>
-                <w:sz w:val="18"/>
+                <w:sz w:val="20"/>
               </w:rPr>
-              <w:t>输出文件保留变量语义与主要转换过程</w:t>
+              <w:t>YAML保存转换规则；输出NetCDF属性记录实际执行的变更</w:t>
             </w:r>
           </w:p>
         </w:tc>
@@ -3022,103 +2436,90 @@
         </w:trPr>
         <w:tc>
           <w:tcPr>
-            <w:tcW w:type="dxa" w:w="1928"/>
-            <w:vAlign w:val="center"/>
+            <w:tcW w:type="dxa" w:w="1769"/>
+            <w:vAlign w:val="top"/>
             <w:tcMar>
-              <w:top w:w="70" w:type="dxa"/>
-              <w:start w:w="90" w:type="dxa"/>
-              <w:bottom w:w="70" w:type="dxa"/>
-              <w:end w:w="90" w:type="dxa"/>
+              <w:top w:w="90" w:type="dxa"/>
+              <w:start w:w="110" w:type="dxa"/>
+              <w:bottom w:w="90" w:type="dxa"/>
+              <w:end w:w="170" w:type="dxa"/>
             </w:tcMar>
+            <w:tcBorders>
+              <w:bottom w:val="single" w:sz="2" w:color="B8BDC4"/>
+            </w:tcBorders>
           </w:tcPr>
           <w:p>
             <w:pPr>
-              <w:keepNext w:val="0"/>
+              <w:keepNext/>
               <w:keepLines/>
-              <w:spacing w:before="0" w:after="0" w:line="240" w:lineRule="auto"/>
+              <w:spacing w:before="0" w:after="0" w:line="252" w:lineRule="auto"/>
               <w:ind w:firstLine="0" w:left="0" w:right="0"/>
-              <w:jc w:val="center"/>
+              <w:jc w:val="left"/>
             </w:pPr>
             <w:r>
               <w:rPr>
-                <w:sz w:val="18"/>
+                <w:sz w:val="20"/>
               </w:rPr>
             </w:r>
             <w:r>
               <w:rPr>
                 <w:rFonts w:ascii="Times New Roman" w:hAnsi="Times New Roman" w:eastAsia="Songti SC"/>
                 <w:b w:val="0"/>
-                <w:sz w:val="18"/>
+                <w:sz w:val="20"/>
               </w:rPr>
-              <w:t>处理记录</w:t>
+              <w:t>复现信息</w:t>
             </w:r>
           </w:p>
         </w:tc>
         <w:tc>
           <w:tcPr>
-            <w:tcW w:type="dxa" w:w="3969"/>
+            <w:tcW w:type="dxa" w:w="7075"/>
             <w:vAlign w:val="top"/>
             <w:tcMar>
-              <w:top w:w="70" w:type="dxa"/>
-              <w:start w:w="90" w:type="dxa"/>
-              <w:bottom w:w="70" w:type="dxa"/>
-              <w:end w:w="90" w:type="dxa"/>
+              <w:top w:w="90" w:type="dxa"/>
+              <w:start w:w="110" w:type="dxa"/>
+              <w:bottom w:w="90" w:type="dxa"/>
+              <w:end w:w="170" w:type="dxa"/>
             </w:tcMar>
+            <w:tcBorders>
+              <w:bottom w:val="single" w:sz="2" w:color="B8BDC4"/>
+            </w:tcBorders>
           </w:tcPr>
           <w:p>
             <w:pPr>
-              <w:keepNext w:val="0"/>
+              <w:keepNext/>
               <w:keepLines/>
-              <w:spacing w:before="0" w:after="0" w:line="240" w:lineRule="auto"/>
+              <w:spacing w:before="0" w:after="0" w:line="252" w:lineRule="auto"/>
               <w:ind w:firstLine="0" w:left="0" w:right="0"/>
               <w:jc w:val="left"/>
             </w:pPr>
             <w:r>
               <w:rPr>
-                <w:sz w:val="18"/>
+                <w:sz w:val="20"/>
               </w:rPr>
             </w:r>
             <w:r>
               <w:rPr>
                 <w:rFonts w:ascii="Times New Roman" w:hAnsi="Times New Roman" w:eastAsia="Songti SC"/>
                 <w:b w:val="0"/>
-                <w:sz w:val="18"/>
+                <w:sz w:val="20"/>
               </w:rPr>
-              <w:t>YAML文件明确记录维度、坐标、数值转换和缺失值填补规则；处理完成后，输出NetCDF文件的属性中同步保存实际执行的变更记录</w:t>
+              <w:t>共同归档配置规范版本（</w:t>
             </w:r>
-          </w:p>
-        </w:tc>
-        <w:tc>
-          <w:tcPr>
-            <w:tcW w:type="dxa" w:w="2948"/>
-            <w:vAlign w:val="top"/>
-            <w:tcMar>
-              <w:top w:w="70" w:type="dxa"/>
-              <w:start w:w="90" w:type="dxa"/>
-              <w:bottom w:w="70" w:type="dxa"/>
-              <w:end w:w="90" w:type="dxa"/>
-            </w:tcMar>
-          </w:tcPr>
-          <w:p>
-            <w:pPr>
-              <w:keepNext w:val="0"/>
-              <w:keepLines/>
-              <w:spacing w:before="0" w:after="0" w:line="240" w:lineRule="auto"/>
-              <w:ind w:firstLine="0" w:left="0" w:right="0"/>
-              <w:jc w:val="left"/>
-            </w:pPr>
             <w:r>
               <w:rPr>
-                <w:sz w:val="18"/>
+                <w:rFonts w:ascii="Consolas" w:hAnsi="Consolas" w:eastAsia="Songti SC"/>
+                <w:sz w:val="20"/>
               </w:rPr>
+              <w:t>SCHEMA_VERSION</w:t>
             </w:r>
             <w:r>
               <w:rPr>
                 <w:rFonts w:ascii="Times New Roman" w:hAnsi="Times New Roman" w:eastAsia="Songti SC"/>
                 <w:b w:val="0"/>
-                <w:sz w:val="18"/>
+                <w:sz w:val="20"/>
               </w:rPr>
-              <w:t>处理规则与实际执行记录可相互核对</w:t>
+              <w:t>）、完整YAML、固定输入及代码环境</w:t>
             </w:r>
           </w:p>
         </w:tc>
@@ -3129,110 +2530,75 @@
         </w:trPr>
         <w:tc>
           <w:tcPr>
-            <w:tcW w:type="dxa" w:w="1928"/>
-            <w:vAlign w:val="center"/>
+            <w:tcW w:type="dxa" w:w="1769"/>
+            <w:vAlign w:val="top"/>
             <w:tcMar>
-              <w:top w:w="70" w:type="dxa"/>
-              <w:start w:w="90" w:type="dxa"/>
-              <w:bottom w:w="70" w:type="dxa"/>
-              <w:end w:w="90" w:type="dxa"/>
+              <w:top w:w="90" w:type="dxa"/>
+              <w:start w:w="110" w:type="dxa"/>
+              <w:bottom w:w="90" w:type="dxa"/>
+              <w:end w:w="170" w:type="dxa"/>
             </w:tcMar>
+            <w:tcBorders>
+              <w:bottom w:val="single" w:sz="2" w:color="B8BDC4"/>
+            </w:tcBorders>
           </w:tcPr>
           <w:p>
             <w:pPr>
-              <w:keepNext w:val="0"/>
+              <w:keepNext/>
               <w:keepLines/>
-              <w:spacing w:before="0" w:after="0" w:line="240" w:lineRule="auto"/>
+              <w:spacing w:before="0" w:after="0" w:line="252" w:lineRule="auto"/>
               <w:ind w:firstLine="0" w:left="0" w:right="0"/>
-              <w:jc w:val="center"/>
+              <w:jc w:val="left"/>
             </w:pPr>
             <w:r>
               <w:rPr>
-                <w:sz w:val="18"/>
+                <w:sz w:val="20"/>
               </w:rPr>
             </w:r>
             <w:r>
               <w:rPr>
                 <w:rFonts w:ascii="Times New Roman" w:hAnsi="Times New Roman" w:eastAsia="Songti SC"/>
                 <w:b w:val="0"/>
-                <w:sz w:val="18"/>
+                <w:sz w:val="20"/>
               </w:rPr>
-              <w:t>处理复现</w:t>
+              <w:t>标签与版本</w:t>
             </w:r>
           </w:p>
         </w:tc>
         <w:tc>
           <w:tcPr>
-            <w:tcW w:type="dxa" w:w="3969"/>
+            <w:tcW w:type="dxa" w:w="7075"/>
             <w:vAlign w:val="top"/>
             <w:tcMar>
-              <w:top w:w="70" w:type="dxa"/>
-              <w:start w:w="90" w:type="dxa"/>
-              <w:bottom w:w="70" w:type="dxa"/>
-              <w:end w:w="90" w:type="dxa"/>
+              <w:top w:w="90" w:type="dxa"/>
+              <w:start w:w="110" w:type="dxa"/>
+              <w:bottom w:w="90" w:type="dxa"/>
+              <w:end w:w="170" w:type="dxa"/>
             </w:tcMar>
+            <w:tcBorders>
+              <w:bottom w:val="single" w:sz="2" w:color="B8BDC4"/>
+            </w:tcBorders>
           </w:tcPr>
           <w:p>
             <w:pPr>
-              <w:keepNext w:val="0"/>
+              <w:keepNext/>
               <w:keepLines/>
-              <w:spacing w:before="0" w:after="0" w:line="240" w:lineRule="auto"/>
+              <w:spacing w:before="0" w:after="0" w:line="252" w:lineRule="auto"/>
               <w:ind w:firstLine="0" w:left="0" w:right="0"/>
               <w:jc w:val="left"/>
             </w:pPr>
             <w:r>
               <w:rPr>
-                <w:sz w:val="18"/>
-              </w:rPr>
-            </w:r>
-            <w:r>
-              <w:rPr>
-                <w:rFonts w:ascii="Consolas" w:hAnsi="Consolas" w:eastAsia="Songti SC"/>
-                <w:sz w:val="18"/>
-              </w:rPr>
-              <w:t>SCHEMA_VERSION</w:t>
-            </w:r>
-            <w:r>
-              <w:rPr>
-                <w:rFonts w:ascii="Times New Roman" w:hAnsi="Times New Roman" w:eastAsia="Songti SC"/>
-                <w:b w:val="0"/>
-                <w:sz w:val="18"/>
-              </w:rPr>
-              <w:t>、完整YAML、固定输入和版本化项目环境共同归档</w:t>
-            </w:r>
-          </w:p>
-        </w:tc>
-        <w:tc>
-          <w:tcPr>
-            <w:tcW w:type="dxa" w:w="2948"/>
-            <w:vAlign w:val="top"/>
-            <w:tcMar>
-              <w:top w:w="70" w:type="dxa"/>
-              <w:start w:w="90" w:type="dxa"/>
-              <w:bottom w:w="70" w:type="dxa"/>
-              <w:end w:w="90" w:type="dxa"/>
-            </w:tcMar>
-          </w:tcPr>
-          <w:p>
-            <w:pPr>
-              <w:keepNext w:val="0"/>
-              <w:keepLines/>
-              <w:spacing w:before="0" w:after="0" w:line="240" w:lineRule="auto"/>
-              <w:ind w:firstLine="0" w:left="0" w:right="0"/>
-              <w:jc w:val="left"/>
-            </w:pPr>
-            <w:r>
-              <w:rPr>
-                <w:sz w:val="18"/>
+                <w:sz w:val="20"/>
               </w:rPr>
             </w:r>
             <w:r>
               <w:rPr>
                 <w:rFonts w:ascii="Times New Roman" w:hAnsi="Times New Roman" w:eastAsia="Songti SC"/>
                 <w:b w:val="0"/>
-                <w:sz w:val="18"/>
+                <w:sz w:val="20"/>
               </w:rPr>
-              <w:t>利用归档的配置、输入与代码环境复现处理</w:t>
+              <w:t>标签记录类别、空间/时间分辨率、年份、版本及可选修订号，并与文件名对应</w:t>
             </w:r>
           </w:p>
         </w:tc>
@@ -3243,210 +2609,69 @@
         </w:trPr>
         <w:tc>
           <w:tcPr>
-            <w:tcW w:type="dxa" w:w="1928"/>
-            <w:vAlign w:val="center"/>
+            <w:tcW w:type="dxa" w:w="1769"/>
+            <w:vAlign w:val="top"/>
             <w:tcMar>
-              <w:top w:w="70" w:type="dxa"/>
-              <w:start w:w="90" w:type="dxa"/>
-              <w:bottom w:w="70" w:type="dxa"/>
-              <w:end w:w="90" w:type="dxa"/>
+              <w:top w:w="90" w:type="dxa"/>
+              <w:start w:w="110" w:type="dxa"/>
+              <w:bottom w:w="90" w:type="dxa"/>
+              <w:end w:w="170" w:type="dxa"/>
             </w:tcMar>
           </w:tcPr>
           <w:p>
             <w:pPr>
               <w:keepNext w:val="0"/>
               <w:keepLines/>
-              <w:spacing w:before="0" w:after="0" w:line="240" w:lineRule="auto"/>
+              <w:spacing w:before="0" w:after="0" w:line="252" w:lineRule="auto"/>
               <w:ind w:firstLine="0" w:left="0" w:right="0"/>
-              <w:jc w:val="center"/>
+              <w:jc w:val="left"/>
             </w:pPr>
             <w:r>
               <w:rPr>
-                <w:sz w:val="18"/>
+                <w:sz w:val="20"/>
               </w:rPr>
             </w:r>
             <w:r>
               <w:rPr>
                 <w:rFonts w:ascii="Times New Roman" w:hAnsi="Times New Roman" w:eastAsia="Songti SC"/>
                 <w:b w:val="0"/>
-                <w:sz w:val="18"/>
+                <w:sz w:val="20"/>
               </w:rPr>
-              <w:t>标签与版本</w:t>
+              <w:t>文件完整性</w:t>
             </w:r>
           </w:p>
         </w:tc>
         <w:tc>
           <w:tcPr>
-            <w:tcW w:type="dxa" w:w="3969"/>
+            <w:tcW w:type="dxa" w:w="7075"/>
             <w:vAlign w:val="top"/>
             <w:tcMar>
-              <w:top w:w="70" w:type="dxa"/>
-              <w:start w:w="90" w:type="dxa"/>
-              <w:bottom w:w="70" w:type="dxa"/>
-              <w:end w:w="90" w:type="dxa"/>
+              <w:top w:w="90" w:type="dxa"/>
+              <w:start w:w="110" w:type="dxa"/>
+              <w:bottom w:w="90" w:type="dxa"/>
+              <w:end w:w="170" w:type="dxa"/>
             </w:tcMar>
           </w:tcPr>
           <w:p>
             <w:pPr>
               <w:keepNext w:val="0"/>
               <w:keepLines/>
-              <w:spacing w:before="0" w:after="0" w:line="240" w:lineRule="auto"/>
+              <w:spacing w:before="0" w:after="0" w:line="252" w:lineRule="auto"/>
               <w:ind w:firstLine="0" w:left="0" w:right="0"/>
               <w:jc w:val="left"/>
             </w:pPr>
             <w:r>
               <w:rPr>
-                <w:sz w:val="18"/>
+                <w:sz w:val="20"/>
               </w:rPr>
             </w:r>
             <w:r>
               <w:rPr>
                 <w:rFonts w:ascii="Times New Roman" w:hAnsi="Times New Roman" w:eastAsia="Songti SC"/>
                 <w:b w:val="0"/>
-                <w:sz w:val="18"/>
+                <w:sz w:val="20"/>
               </w:rPr>
-              <w:t>标签表达类别、空间/时间分辨率、年份、版本和可选修订号</w:t>
-            </w:r>
-          </w:p>
-        </w:tc>
-        <w:tc>
-          <w:tcPr>
-            <w:tcW w:type="dxa" w:w="2948"/>
-            <w:vAlign w:val="top"/>
-            <w:tcMar>
-              <w:top w:w="70" w:type="dxa"/>
-              <w:start w:w="90" w:type="dxa"/>
-              <w:bottom w:w="70" w:type="dxa"/>
-              <w:end w:w="90" w:type="dxa"/>
-            </w:tcMar>
-          </w:tcPr>
-          <w:p>
-            <w:pPr>
-              <w:keepNext w:val="0"/>
-              <w:keepLines/>
-              <w:spacing w:before="0" w:after="0" w:line="240" w:lineRule="auto"/>
-              <w:ind w:firstLine="0" w:left="0" w:right="0"/>
-              <w:jc w:val="left"/>
-            </w:pPr>
-            <w:r>
-              <w:rPr>
-                <w:sz w:val="18"/>
-              </w:rPr>
-            </w:r>
-            <w:r>
-              <w:rPr>
-                <w:rFonts w:ascii="Times New Roman" w:hAnsi="Times New Roman" w:eastAsia="Songti SC"/>
-                <w:b w:val="0"/>
-                <w:sz w:val="18"/>
-              </w:rPr>
-              <w:t>标签与文件名共同形成稳定数据集标识</w:t>
-            </w:r>
-          </w:p>
-        </w:tc>
-      </w:tr>
-      <w:tr>
-        <w:trPr>
-          <w:cantSplit/>
-        </w:trPr>
-        <w:tc>
-          <w:tcPr>
-            <w:tcW w:type="dxa" w:w="1928"/>
-            <w:vAlign w:val="center"/>
-            <w:tcMar>
-              <w:top w:w="70" w:type="dxa"/>
-              <w:start w:w="90" w:type="dxa"/>
-              <w:bottom w:w="70" w:type="dxa"/>
-              <w:end w:w="90" w:type="dxa"/>
-            </w:tcMar>
-          </w:tcPr>
-          <w:p>
-            <w:pPr>
-              <w:keepNext w:val="0"/>
-              <w:keepLines/>
-              <w:spacing w:before="0" w:after="0" w:line="240" w:lineRule="auto"/>
-              <w:ind w:firstLine="0" w:left="0" w:right="0"/>
-              <w:jc w:val="center"/>
-            </w:pPr>
-            <w:r>
-              <w:rPr>
-                <w:sz w:val="18"/>
-              </w:rPr>
-            </w:r>
-            <w:r>
-              <w:rPr>
-                <w:rFonts w:ascii="Times New Roman" w:hAnsi="Times New Roman" w:eastAsia="Songti SC"/>
-                <w:b w:val="0"/>
-                <w:sz w:val="18"/>
-              </w:rPr>
-              <w:t>分发完整性</w:t>
-            </w:r>
-          </w:p>
-        </w:tc>
-        <w:tc>
-          <w:tcPr>
-            <w:tcW w:type="dxa" w:w="3969"/>
-            <w:vAlign w:val="top"/>
-            <w:tcMar>
-              <w:top w:w="70" w:type="dxa"/>
-              <w:start w:w="90" w:type="dxa"/>
-              <w:bottom w:w="70" w:type="dxa"/>
-              <w:end w:w="90" w:type="dxa"/>
-            </w:tcMar>
-          </w:tcPr>
-          <w:p>
-            <w:pPr>
-              <w:keepNext w:val="0"/>
-              <w:keepLines/>
-              <w:spacing w:before="0" w:after="0" w:line="240" w:lineRule="auto"/>
-              <w:ind w:firstLine="0" w:left="0" w:right="0"/>
-              <w:jc w:val="left"/>
-            </w:pPr>
-            <w:r>
-              <w:rPr>
-                <w:sz w:val="18"/>
-              </w:rPr>
-            </w:r>
-            <w:r>
-              <w:rPr>
-                <w:rFonts w:ascii="Times New Roman" w:hAnsi="Times New Roman" w:eastAsia="Songti SC"/>
-                <w:b w:val="0"/>
-                <w:sz w:val="18"/>
-              </w:rPr>
-              <w:t>新登记的条目或纳入严格完整性管理的条目记录文件字节数和SHA-256摘要（用于核验文件内容一致性）；同一标签的受控镜像指向相同内容</w:t>
-            </w:r>
-          </w:p>
-        </w:tc>
-        <w:tc>
-          <w:tcPr>
-            <w:tcW w:type="dxa" w:w="2948"/>
-            <w:vAlign w:val="top"/>
-            <w:tcMar>
-              <w:top w:w="70" w:type="dxa"/>
-              <w:start w:w="90" w:type="dxa"/>
-              <w:bottom w:w="70" w:type="dxa"/>
-              <w:end w:w="90" w:type="dxa"/>
-            </w:tcMar>
-          </w:tcPr>
-          <w:p>
-            <w:pPr>
-              <w:keepNext w:val="0"/>
-              <w:keepLines/>
-              <w:spacing w:before="0" w:after="0" w:line="240" w:lineRule="auto"/>
-              <w:ind w:firstLine="0" w:left="0" w:right="0"/>
-              <w:jc w:val="left"/>
-            </w:pPr>
-            <w:r>
-              <w:rPr>
-                <w:sz w:val="18"/>
-              </w:rPr>
-            </w:r>
-            <w:r>
-              <w:rPr>
-                <w:rFonts w:ascii="Times New Roman" w:hAnsi="Times New Roman" w:eastAsia="Songti SC"/>
-                <w:b w:val="0"/>
-                <w:sz w:val="18"/>
-              </w:rPr>
-              <w:t>带完整性信息的下载文件通过核验后才替换本地正式文件；已有条目按其登记信息获取</w:t>
+              <w:t>新增或纳入严格核验的条目记录文件字节数及SHA-256；同标签受控镜像内容一致，核验后更新本地正式文件</w:t>
             </w:r>
           </w:p>
         </w:tc>
@@ -3471,7 +2696,33 @@
           <w:rFonts w:ascii="Times New Roman" w:hAnsi="Times New Roman" w:eastAsia="Songti SC"/>
           <w:b w:val="0"/>
         </w:rPr>
-        <w:t>字段指定，策略依据变量的物理含义和陆海分布选择，可保留缺失状态、以常数或均值填补，或检查指定区域的数据完整性。需要类别编码的数据可采用整数化处理。陆地掩膜用于区分陆地区域与全域的检查要求；本文高程数据（ELEV）配置采用常数0填补陆地区域缺失值。各策略的作用范围与字段说明见补充材料S3。</w:t>
+        <w:t>字段指定，策略依据变量的物理含义和陆海分布选择，可保留缺失状态（</w:t>
+      </w:r>
+      <w:r>
+        <w:rPr>
+          <w:rFonts w:ascii="Consolas" w:hAnsi="Consolas" w:eastAsia="Songti SC"/>
+        </w:rPr>
+        <w:t>KEEP_AS_IS</w:t>
+      </w:r>
+      <w:r>
+        <w:rPr>
+          <w:rFonts w:ascii="Times New Roman" w:hAnsi="Times New Roman" w:eastAsia="Songti SC"/>
+          <w:b w:val="0"/>
+        </w:rPr>
+        <w:t>）、以常数或均值（</w:t>
+      </w:r>
+      <w:r>
+        <w:rPr>
+          <w:rFonts w:ascii="Consolas" w:hAnsi="Consolas" w:eastAsia="Songti SC"/>
+        </w:rPr>
+        <w:t>MEAN</w:t>
+      </w:r>
+      <w:r>
+        <w:rPr>
+          <w:rFonts w:ascii="Times New Roman" w:hAnsi="Times New Roman" w:eastAsia="Songti SC"/>
+          <w:b w:val="0"/>
+        </w:rPr>
+        <w:t>）填补，或检查指定区域的数据完整性。需要类别编码的数据可采用整数化处理。陆地掩膜用于区分陆地区域与全域的检查要求；本文高程数据（ELEV）配置采用常数0填补陆地区域缺失值。各策略的作用范围与字段说明见补充材料S3。</w:t>
       </w:r>
     </w:p>
     <w:p>
@@ -3981,13 +3232,6 @@
           <w:b/>
         </w:rPr>
         <w:t>Table 3 Application cases and evaluation metrics for the GriddingMachine framework updates.</w:t>
-      </w:r>
-      <w:r>
-        <w:rPr>
-          <w:rFonts w:ascii="Times New Roman" w:hAnsi="Times New Roman" w:eastAsia="Songti SC"/>
-          <w:b w:val="0"/>
-        </w:rPr>
-        <w:t xml:space="preserve"> Controlled experiments and real-data or real-network applications evaluate data standardization, distribution, model-input organization, and cross-platform consistency.</w:t>
       </w:r>
     </w:p>
     <w:tbl>
@@ -4006,10 +3250,9 @@
         </w:tblBorders>
       </w:tblPr>
       <w:tblGrid>
-        <w:gridCol w:w="2268"/>
-        <w:gridCol w:w="2381"/>
-        <w:gridCol w:w="2438"/>
-        <w:gridCol w:w="1757"/>
+        <w:gridCol w:w="1593"/>
+        <w:gridCol w:w="4071"/>
+        <w:gridCol w:w="3180"/>
       </w:tblGrid>
       <w:tr>
         <w:trPr>
@@ -4018,13 +3261,13 @@
         </w:trPr>
         <w:tc>
           <w:tcPr>
-            <w:tcW w:type="dxa" w:w="2268"/>
-            <w:vAlign w:val="center"/>
+            <w:tcW w:type="dxa" w:w="1593"/>
+            <w:vAlign w:val="top"/>
             <w:tcMar>
-              <w:top w:w="70" w:type="dxa"/>
-              <w:start w:w="90" w:type="dxa"/>
-              <w:bottom w:w="70" w:type="dxa"/>
-              <w:end w:w="90" w:type="dxa"/>
+              <w:top w:w="90" w:type="dxa"/>
+              <w:start w:w="110" w:type="dxa"/>
+              <w:bottom w:w="90" w:type="dxa"/>
+              <w:end w:w="170" w:type="dxa"/>
             </w:tcMar>
             <w:tcBorders>
               <w:bottom w:val="single" w:sz="6" w:color="6B7280"/>
@@ -4034,35 +3277,35 @@
             <w:pPr>
               <w:keepNext/>
               <w:keepLines/>
-              <w:spacing w:before="0" w:after="0" w:line="240" w:lineRule="auto"/>
+              <w:spacing w:before="0" w:after="0" w:line="252" w:lineRule="auto"/>
               <w:ind w:firstLine="0" w:left="0" w:right="0"/>
-              <w:jc w:val="center"/>
+              <w:jc w:val="left"/>
             </w:pPr>
             <w:r>
               <w:rPr>
                 <w:b/>
-                <w:sz w:val="18"/>
+                <w:sz w:val="20"/>
               </w:rPr>
             </w:r>
             <w:r>
               <w:rPr>
                 <w:rFonts w:ascii="Times New Roman" w:hAnsi="Times New Roman" w:eastAsia="Songti SC"/>
                 <w:b/>
-                <w:sz w:val="18"/>
+                <w:sz w:val="20"/>
               </w:rPr>
-              <w:t>框架更新与评价内容</w:t>
+              <w:t>评价内容</w:t>
             </w:r>
           </w:p>
         </w:tc>
         <w:tc>
           <w:tcPr>
-            <w:tcW w:type="dxa" w:w="2381"/>
-            <w:vAlign w:val="center"/>
+            <w:tcW w:type="dxa" w:w="4071"/>
+            <w:vAlign w:val="top"/>
             <w:tcMar>
-              <w:top w:w="70" w:type="dxa"/>
-              <w:start w:w="90" w:type="dxa"/>
-              <w:bottom w:w="70" w:type="dxa"/>
-              <w:end w:w="90" w:type="dxa"/>
+              <w:top w:w="90" w:type="dxa"/>
+              <w:start w:w="110" w:type="dxa"/>
+              <w:bottom w:w="90" w:type="dxa"/>
+              <w:end w:w="170" w:type="dxa"/>
             </w:tcMar>
             <w:tcBorders>
               <w:bottom w:val="single" w:sz="6" w:color="6B7280"/>
@@ -4072,35 +3315,35 @@
             <w:pPr>
               <w:keepNext/>
               <w:keepLines/>
-              <w:spacing w:before="0" w:after="0" w:line="240" w:lineRule="auto"/>
+              <w:spacing w:before="0" w:after="0" w:line="252" w:lineRule="auto"/>
               <w:ind w:firstLine="0" w:left="0" w:right="0"/>
-              <w:jc w:val="center"/>
+              <w:jc w:val="left"/>
             </w:pPr>
             <w:r>
               <w:rPr>
                 <w:b/>
-                <w:sz w:val="18"/>
+                <w:sz w:val="20"/>
               </w:rPr>
             </w:r>
             <w:r>
               <w:rPr>
                 <w:rFonts w:ascii="Times New Roman" w:hAnsi="Times New Roman" w:eastAsia="Songti SC"/>
                 <w:b/>
-                <w:sz w:val="18"/>
+                <w:sz w:val="20"/>
               </w:rPr>
-              <w:t>受控实例与对照</w:t>
+              <w:t>实验数据与对照</w:t>
             </w:r>
           </w:p>
         </w:tc>
         <w:tc>
           <w:tcPr>
-            <w:tcW w:type="dxa" w:w="2438"/>
-            <w:vAlign w:val="center"/>
+            <w:tcW w:type="dxa" w:w="3180"/>
+            <w:vAlign w:val="top"/>
             <w:tcMar>
-              <w:top w:w="70" w:type="dxa"/>
-              <w:start w:w="90" w:type="dxa"/>
-              <w:bottom w:w="70" w:type="dxa"/>
-              <w:end w:w="90" w:type="dxa"/>
+              <w:top w:w="90" w:type="dxa"/>
+              <w:start w:w="110" w:type="dxa"/>
+              <w:bottom w:w="90" w:type="dxa"/>
+              <w:end w:w="170" w:type="dxa"/>
             </w:tcMar>
             <w:tcBorders>
               <w:bottom w:val="single" w:sz="6" w:color="6B7280"/>
@@ -4110,59 +3353,21 @@
             <w:pPr>
               <w:keepNext/>
               <w:keepLines/>
-              <w:spacing w:before="0" w:after="0" w:line="240" w:lineRule="auto"/>
+              <w:spacing w:before="0" w:after="0" w:line="252" w:lineRule="auto"/>
               <w:ind w:firstLine="0" w:left="0" w:right="0"/>
-              <w:jc w:val="center"/>
+              <w:jc w:val="left"/>
             </w:pPr>
             <w:r>
               <w:rPr>
                 <w:b/>
-                <w:sz w:val="18"/>
+                <w:sz w:val="20"/>
               </w:rPr>
             </w:r>
             <w:r>
               <w:rPr>
                 <w:rFonts w:ascii="Times New Roman" w:hAnsi="Times New Roman" w:eastAsia="Songti SC"/>
                 <w:b/>
-                <w:sz w:val="18"/>
-              </w:rPr>
-              <w:t>真实数据与网络案例</w:t>
-            </w:r>
-          </w:p>
-        </w:tc>
-        <w:tc>
-          <w:tcPr>
-            <w:tcW w:type="dxa" w:w="1757"/>
-            <w:vAlign w:val="center"/>
-            <w:tcMar>
-              <w:top w:w="70" w:type="dxa"/>
-              <w:start w:w="90" w:type="dxa"/>
-              <w:bottom w:w="70" w:type="dxa"/>
-              <w:end w:w="90" w:type="dxa"/>
-            </w:tcMar>
-            <w:tcBorders>
-              <w:bottom w:val="single" w:sz="6" w:color="6B7280"/>
-            </w:tcBorders>
-          </w:tcPr>
-          <w:p>
-            <w:pPr>
-              <w:keepNext/>
-              <w:keepLines/>
-              <w:spacing w:before="0" w:after="0" w:line="240" w:lineRule="auto"/>
-              <w:ind w:firstLine="0" w:left="0" w:right="0"/>
-              <w:jc w:val="center"/>
-            </w:pPr>
-            <w:r>
-              <w:rPr>
-                <w:b/>
-                <w:sz w:val="18"/>
-              </w:rPr>
-            </w:r>
-            <w:r>
-              <w:rPr>
-                <w:rFonts w:ascii="Times New Roman" w:hAnsi="Times New Roman" w:eastAsia="Songti SC"/>
-                <w:b/>
-                <w:sz w:val="18"/>
+                <w:sz w:val="20"/>
               </w:rPr>
               <w:t>主要评价指标</w:t>
             </w:r>
@@ -4175,137 +3380,112 @@
         </w:trPr>
         <w:tc>
           <w:tcPr>
-            <w:tcW w:type="dxa" w:w="2268"/>
-            <w:vAlign w:val="center"/>
+            <w:tcW w:type="dxa" w:w="1593"/>
+            <w:vAlign w:val="top"/>
             <w:tcMar>
-              <w:top w:w="70" w:type="dxa"/>
-              <w:start w:w="90" w:type="dxa"/>
-              <w:bottom w:w="70" w:type="dxa"/>
-              <w:end w:w="90" w:type="dxa"/>
+              <w:top w:w="90" w:type="dxa"/>
+              <w:start w:w="110" w:type="dxa"/>
+              <w:bottom w:w="90" w:type="dxa"/>
+              <w:end w:w="170" w:type="dxa"/>
             </w:tcMar>
+            <w:tcBorders>
+              <w:bottom w:val="single" w:sz="2" w:color="B8BDC4"/>
+            </w:tcBorders>
           </w:tcPr>
           <w:p>
             <w:pPr>
               <w:keepNext/>
               <w:keepLines/>
-              <w:spacing w:before="0" w:after="0" w:line="240" w:lineRule="auto"/>
+              <w:spacing w:before="0" w:after="0" w:line="252" w:lineRule="auto"/>
               <w:ind w:firstLine="0" w:left="0" w:right="0"/>
-              <w:jc w:val="center"/>
+              <w:jc w:val="left"/>
             </w:pPr>
             <w:r>
               <w:rPr>
-                <w:sz w:val="18"/>
+                <w:sz w:val="20"/>
               </w:rPr>
             </w:r>
             <w:r>
               <w:rPr>
                 <w:rFonts w:ascii="Times New Roman" w:hAnsi="Times New Roman" w:eastAsia="Songti SC"/>
                 <w:b w:val="0"/>
-                <w:sz w:val="18"/>
+                <w:sz w:val="20"/>
               </w:rPr>
-              <w:t>数据生产与标准化层将异构源数据转换为标准NetCDF</w:t>
+              <w:t>标准化一致性</w:t>
             </w:r>
           </w:p>
         </w:tc>
         <w:tc>
           <w:tcPr>
-            <w:tcW w:type="dxa" w:w="2381"/>
+            <w:tcW w:type="dxa" w:w="4071"/>
             <w:vAlign w:val="top"/>
             <w:tcMar>
-              <w:top w:w="70" w:type="dxa"/>
-              <w:start w:w="90" w:type="dxa"/>
-              <w:bottom w:w="70" w:type="dxa"/>
-              <w:end w:w="90" w:type="dxa"/>
+              <w:top w:w="90" w:type="dxa"/>
+              <w:start w:w="110" w:type="dxa"/>
+              <w:bottom w:w="90" w:type="dxa"/>
+              <w:end w:w="170" w:type="dxa"/>
             </w:tcMar>
+            <w:tcBorders>
+              <w:bottom w:val="single" w:sz="2" w:color="B8BDC4"/>
+            </w:tcBorders>
           </w:tcPr>
           <w:p>
             <w:pPr>
               <w:keepNext/>
               <w:keepLines/>
-              <w:spacing w:before="0" w:after="0" w:line="240" w:lineRule="auto"/>
+              <w:spacing w:before="0" w:after="0" w:line="252" w:lineRule="auto"/>
               <w:ind w:firstLine="0" w:left="0" w:right="0"/>
               <w:jc w:val="left"/>
             </w:pPr>
             <w:r>
               <w:rPr>
-                <w:sz w:val="18"/>
+                <w:sz w:val="20"/>
               </w:rPr>
             </w:r>
             <w:r>
               <w:rPr>
                 <w:rFonts w:ascii="Times New Roman" w:hAnsi="Times New Roman" w:eastAsia="Songti SC"/>
                 <w:b w:val="0"/>
-                <w:sz w:val="18"/>
+                <w:sz w:val="20"/>
               </w:rPr>
-              <w:t>31组受控实例、ELEV重复生产与逐点核对</w:t>
+              <w:t>31组受控实例及OISST V2.1；与构造参考和独立解码结果比较</w:t>
             </w:r>
           </w:p>
         </w:tc>
         <w:tc>
           <w:tcPr>
-            <w:tcW w:type="dxa" w:w="2438"/>
+            <w:tcW w:type="dxa" w:w="3180"/>
             <w:vAlign w:val="top"/>
             <w:tcMar>
-              <w:top w:w="70" w:type="dxa"/>
-              <w:start w:w="90" w:type="dxa"/>
-              <w:bottom w:w="70" w:type="dxa"/>
-              <w:end w:w="90" w:type="dxa"/>
+              <w:top w:w="90" w:type="dxa"/>
+              <w:start w:w="110" w:type="dxa"/>
+              <w:bottom w:w="90" w:type="dxa"/>
+              <w:end w:w="170" w:type="dxa"/>
             </w:tcMar>
+            <w:tcBorders>
+              <w:bottom w:val="single" w:sz="2" w:color="B8BDC4"/>
+            </w:tcBorders>
           </w:tcPr>
           <w:p>
             <w:pPr>
               <w:keepNext/>
               <w:keepLines/>
-              <w:spacing w:before="0" w:after="0" w:line="240" w:lineRule="auto"/>
+              <w:spacing w:before="0" w:after="0" w:line="252" w:lineRule="auto"/>
               <w:ind w:firstLine="0" w:left="0" w:right="0"/>
               <w:jc w:val="left"/>
             </w:pPr>
             <w:r>
               <w:rPr>
-                <w:sz w:val="18"/>
+                <w:sz w:val="20"/>
               </w:rPr>
             </w:r>
             <w:r>
               <w:rPr>
                 <w:rFonts w:ascii="Times New Roman" w:hAnsi="Times New Roman" w:eastAsia="Songti SC"/>
                 <w:b w:val="0"/>
-                <w:sz w:val="18"/>
+                <w:sz w:val="20"/>
               </w:rPr>
-              <w:t>OISST V2.1真实异构源数据</w:t>
-            </w:r>
-          </w:p>
-        </w:tc>
-        <w:tc>
-          <w:tcPr>
-            <w:tcW w:type="dxa" w:w="1757"/>
-            <w:vAlign w:val="top"/>
-            <w:tcMar>
-              <w:top w:w="70" w:type="dxa"/>
-              <w:start w:w="90" w:type="dxa"/>
-              <w:bottom w:w="70" w:type="dxa"/>
-              <w:end w:w="90" w:type="dxa"/>
-            </w:tcMar>
-          </w:tcPr>
-          <w:p>
-            <w:pPr>
-              <w:keepNext/>
-              <w:keepLines/>
-              <w:spacing w:before="0" w:after="0" w:line="240" w:lineRule="auto"/>
-              <w:ind w:firstLine="0" w:left="0" w:right="0"/>
-              <w:jc w:val="left"/>
-            </w:pPr>
-            <w:r>
-              <w:rPr>
-                <w:sz w:val="18"/>
-              </w:rPr>
-            </w:r>
-            <w:r>
-              <w:rPr>
-                <w:rFonts w:ascii="Times New Roman" w:hAnsi="Times New Roman" w:eastAsia="Songti SC"/>
-                <w:b w:val="0"/>
-                <w:sz w:val="18"/>
-              </w:rPr>
-              <w:t>维度与坐标、有效值掩膜、逐点物理值、重复生成摘要</w:t>
+              <w:t>维度与坐标、有效值掩膜、逐点物理值</w:t>
             </w:r>
           </w:p>
         </w:tc>
@@ -4316,152 +3496,112 @@
         </w:trPr>
         <w:tc>
           <w:tcPr>
-            <w:tcW w:type="dxa" w:w="2268"/>
-            <w:vAlign w:val="center"/>
+            <w:tcW w:type="dxa" w:w="1593"/>
+            <w:vAlign w:val="top"/>
             <w:tcMar>
-              <w:top w:w="70" w:type="dxa"/>
-              <w:start w:w="90" w:type="dxa"/>
-              <w:bottom w:w="70" w:type="dxa"/>
-              <w:end w:w="90" w:type="dxa"/>
+              <w:top w:w="90" w:type="dxa"/>
+              <w:start w:w="110" w:type="dxa"/>
+              <w:bottom w:w="90" w:type="dxa"/>
+              <w:end w:w="170" w:type="dxa"/>
             </w:tcMar>
+            <w:tcBorders>
+              <w:bottom w:val="single" w:sz="2" w:color="B8BDC4"/>
+            </w:tcBorders>
           </w:tcPr>
           <w:p>
             <w:pPr>
               <w:keepNext/>
               <w:keepLines/>
-              <w:spacing w:before="0" w:after="0" w:line="240" w:lineRule="auto"/>
+              <w:spacing w:before="0" w:after="0" w:line="252" w:lineRule="auto"/>
               <w:ind w:firstLine="0" w:left="0" w:right="0"/>
-              <w:jc w:val="center"/>
+              <w:jc w:val="left"/>
             </w:pPr>
             <w:r>
               <w:rPr>
-                <w:sz w:val="18"/>
+                <w:sz w:val="20"/>
               </w:rPr>
             </w:r>
             <w:r>
               <w:rPr>
                 <w:rFonts w:ascii="Times New Roman" w:hAnsi="Times New Roman" w:eastAsia="Songti SC"/>
                 <w:b w:val="0"/>
-                <w:sz w:val="18"/>
+                <w:sz w:val="20"/>
               </w:rPr>
-              <w:t>数据目录与可信分发层组织高效且内容可核验的数据获取</w:t>
+              <w:t>重复处理与复用</w:t>
             </w:r>
           </w:p>
         </w:tc>
         <w:tc>
           <w:tcPr>
-            <w:tcW w:type="dxa" w:w="2381"/>
+            <w:tcW w:type="dxa" w:w="4071"/>
             <w:vAlign w:val="top"/>
             <w:tcMar>
-              <w:top w:w="70" w:type="dxa"/>
-              <w:start w:w="90" w:type="dxa"/>
-              <w:bottom w:w="70" w:type="dxa"/>
-              <w:end w:w="90" w:type="dxa"/>
+              <w:top w:w="90" w:type="dxa"/>
+              <w:start w:w="110" w:type="dxa"/>
+              <w:bottom w:w="90" w:type="dxa"/>
+              <w:end w:w="170" w:type="dxa"/>
             </w:tcMar>
+            <w:tcBorders>
+              <w:bottom w:val="single" w:sz="2" w:color="B8BDC4"/>
+            </w:tcBorders>
           </w:tcPr>
           <w:p>
             <w:pPr>
               <w:keepNext/>
               <w:keepLines/>
-              <w:spacing w:before="0" w:after="0" w:line="240" w:lineRule="auto"/>
+              <w:spacing w:before="0" w:after="0" w:line="252" w:lineRule="auto"/>
               <w:ind w:firstLine="0" w:left="0" w:right="0"/>
               <w:jc w:val="left"/>
             </w:pPr>
             <w:r>
               <w:rPr>
-                <w:sz w:val="18"/>
+                <w:sz w:val="20"/>
               </w:rPr>
             </w:r>
             <w:r>
               <w:rPr>
                 <w:rFonts w:ascii="Times New Roman" w:hAnsi="Times New Roman" w:eastAsia="Songti SC"/>
                 <w:b w:val="0"/>
-                <w:sz w:val="18"/>
+                <w:sz w:val="20"/>
               </w:rPr>
-              <w:t>ELEV/LAI回环HTTP对照；13类受控状态场景</w:t>
+              <w:t>ELEV连续处理3次；配置生成与数据贡献流程</w:t>
             </w:r>
           </w:p>
         </w:tc>
         <w:tc>
           <w:tcPr>
-            <w:tcW w:type="dxa" w:w="2438"/>
+            <w:tcW w:type="dxa" w:w="3180"/>
             <w:vAlign w:val="top"/>
             <w:tcMar>
-              <w:top w:w="70" w:type="dxa"/>
-              <w:start w:w="90" w:type="dxa"/>
-              <w:bottom w:w="70" w:type="dxa"/>
-              <w:end w:w="90" w:type="dxa"/>
+              <w:top w:w="90" w:type="dxa"/>
+              <w:start w:w="110" w:type="dxa"/>
+              <w:bottom w:w="90" w:type="dxa"/>
+              <w:end w:w="170" w:type="dxa"/>
             </w:tcMar>
+            <w:tcBorders>
+              <w:bottom w:val="single" w:sz="2" w:color="B8BDC4"/>
+            </w:tcBorders>
           </w:tcPr>
           <w:p>
             <w:pPr>
               <w:keepNext/>
               <w:keepLines/>
-              <w:spacing w:before="0" w:after="0" w:line="240" w:lineRule="auto"/>
+              <w:spacing w:before="0" w:after="0" w:line="252" w:lineRule="auto"/>
               <w:ind w:firstLine="0" w:left="0" w:right="0"/>
               <w:jc w:val="left"/>
             </w:pPr>
             <w:r>
               <w:rPr>
-                <w:sz w:val="18"/>
+                <w:sz w:val="20"/>
               </w:rPr>
             </w:r>
             <w:r>
               <w:rPr>
                 <w:rFonts w:ascii="Times New Roman" w:hAnsi="Times New Roman" w:eastAsia="Songti SC"/>
                 <w:b w:val="0"/>
-                <w:sz w:val="18"/>
+                <w:sz w:val="20"/>
               </w:rPr>
-              <w:t>Zenodo公共网络记录；中国科学技术大学（以下简称中科大）校内网 FTP—Zenodo同文件获取</w:t>
-            </w:r>
-          </w:p>
-        </w:tc>
-        <w:tc>
-          <w:tcPr>
-            <w:tcW w:type="dxa" w:w="1757"/>
-            <w:vAlign w:val="top"/>
-            <w:tcMar>
-              <w:top w:w="70" w:type="dxa"/>
-              <w:start w:w="90" w:type="dxa"/>
-              <w:bottom w:w="70" w:type="dxa"/>
-              <w:end w:w="90" w:type="dxa"/>
-            </w:tcMar>
-          </w:tcPr>
-          <w:p>
-            <w:pPr>
-              <w:keepNext/>
-              <w:keepLines/>
-              <w:spacing w:before="0" w:after="0" w:line="240" w:lineRule="auto"/>
-              <w:ind w:firstLine="0" w:left="0" w:right="0"/>
-              <w:jc w:val="left"/>
-            </w:pPr>
-            <w:r>
-              <w:rPr>
-                <w:sz w:val="18"/>
-              </w:rPr>
-            </w:r>
-            <w:r>
-              <w:rPr>
-                <w:rFonts w:ascii="Times New Roman" w:hAnsi="Times New Roman" w:eastAsia="Songti SC"/>
-                <w:b w:val="0"/>
-                <w:sz w:val="18"/>
-              </w:rPr>
-              <w:t>端到端时间、传输字节、候选遍历、</w:t>
-            </w:r>
-            <w:r>
-              <w:rPr>
-                <w:rFonts w:ascii="Consolas" w:hAnsi="Consolas" w:eastAsia="Songti SC"/>
-                <w:sz w:val="18"/>
-              </w:rPr>
-              <w:t>SIZE</w:t>
-            </w:r>
-            <w:r>
-              <w:rPr>
-                <w:rFonts w:ascii="Times New Roman" w:hAnsi="Times New Roman" w:eastAsia="Songti SC"/>
-                <w:b w:val="0"/>
-                <w:sz w:val="18"/>
-              </w:rPr>
-              <w:t>/SHA-256、临时与正式文件状态</w:t>
+              <w:t>数据结构、文件摘要、发布与获取状态</w:t>
             </w:r>
           </w:p>
         </w:tc>
@@ -4472,135 +3612,357 @@
         </w:trPr>
         <w:tc>
           <w:tcPr>
-            <w:tcW w:type="dxa" w:w="2268"/>
-            <w:vAlign w:val="center"/>
+            <w:tcW w:type="dxa" w:w="1593"/>
+            <w:vAlign w:val="top"/>
             <w:tcMar>
-              <w:top w:w="70" w:type="dxa"/>
-              <w:start w:w="90" w:type="dxa"/>
-              <w:bottom w:w="70" w:type="dxa"/>
-              <w:end w:w="90" w:type="dxa"/>
+              <w:top w:w="90" w:type="dxa"/>
+              <w:start w:w="110" w:type="dxa"/>
+              <w:bottom w:w="90" w:type="dxa"/>
+              <w:end w:w="170" w:type="dxa"/>
             </w:tcMar>
+            <w:tcBorders>
+              <w:bottom w:val="single" w:sz="2" w:color="B8BDC4"/>
+            </w:tcBorders>
           </w:tcPr>
           <w:p>
             <w:pPr>
               <w:keepNext/>
               <w:keepLines/>
-              <w:spacing w:before="0" w:after="0" w:line="240" w:lineRule="auto"/>
+              <w:spacing w:before="0" w:after="0" w:line="252" w:lineRule="auto"/>
               <w:ind w:firstLine="0" w:left="0" w:right="0"/>
-              <w:jc w:val="center"/>
+              <w:jc w:val="left"/>
             </w:pPr>
             <w:r>
               <w:rPr>
-                <w:sz w:val="18"/>
+                <w:sz w:val="20"/>
               </w:rPr>
             </w:r>
             <w:r>
               <w:rPr>
                 <w:rFonts w:ascii="Times New Roman" w:hAnsi="Times New Roman" w:eastAsia="Songti SC"/>
                 <w:b w:val="0"/>
-                <w:sz w:val="18"/>
+                <w:sz w:val="20"/>
               </w:rPr>
-              <w:t>模式输入组织层将标准化数据组织为模式就绪输入</w:t>
+              <w:t>文件分发效率</w:t>
             </w:r>
           </w:p>
         </w:tc>
         <w:tc>
           <w:tcPr>
-            <w:tcW w:type="dxa" w:w="2381"/>
+            <w:tcW w:type="dxa" w:w="4071"/>
             <w:vAlign w:val="top"/>
             <w:tcMar>
-              <w:top w:w="70" w:type="dxa"/>
-              <w:start w:w="90" w:type="dxa"/>
-              <w:bottom w:w="70" w:type="dxa"/>
-              <w:end w:w="90" w:type="dxa"/>
+              <w:top w:w="90" w:type="dxa"/>
+              <w:start w:w="110" w:type="dxa"/>
+              <w:bottom w:w="90" w:type="dxa"/>
+              <w:end w:w="170" w:type="dxa"/>
             </w:tcMar>
+            <w:tcBorders>
+              <w:bottom w:val="single" w:sz="2" w:color="B8BDC4"/>
+            </w:tcBorders>
           </w:tcPr>
           <w:p>
             <w:pPr>
               <w:keepNext/>
               <w:keepLines/>
-              <w:spacing w:before="0" w:after="0" w:line="240" w:lineRule="auto"/>
+              <w:spacing w:before="0" w:after="0" w:line="252" w:lineRule="auto"/>
               <w:ind w:firstLine="0" w:left="0" w:right="0"/>
               <w:jc w:val="left"/>
             </w:pPr>
             <w:r>
               <w:rPr>
-                <w:sz w:val="18"/>
+                <w:sz w:val="20"/>
               </w:rPr>
             </w:r>
             <w:r>
               <w:rPr>
                 <w:rFonts w:ascii="Times New Roman" w:hAnsi="Times New Roman" w:eastAsia="Songti SC"/>
                 <w:b w:val="0"/>
-                <w:sz w:val="18"/>
+                <w:sz w:val="20"/>
               </w:rPr>
-              <w:t>确定性读取、字段、时间轴与接口核对</w:t>
+              <w:t>ELEV与LAI；Windows和macOS回环HTTP；直接NetCDF与外层</w:t>
+            </w:r>
+            <w:r>
+              <w:rPr>
+                <w:rFonts w:ascii="Consolas" w:hAnsi="Consolas" w:eastAsia="Songti SC"/>
+                <w:sz w:val="20"/>
+              </w:rPr>
+              <w:t>tar.gz</w:t>
+            </w:r>
+            <w:r>
+              <w:rPr>
+                <w:rFonts w:ascii="Times New Roman" w:hAnsi="Times New Roman" w:eastAsia="Songti SC"/>
+                <w:b w:val="0"/>
+                <w:sz w:val="20"/>
+              </w:rPr>
+              <w:t>对照</w:t>
             </w:r>
           </w:p>
         </w:tc>
         <w:tc>
           <w:tcPr>
-            <w:tcW w:type="dxa" w:w="2438"/>
+            <w:tcW w:type="dxa" w:w="3180"/>
             <w:vAlign w:val="top"/>
             <w:tcMar>
-              <w:top w:w="70" w:type="dxa"/>
-              <w:start w:w="90" w:type="dxa"/>
-              <w:bottom w:w="70" w:type="dxa"/>
-              <w:end w:w="90" w:type="dxa"/>
+              <w:top w:w="90" w:type="dxa"/>
+              <w:start w:w="110" w:type="dxa"/>
+              <w:bottom w:w="90" w:type="dxa"/>
+              <w:end w:w="170" w:type="dxa"/>
             </w:tcMar>
+            <w:tcBorders>
+              <w:bottom w:val="single" w:sz="2" w:color="B8BDC4"/>
+            </w:tcBorders>
           </w:tcPr>
           <w:p>
             <w:pPr>
               <w:keepNext/>
               <w:keepLines/>
-              <w:spacing w:before="0" w:after="0" w:line="240" w:lineRule="auto"/>
+              <w:spacing w:before="0" w:after="0" w:line="252" w:lineRule="auto"/>
               <w:ind w:firstLine="0" w:left="0" w:right="0"/>
               <w:jc w:val="left"/>
             </w:pPr>
             <w:r>
               <w:rPr>
-                <w:sz w:val="18"/>
+                <w:sz w:val="20"/>
               </w:rPr>
             </w:r>
             <w:r>
               <w:rPr>
                 <w:rFonts w:ascii="Times New Roman" w:hAnsi="Times New Roman" w:eastAsia="Songti SC"/>
                 <w:b w:val="0"/>
-                <w:sz w:val="18"/>
+                <w:sz w:val="20"/>
               </w:rPr>
-              <w:t>US-NR1的14类陆面数据集、8类ERA5及Emerald初始化和60 s首步</w:t>
+              <w:t>端到端时间、传输字节、文件存储占用</w:t>
             </w:r>
           </w:p>
         </w:tc>
+      </w:tr>
+      <w:tr>
+        <w:trPr>
+          <w:cantSplit/>
+        </w:trPr>
         <w:tc>
           <w:tcPr>
-            <w:tcW w:type="dxa" w:w="1757"/>
+            <w:tcW w:type="dxa" w:w="1593"/>
             <w:vAlign w:val="top"/>
             <w:tcMar>
-              <w:top w:w="70" w:type="dxa"/>
-              <w:start w:w="90" w:type="dxa"/>
-              <w:bottom w:w="70" w:type="dxa"/>
-              <w:end w:w="90" w:type="dxa"/>
+              <w:top w:w="90" w:type="dxa"/>
+              <w:start w:w="110" w:type="dxa"/>
+              <w:bottom w:w="90" w:type="dxa"/>
+              <w:end w:w="170" w:type="dxa"/>
             </w:tcMar>
+            <w:tcBorders>
+              <w:bottom w:val="single" w:sz="2" w:color="B8BDC4"/>
+            </w:tcBorders>
           </w:tcPr>
           <w:p>
             <w:pPr>
               <w:keepNext/>
               <w:keepLines/>
-              <w:spacing w:before="0" w:after="0" w:line="240" w:lineRule="auto"/>
+              <w:spacing w:before="0" w:after="0" w:line="252" w:lineRule="auto"/>
               <w:ind w:firstLine="0" w:left="0" w:right="0"/>
               <w:jc w:val="left"/>
             </w:pPr>
             <w:r>
               <w:rPr>
-                <w:sz w:val="18"/>
+                <w:sz w:val="20"/>
               </w:rPr>
             </w:r>
             <w:r>
               <w:rPr>
                 <w:rFonts w:ascii="Times New Roman" w:hAnsi="Times New Roman" w:eastAsia="Songti SC"/>
                 <w:b w:val="0"/>
-                <w:sz w:val="18"/>
+                <w:sz w:val="20"/>
+              </w:rPr>
+              <w:t>镜像与目录更新</w:t>
+            </w:r>
+          </w:p>
+        </w:tc>
+        <w:tc>
+          <w:tcPr>
+            <w:tcW w:type="dxa" w:w="4071"/>
+            <w:vAlign w:val="top"/>
+            <w:tcMar>
+              <w:top w:w="90" w:type="dxa"/>
+              <w:start w:w="110" w:type="dxa"/>
+              <w:bottom w:w="90" w:type="dxa"/>
+              <w:end w:w="170" w:type="dxa"/>
+            </w:tcMar>
+            <w:tcBorders>
+              <w:bottom w:val="single" w:sz="2" w:color="B8BDC4"/>
+            </w:tcBorders>
+          </w:tcPr>
+          <w:p>
+            <w:pPr>
+              <w:keepNext/>
+              <w:keepLines/>
+              <w:spacing w:before="0" w:after="0" w:line="252" w:lineRule="auto"/>
+              <w:ind w:firstLine="0" w:left="0" w:right="0"/>
+              <w:jc w:val="left"/>
+            </w:pPr>
+            <w:r>
+              <w:rPr>
+                <w:sz w:val="20"/>
+              </w:rPr>
+            </w:r>
+            <w:r>
+              <w:rPr>
+                <w:rFonts w:ascii="Times New Roman" w:hAnsi="Times New Roman" w:eastAsia="Songti SC"/>
+                <w:b w:val="0"/>
+                <w:sz w:val="20"/>
+              </w:rPr>
+              <w:t>13类受控状态；Zenodo公共网络；中国科学技术大学（以下简称中科大）校内网FTP—Zenodo获取</w:t>
+            </w:r>
+          </w:p>
+        </w:tc>
+        <w:tc>
+          <w:tcPr>
+            <w:tcW w:type="dxa" w:w="3180"/>
+            <w:vAlign w:val="top"/>
+            <w:tcMar>
+              <w:top w:w="90" w:type="dxa"/>
+              <w:start w:w="110" w:type="dxa"/>
+              <w:bottom w:w="90" w:type="dxa"/>
+              <w:end w:w="170" w:type="dxa"/>
+            </w:tcMar>
+            <w:tcBorders>
+              <w:bottom w:val="single" w:sz="2" w:color="B8BDC4"/>
+            </w:tcBorders>
+          </w:tcPr>
+          <w:p>
+            <w:pPr>
+              <w:keepNext/>
+              <w:keepLines/>
+              <w:spacing w:before="0" w:after="0" w:line="252" w:lineRule="auto"/>
+              <w:ind w:firstLine="0" w:left="0" w:right="0"/>
+              <w:jc w:val="left"/>
+            </w:pPr>
+            <w:r>
+              <w:rPr>
+                <w:sz w:val="20"/>
+              </w:rPr>
+            </w:r>
+            <w:r>
+              <w:rPr>
+                <w:rFonts w:ascii="Times New Roman" w:hAnsi="Times New Roman" w:eastAsia="Songti SC"/>
+                <w:b w:val="0"/>
+                <w:sz w:val="20"/>
+              </w:rPr>
+              <w:t>候选遍历、文件大小与SHA-256、临时及正式文件状态</w:t>
+            </w:r>
+          </w:p>
+        </w:tc>
+      </w:tr>
+      <w:tr>
+        <w:trPr>
+          <w:cantSplit/>
+        </w:trPr>
+        <w:tc>
+          <w:tcPr>
+            <w:tcW w:type="dxa" w:w="1593"/>
+            <w:vAlign w:val="top"/>
+            <w:tcMar>
+              <w:top w:w="90" w:type="dxa"/>
+              <w:start w:w="110" w:type="dxa"/>
+              <w:bottom w:w="90" w:type="dxa"/>
+              <w:end w:w="170" w:type="dxa"/>
+            </w:tcMar>
+            <w:tcBorders>
+              <w:bottom w:val="single" w:sz="2" w:color="B8BDC4"/>
+            </w:tcBorders>
+          </w:tcPr>
+          <w:p>
+            <w:pPr>
+              <w:keepNext/>
+              <w:keepLines/>
+              <w:spacing w:before="0" w:after="0" w:line="252" w:lineRule="auto"/>
+              <w:ind w:firstLine="0" w:left="0" w:right="0"/>
+              <w:jc w:val="left"/>
+            </w:pPr>
+            <w:r>
+              <w:rPr>
+                <w:sz w:val="20"/>
+              </w:rPr>
+            </w:r>
+            <w:r>
+              <w:rPr>
+                <w:rFonts w:ascii="Times New Roman" w:hAnsi="Times New Roman" w:eastAsia="Songti SC"/>
+                <w:b w:val="0"/>
+                <w:sz w:val="20"/>
+              </w:rPr>
+              <w:t>模式输入组织</w:t>
+            </w:r>
+          </w:p>
+        </w:tc>
+        <w:tc>
+          <w:tcPr>
+            <w:tcW w:type="dxa" w:w="4071"/>
+            <w:vAlign w:val="top"/>
+            <w:tcMar>
+              <w:top w:w="90" w:type="dxa"/>
+              <w:start w:w="110" w:type="dxa"/>
+              <w:bottom w:w="90" w:type="dxa"/>
+              <w:end w:w="170" w:type="dxa"/>
+            </w:tcMar>
+            <w:tcBorders>
+              <w:bottom w:val="single" w:sz="2" w:color="B8BDC4"/>
+            </w:tcBorders>
+          </w:tcPr>
+          <w:p>
+            <w:pPr>
+              <w:keepNext/>
+              <w:keepLines/>
+              <w:spacing w:before="0" w:after="0" w:line="252" w:lineRule="auto"/>
+              <w:ind w:firstLine="0" w:left="0" w:right="0"/>
+              <w:jc w:val="left"/>
+            </w:pPr>
+            <w:r>
+              <w:rPr>
+                <w:sz w:val="20"/>
+              </w:rPr>
+            </w:r>
+            <w:r>
+              <w:rPr>
+                <w:rFonts w:ascii="Times New Roman" w:hAnsi="Times New Roman" w:eastAsia="Songti SC"/>
+                <w:b w:val="0"/>
+                <w:sz w:val="20"/>
+              </w:rPr>
+              <w:t>US-NR1的14类陆面数据与8类ERA5逐时数据；底层读取对照、Emerald初始化及60 s首步</w:t>
+            </w:r>
+          </w:p>
+        </w:tc>
+        <w:tc>
+          <w:tcPr>
+            <w:tcW w:type="dxa" w:w="3180"/>
+            <w:vAlign w:val="top"/>
+            <w:tcMar>
+              <w:top w:w="90" w:type="dxa"/>
+              <w:start w:w="110" w:type="dxa"/>
+              <w:bottom w:w="90" w:type="dxa"/>
+              <w:end w:w="170" w:type="dxa"/>
+            </w:tcMar>
+            <w:tcBorders>
+              <w:bottom w:val="single" w:sz="2" w:color="B8BDC4"/>
+            </w:tcBorders>
+          </w:tcPr>
+          <w:p>
+            <w:pPr>
+              <w:keepNext/>
+              <w:keepLines/>
+              <w:spacing w:before="0" w:after="0" w:line="252" w:lineRule="auto"/>
+              <w:ind w:firstLine="0" w:left="0" w:right="0"/>
+              <w:jc w:val="left"/>
+            </w:pPr>
+            <w:r>
+              <w:rPr>
+                <w:sz w:val="20"/>
+              </w:rPr>
+            </w:r>
+            <w:r>
+              <w:rPr>
+                <w:rFonts w:ascii="Times New Roman" w:hAnsi="Times New Roman" w:eastAsia="Songti SC"/>
+                <w:b w:val="0"/>
+                <w:sz w:val="20"/>
               </w:rPr>
               <w:t>字段与形状、时间轴、量纲、逐点数值、初始化与首步状态</w:t>
             </w:r>
@@ -4613,137 +3975,103 @@
         </w:trPr>
         <w:tc>
           <w:tcPr>
-            <w:tcW w:type="dxa" w:w="2268"/>
-            <w:vAlign w:val="center"/>
+            <w:tcW w:type="dxa" w:w="1593"/>
+            <w:vAlign w:val="top"/>
             <w:tcMar>
-              <w:top w:w="70" w:type="dxa"/>
-              <w:start w:w="90" w:type="dxa"/>
-              <w:bottom w:w="70" w:type="dxa"/>
-              <w:end w:w="90" w:type="dxa"/>
+              <w:top w:w="90" w:type="dxa"/>
+              <w:start w:w="110" w:type="dxa"/>
+              <w:bottom w:w="90" w:type="dxa"/>
+              <w:end w:w="170" w:type="dxa"/>
             </w:tcMar>
           </w:tcPr>
           <w:p>
             <w:pPr>
               <w:keepNext w:val="0"/>
               <w:keepLines/>
-              <w:spacing w:before="0" w:after="0" w:line="240" w:lineRule="auto"/>
+              <w:spacing w:before="0" w:after="0" w:line="252" w:lineRule="auto"/>
               <w:ind w:firstLine="0" w:left="0" w:right="0"/>
-              <w:jc w:val="center"/>
+              <w:jc w:val="left"/>
             </w:pPr>
             <w:r>
               <w:rPr>
-                <w:sz w:val="18"/>
+                <w:sz w:val="20"/>
               </w:rPr>
             </w:r>
             <w:r>
               <w:rPr>
                 <w:rFonts w:ascii="Times New Roman" w:hAnsi="Times New Roman" w:eastAsia="Songti SC"/>
                 <w:b w:val="0"/>
-                <w:sz w:val="18"/>
+                <w:sz w:val="20"/>
               </w:rPr>
-              <w:t>跨操作系统运行一致性与多语言下载</w:t>
+              <w:t>跨环境运行与调用</w:t>
             </w:r>
           </w:p>
         </w:tc>
         <w:tc>
           <w:tcPr>
-            <w:tcW w:type="dxa" w:w="2381"/>
+            <w:tcW w:type="dxa" w:w="4071"/>
             <w:vAlign w:val="top"/>
             <w:tcMar>
-              <w:top w:w="70" w:type="dxa"/>
-              <w:start w:w="90" w:type="dxa"/>
-              <w:bottom w:w="70" w:type="dxa"/>
-              <w:end w:w="90" w:type="dxa"/>
+              <w:top w:w="90" w:type="dxa"/>
+              <w:start w:w="110" w:type="dxa"/>
+              <w:bottom w:w="90" w:type="dxa"/>
+              <w:end w:w="170" w:type="dxa"/>
             </w:tcMar>
           </w:tcPr>
           <w:p>
             <w:pPr>
               <w:keepNext w:val="0"/>
               <w:keepLines/>
-              <w:spacing w:before="0" w:after="0" w:line="240" w:lineRule="auto"/>
+              <w:spacing w:before="0" w:after="0" w:line="252" w:lineRule="auto"/>
               <w:ind w:firstLine="0" w:left="0" w:right="0"/>
               <w:jc w:val="left"/>
             </w:pPr>
             <w:r>
               <w:rPr>
-                <w:sz w:val="18"/>
+                <w:sz w:val="20"/>
               </w:rPr>
             </w:r>
             <w:r>
               <w:rPr>
                 <w:rFonts w:ascii="Times New Roman" w:hAnsi="Times New Roman" w:eastAsia="Songti SC"/>
                 <w:b w:val="0"/>
-                <w:sz w:val="18"/>
+                <w:sz w:val="20"/>
               </w:rPr>
-              <w:t>Windows、macOS、Linux持续集成；六种语言的URL与标签下载、镜像回退和完整性核验</w:t>
+              <w:t>Windows、macOS和Linux持续集成；Matlab、Octave、Python、R、C和Fortran下载入口</w:t>
             </w:r>
           </w:p>
         </w:tc>
         <w:tc>
           <w:tcPr>
-            <w:tcW w:type="dxa" w:w="2438"/>
+            <w:tcW w:type="dxa" w:w="3180"/>
             <w:vAlign w:val="top"/>
             <w:tcMar>
-              <w:top w:w="70" w:type="dxa"/>
-              <w:start w:w="90" w:type="dxa"/>
-              <w:bottom w:w="70" w:type="dxa"/>
-              <w:end w:w="90" w:type="dxa"/>
+              <w:top w:w="90" w:type="dxa"/>
+              <w:start w:w="110" w:type="dxa"/>
+              <w:bottom w:w="90" w:type="dxa"/>
+              <w:end w:w="170" w:type="dxa"/>
             </w:tcMar>
           </w:tcPr>
           <w:p>
             <w:pPr>
               <w:keepNext w:val="0"/>
               <w:keepLines/>
-              <w:spacing w:before="0" w:after="0" w:line="240" w:lineRule="auto"/>
+              <w:spacing w:before="0" w:after="0" w:line="252" w:lineRule="auto"/>
               <w:ind w:firstLine="0" w:left="0" w:right="0"/>
               <w:jc w:val="left"/>
             </w:pPr>
             <w:r>
               <w:rPr>
-                <w:sz w:val="18"/>
+                <w:sz w:val="20"/>
               </w:rPr>
             </w:r>
             <w:r>
               <w:rPr>
                 <w:rFonts w:ascii="Times New Roman" w:hAnsi="Times New Roman" w:eastAsia="Songti SC"/>
                 <w:b w:val="0"/>
-                <w:sz w:val="18"/>
+                <w:sz w:val="20"/>
               </w:rPr>
-              <w:t>Windows/macOS独立性能观测；真实网络与数据案例</w:t>
-            </w:r>
-          </w:p>
-        </w:tc>
-        <w:tc>
-          <w:tcPr>
-            <w:tcW w:type="dxa" w:w="1757"/>
-            <w:vAlign w:val="top"/>
-            <w:tcMar>
-              <w:top w:w="70" w:type="dxa"/>
-              <w:start w:w="90" w:type="dxa"/>
-              <w:bottom w:w="70" w:type="dxa"/>
-              <w:end w:w="90" w:type="dxa"/>
-            </w:tcMar>
-          </w:tcPr>
-          <w:p>
-            <w:pPr>
-              <w:keepNext w:val="0"/>
-              <w:keepLines/>
-              <w:spacing w:before="0" w:after="0" w:line="240" w:lineRule="auto"/>
-              <w:ind w:firstLine="0" w:left="0" w:right="0"/>
-              <w:jc w:val="left"/>
-            </w:pPr>
-            <w:r>
-              <w:rPr>
-                <w:sz w:val="18"/>
-              </w:rPr>
-            </w:r>
-            <w:r>
-              <w:rPr>
-                <w:rFonts w:ascii="Times New Roman" w:hAnsi="Times New Roman" w:eastAsia="Songti SC"/>
-                <w:b w:val="0"/>
-                <w:sz w:val="18"/>
-              </w:rPr>
-              <w:t>数据集结构、逐点数值、文件摘要、缓存状态和接口状态</w:t>
+              <w:t>数据结构与数值、文件摘要、缓存状态、URL/标签调用及镜像回退</w:t>
             </w:r>
           </w:p>
         </w:tc>

</xml_diff>

<commit_message>
Restore table context and align evaluation overview with manuscript
</commit_message>
<xml_diff>
--- a/论文/GriddingMachine论文初稿_v0.3_语言优化版.docx
+++ b/论文/GriddingMachine论文初稿_v0.3_语言优化版.docx
@@ -926,7 +926,7 @@
                 <w:b w:val="0"/>
                 <w:sz w:val="20"/>
               </w:rPr>
-              <w:t>共享YAML配置、源维度映射及配置生成</w:t>
+              <w:t>以共享YAML配置组织处理规则，统一完成维度、坐标与数值转换，并支持配置生成</w:t>
             </w:r>
           </w:p>
         </w:tc>
@@ -1441,7 +1441,7 @@
                 <w:b w:val="0"/>
                 <w:sz w:val="20"/>
               </w:rPr>
-              <w:t>统一读取入口，兼容</w:t>
+              <w:t>按文件路径或数据标签统一读取，兼容</w:t>
             </w:r>
             <w:r>
               <w:rPr>
@@ -1449,6 +1449,14 @@
                 <w:sz w:val="20"/>
               </w:rPr>
               <w:t>read_LUT</w:t>
+            </w:r>
+            <w:r>
+              <w:rPr>
+                <w:rFonts w:ascii="Times New Roman" w:hAnsi="Times New Roman" w:eastAsia="Songti SC"/>
+                <w:b w:val="0"/>
+                <w:sz w:val="20"/>
+              </w:rPr>
+              <w:t>，并衔接模式输入组织</w:t>
             </w:r>
           </w:p>
         </w:tc>
@@ -1564,7 +1572,7 @@
                 <w:b w:val="0"/>
                 <w:sz w:val="20"/>
               </w:rPr>
-              <w:t>陆面参数融合、气象驱动组织及Emerald接口</w:t>
+              <w:t>融合陆面参数并组织气象驱动，形成可用于Emerald的模式输入</w:t>
             </w:r>
           </w:p>
         </w:tc>
@@ -1671,7 +1679,7 @@
                 <w:b w:val="0"/>
                 <w:sz w:val="20"/>
               </w:rPr>
-              <w:t>完善原有下载支持，新增C和Fortran；各下载入口支持URL、标签与完整性核验</w:t>
+              <w:t>完善原有下载支持，新增C和Fortran；六种非Julia接口支持URL或标签下载与完整性核验</w:t>
             </w:r>
           </w:p>
         </w:tc>
@@ -2267,7 +2275,7 @@
                 <w:b w:val="0"/>
                 <w:sz w:val="20"/>
               </w:rPr>
-              <w:t>为同形不确定性；保存实际物理值、变量说明和单位</w:t>
+              <w:t>为可选的同形不确定性变量；保存实际物理值、变量说明和单位</w:t>
             </w:r>
           </w:p>
         </w:tc>
@@ -2671,7 +2679,7 @@
                 <w:b w:val="0"/>
                 <w:sz w:val="20"/>
               </w:rPr>
-              <w:t>新增或纳入严格核验的条目记录文件字节数及SHA-256；同标签受控镜像内容一致，核验后更新本地正式文件</w:t>
+              <w:t>新增或纳入严格核验的条目记录文件字节数及SHA-256；同标签受控镜像内容一致；带完整性信息的文件核验通过后更新本地正式文件</w:t>
             </w:r>
           </w:p>
         </w:tc>
@@ -2696,33 +2704,7 @@
           <w:rFonts w:ascii="Times New Roman" w:hAnsi="Times New Roman" w:eastAsia="Songti SC"/>
           <w:b w:val="0"/>
         </w:rPr>
-        <w:t>字段指定，策略依据变量的物理含义和陆海分布选择，可保留缺失状态（</w:t>
-      </w:r>
-      <w:r>
-        <w:rPr>
-          <w:rFonts w:ascii="Consolas" w:hAnsi="Consolas" w:eastAsia="Songti SC"/>
-        </w:rPr>
-        <w:t>KEEP_AS_IS</w:t>
-      </w:r>
-      <w:r>
-        <w:rPr>
-          <w:rFonts w:ascii="Times New Roman" w:hAnsi="Times New Roman" w:eastAsia="Songti SC"/>
-          <w:b w:val="0"/>
-        </w:rPr>
-        <w:t>）、以常数或均值（</w:t>
-      </w:r>
-      <w:r>
-        <w:rPr>
-          <w:rFonts w:ascii="Consolas" w:hAnsi="Consolas" w:eastAsia="Songti SC"/>
-        </w:rPr>
-        <w:t>MEAN</w:t>
-      </w:r>
-      <w:r>
-        <w:rPr>
-          <w:rFonts w:ascii="Times New Roman" w:hAnsi="Times New Roman" w:eastAsia="Songti SC"/>
-          <w:b w:val="0"/>
-        </w:rPr>
-        <w:t>）填补，或检查指定区域的数据完整性。需要类别编码的数据可采用整数化处理。陆地掩膜用于区分陆地区域与全域的检查要求；本文高程数据（ELEV）配置采用常数0填补陆地区域缺失值。各策略的作用范围与字段说明见补充材料S3。</w:t>
+        <w:t>字段指定，策略依据变量的物理含义和陆海分布选择，可保留缺失状态、以常数或均值填补，或检查指定区域的数据完整性。需要类别编码的数据可采用整数化处理。陆地掩膜用于区分陆地区域与全域的检查要求；本文高程数据（ELEV）配置采用常数0填补陆地区域缺失值。各策略的作用范围与字段说明见补充材料S3。</w:t>
       </w:r>
     </w:p>
     <w:p>
@@ -3411,7 +3393,7 @@
                 <w:b w:val="0"/>
                 <w:sz w:val="20"/>
               </w:rPr>
-              <w:t>标准化一致性</w:t>
+              <w:t>标准化与重复处理</w:t>
             </w:r>
           </w:p>
         </w:tc>
@@ -3448,7 +3430,7 @@
                 <w:b w:val="0"/>
                 <w:sz w:val="20"/>
               </w:rPr>
-              <w:t>31组受控实例及OISST V2.1；与构造参考和独立解码结果比较</w:t>
+              <w:t>受控实例：31组处理与构造参考对照、配置生成及数据贡献流程；ELEV连续处理3次；真实数据：OISST V2.1独立解码对照</w:t>
             </w:r>
           </w:p>
         </w:tc>
@@ -3485,123 +3467,7 @@
                 <w:b w:val="0"/>
                 <w:sz w:val="20"/>
               </w:rPr>
-              <w:t>维度与坐标、有效值掩膜、逐点物理值</w:t>
-            </w:r>
-          </w:p>
-        </w:tc>
-      </w:tr>
-      <w:tr>
-        <w:trPr>
-          <w:cantSplit/>
-        </w:trPr>
-        <w:tc>
-          <w:tcPr>
-            <w:tcW w:type="dxa" w:w="1593"/>
-            <w:vAlign w:val="top"/>
-            <w:tcMar>
-              <w:top w:w="90" w:type="dxa"/>
-              <w:start w:w="110" w:type="dxa"/>
-              <w:bottom w:w="90" w:type="dxa"/>
-              <w:end w:w="170" w:type="dxa"/>
-            </w:tcMar>
-            <w:tcBorders>
-              <w:bottom w:val="single" w:sz="2" w:color="B8BDC4"/>
-            </w:tcBorders>
-          </w:tcPr>
-          <w:p>
-            <w:pPr>
-              <w:keepNext/>
-              <w:keepLines/>
-              <w:spacing w:before="0" w:after="0" w:line="252" w:lineRule="auto"/>
-              <w:ind w:firstLine="0" w:left="0" w:right="0"/>
-              <w:jc w:val="left"/>
-            </w:pPr>
-            <w:r>
-              <w:rPr>
-                <w:sz w:val="20"/>
-              </w:rPr>
-            </w:r>
-            <w:r>
-              <w:rPr>
-                <w:rFonts w:ascii="Times New Roman" w:hAnsi="Times New Roman" w:eastAsia="Songti SC"/>
-                <w:b w:val="0"/>
-                <w:sz w:val="20"/>
-              </w:rPr>
-              <w:t>重复处理与复用</w:t>
-            </w:r>
-          </w:p>
-        </w:tc>
-        <w:tc>
-          <w:tcPr>
-            <w:tcW w:type="dxa" w:w="4071"/>
-            <w:vAlign w:val="top"/>
-            <w:tcMar>
-              <w:top w:w="90" w:type="dxa"/>
-              <w:start w:w="110" w:type="dxa"/>
-              <w:bottom w:w="90" w:type="dxa"/>
-              <w:end w:w="170" w:type="dxa"/>
-            </w:tcMar>
-            <w:tcBorders>
-              <w:bottom w:val="single" w:sz="2" w:color="B8BDC4"/>
-            </w:tcBorders>
-          </w:tcPr>
-          <w:p>
-            <w:pPr>
-              <w:keepNext/>
-              <w:keepLines/>
-              <w:spacing w:before="0" w:after="0" w:line="252" w:lineRule="auto"/>
-              <w:ind w:firstLine="0" w:left="0" w:right="0"/>
-              <w:jc w:val="left"/>
-            </w:pPr>
-            <w:r>
-              <w:rPr>
-                <w:sz w:val="20"/>
-              </w:rPr>
-            </w:r>
-            <w:r>
-              <w:rPr>
-                <w:rFonts w:ascii="Times New Roman" w:hAnsi="Times New Roman" w:eastAsia="Songti SC"/>
-                <w:b w:val="0"/>
-                <w:sz w:val="20"/>
-              </w:rPr>
-              <w:t>ELEV连续处理3次；配置生成与数据贡献流程</w:t>
-            </w:r>
-          </w:p>
-        </w:tc>
-        <w:tc>
-          <w:tcPr>
-            <w:tcW w:type="dxa" w:w="3180"/>
-            <w:vAlign w:val="top"/>
-            <w:tcMar>
-              <w:top w:w="90" w:type="dxa"/>
-              <w:start w:w="110" w:type="dxa"/>
-              <w:bottom w:w="90" w:type="dxa"/>
-              <w:end w:w="170" w:type="dxa"/>
-            </w:tcMar>
-            <w:tcBorders>
-              <w:bottom w:val="single" w:sz="2" w:color="B8BDC4"/>
-            </w:tcBorders>
-          </w:tcPr>
-          <w:p>
-            <w:pPr>
-              <w:keepNext/>
-              <w:keepLines/>
-              <w:spacing w:before="0" w:after="0" w:line="252" w:lineRule="auto"/>
-              <w:ind w:firstLine="0" w:left="0" w:right="0"/>
-              <w:jc w:val="left"/>
-            </w:pPr>
-            <w:r>
-              <w:rPr>
-                <w:sz w:val="20"/>
-              </w:rPr>
-            </w:r>
-            <w:r>
-              <w:rPr>
-                <w:rFonts w:ascii="Times New Roman" w:hAnsi="Times New Roman" w:eastAsia="Songti SC"/>
-                <w:b w:val="0"/>
-                <w:sz w:val="20"/>
-              </w:rPr>
-              <w:t>数据结构、文件摘要、发布与获取状态</w:t>
+              <w:t>维度与坐标、有效值掩膜、逐点数值、重复生成摘要及登记获取结果</w:t>
             </w:r>
           </w:p>
         </w:tc>
@@ -3774,7 +3640,7 @@
                 <w:b w:val="0"/>
                 <w:sz w:val="20"/>
               </w:rPr>
-              <w:t>镜像与目录更新</w:t>
+              <w:t>目录更新与镜像获取</w:t>
             </w:r>
           </w:p>
         </w:tc>
@@ -3811,7 +3677,7 @@
                 <w:b w:val="0"/>
                 <w:sz w:val="20"/>
               </w:rPr>
-              <w:t>13类受控状态；Zenodo公共网络；中国科学技术大学（以下简称中科大）校内网FTP—Zenodo获取</w:t>
+              <w:t>受控场景：13类镜像状态及目录更新；网络案例：Zenodo公共网络与中国科学技术大学（以下简称中科大）校内网FTP—Zenodo获取；数据修订：ERA5降水单位修订及原标签访问</w:t>
             </w:r>
           </w:p>
         </w:tc>
@@ -3848,7 +3714,7 @@
                 <w:b w:val="0"/>
                 <w:sz w:val="20"/>
               </w:rPr>
-              <w:t>候选遍历、文件大小与SHA-256、临时及正式文件状态</w:t>
+              <w:t>候选遍历、文件大小与SHA-256、临时及正式文件状态、修订后标签访问与缓存复用</w:t>
             </w:r>
           </w:p>
         </w:tc>
@@ -3927,7 +3793,7 @@
                 <w:b w:val="0"/>
                 <w:sz w:val="20"/>
               </w:rPr>
-              <w:t>US-NR1的14类陆面数据与8类ERA5逐时数据；底层读取对照、Emerald初始化及60 s首步</w:t>
+              <w:t>参考数据核对；真实数据：US-NR1的14类陆面数据与8类ERA5逐时数据、非植被格点；底层读取对照及Emerald初始化、60 s首步</w:t>
             </w:r>
           </w:p>
         </w:tc>
@@ -4003,7 +3869,7 @@
                 <w:b w:val="0"/>
                 <w:sz w:val="20"/>
               </w:rPr>
-              <w:t>跨环境运行与调用</w:t>
+              <w:t>跨操作系统运行与多语言下载</w:t>
             </w:r>
           </w:p>
         </w:tc>
@@ -4037,7 +3903,7 @@
                 <w:b w:val="0"/>
                 <w:sz w:val="20"/>
               </w:rPr>
-              <w:t>Windows、macOS和Linux持续集成；Matlab、Octave、Python、R、C和Fortran下载入口</w:t>
+              <w:t>跨系统：Windows、macOS和Linux持续集成及Windows/macOS独立环境；多语言：Matlab、Octave、Python、R、C和Fortran的URL与标签下载</w:t>
             </w:r>
           </w:p>
         </w:tc>
@@ -4071,7 +3937,7 @@
                 <w:b w:val="0"/>
                 <w:sz w:val="20"/>
               </w:rPr>
-              <w:t>数据结构与数值、文件摘要、缓存状态、URL/标签调用及镜像回退</w:t>
+              <w:t>数据结构与逐点数值、文件摘要、接口状态、镜像回退、错误返回与缓存保留</w:t>
             </w:r>
           </w:p>
         </w:tc>

</xml_diff>